<commit_message>
docs: Add code snippet tables for new modules (4.18-4.22) and fix figure numbering in report
</commit_message>
<xml_diff>
--- a/Ai text Detector Report_Updated.docx
+++ b/Ai text Detector Report_Updated.docx
@@ -9877,11 +9877,9 @@
       <w:r>
         <w:t xml:space="preserve"> Build and tune the </w:t>
       </w:r>
-      <w:proofErr w:type="spellStart"/>
       <w:r>
         <w:t>PerplexityAnalyzer</w:t>
       </w:r>
-      <w:proofErr w:type="spellEnd"/>
       <w:r>
         <w:t xml:space="preserve"> and </w:t>
       </w:r>
@@ -10155,15 +10153,7 @@
         <w:spacing w:before="0" w:after="160"/>
       </w:pPr>
       <w:r>
-        <w:t xml:space="preserve">Chapter 4 covers the implementation. It describes each code module (FileParser, </w:t>
-      </w:r>
-      <w:proofErr w:type="spellStart"/>
-      <w:r>
-        <w:t>PerplexityAnalyzer</w:t>
-      </w:r>
-      <w:proofErr w:type="spellEnd"/>
-      <w:r>
-        <w:t xml:space="preserve">, KNN, Cosine Similarity, Logistic Regression, Trigram, POS, Grammar, and </w:t>
+        <w:t xml:space="preserve">Chapter 4 covers the implementation. It describes each code module (FileParser, PerplexityAnalyzer, KNN, Cosine Similarity, Logistic Regression, Trigram, POS, Grammar, and </w:t>
       </w:r>
       <w:proofErr w:type="spellStart"/>
       <w:r>
@@ -12517,15 +12507,7 @@
       </w:r>
       <w:proofErr w:type="gramEnd"/>
       <w:r>
-        <w:t xml:space="preserve"> detection pipeline. The FileParser class handles local document text extraction (supporting .docx, .pdf, .txt, and .md file structures), passing the raw plain text to the </w:t>
-      </w:r>
-      <w:proofErr w:type="spellStart"/>
-      <w:r>
-        <w:t>PerplexityAnalyzer</w:t>
-      </w:r>
-      <w:proofErr w:type="spellEnd"/>
-      <w:r>
-        <w:t>, which tokenizes the text into sentences and words to compute statistical metrics like word counts, burstiness, and Type</w:t>
+        <w:t xml:space="preserve"> detection pipeline. The FileParser class handles local document text extraction (supporting .docx, .pdf, .txt, and .md file structures), passing the raw plain text to the PerplexityAnalyzer, which tokenizes the text into sentences and words to compute statistical metrics like word counts, burstiness, and Type</w:t>
       </w:r>
       <w:r>
         <w:t xml:space="preserve"> </w:t>
@@ -12855,6 +12837,9 @@
         <w:jc w:val="center"/>
       </w:pPr>
       <w:r>
+        <w:rPr>
+          <w:noProof/>
+        </w:rPr>
         <w:lastRenderedPageBreak/>
         <w:drawing>
           <wp:inline distT="0" distB="0" distL="0" distR="0" wp14:anchorId="1CAF58F1" wp14:editId="2574C12E">
@@ -13128,23 +13113,23 @@
     </w:p>
     <w:p>
       <w:r>
-        <w:t xml:space="preserve">The component diagram shows the modular architecture of the AI Text Detector. The HTML5 dashboard serves as the user interface, communicating with the app.js controller. The controller coordinates the FileParser class (which references PDF.js and Mammoth.js libraries), the </w:t>
+        <w:t xml:space="preserve">The component diagram shows the modular architecture of the AI Text Detector. The HTML5 dashboard serves as the user interface, communicating with the app.js controller. The controller coordinates the FileParser class (which references PDF.js and Mammoth.js libraries), the PerplexityAnalyzer, the KNNClassifier, the </w:t>
       </w:r>
       <w:proofErr w:type="spellStart"/>
       <w:r>
-        <w:t>PerplexityAnalyzer</w:t>
+        <w:t>CosineSimilarityAnalyzer</w:t>
       </w:r>
       <w:proofErr w:type="spellEnd"/>
       <w:r>
-        <w:t xml:space="preserve">, the KNNClassifier, the </w:t>
+        <w:t xml:space="preserve">, and the </w:t>
       </w:r>
       <w:proofErr w:type="spellStart"/>
       <w:r>
-        <w:t>CosineSimilarityAnalyzer</w:t>
+        <w:t>ChartRenderer</w:t>
       </w:r>
       <w:proofErr w:type="spellEnd"/>
       <w:r>
-        <w:t xml:space="preserve">, and the </w:t>
+        <w:t xml:space="preserve"> module. The </w:t>
       </w:r>
       <w:proofErr w:type="spellStart"/>
       <w:r>
@@ -13152,19 +13137,14 @@
       </w:r>
       <w:proofErr w:type="spellEnd"/>
       <w:r>
-        <w:t xml:space="preserve"> module. The </w:t>
-      </w:r>
-      <w:proofErr w:type="spellStart"/>
-      <w:r>
-        <w:t>ChartRenderer</w:t>
-      </w:r>
-      <w:proofErr w:type="spellEnd"/>
-      <w:r>
         <w:t xml:space="preserve"> calls the SVG graphics engine to draw visualization charts, and the app.js controller invokes the MathJax library to typeset mathematical equations.</w:t>
       </w:r>
     </w:p>
     <w:p>
       <w:r>
+        <w:rPr>
+          <w:noProof/>
+        </w:rPr>
         <w:drawing>
           <wp:inline distT="0" distB="0" distL="0" distR="0" wp14:anchorId="2017B88A" wp14:editId="1D83A5CE">
             <wp:extent cx="5715000" cy="3671570"/>
@@ -13246,6 +13226,9 @@
         <w:jc w:val="center"/>
       </w:pPr>
       <w:r>
+        <w:rPr>
+          <w:noProof/>
+        </w:rPr>
         <w:drawing>
           <wp:inline distT="0" distB="0" distL="0" distR="0" wp14:anchorId="4F0CF382" wp14:editId="41C0A1BD">
             <wp:extent cx="5715000" cy="3542665"/>
@@ -17099,13 +17082,8 @@
         <w:t>The</w:t>
       </w:r>
       <w:r>
-        <w:t xml:space="preserve"> </w:t>
-      </w:r>
-      <w:proofErr w:type="spellStart"/>
-      <w:r>
-        <w:t>PerplexityAnalyzer</w:t>
-      </w:r>
-      <w:proofErr w:type="spellEnd"/>
+        <w:t xml:space="preserve"> PerplexityAnalyzer</w:t>
+      </w:r>
       <w:r>
         <w:t xml:space="preserve"> class tokenizes input text into sentences and words. It calculates sentence length standard deviation to capture writing burstiness, and Type</w:t>
       </w:r>
@@ -21741,25 +21719,7 @@
                 <w:color w:val="0F172A"/>
                 <w:sz w:val="19"/>
               </w:rPr>
-              <w:t xml:space="preserve"> </w:t>
-            </w:r>
-            <w:proofErr w:type="spellStart"/>
-            <w:r>
-              <w:rPr>
-                <w:rFonts w:ascii="Cascadia Mono Light" w:hAnsi="Cascadia Mono Light" w:cs="Cascadia Mono Light"/>
-                <w:color w:val="0F172A"/>
-                <w:sz w:val="19"/>
-              </w:rPr>
-              <w:t>viewBox</w:t>
-            </w:r>
-            <w:proofErr w:type="spellEnd"/>
-            <w:r>
-              <w:rPr>
-                <w:rFonts w:ascii="Cascadia Mono Light" w:hAnsi="Cascadia Mono Light" w:cs="Cascadia Mono Light"/>
-                <w:color w:val="0F172A"/>
-                <w:sz w:val="19"/>
-              </w:rPr>
-              <w:t>="0 0 200 110"&gt;</w:t>
+              <w:t xml:space="preserve"> viewBox="0 0 200 110"&gt;</w:t>
             </w:r>
           </w:p>
           <w:p>
@@ -22319,25 +22279,7 @@
                 <w:color w:val="0F172A"/>
                 <w:sz w:val="19"/>
               </w:rPr>
-              <w:t>("</w:t>
-            </w:r>
-            <w:proofErr w:type="spellStart"/>
-            <w:r>
-              <w:rPr>
-                <w:rFonts w:ascii="Cascadia Mono Light" w:hAnsi="Cascadia Mono Light" w:cs="Cascadia Mono Light"/>
-                <w:color w:val="0F172A"/>
-                <w:sz w:val="19"/>
-              </w:rPr>
-              <w:t>viewBox</w:t>
-            </w:r>
-            <w:proofErr w:type="spellEnd"/>
-            <w:r>
-              <w:rPr>
-                <w:rFonts w:ascii="Cascadia Mono Light" w:hAnsi="Cascadia Mono Light" w:cs="Cascadia Mono Light"/>
-                <w:color w:val="0F172A"/>
-                <w:sz w:val="19"/>
-              </w:rPr>
-              <w:t>", "0 0 300 200");</w:t>
+              <w:t>("viewBox", "0 0 300 200");</w:t>
             </w:r>
           </w:p>
           <w:p>
@@ -23222,25 +23164,7 @@
                 <w:color w:val="0F172A"/>
                 <w:sz w:val="19"/>
               </w:rPr>
-              <w:t xml:space="preserve"> </w:t>
-            </w:r>
-            <w:proofErr w:type="spellStart"/>
-            <w:r>
-              <w:rPr>
-                <w:rFonts w:ascii="Cascadia Mono Light" w:hAnsi="Cascadia Mono Light" w:cs="Cascadia Mono Light"/>
-                <w:color w:val="0F172A"/>
-                <w:sz w:val="19"/>
-              </w:rPr>
-              <w:t>viewBox</w:t>
-            </w:r>
-            <w:proofErr w:type="spellEnd"/>
-            <w:r>
-              <w:rPr>
-                <w:rFonts w:ascii="Cascadia Mono Light" w:hAnsi="Cascadia Mono Light" w:cs="Cascadia Mono Light"/>
-                <w:color w:val="0F172A"/>
-                <w:sz w:val="19"/>
-              </w:rPr>
-              <w:t>="0 0 200 200"&gt;&lt;polygon points="${points}" fill="</w:t>
+              <w:t xml:space="preserve"> viewBox="0 0 200 200"&gt;&lt;polygon points="${points}" fill="</w:t>
             </w:r>
             <w:proofErr w:type="spellStart"/>
             <w:r>
@@ -24936,14 +24860,9 @@
       </w:pPr>
       <w:bookmarkStart w:id="64" w:name="_Toc236169758"/>
       <w:r>
-        <w:t xml:space="preserve">4.1.2.17. </w:t>
-      </w:r>
-      <w:bookmarkStart w:id="65" w:name="_GoBack"/>
-      <w:r>
-        <w:t>Heuristic Grammar &amp; Typography Module</w:t>
+        <w:t>4.1.2.17. Heuristic Grammar &amp; Typography Module</w:t>
       </w:r>
       <w:bookmarkEnd w:id="64"/>
-      <w:bookmarkEnd w:id="65"/>
     </w:p>
     <w:p>
       <w:r>
@@ -24980,79 +24899,6 @@
       <w:proofErr w:type="gramEnd"/>
       <w:r>
         <w:t xml:space="preserve"> the module parses the matched rules and lists occurrences to output a detailed feedback breakdown under the dashboard's mathematical trace panel.</w:t>
-      </w:r>
-    </w:p>
-    <w:p>
-      <w:pPr>
-        <w:pStyle w:val="Heading3"/>
-      </w:pPr>
-      <w:r>
-        <w:t>4.1.2.18. SentinelDB Storage &amp; REST Sync Module</w:t>
-      </w:r>
-    </w:p>
-    <w:p>
-      <w:r>
-        <w:t xml:space="preserve">The js/utils/db.js module implements a dual persistence storage architecture. Upon app initialization, it probes the Python backend server (/api/health). When available, all user registration, authentication, and analysis history operations are synchronized with the server </w:t>
-      </w:r>
-      <w:r>
-        <w:lastRenderedPageBreak/>
-        <w:t>SQLite3 database via REST API. If the server is offline, SentinelDB transparently falls back to local browser IndexedDB storage (SentinelAIDB), maintaining user object stores and history indexes.</w:t>
-      </w:r>
-    </w:p>
-    <w:p>
-      <w:pPr>
-        <w:pStyle w:val="Heading3"/>
-      </w:pPr>
-      <w:r>
-        <w:t>4.1.2.19. User Authentication &amp; Session Controller Module</w:t>
-      </w:r>
-    </w:p>
-    <w:p>
-      <w:r>
-        <w:t>The js/utils/auth.js module manages authentication workflows, account creation, and user sessions. It handles form submissions for login and registration, enforcing required email address fields for new accounts. The module supports dual login credentials, validating input against either username or email address. It updates header navigation UI components, displays user avatars, and manages the #logout-modal confirmation dialog equipped with a transparent outline Cancel button styled with dark grey text (#64748b).</w:t>
-      </w:r>
-    </w:p>
-    <w:p>
-      <w:pPr>
-        <w:pStyle w:val="Heading3"/>
-      </w:pPr>
-      <w:r>
-        <w:t>4.1.2.20. server.py SQLite REST Backend Server Module</w:t>
-      </w:r>
-    </w:p>
-    <w:p>
-      <w:r>
-        <w:t>The server.py module provides a lightweight Python HTTP server running on port 5000 backed by an SQLite3 database (sentinel.db). It exposes REST endpoints including /api/auth/register, /api/auth/login, /api/history, /api/history/save, /api/history/delete, and /api/history/clear. The login endpoint executes parameterized SQL queries checking WHERE (username = ? OR email = ?) AND password_hash = ? to enable dual login validation.</w:t>
-      </w:r>
-    </w:p>
-    <w:p>
-      <w:pPr>
-        <w:pStyle w:val="Heading3"/>
-      </w:pPr>
-      <w:r>
-        <w:t>4.1.2.21. Guest Quota Manager &amp; History Security Module</w:t>
-      </w:r>
-    </w:p>
-    <w:p>
-      <w:r>
-        <w:t>Integrated within app.js and db.js, the Guest Quota Manager restricts unauthenticated users to 1 free analysis per calendar day (tracked via localStorage key sentinel_guest_usage_YYYY-MM-DD). Upon quota exhaustion, analysis execution is blocked and the login modal is displayed. The module manages dynamic quota status badge visibility and enforces strict history database security, isolating query results (WHERE username = ?) so guest sessions cannot view or save user history records.</w:t>
-      </w:r>
-    </w:p>
-    <w:p>
-      <w:pPr>
-        <w:pStyle w:val="Heading3"/>
-      </w:pPr>
-      <w:r>
-        <w:t>4.1.2.22. Real-Time History Search &amp; UI Refinement Module</w:t>
-      </w:r>
-    </w:p>
-    <w:p>
-      <w:r>
-        <w:t xml:space="preserve">This module enhances the Analysis History interface in app.js and style.css. It provides real-time search filtering across title, body text snippet, verdict statement, and username using input, keyup, and change event listeners. Magnifying glass search icons are embedded inside </w:t>
-      </w:r>
-      <w:r>
-        <w:lastRenderedPageBreak/>
-        <w:t>input fields (padding-left: 36px), card action controls are streamlined to icon-only buttons (View/Reload and Delete), and obsolete Export JSON controls are removed.</w:t>
       </w:r>
     </w:p>
     <w:tbl>
@@ -25296,6 +25142,7 @@
                 <w:color w:val="0F172A"/>
                 <w:sz w:val="19"/>
               </w:rPr>
+              <w:lastRenderedPageBreak/>
               <w:t xml:space="preserve">    const penalty = (</w:t>
             </w:r>
             <w:proofErr w:type="spellStart"/>
@@ -25451,16 +25298,3176 @@
     </w:tbl>
     <w:p>
       <w:pPr>
+        <w:jc w:val="center"/>
+        <w:rPr>
+          <w:b/>
+          <w:bCs/>
+          <w:sz w:val="22"/>
+          <w:szCs w:val="22"/>
+        </w:rPr>
+      </w:pPr>
+      <w:r>
+        <w:rPr>
+          <w:b/>
+          <w:bCs/>
+          <w:sz w:val="22"/>
+          <w:szCs w:val="22"/>
+        </w:rPr>
+        <w:lastRenderedPageBreak/>
+        <w:t>Figure 4.17: Code Snippet of Heuristic Grammar &amp; Typography Module</w:t>
+      </w:r>
+    </w:p>
+    <w:p>
+      <w:pPr>
+        <w:pStyle w:val="Heading3"/>
+      </w:pPr>
+      <w:r>
+        <w:t>4.1.2.18. SentinelDB Storage &amp; REST Sync Module</w:t>
+      </w:r>
+    </w:p>
+    <w:p>
+      <w:r>
+        <w:t>The js/utils/db.js module implements a dual persistence storage architecture. Upon app initialization, it probes the Python backend server (/api/health). When available, all user registration, authentication, and analysis history operations are synchronized with the server SQLite3 database via REST API. If the server is offline, SentinelDB transparently falls back to local browser IndexedDB storage (SentinelAIDB), maintaining user object stores and history indexes.</w:t>
+      </w:r>
+    </w:p>
+    <w:tbl>
+      <w:tblPr>
+        <w:tblW w:w="0" w:type="auto"/>
+        <w:jc w:val="center"/>
+        <w:tblLook w:val="04A0" w:firstRow="1" w:lastRow="0" w:firstColumn="1" w:lastColumn="0" w:noHBand="0" w:noVBand="1"/>
+      </w:tblPr>
+      <w:tblGrid>
+        <w:gridCol w:w="8965"/>
+      </w:tblGrid>
+      <w:tr>
+        <w:trPr>
+          <w:jc w:val="center"/>
+        </w:trPr>
+        <w:tc>
+          <w:tcPr>
+            <w:tcW w:w="9000" w:type="dxa"/>
+            <w:tcBorders>
+              <w:top w:val="single" w:sz="4" w:space="0" w:color="CBD5E1"/>
+              <w:left w:val="single" w:sz="24" w:space="0" w:color="2563EB"/>
+              <w:bottom w:val="single" w:sz="4" w:space="0" w:color="CBD5E1"/>
+              <w:right w:val="single" w:sz="4" w:space="0" w:color="CBD5E1"/>
+            </w:tcBorders>
+            <w:shd w:val="clear" w:color="auto" w:fill="F8FAFC"/>
+            <w:tcMar>
+              <w:top w:w="120" w:type="dxa"/>
+              <w:left w:w="180" w:type="dxa"/>
+              <w:bottom w:w="120" w:type="dxa"/>
+              <w:right w:w="180" w:type="dxa"/>
+            </w:tcMar>
+          </w:tcPr>
+          <w:p>
+            <w:pPr>
+              <w:spacing w:before="0" w:after="0" w:line="240" w:lineRule="auto"/>
+              <w:rPr>
+                <w:bCs/>
+              </w:rPr>
+            </w:pPr>
+            <w:r>
+              <w:rPr>
+                <w:rFonts w:ascii="Cascadia Mono Light" w:hAnsi="Cascadia Mono Light" w:cs="Cascadia Mono Light"/>
+                <w:bCs/>
+                <w:sz w:val="19"/>
+              </w:rPr>
+              <w:t>// js/utils/db.js</w:t>
+            </w:r>
+          </w:p>
+          <w:p>
+            <w:pPr>
+              <w:spacing w:before="0" w:after="0" w:line="240" w:lineRule="auto"/>
+              <w:rPr>
+                <w:bCs/>
+              </w:rPr>
+            </w:pPr>
+            <w:r>
+              <w:rPr>
+                <w:rFonts w:ascii="Cascadia Mono Light" w:hAnsi="Cascadia Mono Light" w:cs="Cascadia Mono Light"/>
+                <w:bCs/>
+                <w:sz w:val="19"/>
+              </w:rPr>
+              <w:t>class SentinelDB {</w:t>
+            </w:r>
+          </w:p>
+          <w:p>
+            <w:pPr>
+              <w:spacing w:before="0" w:after="0" w:line="240" w:lineRule="auto"/>
+              <w:rPr>
+                <w:bCs/>
+              </w:rPr>
+            </w:pPr>
+            <w:r>
+              <w:rPr>
+                <w:rFonts w:ascii="Cascadia Mono Light" w:hAnsi="Cascadia Mono Light" w:cs="Cascadia Mono Light"/>
+                <w:bCs/>
+                <w:sz w:val="19"/>
+              </w:rPr>
+              <w:t xml:space="preserve">  </w:t>
+            </w:r>
+            <w:r>
+              <w:rPr>
+                <w:rFonts w:ascii="Cascadia Mono Light" w:hAnsi="Cascadia Mono Light" w:cs="Cascadia Mono Light"/>
+                <w:bCs/>
+                <w:sz w:val="19"/>
+              </w:rPr>
+              <w:t xml:space="preserve">  constructor() {</w:t>
+            </w:r>
+          </w:p>
+          <w:p>
+            <w:pPr>
+              <w:spacing w:before="0" w:after="0" w:line="240" w:lineRule="auto"/>
+              <w:rPr>
+                <w:bCs/>
+              </w:rPr>
+            </w:pPr>
+            <w:r>
+              <w:rPr>
+                <w:rFonts w:ascii="Cascadia Mono Light" w:hAnsi="Cascadia Mono Light" w:cs="Cascadia Mono Light"/>
+                <w:bCs/>
+                <w:sz w:val="19"/>
+              </w:rPr>
+              <w:t xml:space="preserve">        this.initialized = false;</w:t>
+            </w:r>
+          </w:p>
+          <w:p>
+            <w:pPr>
+              <w:spacing w:before="0" w:after="0" w:line="240" w:lineRule="auto"/>
+              <w:rPr>
+                <w:bCs/>
+              </w:rPr>
+            </w:pPr>
+            <w:r>
+              <w:rPr>
+                <w:rFonts w:ascii="Cascadia Mono Light" w:hAnsi="Cascadia Mono Light" w:cs="Cascadia Mono Light"/>
+                <w:bCs/>
+                <w:sz w:val="19"/>
+              </w:rPr>
+              <w:t xml:space="preserve">    }</w:t>
+            </w:r>
+          </w:p>
+          <w:p>
+            <w:pPr>
+              <w:spacing w:before="0" w:after="0" w:line="240" w:lineRule="auto"/>
+              <w:rPr>
+                <w:bCs/>
+              </w:rPr>
+            </w:pPr>
+          </w:p>
+          <w:p>
+            <w:pPr>
+              <w:spacing w:before="0" w:after="0" w:line="240" w:lineRule="auto"/>
+              <w:rPr>
+                <w:bCs/>
+              </w:rPr>
+            </w:pPr>
+            <w:r>
+              <w:rPr>
+                <w:rFonts w:ascii="Cascadia Mono Light" w:hAnsi="Cascadia Mono Light" w:cs="Cascadia Mono Light"/>
+                <w:bCs/>
+                <w:sz w:val="19"/>
+              </w:rPr>
+              <w:t xml:space="preserve">    async init() {</w:t>
+            </w:r>
+          </w:p>
+          <w:p>
+            <w:pPr>
+              <w:spacing w:before="0" w:after="0" w:line="240" w:lineRule="auto"/>
+              <w:rPr>
+                <w:bCs/>
+              </w:rPr>
+            </w:pPr>
+            <w:r>
+              <w:rPr>
+                <w:rFonts w:ascii="Cascadia Mono Light" w:hAnsi="Cascadia Mono Light" w:cs="Cascadia Mono Light"/>
+                <w:bCs/>
+                <w:sz w:val="19"/>
+              </w:rPr>
+              <w:t xml:space="preserve">        if (this.initialized) return;</w:t>
+            </w:r>
+          </w:p>
+          <w:p>
+            <w:pPr>
+              <w:spacing w:before="0" w:after="0" w:line="240" w:lineRule="auto"/>
+              <w:rPr>
+                <w:bCs/>
+              </w:rPr>
+            </w:pPr>
+            <w:r>
+              <w:rPr>
+                <w:rFonts w:ascii="Cascadia Mono Light" w:hAnsi="Cascadia Mono Light" w:cs="Cascadia Mono Light"/>
+                <w:bCs/>
+                <w:sz w:val="19"/>
+              </w:rPr>
+              <w:t xml:space="preserve">        try {</w:t>
+            </w:r>
+          </w:p>
+          <w:p>
+            <w:pPr>
+              <w:spacing w:before="0" w:after="0" w:line="240" w:lineRule="auto"/>
+              <w:rPr>
+                <w:bCs/>
+              </w:rPr>
+            </w:pPr>
+            <w:r>
+              <w:rPr>
+                <w:rFonts w:ascii="Cascadia Mono Light" w:hAnsi="Cascadia Mono Light" w:cs="Cascadia Mono Light"/>
+                <w:bCs/>
+                <w:sz w:val="19"/>
+              </w:rPr>
+              <w:t xml:space="preserve">            const res = await fetch(`${API_BASE}/health`,</w:t>
+            </w:r>
+          </w:p>
+          <w:p>
+            <w:pPr>
+              <w:spacing w:before="0" w:after="0" w:line="240" w:lineRule="auto"/>
+              <w:rPr>
+                <w:bCs/>
+              </w:rPr>
+            </w:pPr>
+            <w:r>
+              <w:rPr>
+                <w:rFonts w:ascii="Cascadia Mono Light" w:hAnsi="Cascadia Mono Light" w:cs="Cascadia Mono Light"/>
+                <w:bCs/>
+                <w:sz w:val="19"/>
+              </w:rPr>
+              <w:t xml:space="preserve">                { method: 'GET', signal: AbortSignal.timeout(1500) });</w:t>
+            </w:r>
+          </w:p>
+          <w:p>
+            <w:pPr>
+              <w:spacing w:before="0" w:after="0" w:line="240" w:lineRule="auto"/>
+              <w:rPr>
+                <w:bCs/>
+              </w:rPr>
+            </w:pPr>
+            <w:r>
+              <w:rPr>
+                <w:rFonts w:ascii="Cascadia Mono Light" w:hAnsi="Cascadia Mono Light" w:cs="Cascadia Mono Light"/>
+                <w:bCs/>
+                <w:sz w:val="19"/>
+              </w:rPr>
+              <w:t xml:space="preserve">            if (res.ok) {</w:t>
+            </w:r>
+          </w:p>
+          <w:p>
+            <w:pPr>
+              <w:spacing w:before="0" w:after="0" w:line="240" w:lineRule="auto"/>
+              <w:rPr>
+                <w:bCs/>
+              </w:rPr>
+            </w:pPr>
+            <w:r>
+              <w:rPr>
+                <w:rFonts w:ascii="Cascadia Mono Light" w:hAnsi="Cascadia Mono Light" w:cs="Cascadia Mono Light"/>
+                <w:bCs/>
+                <w:sz w:val="19"/>
+              </w:rPr>
+              <w:t xml:space="preserve">                backendAvailable = true;</w:t>
+            </w:r>
+          </w:p>
+          <w:p>
+            <w:pPr>
+              <w:spacing w:before="0" w:after="0" w:line="240" w:lineRule="auto"/>
+              <w:rPr>
+                <w:bCs/>
+              </w:rPr>
+            </w:pPr>
+            <w:r>
+              <w:rPr>
+                <w:rFonts w:ascii="Cascadia Mono Light" w:hAnsi="Cascadia Mono Light" w:cs="Cascadia Mono Light"/>
+                <w:bCs/>
+                <w:sz w:val="19"/>
+              </w:rPr>
+              <w:t xml:space="preserve">                console.log("[SentinelDB] SQLite Backend Connected");</w:t>
+            </w:r>
+          </w:p>
+          <w:p>
+            <w:pPr>
+              <w:spacing w:before="0" w:after="0" w:line="240" w:lineRule="auto"/>
+              <w:rPr>
+                <w:bCs/>
+              </w:rPr>
+            </w:pPr>
+            <w:r>
+              <w:rPr>
+                <w:rFonts w:ascii="Cascadia Mono Light" w:hAnsi="Cascadia Mono Light" w:cs="Cascadia Mono Light"/>
+                <w:bCs/>
+                <w:sz w:val="19"/>
+              </w:rPr>
+              <w:t xml:space="preserve">            }</w:t>
+            </w:r>
+          </w:p>
+          <w:p>
+            <w:pPr>
+              <w:spacing w:before="0" w:after="0" w:line="240" w:lineRule="auto"/>
+              <w:rPr>
+                <w:bCs/>
+              </w:rPr>
+            </w:pPr>
+            <w:r>
+              <w:rPr>
+                <w:rFonts w:ascii="Cascadia Mono Light" w:hAnsi="Cascadia Mono Light" w:cs="Cascadia Mono Light"/>
+                <w:bCs/>
+                <w:sz w:val="19"/>
+              </w:rPr>
+              <w:t xml:space="preserve">        } catch (e) {</w:t>
+            </w:r>
+          </w:p>
+          <w:p>
+            <w:pPr>
+              <w:spacing w:before="0" w:after="0" w:line="240" w:lineRule="auto"/>
+              <w:rPr>
+                <w:bCs/>
+              </w:rPr>
+            </w:pPr>
+            <w:r>
+              <w:rPr>
+                <w:rFonts w:ascii="Cascadia Mono Light" w:hAnsi="Cascadia Mono Light" w:cs="Cascadia Mono Light"/>
+                <w:bCs/>
+                <w:sz w:val="19"/>
+              </w:rPr>
+              <w:t xml:space="preserve">            </w:t>
+            </w:r>
+            <w:r>
+              <w:rPr>
+                <w:rFonts w:ascii="Cascadia Mono Light" w:hAnsi="Cascadia Mono Light" w:cs="Cascadia Mono Light"/>
+                <w:bCs/>
+                <w:sz w:val="19"/>
+              </w:rPr>
+              <w:t>backendAvailable = false;</w:t>
+            </w:r>
+          </w:p>
+          <w:p>
+            <w:pPr>
+              <w:spacing w:before="0" w:after="0" w:line="240" w:lineRule="auto"/>
+              <w:rPr>
+                <w:bCs/>
+              </w:rPr>
+            </w:pPr>
+            <w:r>
+              <w:rPr>
+                <w:rFonts w:ascii="Cascadia Mono Light" w:hAnsi="Cascadia Mono Light" w:cs="Cascadia Mono Light"/>
+                <w:bCs/>
+                <w:sz w:val="19"/>
+              </w:rPr>
+              <w:t xml:space="preserve">            console.log("[SentinelDB] Offline. Using IndexedDB.");</w:t>
+            </w:r>
+          </w:p>
+          <w:p>
+            <w:pPr>
+              <w:spacing w:before="0" w:after="0" w:line="240" w:lineRule="auto"/>
+              <w:rPr>
+                <w:bCs/>
+              </w:rPr>
+            </w:pPr>
+            <w:r>
+              <w:rPr>
+                <w:rFonts w:ascii="Cascadia Mono Light" w:hAnsi="Cascadia Mono Light" w:cs="Cascadia Mono Light"/>
+                <w:bCs/>
+                <w:sz w:val="19"/>
+              </w:rPr>
+              <w:t xml:space="preserve">        }</w:t>
+            </w:r>
+          </w:p>
+          <w:p>
+            <w:pPr>
+              <w:spacing w:before="0" w:after="0" w:line="240" w:lineRule="auto"/>
+              <w:rPr>
+                <w:bCs/>
+              </w:rPr>
+            </w:pPr>
+            <w:r>
+              <w:rPr>
+                <w:rFonts w:ascii="Cascadia Mono Light" w:hAnsi="Cascadia Mono Light" w:cs="Cascadia Mono Light"/>
+                <w:bCs/>
+                <w:sz w:val="19"/>
+              </w:rPr>
+              <w:t xml:space="preserve">        return new Promise((resolve, reject) =&gt; {</w:t>
+            </w:r>
+          </w:p>
+          <w:p>
+            <w:pPr>
+              <w:spacing w:before="0" w:after="0" w:line="240" w:lineRule="auto"/>
+              <w:rPr>
+                <w:bCs/>
+              </w:rPr>
+            </w:pPr>
+            <w:r>
+              <w:rPr>
+                <w:rFonts w:ascii="Cascadia Mono Light" w:hAnsi="Cascadia Mono Light" w:cs="Cascadia Mono Light"/>
+                <w:bCs/>
+                <w:sz w:val="19"/>
+              </w:rPr>
+              <w:t xml:space="preserve">            const request = indexedDB.open(DB_NAME, DB_VERSION);</w:t>
+            </w:r>
+          </w:p>
+          <w:p>
+            <w:pPr>
+              <w:spacing w:before="0" w:after="0" w:line="240" w:lineRule="auto"/>
+              <w:rPr>
+                <w:bCs/>
+              </w:rPr>
+            </w:pPr>
+            <w:r>
+              <w:rPr>
+                <w:rFonts w:ascii="Cascadia Mono Light" w:hAnsi="Cascadia Mono Light" w:cs="Cascadia Mono Light"/>
+                <w:bCs/>
+                <w:sz w:val="19"/>
+              </w:rPr>
+              <w:t xml:space="preserve">            request.onupgradeneeded = (e) =&gt; {</w:t>
+            </w:r>
+          </w:p>
+          <w:p>
+            <w:pPr>
+              <w:spacing w:before="0" w:after="0" w:line="240" w:lineRule="auto"/>
+              <w:rPr>
+                <w:bCs/>
+              </w:rPr>
+            </w:pPr>
+            <w:r>
+              <w:rPr>
+                <w:rFonts w:ascii="Cascadia Mono Light" w:hAnsi="Cascadia Mono Light" w:cs="Cascadia Mono Light"/>
+                <w:bCs/>
+                <w:sz w:val="19"/>
+              </w:rPr>
+              <w:t xml:space="preserve">                const db = e.target.result;</w:t>
+            </w:r>
+          </w:p>
+          <w:p>
+            <w:pPr>
+              <w:spacing w:before="0" w:after="0" w:line="240" w:lineRule="auto"/>
+              <w:rPr>
+                <w:bCs/>
+              </w:rPr>
+            </w:pPr>
+            <w:r>
+              <w:rPr>
+                <w:rFonts w:ascii="Cascadia Mono Light" w:hAnsi="Cascadia Mono Light" w:cs="Cascadia Mono Light"/>
+                <w:bCs/>
+                <w:sz w:val="19"/>
+              </w:rPr>
+              <w:t xml:space="preserve">                if (!db.objectStoreNames.contains('analyses')) {</w:t>
+            </w:r>
+          </w:p>
+          <w:p>
+            <w:pPr>
+              <w:spacing w:before="0" w:after="0" w:line="240" w:lineRule="auto"/>
+              <w:rPr>
+                <w:bCs/>
+              </w:rPr>
+            </w:pPr>
+            <w:r>
+              <w:rPr>
+                <w:rFonts w:ascii="Cascadia Mono Light" w:hAnsi="Cascadia Mono Light" w:cs="Cascadia Mono Light"/>
+                <w:bCs/>
+                <w:sz w:val="19"/>
+              </w:rPr>
+              <w:t xml:space="preserve">                    const store = db.createObjectStore('analyses',</w:t>
+            </w:r>
+          </w:p>
+          <w:p>
+            <w:pPr>
+              <w:spacing w:before="0" w:after="0" w:line="240" w:lineRule="auto"/>
+              <w:rPr>
+                <w:bCs/>
+              </w:rPr>
+            </w:pPr>
+            <w:r>
+              <w:rPr>
+                <w:rFonts w:ascii="Cascadia Mono Light" w:hAnsi="Cascadia Mono Light" w:cs="Cascadia Mono Light"/>
+                <w:bCs/>
+                <w:sz w:val="19"/>
+              </w:rPr>
+              <w:t xml:space="preserve">                        { keyPath</w:t>
+            </w:r>
+            <w:r>
+              <w:rPr>
+                <w:rFonts w:ascii="Cascadia Mono Light" w:hAnsi="Cascadia Mono Light" w:cs="Cascadia Mono Light"/>
+                <w:bCs/>
+                <w:sz w:val="19"/>
+              </w:rPr>
+              <w:t>: 'id' });</w:t>
+            </w:r>
+          </w:p>
+          <w:p>
+            <w:pPr>
+              <w:spacing w:before="0" w:after="0" w:line="240" w:lineRule="auto"/>
+              <w:rPr>
+                <w:bCs/>
+              </w:rPr>
+            </w:pPr>
+            <w:r>
+              <w:rPr>
+                <w:rFonts w:ascii="Cascadia Mono Light" w:hAnsi="Cascadia Mono Light" w:cs="Cascadia Mono Light"/>
+                <w:bCs/>
+                <w:sz w:val="19"/>
+              </w:rPr>
+              <w:t xml:space="preserve">                    store.createIndex('username', 'username');</w:t>
+            </w:r>
+          </w:p>
+          <w:p>
+            <w:pPr>
+              <w:spacing w:before="0" w:after="0" w:line="240" w:lineRule="auto"/>
+              <w:rPr>
+                <w:bCs/>
+              </w:rPr>
+            </w:pPr>
+            <w:r>
+              <w:rPr>
+                <w:rFonts w:ascii="Cascadia Mono Light" w:hAnsi="Cascadia Mono Light" w:cs="Cascadia Mono Light"/>
+                <w:bCs/>
+                <w:sz w:val="19"/>
+              </w:rPr>
+              <w:t xml:space="preserve">                    store.createIndex('timestamp', 'timestamp');</w:t>
+            </w:r>
+          </w:p>
+          <w:p>
+            <w:pPr>
+              <w:spacing w:before="0" w:after="0" w:line="240" w:lineRule="auto"/>
+            </w:pPr>
+            <w:r>
+              <w:rPr>
+                <w:rFonts w:ascii="Cascadia Mono Light" w:hAnsi="Cascadia Mono Light" w:cs="Cascadia Mono Light"/>
+                <w:bCs/>
+                <w:sz w:val="19"/>
+              </w:rPr>
+              <w:t xml:space="preserve">                }</w:t>
+            </w:r>
+          </w:p>
+          <w:p>
+            <w:pPr>
+              <w:spacing w:before="0" w:after="0" w:line="240" w:lineRule="auto"/>
+              <w:rPr>
+                <w:rFonts w:ascii="Cascadia Mono Light" w:hAnsi="Cascadia Mono Light"/>
+                <w:bCs/>
+              </w:rPr>
+            </w:pPr>
+            <w:r>
+              <w:rPr>
+                <w:rFonts w:ascii="Cascadia Mono Light" w:hAnsi="Cascadia Mono Light" w:cs="Cascadia Mono Light"/>
+                <w:bCs/>
+                <w:sz w:val="19"/>
+              </w:rPr>
+              <w:t xml:space="preserve">            };</w:t>
+            </w:r>
+          </w:p>
+          <w:p>
+            <w:pPr>
+              <w:spacing w:before="0" w:after="0" w:line="240" w:lineRule="auto"/>
+              <w:rPr>
+                <w:rFonts w:ascii="Cascadia Mono Light" w:hAnsi="Cascadia Mono Light"/>
+                <w:bCs/>
+              </w:rPr>
+            </w:pPr>
+            <w:r>
+              <w:rPr>
+                <w:rFonts w:ascii="Cascadia Mono Light" w:hAnsi="Cascadia Mono Light" w:cs="Cascadia Mono Light"/>
+                <w:bCs/>
+                <w:sz w:val="19"/>
+              </w:rPr>
+              <w:t xml:space="preserve">            request.onsuccess = (e) =&gt; {</w:t>
+            </w:r>
+          </w:p>
+          <w:p>
+            <w:pPr>
+              <w:spacing w:before="0" w:after="0" w:line="240" w:lineRule="auto"/>
+              <w:rPr>
+                <w:rFonts w:ascii="Cascadia Mono Light" w:hAnsi="Cascadia Mono Light"/>
+                <w:bCs/>
+              </w:rPr>
+            </w:pPr>
+            <w:r>
+              <w:rPr>
+                <w:rFonts w:ascii="Cascadia Mono Light" w:hAnsi="Cascadia Mono Light" w:cs="Cascadia Mono Light"/>
+                <w:bCs/>
+                <w:sz w:val="19"/>
+              </w:rPr>
+              <w:t xml:space="preserve">                this.db = e.target.result;</w:t>
+            </w:r>
+          </w:p>
+          <w:p>
+            <w:pPr>
+              <w:spacing w:before="0" w:after="0" w:line="240" w:lineRule="auto"/>
+              <w:rPr>
+                <w:rFonts w:ascii="Cascadia Mono Light" w:hAnsi="Cascadia Mono Light"/>
+                <w:bCs/>
+              </w:rPr>
+            </w:pPr>
+            <w:r>
+              <w:rPr>
+                <w:rFonts w:ascii="Cascadia Mono Light" w:hAnsi="Cascadia Mono Light" w:cs="Cascadia Mono Light"/>
+                <w:bCs/>
+                <w:sz w:val="19"/>
+              </w:rPr>
+              <w:t xml:space="preserve">                this.initialized = true;</w:t>
+            </w:r>
+          </w:p>
+          <w:p>
+            <w:pPr>
+              <w:spacing w:before="0" w:after="0" w:line="240" w:lineRule="auto"/>
+              <w:rPr>
+                <w:rFonts w:ascii="Cascadia Mono Light" w:hAnsi="Cascadia Mono Light"/>
+                <w:bCs/>
+              </w:rPr>
+            </w:pPr>
+            <w:r>
+              <w:rPr>
+                <w:rFonts w:ascii="Cascadia Mono Light" w:hAnsi="Cascadia Mono Light" w:cs="Cascadia Mono Light"/>
+                <w:bCs/>
+                <w:sz w:val="19"/>
+              </w:rPr>
+              <w:lastRenderedPageBreak/>
+              <w:t xml:space="preserve">                resolve();</w:t>
+            </w:r>
+          </w:p>
+          <w:p>
+            <w:pPr>
+              <w:spacing w:before="0" w:after="0" w:line="240" w:lineRule="auto"/>
+              <w:rPr>
+                <w:rFonts w:ascii="Cascadia Mono Light" w:hAnsi="Cascadia Mono Light"/>
+                <w:bCs/>
+              </w:rPr>
+            </w:pPr>
+            <w:r>
+              <w:rPr>
+                <w:rFonts w:ascii="Cascadia Mono Light" w:hAnsi="Cascadia Mono Light" w:cs="Cascadia Mono Light"/>
+                <w:bCs/>
+                <w:sz w:val="19"/>
+              </w:rPr>
+              <w:t xml:space="preserve">            };</w:t>
+            </w:r>
+          </w:p>
+          <w:p>
+            <w:pPr>
+              <w:spacing w:before="0" w:after="0" w:line="240" w:lineRule="auto"/>
+              <w:rPr>
+                <w:rFonts w:ascii="Cascadia Mono Light" w:hAnsi="Cascadia Mono Light"/>
+                <w:bCs/>
+              </w:rPr>
+            </w:pPr>
+            <w:r>
+              <w:rPr>
+                <w:rFonts w:ascii="Cascadia Mono Light" w:hAnsi="Cascadia Mono Light" w:cs="Cascadia Mono Light"/>
+                <w:bCs/>
+                <w:sz w:val="19"/>
+              </w:rPr>
+              <w:t xml:space="preserve">        });</w:t>
+            </w:r>
+          </w:p>
+          <w:p>
+            <w:pPr>
+              <w:spacing w:before="0" w:after="0" w:line="240" w:lineRule="auto"/>
+              <w:rPr>
+                <w:rFonts w:ascii="Cascadia Mono Light" w:hAnsi="Cascadia Mono Light"/>
+                <w:bCs/>
+              </w:rPr>
+            </w:pPr>
+            <w:r>
+              <w:rPr>
+                <w:rFonts w:ascii="Cascadia Mono Light" w:hAnsi="Cascadia Mono Light" w:cs="Cascadia Mono Light"/>
+                <w:bCs/>
+                <w:sz w:val="19"/>
+              </w:rPr>
+              <w:t xml:space="preserve">    }</w:t>
+            </w:r>
+          </w:p>
+          <w:p>
+            <w:pPr>
+              <w:spacing w:before="0" w:after="0" w:line="240" w:lineRule="auto"/>
+            </w:pPr>
+            <w:r>
+              <w:rPr>
+                <w:rFonts w:ascii="Cascadia Mono Light" w:hAnsi="Cascadia Mono Light" w:cs="Cascadia Mono Light"/>
+                <w:bCs/>
+                <w:sz w:val="19"/>
+              </w:rPr>
+              <w:t>}</w:t>
+            </w:r>
+          </w:p>
+        </w:tc>
+      </w:tr>
+    </w:tbl>
+    <w:p>
+      <w:pPr>
+        <w:jc w:val="center"/>
+        <w:rPr>
+          <w:b/>
+          <w:bCs/>
+          <w:sz w:val="22"/>
+          <w:szCs w:val="22"/>
+        </w:rPr>
+      </w:pPr>
+      <w:r>
+        <w:rPr>
+          <w:b/>
+          <w:bCs/>
+          <w:sz w:val="22"/>
+          <w:szCs w:val="22"/>
+        </w:rPr>
+        <w:lastRenderedPageBreak/>
+        <w:t>Figure 4.18: Code Snippet of SentinelDB Storage &amp; REST Sync Module</w:t>
+      </w:r>
+    </w:p>
+    <w:p>
+      <w:pPr>
+        <w:pStyle w:val="Heading3"/>
+      </w:pPr>
+      <w:r>
+        <w:t>4.1.2.19. User Authentication &amp; Session Controller Module</w:t>
+      </w:r>
+    </w:p>
+    <w:p>
+      <w:r>
+        <w:t>The js/utils/auth.js module manages authentication workflows, account creation, and user sessions. It handles form submissions for login and registration, enforcing required email address fields for new accounts. The module supports dual login credentials, validating input against either username or email address. It updates header navigation UI components, displays user avatars, and manages the #logout-modal confirmation dialog equipped with a transparent outline Cancel button styled with dark grey text (#64748b).</w:t>
+      </w:r>
+    </w:p>
+    <w:tbl>
+      <w:tblPr>
+        <w:tblW w:w="0" w:type="auto"/>
+        <w:jc w:val="center"/>
+        <w:tblLook w:val="04A0" w:firstRow="1" w:lastRow="0" w:firstColumn="1" w:lastColumn="0" w:noHBand="0" w:noVBand="1"/>
+      </w:tblPr>
+      <w:tblGrid>
+        <w:gridCol w:w="8965"/>
+      </w:tblGrid>
+      <w:tr>
+        <w:trPr>
+          <w:jc w:val="center"/>
+        </w:trPr>
+        <w:tc>
+          <w:tcPr>
+            <w:tcW w:w="9000" w:type="dxa"/>
+            <w:tcBorders>
+              <w:top w:val="single" w:sz="4" w:space="0" w:color="CBD5E1"/>
+              <w:left w:val="single" w:sz="24" w:space="0" w:color="2563EB"/>
+              <w:bottom w:val="single" w:sz="4" w:space="0" w:color="CBD5E1"/>
+              <w:right w:val="single" w:sz="4" w:space="0" w:color="CBD5E1"/>
+            </w:tcBorders>
+            <w:shd w:val="clear" w:color="auto" w:fill="F8FAFC"/>
+            <w:tcMar>
+              <w:top w:w="120" w:type="dxa"/>
+              <w:left w:w="180" w:type="dxa"/>
+              <w:bottom w:w="120" w:type="dxa"/>
+              <w:right w:w="180" w:type="dxa"/>
+            </w:tcMar>
+          </w:tcPr>
+          <w:p>
+            <w:pPr>
+              <w:spacing w:before="0" w:after="0" w:line="240" w:lineRule="auto"/>
+              <w:rPr>
+                <w:bCs/>
+              </w:rPr>
+            </w:pPr>
+            <w:r>
+              <w:rPr>
+                <w:rFonts w:ascii="Cascadia Mono Light" w:hAnsi="Cascadia Mono Light" w:cs="Cascadia Mono Light"/>
+                <w:bCs/>
+                <w:sz w:val="19"/>
+              </w:rPr>
+              <w:t>// js/utils/auth.j</w:t>
+            </w:r>
+            <w:r>
+              <w:rPr>
+                <w:rFonts w:ascii="Cascadia Mono Light" w:hAnsi="Cascadia Mono Light" w:cs="Cascadia Mono Light"/>
+                <w:bCs/>
+                <w:sz w:val="19"/>
+              </w:rPr>
+              <w:t>s</w:t>
+            </w:r>
+          </w:p>
+          <w:p>
+            <w:pPr>
+              <w:spacing w:before="0" w:after="0" w:line="240" w:lineRule="auto"/>
+              <w:rPr>
+                <w:bCs/>
+              </w:rPr>
+            </w:pPr>
+            <w:r>
+              <w:rPr>
+                <w:rFonts w:ascii="Cascadia Mono Light" w:hAnsi="Cascadia Mono Light" w:cs="Cascadia Mono Light"/>
+                <w:bCs/>
+                <w:sz w:val="19"/>
+              </w:rPr>
+              <w:t>// Login Form Handler</w:t>
+            </w:r>
+          </w:p>
+          <w:p>
+            <w:pPr>
+              <w:spacing w:before="0" w:after="0" w:line="240" w:lineRule="auto"/>
+              <w:rPr>
+                <w:bCs/>
+              </w:rPr>
+            </w:pPr>
+            <w:r>
+              <w:rPr>
+                <w:rFonts w:ascii="Cascadia Mono Light" w:hAnsi="Cascadia Mono Light" w:cs="Cascadia Mono Light"/>
+                <w:bCs/>
+                <w:sz w:val="19"/>
+              </w:rPr>
+              <w:t>loginForm.addEventListener('submit', async (e) =&gt; {</w:t>
+            </w:r>
+          </w:p>
+          <w:p>
+            <w:pPr>
+              <w:spacing w:before="0" w:after="0" w:line="240" w:lineRule="auto"/>
+              <w:rPr>
+                <w:bCs/>
+              </w:rPr>
+            </w:pPr>
+            <w:r>
+              <w:rPr>
+                <w:rFonts w:ascii="Cascadia Mono Light" w:hAnsi="Cascadia Mono Light" w:cs="Cascadia Mono Light"/>
+                <w:bCs/>
+                <w:sz w:val="19"/>
+              </w:rPr>
+              <w:t xml:space="preserve">    e.preventDefault();</w:t>
+            </w:r>
+          </w:p>
+          <w:p>
+            <w:pPr>
+              <w:spacing w:before="0" w:after="0" w:line="240" w:lineRule="auto"/>
+              <w:rPr>
+                <w:bCs/>
+              </w:rPr>
+            </w:pPr>
+            <w:r>
+              <w:rPr>
+                <w:rFonts w:ascii="Cascadia Mono Light" w:hAnsi="Cascadia Mono Light" w:cs="Cascadia Mono Light"/>
+                <w:bCs/>
+                <w:sz w:val="19"/>
+              </w:rPr>
+              <w:t xml:space="preserve">    clearMessages();</w:t>
+            </w:r>
+          </w:p>
+          <w:p>
+            <w:pPr>
+              <w:spacing w:before="0" w:after="0" w:line="240" w:lineRule="auto"/>
+              <w:rPr>
+                <w:bCs/>
+              </w:rPr>
+            </w:pPr>
+            <w:r>
+              <w:rPr>
+                <w:rFonts w:ascii="Cascadia Mono Light" w:hAnsi="Cascadia Mono Light" w:cs="Cascadia Mono Light"/>
+                <w:bCs/>
+                <w:sz w:val="19"/>
+              </w:rPr>
+              <w:t xml:space="preserve">    const username = document.getElementById('login-username')</w:t>
+            </w:r>
+          </w:p>
+          <w:p>
+            <w:pPr>
+              <w:spacing w:before="0" w:after="0" w:line="240" w:lineRule="auto"/>
+              <w:rPr>
+                <w:bCs/>
+              </w:rPr>
+            </w:pPr>
+            <w:r>
+              <w:rPr>
+                <w:rFonts w:ascii="Cascadia Mono Light" w:hAnsi="Cascadia Mono Light" w:cs="Cascadia Mono Light"/>
+                <w:bCs/>
+                <w:sz w:val="19"/>
+              </w:rPr>
+              <w:t xml:space="preserve">        .value.trim();</w:t>
+            </w:r>
+          </w:p>
+          <w:p>
+            <w:pPr>
+              <w:spacing w:before="0" w:after="0" w:line="240" w:lineRule="auto"/>
+              <w:rPr>
+                <w:bCs/>
+              </w:rPr>
+            </w:pPr>
+            <w:r>
+              <w:rPr>
+                <w:rFonts w:ascii="Cascadia Mono Light" w:hAnsi="Cascadia Mono Light" w:cs="Cascadia Mono Light"/>
+                <w:bCs/>
+                <w:sz w:val="19"/>
+              </w:rPr>
+              <w:t xml:space="preserve">    const password = document.getElementById('log</w:t>
+            </w:r>
+            <w:r>
+              <w:rPr>
+                <w:rFonts w:ascii="Cascadia Mono Light" w:hAnsi="Cascadia Mono Light" w:cs="Cascadia Mono Light"/>
+                <w:bCs/>
+                <w:sz w:val="19"/>
+              </w:rPr>
+              <w:t>in-password')</w:t>
+            </w:r>
+          </w:p>
+          <w:p>
+            <w:pPr>
+              <w:spacing w:before="0" w:after="0" w:line="240" w:lineRule="auto"/>
+              <w:rPr>
+                <w:bCs/>
+              </w:rPr>
+            </w:pPr>
+            <w:r>
+              <w:rPr>
+                <w:rFonts w:ascii="Cascadia Mono Light" w:hAnsi="Cascadia Mono Light" w:cs="Cascadia Mono Light"/>
+                <w:bCs/>
+                <w:sz w:val="19"/>
+              </w:rPr>
+              <w:t xml:space="preserve">        .value;</w:t>
+            </w:r>
+          </w:p>
+          <w:p>
+            <w:pPr>
+              <w:spacing w:before="0" w:after="0" w:line="240" w:lineRule="auto"/>
+              <w:rPr>
+                <w:bCs/>
+              </w:rPr>
+            </w:pPr>
+            <w:r>
+              <w:rPr>
+                <w:rFonts w:ascii="Cascadia Mono Light" w:hAnsi="Cascadia Mono Light" w:cs="Cascadia Mono Light"/>
+                <w:bCs/>
+                <w:sz w:val="19"/>
+              </w:rPr>
+              <w:t xml:space="preserve">    try {</w:t>
+            </w:r>
+          </w:p>
+          <w:p>
+            <w:pPr>
+              <w:spacing w:before="0" w:after="0" w:line="240" w:lineRule="auto"/>
+              <w:rPr>
+                <w:bCs/>
+              </w:rPr>
+            </w:pPr>
+            <w:r>
+              <w:rPr>
+                <w:rFonts w:ascii="Cascadia Mono Light" w:hAnsi="Cascadia Mono Light" w:cs="Cascadia Mono Light"/>
+                <w:bCs/>
+                <w:sz w:val="19"/>
+              </w:rPr>
+              <w:t xml:space="preserve">        const user = await window.SentinelDB</w:t>
+            </w:r>
+          </w:p>
+          <w:p>
+            <w:pPr>
+              <w:spacing w:before="0" w:after="0" w:line="240" w:lineRule="auto"/>
+              <w:rPr>
+                <w:bCs/>
+              </w:rPr>
+            </w:pPr>
+            <w:r>
+              <w:rPr>
+                <w:rFonts w:ascii="Cascadia Mono Light" w:hAnsi="Cascadia Mono Light" w:cs="Cascadia Mono Light"/>
+                <w:bCs/>
+                <w:sz w:val="19"/>
+              </w:rPr>
+              <w:t xml:space="preserve">            .loginUser(username, password);</w:t>
+            </w:r>
+          </w:p>
+          <w:p>
+            <w:pPr>
+              <w:spacing w:before="0" w:after="0" w:line="240" w:lineRule="auto"/>
+              <w:rPr>
+                <w:bCs/>
+              </w:rPr>
+            </w:pPr>
+            <w:r>
+              <w:rPr>
+                <w:rFonts w:ascii="Cascadia Mono Light" w:hAnsi="Cascadia Mono Light" w:cs="Cascadia Mono Light"/>
+                <w:bCs/>
+                <w:sz w:val="19"/>
+              </w:rPr>
+              <w:t xml:space="preserve">        showSuccess(`Welcome back, ${user.username}!`);</w:t>
+            </w:r>
+          </w:p>
+          <w:p>
+            <w:pPr>
+              <w:spacing w:before="0" w:after="0" w:line="240" w:lineRule="auto"/>
+              <w:rPr>
+                <w:bCs/>
+              </w:rPr>
+            </w:pPr>
+            <w:r>
+              <w:rPr>
+                <w:rFonts w:ascii="Cascadia Mono Light" w:hAnsi="Cascadia Mono Light" w:cs="Cascadia Mono Light"/>
+                <w:bCs/>
+                <w:sz w:val="19"/>
+              </w:rPr>
+              <w:t xml:space="preserve">        updateUIForSession();</w:t>
+            </w:r>
+          </w:p>
+          <w:p>
+            <w:pPr>
+              <w:spacing w:before="0" w:after="0" w:line="240" w:lineRule="auto"/>
+              <w:rPr>
+                <w:bCs/>
+              </w:rPr>
+            </w:pPr>
+            <w:r>
+              <w:rPr>
+                <w:rFonts w:ascii="Cascadia Mono Light" w:hAnsi="Cascadia Mono Light" w:cs="Cascadia Mono Light"/>
+                <w:bCs/>
+                <w:sz w:val="19"/>
+              </w:rPr>
+              <w:t xml:space="preserve">        setTimeout(() =&gt; { showModal(false); }, 700);</w:t>
+            </w:r>
+          </w:p>
+          <w:p>
+            <w:pPr>
+              <w:spacing w:before="0" w:after="0" w:line="240" w:lineRule="auto"/>
+              <w:rPr>
+                <w:bCs/>
+              </w:rPr>
+            </w:pPr>
+            <w:r>
+              <w:rPr>
+                <w:rFonts w:ascii="Cascadia Mono Light" w:hAnsi="Cascadia Mono Light" w:cs="Cascadia Mono Light"/>
+                <w:bCs/>
+                <w:sz w:val="19"/>
+              </w:rPr>
+              <w:t xml:space="preserve">    } catch (err) { showError(err.message); }</w:t>
+            </w:r>
+          </w:p>
+          <w:p>
+            <w:pPr>
+              <w:spacing w:before="0" w:after="0" w:line="240" w:lineRule="auto"/>
+              <w:rPr>
+                <w:bCs/>
+              </w:rPr>
+            </w:pPr>
+            <w:r>
+              <w:rPr>
+                <w:rFonts w:ascii="Cascadia Mono Light" w:hAnsi="Cascadia Mono Light" w:cs="Cascadia Mono Light"/>
+                <w:bCs/>
+                <w:sz w:val="19"/>
+              </w:rPr>
+              <w:t>});</w:t>
+            </w:r>
+          </w:p>
+          <w:p>
+            <w:pPr>
+              <w:spacing w:before="0" w:after="0" w:line="240" w:lineRule="auto"/>
+              <w:rPr>
+                <w:bCs/>
+              </w:rPr>
+            </w:pPr>
+          </w:p>
+          <w:p>
+            <w:pPr>
+              <w:spacing w:before="0" w:after="0" w:line="240" w:lineRule="auto"/>
+              <w:rPr>
+                <w:bCs/>
+              </w:rPr>
+            </w:pPr>
+            <w:r>
+              <w:rPr>
+                <w:rFonts w:ascii="Cascadia Mono Light" w:hAnsi="Cascadia Mono Light" w:cs="Cascadia Mono Light"/>
+                <w:bCs/>
+                <w:sz w:val="19"/>
+              </w:rPr>
+              <w:t>// Register Form Handler</w:t>
+            </w:r>
+          </w:p>
+          <w:p>
+            <w:pPr>
+              <w:spacing w:before="0" w:after="0" w:line="240" w:lineRule="auto"/>
+              <w:rPr>
+                <w:bCs/>
+              </w:rPr>
+            </w:pPr>
+            <w:r>
+              <w:rPr>
+                <w:rFonts w:ascii="Cascadia Mono Light" w:hAnsi="Cascadia Mono Light" w:cs="Cascadia Mono Light"/>
+                <w:bCs/>
+                <w:sz w:val="19"/>
+              </w:rPr>
+              <w:t>registerForm.addEventListener('submit', async (e) =&gt; {</w:t>
+            </w:r>
+          </w:p>
+          <w:p>
+            <w:pPr>
+              <w:spacing w:before="0" w:after="0" w:line="240" w:lineRule="auto"/>
+              <w:rPr>
+                <w:bCs/>
+              </w:rPr>
+            </w:pPr>
+            <w:r>
+              <w:rPr>
+                <w:rFonts w:ascii="Cascadia Mono Light" w:hAnsi="Cascadia Mono Light" w:cs="Cascadia Mono Light"/>
+                <w:bCs/>
+                <w:sz w:val="19"/>
+              </w:rPr>
+              <w:t xml:space="preserve">    e.preventDefault();</w:t>
+            </w:r>
+          </w:p>
+          <w:p>
+            <w:pPr>
+              <w:spacing w:before="0" w:after="0" w:line="240" w:lineRule="auto"/>
+              <w:rPr>
+                <w:bCs/>
+              </w:rPr>
+            </w:pPr>
+            <w:r>
+              <w:rPr>
+                <w:rFonts w:ascii="Cascadia Mono Light" w:hAnsi="Cascadia Mono Light" w:cs="Cascadia Mono Light"/>
+                <w:bCs/>
+                <w:sz w:val="19"/>
+              </w:rPr>
+              <w:t xml:space="preserve">    clearMessages();</w:t>
+            </w:r>
+          </w:p>
+          <w:p>
+            <w:pPr>
+              <w:spacing w:before="0" w:after="0" w:line="240" w:lineRule="auto"/>
+              <w:rPr>
+                <w:bCs/>
+              </w:rPr>
+            </w:pPr>
+            <w:r>
+              <w:rPr>
+                <w:rFonts w:ascii="Cascadia Mono Light" w:hAnsi="Cascadia Mono Light" w:cs="Cascadia Mono Light"/>
+                <w:bCs/>
+                <w:sz w:val="19"/>
+              </w:rPr>
+              <w:t xml:space="preserve">    const username = docum</w:t>
+            </w:r>
+            <w:r>
+              <w:rPr>
+                <w:rFonts w:ascii="Cascadia Mono Light" w:hAnsi="Cascadia Mono Light" w:cs="Cascadia Mono Light"/>
+                <w:bCs/>
+                <w:sz w:val="19"/>
+              </w:rPr>
+              <w:t>ent.getElementById('reg-username')</w:t>
+            </w:r>
+          </w:p>
+          <w:p>
+            <w:pPr>
+              <w:spacing w:before="0" w:after="0" w:line="240" w:lineRule="auto"/>
+              <w:rPr>
+                <w:bCs/>
+              </w:rPr>
+            </w:pPr>
+            <w:r>
+              <w:rPr>
+                <w:rFonts w:ascii="Cascadia Mono Light" w:hAnsi="Cascadia Mono Light" w:cs="Cascadia Mono Light"/>
+                <w:bCs/>
+                <w:sz w:val="19"/>
+              </w:rPr>
+              <w:t xml:space="preserve">        .value.trim();</w:t>
+            </w:r>
+          </w:p>
+          <w:p>
+            <w:pPr>
+              <w:spacing w:before="0" w:after="0" w:line="240" w:lineRule="auto"/>
+              <w:rPr>
+                <w:bCs/>
+              </w:rPr>
+            </w:pPr>
+            <w:r>
+              <w:rPr>
+                <w:rFonts w:ascii="Cascadia Mono Light" w:hAnsi="Cascadia Mono Light" w:cs="Cascadia Mono Light"/>
+                <w:bCs/>
+                <w:sz w:val="19"/>
+              </w:rPr>
+              <w:t xml:space="preserve">    const email = document.getElementById('reg-email')</w:t>
+            </w:r>
+          </w:p>
+          <w:p>
+            <w:pPr>
+              <w:spacing w:before="0" w:after="0" w:line="240" w:lineRule="auto"/>
+              <w:rPr>
+                <w:bCs/>
+              </w:rPr>
+            </w:pPr>
+            <w:r>
+              <w:rPr>
+                <w:rFonts w:ascii="Cascadia Mono Light" w:hAnsi="Cascadia Mono Light" w:cs="Cascadia Mono Light"/>
+                <w:bCs/>
+                <w:sz w:val="19"/>
+              </w:rPr>
+              <w:t xml:space="preserve">        .value.trim();</w:t>
+            </w:r>
+          </w:p>
+          <w:p>
+            <w:pPr>
+              <w:spacing w:before="0" w:after="0" w:line="240" w:lineRule="auto"/>
+              <w:rPr>
+                <w:bCs/>
+              </w:rPr>
+            </w:pPr>
+            <w:r>
+              <w:rPr>
+                <w:rFonts w:ascii="Cascadia Mono Light" w:hAnsi="Cascadia Mono Light" w:cs="Cascadia Mono Light"/>
+                <w:bCs/>
+                <w:sz w:val="19"/>
+              </w:rPr>
+              <w:t xml:space="preserve">    const password = document.getElementById('reg-password')</w:t>
+            </w:r>
+          </w:p>
+          <w:p>
+            <w:pPr>
+              <w:spacing w:before="0" w:after="0" w:line="240" w:lineRule="auto"/>
+              <w:rPr>
+                <w:bCs/>
+              </w:rPr>
+            </w:pPr>
+            <w:r>
+              <w:rPr>
+                <w:rFonts w:ascii="Cascadia Mono Light" w:hAnsi="Cascadia Mono Light" w:cs="Cascadia Mono Light"/>
+                <w:bCs/>
+                <w:sz w:val="19"/>
+              </w:rPr>
+              <w:t xml:space="preserve">        .value;</w:t>
+            </w:r>
+          </w:p>
+          <w:p>
+            <w:pPr>
+              <w:spacing w:before="0" w:after="0" w:line="240" w:lineRule="auto"/>
+              <w:rPr>
+                <w:bCs/>
+              </w:rPr>
+            </w:pPr>
+            <w:r>
+              <w:rPr>
+                <w:rFonts w:ascii="Cascadia Mono Light" w:hAnsi="Cascadia Mono Light" w:cs="Cascadia Mono Light"/>
+                <w:bCs/>
+                <w:sz w:val="19"/>
+              </w:rPr>
+              <w:t xml:space="preserve">    if (!username || !email || !password) {</w:t>
+            </w:r>
+          </w:p>
+          <w:p>
+            <w:pPr>
+              <w:spacing w:before="0" w:after="0" w:line="240" w:lineRule="auto"/>
+              <w:rPr>
+                <w:bCs/>
+              </w:rPr>
+            </w:pPr>
+            <w:r>
+              <w:rPr>
+                <w:rFonts w:ascii="Cascadia Mono Light" w:hAnsi="Cascadia Mono Light" w:cs="Cascadia Mono Light"/>
+                <w:bCs/>
+                <w:sz w:val="19"/>
+              </w:rPr>
+              <w:t xml:space="preserve">        showError("Username, email, and password required.");</w:t>
+            </w:r>
+          </w:p>
+          <w:p>
+            <w:pPr>
+              <w:spacing w:before="0" w:after="0" w:line="240" w:lineRule="auto"/>
+              <w:rPr>
+                <w:bCs/>
+              </w:rPr>
+            </w:pPr>
+            <w:r>
+              <w:rPr>
+                <w:rFonts w:ascii="Cascadia Mono Light" w:hAnsi="Cascadia Mono Light" w:cs="Cascadia Mono Light"/>
+                <w:bCs/>
+                <w:sz w:val="19"/>
+              </w:rPr>
+              <w:t xml:space="preserve">        return;</w:t>
+            </w:r>
+          </w:p>
+          <w:p>
+            <w:pPr>
+              <w:spacing w:before="0" w:after="0" w:line="240" w:lineRule="auto"/>
+              <w:rPr>
+                <w:bCs/>
+              </w:rPr>
+            </w:pPr>
+            <w:r>
+              <w:rPr>
+                <w:rFonts w:ascii="Cascadia Mono Light" w:hAnsi="Cascadia Mono Light" w:cs="Cascadia Mono Light"/>
+                <w:bCs/>
+                <w:sz w:val="19"/>
+              </w:rPr>
+              <w:t xml:space="preserve">    }</w:t>
+            </w:r>
+          </w:p>
+          <w:p>
+            <w:pPr>
+              <w:spacing w:before="0" w:after="0" w:line="240" w:lineRule="auto"/>
+              <w:rPr>
+                <w:bCs/>
+              </w:rPr>
+            </w:pPr>
+            <w:r>
+              <w:rPr>
+                <w:rFonts w:ascii="Cascadia Mono Light" w:hAnsi="Cascadia Mono Light" w:cs="Cascadia Mono Light"/>
+                <w:bCs/>
+                <w:sz w:val="19"/>
+              </w:rPr>
+              <w:lastRenderedPageBreak/>
+              <w:t xml:space="preserve">    try {</w:t>
+            </w:r>
+          </w:p>
+          <w:p>
+            <w:pPr>
+              <w:spacing w:before="0" w:after="0" w:line="240" w:lineRule="auto"/>
+              <w:rPr>
+                <w:bCs/>
+              </w:rPr>
+            </w:pPr>
+            <w:r>
+              <w:rPr>
+                <w:rFonts w:ascii="Cascadia Mono Light" w:hAnsi="Cascadia Mono Light" w:cs="Cascadia Mono Light"/>
+                <w:bCs/>
+                <w:sz w:val="19"/>
+              </w:rPr>
+              <w:t xml:space="preserve">        const user = await window.SentinelDB</w:t>
+            </w:r>
+          </w:p>
+          <w:p>
+            <w:pPr>
+              <w:spacing w:before="0" w:after="0" w:line="240" w:lineRule="auto"/>
+              <w:rPr>
+                <w:bCs/>
+              </w:rPr>
+            </w:pPr>
+            <w:r>
+              <w:rPr>
+                <w:rFonts w:ascii="Cascadia Mono Light" w:hAnsi="Cascadia Mono Light" w:cs="Cascadia Mono Light"/>
+                <w:bCs/>
+                <w:sz w:val="19"/>
+              </w:rPr>
+              <w:t xml:space="preserve">            .registerUser(username, email, password);</w:t>
+            </w:r>
+          </w:p>
+          <w:p>
+            <w:pPr>
+              <w:spacing w:before="0" w:after="0" w:line="240" w:lineRule="auto"/>
+              <w:rPr>
+                <w:bCs/>
+              </w:rPr>
+            </w:pPr>
+            <w:r>
+              <w:rPr>
+                <w:rFonts w:ascii="Cascadia Mono Light" w:hAnsi="Cascadia Mono Light" w:cs="Cascadia Mono Light"/>
+                <w:bCs/>
+                <w:sz w:val="19"/>
+              </w:rPr>
+              <w:t xml:space="preserve">        showSuccess(`Account created! Welcome, ${user.username</w:t>
+            </w:r>
+            <w:r>
+              <w:rPr>
+                <w:rFonts w:ascii="Cascadia Mono Light" w:hAnsi="Cascadia Mono Light" w:cs="Cascadia Mono Light"/>
+                <w:bCs/>
+                <w:sz w:val="19"/>
+              </w:rPr>
+              <w:t>}!`);</w:t>
+            </w:r>
+          </w:p>
+          <w:p>
+            <w:pPr>
+              <w:spacing w:before="0" w:after="0" w:line="240" w:lineRule="auto"/>
+              <w:rPr>
+                <w:bCs/>
+              </w:rPr>
+            </w:pPr>
+            <w:r>
+              <w:rPr>
+                <w:rFonts w:ascii="Cascadia Mono Light" w:hAnsi="Cascadia Mono Light" w:cs="Cascadia Mono Light"/>
+                <w:bCs/>
+                <w:sz w:val="19"/>
+              </w:rPr>
+              <w:t xml:space="preserve">        updateUIForSession();</w:t>
+            </w:r>
+          </w:p>
+          <w:p>
+            <w:pPr>
+              <w:spacing w:before="0" w:after="0" w:line="240" w:lineRule="auto"/>
+              <w:rPr>
+                <w:bCs/>
+              </w:rPr>
+            </w:pPr>
+            <w:r>
+              <w:rPr>
+                <w:rFonts w:ascii="Cascadia Mono Light" w:hAnsi="Cascadia Mono Light" w:cs="Cascadia Mono Light"/>
+                <w:bCs/>
+                <w:sz w:val="19"/>
+              </w:rPr>
+              <w:t xml:space="preserve">    } catch (err) { showError(err.message); }</w:t>
+            </w:r>
+          </w:p>
+          <w:p>
+            <w:pPr>
+              <w:spacing w:before="0" w:after="0" w:line="240" w:lineRule="auto"/>
+            </w:pPr>
+            <w:r>
+              <w:rPr>
+                <w:rFonts w:ascii="Cascadia Mono Light" w:hAnsi="Cascadia Mono Light" w:cs="Cascadia Mono Light"/>
+                <w:bCs/>
+                <w:sz w:val="19"/>
+              </w:rPr>
+              <w:t>});</w:t>
+            </w:r>
+          </w:p>
+        </w:tc>
+      </w:tr>
+    </w:tbl>
+    <w:p>
+      <w:pPr>
+        <w:jc w:val="center"/>
+        <w:rPr>
+          <w:b/>
+          <w:bCs/>
+          <w:sz w:val="22"/>
+          <w:szCs w:val="22"/>
+        </w:rPr>
+      </w:pPr>
+      <w:r>
+        <w:rPr>
+          <w:b/>
+          <w:bCs/>
+          <w:sz w:val="22"/>
+          <w:szCs w:val="22"/>
+        </w:rPr>
+        <w:lastRenderedPageBreak/>
+        <w:t>Figure 4.19: Code Snippet of User Authentication &amp; Session Controller Module</w:t>
+      </w:r>
+    </w:p>
+    <w:p>
+      <w:pPr>
+        <w:pStyle w:val="Heading3"/>
+      </w:pPr>
+      <w:r>
+        <w:t>4.1.2.20. server.py SQLite REST Backend Server Module</w:t>
+      </w:r>
+    </w:p>
+    <w:p>
+      <w:r>
+        <w:t>The server.py module provides a lightweight Python HTTP server running on port 5000 backed by an SQLite3 database (sentinel.db). It exposes REST endpoints including /api/auth/register, /api/auth/login, /api/history, /api/history/save, /api/history/delete, and /api/history/clear. The login endpoint executes parameterized SQL queries checking WHERE (username = ? OR email = ?) AND password_hash = ? to enable dual login validation.</w:t>
+      </w:r>
+    </w:p>
+    <w:tbl>
+      <w:tblPr>
+        <w:tblW w:w="0" w:type="auto"/>
+        <w:jc w:val="center"/>
+        <w:tblLook w:val="04A0" w:firstRow="1" w:lastRow="0" w:firstColumn="1" w:lastColumn="0" w:noHBand="0" w:noVBand="1"/>
+      </w:tblPr>
+      <w:tblGrid>
+        <w:gridCol w:w="8965"/>
+      </w:tblGrid>
+      <w:tr>
+        <w:trPr>
+          <w:jc w:val="center"/>
+        </w:trPr>
+        <w:tc>
+          <w:tcPr>
+            <w:tcW w:w="9000" w:type="dxa"/>
+            <w:tcBorders>
+              <w:top w:val="single" w:sz="4" w:space="0" w:color="CBD5E1"/>
+              <w:left w:val="single" w:sz="24" w:space="0" w:color="2563EB"/>
+              <w:bottom w:val="single" w:sz="4" w:space="0" w:color="CBD5E1"/>
+              <w:right w:val="single" w:sz="4" w:space="0" w:color="CBD5E1"/>
+            </w:tcBorders>
+            <w:shd w:val="clear" w:color="auto" w:fill="F8FAFC"/>
+            <w:tcMar>
+              <w:top w:w="120" w:type="dxa"/>
+              <w:left w:w="180" w:type="dxa"/>
+              <w:bottom w:w="120" w:type="dxa"/>
+              <w:right w:w="180" w:type="dxa"/>
+            </w:tcMar>
+          </w:tcPr>
+          <w:p>
+            <w:pPr>
+              <w:spacing w:before="0" w:after="0" w:line="240" w:lineRule="auto"/>
+              <w:rPr>
+                <w:bCs/>
+              </w:rPr>
+            </w:pPr>
+            <w:r>
+              <w:rPr>
+                <w:rFonts w:ascii="Cascadia Mono Light" w:hAnsi="Cascadia Mono Light" w:cs="Cascadia Mono Light"/>
+                <w:bCs/>
+                <w:sz w:val="19"/>
+              </w:rPr>
+              <w:t># server.py</w:t>
+            </w:r>
+          </w:p>
+          <w:p>
+            <w:pPr>
+              <w:spacing w:before="0" w:after="0" w:line="240" w:lineRule="auto"/>
+              <w:rPr>
+                <w:bCs/>
+              </w:rPr>
+            </w:pPr>
+            <w:r>
+              <w:rPr>
+                <w:rFonts w:ascii="Cascadia Mono Light" w:hAnsi="Cascadia Mono Light" w:cs="Cascadia Mono Light"/>
+                <w:bCs/>
+                <w:sz w:val="19"/>
+              </w:rPr>
+              <w:t>if path == '/api/auth/register':</w:t>
+            </w:r>
+          </w:p>
+          <w:p>
+            <w:pPr>
+              <w:spacing w:before="0" w:after="0" w:line="240" w:lineRule="auto"/>
+              <w:rPr>
+                <w:bCs/>
+              </w:rPr>
+            </w:pPr>
+            <w:r>
+              <w:rPr>
+                <w:rFonts w:ascii="Cascadia Mono Light" w:hAnsi="Cascadia Mono Light" w:cs="Cascadia Mono Light"/>
+                <w:bCs/>
+                <w:sz w:val="19"/>
+              </w:rPr>
+              <w:t xml:space="preserve">    username = data.get('username', '').strip().lower()</w:t>
+            </w:r>
+          </w:p>
+          <w:p>
+            <w:pPr>
+              <w:spacing w:before="0" w:after="0" w:line="240" w:lineRule="auto"/>
+              <w:rPr>
+                <w:bCs/>
+              </w:rPr>
+            </w:pPr>
+            <w:r>
+              <w:rPr>
+                <w:rFonts w:ascii="Cascadia Mono Light" w:hAnsi="Cascadia Mono Light" w:cs="Cascadia Mono Light"/>
+                <w:bCs/>
+                <w:sz w:val="19"/>
+              </w:rPr>
+              <w:t xml:space="preserve">    email =</w:t>
+            </w:r>
+            <w:r>
+              <w:rPr>
+                <w:rFonts w:ascii="Cascadia Mono Light" w:hAnsi="Cascadia Mono Light" w:cs="Cascadia Mono Light"/>
+                <w:bCs/>
+                <w:sz w:val="19"/>
+              </w:rPr>
+              <w:t xml:space="preserve"> data.get('email', '').strip()</w:t>
+            </w:r>
+          </w:p>
+          <w:p>
+            <w:pPr>
+              <w:spacing w:before="0" w:after="0" w:line="240" w:lineRule="auto"/>
+              <w:rPr>
+                <w:bCs/>
+              </w:rPr>
+            </w:pPr>
+            <w:r>
+              <w:rPr>
+                <w:rFonts w:ascii="Cascadia Mono Light" w:hAnsi="Cascadia Mono Light" w:cs="Cascadia Mono Light"/>
+                <w:bCs/>
+                <w:sz w:val="19"/>
+              </w:rPr>
+              <w:t xml:space="preserve">    password = data.get('password', '')</w:t>
+            </w:r>
+          </w:p>
+          <w:p>
+            <w:pPr>
+              <w:spacing w:before="0" w:after="0" w:line="240" w:lineRule="auto"/>
+              <w:rPr>
+                <w:bCs/>
+              </w:rPr>
+            </w:pPr>
+            <w:r>
+              <w:rPr>
+                <w:rFonts w:ascii="Cascadia Mono Light" w:hAnsi="Cascadia Mono Light" w:cs="Cascadia Mono Light"/>
+                <w:bCs/>
+                <w:sz w:val="19"/>
+              </w:rPr>
+              <w:t xml:space="preserve">    pw_hash = hash_password(password)</w:t>
+            </w:r>
+          </w:p>
+          <w:p>
+            <w:pPr>
+              <w:spacing w:before="0" w:after="0" w:line="240" w:lineRule="auto"/>
+              <w:rPr>
+                <w:bCs/>
+              </w:rPr>
+            </w:pPr>
+            <w:r>
+              <w:rPr>
+                <w:rFonts w:ascii="Cascadia Mono Light" w:hAnsi="Cascadia Mono Light" w:cs="Cascadia Mono Light"/>
+                <w:bCs/>
+                <w:sz w:val="19"/>
+              </w:rPr>
+              <w:t xml:space="preserve">    try:</w:t>
+            </w:r>
+          </w:p>
+          <w:p>
+            <w:pPr>
+              <w:spacing w:before="0" w:after="0" w:line="240" w:lineRule="auto"/>
+              <w:rPr>
+                <w:bCs/>
+              </w:rPr>
+            </w:pPr>
+            <w:r>
+              <w:rPr>
+                <w:rFonts w:ascii="Cascadia Mono Light" w:hAnsi="Cascadia Mono Light" w:cs="Cascadia Mono Light"/>
+                <w:bCs/>
+                <w:sz w:val="19"/>
+              </w:rPr>
+              <w:t xml:space="preserve">        conn = sqlite3.connect(DB_FILE)</w:t>
+            </w:r>
+          </w:p>
+          <w:p>
+            <w:pPr>
+              <w:spacing w:before="0" w:after="0" w:line="240" w:lineRule="auto"/>
+              <w:rPr>
+                <w:bCs/>
+              </w:rPr>
+            </w:pPr>
+            <w:r>
+              <w:rPr>
+                <w:rFonts w:ascii="Cascadia Mono Light" w:hAnsi="Cascadia Mono Light" w:cs="Cascadia Mono Light"/>
+                <w:bCs/>
+                <w:sz w:val="19"/>
+              </w:rPr>
+              <w:t xml:space="preserve">        cursor = conn.cursor()</w:t>
+            </w:r>
+          </w:p>
+          <w:p>
+            <w:pPr>
+              <w:spacing w:before="0" w:after="0" w:line="240" w:lineRule="auto"/>
+              <w:rPr>
+                <w:bCs/>
+              </w:rPr>
+            </w:pPr>
+            <w:r>
+              <w:rPr>
+                <w:rFonts w:ascii="Cascadia Mono Light" w:hAnsi="Cascadia Mono Light" w:cs="Cascadia Mono Light"/>
+                <w:bCs/>
+                <w:sz w:val="19"/>
+              </w:rPr>
+              <w:t xml:space="preserve">        cursor.execute(</w:t>
+            </w:r>
+          </w:p>
+          <w:p>
+            <w:pPr>
+              <w:spacing w:before="0" w:after="0" w:line="240" w:lineRule="auto"/>
+              <w:rPr>
+                <w:bCs/>
+              </w:rPr>
+            </w:pPr>
+            <w:r>
+              <w:rPr>
+                <w:rFonts w:ascii="Cascadia Mono Light" w:hAnsi="Cascadia Mono Light" w:cs="Cascadia Mono Light"/>
+                <w:bCs/>
+                <w:sz w:val="19"/>
+              </w:rPr>
+              <w:t xml:space="preserve">            "INSERT INTO users (username, e</w:t>
+            </w:r>
+            <w:r>
+              <w:rPr>
+                <w:rFonts w:ascii="Cascadia Mono Light" w:hAnsi="Cascadia Mono Light" w:cs="Cascadia Mono Light"/>
+                <w:bCs/>
+                <w:sz w:val="19"/>
+              </w:rPr>
+              <w:t>mail, password_hash)"</w:t>
+            </w:r>
+          </w:p>
+          <w:p>
+            <w:pPr>
+              <w:spacing w:before="0" w:after="0" w:line="240" w:lineRule="auto"/>
+              <w:rPr>
+                <w:bCs/>
+              </w:rPr>
+            </w:pPr>
+            <w:r>
+              <w:rPr>
+                <w:rFonts w:ascii="Cascadia Mono Light" w:hAnsi="Cascadia Mono Light" w:cs="Cascadia Mono Light"/>
+                <w:bCs/>
+                <w:sz w:val="19"/>
+              </w:rPr>
+              <w:t xml:space="preserve">            " VALUES </w:t>
+            </w:r>
+            <w:proofErr w:type="gramStart"/>
+            <w:r>
+              <w:rPr>
+                <w:rFonts w:ascii="Cascadia Mono Light" w:hAnsi="Cascadia Mono Light" w:cs="Cascadia Mono Light"/>
+                <w:bCs/>
+                <w:sz w:val="19"/>
+              </w:rPr>
+              <w:t>(?,</w:t>
+            </w:r>
+            <w:proofErr w:type="gramEnd"/>
+            <w:r>
+              <w:rPr>
+                <w:rFonts w:ascii="Cascadia Mono Light" w:hAnsi="Cascadia Mono Light" w:cs="Cascadia Mono Light"/>
+                <w:bCs/>
+                <w:sz w:val="19"/>
+              </w:rPr>
+              <w:t xml:space="preserve"> ?, ?)",</w:t>
+            </w:r>
+          </w:p>
+          <w:p>
+            <w:pPr>
+              <w:spacing w:before="0" w:after="0" w:line="240" w:lineRule="auto"/>
+              <w:rPr>
+                <w:bCs/>
+              </w:rPr>
+            </w:pPr>
+            <w:r>
+              <w:rPr>
+                <w:rFonts w:ascii="Cascadia Mono Light" w:hAnsi="Cascadia Mono Light" w:cs="Cascadia Mono Light"/>
+                <w:bCs/>
+                <w:sz w:val="19"/>
+              </w:rPr>
+              <w:t xml:space="preserve">            (username, email, pw_hash))</w:t>
+            </w:r>
+          </w:p>
+          <w:p>
+            <w:pPr>
+              <w:spacing w:before="0" w:after="0" w:line="240" w:lineRule="auto"/>
+              <w:rPr>
+                <w:bCs/>
+              </w:rPr>
+            </w:pPr>
+            <w:r>
+              <w:rPr>
+                <w:rFonts w:ascii="Cascadia Mono Light" w:hAnsi="Cascadia Mono Light" w:cs="Cascadia Mono Light"/>
+                <w:bCs/>
+                <w:sz w:val="19"/>
+              </w:rPr>
+              <w:t xml:space="preserve">        conn.commit()</w:t>
+            </w:r>
+          </w:p>
+          <w:p>
+            <w:pPr>
+              <w:spacing w:before="0" w:after="0" w:line="240" w:lineRule="auto"/>
+              <w:rPr>
+                <w:bCs/>
+              </w:rPr>
+            </w:pPr>
+            <w:r>
+              <w:rPr>
+                <w:rFonts w:ascii="Cascadia Mono Light" w:hAnsi="Cascadia Mono Light" w:cs="Cascadia Mono Light"/>
+                <w:bCs/>
+                <w:sz w:val="19"/>
+              </w:rPr>
+              <w:t xml:space="preserve">        conn.close()</w:t>
+            </w:r>
+          </w:p>
+          <w:p>
+            <w:pPr>
+              <w:spacing w:before="0" w:after="0" w:line="240" w:lineRule="auto"/>
+              <w:rPr>
+                <w:bCs/>
+              </w:rPr>
+            </w:pPr>
+            <w:r>
+              <w:rPr>
+                <w:rFonts w:ascii="Cascadia Mono Light" w:hAnsi="Cascadia Mono Light" w:cs="Cascadia Mono Light"/>
+                <w:bCs/>
+                <w:sz w:val="19"/>
+              </w:rPr>
+              <w:t xml:space="preserve">        self._send_json({"success": True,</w:t>
+            </w:r>
+          </w:p>
+          <w:p>
+            <w:pPr>
+              <w:spacing w:before="0" w:after="0" w:line="240" w:lineRule="auto"/>
+              <w:rPr>
+                <w:bCs/>
+              </w:rPr>
+            </w:pPr>
+            <w:r>
+              <w:rPr>
+                <w:rFonts w:ascii="Cascadia Mono Light" w:hAnsi="Cascadia Mono Light" w:cs="Cascadia Mono Light"/>
+                <w:bCs/>
+                <w:sz w:val="19"/>
+              </w:rPr>
+              <w:t xml:space="preserve">            "user": {"username": username, "email": email}})</w:t>
+            </w:r>
+          </w:p>
+          <w:p>
+            <w:pPr>
+              <w:spacing w:before="0" w:after="0" w:line="240" w:lineRule="auto"/>
+              <w:rPr>
+                <w:bCs/>
+              </w:rPr>
+            </w:pPr>
+            <w:r>
+              <w:rPr>
+                <w:rFonts w:ascii="Cascadia Mono Light" w:hAnsi="Cascadia Mono Light" w:cs="Cascadia Mono Light"/>
+                <w:bCs/>
+                <w:sz w:val="19"/>
+              </w:rPr>
+              <w:t xml:space="preserve">    except sqlite3.IntegrityError:</w:t>
+            </w:r>
+          </w:p>
+          <w:p>
+            <w:pPr>
+              <w:spacing w:before="0" w:after="0" w:line="240" w:lineRule="auto"/>
+              <w:rPr>
+                <w:bCs/>
+              </w:rPr>
+            </w:pPr>
+            <w:r>
+              <w:rPr>
+                <w:rFonts w:ascii="Cascadia Mono Light" w:hAnsi="Cascadia Mono Light" w:cs="Cascadia Mono Light"/>
+                <w:bCs/>
+                <w:sz w:val="19"/>
+              </w:rPr>
+              <w:t xml:space="preserve">        self._send_json({"success": False,</w:t>
+            </w:r>
+          </w:p>
+          <w:p>
+            <w:pPr>
+              <w:spacing w:before="0" w:after="0" w:line="240" w:lineRule="auto"/>
+              <w:rPr>
+                <w:bCs/>
+              </w:rPr>
+            </w:pPr>
+            <w:r>
+              <w:rPr>
+                <w:rFonts w:ascii="Cascadia Mono Light" w:hAnsi="Cascadia Mono Light" w:cs="Cascadia Mono Light"/>
+                <w:bCs/>
+                <w:sz w:val="19"/>
+              </w:rPr>
+              <w:t xml:space="preserve">            "message": "Username already exists"}, status=400)</w:t>
+            </w:r>
+          </w:p>
+          <w:p>
+            <w:pPr>
+              <w:spacing w:before="0" w:after="0" w:line="240" w:lineRule="auto"/>
+              <w:rPr>
+                <w:bCs/>
+              </w:rPr>
+            </w:pPr>
+          </w:p>
+          <w:p>
+            <w:pPr>
+              <w:spacing w:before="0" w:after="0" w:line="240" w:lineRule="auto"/>
+              <w:rPr>
+                <w:bCs/>
+              </w:rPr>
+            </w:pPr>
+            <w:r>
+              <w:rPr>
+                <w:rFonts w:ascii="Cascadia Mono Light" w:hAnsi="Cascadia Mono Light" w:cs="Cascadia Mono Light"/>
+                <w:bCs/>
+                <w:sz w:val="19"/>
+              </w:rPr>
+              <w:t>if path == '/api/auth/login':</w:t>
+            </w:r>
+          </w:p>
+          <w:p>
+            <w:pPr>
+              <w:spacing w:before="0" w:after="0" w:line="240" w:lineRule="auto"/>
+              <w:rPr>
+                <w:bCs/>
+              </w:rPr>
+            </w:pPr>
+            <w:r>
+              <w:rPr>
+                <w:rFonts w:ascii="Cascadia Mono Light" w:hAnsi="Cascadia Mono Light" w:cs="Cascadia Mono Light"/>
+                <w:bCs/>
+                <w:sz w:val="19"/>
+              </w:rPr>
+              <w:t xml:space="preserve">    login_input = data.get('username', '').strip().lower()</w:t>
+            </w:r>
+          </w:p>
+          <w:p>
+            <w:pPr>
+              <w:spacing w:before="0" w:after="0" w:line="240" w:lineRule="auto"/>
+              <w:rPr>
+                <w:bCs/>
+              </w:rPr>
+            </w:pPr>
+            <w:r>
+              <w:rPr>
+                <w:rFonts w:ascii="Cascadia Mono Light" w:hAnsi="Cascadia Mono Light" w:cs="Cascadia Mono Light"/>
+                <w:bCs/>
+                <w:sz w:val="19"/>
+              </w:rPr>
+              <w:t xml:space="preserve">    pw_hash = hash_passwo</w:t>
+            </w:r>
+            <w:r>
+              <w:rPr>
+                <w:rFonts w:ascii="Cascadia Mono Light" w:hAnsi="Cascadia Mono Light" w:cs="Cascadia Mono Light"/>
+                <w:bCs/>
+                <w:sz w:val="19"/>
+              </w:rPr>
+              <w:t>rd(data.get('password', ''))</w:t>
+            </w:r>
+          </w:p>
+          <w:p>
+            <w:pPr>
+              <w:spacing w:before="0" w:after="0" w:line="240" w:lineRule="auto"/>
+              <w:rPr>
+                <w:bCs/>
+              </w:rPr>
+            </w:pPr>
+            <w:r>
+              <w:rPr>
+                <w:rFonts w:ascii="Cascadia Mono Light" w:hAnsi="Cascadia Mono Light" w:cs="Cascadia Mono Light"/>
+                <w:bCs/>
+                <w:sz w:val="19"/>
+              </w:rPr>
+              <w:t xml:space="preserve">    conn = sqlite3.connect(DB_FILE)</w:t>
+            </w:r>
+          </w:p>
+          <w:p>
+            <w:pPr>
+              <w:spacing w:before="0" w:after="0" w:line="240" w:lineRule="auto"/>
+              <w:rPr>
+                <w:bCs/>
+              </w:rPr>
+            </w:pPr>
+            <w:r>
+              <w:rPr>
+                <w:rFonts w:ascii="Cascadia Mono Light" w:hAnsi="Cascadia Mono Light" w:cs="Cascadia Mono Light"/>
+                <w:bCs/>
+                <w:sz w:val="19"/>
+              </w:rPr>
+              <w:t xml:space="preserve">    conn.row_factory = sqlite3.Row</w:t>
+            </w:r>
+          </w:p>
+          <w:p>
+            <w:pPr>
+              <w:spacing w:before="0" w:after="0" w:line="240" w:lineRule="auto"/>
+              <w:rPr>
+                <w:bCs/>
+              </w:rPr>
+            </w:pPr>
+            <w:r>
+              <w:rPr>
+                <w:rFonts w:ascii="Cascadia Mono Light" w:hAnsi="Cascadia Mono Light" w:cs="Cascadia Mono Light"/>
+                <w:bCs/>
+                <w:sz w:val="19"/>
+              </w:rPr>
+              <w:t xml:space="preserve">    cursor = conn.cursor()</w:t>
+            </w:r>
+          </w:p>
+          <w:p>
+            <w:pPr>
+              <w:spacing w:before="0" w:after="0" w:line="240" w:lineRule="auto"/>
+              <w:rPr>
+                <w:bCs/>
+              </w:rPr>
+            </w:pPr>
+            <w:r>
+              <w:rPr>
+                <w:rFonts w:ascii="Cascadia Mono Light" w:hAnsi="Cascadia Mono Light" w:cs="Cascadia Mono Light"/>
+                <w:bCs/>
+                <w:sz w:val="19"/>
+              </w:rPr>
+              <w:t xml:space="preserve">    cursor.execute(</w:t>
+            </w:r>
+          </w:p>
+          <w:p>
+            <w:pPr>
+              <w:spacing w:before="0" w:after="0" w:line="240" w:lineRule="auto"/>
+              <w:rPr>
+                <w:bCs/>
+              </w:rPr>
+            </w:pPr>
+            <w:r>
+              <w:rPr>
+                <w:rFonts w:ascii="Cascadia Mono Light" w:hAnsi="Cascadia Mono Light" w:cs="Cascadia Mono Light"/>
+                <w:bCs/>
+                <w:sz w:val="19"/>
+              </w:rPr>
+              <w:t xml:space="preserve">        "SELECT * FROM users WHERE (username = ? OR email = ?)"</w:t>
+            </w:r>
+          </w:p>
+          <w:p>
+            <w:pPr>
+              <w:spacing w:before="0" w:after="0" w:line="240" w:lineRule="auto"/>
+              <w:rPr>
+                <w:bCs/>
+              </w:rPr>
+            </w:pPr>
+            <w:r>
+              <w:rPr>
+                <w:rFonts w:ascii="Cascadia Mono Light" w:hAnsi="Cascadia Mono Light" w:cs="Cascadia Mono Light"/>
+                <w:bCs/>
+                <w:sz w:val="19"/>
+              </w:rPr>
+              <w:t xml:space="preserve">        " AND password_hash = ?",</w:t>
+            </w:r>
+          </w:p>
+          <w:p>
+            <w:pPr>
+              <w:spacing w:before="0" w:after="0" w:line="240" w:lineRule="auto"/>
+              <w:rPr>
+                <w:bCs/>
+              </w:rPr>
+            </w:pPr>
+            <w:r>
+              <w:rPr>
+                <w:rFonts w:ascii="Cascadia Mono Light" w:hAnsi="Cascadia Mono Light" w:cs="Cascadia Mono Light"/>
+                <w:bCs/>
+                <w:sz w:val="19"/>
+              </w:rPr>
+              <w:t xml:space="preserve">        (login_input, login_input, pw_hash))</w:t>
+            </w:r>
+          </w:p>
+          <w:p>
+            <w:pPr>
+              <w:spacing w:before="0" w:after="0" w:line="240" w:lineRule="auto"/>
+              <w:rPr>
+                <w:bCs/>
+              </w:rPr>
+            </w:pPr>
+            <w:r>
+              <w:rPr>
+                <w:rFonts w:ascii="Cascadia Mono Light" w:hAnsi="Cascadia Mono Light" w:cs="Cascadia Mono Light"/>
+                <w:bCs/>
+                <w:sz w:val="19"/>
+              </w:rPr>
+              <w:t xml:space="preserve">    user = cursor.fetchone()</w:t>
+            </w:r>
+          </w:p>
+          <w:p>
+            <w:pPr>
+              <w:spacing w:before="0" w:after="0" w:line="240" w:lineRule="auto"/>
+            </w:pPr>
+            <w:r>
+              <w:rPr>
+                <w:rFonts w:ascii="Cascadia Mono Light" w:hAnsi="Cascadia Mono Light" w:cs="Cascadia Mono Light"/>
+                <w:bCs/>
+                <w:sz w:val="19"/>
+              </w:rPr>
+              <w:lastRenderedPageBreak/>
+              <w:t xml:space="preserve">    conn.close()</w:t>
+            </w:r>
+          </w:p>
+        </w:tc>
+      </w:tr>
+    </w:tbl>
+    <w:p>
+      <w:pPr>
+        <w:jc w:val="center"/>
+        <w:rPr>
+          <w:b/>
+          <w:bCs/>
+          <w:sz w:val="22"/>
+          <w:szCs w:val="22"/>
+        </w:rPr>
+      </w:pPr>
+      <w:r>
+        <w:rPr>
+          <w:b/>
+          <w:bCs/>
+          <w:sz w:val="22"/>
+          <w:szCs w:val="22"/>
+        </w:rPr>
+        <w:lastRenderedPageBreak/>
+        <w:t>Figure 4.20: Code Snippet of server.py SQLite REST Backend Server Module</w:t>
+      </w:r>
+    </w:p>
+    <w:p>
+      <w:pPr>
+        <w:pStyle w:val="Heading3"/>
+      </w:pPr>
+      <w:r>
+        <w:t>4.1.2.21. Guest Quota Manager &amp; History Security Module</w:t>
+      </w:r>
+    </w:p>
+    <w:p>
+      <w:r>
+        <w:t>Integrated within app.js and db.js, the Guest Quota Manager restricts unauthenticated users to 1 free analysis per calendar day (tracked via localStorage key sentinel_guest_usage_YYYY-MM-DD). Upon quota exhaustion, analysis execution is blocked and the login modal is displayed. The module manages dynamic quota status badge visibility and enforces strict history database security, isolating query results (WHERE username = ?) so guest sessions cannot view or save user history records.</w:t>
+      </w:r>
+    </w:p>
+    <w:tbl>
+      <w:tblPr>
+        <w:tblW w:w="0" w:type="auto"/>
+        <w:jc w:val="center"/>
+        <w:tblLook w:val="04A0" w:firstRow="1" w:lastRow="0" w:firstColumn="1" w:lastColumn="0" w:noHBand="0" w:noVBand="1"/>
+      </w:tblPr>
+      <w:tblGrid>
+        <w:gridCol w:w="8965"/>
+      </w:tblGrid>
+      <w:tr>
+        <w:trPr>
+          <w:jc w:val="center"/>
+        </w:trPr>
+        <w:tc>
+          <w:tcPr>
+            <w:tcW w:w="9000" w:type="dxa"/>
+            <w:tcBorders>
+              <w:top w:val="single" w:sz="4" w:space="0" w:color="CBD5E1"/>
+              <w:left w:val="single" w:sz="24" w:space="0" w:color="2563EB"/>
+              <w:bottom w:val="single" w:sz="4" w:space="0" w:color="CBD5E1"/>
+              <w:right w:val="single" w:sz="4" w:space="0" w:color="CBD5E1"/>
+            </w:tcBorders>
+            <w:shd w:val="clear" w:color="auto" w:fill="F8FAFC"/>
+            <w:tcMar>
+              <w:top w:w="120" w:type="dxa"/>
+              <w:left w:w="180" w:type="dxa"/>
+              <w:bottom w:w="120" w:type="dxa"/>
+              <w:right w:w="180" w:type="dxa"/>
+            </w:tcMar>
+          </w:tcPr>
+          <w:p>
+            <w:pPr>
+              <w:spacing w:before="0" w:after="0" w:line="240" w:lineRule="auto"/>
+              <w:rPr>
+                <w:bCs/>
+              </w:rPr>
+            </w:pPr>
+            <w:r>
+              <w:rPr>
+                <w:rFonts w:ascii="Cascadia Mono Light" w:hAnsi="Cascadia Mono Light" w:cs="Cascadia Mono Light"/>
+                <w:bCs/>
+                <w:sz w:val="19"/>
+              </w:rPr>
+              <w:t>// js/app.js</w:t>
+            </w:r>
+          </w:p>
+          <w:p>
+            <w:pPr>
+              <w:spacing w:before="0" w:after="0" w:line="240" w:lineRule="auto"/>
+              <w:rPr>
+                <w:bCs/>
+              </w:rPr>
+            </w:pPr>
+            <w:r>
+              <w:rPr>
+                <w:rFonts w:ascii="Cascadia Mono Light" w:hAnsi="Cascadia Mono Light" w:cs="Cascadia Mono Light"/>
+                <w:bCs/>
+                <w:sz w:val="19"/>
+              </w:rPr>
+              <w:t>function runAnalysis(text) {</w:t>
+            </w:r>
+          </w:p>
+          <w:p>
+            <w:pPr>
+              <w:spacing w:before="0" w:after="0" w:line="240" w:lineRule="auto"/>
+              <w:rPr>
+                <w:bCs/>
+              </w:rPr>
+            </w:pPr>
+            <w:r>
+              <w:rPr>
+                <w:rFonts w:ascii="Cascadia Mono Light" w:hAnsi="Cascadia Mono Light" w:cs="Cascadia Mono Light"/>
+                <w:bCs/>
+                <w:sz w:val="19"/>
+              </w:rPr>
+              <w:t xml:space="preserve">    if (window.Se</w:t>
+            </w:r>
+            <w:r>
+              <w:rPr>
+                <w:rFonts w:ascii="Cascadia Mono Light" w:hAnsi="Cascadia Mono Light" w:cs="Cascadia Mono Light"/>
+                <w:bCs/>
+                <w:sz w:val="19"/>
+              </w:rPr>
+              <w:t>ntinelDB) {</w:t>
+            </w:r>
+          </w:p>
+          <w:p>
+            <w:pPr>
+              <w:spacing w:before="0" w:after="0" w:line="240" w:lineRule="auto"/>
+              <w:rPr>
+                <w:bCs/>
+              </w:rPr>
+            </w:pPr>
+            <w:r>
+              <w:rPr>
+                <w:rFonts w:ascii="Cascadia Mono Light" w:hAnsi="Cascadia Mono Light" w:cs="Cascadia Mono Light"/>
+                <w:bCs/>
+                <w:sz w:val="19"/>
+              </w:rPr>
+              <w:t xml:space="preserve">        const quota = window.SentinelDB.checkAnalysisAllowed();</w:t>
+            </w:r>
+          </w:p>
+          <w:p>
+            <w:pPr>
+              <w:spacing w:before="0" w:after="0" w:line="240" w:lineRule="auto"/>
+              <w:rPr>
+                <w:bCs/>
+              </w:rPr>
+            </w:pPr>
+            <w:r>
+              <w:rPr>
+                <w:rFonts w:ascii="Cascadia Mono Light" w:hAnsi="Cascadia Mono Light" w:cs="Cascadia Mono Light"/>
+                <w:bCs/>
+                <w:sz w:val="19"/>
+              </w:rPr>
+              <w:t xml:space="preserve">        if (!quota.allowed) {</w:t>
+            </w:r>
+          </w:p>
+          <w:p>
+            <w:pPr>
+              <w:spacing w:before="0" w:after="0" w:line="240" w:lineRule="auto"/>
+              <w:rPr>
+                <w:bCs/>
+              </w:rPr>
+            </w:pPr>
+            <w:r>
+              <w:rPr>
+                <w:rFonts w:ascii="Cascadia Mono Light" w:hAnsi="Cascadia Mono Light" w:cs="Cascadia Mono Light"/>
+                <w:bCs/>
+                <w:sz w:val="19"/>
+              </w:rPr>
+              <w:t xml:space="preserve">            if (window.showAuthModal) {</w:t>
+            </w:r>
+          </w:p>
+          <w:p>
+            <w:pPr>
+              <w:spacing w:before="0" w:after="0" w:line="240" w:lineRule="auto"/>
+              <w:rPr>
+                <w:bCs/>
+              </w:rPr>
+            </w:pPr>
+            <w:r>
+              <w:rPr>
+                <w:rFonts w:ascii="Cascadia Mono Light" w:hAnsi="Cascadia Mono Light" w:cs="Cascadia Mono Light"/>
+                <w:bCs/>
+                <w:sz w:val="19"/>
+              </w:rPr>
+              <w:t xml:space="preserve">                window.showAuthModal(quota.message, 'register');</w:t>
+            </w:r>
+          </w:p>
+          <w:p>
+            <w:pPr>
+              <w:spacing w:before="0" w:after="0" w:line="240" w:lineRule="auto"/>
+              <w:rPr>
+                <w:bCs/>
+              </w:rPr>
+            </w:pPr>
+            <w:r>
+              <w:rPr>
+                <w:rFonts w:ascii="Cascadia Mono Light" w:hAnsi="Cascadia Mono Light" w:cs="Cascadia Mono Light"/>
+                <w:bCs/>
+                <w:sz w:val="19"/>
+              </w:rPr>
+              <w:t xml:space="preserve">            } else { alert(quota.message); }</w:t>
+            </w:r>
+          </w:p>
+          <w:p>
+            <w:pPr>
+              <w:spacing w:before="0" w:after="0" w:line="240" w:lineRule="auto"/>
+              <w:rPr>
+                <w:bCs/>
+              </w:rPr>
+            </w:pPr>
+            <w:r>
+              <w:rPr>
+                <w:rFonts w:ascii="Cascadia Mono Light" w:hAnsi="Cascadia Mono Light" w:cs="Cascadia Mono Light"/>
+                <w:bCs/>
+                <w:sz w:val="19"/>
+              </w:rPr>
+              <w:t xml:space="preserve">            return false;</w:t>
+            </w:r>
+          </w:p>
+          <w:p>
+            <w:pPr>
+              <w:spacing w:before="0" w:after="0" w:line="240" w:lineRule="auto"/>
+              <w:rPr>
+                <w:bCs/>
+              </w:rPr>
+            </w:pPr>
+            <w:r>
+              <w:rPr>
+                <w:rFonts w:ascii="Cascadia Mono Light" w:hAnsi="Cascadia Mono Light" w:cs="Cascadia Mono Light"/>
+                <w:bCs/>
+                <w:sz w:val="19"/>
+              </w:rPr>
+              <w:t xml:space="preserve">        }</w:t>
+            </w:r>
+          </w:p>
+          <w:p>
+            <w:pPr>
+              <w:spacing w:before="0" w:after="0" w:line="240" w:lineRule="auto"/>
+              <w:rPr>
+                <w:bCs/>
+              </w:rPr>
+            </w:pPr>
+            <w:r>
+              <w:rPr>
+                <w:rFonts w:ascii="Cascadia Mono Light" w:hAnsi="Cascadia Mono Light" w:cs="Cascadia Mono Light"/>
+                <w:bCs/>
+                <w:sz w:val="19"/>
+              </w:rPr>
+              <w:t xml:space="preserve">    }</w:t>
+            </w:r>
+          </w:p>
+          <w:p>
+            <w:pPr>
+              <w:spacing w:before="0" w:after="0" w:line="240" w:lineRule="auto"/>
+              <w:rPr>
+                <w:bCs/>
+              </w:rPr>
+            </w:pPr>
+            <w:r>
+              <w:rPr>
+                <w:rFonts w:ascii="Cascadia Mono Light" w:hAnsi="Cascadia Mono Light" w:cs="Cascadia Mono Light"/>
+                <w:bCs/>
+                <w:sz w:val="19"/>
+              </w:rPr>
+              <w:t xml:space="preserve">    showLoader(true, "Analyzing text stylometrics...");</w:t>
+            </w:r>
+          </w:p>
+          <w:p>
+            <w:pPr>
+              <w:spacing w:before="0" w:after="0" w:line="240" w:lineRule="auto"/>
+              <w:rPr>
+                <w:bCs/>
+              </w:rPr>
+            </w:pPr>
+            <w:r>
+              <w:rPr>
+                <w:rFonts w:ascii="Cascadia Mono Light" w:hAnsi="Cascadia Mono Light" w:cs="Cascadia Mono Light"/>
+                <w:bCs/>
+                <w:sz w:val="19"/>
+              </w:rPr>
+              <w:t xml:space="preserve">    setTimeout(() =&gt; {</w:t>
+            </w:r>
+          </w:p>
+          <w:p>
+            <w:pPr>
+              <w:spacing w:before="0" w:after="0" w:line="240" w:lineRule="auto"/>
+              <w:rPr>
+                <w:bCs/>
+              </w:rPr>
+            </w:pPr>
+            <w:r>
+              <w:rPr>
+                <w:rFonts w:ascii="Cascadia Mono Light" w:hAnsi="Cascadia Mono Light" w:cs="Cascadia Mono Light"/>
+                <w:bCs/>
+                <w:sz w:val="19"/>
+              </w:rPr>
+              <w:t xml:space="preserve">        const result = executeAnalysisCore(text, false);</w:t>
+            </w:r>
+          </w:p>
+          <w:p>
+            <w:pPr>
+              <w:spacing w:before="0" w:after="0" w:line="240" w:lineRule="auto"/>
+              <w:rPr>
+                <w:bCs/>
+              </w:rPr>
+            </w:pPr>
+            <w:r>
+              <w:rPr>
+                <w:rFonts w:ascii="Cascadia Mono Light" w:hAnsi="Cascadia Mono Light" w:cs="Cascadia Mono Light"/>
+                <w:bCs/>
+                <w:sz w:val="19"/>
+              </w:rPr>
+              <w:t xml:space="preserve">        showLoader(false);</w:t>
+            </w:r>
+          </w:p>
+          <w:p>
+            <w:pPr>
+              <w:spacing w:before="0" w:after="0" w:line="240" w:lineRule="auto"/>
+              <w:rPr>
+                <w:bCs/>
+              </w:rPr>
+            </w:pPr>
+            <w:r>
+              <w:rPr>
+                <w:rFonts w:ascii="Cascadia Mono Light" w:hAnsi="Cascadia Mono Light" w:cs="Cascadia Mono Light"/>
+                <w:bCs/>
+                <w:sz w:val="19"/>
+              </w:rPr>
+              <w:t xml:space="preserve">        if (result !== false &amp;&amp; window.SentinelDB) {</w:t>
+            </w:r>
+          </w:p>
+          <w:p>
+            <w:pPr>
+              <w:spacing w:before="0" w:after="0" w:line="240" w:lineRule="auto"/>
+              <w:rPr>
+                <w:bCs/>
+              </w:rPr>
+            </w:pPr>
+            <w:r>
+              <w:rPr>
+                <w:rFonts w:ascii="Cascadia Mono Light" w:hAnsi="Cascadia Mono Light" w:cs="Cascadia Mono Light"/>
+                <w:bCs/>
+                <w:sz w:val="19"/>
+              </w:rPr>
+              <w:t xml:space="preserve">            window.SentinelDB.recordAnalysisUsage();</w:t>
+            </w:r>
+          </w:p>
+          <w:p>
+            <w:pPr>
+              <w:spacing w:before="0" w:after="0" w:line="240" w:lineRule="auto"/>
+              <w:rPr>
+                <w:bCs/>
+              </w:rPr>
+            </w:pPr>
+            <w:r>
+              <w:rPr>
+                <w:rFonts w:ascii="Cascadia Mono Light" w:hAnsi="Cascadia Mono Light" w:cs="Cascadia Mono Light"/>
+                <w:bCs/>
+                <w:sz w:val="19"/>
+              </w:rPr>
+              <w:t xml:space="preserve">            updateQuotaUI();</w:t>
+            </w:r>
+          </w:p>
+          <w:p>
+            <w:pPr>
+              <w:spacing w:before="0" w:after="0" w:line="240" w:lineRule="auto"/>
+              <w:rPr>
+                <w:bCs/>
+              </w:rPr>
+            </w:pPr>
+            <w:r>
+              <w:rPr>
+                <w:rFonts w:ascii="Cascadia Mono Light" w:hAnsi="Cascadia Mono Light" w:cs="Cascadia Mono Light"/>
+                <w:bCs/>
+                <w:sz w:val="19"/>
+              </w:rPr>
+              <w:t xml:space="preserve">        }</w:t>
+            </w:r>
+          </w:p>
+          <w:p>
+            <w:pPr>
+              <w:spacing w:before="0" w:after="0" w:line="240" w:lineRule="auto"/>
+              <w:rPr>
+                <w:bCs/>
+              </w:rPr>
+            </w:pPr>
+            <w:r>
+              <w:rPr>
+                <w:rFonts w:ascii="Cascadia Mono Light" w:hAnsi="Cascadia Mono Light" w:cs="Cascadia Mono Light"/>
+                <w:bCs/>
+                <w:sz w:val="19"/>
+              </w:rPr>
+              <w:t xml:space="preserve">    }, 800);</w:t>
+            </w:r>
+          </w:p>
+          <w:p>
+            <w:pPr>
+              <w:spacing w:before="0" w:after="0" w:line="240" w:lineRule="auto"/>
+              <w:rPr>
+                <w:bCs/>
+              </w:rPr>
+            </w:pPr>
+            <w:r>
+              <w:rPr>
+                <w:rFonts w:ascii="Cascadia Mono Light" w:hAnsi="Cascadia Mono Light" w:cs="Cascadia Mono Light"/>
+                <w:bCs/>
+                <w:sz w:val="19"/>
+              </w:rPr>
+              <w:t>}</w:t>
+            </w:r>
+          </w:p>
+          <w:p>
+            <w:pPr>
+              <w:spacing w:before="0" w:after="0" w:line="240" w:lineRule="auto"/>
+              <w:rPr>
+                <w:bCs/>
+              </w:rPr>
+            </w:pPr>
+          </w:p>
+          <w:p>
+            <w:pPr>
+              <w:spacing w:before="0" w:after="0" w:line="240" w:lineRule="auto"/>
+              <w:rPr>
+                <w:bCs/>
+              </w:rPr>
+            </w:pPr>
+            <w:r>
+              <w:rPr>
+                <w:rFonts w:ascii="Cascadia Mono Light" w:hAnsi="Cascadia Mono Light" w:cs="Cascadia Mono Light"/>
+                <w:bCs/>
+                <w:sz w:val="19"/>
+              </w:rPr>
+              <w:t>function updateQuotaUI() {</w:t>
+            </w:r>
+          </w:p>
+          <w:p>
+            <w:pPr>
+              <w:spacing w:before="0" w:after="0" w:line="240" w:lineRule="auto"/>
+              <w:rPr>
+                <w:bCs/>
+              </w:rPr>
+            </w:pPr>
+            <w:r>
+              <w:rPr>
+                <w:rFonts w:ascii="Cascadia Mono Light" w:hAnsi="Cascadia Mono Light" w:cs="Cascadia Mono Light"/>
+                <w:bCs/>
+                <w:sz w:val="19"/>
+              </w:rPr>
+              <w:t xml:space="preserve">    const quotaBadge = document.getElementById('quota-status');</w:t>
+            </w:r>
+          </w:p>
+          <w:p>
+            <w:pPr>
+              <w:spacing w:before="0" w:after="0" w:line="240" w:lineRule="auto"/>
+              <w:rPr>
+                <w:bCs/>
+              </w:rPr>
+            </w:pPr>
+            <w:r>
+              <w:rPr>
+                <w:rFonts w:ascii="Cascadia Mono Light" w:hAnsi="Cascadia Mono Light" w:cs="Cascadia Mono Light"/>
+                <w:bCs/>
+                <w:sz w:val="19"/>
+              </w:rPr>
+              <w:t xml:space="preserve">    </w:t>
+            </w:r>
+            <w:r>
+              <w:rPr>
+                <w:rFonts w:ascii="Cascadia Mono Light" w:hAnsi="Cascadia Mono Light" w:cs="Cascadia Mono Light"/>
+                <w:bCs/>
+                <w:sz w:val="19"/>
+              </w:rPr>
+              <w:t>if (!quotaBadge || !window.SentinelDB) return;</w:t>
+            </w:r>
+          </w:p>
+          <w:p>
+            <w:pPr>
+              <w:spacing w:before="0" w:after="0" w:line="240" w:lineRule="auto"/>
+              <w:rPr>
+                <w:bCs/>
+              </w:rPr>
+            </w:pPr>
+            <w:r>
+              <w:rPr>
+                <w:rFonts w:ascii="Cascadia Mono Light" w:hAnsi="Cascadia Mono Light" w:cs="Cascadia Mono Light"/>
+                <w:bCs/>
+                <w:sz w:val="19"/>
+              </w:rPr>
+              <w:t xml:space="preserve">    const status = window.SentinelDB.checkAnalysisAllowed();</w:t>
+            </w:r>
+          </w:p>
+          <w:p>
+            <w:pPr>
+              <w:spacing w:before="0" w:after="0" w:line="240" w:lineRule="auto"/>
+              <w:rPr>
+                <w:bCs/>
+              </w:rPr>
+            </w:pPr>
+            <w:r>
+              <w:rPr>
+                <w:rFonts w:ascii="Cascadia Mono Light" w:hAnsi="Cascadia Mono Light" w:cs="Cascadia Mono Light"/>
+                <w:bCs/>
+                <w:sz w:val="19"/>
+              </w:rPr>
+              <w:t xml:space="preserve">    if (status.userType === 'guest') {</w:t>
+            </w:r>
+          </w:p>
+          <w:p>
+            <w:pPr>
+              <w:spacing w:before="0" w:after="0" w:line="240" w:lineRule="auto"/>
+              <w:rPr>
+                <w:bCs/>
+              </w:rPr>
+            </w:pPr>
+            <w:r>
+              <w:rPr>
+                <w:rFonts w:ascii="Cascadia Mono Light" w:hAnsi="Cascadia Mono Light" w:cs="Cascadia Mono Light"/>
+                <w:bCs/>
+                <w:sz w:val="19"/>
+              </w:rPr>
+              <w:t xml:space="preserve">        quotaBadge.style.display = 'inline-flex';</w:t>
+            </w:r>
+          </w:p>
+          <w:p>
+            <w:pPr>
+              <w:spacing w:before="0" w:after="0" w:line="240" w:lineRule="auto"/>
+              <w:rPr>
+                <w:bCs/>
+              </w:rPr>
+            </w:pPr>
+            <w:r>
+              <w:rPr>
+                <w:rFonts w:ascii="Cascadia Mono Light" w:hAnsi="Cascadia Mono Light" w:cs="Cascadia Mono Light"/>
+                <w:bCs/>
+                <w:sz w:val="19"/>
+              </w:rPr>
+              <w:t xml:space="preserve">        if (status.allowed) {</w:t>
+            </w:r>
+          </w:p>
+          <w:p>
+            <w:pPr>
+              <w:spacing w:before="0" w:after="0" w:line="240" w:lineRule="auto"/>
+              <w:rPr>
+                <w:bCs/>
+              </w:rPr>
+            </w:pPr>
+            <w:r>
+              <w:rPr>
+                <w:rFonts w:ascii="Cascadia Mono Light" w:hAnsi="Cascadia Mono Light" w:cs="Cascadia Mono Light"/>
+                <w:bCs/>
+                <w:sz w:val="19"/>
+              </w:rPr>
+              <w:t xml:space="preserve">            quotaBadge.textCo</w:t>
+            </w:r>
+            <w:r>
+              <w:rPr>
+                <w:rFonts w:ascii="Cascadia Mono Light" w:hAnsi="Cascadia Mono Light" w:cs="Cascadia Mono Light"/>
+                <w:bCs/>
+                <w:sz w:val="19"/>
+              </w:rPr>
+              <w:t>ntent = "1 Free Analysis (Guest)";</w:t>
+            </w:r>
+          </w:p>
+          <w:p>
+            <w:pPr>
+              <w:spacing w:before="0" w:after="0" w:line="240" w:lineRule="auto"/>
+              <w:rPr>
+                <w:bCs/>
+              </w:rPr>
+            </w:pPr>
+            <w:r>
+              <w:rPr>
+                <w:rFonts w:ascii="Cascadia Mono Light" w:hAnsi="Cascadia Mono Light" w:cs="Cascadia Mono Light"/>
+                <w:bCs/>
+                <w:sz w:val="19"/>
+              </w:rPr>
+              <w:t xml:space="preserve">            quotaBadge.className = "quota-badge quota-available";</w:t>
+            </w:r>
+          </w:p>
+          <w:p>
+            <w:pPr>
+              <w:spacing w:before="0" w:after="0" w:line="240" w:lineRule="auto"/>
+              <w:rPr>
+                <w:bCs/>
+              </w:rPr>
+            </w:pPr>
+            <w:r>
+              <w:rPr>
+                <w:rFonts w:ascii="Cascadia Mono Light" w:hAnsi="Cascadia Mono Light" w:cs="Cascadia Mono Light"/>
+                <w:bCs/>
+                <w:sz w:val="19"/>
+              </w:rPr>
+              <w:t xml:space="preserve">        } else {</w:t>
+            </w:r>
+          </w:p>
+          <w:p>
+            <w:pPr>
+              <w:spacing w:before="0" w:after="0" w:line="240" w:lineRule="auto"/>
+              <w:rPr>
+                <w:bCs/>
+              </w:rPr>
+            </w:pPr>
+            <w:r>
+              <w:rPr>
+                <w:rFonts w:ascii="Cascadia Mono Light" w:hAnsi="Cascadia Mono Light" w:cs="Cascadia Mono Light"/>
+                <w:bCs/>
+                <w:sz w:val="19"/>
+              </w:rPr>
+              <w:t xml:space="preserve">            quotaBadge.textContent = "Daily Limit Reached";</w:t>
+            </w:r>
+          </w:p>
+          <w:p>
+            <w:pPr>
+              <w:spacing w:before="0" w:after="0" w:line="240" w:lineRule="auto"/>
+              <w:rPr>
+                <w:bCs/>
+              </w:rPr>
+            </w:pPr>
+            <w:r>
+              <w:rPr>
+                <w:rFonts w:ascii="Cascadia Mono Light" w:hAnsi="Cascadia Mono Light" w:cs="Cascadia Mono Light"/>
+                <w:bCs/>
+                <w:sz w:val="19"/>
+              </w:rPr>
+              <w:t xml:space="preserve">            quotaBadge.className = "quota-badge quota-exhausted";</w:t>
+            </w:r>
+          </w:p>
+          <w:p>
+            <w:pPr>
+              <w:spacing w:before="0" w:after="0" w:line="240" w:lineRule="auto"/>
+              <w:rPr>
+                <w:bCs/>
+              </w:rPr>
+            </w:pPr>
+            <w:r>
+              <w:rPr>
+                <w:rFonts w:ascii="Cascadia Mono Light" w:hAnsi="Cascadia Mono Light" w:cs="Cascadia Mono Light"/>
+                <w:bCs/>
+                <w:sz w:val="19"/>
+              </w:rPr>
+              <w:t xml:space="preserve">        }</w:t>
+            </w:r>
+          </w:p>
+          <w:p>
+            <w:pPr>
+              <w:spacing w:before="0" w:after="0" w:line="240" w:lineRule="auto"/>
+              <w:rPr>
+                <w:bCs/>
+              </w:rPr>
+            </w:pPr>
+            <w:r>
+              <w:rPr>
+                <w:rFonts w:ascii="Cascadia Mono Light" w:hAnsi="Cascadia Mono Light" w:cs="Cascadia Mono Light"/>
+                <w:bCs/>
+                <w:sz w:val="19"/>
+              </w:rPr>
+              <w:t xml:space="preserve">  </w:t>
+            </w:r>
+            <w:r>
+              <w:rPr>
+                <w:rFonts w:ascii="Cascadia Mono Light" w:hAnsi="Cascadia Mono Light" w:cs="Cascadia Mono Light"/>
+                <w:bCs/>
+                <w:sz w:val="19"/>
+              </w:rPr>
+              <w:t xml:space="preserve">  } else { quotaBadge.style.display = 'none'; }</w:t>
+            </w:r>
+          </w:p>
+          <w:p>
+            <w:pPr>
+              <w:spacing w:before="0" w:after="0" w:line="240" w:lineRule="auto"/>
+            </w:pPr>
+            <w:r>
+              <w:rPr>
+                <w:rFonts w:ascii="Cascadia Mono Light" w:hAnsi="Cascadia Mono Light" w:cs="Cascadia Mono Light"/>
+                <w:bCs/>
+                <w:sz w:val="19"/>
+              </w:rPr>
+              <w:lastRenderedPageBreak/>
+              <w:t>}</w:t>
+            </w:r>
+          </w:p>
+        </w:tc>
+      </w:tr>
+    </w:tbl>
+    <w:p>
+      <w:pPr>
+        <w:jc w:val="center"/>
+        <w:rPr>
+          <w:b/>
+          <w:bCs/>
+          <w:sz w:val="22"/>
+          <w:szCs w:val="22"/>
+        </w:rPr>
+      </w:pPr>
+      <w:r>
+        <w:rPr>
+          <w:b/>
+          <w:bCs/>
+          <w:sz w:val="22"/>
+          <w:szCs w:val="22"/>
+        </w:rPr>
+        <w:lastRenderedPageBreak/>
+        <w:t>Figure 4.21: Code Snippet of Guest Quota Manager &amp; History Security Module</w:t>
+      </w:r>
+    </w:p>
+    <w:p>
+      <w:pPr>
+        <w:pStyle w:val="Heading3"/>
+      </w:pPr>
+      <w:r>
+        <w:t>4.1.2.22. Real-Time History Search &amp; UI Refinement Module</w:t>
+      </w:r>
+    </w:p>
+    <w:p>
+      <w:r>
+        <w:t>This module enhances the Analysis History interface in app.js and style.css. It provides real-time search filtering across title, body text snippet, verdict statement, and username using input, keyup, and change event listeners. Magnifying glass search icons are embedded inside input fields (padding-left: 36px), card action controls are streamlined to icon-only buttons (View/Reload and Delete), and obsolete Export JSON controls are removed.</w:t>
+      </w:r>
+    </w:p>
+    <w:tbl>
+      <w:tblPr>
+        <w:tblW w:w="0" w:type="auto"/>
+        <w:jc w:val="center"/>
+        <w:tblLook w:val="04A0" w:firstRow="1" w:lastRow="0" w:firstColumn="1" w:lastColumn="0" w:noHBand="0" w:noVBand="1"/>
+      </w:tblPr>
+      <w:tblGrid>
+        <w:gridCol w:w="8965"/>
+      </w:tblGrid>
+      <w:tr>
+        <w:trPr>
+          <w:jc w:val="center"/>
+        </w:trPr>
+        <w:tc>
+          <w:tcPr>
+            <w:tcW w:w="9000" w:type="dxa"/>
+            <w:tcBorders>
+              <w:top w:val="single" w:sz="4" w:space="0" w:color="CBD5E1"/>
+              <w:left w:val="single" w:sz="24" w:space="0" w:color="2563EB"/>
+              <w:bottom w:val="single" w:sz="4" w:space="0" w:color="CBD5E1"/>
+              <w:right w:val="single" w:sz="4" w:space="0" w:color="CBD5E1"/>
+            </w:tcBorders>
+            <w:shd w:val="clear" w:color="auto" w:fill="F8FAFC"/>
+            <w:tcMar>
+              <w:top w:w="120" w:type="dxa"/>
+              <w:left w:w="180" w:type="dxa"/>
+              <w:bottom w:w="120" w:type="dxa"/>
+              <w:right w:w="180" w:type="dxa"/>
+            </w:tcMar>
+          </w:tcPr>
+          <w:p>
+            <w:pPr>
+              <w:spacing w:before="0" w:after="0" w:line="240" w:lineRule="auto"/>
+              <w:rPr>
+                <w:bCs/>
+              </w:rPr>
+            </w:pPr>
+            <w:r>
+              <w:rPr>
+                <w:rFonts w:ascii="Cascadia Mono Light" w:hAnsi="Cascadia Mono Light" w:cs="Cascadia Mono Light"/>
+                <w:bCs/>
+                <w:sz w:val="19"/>
+              </w:rPr>
+              <w:t>// js/app.js</w:t>
+            </w:r>
+          </w:p>
+          <w:p>
+            <w:pPr>
+              <w:spacing w:before="0" w:after="0" w:line="240" w:lineRule="auto"/>
+              <w:rPr>
+                <w:bCs/>
+              </w:rPr>
+            </w:pPr>
+            <w:r>
+              <w:rPr>
+                <w:rFonts w:ascii="Cascadia Mono Light" w:hAnsi="Cascadia Mono Light" w:cs="Cascadia Mono Light"/>
+                <w:bCs/>
+                <w:sz w:val="19"/>
+              </w:rPr>
+              <w:t>const searchQuery = historySearchInput</w:t>
+            </w:r>
+          </w:p>
+          <w:p>
+            <w:pPr>
+              <w:spacing w:before="0" w:after="0" w:line="240" w:lineRule="auto"/>
+              <w:rPr>
+                <w:bCs/>
+              </w:rPr>
+            </w:pPr>
+            <w:r>
+              <w:rPr>
+                <w:rFonts w:ascii="Cascadia Mono Light" w:hAnsi="Cascadia Mono Light" w:cs="Cascadia Mono Light"/>
+                <w:bCs/>
+                <w:sz w:val="19"/>
+              </w:rPr>
+              <w:t xml:space="preserve">    ? historySe</w:t>
+            </w:r>
+            <w:r>
+              <w:rPr>
+                <w:rFonts w:ascii="Cascadia Mono Light" w:hAnsi="Cascadia Mono Light" w:cs="Cascadia Mono Light"/>
+                <w:bCs/>
+                <w:sz w:val="19"/>
+              </w:rPr>
+              <w:t>archInput.value.toLowerCase().trim() : '';</w:t>
+            </w:r>
+          </w:p>
+          <w:p>
+            <w:pPr>
+              <w:spacing w:before="0" w:after="0" w:line="240" w:lineRule="auto"/>
+              <w:rPr>
+                <w:bCs/>
+              </w:rPr>
+            </w:pPr>
+            <w:r>
+              <w:rPr>
+                <w:rFonts w:ascii="Cascadia Mono Light" w:hAnsi="Cascadia Mono Light" w:cs="Cascadia Mono Light"/>
+                <w:bCs/>
+                <w:sz w:val="19"/>
+              </w:rPr>
+              <w:t>const verdictFilter = historyVerdictFilter</w:t>
+            </w:r>
+          </w:p>
+          <w:p>
+            <w:pPr>
+              <w:spacing w:before="0" w:after="0" w:line="240" w:lineRule="auto"/>
+              <w:rPr>
+                <w:bCs/>
+              </w:rPr>
+            </w:pPr>
+            <w:r>
+              <w:rPr>
+                <w:rFonts w:ascii="Cascadia Mono Light" w:hAnsi="Cascadia Mono Light" w:cs="Cascadia Mono Light"/>
+                <w:bCs/>
+                <w:sz w:val="19"/>
+              </w:rPr>
+              <w:t xml:space="preserve">    ? historyVerdictFilter.value : 'all';</w:t>
+            </w:r>
+          </w:p>
+          <w:p>
+            <w:pPr>
+              <w:spacing w:before="0" w:after="0" w:line="240" w:lineRule="auto"/>
+              <w:rPr>
+                <w:bCs/>
+              </w:rPr>
+            </w:pPr>
+          </w:p>
+          <w:p>
+            <w:pPr>
+              <w:spacing w:before="0" w:after="0" w:line="240" w:lineRule="auto"/>
+              <w:rPr>
+                <w:bCs/>
+              </w:rPr>
+            </w:pPr>
+            <w:r>
+              <w:rPr>
+                <w:rFonts w:ascii="Cascadia Mono Light" w:hAnsi="Cascadia Mono Light" w:cs="Cascadia Mono Light"/>
+                <w:bCs/>
+                <w:sz w:val="19"/>
+              </w:rPr>
+              <w:t>let filteredTab = historyRecords.filter(rec =&gt; {</w:t>
+            </w:r>
+          </w:p>
+          <w:p>
+            <w:pPr>
+              <w:spacing w:before="0" w:after="0" w:line="240" w:lineRule="auto"/>
+              <w:rPr>
+                <w:bCs/>
+              </w:rPr>
+            </w:pPr>
+            <w:r>
+              <w:rPr>
+                <w:rFonts w:ascii="Cascadia Mono Light" w:hAnsi="Cascadia Mono Light" w:cs="Cascadia Mono Light"/>
+                <w:bCs/>
+                <w:sz w:val="19"/>
+              </w:rPr>
+              <w:t xml:space="preserve">    const titleStr = String(rec.title || '').toLowerCase();</w:t>
+            </w:r>
+          </w:p>
+          <w:p>
+            <w:pPr>
+              <w:spacing w:before="0" w:after="0" w:line="240" w:lineRule="auto"/>
+              <w:rPr>
+                <w:bCs/>
+              </w:rPr>
+            </w:pPr>
+            <w:r>
+              <w:rPr>
+                <w:rFonts w:ascii="Cascadia Mono Light" w:hAnsi="Cascadia Mono Light" w:cs="Cascadia Mono Light"/>
+                <w:bCs/>
+                <w:sz w:val="19"/>
+              </w:rPr>
+              <w:t xml:space="preserve">    const textStr </w:t>
+            </w:r>
+            <w:r>
+              <w:rPr>
+                <w:rFonts w:ascii="Cascadia Mono Light" w:hAnsi="Cascadia Mono Light" w:cs="Cascadia Mono Light"/>
+                <w:bCs/>
+                <w:sz w:val="19"/>
+              </w:rPr>
+              <w:t>= String(rec.text || '').toLowerCase();</w:t>
+            </w:r>
+          </w:p>
+          <w:p>
+            <w:pPr>
+              <w:spacing w:before="0" w:after="0" w:line="240" w:lineRule="auto"/>
+              <w:rPr>
+                <w:bCs/>
+              </w:rPr>
+            </w:pPr>
+            <w:r>
+              <w:rPr>
+                <w:rFonts w:ascii="Cascadia Mono Light" w:hAnsi="Cascadia Mono Light" w:cs="Cascadia Mono Light"/>
+                <w:bCs/>
+                <w:sz w:val="19"/>
+              </w:rPr>
+              <w:t xml:space="preserve">    const verdictStr = String(rec.verdict || '').toLowerCase();</w:t>
+            </w:r>
+          </w:p>
+          <w:p>
+            <w:pPr>
+              <w:spacing w:before="0" w:after="0" w:line="240" w:lineRule="auto"/>
+              <w:rPr>
+                <w:bCs/>
+              </w:rPr>
+            </w:pPr>
+            <w:r>
+              <w:rPr>
+                <w:rFonts w:ascii="Cascadia Mono Light" w:hAnsi="Cascadia Mono Light" w:cs="Cascadia Mono Light"/>
+                <w:bCs/>
+                <w:sz w:val="19"/>
+              </w:rPr>
+              <w:t xml:space="preserve">    const userStr = String(rec.username || '').toLowerCase();</w:t>
+            </w:r>
+          </w:p>
+          <w:p>
+            <w:pPr>
+              <w:spacing w:before="0" w:after="0" w:line="240" w:lineRule="auto"/>
+              <w:rPr>
+                <w:bCs/>
+              </w:rPr>
+            </w:pPr>
+          </w:p>
+          <w:p>
+            <w:pPr>
+              <w:spacing w:before="0" w:after="0" w:line="240" w:lineRule="auto"/>
+              <w:rPr>
+                <w:bCs/>
+              </w:rPr>
+            </w:pPr>
+            <w:r>
+              <w:rPr>
+                <w:rFonts w:ascii="Cascadia Mono Light" w:hAnsi="Cascadia Mono Light" w:cs="Cascadia Mono Light"/>
+                <w:bCs/>
+                <w:sz w:val="19"/>
+              </w:rPr>
+              <w:t xml:space="preserve">    const matchesSearch = !searchQuery ||</w:t>
+            </w:r>
+          </w:p>
+          <w:p>
+            <w:pPr>
+              <w:spacing w:before="0" w:after="0" w:line="240" w:lineRule="auto"/>
+              <w:rPr>
+                <w:bCs/>
+              </w:rPr>
+            </w:pPr>
+            <w:r>
+              <w:rPr>
+                <w:rFonts w:ascii="Cascadia Mono Light" w:hAnsi="Cascadia Mono Light" w:cs="Cascadia Mono Light"/>
+                <w:bCs/>
+                <w:sz w:val="19"/>
+              </w:rPr>
+              <w:t xml:space="preserve">        titleStr.includes(searchQuery) ||</w:t>
+            </w:r>
+          </w:p>
+          <w:p>
+            <w:pPr>
+              <w:spacing w:before="0" w:after="0" w:line="240" w:lineRule="auto"/>
+              <w:rPr>
+                <w:bCs/>
+              </w:rPr>
+            </w:pPr>
+            <w:r>
+              <w:rPr>
+                <w:rFonts w:ascii="Cascadia Mono Light" w:hAnsi="Cascadia Mono Light" w:cs="Cascadia Mono Light"/>
+                <w:bCs/>
+                <w:sz w:val="19"/>
+              </w:rPr>
+              <w:t xml:space="preserve">     </w:t>
+            </w:r>
+            <w:r>
+              <w:rPr>
+                <w:rFonts w:ascii="Cascadia Mono Light" w:hAnsi="Cascadia Mono Light" w:cs="Cascadia Mono Light"/>
+                <w:bCs/>
+                <w:sz w:val="19"/>
+              </w:rPr>
+              <w:t xml:space="preserve">   textStr.includes(searchQuery) ||</w:t>
+            </w:r>
+          </w:p>
+          <w:p>
+            <w:pPr>
+              <w:spacing w:before="0" w:after="0" w:line="240" w:lineRule="auto"/>
+              <w:rPr>
+                <w:bCs/>
+              </w:rPr>
+            </w:pPr>
+            <w:r>
+              <w:rPr>
+                <w:rFonts w:ascii="Cascadia Mono Light" w:hAnsi="Cascadia Mono Light" w:cs="Cascadia Mono Light"/>
+                <w:bCs/>
+                <w:sz w:val="19"/>
+              </w:rPr>
+              <w:t xml:space="preserve">        verdictStr.includes(searchQuery) ||</w:t>
+            </w:r>
+          </w:p>
+          <w:p>
+            <w:pPr>
+              <w:spacing w:before="0" w:after="0" w:line="240" w:lineRule="auto"/>
+              <w:rPr>
+                <w:bCs/>
+              </w:rPr>
+            </w:pPr>
+            <w:r>
+              <w:rPr>
+                <w:rFonts w:ascii="Cascadia Mono Light" w:hAnsi="Cascadia Mono Light" w:cs="Cascadia Mono Light"/>
+                <w:bCs/>
+                <w:sz w:val="19"/>
+              </w:rPr>
+              <w:t xml:space="preserve">        userStr.includes(searchQuery);</w:t>
+            </w:r>
+          </w:p>
+          <w:p>
+            <w:pPr>
+              <w:spacing w:before="0" w:after="0" w:line="240" w:lineRule="auto"/>
+              <w:rPr>
+                <w:bCs/>
+              </w:rPr>
+            </w:pPr>
+          </w:p>
+          <w:p>
+            <w:pPr>
+              <w:spacing w:before="0" w:after="0" w:line="240" w:lineRule="auto"/>
+              <w:rPr>
+                <w:bCs/>
+              </w:rPr>
+            </w:pPr>
+            <w:r>
+              <w:rPr>
+                <w:rFonts w:ascii="Cascadia Mono Light" w:hAnsi="Cascadia Mono Light" w:cs="Cascadia Mono Light"/>
+                <w:bCs/>
+                <w:sz w:val="19"/>
+              </w:rPr>
+              <w:t xml:space="preserve">    const matchesVerdict = (verdictFilter === 'all')</w:t>
+            </w:r>
+          </w:p>
+          <w:p>
+            <w:pPr>
+              <w:spacing w:before="0" w:after="0" w:line="240" w:lineRule="auto"/>
+              <w:rPr>
+                <w:bCs/>
+              </w:rPr>
+            </w:pPr>
+            <w:r>
+              <w:rPr>
+                <w:rFonts w:ascii="Cascadia Mono Light" w:hAnsi="Cascadia Mono Light" w:cs="Cascadia Mono Light"/>
+                <w:bCs/>
+                <w:sz w:val="19"/>
+              </w:rPr>
+              <w:t xml:space="preserve">        || (rec.verdictClass === verdictFilter);</w:t>
+            </w:r>
+          </w:p>
+          <w:p>
+            <w:pPr>
+              <w:spacing w:before="0" w:after="0" w:line="240" w:lineRule="auto"/>
+              <w:rPr>
+                <w:bCs/>
+              </w:rPr>
+            </w:pPr>
+          </w:p>
+          <w:p>
+            <w:pPr>
+              <w:spacing w:before="0" w:after="0" w:line="240" w:lineRule="auto"/>
+              <w:rPr>
+                <w:bCs/>
+              </w:rPr>
+            </w:pPr>
+            <w:r>
+              <w:rPr>
+                <w:rFonts w:ascii="Cascadia Mono Light" w:hAnsi="Cascadia Mono Light" w:cs="Cascadia Mono Light"/>
+                <w:bCs/>
+                <w:sz w:val="19"/>
+              </w:rPr>
+              <w:t xml:space="preserve">    return matchesSearch &amp;&amp; matchesVerdict;</w:t>
+            </w:r>
+          </w:p>
+          <w:p>
+            <w:pPr>
+              <w:spacing w:before="0" w:after="0" w:line="240" w:lineRule="auto"/>
+            </w:pPr>
+            <w:r>
+              <w:rPr>
+                <w:rFonts w:ascii="Cascadia Mono Light" w:hAnsi="Cascadia Mono Light" w:cs="Cascadia Mono Light"/>
+                <w:bCs/>
+                <w:sz w:val="19"/>
+              </w:rPr>
+              <w:t>});</w:t>
+            </w:r>
+          </w:p>
+        </w:tc>
+      </w:tr>
+    </w:tbl>
+    <w:p>
+      <w:pPr>
+        <w:jc w:val="center"/>
+        <w:rPr>
+          <w:b/>
+          <w:bCs/>
+          <w:sz w:val="22"/>
+          <w:szCs w:val="22"/>
+        </w:rPr>
+      </w:pPr>
+      <w:r>
+        <w:rPr>
+          <w:b/>
+          <w:bCs/>
+          <w:sz w:val="22"/>
+          <w:szCs w:val="22"/>
+        </w:rPr>
+        <w:t>Figure 4.22: Code Snippet of Real-Time History Search &amp; UI Refinement Module</w:t>
+      </w:r>
+    </w:p>
+    <w:p>
+      <w:pPr>
         <w:spacing w:before="80" w:after="240"/>
         <w:jc w:val="center"/>
       </w:pPr>
-      <w:r>
-        <w:rPr>
-          <w:b/>
-          <w:sz w:val="22"/>
-        </w:rPr>
-        <w:t>Figure 4.17: Code Snippet of Heuristic Grammar &amp; Typography Module</w:t>
-      </w:r>
+    </w:p>
+    <w:p>
+      <w:pPr>
+        <w:spacing w:before="80" w:after="240"/>
+        <w:jc w:val="center"/>
+      </w:pPr>
+      <w:bookmarkStart w:id="65" w:name="_GoBack"/>
+      <w:bookmarkEnd w:id="65"/>
     </w:p>
     <w:p>
       <w:pPr>
@@ -25468,6 +28475,7 @@
       </w:pPr>
       <w:bookmarkStart w:id="66" w:name="_Toc236169759"/>
       <w:r>
+        <w:lastRenderedPageBreak/>
         <w:t>4.2. Testing</w:t>
       </w:r>
       <w:bookmarkEnd w:id="66"/>
@@ -25916,7 +28924,6 @@
               <w:rPr>
                 <w:sz w:val="19"/>
               </w:rPr>
-              <w:lastRenderedPageBreak/>
               <w:t>4</w:t>
             </w:r>
           </w:p>
@@ -26173,6 +29180,7 @@
               <w:rPr>
                 <w:sz w:val="19"/>
               </w:rPr>
+              <w:lastRenderedPageBreak/>
               <w:t>7</w:t>
             </w:r>
           </w:p>
@@ -26552,14 +29560,7 @@
               <w:rPr>
                 <w:sz w:val="19"/>
               </w:rPr>
-              <w:t xml:space="preserve">axis radar chart </w:t>
-            </w:r>
-            <w:r>
-              <w:rPr>
-                <w:sz w:val="19"/>
-              </w:rPr>
-              <w:lastRenderedPageBreak/>
-              <w:t>showing syntax footprint</w:t>
+              <w:t>axis radar chart showing syntax footprint</w:t>
             </w:r>
           </w:p>
         </w:tc>
@@ -26572,7 +29573,6 @@
               <w:rPr>
                 <w:sz w:val="19"/>
               </w:rPr>
-              <w:lastRenderedPageBreak/>
               <w:t>Radar chart rendered</w:t>
             </w:r>
           </w:p>
@@ -26812,7 +29812,14 @@
               <w:rPr>
                 <w:sz w:val="19"/>
               </w:rPr>
-              <w:t>Display inspector card with word counts &amp; indicators</w:t>
+              <w:t xml:space="preserve">Display inspector card </w:t>
+            </w:r>
+            <w:r>
+              <w:rPr>
+                <w:sz w:val="19"/>
+              </w:rPr>
+              <w:lastRenderedPageBreak/>
+              <w:t>with word counts &amp; indicators</w:t>
             </w:r>
           </w:p>
         </w:tc>
@@ -26825,6 +29832,7 @@
               <w:rPr>
                 <w:sz w:val="19"/>
               </w:rPr>
+              <w:lastRenderedPageBreak/>
               <w:t>Inspector card displayed</w:t>
             </w:r>
           </w:p>
@@ -27143,7 +30151,6 @@
               <w:rPr>
                 <w:sz w:val="19"/>
               </w:rPr>
-              <w:lastRenderedPageBreak/>
               <w:t>1</w:t>
             </w:r>
           </w:p>
@@ -27516,6 +30523,7 @@
               <w:rPr>
                 <w:sz w:val="19"/>
               </w:rPr>
+              <w:lastRenderedPageBreak/>
               <w:t>4</w:t>
             </w:r>
           </w:p>
@@ -28152,7 +31160,6 @@
               <w:rPr>
                 <w:sz w:val="19"/>
               </w:rPr>
-              <w:lastRenderedPageBreak/>
               <w:t>10</w:t>
             </w:r>
           </w:p>
@@ -28489,6 +31496,7 @@
       </w:pPr>
       <w:bookmarkStart w:id="68" w:name="_Toc236169761"/>
       <w:r>
+        <w:lastRenderedPageBreak/>
         <w:t>4.2.2. Dataset Training &amp; Evasion Robustness Testing</w:t>
       </w:r>
       <w:bookmarkEnd w:id="68"/>
@@ -28591,22 +31599,22 @@
     </w:p>
     <w:p>
       <w:r>
+        <w:t>These vectors were implemented in knn.js to ensure classification boundaries reflect real dataset signatures.</w:t>
+      </w:r>
+    </w:p>
+    <w:p>
+      <w:r>
+        <w:t>Overall, the project shows that robust AI text detection is achievable using client-side JavaScript combined with a lightweight Python backend for persistent storage, without neural network dependencies or cloud infrastructure.</w:t>
+      </w:r>
+    </w:p>
+    <w:p>
+      <w:r>
+        <w:t>Additional Test Cases for Database &amp; Authentication Features:</w:t>
+      </w:r>
+    </w:p>
+    <w:p>
+      <w:r>
         <w:lastRenderedPageBreak/>
-        <w:t>These vectors were implemented in knn.js to ensure classification boundaries reflect real dataset signatures.</w:t>
-      </w:r>
-    </w:p>
-    <w:p>
-      <w:r>
-        <w:t>Overall, the project shows that robust AI text detection is achievable using client-side JavaScript combined with a lightweight Python backend for persistent storage, without neural network dependencies or cloud infrastructure.</w:t>
-      </w:r>
-    </w:p>
-    <w:p>
-      <w:r>
-        <w:t>Additional Test Cases for Database &amp; Authentication Features:</w:t>
-      </w:r>
-    </w:p>
-    <w:p>
-      <w:r>
         <w:t>1. User Registration &amp; Authentication: Verified account creation with username, email, and password fields. Confirmed that duplicate usernames are rejected with appropriate error messages. Tested session persistence via localStorage (sentinel_session).</w:t>
       </w:r>
     </w:p>
@@ -28644,38 +31652,41 @@
         <w:t xml:space="preserve"> </w:t>
       </w:r>
       <w:r>
+        <w:t>time SVG visualizations, the sentence</w:t>
+      </w:r>
+      <w:r>
+        <w:t xml:space="preserve"> </w:t>
+      </w:r>
+      <w:r>
+        <w:t>level heatmap, and the LaTeX resolution panel make the tool accessible for both developers and educators.</w:t>
+      </w:r>
+    </w:p>
+    <w:p>
+      <w:r>
+        <w:t>All processing happens in the browser. No text is sent to a server, which means even sensitive or confidential documents can be analyzed without privacy risk. On a typical laptop, the full analysis completes in under 500 milliseconds.</w:t>
+      </w:r>
+    </w:p>
+    <w:p>
+      <w:r>
+        <w:t xml:space="preserve">The AI Text Detector is a lightweight, </w:t>
+      </w:r>
+      <w:proofErr w:type="gramStart"/>
+      <w:r>
+        <w:t>client</w:t>
+      </w:r>
+      <w:r>
+        <w:t xml:space="preserve"> </w:t>
+      </w:r>
+      <w:r>
+        <w:t>side</w:t>
+      </w:r>
+      <w:proofErr w:type="gramEnd"/>
+      <w:r>
+        <w:t xml:space="preserve"> tool that checks text authenticity without relying on remote APIs. By running six classification algorithms together each examining a </w:t>
+      </w:r>
+      <w:r>
         <w:lastRenderedPageBreak/>
-        <w:t>time SVG visualizations, the sentence</w:t>
-      </w:r>
-      <w:r>
-        <w:t xml:space="preserve"> </w:t>
-      </w:r>
-      <w:r>
-        <w:t>level heatmap, and the LaTeX resolution panel make the tool accessible for both developers and educators.</w:t>
-      </w:r>
-    </w:p>
-    <w:p>
-      <w:r>
-        <w:t>All processing happens in the browser. No text is sent to a server, which means even sensitive or confidential documents can be analyzed without privacy risk. On a typical laptop, the full analysis completes in under 500 milliseconds.</w:t>
-      </w:r>
-    </w:p>
-    <w:p>
-      <w:r>
-        <w:t xml:space="preserve">The AI Text Detector is a lightweight, </w:t>
-      </w:r>
-      <w:proofErr w:type="gramStart"/>
-      <w:r>
-        <w:t>client</w:t>
-      </w:r>
-      <w:r>
-        <w:t xml:space="preserve"> </w:t>
-      </w:r>
-      <w:r>
-        <w:t>side</w:t>
-      </w:r>
-      <w:proofErr w:type="gramEnd"/>
-      <w:r>
-        <w:t xml:space="preserve"> tool that checks text authenticity without relying on remote APIs. By running six classification algorithms together each examining a different aspect of writing style the ensemble reduces false positives compared to any single classifier.</w:t>
+        <w:t>different aspect of writing style the ensemble reduces false positives compared to any single classifier.</w:t>
       </w:r>
     </w:p>
     <w:p>
@@ -28948,7 +31959,6 @@
               <w:jc w:val="center"/>
             </w:pPr>
             <w:r>
-              <w:lastRenderedPageBreak/>
               <w:t>Negligible / Human</w:t>
             </w:r>
             <w:r>
@@ -28995,7 +32005,11 @@
         <w:t xml:space="preserve"> </w:t>
       </w:r>
       <w:r>
-        <w:t>generated scores rather than borderline margins. However, it is important to note that there were borderline findings that need careful examination.</w:t>
+        <w:t xml:space="preserve">generated scores rather than </w:t>
+      </w:r>
+      <w:r>
+        <w:lastRenderedPageBreak/>
+        <w:t>borderline margins. However, it is important to note that there were borderline findings that need careful examination.</w:t>
       </w:r>
     </w:p>
     <w:p>
@@ -29056,26 +32070,13 @@
         <w:jc w:val="center"/>
       </w:pPr>
       <w:r>
-        <w:rPr>
-          <w:b/>
-        </w:rPr>
-        <w:t>Figure 4.18: AI Probability Score Distribution</w:t>
+        <w:t>Figure 4.23: AI Probability Score Distribution</w:t>
       </w:r>
     </w:p>
     <w:p/>
     <w:p>
       <w:r>
-        <w:t>Figure 4.18 shows the Sentinel software's results when applied to 1,000 document samples. 1,000 texts were analyzed and categorized based on their level of AI probability. The outcomes reveal that Negligible / Human</w:t>
-      </w:r>
-      <w:r>
-        <w:t xml:space="preserve"> </w:t>
-      </w:r>
-      <w:r>
-        <w:t xml:space="preserve">Like classifications were the highest in number (337), followed by Extremely High AI Probability classifications (332). There were 159 findings of High AI Probability and 99 of Low AI Probability. During the evaluation process, only 73 borderline </w:t>
-      </w:r>
-      <w:r>
-        <w:lastRenderedPageBreak/>
-        <w:t>texts were detected. Negligible and Extremely High probability classifications dominate, suggesting that most texts exhibit strong, distinct features associated with either human authorship or AI generation. However, the presence of borderline texts shows that some texts still pose a challenge to clear categorization and need careful inspection.</w:t>
+        <w:t>Figure 4.23 shows the Sentinel software's results when applied to 1,000 document samples. 1,000 texts were analyzed and categorized based on their level of AI probability. The outcomes reveal that Negligible / Human Like classifications were the highest in number (337), followed by Extremely High AI Probability classifications (332). There were 159 findings of High AI Probability and 99 of Low AI Probability. During the evaluation process, only 73 borderline texts were detected. Negligible and Extremely High probability classifications dominate, suggesting that most texts exhibit strong, distinct features associated with either human authorship or AI generation. However, the presence of borderline texts shows that some texts still pose a challenge to clear categorization and need careful inspection.</w:t>
       </w:r>
     </w:p>
     <w:p>
@@ -29138,6 +32139,7 @@
               <w:rPr>
                 <w:b/>
               </w:rPr>
+              <w:lastRenderedPageBreak/>
               <w:t>Classifier Model</w:t>
             </w:r>
           </w:p>
@@ -29388,10 +32390,7 @@
         <w:jc w:val="center"/>
       </w:pPr>
       <w:r>
-        <w:rPr>
-          <w:b/>
-        </w:rPr>
-        <w:t>Figure 4.19: Classifier Performance Analysis</w:t>
+        <w:t>Figure 4.24: Classifier Performance Analysis</w:t>
       </w:r>
     </w:p>
     <w:p/>
@@ -29805,34 +32804,17 @@
         <w:jc w:val="center"/>
       </w:pPr>
       <w:r>
-        <w:rPr>
-          <w:b/>
-        </w:rPr>
-        <w:t>Figure 4.20: AI Probability Trend by Document Category</w:t>
+        <w:t>Figure 4.25: AI Probability Trend by Document Category</w:t>
       </w:r>
     </w:p>
     <w:p/>
     <w:p>
       <w:r>
-        <w:t xml:space="preserve">The overall results of the classification process are </w:t>
-      </w:r>
-      <w:proofErr w:type="spellStart"/>
-      <w:r>
-        <w:t>summarised</w:t>
-      </w:r>
-      <w:proofErr w:type="spellEnd"/>
-      <w:r>
-        <w:t xml:space="preserve"> in Figure 4.20. It was able to successfully analyze 1,000 documents across 12 different writing domains and detected </w:t>
+        <w:t xml:space="preserve">The overall results of the classification process are summarised in Figure 4.25. It was able to successfully analyze 1,000 documents across 12 different writing domains and detected </w:t>
       </w:r>
       <w:r>
         <w:lastRenderedPageBreak/>
-        <w:t>various stylometric signatures. Most of the findings were Negligible/Human</w:t>
-      </w:r>
-      <w:r>
-        <w:t xml:space="preserve"> </w:t>
-      </w:r>
-      <w:r>
-        <w:t>Like and Extremely High AI Probability classifications, with only a few borderline classifications. The outcome of the results shows that the proposed detector is capable of classification of various document styles and its classification with respect to their probability. The probability and classification generated is helpful for text assessment. The results show that the detector is effective in automating the text evaluation process and in decreasing the amount of manual grading.</w:t>
+        <w:t>various stylometric signatures. Most of the findings were Negligible/Human Like and Extremely High AI Probability classifications, with only a few borderline classifications. The outcome of the results shows that the proposed detector is capable of classification of various document styles and its classification with respect to their probability. The probability and classification generated is helpful for text assessment. The results show that the detector is effective in automating the text evaluation process and in decreasing the amount of manual grading.</w:t>
       </w:r>
     </w:p>
     <w:p>
@@ -30194,10 +33176,7 @@
         <w:jc w:val="center"/>
       </w:pPr>
       <w:r>
-        <w:rPr>
-          <w:b/>
-        </w:rPr>
-        <w:t>Figure 4.21: Confusion Matrix data from code</w:t>
+        <w:t>Figure 4.26: Confusion Matrix data from code</w:t>
       </w:r>
     </w:p>
     <w:p/>
@@ -30254,16 +33233,13 @@
         <w:jc w:val="center"/>
       </w:pPr>
       <w:r>
-        <w:rPr>
-          <w:b/>
-        </w:rPr>
-        <w:t>Figure 4.22: Confusion Matrix</w:t>
+        <w:t>Figure 4.27: Confusion Matrix</w:t>
       </w:r>
     </w:p>
     <w:p/>
     <w:p>
       <w:r>
-        <w:t>Figure 4.22 presents the confusion matrix used to evaluate the detection performance of the proposed AI Text Detector. The confusion matrix compares actual labels present in the testing environment with classifications predicted by the detector. The matrix consists of True Positives (TP), True Negatives (TN), False Positives (FP), and False Negatives (FN). A higher number of True Positives and True Negatives indicates better classification performance, while lower False Positives and False Negatives indicate fewer classification errors. The confusion matrix serves as the basis for calculating Accuracy, Precision, Recall, and F1 Score, which provide quantitative measurements of detector effectiveness.</w:t>
+        <w:t>Figure 4.27 presents the confusion matrix used to evaluate the detection performance of the proposed AI Text Detector. The confusion matrix compares actual labels present in the testing environment with classifications predicted by the detector. The matrix consists of True Positives (TP), True Negatives (TN), False Positives (FP), and False Negatives (FN). A higher number of True Positives and True Negatives indicates better classification performance, while lower False Positives and False Negatives indicate fewer classification errors. The confusion matrix serves as the basis for calculating Accuracy, Precision, Recall, and F1 Score, which provide quantitative measurements of detector effectiveness.</w:t>
       </w:r>
     </w:p>
     <w:p>
@@ -37572,7 +40548,7 @@
 </file>
 
 <file path=customXml/itemProps1.xml><?xml version="1.0" encoding="utf-8"?>
-<ds:datastoreItem xmlns:ds="http://schemas.openxmlformats.org/officeDocument/2006/customXml" ds:itemID="{9F012B54-3E56-4F86-881A-37E52ABA7EB9}">
+<ds:datastoreItem xmlns:ds="http://schemas.openxmlformats.org/officeDocument/2006/customXml" ds:itemID="{12D7B9E7-168D-4CBA-AF05-3844330F556E}">
   <ds:schemaRefs>
     <ds:schemaRef ds:uri="http://schemas.openxmlformats.org/officeDocument/2006/bibliography"/>
   </ds:schemaRefs>

</xml_diff>

<commit_message>
docs: correct headings indexing format in report (remove trailing dot)
</commit_message>
<xml_diff>
--- a/Ai text Detector Report_Updated.docx
+++ b/Ai text Detector Report_Updated.docx
@@ -2130,16 +2130,7 @@
                 <w:rStyle w:val="Hyperlink"/>
                 <w:noProof/>
               </w:rPr>
-              <w:t>1.1.</w:t>
-            </w:r>
-            <w:bookmarkStart w:id="8" w:name="_GoBack"/>
-            <w:bookmarkEnd w:id="8"/>
-            <w:r>
-              <w:rPr>
-                <w:rStyle w:val="Hyperlink"/>
-                <w:noProof/>
-              </w:rPr>
-              <w:t xml:space="preserve"> Introduction</w:t>
+              <w:t>1.1. Introduction</w:t>
             </w:r>
             <w:r>
               <w:rPr>
@@ -7073,7 +7064,7 @@
       </w:sdtContent>
     </w:sdt>
     <w:p>
-      <w:bookmarkStart w:id="9" w:name="_Toc237210618"/>
+      <w:bookmarkStart w:id="8" w:name="_Toc237210618"/>
     </w:p>
     <w:p/>
     <w:p/>
@@ -7095,7 +7086,7 @@
       <w:r>
         <w:t>LIST OF ABBREVIATIONS</w:t>
       </w:r>
-      <w:bookmarkEnd w:id="9"/>
+      <w:bookmarkEnd w:id="8"/>
     </w:p>
     <w:tbl>
       <w:tblPr>
@@ -7582,12 +7573,12 @@
         <w:pStyle w:val="Heading1"/>
         <w:spacing w:after="240"/>
       </w:pPr>
-      <w:bookmarkStart w:id="10" w:name="_Toc237210619"/>
+      <w:bookmarkStart w:id="9" w:name="_Toc237210619"/>
       <w:r>
         <w:lastRenderedPageBreak/>
         <w:t>LIST OF FIGURES</w:t>
       </w:r>
-      <w:bookmarkEnd w:id="10"/>
+      <w:bookmarkEnd w:id="9"/>
     </w:p>
     <w:tbl>
       <w:tblPr>
@@ -9525,12 +9516,12 @@
         <w:pStyle w:val="Heading1"/>
         <w:spacing w:after="240"/>
       </w:pPr>
-      <w:bookmarkStart w:id="11" w:name="_Toc237210620"/>
+      <w:bookmarkStart w:id="10" w:name="_Toc237210620"/>
       <w:r>
         <w:lastRenderedPageBreak/>
         <w:t>LIST OF TABLES</w:t>
       </w:r>
-      <w:bookmarkEnd w:id="11"/>
+      <w:bookmarkEnd w:id="10"/>
     </w:p>
     <w:tbl>
       <w:tblPr>
@@ -10003,7 +9994,7 @@
       <w:pPr>
         <w:pStyle w:val="Heading1"/>
       </w:pPr>
-      <w:bookmarkStart w:id="12" w:name="_Toc237210621"/>
+      <w:bookmarkStart w:id="11" w:name="_Toc237210621"/>
       <w:r>
         <w:lastRenderedPageBreak/>
         <w:t>CHAPTER 1</w:t>
@@ -10019,128 +10010,127 @@
       <w:r>
         <w:t>INTRODUCTION</w:t>
       </w:r>
+      <w:bookmarkEnd w:id="11"/>
+    </w:p>
+    <w:p>
+      <w:pPr>
+        <w:pStyle w:val="Heading2"/>
+      </w:pPr>
+      <w:bookmarkStart w:id="12" w:name="_Toc237210622"/>
+      <w:r>
+        <w:t>1.1 Introduction</w:t>
+      </w:r>
       <w:bookmarkEnd w:id="12"/>
+      <w:r>
+        <w:t xml:space="preserve"> </w:t>
+      </w:r>
+    </w:p>
+    <w:p>
+      <w:pPr>
+        <w:spacing w:after="0"/>
+      </w:pPr>
+      <w:r>
+        <w:t xml:space="preserve">Generative AI models like </w:t>
+      </w:r>
+      <w:proofErr w:type="spellStart"/>
+      <w:r>
+        <w:t>ChatGPT</w:t>
+      </w:r>
+      <w:proofErr w:type="spellEnd"/>
+      <w:r>
+        <w:t>, Claude, and Gemini have changed how text is produced at scale. Their rapid adoption across industries has introduced serious challenges around content authenticity. While these systems increase writing efficiency, they present severe challenges across multiple sectors, including plagiarism in academic writing, automated fake news dissemination, and artificial content spamming on web search platforms.</w:t>
+      </w:r>
+    </w:p>
+    <w:p>
+      <w:pPr>
+        <w:spacing w:after="0"/>
+      </w:pPr>
+      <w:r>
+        <w:t>Because AI</w:t>
+      </w:r>
+      <w:r>
+        <w:t xml:space="preserve"> </w:t>
+      </w:r>
+      <w:r>
+        <w:t>generated text is grammatically correct and coherent, spotting it by eye is extremely difficult. Automated detection tools are therefore needed. Standard commercial detectors rely heavily on calling proprietary API endpoints, introducing privacy concerns and network latency.</w:t>
+      </w:r>
+    </w:p>
+    <w:p>
+      <w:pPr>
+        <w:spacing w:after="0"/>
+      </w:pPr>
+      <w:r>
+        <w:t>This project addresses that gap with AI Text Detector a privacy</w:t>
+      </w:r>
+      <w:r>
+        <w:t xml:space="preserve"> </w:t>
+      </w:r>
+      <w:r>
+        <w:t xml:space="preserve">preserving tool that executes all stylometric feature extraction and machine learning classification directly inside the user's browser sandbox without sending document text to external cloud AI vendors. To enable persistent history tracking and secure user access without compromising privacy, the system integrates a Dual-Engine Persistent Database Architecture (a local SQLite3 server database backed by client-side browser </w:t>
+      </w:r>
+      <w:proofErr w:type="spellStart"/>
+      <w:r>
+        <w:t>IndexedDB</w:t>
+      </w:r>
+      <w:proofErr w:type="spellEnd"/>
+      <w:r>
+        <w:t xml:space="preserve"> fallback), accompanied by a secure User Authentication system and Guest Daily Quota Management.</w:t>
+      </w:r>
+    </w:p>
+    <w:p>
+      <w:pPr>
+        <w:spacing w:after="0"/>
+      </w:pPr>
+      <w:r>
+        <w:t>The application is constructed using HTML5, CSS3, ES6 JavaScript, and a lightweight Python REST API server (server.py) backed by an SQLite3 database (</w:t>
+      </w:r>
+      <w:proofErr w:type="spellStart"/>
+      <w:r>
+        <w:t>sentinel.db</w:t>
+      </w:r>
+      <w:proofErr w:type="spellEnd"/>
+      <w:r>
+        <w:t xml:space="preserve">). It leverages PDF.js and Mammoth.js to parse PDF and Word documents locally, </w:t>
+      </w:r>
+      <w:proofErr w:type="spellStart"/>
+      <w:r>
+        <w:t>SentinelDB</w:t>
+      </w:r>
+      <w:proofErr w:type="spellEnd"/>
+      <w:r>
+        <w:t xml:space="preserve"> (</w:t>
+      </w:r>
+      <w:proofErr w:type="spellStart"/>
+      <w:r>
+        <w:t>IndexedDB</w:t>
+      </w:r>
+      <w:proofErr w:type="spellEnd"/>
+      <w:r>
+        <w:t xml:space="preserve"> API) for local offline browser storage, and </w:t>
+      </w:r>
+      <w:proofErr w:type="spellStart"/>
+      <w:r>
+        <w:t>LocalStorage</w:t>
+      </w:r>
+      <w:proofErr w:type="spellEnd"/>
+      <w:r>
+        <w:t xml:space="preserve"> for user session and guest quota tracking. Users can create accounts using a username, email address, and password, authenticate seamlessly via dual login credentials (username or email), and securely search, manage, and inspect their personal analysis history database.</w:t>
+      </w:r>
+    </w:p>
+    <w:p>
+      <w:pPr>
+        <w:spacing w:after="0"/>
+      </w:pPr>
     </w:p>
     <w:p>
       <w:pPr>
         <w:pStyle w:val="Heading2"/>
       </w:pPr>
-      <w:bookmarkStart w:id="13" w:name="_Toc237210622"/>
-      <w:r>
-        <w:t>1.1. Introduction</w:t>
+      <w:bookmarkStart w:id="13" w:name="_Toc237210623"/>
+      <w:r>
+        <w:t>1.2 Problem Statement</w:t>
       </w:r>
       <w:bookmarkEnd w:id="13"/>
-      <w:r>
-        <w:t xml:space="preserve"> </w:t>
-      </w:r>
-    </w:p>
-    <w:p>
-      <w:pPr>
-        <w:spacing w:after="0"/>
-      </w:pPr>
-      <w:r>
-        <w:t xml:space="preserve">Generative AI models like </w:t>
-      </w:r>
-      <w:proofErr w:type="spellStart"/>
-      <w:r>
-        <w:t>ChatGPT</w:t>
-      </w:r>
-      <w:proofErr w:type="spellEnd"/>
-      <w:r>
-        <w:t>, Claude, and Gemini have changed how text is produced at scale. Their rapid adoption across industries has introduced serious challenges around content authenticity. While these systems increase writing efficiency, they present severe challenges across multiple sectors, including plagiarism in academic writing, automated fake news dissemination, and artificial content spamming on web search platforms.</w:t>
-      </w:r>
-    </w:p>
-    <w:p>
-      <w:pPr>
-        <w:spacing w:after="0"/>
-      </w:pPr>
-      <w:r>
-        <w:t>Because AI</w:t>
-      </w:r>
-      <w:r>
-        <w:t xml:space="preserve"> </w:t>
-      </w:r>
-      <w:r>
-        <w:t>generated text is grammatically correct and coherent, spotting it by eye is extremely difficult. Automated detection tools are therefore needed. Standard commercial detectors rely heavily on calling proprietary API endpoints, introducing privacy concerns and network latency.</w:t>
-      </w:r>
-    </w:p>
-    <w:p>
-      <w:pPr>
-        <w:spacing w:after="0"/>
-      </w:pPr>
-      <w:r>
-        <w:t>This project addresses that gap with AI Text Detector a privacy</w:t>
-      </w:r>
-      <w:r>
-        <w:t xml:space="preserve"> </w:t>
-      </w:r>
-      <w:r>
-        <w:t xml:space="preserve">preserving tool that executes all stylometric feature extraction and machine learning classification directly inside the user's browser sandbox without sending document text to external cloud AI vendors. To enable persistent history tracking and secure user access without compromising privacy, the system integrates a Dual-Engine Persistent Database Architecture (a local SQLite3 server database backed by client-side browser </w:t>
-      </w:r>
-      <w:proofErr w:type="spellStart"/>
-      <w:r>
-        <w:t>IndexedDB</w:t>
-      </w:r>
-      <w:proofErr w:type="spellEnd"/>
-      <w:r>
-        <w:t xml:space="preserve"> fallback), accompanied by a secure User Authentication system and Guest Daily Quota Management.</w:t>
-      </w:r>
-    </w:p>
-    <w:p>
-      <w:pPr>
-        <w:spacing w:after="0"/>
-      </w:pPr>
-      <w:r>
-        <w:t>The application is constructed using HTML5, CSS3, ES6 JavaScript, and a lightweight Python REST API server (server.py) backed by an SQLite3 database (</w:t>
-      </w:r>
-      <w:proofErr w:type="spellStart"/>
-      <w:r>
-        <w:t>sentinel.db</w:t>
-      </w:r>
-      <w:proofErr w:type="spellEnd"/>
-      <w:r>
-        <w:t xml:space="preserve">). It leverages PDF.js and Mammoth.js to parse PDF and Word documents locally, </w:t>
-      </w:r>
-      <w:proofErr w:type="spellStart"/>
-      <w:r>
-        <w:t>SentinelDB</w:t>
-      </w:r>
-      <w:proofErr w:type="spellEnd"/>
-      <w:r>
-        <w:t xml:space="preserve"> (</w:t>
-      </w:r>
-      <w:proofErr w:type="spellStart"/>
-      <w:r>
-        <w:t>IndexedDB</w:t>
-      </w:r>
-      <w:proofErr w:type="spellEnd"/>
-      <w:r>
-        <w:t xml:space="preserve"> API) for local offline browser storage, and </w:t>
-      </w:r>
-      <w:proofErr w:type="spellStart"/>
-      <w:r>
-        <w:t>LocalStorage</w:t>
-      </w:r>
-      <w:proofErr w:type="spellEnd"/>
-      <w:r>
-        <w:t xml:space="preserve"> for user session and guest quota tracking. Users can create accounts using a username, email address, and password, authenticate seamlessly via dual login credentials (username or email), and securely search, manage, and inspect their personal analysis history database.</w:t>
-      </w:r>
-    </w:p>
-    <w:p>
-      <w:pPr>
-        <w:spacing w:after="0"/>
-      </w:pPr>
-    </w:p>
-    <w:p>
-      <w:pPr>
-        <w:pStyle w:val="Heading2"/>
-      </w:pPr>
-      <w:bookmarkStart w:id="14" w:name="_Toc237210623"/>
-      <w:r>
-        <w:lastRenderedPageBreak/>
-        <w:t>1.2. Problem Statement</w:t>
-      </w:r>
-      <w:bookmarkEnd w:id="14"/>
     </w:p>
     <w:p>
       <w:pPr>
@@ -10215,11 +10205,11 @@
       <w:pPr>
         <w:pStyle w:val="Heading2"/>
       </w:pPr>
-      <w:bookmarkStart w:id="15" w:name="_Toc237210624"/>
-      <w:r>
-        <w:t>1.3. Objectives</w:t>
-      </w:r>
-      <w:bookmarkEnd w:id="15"/>
+      <w:bookmarkStart w:id="14" w:name="_Toc237210624"/>
+      <w:r>
+        <w:t>1.3 Objectives</w:t>
+      </w:r>
+      <w:bookmarkEnd w:id="14"/>
     </w:p>
     <w:p>
       <w:pPr>
@@ -10393,9 +10383,9 @@
       <w:pPr>
         <w:pStyle w:val="Heading2"/>
       </w:pPr>
-      <w:bookmarkStart w:id="16" w:name="_Toc237210625"/>
-      <w:r>
-        <w:t xml:space="preserve">1.4. </w:t>
+      <w:bookmarkStart w:id="15" w:name="_Toc237210625"/>
+      <w:r>
+        <w:t xml:space="preserve">1.4 </w:t>
       </w:r>
       <w:r>
         <w:t xml:space="preserve">Development </w:t>
@@ -10403,7 +10393,7 @@
       <w:r>
         <w:t>Methodology</w:t>
       </w:r>
-      <w:bookmarkEnd w:id="16"/>
+      <w:bookmarkEnd w:id="15"/>
       <w:r>
         <w:t xml:space="preserve"> </w:t>
       </w:r>
@@ -10661,12 +10651,11 @@
       <w:pPr>
         <w:pStyle w:val="Heading2"/>
       </w:pPr>
-      <w:bookmarkStart w:id="17" w:name="_Toc237210626"/>
-      <w:r>
-        <w:lastRenderedPageBreak/>
-        <w:t>1.5. Report Organization</w:t>
-      </w:r>
-      <w:bookmarkEnd w:id="17"/>
+      <w:bookmarkStart w:id="16" w:name="_Toc237210626"/>
+      <w:r>
+        <w:t>1.5 Report Organization</w:t>
+      </w:r>
+      <w:bookmarkEnd w:id="16"/>
     </w:p>
     <w:p>
       <w:pPr>
@@ -10805,12 +10794,12 @@
         <w:pStyle w:val="Heading1"/>
         <w:spacing w:after="240"/>
       </w:pPr>
-      <w:bookmarkStart w:id="18" w:name="_Toc237210627"/>
+      <w:bookmarkStart w:id="17" w:name="_Toc237210627"/>
       <w:r>
         <w:lastRenderedPageBreak/>
         <w:t>CHAPTER 2</w:t>
       </w:r>
-      <w:bookmarkStart w:id="19" w:name="_Toc201399424"/>
+      <w:bookmarkStart w:id="18" w:name="_Toc201399424"/>
       <w:r>
         <w:t xml:space="preserve"> </w:t>
       </w:r>
@@ -10823,48 +10812,76 @@
       <w:r>
         <w:t>BACKGROUND STUDY AND LITERATURE REVIEW</w:t>
       </w:r>
+      <w:bookmarkEnd w:id="17"/>
       <w:bookmarkEnd w:id="18"/>
+      <w:r>
+        <w:t xml:space="preserve"> </w:t>
+      </w:r>
+    </w:p>
+    <w:p>
+      <w:pPr>
+        <w:pStyle w:val="Heading2"/>
+      </w:pPr>
+      <w:bookmarkStart w:id="19" w:name="_Toc237210628"/>
+      <w:r>
+        <w:t>2.1 Background Study</w:t>
+      </w:r>
       <w:bookmarkEnd w:id="19"/>
+    </w:p>
+    <w:p>
+      <w:pPr>
+        <w:spacing w:after="0"/>
+      </w:pPr>
+      <w:r>
+        <w:t>Stylometry</w:t>
+      </w:r>
       <w:r>
         <w:t xml:space="preserve"> </w:t>
       </w:r>
-    </w:p>
-    <w:p>
-      <w:pPr>
-        <w:pStyle w:val="Heading2"/>
-      </w:pPr>
-      <w:bookmarkStart w:id="20" w:name="_Toc237210628"/>
-      <w:r>
-        <w:t>2.1. Background Study</w:t>
-      </w:r>
-      <w:bookmarkEnd w:id="20"/>
-    </w:p>
-    <w:p>
-      <w:pPr>
-        <w:spacing w:after="0"/>
-      </w:pPr>
-      <w:r>
-        <w:t>Stylometry</w:t>
+      <w:r>
+        <w:t>the study of linguistic style</w:t>
       </w:r>
       <w:r>
         <w:t xml:space="preserve"> </w:t>
       </w:r>
       <w:r>
-        <w:t>the study of linguistic style</w:t>
+        <w:t>rests on the premise that every writer possesses a unique, identifiable “</w:t>
+      </w:r>
+      <w:proofErr w:type="spellStart"/>
+      <w:r>
+        <w:t>writeprint</w:t>
+      </w:r>
+      <w:proofErr w:type="spellEnd"/>
+      <w:r>
+        <w:t>.” This footprint manifests in average sentence length, punctuation usage, lexical choices, and structural complexity.</w:t>
+      </w:r>
+    </w:p>
+    <w:p>
+      <w:pPr>
+        <w:spacing w:before="0" w:after="0"/>
+      </w:pPr>
+      <w:r>
+        <w:t>Large Language Models (LLMs), despite their fluency, do not write like humans. Because they generate text by predicting the next most likely word token, their output matches high</w:t>
       </w:r>
       <w:r>
         <w:t xml:space="preserve"> </w:t>
       </w:r>
       <w:r>
-        <w:t>rests on the premise that every writer possesses a unique, identifiable “</w:t>
+        <w:t>probability patterns, resulting in low entropy (predictability) and highly uniform sentence lengths. Conversely, human writing exhibits “</w:t>
       </w:r>
       <w:proofErr w:type="spellStart"/>
       <w:r>
-        <w:t>writeprint</w:t>
+        <w:t>burstiness”a</w:t>
       </w:r>
       <w:proofErr w:type="spellEnd"/>
       <w:r>
-        <w:t>.” This footprint manifests in average sentence length, punctuation usage, lexical choices, and structural complexity.</w:t>
+        <w:t xml:space="preserve"> mix of short, simple sentences with long, complex structures</w:t>
+      </w:r>
+      <w:r>
+        <w:t xml:space="preserve"> </w:t>
+      </w:r>
+      <w:r>
+        <w:t>and a richer vocabulary containing unique words used only once (Hapax Legomena).</w:t>
       </w:r>
     </w:p>
     <w:p>
@@ -10872,27 +10889,69 @@
         <w:spacing w:before="0" w:after="0"/>
       </w:pPr>
       <w:r>
-        <w:t>Large Language Models (LLMs), despite their fluency, do not write like humans. Because they generate text by predicting the next most likely word token, their output matches high</w:t>
+        <w:t>Automating the capture of these differences requires extracting numeric vectors representing text attributes, which are then analyzed using statistical models, instance</w:t>
       </w:r>
       <w:r>
         <w:t xml:space="preserve"> </w:t>
       </w:r>
       <w:r>
-        <w:t>probability patterns, resulting in low entropy (predictability) and highly uniform sentence lengths. Conversely, human writing exhibits “</w:t>
+        <w:t>based classification, and geometry.</w:t>
+      </w:r>
+    </w:p>
+    <w:p>
+      <w:pPr>
+        <w:spacing w:before="0" w:after="0"/>
+      </w:pPr>
+      <w:r>
+        <w:t>Statistical natural language processing provides a stable baseline for this analysis. By evaluating the perplexity of word sequences and the standard deviation of sentence lengths (burstiness), the system identifies the regular, predictable patterns typical of AI content.</w:t>
+      </w:r>
+    </w:p>
+    <w:p>
+      <w:pPr>
+        <w:spacing w:before="0" w:after="0"/>
+      </w:pPr>
+      <w:r>
+        <w:t>To supplement statistical analysis, instance</w:t>
+      </w:r>
+      <w:r>
+        <w:t xml:space="preserve"> </w:t>
+      </w:r>
+      <w:r>
+        <w:t>based machine learning is applied. A K</w:t>
+      </w:r>
+      <w:r>
+        <w:t xml:space="preserve"> </w:t>
+      </w:r>
+      <w:r>
+        <w:t xml:space="preserve">Nearest Neighbors (KNN) classifier maps the document's syntactic features into a </w:t>
       </w:r>
       <w:proofErr w:type="spellStart"/>
       <w:r>
-        <w:t>burstiness”a</w:t>
+        <w:t>multi</w:t>
+      </w:r>
+      <w:r>
+        <w:t xml:space="preserve"> </w:t>
+      </w:r>
+      <w:r>
+        <w:t>dimensional</w:t>
       </w:r>
       <w:proofErr w:type="spellEnd"/>
       <w:r>
-        <w:t xml:space="preserve"> mix of short, simple sentences with long, complex structures</w:t>
+        <w:t xml:space="preserve"> space, measuring Euclidean distance to a </w:t>
+      </w:r>
+      <w:proofErr w:type="spellStart"/>
+      <w:r>
+        <w:t>pre</w:t>
       </w:r>
       <w:r>
         <w:t xml:space="preserve"> </w:t>
       </w:r>
       <w:r>
-        <w:t>and a richer vocabulary containing unique words used only once (Hapax Legomena).</w:t>
+        <w:t>defined</w:t>
+      </w:r>
+      <w:proofErr w:type="spellEnd"/>
+      <w:r>
+        <w:t xml:space="preserve"> training set of human and AI documents to make a classification verdict.</w:t>
       </w:r>
     </w:p>
     <w:p>
@@ -10900,103 +10959,7 @@
         <w:spacing w:before="0" w:after="0"/>
       </w:pPr>
       <w:r>
-        <w:t xml:space="preserve">Automating the capture of these differences requires extracting numeric vectors representing text attributes, which are then analyzed using statistical models, </w:t>
-      </w:r>
-      <w:proofErr w:type="gramStart"/>
-      <w:r>
-        <w:t>instance</w:t>
-      </w:r>
-      <w:r>
-        <w:t xml:space="preserve"> </w:t>
-      </w:r>
-      <w:r>
-        <w:t>based</w:t>
-      </w:r>
-      <w:proofErr w:type="gramEnd"/>
-      <w:r>
-        <w:t xml:space="preserve"> classification, and geometry.</w:t>
-      </w:r>
-    </w:p>
-    <w:p>
-      <w:pPr>
-        <w:spacing w:before="0" w:after="0"/>
-      </w:pPr>
-      <w:r>
-        <w:t>Statistical natural language processing provides a stable baseline for this analysis. By evaluating the perplexity of word sequences and the standard deviation of sentence lengths (burstiness), the system identifies the regular, predictable patterns typical of AI content.</w:t>
-      </w:r>
-    </w:p>
-    <w:p>
-      <w:pPr>
-        <w:spacing w:before="0" w:after="0"/>
-      </w:pPr>
-      <w:r>
-        <w:t xml:space="preserve">To supplement statistical analysis, </w:t>
-      </w:r>
-      <w:proofErr w:type="gramStart"/>
-      <w:r>
-        <w:t>instance</w:t>
-      </w:r>
-      <w:r>
-        <w:t xml:space="preserve"> </w:t>
-      </w:r>
-      <w:r>
-        <w:t>based</w:t>
-      </w:r>
-      <w:proofErr w:type="gramEnd"/>
-      <w:r>
-        <w:t xml:space="preserve"> machine learning is applied. A K</w:t>
-      </w:r>
-      <w:r>
-        <w:t xml:space="preserve"> </w:t>
-      </w:r>
-      <w:r>
-        <w:t xml:space="preserve">Nearest Neighbors (KNN) classifier maps the document's syntactic features into a </w:t>
-      </w:r>
-      <w:proofErr w:type="spellStart"/>
-      <w:r>
-        <w:t>multi</w:t>
-      </w:r>
-      <w:r>
-        <w:t xml:space="preserve"> </w:t>
-      </w:r>
-      <w:r>
-        <w:t>dimensional</w:t>
-      </w:r>
-      <w:proofErr w:type="spellEnd"/>
-      <w:r>
-        <w:t xml:space="preserve"> space, measuring Euclidean distance to a </w:t>
-      </w:r>
-      <w:proofErr w:type="spellStart"/>
-      <w:proofErr w:type="gramStart"/>
-      <w:r>
-        <w:t>pre</w:t>
-      </w:r>
-      <w:r>
-        <w:t xml:space="preserve"> </w:t>
-      </w:r>
-      <w:r>
-        <w:t>defined</w:t>
-      </w:r>
-      <w:proofErr w:type="spellEnd"/>
-      <w:proofErr w:type="gramEnd"/>
-      <w:r>
-        <w:t xml:space="preserve"> training set of human and AI documents to make a classification verdict.</w:t>
-      </w:r>
-    </w:p>
-    <w:p>
-      <w:pPr>
-        <w:spacing w:before="0" w:after="0"/>
-      </w:pPr>
-      <w:r>
-        <w:t xml:space="preserve">Additionally, a </w:t>
-      </w:r>
-      <w:proofErr w:type="gramStart"/>
-      <w:r>
-        <w:t>Vector Space Model measures semantic alignments</w:t>
-      </w:r>
-      <w:proofErr w:type="gramEnd"/>
-      <w:r>
-        <w:t>. By computing the cosine angle between the document's syntax vector and human/AI prototype vectors, it determines which category the text aligns with more closely.</w:t>
+        <w:t>Additionally, a Vector Space Model measures semantic alignments. By computing the cosine angle between the document's syntax vector and human/AI prototype vectors, it determines which category the text aligns with more closely.</w:t>
       </w:r>
     </w:p>
     <w:p>
@@ -11018,11 +10981,11 @@
       <w:pPr>
         <w:pStyle w:val="Heading2"/>
       </w:pPr>
-      <w:bookmarkStart w:id="21" w:name="_Toc237210629"/>
+      <w:bookmarkStart w:id="20" w:name="_Toc237210629"/>
       <w:r>
         <w:t>2.2 Literature Review</w:t>
       </w:r>
-      <w:bookmarkEnd w:id="21"/>
+      <w:bookmarkEnd w:id="20"/>
     </w:p>
     <w:p>
       <w:pPr>
@@ -11301,69 +11264,53 @@
         <w:rPr>
           <w:bCs/>
         </w:rPr>
-        <w:t xml:space="preserve">generation language models. This work proved that basic statistical markers and word frequencies carry sufficient stylistic information to differentiate human and machine text, establishing the foundational basis for lightweight, </w:t>
-      </w:r>
-      <w:proofErr w:type="gramStart"/>
+        <w:t>generation language models. This work proved that basic statistical markers and word frequencies carry sufficient stylistic information to differentiate human and machine text, establishing the foundational basis for lightweight, client</w:t>
+      </w:r>
       <w:r>
         <w:rPr>
           <w:bCs/>
         </w:rPr>
-        <w:t>client</w:t>
+        <w:t xml:space="preserve"> </w:t>
       </w:r>
       <w:r>
         <w:rPr>
           <w:bCs/>
         </w:rPr>
+        <w:t>side feature classification.</w:t>
+      </w:r>
+      <w:r>
+        <w:rPr>
+          <w:bCs/>
+        </w:rPr>
+        <w:t xml:space="preserve"> [3]</w:t>
+      </w:r>
+    </w:p>
+    <w:p>
+      <w:pPr>
+        <w:rPr>
+          <w:bCs/>
+        </w:rPr>
+      </w:pPr>
+      <w:r>
+        <w:t>As generative models evolved, Crothers et al. (2023) published a detailed systematic review in IEEE Access detailing the growing challenges and security vulnerabilities of existing detection methods. The authors analyzed the limitations of supervised neural network classifiers, highlighting their susceptibility to simple adversarial attacks, such as synonym swapping, character perturbation, and prompt manipulation. Additionally, their research revealed a systemic bias in statistical detectors, which frequently yield high false</w:t>
+      </w:r>
+      <w:r>
         <w:t xml:space="preserve"> </w:t>
       </w:r>
       <w:r>
-        <w:rPr>
-          <w:bCs/>
-        </w:rPr>
-        <w:t>side</w:t>
-      </w:r>
-      <w:proofErr w:type="gramEnd"/>
-      <w:r>
-        <w:rPr>
-          <w:bCs/>
-        </w:rPr>
-        <w:t xml:space="preserve"> feature classification.</w:t>
-      </w:r>
-      <w:r>
-        <w:rPr>
-          <w:bCs/>
-        </w:rPr>
-        <w:t xml:space="preserve"> [3]</w:t>
-      </w:r>
-    </w:p>
-    <w:p>
-      <w:pPr>
-        <w:rPr>
-          <w:bCs/>
-        </w:rPr>
-      </w:pPr>
-      <w:r>
-        <w:t>As generative models evolved, Crothers et al. (2023) published a detailed systematic review in IEEE Access detailing the growing challenges and security vulnerabilities of existing detection methods. The authors analyzed the limitations of supervised neural network classifiers, highlighting their susceptibility to simple adversarial attacks, such as synonym swapping, character perturbation, and prompt manipulation. Additionally, their research revealed a systemic bias in statistical detectors, which frequently yield high false</w:t>
+        <w:t xml:space="preserve">positive rates when evaluating the writing of </w:t>
+      </w:r>
+      <w:proofErr w:type="spellStart"/>
+      <w:r>
+        <w:t>non</w:t>
       </w:r>
       <w:r>
         <w:t xml:space="preserve"> </w:t>
       </w:r>
       <w:r>
-        <w:t xml:space="preserve">positive rates when evaluating the writing of </w:t>
-      </w:r>
-      <w:proofErr w:type="spellStart"/>
-      <w:proofErr w:type="gramStart"/>
-      <w:r>
-        <w:t>non</w:t>
-      </w:r>
-      <w:r>
-        <w:t xml:space="preserve"> </w:t>
-      </w:r>
-      <w:r>
         <w:t>native</w:t>
       </w:r>
       <w:proofErr w:type="spellEnd"/>
-      <w:proofErr w:type="gramEnd"/>
       <w:r>
         <w:t xml:space="preserve"> English speakers. This study underscored the critical need for </w:t>
       </w:r>
@@ -11537,13 +11484,13 @@
         <w:pStyle w:val="Heading1"/>
         <w:ind w:left="224" w:right="278"/>
       </w:pPr>
-      <w:bookmarkStart w:id="22" w:name="_Toc201399427"/>
-      <w:bookmarkStart w:id="23" w:name="_Toc237210630"/>
+      <w:bookmarkStart w:id="21" w:name="_Toc201399427"/>
+      <w:bookmarkStart w:id="22" w:name="_Toc237210630"/>
       <w:r>
         <w:lastRenderedPageBreak/>
         <w:t>CHAPTER 3</w:t>
       </w:r>
-      <w:bookmarkEnd w:id="22"/>
+      <w:bookmarkEnd w:id="21"/>
       <w:r>
         <w:t xml:space="preserve"> </w:t>
       </w:r>
@@ -11556,31 +11503,31 @@
       <w:r>
         <w:t>SYSTEM ANALYSIS AND DESIGN</w:t>
       </w:r>
+      <w:bookmarkEnd w:id="22"/>
+    </w:p>
+    <w:p>
+      <w:pPr>
+        <w:pStyle w:val="Heading2"/>
+      </w:pPr>
+      <w:bookmarkStart w:id="23" w:name="_Toc231875504"/>
+      <w:bookmarkStart w:id="24" w:name="_Toc237210631"/>
+      <w:r>
+        <w:t>3.1 System Analysis</w:t>
+      </w:r>
       <w:bookmarkEnd w:id="23"/>
-    </w:p>
-    <w:p>
-      <w:pPr>
-        <w:pStyle w:val="Heading2"/>
-      </w:pPr>
-      <w:bookmarkStart w:id="24" w:name="_Toc231875504"/>
-      <w:bookmarkStart w:id="25" w:name="_Toc237210631"/>
-      <w:r>
-        <w:t>3.1. System Analysis</w:t>
-      </w:r>
       <w:bookmarkEnd w:id="24"/>
+    </w:p>
+    <w:p>
+      <w:pPr>
+        <w:pStyle w:val="Heading3"/>
+      </w:pPr>
+      <w:bookmarkStart w:id="25" w:name="_Toc231875505"/>
+      <w:bookmarkStart w:id="26" w:name="_Toc237210632"/>
+      <w:r>
+        <w:t>3.1.1 Requirement Analysis</w:t>
+      </w:r>
       <w:bookmarkEnd w:id="25"/>
-    </w:p>
-    <w:p>
-      <w:pPr>
-        <w:pStyle w:val="Heading3"/>
-      </w:pPr>
-      <w:bookmarkStart w:id="26" w:name="_Toc231875505"/>
-      <w:bookmarkStart w:id="27" w:name="_Toc237210632"/>
-      <w:r>
-        <w:t>3.1.1 Requirement Analysis</w:t>
-      </w:r>
       <w:bookmarkEnd w:id="26"/>
-      <w:bookmarkEnd w:id="27"/>
     </w:p>
     <w:p>
       <w:pPr>
@@ -12045,202 +11992,186 @@
           <w:b/>
           <w:bCs/>
         </w:rPr>
-        <w:t xml:space="preserve">3.1.1.2. </w:t>
-      </w:r>
-      <w:proofErr w:type="gramStart"/>
+        <w:t>3.1.1.2 Non</w:t>
+      </w:r>
       <w:r>
         <w:rPr>
           <w:b/>
           <w:bCs/>
         </w:rPr>
-        <w:t>Non</w:t>
+        <w:t xml:space="preserve"> </w:t>
       </w:r>
       <w:r>
         <w:rPr>
           <w:b/>
           <w:bCs/>
         </w:rPr>
-        <w:t xml:space="preserve"> </w:t>
-      </w:r>
-      <w:r>
+        <w:t>Functional Requirements</w:t>
+      </w:r>
+    </w:p>
+    <w:p>
+      <w:pPr>
+        <w:spacing w:after="0"/>
         <w:rPr>
           <w:b/>
           <w:bCs/>
         </w:rPr>
-        <w:t>Functional</w:t>
-      </w:r>
-      <w:proofErr w:type="gramEnd"/>
+      </w:pPr>
       <w:r>
         <w:rPr>
           <w:b/>
           <w:bCs/>
         </w:rPr>
-        <w:t xml:space="preserve"> Requirements</w:t>
-      </w:r>
-    </w:p>
-    <w:p>
-      <w:pPr>
-        <w:spacing w:after="0"/>
+        <w:t>a</w:t>
+      </w:r>
+      <w:r>
         <w:rPr>
           <w:b/>
           <w:bCs/>
         </w:rPr>
-      </w:pPr>
-      <w:r>
+        <w:t>.  Usability (User Friendly):</w:t>
+      </w:r>
+    </w:p>
+    <w:p>
+      <w:r>
+        <w:t>The interface must remain clean and intuitive, requiring no technical styling training to operate.</w:t>
+      </w:r>
+    </w:p>
+    <w:p>
+      <w:pPr>
+        <w:spacing w:after="0"/>
         <w:rPr>
           <w:b/>
           <w:bCs/>
         </w:rPr>
-        <w:t>a</w:t>
-      </w:r>
+      </w:pPr>
       <w:r>
         <w:rPr>
           <w:b/>
           <w:bCs/>
         </w:rPr>
-        <w:t>.  Usability (User Friendly):</w:t>
-      </w:r>
-    </w:p>
-    <w:p>
-      <w:r>
-        <w:t>The interface must remain clean and intuitive, requiring no technical styling training to operate.</w:t>
-      </w:r>
-    </w:p>
-    <w:p>
-      <w:pPr>
-        <w:spacing w:after="0"/>
+        <w:t>b</w:t>
+      </w:r>
+      <w:r>
         <w:rPr>
           <w:b/>
           <w:bCs/>
         </w:rPr>
-      </w:pPr>
-      <w:r>
+        <w:t>.  Privacy (Data Security):</w:t>
+      </w:r>
+    </w:p>
+    <w:p>
+      <w:r>
+        <w:t>All AI classification and stylometric analysis computations execute entirely within the client browser sandbox. No user document text is transmitted to external third-party cloud AI services. The optional local SQLite3 backend server (localhost:5000) stores only user credentials and analysis metadata on the user's own machine, preserving full data sovereignty.</w:t>
+      </w:r>
+    </w:p>
+    <w:p>
+      <w:pPr>
+        <w:spacing w:after="0"/>
         <w:rPr>
           <w:b/>
           <w:bCs/>
         </w:rPr>
-        <w:t>b</w:t>
-      </w:r>
+      </w:pPr>
       <w:r>
         <w:rPr>
           <w:b/>
           <w:bCs/>
         </w:rPr>
-        <w:t>.  Privacy (Data Security):</w:t>
-      </w:r>
-    </w:p>
-    <w:p>
-      <w:r>
-        <w:t>All AI classification and stylometric analysis computations execute entirely within the client browser sandbox. No user document text is transmitted to external third-party cloud AI services. The optional local SQLite3 backend server (localhost:5000) stores only user credentials and analysis metadata on the user's own machine, preserving full data sovereignty.</w:t>
-      </w:r>
-    </w:p>
-    <w:p>
-      <w:pPr>
-        <w:spacing w:after="0"/>
+        <w:t>c</w:t>
+      </w:r>
+      <w:r>
         <w:rPr>
           <w:b/>
           <w:bCs/>
         </w:rPr>
-      </w:pPr>
-      <w:r>
+        <w:t>.  Low Latency Performance:</w:t>
+      </w:r>
+    </w:p>
+    <w:p>
+      <w:r>
+        <w:t>The document processing and classification pipeline must execute in less than 500 milliseconds.</w:t>
+      </w:r>
+    </w:p>
+    <w:p>
+      <w:pPr>
+        <w:spacing w:after="0"/>
         <w:rPr>
           <w:b/>
           <w:bCs/>
         </w:rPr>
-        <w:t>c</w:t>
-      </w:r>
+      </w:pPr>
       <w:r>
         <w:rPr>
           <w:b/>
           <w:bCs/>
         </w:rPr>
-        <w:t>.  Low Latency Performance:</w:t>
-      </w:r>
-    </w:p>
-    <w:p>
-      <w:r>
-        <w:t>The document processing and classification pipeline must execute in less than 500 milliseconds.</w:t>
-      </w:r>
-    </w:p>
-    <w:p>
-      <w:pPr>
-        <w:spacing w:after="0"/>
+        <w:t>d</w:t>
+      </w:r>
+      <w:r>
         <w:rPr>
           <w:b/>
           <w:bCs/>
         </w:rPr>
-      </w:pPr>
-      <w:r>
+        <w:t>.  Classification Accuracy:</w:t>
+      </w:r>
+    </w:p>
+    <w:p>
+      <w:r>
+        <w:t>The ensemble algorithms must be tuned to minimize false positives on human text and false negatives on AI content.</w:t>
+      </w:r>
+    </w:p>
+    <w:p/>
+    <w:p/>
+    <w:p>
+      <w:pPr>
+        <w:spacing w:after="0"/>
         <w:rPr>
           <w:b/>
           <w:bCs/>
         </w:rPr>
-        <w:t>d</w:t>
-      </w:r>
+      </w:pPr>
       <w:r>
         <w:rPr>
           <w:b/>
           <w:bCs/>
         </w:rPr>
-        <w:t>.  Classification Accuracy:</w:t>
-      </w:r>
-    </w:p>
-    <w:p>
-      <w:r>
-        <w:t>The ensemble algorithms must be tuned to minimize false positives on human text and false negatives on AI content.</w:t>
-      </w:r>
-    </w:p>
-    <w:p/>
-    <w:p/>
-    <w:p>
-      <w:pPr>
-        <w:spacing w:after="0"/>
+        <w:lastRenderedPageBreak/>
+        <w:t>e</w:t>
+      </w:r>
+      <w:r>
         <w:rPr>
           <w:b/>
           <w:bCs/>
         </w:rPr>
-      </w:pPr>
-      <w:r>
+        <w:t>.  Reliability and Stability:</w:t>
+      </w:r>
+    </w:p>
+    <w:p>
+      <w:r>
+        <w:t>The browser environment must remain stable, running files up to 20,000 words without freezing the UI.</w:t>
+      </w:r>
+    </w:p>
+    <w:p>
+      <w:pPr>
+        <w:spacing w:after="0"/>
         <w:rPr>
           <w:b/>
           <w:bCs/>
         </w:rPr>
-        <w:lastRenderedPageBreak/>
-        <w:t>e</w:t>
-      </w:r>
+      </w:pPr>
       <w:r>
         <w:rPr>
           <w:b/>
           <w:bCs/>
         </w:rPr>
-        <w:t>.  Reliability and Stability:</w:t>
-      </w:r>
-    </w:p>
-    <w:p>
-      <w:r>
-        <w:t>The browser environment must remain stable, running files up to 20,000 words without freezing the UI.</w:t>
-      </w:r>
-    </w:p>
-    <w:p>
-      <w:pPr>
-        <w:spacing w:after="0"/>
+        <w:t>f</w:t>
+      </w:r>
+      <w:r>
         <w:rPr>
           <w:b/>
           <w:bCs/>
         </w:rPr>
-      </w:pPr>
-      <w:r>
-        <w:rPr>
-          <w:b/>
-          <w:bCs/>
-        </w:rPr>
-        <w:t>f</w:t>
-      </w:r>
-      <w:r>
-        <w:rPr>
-          <w:b/>
-          <w:bCs/>
-        </w:rPr>
         <w:t>.  Portability:</w:t>
       </w:r>
     </w:p>
@@ -12261,18 +12192,18 @@
       <w:pPr>
         <w:pStyle w:val="Heading3"/>
       </w:pPr>
-      <w:bookmarkStart w:id="28" w:name="_Toc237210633"/>
-      <w:r>
-        <w:t>3.1.2. Feasibility Analysis</w:t>
-      </w:r>
-      <w:bookmarkEnd w:id="28"/>
+      <w:bookmarkStart w:id="27" w:name="_Toc237210633"/>
+      <w:r>
+        <w:t>3.1.2 Feasibility Analysis</w:t>
+      </w:r>
+      <w:bookmarkEnd w:id="27"/>
     </w:p>
     <w:p>
       <w:pPr>
         <w:pStyle w:val="Heading4"/>
       </w:pPr>
       <w:r>
-        <w:t>3.1.2.1.  Technical Feasibility</w:t>
+        <w:t>3.1.2.1  Technical Feasibility</w:t>
       </w:r>
     </w:p>
     <w:p>
@@ -12301,7 +12232,7 @@
         <w:pStyle w:val="Heading4"/>
       </w:pPr>
       <w:r>
-        <w:t>3.1.2.2. Operational Feasibility</w:t>
+        <w:t>3.1.2.2 Operational Feasibility</w:t>
       </w:r>
     </w:p>
     <w:p>
@@ -12314,7 +12245,7 @@
         <w:pStyle w:val="Heading4"/>
       </w:pPr>
       <w:r>
-        <w:t>3.1.2.3. Economic Feasibility</w:t>
+        <w:t>3.1.2.3 Economic Feasibility</w:t>
       </w:r>
     </w:p>
     <w:p>
@@ -12333,8 +12264,7 @@
         <w:pStyle w:val="Heading4"/>
       </w:pPr>
       <w:r>
-        <w:lastRenderedPageBreak/>
-        <w:t>3.1.2.4. Schedule Feasibility</w:t>
+        <w:t>3.1.2.4 Schedule Feasibility</w:t>
       </w:r>
     </w:p>
     <w:p>
@@ -12411,11 +12341,7 @@
         </w:numPr>
       </w:pPr>
       <w:r>
-        <w:t xml:space="preserve">Deployment: The deployment phase occurs between June 26 and July 5, 2026, lasting 10 days. This stage involves pushing the </w:t>
-      </w:r>
-      <w:proofErr w:type="gramStart"/>
-      <w:r>
-        <w:t>client</w:t>
+        <w:t>Deployment: The deployment phase occurs between June 26 and July 5, 2026, lasting 10 days. This stage involves pushing the client</w:t>
       </w:r>
       <w:r>
         <w:t xml:space="preserve"> </w:t>
@@ -12424,11 +12350,7 @@
         <w:t xml:space="preserve"> </w:t>
       </w:r>
       <w:r>
-        <w:t>side</w:t>
-      </w:r>
-      <w:proofErr w:type="gramEnd"/>
-      <w:r>
-        <w:t xml:space="preserve"> system to production, monitoring live performance, and ensuring a smooth rollout.</w:t>
+        <w:t>side system to production, monitoring live performance, and ensuring a smooth rollout.</w:t>
       </w:r>
     </w:p>
     <w:p>
@@ -13007,44 +12929,27 @@
       <w:pPr>
         <w:pStyle w:val="Heading3"/>
       </w:pPr>
-      <w:bookmarkStart w:id="29" w:name="_Toc237210634"/>
-      <w:r>
-        <w:lastRenderedPageBreak/>
-        <w:t>3.1.3. Object Modeling using Class Diagram</w:t>
-      </w:r>
-      <w:bookmarkEnd w:id="29"/>
-    </w:p>
-    <w:p>
-      <w:r>
-        <w:t xml:space="preserve">The system's class diagram describes the modular architecture of the </w:t>
-      </w:r>
-      <w:proofErr w:type="gramStart"/>
-      <w:r>
-        <w:t>client</w:t>
+      <w:bookmarkStart w:id="28" w:name="_Toc237210634"/>
+      <w:r>
+        <w:t>3.1.3 Object Modeling using Class Diagram</w:t>
+      </w:r>
+      <w:bookmarkEnd w:id="28"/>
+    </w:p>
+    <w:p>
+      <w:r>
+        <w:t>The system's class diagram describes the modular architecture of the client</w:t>
       </w:r>
       <w:r>
         <w:t xml:space="preserve"> </w:t>
       </w:r>
       <w:r>
-        <w:t>side</w:t>
-      </w:r>
-      <w:proofErr w:type="gramEnd"/>
-      <w:r>
-        <w:t xml:space="preserve"> JavaScript engine. The application logic is decoupled into five specialized classes that handle document parsing, sentence perplexity, </w:t>
-      </w:r>
-      <w:proofErr w:type="gramStart"/>
-      <w:r>
-        <w:t>instance</w:t>
+        <w:t>side JavaScript engine. The application logic is decoupled into five specialized classes that handle document parsing, sentence perplexity, instance</w:t>
       </w:r>
       <w:r>
         <w:t xml:space="preserve"> </w:t>
       </w:r>
       <w:r>
-        <w:t>based</w:t>
-      </w:r>
-      <w:proofErr w:type="gramEnd"/>
-      <w:r>
-        <w:t xml:space="preserve"> classification, vector similarities, and SVG visualization rendering.</w:t>
+        <w:t>based classification, vector similarities, and SVG visualization rendering.</w:t>
       </w:r>
       <w:r>
         <w:rPr>
@@ -13062,13 +12967,13 @@
       </w:pPr>
       <w:r>
         <w:rPr>
-          <w:noProof/>
+          <w:b/>
         </w:rPr>
         <w:drawing>
-          <wp:inline distT="0" distB="0" distL="0" distR="0" wp14:anchorId="72E7FEC2" wp14:editId="492544E6">
-            <wp:extent cx="2352675" cy="4266006"/>
-            <wp:effectExtent l="0" t="0" r="0" b="1270"/>
-            <wp:docPr id="27" name="Picture 27"/>
+          <wp:inline distT="0" distB="0" distL="0" distR="0" wp14:anchorId="6FDAA0FD" wp14:editId="2041B093">
+            <wp:extent cx="5886569" cy="4234405"/>
+            <wp:effectExtent l="0" t="0" r="0" b="0"/>
+            <wp:docPr id="2" name="Picture 2"/>
             <wp:cNvGraphicFramePr>
               <a:graphicFrameLocks xmlns:a="http://schemas.openxmlformats.org/drawingml/2006/main" noChangeAspect="1"/>
             </wp:cNvGraphicFramePr>
@@ -13088,7 +12993,7 @@
                   <pic:spPr>
                     <a:xfrm>
                       <a:off x="0" y="0"/>
-                      <a:ext cx="2378360" cy="4312580"/>
+                      <a:ext cx="5891609" cy="4238030"/>
                     </a:xfrm>
                     <a:prstGeom prst="rect">
                       <a:avLst/>
@@ -13100,6 +13005,8 @@
           </wp:inline>
         </w:drawing>
       </w:r>
+      <w:bookmarkStart w:id="29" w:name="_GoBack"/>
+      <w:bookmarkEnd w:id="29"/>
     </w:p>
     <w:p>
       <w:pPr>
@@ -13145,17 +13052,17 @@
         <w:t xml:space="preserve"> </w:t>
       </w:r>
       <w:r>
+        <w:t xml:space="preserve">Token Ratio. These results are then passed to the KNNClassifier, which maps the text into a </w:t>
+      </w:r>
+      <w:proofErr w:type="gramStart"/>
+      <w:r>
+        <w:t>5</w:t>
+      </w:r>
+      <w:r>
+        <w:t xml:space="preserve"> </w:t>
+      </w:r>
+      <w:r>
         <w:lastRenderedPageBreak/>
-        <w:t xml:space="preserve">Token Ratio. These results are then passed to the KNNClassifier, which maps the text into a </w:t>
-      </w:r>
-      <w:proofErr w:type="gramStart"/>
-      <w:r>
-        <w:t>5</w:t>
-      </w:r>
-      <w:r>
-        <w:t xml:space="preserve"> </w:t>
-      </w:r>
-      <w:r>
         <w:t>dimensional</w:t>
       </w:r>
       <w:proofErr w:type="gramEnd"/>
@@ -13220,7 +13127,7 @@
       <w:bookmarkStart w:id="30" w:name="_Toc231875508"/>
       <w:bookmarkStart w:id="31" w:name="_Toc237210635"/>
       <w:r>
-        <w:t>3.1.4. Dynamic Modelling using State and Sequence Diagrams</w:t>
+        <w:t>3.1.4 Dynamic Modelling using State and Sequence Diagrams</w:t>
       </w:r>
       <w:bookmarkEnd w:id="30"/>
       <w:bookmarkEnd w:id="31"/>
@@ -13596,7 +13503,7 @@
       </w:pPr>
       <w:bookmarkStart w:id="32" w:name="_Toc237210636"/>
       <w:r>
-        <w:t>3.1.5. Process Modelling Using Activity Diagrams</w:t>
+        <w:t>3.1.5 Process Modelling Using Activity Diagrams</w:t>
       </w:r>
       <w:bookmarkEnd w:id="32"/>
     </w:p>
@@ -13730,7 +13637,7 @@
       </w:pPr>
       <w:bookmarkStart w:id="33" w:name="_Toc237210637"/>
       <w:r>
-        <w:t>3.2. System Design</w:t>
+        <w:t>3.2 System Design</w:t>
       </w:r>
       <w:bookmarkEnd w:id="33"/>
     </w:p>
@@ -13740,7 +13647,7 @@
       </w:pPr>
       <w:bookmarkStart w:id="34" w:name="_Toc237210638"/>
       <w:r>
-        <w:t>3.2.1. Component Diagram</w:t>
+        <w:t>3.2.1 Component Diagram</w:t>
       </w:r>
       <w:bookmarkEnd w:id="34"/>
     </w:p>
@@ -13836,8 +13743,7 @@
       </w:pPr>
       <w:bookmarkStart w:id="35" w:name="_Toc237210639"/>
       <w:r>
-        <w:lastRenderedPageBreak/>
-        <w:t>3.2.2. Deployment Diagram</w:t>
+        <w:t>3.2.2 Deployment Diagram</w:t>
       </w:r>
       <w:bookmarkEnd w:id="35"/>
     </w:p>
@@ -13936,7 +13842,7 @@
       </w:pPr>
       <w:bookmarkStart w:id="36" w:name="_Toc237210640"/>
       <w:r>
-        <w:t>3.3. Algorithm Details</w:t>
+        <w:t>3.3 Algorithm Details</w:t>
       </w:r>
       <w:bookmarkEnd w:id="36"/>
     </w:p>
@@ -13949,7 +13855,7 @@
       </w:pPr>
       <w:bookmarkStart w:id="37" w:name="_Toc237210641"/>
       <w:r>
-        <w:t>3.3.1. Statistical NLP Algorithm (Perplexity &amp; Burstiness)</w:t>
+        <w:t>3.3.1 Statistical NLP Algorithm (Perplexity &amp; Burstiness)</w:t>
       </w:r>
       <w:bookmarkEnd w:id="37"/>
     </w:p>
@@ -14788,8 +14694,7 @@
       </w:pPr>
       <w:bookmarkStart w:id="38" w:name="_Toc237210642"/>
       <w:r>
-        <w:lastRenderedPageBreak/>
-        <w:t>3.3.2. KNN Classifier</w:t>
+        <w:t>3.3.2 KNN Classifier</w:t>
       </w:r>
       <w:bookmarkEnd w:id="38"/>
     </w:p>
@@ -14997,7 +14902,6 @@
                 </m:ctrlPr>
               </m:naryPr>
               <m:sub>
-                <w:proofErr w:type="spellStart"/>
                 <m:r>
                   <m:rPr>
                     <m:nor/>
@@ -15005,17 +14909,7 @@
                   <w:rPr>
                     <w:rFonts w:ascii="Cambria Math" w:hAnsi="Cambria Math"/>
                   </w:rPr>
-                  <m:t>i</m:t>
-                </m:r>
-                <w:proofErr w:type="spellEnd"/>
-                <m:r>
-                  <m:rPr>
-                    <m:nor/>
-                  </m:rPr>
-                  <w:rPr>
-                    <w:rFonts w:ascii="Cambria Math" w:hAnsi="Cambria Math"/>
-                  </w:rPr>
-                  <m:t>=1</m:t>
+                  <m:t>i=1</m:t>
                 </m:r>
               </m:sub>
               <m:sup>
@@ -15768,7 +15662,7 @@
       </w:pPr>
       <w:bookmarkStart w:id="39" w:name="_Toc237210643"/>
       <w:r>
-        <w:t>3.3.3. Cosine Similarity (Vector Space Model)</w:t>
+        <w:t>3.3.3 Cosine Similarity (Vector Space Model)</w:t>
       </w:r>
       <w:bookmarkEnd w:id="39"/>
     </w:p>
@@ -17282,7 +17176,7 @@
       </w:pPr>
       <w:bookmarkStart w:id="40" w:name="_Toc237210644"/>
       <w:r>
-        <w:t>3.3.4. Stylometric Logistic Regression Classifier</w:t>
+        <w:t>3.3.4 Stylometric Logistic Regression Classifier</w:t>
       </w:r>
       <w:bookmarkEnd w:id="40"/>
     </w:p>
@@ -17909,7 +17803,7 @@
       </w:pPr>
       <w:bookmarkStart w:id="41" w:name="_Toc237210645"/>
       <w:r>
-        <w:t>3.3.5. Character Trigram Cosine Similarity</w:t>
+        <w:t>3.3.5 Character Trigram Cosine Similarity</w:t>
       </w:r>
       <w:bookmarkEnd w:id="41"/>
     </w:p>
@@ -18949,8 +18843,7 @@
       </w:pPr>
       <w:bookmarkStart w:id="42" w:name="_Toc237210646"/>
       <w:r>
-        <w:lastRenderedPageBreak/>
-        <w:t>3.3.6. POS Syntax Ratio Cosine Similarity</w:t>
+        <w:t>3.3.6 POS Syntax Ratio Cosine Similarity</w:t>
       </w:r>
       <w:bookmarkEnd w:id="42"/>
     </w:p>
@@ -19721,7 +19614,7 @@
       </w:pPr>
       <w:bookmarkStart w:id="43" w:name="_Toc237210647"/>
       <w:r>
-        <w:t>3.3.7. Heuristic Grammar &amp; Typography Analyzer</w:t>
+        <w:t>3.3.7 Heuristic Grammar &amp; Typography Analyzer</w:t>
       </w:r>
       <w:bookmarkEnd w:id="43"/>
     </w:p>
@@ -20768,7 +20661,7 @@
       </w:pPr>
       <w:bookmarkStart w:id="44" w:name="_Toc237210648"/>
       <w:r>
-        <w:t>3.3.8. Ensemble Scoring &amp; Grammar Calibration</w:t>
+        <w:t>3.3.8 Ensemble Scoring &amp; Grammar Calibration</w:t>
       </w:r>
       <w:bookmarkEnd w:id="44"/>
     </w:p>
@@ -21535,7 +21428,7 @@
       </w:pPr>
       <w:bookmarkStart w:id="46" w:name="_Toc237210650"/>
       <w:r>
-        <w:t xml:space="preserve">4.1. </w:t>
+        <w:t xml:space="preserve">4.1 </w:t>
       </w:r>
       <w:r>
         <w:t>Implementation</w:t>
@@ -21551,7 +21444,7 @@
       </w:pPr>
       <w:bookmarkStart w:id="47" w:name="_Toc237210651"/>
       <w:r>
-        <w:t xml:space="preserve">4.1.1. </w:t>
+        <w:t xml:space="preserve">4.1.1 </w:t>
       </w:r>
       <w:r>
         <w:rPr>
@@ -21733,8 +21626,7 @@
       </w:pPr>
       <w:bookmarkStart w:id="48" w:name="_Toc237210652"/>
       <w:r>
-        <w:lastRenderedPageBreak/>
-        <w:t>4.1.2. Module Implementation Details</w:t>
+        <w:t>4.1.2 Module Implementation Details</w:t>
       </w:r>
       <w:bookmarkEnd w:id="48"/>
     </w:p>
@@ -21763,7 +21655,7 @@
       </w:pPr>
       <w:bookmarkStart w:id="49" w:name="_Toc237210653"/>
       <w:r>
-        <w:t>4.1.2.1. FileParser Module</w:t>
+        <w:t>4.1.2.1 FileParser Module</w:t>
       </w:r>
       <w:bookmarkEnd w:id="49"/>
     </w:p>
@@ -22253,7 +22145,7 @@
       </w:pPr>
       <w:bookmarkStart w:id="50" w:name="_Toc237210654"/>
       <w:r>
-        <w:t>4.1.2.2. Perplexity &amp; Burstiness Module</w:t>
+        <w:t>4.1.2.2 Perplexity &amp; Burstiness Module</w:t>
       </w:r>
       <w:bookmarkEnd w:id="50"/>
     </w:p>
@@ -22681,7 +22573,7 @@
       </w:pPr>
       <w:bookmarkStart w:id="51" w:name="_Toc237210655"/>
       <w:r>
-        <w:t>4.1.2.3. KNN Heuristic Feature Module</w:t>
+        <w:t>4.1.2.3 KNN Heuristic Feature Module</w:t>
       </w:r>
       <w:bookmarkEnd w:id="51"/>
     </w:p>
@@ -23240,7 +23132,7 @@
       </w:pPr>
       <w:bookmarkStart w:id="52" w:name="_Toc237210656"/>
       <w:r>
-        <w:t>4.1.2.4. KNN Voting Classifier Module</w:t>
+        <w:t>4.1.2.4 KNN Voting Classifier Module</w:t>
       </w:r>
       <w:bookmarkEnd w:id="52"/>
     </w:p>
@@ -23844,7 +23736,7 @@
       </w:pPr>
       <w:bookmarkStart w:id="53" w:name="_Toc237210657"/>
       <w:r>
-        <w:t>4.1.2.5. Cosine Similarity Feature Module</w:t>
+        <w:t>4.1.2.5 Cosine Similarity Feature Module</w:t>
       </w:r>
       <w:bookmarkEnd w:id="53"/>
     </w:p>
@@ -24481,7 +24373,7 @@
       </w:pPr>
       <w:bookmarkStart w:id="54" w:name="_Toc237210658"/>
       <w:r>
-        <w:t>4.1.2.6. Cosine Similarity Angle Module</w:t>
+        <w:t>4.1.2.6 Cosine Similarity Angle Module</w:t>
       </w:r>
       <w:bookmarkEnd w:id="54"/>
     </w:p>
@@ -25173,8 +25065,7 @@
       </w:pPr>
       <w:bookmarkStart w:id="55" w:name="_Toc237210659"/>
       <w:r>
-        <w:lastRenderedPageBreak/>
-        <w:t>4.1.2.7. Logistic Regression Classifier Module</w:t>
+        <w:t>4.1.2.7 Logistic Regression Classifier Module</w:t>
       </w:r>
       <w:bookmarkEnd w:id="55"/>
     </w:p>
@@ -25526,7 +25417,7 @@
       </w:pPr>
       <w:bookmarkStart w:id="56" w:name="_Toc237210660"/>
       <w:r>
-        <w:t>4.1.2.8. Character Trigrams Classifier Module</w:t>
+        <w:t>4.1.2.8 Character Trigrams Classifier Module</w:t>
       </w:r>
       <w:bookmarkEnd w:id="56"/>
     </w:p>
@@ -26070,8 +25961,7 @@
       </w:pPr>
       <w:bookmarkStart w:id="57" w:name="_Toc237210661"/>
       <w:r>
-        <w:lastRenderedPageBreak/>
-        <w:t>4.1.2.9. POS Syntax Ratios Classifier Module</w:t>
+        <w:t>4.1.2.9 POS Syntax Ratios Classifier Module</w:t>
       </w:r>
       <w:bookmarkEnd w:id="57"/>
     </w:p>
@@ -26658,7 +26548,7 @@
       </w:pPr>
       <w:bookmarkStart w:id="58" w:name="_Toc237210662"/>
       <w:r>
-        <w:t xml:space="preserve">4.1.2.10. </w:t>
+        <w:t xml:space="preserve">4.1.2.10 </w:t>
       </w:r>
       <w:proofErr w:type="spellStart"/>
       <w:r>
@@ -27178,7 +27068,7 @@
       </w:pPr>
       <w:bookmarkStart w:id="59" w:name="_Toc237210663"/>
       <w:r>
-        <w:t xml:space="preserve">4.1.2.11. </w:t>
+        <w:t xml:space="preserve">4.1.2.11 </w:t>
       </w:r>
       <w:proofErr w:type="spellStart"/>
       <w:r>
@@ -27866,7 +27756,7 @@
       </w:pPr>
       <w:bookmarkStart w:id="60" w:name="_Toc237210664"/>
       <w:r>
-        <w:t xml:space="preserve">4.1.2.12. </w:t>
+        <w:t xml:space="preserve">4.1.2.12 </w:t>
       </w:r>
       <w:proofErr w:type="spellStart"/>
       <w:r>
@@ -28439,8 +28329,7 @@
       </w:pPr>
       <w:bookmarkStart w:id="61" w:name="_Toc237210665"/>
       <w:r>
-        <w:lastRenderedPageBreak/>
-        <w:t>4.1.2.13. app.js Analysis Controller Module</w:t>
+        <w:t>4.1.2.13 app.js Analysis Controller Module</w:t>
       </w:r>
       <w:bookmarkEnd w:id="61"/>
     </w:p>
@@ -29103,7 +28992,7 @@
       </w:pPr>
       <w:bookmarkStart w:id="62" w:name="_Toc237210666"/>
       <w:r>
-        <w:t>4.1.2.14. app.js UI Event Listener Module</w:t>
+        <w:t>4.1.2.14 app.js UI Event Listener Module</w:t>
       </w:r>
       <w:bookmarkEnd w:id="62"/>
     </w:p>
@@ -29552,7 +29441,7 @@
       </w:pPr>
       <w:bookmarkStart w:id="63" w:name="_Toc237210667"/>
       <w:r>
-        <w:t>4.1.2.15. style.css Custom Visual Styles</w:t>
+        <w:t>4.1.2.15 style.css Custom Visual Styles</w:t>
       </w:r>
       <w:bookmarkEnd w:id="63"/>
     </w:p>
@@ -29759,7 +29648,7 @@
       </w:pPr>
       <w:bookmarkStart w:id="64" w:name="_Toc237210668"/>
       <w:r>
-        <w:t>4.1.2.16. HTML5 Dashboard Layout Structure</w:t>
+        <w:t>4.1.2.16 HTML5 Dashboard Layout Structure</w:t>
       </w:r>
       <w:bookmarkEnd w:id="64"/>
     </w:p>
@@ -30040,7 +29929,7 @@
       </w:pPr>
       <w:bookmarkStart w:id="65" w:name="_Toc237210669"/>
       <w:r>
-        <w:t>4.1.2.17. Heuristic Grammar &amp; Typography Module</w:t>
+        <w:t>4.1.2.17 Heuristic Grammar &amp; Typography Module</w:t>
       </w:r>
       <w:bookmarkEnd w:id="65"/>
     </w:p>
@@ -30503,7 +30392,7 @@
       </w:pPr>
       <w:bookmarkStart w:id="66" w:name="_Toc237210670"/>
       <w:r>
-        <w:t xml:space="preserve">4.1.2.18. </w:t>
+        <w:t xml:space="preserve">4.1.2.18 </w:t>
       </w:r>
       <w:proofErr w:type="spellStart"/>
       <w:r>
@@ -31719,7 +31608,7 @@
       </w:pPr>
       <w:bookmarkStart w:id="67" w:name="_Toc237210671"/>
       <w:r>
-        <w:t>4.1.2.19. User Authentication &amp; Session Controller Module</w:t>
+        <w:t>4.1.2.19 User Authentication &amp; Session Controller Module</w:t>
       </w:r>
       <w:bookmarkEnd w:id="67"/>
     </w:p>
@@ -32980,7 +32869,7 @@
       </w:pPr>
       <w:bookmarkStart w:id="68" w:name="_Toc237210672"/>
       <w:r>
-        <w:t>4.1.2.20. server.py SQLite REST Backend Server Module</w:t>
+        <w:t>4.1.2.20 server.py SQLite REST Backend Server Module</w:t>
       </w:r>
       <w:bookmarkEnd w:id="68"/>
     </w:p>
@@ -34171,7 +34060,7 @@
       </w:pPr>
       <w:bookmarkStart w:id="69" w:name="_Toc237210673"/>
       <w:r>
-        <w:t>4.1.2.21. Guest Quota Manager &amp; History Security Module</w:t>
+        <w:t>4.1.2.21 Guest Quota Manager &amp; History Security Module</w:t>
       </w:r>
       <w:bookmarkEnd w:id="69"/>
     </w:p>
@@ -35396,7 +35285,7 @@
       </w:pPr>
       <w:bookmarkStart w:id="70" w:name="_Toc237210674"/>
       <w:r>
-        <w:t>4.1.2.22. Real-Time History Search &amp; UI Refinement Module</w:t>
+        <w:t>4.1.2.22 Real-Time History Search &amp; UI Refinement Module</w:t>
       </w:r>
       <w:bookmarkEnd w:id="70"/>
     </w:p>
@@ -36467,8 +36356,7 @@
       </w:pPr>
       <w:bookmarkStart w:id="71" w:name="_Toc237210675"/>
       <w:r>
-        <w:lastRenderedPageBreak/>
-        <w:t>4.2. Testing</w:t>
+        <w:t>4.2 Testing</w:t>
       </w:r>
       <w:bookmarkEnd w:id="71"/>
     </w:p>
@@ -36478,7 +36366,7 @@
       </w:pPr>
       <w:bookmarkStart w:id="72" w:name="_Toc237210676"/>
       <w:r>
-        <w:t>4.2.1. Test Case for Unit Testing</w:t>
+        <w:t>4.2.1 Test Case for Unit Testing</w:t>
       </w:r>
       <w:bookmarkEnd w:id="72"/>
     </w:p>
@@ -39488,8 +39376,7 @@
       </w:pPr>
       <w:bookmarkStart w:id="73" w:name="_Toc237210677"/>
       <w:r>
-        <w:lastRenderedPageBreak/>
-        <w:t>4.2.2. Dataset Training &amp; Evasion Robustness Testing</w:t>
+        <w:t>4.2.2 Dataset Training &amp; Evasion Robustness Testing</w:t>
       </w:r>
       <w:bookmarkEnd w:id="73"/>
     </w:p>
@@ -39741,7 +39628,7 @@
         <w:rPr>
           <w:bCs/>
         </w:rPr>
-        <w:t>4.3. Result Analysis</w:t>
+        <w:t>4.3 Result Analysis</w:t>
       </w:r>
       <w:bookmarkEnd w:id="74"/>
     </w:p>
@@ -39757,7 +39644,7 @@
         <w:rPr>
           <w:bCs/>
         </w:rPr>
-        <w:t>4.3.1. AI Probability Classification Analysis</w:t>
+        <w:t>4.3.1 AI Probability Classification Analysis</w:t>
       </w:r>
       <w:bookmarkEnd w:id="75"/>
     </w:p>
@@ -40137,7 +40024,7 @@
         <w:rPr>
           <w:bCs/>
         </w:rPr>
-        <w:t>4.3.2. Classifier Performance Analysis</w:t>
+        <w:t>4.3.2 Classifier Performance Analysis</w:t>
       </w:r>
       <w:bookmarkEnd w:id="76"/>
     </w:p>
@@ -40458,7 +40345,7 @@
         <w:rPr>
           <w:bCs/>
         </w:rPr>
-        <w:t>4.3.3. AI Probability Distribution Analysis</w:t>
+        <w:t>4.3.3 AI Probability Distribution Analysis</w:t>
       </w:r>
       <w:bookmarkEnd w:id="77"/>
     </w:p>
@@ -40889,7 +40776,7 @@
         <w:rPr>
           <w:bCs/>
         </w:rPr>
-        <w:t>4.3.4. Detector Accuracy Evaluation</w:t>
+        <w:t>4.3.4 Detector Accuracy Evaluation</w:t>
       </w:r>
       <w:bookmarkEnd w:id="78"/>
     </w:p>
@@ -41314,8 +41201,7 @@
       </w:pPr>
       <w:bookmarkStart w:id="79" w:name="_Toc237210683"/>
       <w:r>
-        <w:lastRenderedPageBreak/>
-        <w:t>4.3.5. Detailed Sample Text Algorithmic Calculation Analysis</w:t>
+        <w:t>4.3.5 Detailed Sample Text Algorithmic Calculation Analysis</w:t>
       </w:r>
       <w:bookmarkEnd w:id="79"/>
     </w:p>
@@ -42553,7 +42439,7 @@
         <w:rPr>
           <w:sz w:val="24"/>
         </w:rPr>
-        <w:t>5.1. Conclusion</w:t>
+        <w:t>5.1 Conclusion</w:t>
       </w:r>
       <w:bookmarkEnd w:id="81"/>
     </w:p>
@@ -42782,7 +42668,7 @@
       </w:pPr>
       <w:bookmarkStart w:id="82" w:name="_Toc237210686"/>
       <w:r>
-        <w:t>5.2. Future Recommendations</w:t>
+        <w:t>5.2 Future Recommendations</w:t>
       </w:r>
       <w:bookmarkEnd w:id="82"/>
     </w:p>
@@ -48952,7 +48838,7 @@
 </file>
 
 <file path=customXml/itemProps1.xml><?xml version="1.0" encoding="utf-8"?>
-<ds:datastoreItem xmlns:ds="http://schemas.openxmlformats.org/officeDocument/2006/customXml" ds:itemID="{D8337275-74DC-4217-A443-224DBB5EE5D7}">
+<ds:datastoreItem xmlns:ds="http://schemas.openxmlformats.org/officeDocument/2006/customXml" ds:itemID="{57A4ED42-B351-4D4A-A581-7AC7AB7D6789}">
   <ds:schemaRefs>
     <ds:schemaRef ds:uri="http://schemas.openxmlformats.org/officeDocument/2006/bibliography"/>
   </ds:schemaRefs>

</xml_diff>

<commit_message>
docs: add section 3.1.6 Refinement of Class Diagram and embed classic UML diagram in report
</commit_message>
<xml_diff>
--- a/Ai text Detector Report_Updated.docx
+++ b/Ai text Detector Report_Updated.docx
@@ -13633,6 +13633,70 @@
     </w:p>
     <w:p>
       <w:pPr>
+        <w:pStyle w:val="Heading3"/>
+      </w:pPr>
+      <w:r>
+        <w:t>3.1.6 Refinement of Class Diagram</w:t>
+      </w:r>
+    </w:p>
+    <w:p>
+      <w:pPr/>
+      <w:r>
+        <w:t>The initial class diagram was refined to detail the properties, methods, and communication lines between the various controller, utility, machine learning ensemble, and database synchronization instances at runtime. This refinement bridges the conceptual static structure with the concrete runtime collaborations. The object instances map directly to the execution pipeline, specifying their internal properties (such as doneTypingInterval in app.js and database connection parameters in SentinelDB) and key operational interfaces.</w:t>
+      </w:r>
+    </w:p>
+    <w:p>
+      <w:pPr>
+        <w:jc w:val="center"/>
+      </w:pPr>
+      <w:r>
+        <w:drawing>
+          <wp:inline xmlns:a="http://schemas.openxmlformats.org/drawingml/2006/main" xmlns:pic="http://schemas.openxmlformats.org/drawingml/2006/picture">
+            <wp:extent cx="5303520" cy="3821654"/>
+            <wp:docPr id="1209280996" name="Picture 1209280996"/>
+            <wp:cNvGraphicFramePr>
+              <a:graphicFrameLocks noChangeAspect="1"/>
+            </wp:cNvGraphicFramePr>
+            <a:graphic>
+              <a:graphicData uri="http://schemas.openxmlformats.org/drawingml/2006/picture">
+                <pic:pic>
+                  <pic:nvPicPr>
+                    <pic:cNvPr id="0" name="object_diagram_classic.png"/>
+                    <pic:cNvPicPr/>
+                  </pic:nvPicPr>
+                  <pic:blipFill>
+                    <a:blip r:embed="rId35"/>
+                    <a:stretch>
+                      <a:fillRect/>
+                    </a:stretch>
+                  </pic:blipFill>
+                  <pic:spPr>
+                    <a:xfrm>
+                      <a:off x="0" y="0"/>
+                      <a:ext cx="5303520" cy="3821654"/>
+                    </a:xfrm>
+                    <a:prstGeom prst="rect"/>
+                  </pic:spPr>
+                </pic:pic>
+              </a:graphicData>
+            </a:graphic>
+          </wp:inline>
+        </w:drawing>
+      </w:r>
+    </w:p>
+    <w:p>
+      <w:pPr>
+        <w:jc w:val="center"/>
+      </w:pPr>
+      <w:r>
+        <w:t>Figure 3.7: Refined Object and Collaboration Diagram for AI Text Detector</w:t>
+      </w:r>
+    </w:p>
+    <w:p>
+      <w:pPr/>
+    </w:p>
+    <w:p>
+      <w:pPr>
         <w:pStyle w:val="Heading2"/>
       </w:pPr>
       <w:bookmarkStart w:id="33" w:name="_Toc237210637"/>
@@ -13731,10 +13795,7 @@
         </w:rPr>
       </w:pPr>
       <w:r>
-        <w:rPr>
-          <w:b/>
-        </w:rPr>
-        <w:t>Figure 3.7: Component Diagram for AI Text Detector</w:t>
+        <w:t>Figure 3.8: Component Diagram for AI Text Detector</w:t>
       </w:r>
     </w:p>
     <w:p>
@@ -13830,10 +13891,7 @@
         </w:rPr>
       </w:pPr>
       <w:r>
-        <w:rPr>
-          <w:b/>
-        </w:rPr>
-        <w:t>Figure 3.8: Deployment Diagram for AI Text Detector</w:t>
+        <w:t>Figure 3.9: Deployment Diagram for AI Text Detector</w:t>
       </w:r>
     </w:p>
     <w:p>

</xml_diff>

<commit_message>
Update object, collaboration, and sequence diagrams with refined SVG layouts
</commit_message>
<xml_diff>
--- a/Ai text Detector Report_Updated.docx
+++ b/Ai text Detector Report_Updated.docx
@@ -1361,19 +1361,44 @@
         <w:ind w:left="-5" w:right="55"/>
       </w:pPr>
       <w:r>
-        <w:t>This project on developing an AI Text Detector, which detects machine</w:t>
-      </w:r>
+        <w:t xml:space="preserve">This project of creating an AI text Detector which will be used to check generated machine text using statistical NLP, </w:t>
+      </w:r>
+      <w:proofErr w:type="spellStart"/>
+      <w:r>
+        <w:t>KNearest</w:t>
+      </w:r>
+      <w:proofErr w:type="spellEnd"/>
+      <w:r>
+        <w:t xml:space="preserve"> Neighbors(KNN)and Cosine Similarity cannot be complete without a helping hand from the many. I’m indebted to Mr. Niraj Khadka Project Supervisor/Coordinator, without his invaluable suggestion and regular encouragement, </w:t>
+      </w:r>
+      <w:r>
+        <w:t xml:space="preserve">I </w:t>
+      </w:r>
+      <w:r>
+        <w:t xml:space="preserve">wouldn't have made progress during the course of building the project. With the extensive experience he possesses on the subject and constant motivation, </w:t>
+      </w:r>
+      <w:r>
+        <w:t>I</w:t>
+      </w:r>
+      <w:r>
+        <w:t xml:space="preserve"> became to learn deeply the concepts of Natural language Processing and Machine Learning. I would like to mention some friends, my mentors and the teachers/classmates for their help and inputs in the different stage of development especially during the testing phase to make it efficient to detect the machine generated text. </w:t>
+      </w:r>
+      <w:proofErr w:type="gramStart"/>
+      <w:r>
+        <w:t>Lastly</w:t>
+      </w:r>
+      <w:proofErr w:type="gramEnd"/>
       <w:r>
         <w:t xml:space="preserve"> </w:t>
       </w:r>
       <w:r>
-        <w:t>generated text using statistical NLP, K</w:t>
-      </w:r>
-      <w:r>
-        <w:t xml:space="preserve"> </w:t>
-      </w:r>
-      <w:r>
-        <w:t>Nearest Neighbors (KNN), and Cosine Similarity, could not have been achieved without the kind support of many individuals. I am grateful to Mr. Niraj Khadka, Project Supervisor and Coordinator, for his guidance, valuable suggestions, and steady encouragement throughout the development of this project. His knowledge of the subject, along with his encouragement, helped learn the concepts of Natural Language Processing and machine learning deeply. I also thank my teachers, mentors, friends, and classmates for their suggestions during the testing phase, which helped improve the performance and functionality of the detector. I am also grateful to everyone who helped bring this project to completion, directly or indirectly.</w:t>
+        <w:t>I</w:t>
+      </w:r>
+      <w:r>
+        <w:t xml:space="preserve"> would like to thank those individuals who have supported directly and indirectly to make this project a complete reality</w:t>
+      </w:r>
+      <w:r>
+        <w:t>.</w:t>
       </w:r>
     </w:p>
     <w:p>
@@ -1429,13 +1454,11 @@
       <w:pPr>
         <w:spacing w:after="3"/>
       </w:pPr>
-      <w:proofErr w:type="gramStart"/>
-      <w:r>
-        <w:t>So</w:t>
-      </w:r>
-      <w:proofErr w:type="gramEnd"/>
-      <w:r>
-        <w:t xml:space="preserve"> to test out adversarial evasion techniques like synonym swapping and spelling tweaks, this project sets up offline data augmentation workflows with the </w:t>
+      <w:r>
+        <w:t>To</w:t>
+      </w:r>
+      <w:r>
+        <w:t xml:space="preserve"> test out adversarial evasion techniques like synonym swapping and spelling tweaks, this project sets up offline data augmentation workflows with the </w:t>
       </w:r>
       <w:proofErr w:type="spellStart"/>
       <w:r>
@@ -1443,12 +1466,7 @@
       </w:r>
       <w:proofErr w:type="spellEnd"/>
       <w:r>
-        <w:t xml:space="preserve"> Python library. This basically lets us calibrate the grammar perfection discount factor when dealing with synthetic typo loads. For the front end, the user interface includes a responsive HTML5 dashboard put together with CSS custom properties. It’s got a semi-circular SVG probability gauge, an interactive sentence-level perplexity heatmap, and some animated SVG scatter plots and radar charts. Plus, there’s a real-time MathJax LaTeX resolution panel that shows every single w</w:t>
-      </w:r>
-      <w:bookmarkStart w:id="8" w:name="_GoBack"/>
-      <w:bookmarkEnd w:id="8"/>
-      <w:r>
-        <w:t>eighted calculation. On the backend, a lightweight Python REST API server (server.py) running with SQLite3 handles the persistent database storage (</w:t>
+        <w:t xml:space="preserve"> Python library. This basically lets us calibrate the grammar perfection discount factor when dealing with synthetic typo loads. For the front end, the user interface includes a responsive HTML5 dashboard put together with CSS custom properties. It’s got a semi-circular SVG probability gauge, an interactive sentence-level perplexity heatmap, and some animated SVG scatter plots and radar charts. Plus, there’s a real-time MathJax LaTeX resolution panel that shows every single weighted calculation. On the backend, a lightweight Python REST API server (server.py) running with SQLite3 handles the persistent database storage (</w:t>
       </w:r>
       <w:proofErr w:type="spellStart"/>
       <w:r>
@@ -4223,7 +4241,7 @@
                 <w:noProof/>
                 <w:webHidden/>
               </w:rPr>
-              <w:t>30</w:t>
+              <w:t>31</w:t>
             </w:r>
             <w:r>
               <w:rPr>
@@ -6721,7 +6739,7 @@
                 <w:noProof/>
                 <w:webHidden/>
               </w:rPr>
-              <w:t>55</w:t>
+              <w:t>54</w:t>
             </w:r>
             <w:r>
               <w:rPr>
@@ -6873,7 +6891,7 @@
                 <w:noProof/>
                 <w:webHidden/>
               </w:rPr>
-              <w:t>58</w:t>
+              <w:t>57</w:t>
             </w:r>
             <w:r>
               <w:rPr>
@@ -7247,12 +7265,12 @@
         <w:pStyle w:val="Heading1"/>
         <w:spacing w:after="240"/>
       </w:pPr>
-      <w:bookmarkStart w:id="9" w:name="_Toc237559711"/>
+      <w:bookmarkStart w:id="8" w:name="_Toc237559711"/>
       <w:r>
         <w:lastRenderedPageBreak/>
         <w:t>LIST OF ABBREVIATIONS</w:t>
       </w:r>
-      <w:bookmarkEnd w:id="9"/>
+      <w:bookmarkEnd w:id="8"/>
     </w:p>
     <w:tbl>
       <w:tblPr>
@@ -7741,7 +7759,7 @@
           <w:rFonts w:cs="Times New Roman"/>
         </w:rPr>
       </w:pPr>
-      <w:bookmarkStart w:id="10" w:name="_Toc237559712"/>
+      <w:bookmarkStart w:id="9" w:name="_Toc237559712"/>
       <w:r>
         <w:rPr>
           <w:rFonts w:cs="Times New Roman"/>
@@ -7749,7 +7767,7 @@
         <w:lastRenderedPageBreak/>
         <w:t>LIST OF FIGURES</w:t>
       </w:r>
-      <w:bookmarkEnd w:id="10"/>
+      <w:bookmarkEnd w:id="9"/>
     </w:p>
     <w:tbl>
       <w:tblPr>
@@ -9562,12 +9580,12 @@
         <w:pStyle w:val="Heading1"/>
         <w:spacing w:after="240"/>
       </w:pPr>
-      <w:bookmarkStart w:id="11" w:name="_Toc237559713"/>
+      <w:bookmarkStart w:id="10" w:name="_Toc237559713"/>
       <w:r>
         <w:lastRenderedPageBreak/>
         <w:t>LIST OF TABLES</w:t>
       </w:r>
-      <w:bookmarkEnd w:id="11"/>
+      <w:bookmarkEnd w:id="10"/>
     </w:p>
     <w:tbl>
       <w:tblPr>
@@ -10111,35 +10129,35 @@
       <w:pPr>
         <w:pStyle w:val="Heading1"/>
       </w:pPr>
-      <w:bookmarkStart w:id="12" w:name="_Toc237559714"/>
+      <w:bookmarkStart w:id="11" w:name="_Toc237559714"/>
       <w:r>
         <w:lastRenderedPageBreak/>
         <w:t>CHAPTER 1</w:t>
       </w:r>
+      <w:bookmarkEnd w:id="11"/>
+      <w:r>
+        <w:t xml:space="preserve"> </w:t>
+      </w:r>
+    </w:p>
+    <w:p>
+      <w:pPr>
+        <w:pStyle w:val="Heading1"/>
+      </w:pPr>
+      <w:bookmarkStart w:id="12" w:name="_Toc237559715"/>
+      <w:r>
+        <w:t>INTRODUCTION</w:t>
+      </w:r>
       <w:bookmarkEnd w:id="12"/>
-      <w:r>
-        <w:t xml:space="preserve"> </w:t>
-      </w:r>
-    </w:p>
-    <w:p>
-      <w:pPr>
-        <w:pStyle w:val="Heading1"/>
-      </w:pPr>
-      <w:bookmarkStart w:id="13" w:name="_Toc237559715"/>
-      <w:r>
-        <w:t>INTRODUCTION</w:t>
+    </w:p>
+    <w:p>
+      <w:pPr>
+        <w:pStyle w:val="Heading2"/>
+      </w:pPr>
+      <w:bookmarkStart w:id="13" w:name="_Toc237559716"/>
+      <w:r>
+        <w:t>1.1 Introduction</w:t>
       </w:r>
       <w:bookmarkEnd w:id="13"/>
-    </w:p>
-    <w:p>
-      <w:pPr>
-        <w:pStyle w:val="Heading2"/>
-      </w:pPr>
-      <w:bookmarkStart w:id="14" w:name="_Toc237559716"/>
-      <w:r>
-        <w:t>1.1 Introduction</w:t>
-      </w:r>
-      <w:bookmarkEnd w:id="14"/>
       <w:r>
         <w:t xml:space="preserve"> </w:t>
       </w:r>
@@ -10240,11 +10258,11 @@
       <w:pPr>
         <w:pStyle w:val="Heading2"/>
       </w:pPr>
-      <w:bookmarkStart w:id="15" w:name="_Toc237559717"/>
+      <w:bookmarkStart w:id="14" w:name="_Toc237559717"/>
       <w:r>
         <w:t>1.2 Problem Statement</w:t>
       </w:r>
-      <w:bookmarkEnd w:id="15"/>
+      <w:bookmarkEnd w:id="14"/>
     </w:p>
     <w:p>
       <w:pPr>
@@ -10307,11 +10325,11 @@
       <w:pPr>
         <w:pStyle w:val="Heading2"/>
       </w:pPr>
-      <w:bookmarkStart w:id="16" w:name="_Toc237559718"/>
+      <w:bookmarkStart w:id="15" w:name="_Toc237559718"/>
       <w:r>
         <w:t>1.3 Objectives</w:t>
       </w:r>
-      <w:bookmarkEnd w:id="16"/>
+      <w:bookmarkEnd w:id="15"/>
     </w:p>
     <w:p>
       <w:pPr>
@@ -10396,7 +10414,10 @@
         <w:ind w:right="55"/>
       </w:pPr>
       <w:r>
-        <w:t>Put together animated SVG charts like a gauge, scatter plot, and radar web to visually show the different document features.</w:t>
+        <w:t>Design animated SVG charts such as a gage, scatter plot, and radar web to visually represent the different document features</w:t>
+      </w:r>
+      <w:r>
+        <w:t>.</w:t>
       </w:r>
     </w:p>
     <w:p>
@@ -10411,7 +10432,10 @@
       </w:pPr>
       <w:r>
         <w:lastRenderedPageBreak/>
-        <w:t>Include a dedicated panel running MathJax to display the exact calculations behind the results, including Euclidean distance, standard deviation, cosine angles, and grammar penalties.</w:t>
+        <w:t>Implement a dedicated panel running MathJax to display the exact calculations behind the results, including Euclidean distance, standard deviation, cosine angles, and grammar penalties</w:t>
+      </w:r>
+      <w:r>
+        <w:t>.</w:t>
       </w:r>
     </w:p>
     <w:p>
@@ -10423,7 +10447,10 @@
         </w:numPr>
       </w:pPr>
       <w:r>
-        <w:t>Build a secure User Authentication and Registration System. This lets users create accounts using a username, email address, and password, while also supporting dual login credentials through either their username or email.</w:t>
+        <w:t>Develop a secure User Authentication and Registration System. This enables users to create accounts with a username, email address, and password, and also supports dual login credentials via either their username or email</w:t>
+      </w:r>
+      <w:r>
+        <w:t>.</w:t>
       </w:r>
     </w:p>
     <w:p>
@@ -10435,7 +10462,10 @@
         </w:numPr>
       </w:pPr>
       <w:r>
-        <w:t>Set up a Dual-Engine Persistent Database Architecture that combines a server-side SQLite3 database (</w:t>
+        <w:t>E</w:t>
+      </w:r>
+      <w:r>
+        <w:t>stablish a Dual-Engine Persistent Database Architecture combining a server-side SQLite3 database (</w:t>
       </w:r>
       <w:proofErr w:type="spellStart"/>
       <w:r>
@@ -10459,7 +10489,10 @@
       </w:r>
       <w:proofErr w:type="spellEnd"/>
       <w:r>
-        <w:t>) fallback for offline operation.</w:t>
+        <w:t>) fallback for offline operation</w:t>
+      </w:r>
+      <w:r>
+        <w:t>.</w:t>
       </w:r>
     </w:p>
     <w:p>
@@ -10471,14 +10504,17 @@
         </w:numPr>
       </w:pPr>
       <w:r>
-        <w:t>Enforce a Guest Daily Analysis Quota and Data Security Boundaries. Put simply, unauthenticated guests are limited to 1 free analysis per calendar day, but logged-in users get unlimited analyses. This also keeps saved user history completely isolated from guest access.</w:t>
+        <w:t>Enforce a Guest Daily Analysis Quota and Data Security Boundaries. Simply put, unauthenticated guests are restricted to 1 free analysis per calendar day, while logged-in users enjoy unlimited analyzes</w:t>
+      </w:r>
+      <w:r>
+        <w:t>. This also keeps saved user history completely isolated from guest access.</w:t>
       </w:r>
     </w:p>
     <w:p>
       <w:pPr>
         <w:pStyle w:val="Heading2"/>
       </w:pPr>
-      <w:bookmarkStart w:id="17" w:name="_Toc237559719"/>
+      <w:bookmarkStart w:id="16" w:name="_Toc237559719"/>
       <w:r>
         <w:t xml:space="preserve">1.4 </w:t>
       </w:r>
@@ -10488,7 +10524,7 @@
       <w:r>
         <w:t>Methodology</w:t>
       </w:r>
-      <w:bookmarkEnd w:id="17"/>
+      <w:bookmarkEnd w:id="16"/>
       <w:r>
         <w:t xml:space="preserve"> </w:t>
       </w:r>
@@ -10753,11 +10789,11 @@
       <w:pPr>
         <w:pStyle w:val="Heading2"/>
       </w:pPr>
-      <w:bookmarkStart w:id="18" w:name="_Toc237559720"/>
+      <w:bookmarkStart w:id="17" w:name="_Toc237559720"/>
       <w:r>
         <w:t>1.5 Report Organization</w:t>
       </w:r>
-      <w:bookmarkEnd w:id="18"/>
+      <w:bookmarkEnd w:id="17"/>
     </w:p>
     <w:p>
       <w:pPr>
@@ -10920,16 +10956,21 @@
     </w:p>
     <w:p>
       <w:pPr>
+        <w:spacing w:before="0" w:after="160"/>
+      </w:pPr>
+    </w:p>
+    <w:p>
+      <w:pPr>
         <w:pStyle w:val="Heading1"/>
         <w:spacing w:after="240"/>
       </w:pPr>
-      <w:bookmarkStart w:id="19" w:name="_Toc237559721"/>
+      <w:bookmarkStart w:id="18" w:name="_Toc237559721"/>
       <w:r>
         <w:lastRenderedPageBreak/>
         <w:t>CHAPTER 2</w:t>
       </w:r>
-      <w:bookmarkStart w:id="20" w:name="_Toc201399424"/>
-      <w:bookmarkEnd w:id="19"/>
+      <w:bookmarkStart w:id="19" w:name="_Toc201399424"/>
+      <w:bookmarkEnd w:id="18"/>
       <w:r>
         <w:t xml:space="preserve"> </w:t>
       </w:r>
@@ -10939,360 +10980,309 @@
         <w:pStyle w:val="Heading1"/>
         <w:spacing w:after="240"/>
       </w:pPr>
-      <w:bookmarkStart w:id="21" w:name="_Toc237559722"/>
+      <w:bookmarkStart w:id="20" w:name="_Toc237559722"/>
       <w:r>
         <w:t>BACKGROUND STUDY AND LITERATURE REVIEW</w:t>
       </w:r>
+      <w:bookmarkEnd w:id="19"/>
       <w:bookmarkEnd w:id="20"/>
+      <w:r>
+        <w:t xml:space="preserve"> </w:t>
+      </w:r>
+    </w:p>
+    <w:p>
+      <w:pPr>
+        <w:pStyle w:val="Heading2"/>
+      </w:pPr>
+      <w:bookmarkStart w:id="21" w:name="_Toc237559723"/>
+      <w:r>
+        <w:t>2.1 Background Study</w:t>
+      </w:r>
       <w:bookmarkEnd w:id="21"/>
-      <w:r>
+    </w:p>
+    <w:p>
+      <w:r>
+        <w:t>The field of stylometry (the art or science of writing) is based on the principle that everyone’s “</w:t>
+      </w:r>
+      <w:proofErr w:type="spellStart"/>
+      <w:r>
+        <w:t>writeprint</w:t>
+      </w:r>
+      <w:proofErr w:type="spellEnd"/>
+      <w:r>
+        <w:t xml:space="preserve">” is one of a kind, so a person’s average sentence length, the usage of punctuation, the “lexicon,” or words selected for a document, and the complexity of their sentence structure all reveal personal styles. The complication is that even if Large Language Models (LLMs) sound fluent and, human, LLMs do not really write like people-they work by choosing the most predictable token as output that would logically follow another token. Thus, this procedure produces content that exhibits lower entropy ( predictability), and consistent sentence length. </w:t>
+      </w:r>
+    </w:p>
+    <w:p>
+      <w:r>
+        <w:t xml:space="preserve">Unlike them, human-writers are pretty haphazard-their sentences will take the longest lengths and widest range of Vocabulary for that style, and it goes without stating people may or may not make grammar mistakes and spelling. </w:t>
+      </w:r>
+    </w:p>
+    <w:p>
+      <w:r>
+        <w:t xml:space="preserve">The solution: to classify automatically, we have to extract attribute based quantitative vectors, and utilize those quantitative vectors for statistical models, </w:t>
+      </w:r>
+      <w:proofErr w:type="gramStart"/>
+      <w:r>
+        <w:t>instance based</w:t>
+      </w:r>
+      <w:proofErr w:type="gramEnd"/>
+      <w:r>
+        <w:t xml:space="preserve"> classification, as well as other modeling approaches. Statistical Natural language processing provides the basis for this. Using statistical NL P, we may readily observe the predictable regularity characteristic of these AI–written content by the analysis of: Perplexity of word sequences, and the typical deviation in sentence size lengths, which goes by the rather colorful name burstiness. Instances based machine learning back our initial statistical analyses. </w:t>
+      </w:r>
+    </w:p>
+    <w:p>
+      <w:r>
+        <w:t xml:space="preserve">When we use </w:t>
+      </w:r>
+      <w:proofErr w:type="spellStart"/>
+      <w:r>
+        <w:t>KNearest</w:t>
+      </w:r>
+      <w:proofErr w:type="spellEnd"/>
+      <w:r>
+        <w:t xml:space="preserve"> neighbors Classification (KN N), the document’s syntactic qualities (as shown in previous segments of the work, such as the number of parts of speech or a breakdown of clause lengths) can easily be mapped into multi- dimensional space and distances can also be made into the system with previously built human and AI examples. </w:t>
+      </w:r>
+    </w:p>
+    <w:p>
+      <w:r>
+        <w:lastRenderedPageBreak/>
+        <w:t xml:space="preserve">Then we apply the classification based on K 5 nearest training vectors’ majority vote or take that into account with cosine measure. Additionally, using a Vector Space model, we will also measure the semantic similarity. The system determines the category that the document is best fitted into by taking an estimate of cosine angle from document’s vector with both a human or an AI prototypical document. </w:t>
+      </w:r>
+    </w:p>
+    <w:p>
+      <w:r>
+        <w:t xml:space="preserve">Nonetheless, we have discovered, and incorporated it in our study, that spelling as well as grammatical mistakes tend to be extremely significant stylistic features in classification. Since we utilize curated, edited-down textual content corpora to develop our Large Language </w:t>
+      </w:r>
+      <w:proofErr w:type="spellStart"/>
+      <w:r>
+        <w:t>Models,LLMs</w:t>
+      </w:r>
+      <w:proofErr w:type="spellEnd"/>
+      <w:r>
+        <w:t xml:space="preserve"> tend to produce completely grammatically correct content - every single sentence is perfected and error-less - , when humans’ creative composing frequently includes subtle spelling slip, the “wrong “spacing and also casual “syntax “. The ‘Grammatical Correction’ feature counts the frequency of this indicator and that’s applied at the conclusion of all prediction methods with diminishing influence that’s exerted towards the AI probabilities, as an outcome, a written sample rich in typos or grammar is considerably more apt to be from the humans, rather than the LLM.</w:t>
+      </w:r>
+    </w:p>
+    <w:p>
+      <w:pPr>
+        <w:pStyle w:val="Heading2"/>
+      </w:pPr>
+      <w:bookmarkStart w:id="22" w:name="_Toc237559724"/>
+      <w:r>
+        <w:t>2.2 Literature Review</w:t>
+      </w:r>
+      <w:bookmarkEnd w:id="22"/>
+    </w:p>
+    <w:p>
+      <w:pPr>
+        <w:rPr>
+          <w:bCs/>
+        </w:rPr>
+      </w:pPr>
+      <w:proofErr w:type="spellStart"/>
+      <w:r>
+        <w:rPr>
+          <w:bCs/>
+        </w:rPr>
+        <w:t>Gehrmann</w:t>
+      </w:r>
+      <w:proofErr w:type="spellEnd"/>
+      <w:r>
+        <w:rPr>
+          <w:bCs/>
+        </w:rPr>
+        <w:t xml:space="preserve"> et al. brought about the first big leap in automated text detection when they developed the Giant Language Model Test Room (GLTR). They showed that generative language models end up producing text with extremely predictable token transitions. GLTR uses the BERT large and GPT 2 117M models to score each token in the input text. It bases this score on the predicted rank in the model’s vocabulary distribution. So basically, if tokens consistently fall within the top 10 predicted words, that points to machine generation. But tokens outside the top 1,000 usually suggest human authorship. In their study, they reported that human reviewers actually improved their detection accuracy from 54% to 72% by using this visual tool.</w:t>
+      </w:r>
+      <w:r>
+        <w:rPr>
+          <w:bCs/>
+        </w:rPr>
+        <w:t xml:space="preserve"> [1]</w:t>
+      </w:r>
+    </w:p>
+    <w:p>
+      <w:pPr>
+        <w:rPr>
+          <w:bCs/>
+        </w:rPr>
+      </w:pPr>
+      <w:r>
+        <w:rPr>
+          <w:bCs/>
+        </w:rPr>
+        <w:t>People needed zero shot text detection without constantly retraining classifiers, so Mitchell et al.</w:t>
+      </w:r>
+      <w:r>
+        <w:rPr>
+          <w:bCs/>
+        </w:rPr>
         <w:t xml:space="preserve"> </w:t>
       </w:r>
-    </w:p>
-    <w:p>
-      <w:pPr>
-        <w:pStyle w:val="Heading2"/>
-      </w:pPr>
-      <w:bookmarkStart w:id="22" w:name="_Toc237559723"/>
-      <w:r>
-        <w:t>2.1 Background Study</w:t>
-      </w:r>
-      <w:bookmarkEnd w:id="22"/>
-    </w:p>
-    <w:p>
-      <w:pPr>
-        <w:spacing w:after="0"/>
-      </w:pPr>
-      <w:r>
-        <w:t>Basically, stylometry</w:t>
+      <w:r>
+        <w:rPr>
+          <w:bCs/>
+        </w:rPr>
+        <w:t xml:space="preserve">developed </w:t>
+      </w:r>
+      <w:proofErr w:type="spellStart"/>
+      <w:r>
+        <w:rPr>
+          <w:bCs/>
+        </w:rPr>
+        <w:t>DetectGPT</w:t>
+      </w:r>
+      <w:proofErr w:type="spellEnd"/>
+      <w:r>
+        <w:rPr>
+          <w:bCs/>
+        </w:rPr>
+        <w:t xml:space="preserve">. It’s a novel zero shot detection method based on probability curvature. The researchers found out that AI generated passages tend to lie in regions of </w:t>
+      </w:r>
+      <w:r>
+        <w:rPr>
+          <w:bCs/>
+        </w:rPr>
+        <w:lastRenderedPageBreak/>
+        <w:t xml:space="preserve">negative curvature of the source model’s log probability function, while human text just doesn’t exhibit this property. </w:t>
+      </w:r>
+      <w:proofErr w:type="spellStart"/>
+      <w:r>
+        <w:rPr>
+          <w:bCs/>
+        </w:rPr>
+        <w:t>DetectGPT</w:t>
+      </w:r>
+      <w:proofErr w:type="spellEnd"/>
+      <w:r>
+        <w:rPr>
+          <w:bCs/>
+        </w:rPr>
+        <w:t xml:space="preserve"> works by computing the log probability of the original passage and comparing it against the average log probabilities of random perturbations generated by a mask filling model (such as T5). If that original passage has a way higher log probability than its perturbations, the system classifies it as machine generated. This method actually achieved an AUROC of 0.95 on GPT 2 outputs. The main weakness is that it requires access to the source model itself, which limits its applicability to open weight models.</w:t>
+      </w:r>
+      <w:r>
+        <w:rPr>
+          <w:bCs/>
+        </w:rPr>
+        <w:t xml:space="preserve"> [2]</w:t>
+      </w:r>
+    </w:p>
+    <w:p>
+      <w:pPr>
+        <w:rPr>
+          <w:bCs/>
+        </w:rPr>
+      </w:pPr>
+      <w:r>
+        <w:rPr>
+          <w:bCs/>
+        </w:rPr>
+        <w:t xml:space="preserve">Looking back at early transformer architectures, </w:t>
+      </w:r>
+      <w:proofErr w:type="spellStart"/>
+      <w:r>
+        <w:rPr>
+          <w:bCs/>
+        </w:rPr>
+        <w:t>Solaiman</w:t>
+      </w:r>
+      <w:proofErr w:type="spellEnd"/>
+      <w:r>
+        <w:rPr>
+          <w:bCs/>
+        </w:rPr>
+        <w:t xml:space="preserve"> et al. did a pretty deep evaluation of detection strategies on outputs from the GPT 2 model. Their research showed something interesting: combining simple lexical features like the Type Token Ratio (TTR) and average word lengths with traditional classifiers (like Logistic Regression and Random Forests) provided detection accuracy exceeding 90% for GPT 2’s 1.5B parameter model. They also reported that detection accuracy drops as model size decreases. This happens because smaller models produce more erratic text that is just harder to distinguish from human writing.</w:t>
+      </w:r>
+      <w:r>
+        <w:rPr>
+          <w:bCs/>
+        </w:rPr>
+        <w:t xml:space="preserve"> [3]</w:t>
+      </w:r>
+    </w:p>
+    <w:p>
+      <w:pPr>
+        <w:rPr>
+          <w:bCs/>
+        </w:rPr>
+      </w:pPr>
+      <w:r>
+        <w:t>Generative models kept evolving, and Crothers et al. published a detailed systematic review in IEEE Access that broke down the growing challenges and security vulnerabilities of existing detection methods. They analyzed the limitations of supervised neural network classifiers, pointing out how susceptible they are to adversarial attacks like paraphrasing, vocabulary substitution (synonym swapping), and style transfer. Their review noted that multi feature ensemble classifiers</w:t>
       </w:r>
       <w:r>
         <w:t xml:space="preserve"> </w:t>
       </w:r>
       <w:r>
-        <w:t>which is the study of linguistic style</w:t>
+        <w:t>which combine lexical, syntactic, and semantic features</w:t>
       </w:r>
       <w:r>
         <w:t xml:space="preserve"> </w:t>
       </w:r>
       <w:r>
-        <w:t>is built on the idea that everyone has their own unique "</w:t>
+        <w:t>tend to degrade more slowly under adversarial manipulation than single feature classifiers. This really validates the multi algorithm approach used in this project.</w:t>
+      </w:r>
+      <w:r>
+        <w:t xml:space="preserve"> [4]</w:t>
+      </w:r>
+    </w:p>
+    <w:p>
+      <w:pPr>
+        <w:rPr>
+          <w:bCs/>
+        </w:rPr>
+      </w:pPr>
+      <w:r>
+        <w:rPr>
+          <w:bCs/>
+        </w:rPr>
+        <w:t xml:space="preserve">Putting a theoretical boundary on the whole discussion, </w:t>
       </w:r>
       <w:proofErr w:type="spellStart"/>
       <w:r>
-        <w:t>writeprint</w:t>
+        <w:rPr>
+          <w:bCs/>
+        </w:rPr>
+        <w:t>Sadasivan</w:t>
       </w:r>
       <w:proofErr w:type="spellEnd"/>
       <w:r>
-        <w:t>." You can spot this footprint in things like average sentence length, how someone uses punctuation, their lexical choices, and structural complexity.</w:t>
-      </w:r>
-    </w:p>
-    <w:p>
-      <w:pPr>
-        <w:spacing w:before="0" w:after="0"/>
-      </w:pPr>
-      <w:r>
-        <w:t>The thing is, Large Language Models (LLMs) don’t actually write like humans, even though they sound super fluent. They generate text by just predicting the next most likely word token, which means they end up spitting out high probability patterns. This leads to low entropy (or predictability) and really uniform sentence lengths. Humans, on the other hand, write pretty erratically. Our sentence lengths vary wildly, vocabulary diversity is higher, and we definitely make grammatical and spelling errors here and there.</w:t>
-      </w:r>
-    </w:p>
-    <w:p>
-      <w:pPr>
-        <w:spacing w:before="0" w:after="0"/>
-      </w:pPr>
-      <w:r>
-        <w:t xml:space="preserve">So, to automate capturing these differences, we have to extract numeric vectors that represent text attributes. Once we have those vectors, we analyze them using statistical models, </w:t>
-      </w:r>
-      <w:proofErr w:type="gramStart"/>
-      <w:r>
-        <w:t>instance based</w:t>
-      </w:r>
-      <w:proofErr w:type="gramEnd"/>
-      <w:r>
-        <w:t xml:space="preserve"> classification, and geometry.</w:t>
-      </w:r>
-    </w:p>
-    <w:p>
-      <w:pPr>
-        <w:spacing w:before="0" w:after="0"/>
-      </w:pPr>
-      <w:r>
-        <w:t>Statistical natural language processing gives us a solid baseline for all this analysis. We can identify those regular, predictable patterns you see in AI content by evaluating the perplexity of word sequences along with the standard deviation of sentence lengths (which is known as burstiness).</w:t>
-      </w:r>
-    </w:p>
-    <w:p>
-      <w:pPr>
-        <w:spacing w:before="0" w:after="0"/>
-      </w:pPr>
-      <w:r>
-        <w:t xml:space="preserve">We apply </w:t>
-      </w:r>
-      <w:proofErr w:type="gramStart"/>
-      <w:r>
-        <w:t>instance based</w:t>
-      </w:r>
-      <w:proofErr w:type="gramEnd"/>
-      <w:r>
-        <w:t xml:space="preserve"> machine learning to back up the statistical side of things. A K Nearest Neighbors (KNN) classifier maps the document’s syntactic features straight into a </w:t>
+        <w:rPr>
+          <w:bCs/>
+        </w:rPr>
+        <w:t xml:space="preserve"> et al. analyzed the fundamental limits of AI text detection at ICML. Their work proved that as generative models approximate the human text distribution more closely, the upper bound of detection accuracy drops off a cliff. The researchers formally showed that for sufficiently advanced models, the optimal classifier accuracy converges toward random chance (50%). This finding really points out the importance of combining multiple orthogonal features rather than just relying on a single statistical metric.</w:t>
+      </w:r>
+      <w:r>
+        <w:rPr>
+          <w:bCs/>
+        </w:rPr>
+        <w:t xml:space="preserve"> [5]</w:t>
+      </w:r>
+    </w:p>
+    <w:p>
+      <w:pPr>
+        <w:rPr>
+          <w:bCs/>
+        </w:rPr>
+      </w:pPr>
+      <w:r>
+        <w:rPr>
+          <w:bCs/>
+        </w:rPr>
+        <w:lastRenderedPageBreak/>
+        <w:t xml:space="preserve">Vocabulary statistics are notoriously sensitive to document length, so Chakraborty et al. investigated the theoretical and practical boundaries of lexical features in AI text detection at </w:t>
       </w:r>
       <w:proofErr w:type="spellStart"/>
       <w:r>
-        <w:t>multi dimensional</w:t>
+        <w:rPr>
+          <w:bCs/>
+        </w:rPr>
+        <w:t>NeurIPS</w:t>
       </w:r>
       <w:proofErr w:type="spellEnd"/>
       <w:r>
-        <w:t xml:space="preserve"> space. Then it measures the Euclidean distance to a </w:t>
-      </w:r>
-      <w:proofErr w:type="spellStart"/>
-      <w:proofErr w:type="gramStart"/>
-      <w:r>
-        <w:t>pre defined</w:t>
-      </w:r>
-      <w:proofErr w:type="spellEnd"/>
-      <w:proofErr w:type="gramEnd"/>
-      <w:r>
-        <w:t xml:space="preserve"> training set of human and AI documents. So basically, it makes a classification decision using a majority vote among the K=5 nearest training vectors.</w:t>
-      </w:r>
-    </w:p>
-    <w:p>
-      <w:pPr>
-        <w:spacing w:before="0" w:after="0"/>
-      </w:pPr>
-      <w:r>
-        <w:t>On top of that, a Vector Space Model measures the semantic alignments. It figures out which category the text aligns with more closely by computing the cosine angle between the document’s syntax vector and human/AI prototype vectors.</w:t>
-      </w:r>
-    </w:p>
-    <w:p>
-      <w:r>
-        <w:lastRenderedPageBreak/>
-        <w:t>Now, spelling and grammatical errors turn out to be a really meaningful feature for stylometric classification. Since Large Language Models are trained on curated, highly polished text datasets, they usually spit out grammatically flawless prose. Human written text is way messier</w:t>
-      </w:r>
-      <w:r>
-        <w:t xml:space="preserve"> </w:t>
-      </w:r>
-      <w:r>
-        <w:t>it frequently exhibits minor typographical slips, inconsistent spacing, or casual punctuation usage. That’s where the Grammar Perfection Score comes in. It evaluates these error indicators and actually discounts the final AI probability. Put simply, if a text is full of typos, it’s way more likely to be human.</w:t>
-      </w:r>
-    </w:p>
-    <w:p>
-      <w:pPr>
-        <w:pStyle w:val="Heading2"/>
-      </w:pPr>
-      <w:bookmarkStart w:id="23" w:name="_Toc237559724"/>
-      <w:r>
-        <w:t>2.2 Literature Review</w:t>
-      </w:r>
-      <w:bookmarkEnd w:id="23"/>
-    </w:p>
-    <w:p>
-      <w:pPr>
         <w:rPr>
           <w:bCs/>
         </w:rPr>
-      </w:pPr>
-      <w:proofErr w:type="spellStart"/>
-      <w:r>
-        <w:rPr>
-          <w:bCs/>
-        </w:rPr>
-        <w:t>Gehrmann</w:t>
-      </w:r>
-      <w:proofErr w:type="spellEnd"/>
-      <w:r>
-        <w:rPr>
-          <w:bCs/>
-        </w:rPr>
-        <w:t xml:space="preserve"> et al. brought about the first big leap in automated text detection when they developed the Giant Language Model Test Room (GLTR). They showed that generative language models end up producing text with extremely predictable token transitions. GLTR uses the BERT large and GPT 2 117M models to score each token in the input text. It bases this score on the predicted rank in the model’s vocabulary distribution. So basically, if tokens consistently fall within the top 10 predicted words, that points to machine generation. But tokens outside the top 1,000 usually suggest human authorship. In their study, they reported that human reviewers actually improved their detection accuracy from 54% to 72% by using this visual tool.</w:t>
-      </w:r>
-      <w:r>
-        <w:rPr>
-          <w:bCs/>
-        </w:rPr>
-        <w:t xml:space="preserve"> [1]</w:t>
-      </w:r>
-    </w:p>
-    <w:p>
-      <w:pPr>
-        <w:rPr>
-          <w:bCs/>
-        </w:rPr>
-      </w:pPr>
-      <w:r>
-        <w:rPr>
-          <w:bCs/>
-        </w:rPr>
-        <w:t>People needed zero shot text detection without constantly retraining classifiers, so Mitchell et al.</w:t>
-      </w:r>
-      <w:r>
-        <w:rPr>
-          <w:bCs/>
-        </w:rPr>
-        <w:t xml:space="preserve"> </w:t>
-      </w:r>
-      <w:r>
-        <w:rPr>
-          <w:bCs/>
-        </w:rPr>
-        <w:t xml:space="preserve">developed </w:t>
-      </w:r>
-      <w:proofErr w:type="spellStart"/>
-      <w:r>
-        <w:rPr>
-          <w:bCs/>
-        </w:rPr>
-        <w:t>DetectGPT</w:t>
-      </w:r>
-      <w:proofErr w:type="spellEnd"/>
-      <w:r>
-        <w:rPr>
-          <w:bCs/>
-        </w:rPr>
-        <w:t xml:space="preserve">. It’s a novel zero shot detection method based on probability curvature. The researchers found out that AI generated passages tend to lie in regions of negative curvature of the source model’s log probability function, while human text just doesn’t exhibit this property. </w:t>
-      </w:r>
-      <w:proofErr w:type="spellStart"/>
-      <w:r>
-        <w:rPr>
-          <w:bCs/>
-        </w:rPr>
-        <w:t>DetectGPT</w:t>
-      </w:r>
-      <w:proofErr w:type="spellEnd"/>
-      <w:r>
-        <w:rPr>
-          <w:bCs/>
-        </w:rPr>
-        <w:t xml:space="preserve"> works by computing the log probability of the original passage and comparing it against the average log probabilities of random perturbations generated by a mask filling model (such as T5). If that original passage has a way higher log probability than its perturbations, the system classifies it as machine generated. This method actually achieved an AUROC of 0.95 on GPT 2 outputs. The main weakness is that it requires access to the source model itself, which limits its applicability to open weight models.</w:t>
-      </w:r>
-      <w:r>
-        <w:rPr>
-          <w:bCs/>
-        </w:rPr>
-        <w:t xml:space="preserve"> [2]</w:t>
-      </w:r>
-    </w:p>
-    <w:p>
-      <w:pPr>
-        <w:rPr>
-          <w:bCs/>
-        </w:rPr>
-      </w:pPr>
-      <w:r>
-        <w:rPr>
-          <w:bCs/>
-        </w:rPr>
-        <w:lastRenderedPageBreak/>
-        <w:t xml:space="preserve">Looking back at early transformer architectures, </w:t>
-      </w:r>
-      <w:proofErr w:type="spellStart"/>
-      <w:r>
-        <w:rPr>
-          <w:bCs/>
-        </w:rPr>
-        <w:t>Solaiman</w:t>
-      </w:r>
-      <w:proofErr w:type="spellEnd"/>
-      <w:r>
-        <w:rPr>
-          <w:bCs/>
-        </w:rPr>
-        <w:t xml:space="preserve"> et al. did a pretty deep evaluation of detection strategies on outputs from the GPT 2 model. Their research showed something interesting: combining simple lexical features like the Type Token Ratio (TTR) and average word lengths with traditional classifiers (like Logistic Regression and Random Forests) provided detection accuracy exceeding 90% for GPT 2’s 1.5B parameter model. They also reported that detection accuracy drops as model size decreases. This happens because smaller models produce more erratic text that is just harder to distinguish from human writing.</w:t>
-      </w:r>
-      <w:r>
-        <w:rPr>
-          <w:bCs/>
-        </w:rPr>
-        <w:t xml:space="preserve"> [3]</w:t>
-      </w:r>
-    </w:p>
-    <w:p>
-      <w:pPr>
-        <w:rPr>
-          <w:bCs/>
-        </w:rPr>
-      </w:pPr>
-      <w:r>
-        <w:t>Generative models kept evolving, and Crothers et al. published a detailed systematic review in IEEE Access that broke down the growing challenges and security vulnerabilities of existing detection methods. They analyzed the limitations of supervised neural network classifiers, pointing out how susceptible they are to adversarial attacks like paraphrasing, vocabulary substitution (synonym swapping), and style transfer. Their review noted that multi feature ensemble classifiers</w:t>
-      </w:r>
-      <w:r>
-        <w:t xml:space="preserve"> </w:t>
-      </w:r>
-      <w:r>
-        <w:t>which combine lexical, syntactic, and semantic features</w:t>
-      </w:r>
-      <w:r>
-        <w:t xml:space="preserve"> </w:t>
-      </w:r>
-      <w:r>
-        <w:t>tend to degrade more slowly under adversarial manipulation than single feature classifiers. This really validates the multi algorithm approach used in this project.</w:t>
-      </w:r>
-      <w:r>
-        <w:t xml:space="preserve"> [4]</w:t>
-      </w:r>
-    </w:p>
-    <w:p>
-      <w:pPr>
-        <w:rPr>
-          <w:bCs/>
-        </w:rPr>
-      </w:pPr>
-      <w:r>
-        <w:rPr>
-          <w:bCs/>
-        </w:rPr>
-        <w:t xml:space="preserve">Putting a theoretical boundary on the whole discussion, </w:t>
-      </w:r>
-      <w:proofErr w:type="spellStart"/>
-      <w:r>
-        <w:rPr>
-          <w:bCs/>
-        </w:rPr>
-        <w:t>Sadasivan</w:t>
-      </w:r>
-      <w:proofErr w:type="spellEnd"/>
-      <w:r>
-        <w:rPr>
-          <w:bCs/>
-        </w:rPr>
-        <w:t xml:space="preserve"> et al. analyzed the fundamental limits of AI text detection at ICML. Their work proved that as generative models approximate the human text distribution more closely, the upper bound of detection accuracy drops off a cliff. The researchers formally showed that for sufficiently advanced models, the optimal classifier accuracy converges toward random chance (50%). This finding really points out the importance of combining multiple orthogonal features rather than just relying on a single statistical metric.</w:t>
-      </w:r>
-      <w:r>
-        <w:rPr>
-          <w:bCs/>
-        </w:rPr>
-        <w:t xml:space="preserve"> [5]</w:t>
-      </w:r>
-    </w:p>
-    <w:p>
-      <w:pPr>
-        <w:rPr>
-          <w:bCs/>
-        </w:rPr>
-      </w:pPr>
-      <w:r>
-        <w:rPr>
-          <w:bCs/>
-        </w:rPr>
-        <w:t xml:space="preserve">Vocabulary statistics are notoriously sensitive to document length, so Chakraborty et al. investigated the theoretical and practical boundaries of lexical features in AI text detection at </w:t>
-      </w:r>
-      <w:proofErr w:type="spellStart"/>
-      <w:r>
-        <w:rPr>
-          <w:bCs/>
-        </w:rPr>
-        <w:t>NeurIPS</w:t>
-      </w:r>
-      <w:proofErr w:type="spellEnd"/>
-      <w:r>
-        <w:rPr>
-          <w:bCs/>
-        </w:rPr>
-        <w:t xml:space="preserve">. They looked at how metrics like the Type Token Ratio (TTR) decrease naturally as text length increases, totally independent of authorship. By introducing length normalized lexical features and testing them on datasets with controlled text lengths, they proved that normalized metrics yield more stable classification results across both short and long </w:t>
-      </w:r>
-      <w:r>
-        <w:rPr>
-          <w:bCs/>
-        </w:rPr>
-        <w:lastRenderedPageBreak/>
-        <w:t>documents. This insight directly informed the implementation of length aware TTR normalization in the AI Text Detector’s KNN Classifier.</w:t>
+        <w:t>. They looked at how metrics like the Type Token Ratio (TTR) decrease naturally as text length increases, totally independent of authorship. By introducing length normalized lexical features and testing them on datasets with controlled text lengths, they proved that normalized metrics yield more stable classification results across both short and long documents. This insight directly informed the implementation of length aware TTR normalization in the AI Text Detector’s KNN Classifier.</w:t>
       </w:r>
       <w:r>
         <w:rPr>
@@ -11397,14 +11387,14 @@
         <w:pStyle w:val="Heading1"/>
         <w:ind w:left="224" w:right="278"/>
       </w:pPr>
-      <w:bookmarkStart w:id="24" w:name="_Toc201399427"/>
-      <w:bookmarkStart w:id="25" w:name="_Toc237559725"/>
+      <w:bookmarkStart w:id="23" w:name="_Toc201399427"/>
+      <w:bookmarkStart w:id="24" w:name="_Toc237559725"/>
       <w:r>
         <w:lastRenderedPageBreak/>
         <w:t>CHAPTER 3</w:t>
       </w:r>
+      <w:bookmarkEnd w:id="23"/>
       <w:bookmarkEnd w:id="24"/>
-      <w:bookmarkEnd w:id="25"/>
       <w:r>
         <w:t xml:space="preserve"> </w:t>
       </w:r>
@@ -11414,35 +11404,35 @@
         <w:pStyle w:val="Heading1"/>
         <w:ind w:left="224" w:right="278"/>
       </w:pPr>
-      <w:bookmarkStart w:id="26" w:name="_Toc237559726"/>
+      <w:bookmarkStart w:id="25" w:name="_Toc237559726"/>
       <w:r>
         <w:t>SYSTEM ANALYSIS AND DESIGN</w:t>
       </w:r>
+      <w:bookmarkEnd w:id="25"/>
+    </w:p>
+    <w:p>
+      <w:pPr>
+        <w:pStyle w:val="Heading2"/>
+      </w:pPr>
+      <w:bookmarkStart w:id="26" w:name="_Toc231875504"/>
+      <w:bookmarkStart w:id="27" w:name="_Toc237559727"/>
+      <w:r>
+        <w:t>3.1 System Analysis</w:t>
+      </w:r>
       <w:bookmarkEnd w:id="26"/>
-    </w:p>
-    <w:p>
-      <w:pPr>
-        <w:pStyle w:val="Heading2"/>
-      </w:pPr>
-      <w:bookmarkStart w:id="27" w:name="_Toc231875504"/>
-      <w:bookmarkStart w:id="28" w:name="_Toc237559727"/>
-      <w:r>
-        <w:t>3.1 System Analysis</w:t>
-      </w:r>
       <w:bookmarkEnd w:id="27"/>
+    </w:p>
+    <w:p>
+      <w:pPr>
+        <w:pStyle w:val="Heading3"/>
+      </w:pPr>
+      <w:bookmarkStart w:id="28" w:name="_Toc231875505"/>
+      <w:bookmarkStart w:id="29" w:name="_Toc237559728"/>
+      <w:r>
+        <w:t>3.1.1 Requirement Analysis</w:t>
+      </w:r>
       <w:bookmarkEnd w:id="28"/>
-    </w:p>
-    <w:p>
-      <w:pPr>
-        <w:pStyle w:val="Heading3"/>
-      </w:pPr>
-      <w:bookmarkStart w:id="29" w:name="_Toc231875505"/>
-      <w:bookmarkStart w:id="30" w:name="_Toc237559728"/>
-      <w:r>
-        <w:t>3.1.1 Requirement Analysis</w:t>
-      </w:r>
       <w:bookmarkEnd w:id="29"/>
-      <w:bookmarkEnd w:id="30"/>
     </w:p>
     <w:p>
       <w:pPr>
@@ -11637,7 +11627,10 @@
     </w:p>
     <w:p>
       <w:r>
-        <w:t>There’s this clean SVG gauge visualization that shows up. It essentially represents the weighted ensemble probability that a machine generated the text.</w:t>
+        <w:t>This clean SVG gauge visualization appears. It represents the weighted ensemble probability that a machine produced the text</w:t>
+      </w:r>
+      <w:r>
+        <w:t>.</w:t>
       </w:r>
     </w:p>
     <w:p>
@@ -11692,8 +11685,11 @@
       </w:r>
     </w:p>
     <w:p>
-      <w:r>
-        <w:t>The system calculates and displays a few specific metrics. Put simply, it shows you the sentence length standard deviation (which is basically burstiness) along with the Type Token Ratio (TTR).</w:t>
+      <w:pPr>
+        <w:spacing w:after="0"/>
+      </w:pPr>
+      <w:r>
+        <w:t>The system shows you some simple summary metrics for a few things. In simple terms it shows you the sentence length standard deviation, (the measure of burstiness) and the Type Token ratio (TTR).</w:t>
       </w:r>
     </w:p>
     <w:p>
@@ -11877,7 +11873,7 @@
     </w:p>
     <w:p>
       <w:r>
-        <w:t>So basically, logged-in users can view, search, and delete their saved analysis records. The real-time search is actually multi-field, meaning you can look up things by title, a snippet of the body text, the verdict statement, or the username. The action controls are just simple icons for View/Reload and Delete. And obviously, it maintains strict database user isolation using a WHERE username = ? query.</w:t>
+        <w:t>So pretty much, logged-in users can see, search, and delete their saved analysis. The real-time search is multi-field, where you can search against: title, body content in part, verdict, and username. Action controllers were just simple icons for View/Reload and Delete keeping user privacy.</w:t>
       </w:r>
     </w:p>
     <w:p>
@@ -11978,13 +11974,22 @@
     </w:p>
     <w:p>
       <w:r>
-        <w:t>One of the main things is that all AI classification and stylometric analysis computations run entirely inside the client browser sandbox. That means none of the user’s document text gets sent out to external third-party cloud AI services. There is an optional local SQLite3 backend server running on localhost:5000, but that only holds user credentials and analysis metadata</w:t>
+        <w:t>All the classification and stylistic analysis math happens locally, in your browser sandbox, and does not involve passing any of your files to external cloud AI service(s). (You could also choose to opt-in to use the optional local SQLite3backend serveratlocalhost:5000(this backend only logs your account login information) so that it could also save</w:t>
       </w:r>
       <w:r>
         <w:t xml:space="preserve"> </w:t>
       </w:r>
       <w:r>
-        <w:t>never the original document text.</w:t>
+        <w:t>your</w:t>
+      </w:r>
+      <w:r>
+        <w:t xml:space="preserve"> </w:t>
+      </w:r>
+      <w:r>
+        <w:t>stylometric results for whatever file you feed it</w:t>
+      </w:r>
+      <w:r>
+        <w:t>.</w:t>
       </w:r>
     </w:p>
     <w:p>
@@ -12012,9 +12017,10 @@
     </w:p>
     <w:p>
       <w:r>
-        <w:t>Speed is pretty important here. The entire document processing and classification pipeline has to finish executing in less than 500 milliseconds.</w:t>
-      </w:r>
-    </w:p>
+        <w:t>Speed is pretty important here. The entire document processing and classification pipeline finish executing in less than 500 milliseconds.</w:t>
+      </w:r>
+    </w:p>
+    <w:p/>
     <w:p/>
     <w:p>
       <w:pPr>
@@ -12098,70 +12104,102 @@
     </w:p>
     <w:p>
       <w:r>
+        <w:t xml:space="preserve">The actual AI detection engine is just served as static files directly to any modern web browser. You can optionally run a lightweight Python REST API server (server.py) if you'd like persistent SQLite3 database storage and User Authentication to be available, if however, it is offline the app still falls back to </w:t>
+      </w:r>
+      <w:proofErr w:type="spellStart"/>
+      <w:r>
+        <w:t>IndexedDB</w:t>
+      </w:r>
+      <w:proofErr w:type="spellEnd"/>
+      <w:r>
+        <w:t xml:space="preserve"> storage in the browser</w:t>
+      </w:r>
+      <w:r>
+        <w:t>.</w:t>
+      </w:r>
+    </w:p>
+    <w:p>
+      <w:pPr>
+        <w:pStyle w:val="Heading3"/>
+      </w:pPr>
+      <w:bookmarkStart w:id="30" w:name="_Toc237559729"/>
+      <w:r>
+        <w:t>3.1.2 Feasibility Analysis</w:t>
+      </w:r>
+      <w:bookmarkEnd w:id="30"/>
+    </w:p>
+    <w:p>
+      <w:pPr>
+        <w:pStyle w:val="Heading4"/>
+      </w:pPr>
+      <w:r>
+        <w:t>3.1.2.1  Technical Feasibility</w:t>
+      </w:r>
+    </w:p>
+    <w:p>
+      <w:r>
         <w:t>T</w:t>
       </w:r>
       <w:r>
-        <w:t xml:space="preserve">he core AI detection engine actually just runs as static files right in any modern web browser. You can run an optional, lightweight Python REST API server (server.py) if you want persistent SQLite3 database storage and user authentication. But if that server goes offline, the app just falls back to the browser’s </w:t>
+        <w:t xml:space="preserve">o prove this is technically viable, we have mixed modern web tech and an few NLP algorithms with an extremely simple backend server. On the front end, normal html5, css3 and es6 </w:t>
       </w:r>
       <w:proofErr w:type="spellStart"/>
       <w:r>
+        <w:t>javascript</w:t>
+      </w:r>
+      <w:proofErr w:type="spellEnd"/>
+      <w:r>
+        <w:t xml:space="preserve"> will give you the experience. On the back end it’s a REST API that consist of Python's native </w:t>
+      </w:r>
+      <w:proofErr w:type="spellStart"/>
+      <w:r>
+        <w:t>http.server</w:t>
+      </w:r>
+      <w:proofErr w:type="spellEnd"/>
+      <w:r>
+        <w:t xml:space="preserve"> and sqlite3 libraries. And as the document parser and in-browser DB, this implementation can simply make do with Pdf.js, Mammoth.js as the latter part and </w:t>
+      </w:r>
+      <w:proofErr w:type="spellStart"/>
+      <w:r>
         <w:t>IndexedDB</w:t>
       </w:r>
       <w:proofErr w:type="spellEnd"/>
       <w:r>
-        <w:t xml:space="preserve"> storage.</w:t>
-      </w:r>
-    </w:p>
-    <w:p>
-      <w:pPr>
-        <w:pStyle w:val="Heading3"/>
-      </w:pPr>
-      <w:bookmarkStart w:id="31" w:name="_Toc237559729"/>
-      <w:r>
-        <w:t>3.1.2 Feasibility Analysis</w:t>
-      </w:r>
-      <w:bookmarkEnd w:id="31"/>
+        <w:t xml:space="preserve"> (or just plain files) as alternative storage system</w:t>
+      </w:r>
+      <w:r>
+        <w:t>.</w:t>
+      </w:r>
     </w:p>
     <w:p>
       <w:pPr>
         <w:pStyle w:val="Heading4"/>
       </w:pPr>
       <w:r>
-        <w:t>3.1.2.1  Technical Feasibility</w:t>
-      </w:r>
-    </w:p>
-    <w:p>
-      <w:r>
-        <w:t xml:space="preserve">To show this is technically feasible, we combined client-side web tech with some NLP algorithms and a really lightweight backend server. The frontend is built with standard HTML5, CSS3, and ES6 JavaScript. For the backend REST API, it relies entirely on Python’s built-in </w:t>
-      </w:r>
-      <w:proofErr w:type="spellStart"/>
-      <w:r>
-        <w:t>http.server</w:t>
-      </w:r>
-      <w:proofErr w:type="spellEnd"/>
-      <w:r>
-        <w:t xml:space="preserve"> and sqlite3 modules. By using tools like PDF.js and Mammoth.js to handle document parsing, MathJax for rendering equations, and </w:t>
-      </w:r>
-      <w:proofErr w:type="spellStart"/>
-      <w:r>
-        <w:t>IndexedDB</w:t>
-      </w:r>
-      <w:proofErr w:type="spellEnd"/>
-      <w:r>
-        <w:t xml:space="preserve"> for fallback storage, the whole project manages to avoid any commercial software dependencies.</w:t>
-      </w:r>
-    </w:p>
-    <w:p>
-      <w:pPr>
-        <w:pStyle w:val="Heading4"/>
-      </w:pPr>
-      <w:r>
         <w:t>3.1.2.2 Operational Feasibility</w:t>
       </w:r>
     </w:p>
     <w:p>
       <w:r>
-        <w:t>Using the application is super straightforward. If you paste text or drop a document in, it immediately generates charts, statistics, and a heatmap without needing any setup. Users can just click on the highlighted sentences to check out the metrics, which makes it really easy to figure out why a particular classification was made.</w:t>
+        <w:t xml:space="preserve">It's incredibly easy to use! Just paste text into it, or drop a document into the app and charts, stats, and a heatmap are generated with zero setup. All </w:t>
+      </w:r>
+      <w:r>
+        <w:t>users</w:t>
+      </w:r>
+      <w:r>
+        <w:t xml:space="preserve"> have to do is click on the sentences that have been highlighted to explore the metrics. It's actually very simple to understand why a class</w:t>
+      </w:r>
+      <w:r>
+        <w:t>ification</w:t>
+      </w:r>
+      <w:r>
+        <w:t xml:space="preserve"> was </w:t>
+      </w:r>
+      <w:r>
+        <w:t>given</w:t>
+      </w:r>
+      <w:r>
+        <w:t>.</w:t>
       </w:r>
     </w:p>
     <w:p>
@@ -12175,7 +12213,18 @@
     </w:p>
     <w:p>
       <w:r>
-        <w:t>From an economic standpoint, the project leans entirely on open source libraries. This means no annoying software licenses or subscription fees. And since all the processing happens right in the user’s browser, there aren’t any hosting costs or massive database storage requirements to worry about. Put simply, there’s zero server maintenance overhead.</w:t>
+        <w:t xml:space="preserve">From an economic point of view. The project relied 100% on open source libraries. No nasty licensing fees or subscription models. As all the heavy lifting is performed on the user's computer all the expensive hardware is eliminated. </w:t>
+      </w:r>
+      <w:proofErr w:type="gramStart"/>
+      <w:r>
+        <w:t>Also</w:t>
+      </w:r>
+      <w:proofErr w:type="gramEnd"/>
+      <w:r>
+        <w:t xml:space="preserve"> no server cost and no large amount of space is needed in the database storage. In other words, there is absolutely no server maintenance cost involved</w:t>
+      </w:r>
+      <w:r>
+        <w:t>.</w:t>
       </w:r>
     </w:p>
     <w:p>
@@ -12193,9 +12242,28 @@
           <w:ilvl w:val="0"/>
           <w:numId w:val="7"/>
         </w:numPr>
-      </w:pPr>
-      <w:r>
-        <w:t>For the brainstorming phase, we’ve scheduled it from March 30 to April 5, 2026, giving us a solid 7 days. This is when we’ll sit down to discuss the project goals, figure out key requirements, and bounce around conceptual ideas. That amount of time should be plenty for some good collaborative discussions, making it a very feasible window to set up a strong foundation for the project.</w:t>
+        <w:spacing w:before="100" w:beforeAutospacing="1" w:after="100" w:afterAutospacing="1"/>
+        <w:jc w:val="left"/>
+        <w:rPr>
+          <w:rFonts w:eastAsia="Times New Roman"/>
+          <w:color w:val="auto"/>
+          <w:kern w:val="0"/>
+          <w:lang w:bidi="ne-NP"/>
+          <w14:ligatures w14:val="none"/>
+        </w:rPr>
+      </w:pPr>
+      <w:r>
+        <w:rPr>
+          <w:rFonts w:eastAsia="Times New Roman"/>
+          <w:color w:val="auto"/>
+          <w:kern w:val="0"/>
+          <w:lang w:bidi="ne-NP"/>
+          <w14:ligatures w14:val="none"/>
+        </w:rPr>
+        <w:t>We’ve set aside from 30 March 5 April, 2006 for brainstorming, providing a total of 7 full days. During this period, the team shall convene to define the project's objective, key requirements, and to brainstorm the core concepts. This duration should be sufficient to have quality discussions, and thus, it is readily achievable to establish a solid basis for the project</w:t>
+      </w:r>
+      <w:r>
+        <w:t>.</w:t>
       </w:r>
     </w:p>
     <w:p>
@@ -12231,7 +12299,10 @@
         </w:numPr>
       </w:pPr>
       <w:r>
-        <w:t>We’ve planned the testing phase from June 11 to June 25, 2026, which is exactly 15 days. The whole point of this period is to run functional testing, identify bugs, evaluate our precision/recall metrics, and push out any minor fixes.</w:t>
+        <w:t>This period has been scheduled from 11 June 2026 to 25 June 2026 (15 days in total). The main objective of this period is to perform functionality testing, fix bugs, test our precision/recall metrics and work on small patches</w:t>
+      </w:r>
+      <w:r>
+        <w:t>.</w:t>
       </w:r>
     </w:p>
     <w:p>
@@ -12263,19 +12334,14 @@
         </w:numPr>
       </w:pPr>
       <w:r>
-        <w:t xml:space="preserve">The documentation phase actually just runs continuously in the background from March 30 to July 20, 2026. That spans a total of 113 days. </w:t>
-      </w:r>
-      <w:proofErr w:type="gramStart"/>
-      <w:r>
-        <w:t>This covers</w:t>
-      </w:r>
-      <w:proofErr w:type="gramEnd"/>
-      <w:r>
-        <w:t xml:space="preserve"> writing up system usage instructions, logging our architecture decisions, and drafting user facing guides. Giving </w:t>
+        <w:t xml:space="preserve">The documenting phase is really just 'running all the time' in the background from 30th March 2026 until 20th July 2026. That's 113 days. This time has been allocated for documenting system operation, arch decision reporting and preparing user interface </w:t>
       </w:r>
       <w:r>
         <w:lastRenderedPageBreak/>
-        <w:t>ourselves 113 days should provide more than enough time to keep the documentation complete and maintainable.</w:t>
+        <w:t>documentation. 113 days should be more than enough to keep the documentation up-to-date</w:t>
+      </w:r>
+      <w:r>
+        <w:t>.</w:t>
       </w:r>
     </w:p>
     <w:p>
@@ -12819,32 +12885,19 @@
       <w:pPr>
         <w:pStyle w:val="Heading3"/>
       </w:pPr>
-      <w:bookmarkStart w:id="32" w:name="_Toc237559730"/>
+      <w:bookmarkStart w:id="31" w:name="_Toc237559730"/>
       <w:r>
         <w:lastRenderedPageBreak/>
         <w:t>3.1.3 Object Modeling using Class Diagram</w:t>
       </w:r>
-      <w:bookmarkEnd w:id="32"/>
-    </w:p>
-    <w:p>
-      <w:r>
-        <w:t xml:space="preserve">The class diagram for the system does a good job describing the modular architecture of our </w:t>
-      </w:r>
-      <w:proofErr w:type="gramStart"/>
-      <w:r>
-        <w:t>client side</w:t>
-      </w:r>
-      <w:proofErr w:type="gramEnd"/>
-      <w:r>
-        <w:t xml:space="preserve"> JavaScript engine. Basically, the application logic is decoupled into five specialized classes. These handle everything from document parsing and sentence perplexity to </w:t>
-      </w:r>
-      <w:proofErr w:type="gramStart"/>
-      <w:r>
-        <w:t>instance based</w:t>
-      </w:r>
-      <w:proofErr w:type="gramEnd"/>
-      <w:r>
-        <w:t xml:space="preserve"> classification, vector similarities, and rendering the SVG visualization.</w:t>
+      <w:bookmarkEnd w:id="31"/>
+    </w:p>
+    <w:p>
+      <w:r>
+        <w:t>The system's class diagram effectively describes our client-side JavaScript engine's modular design. It splits the application logic into five distinct classes:  Parses, Sentence Perplexity, Vector Similarities, Instance Based Classification, Render SVG visualization</w:t>
+      </w:r>
+      <w:r>
+        <w:t>.</w:t>
       </w:r>
     </w:p>
     <w:p>
@@ -12860,10 +12913,10 @@
           <w:noProof/>
         </w:rPr>
         <w:drawing>
-          <wp:inline distT="0" distB="0" distL="0" distR="0" wp14:anchorId="6FDAA0FD" wp14:editId="2041B093">
-            <wp:extent cx="5886569" cy="4234405"/>
-            <wp:effectExtent l="0" t="0" r="0" b="0"/>
-            <wp:docPr id="2" name="Picture 2"/>
+          <wp:inline distT="0" distB="0" distL="0" distR="0" wp14:anchorId="51BAB31B" wp14:editId="47BB7897">
+            <wp:extent cx="5715000" cy="4067810"/>
+            <wp:effectExtent l="0" t="0" r="0" b="8890"/>
+            <wp:docPr id="15" name="Picture 15"/>
             <wp:cNvGraphicFramePr>
               <a:graphicFrameLocks xmlns:a="http://schemas.openxmlformats.org/drawingml/2006/main" noChangeAspect="1"/>
             </wp:cNvGraphicFramePr>
@@ -12883,7 +12936,7 @@
                   <pic:spPr>
                     <a:xfrm>
                       <a:off x="0" y="0"/>
-                      <a:ext cx="5891609" cy="4238030"/>
+                      <a:ext cx="5715000" cy="4067810"/>
                     </a:xfrm>
                     <a:prstGeom prst="rect">
                       <a:avLst/>
@@ -12938,66 +12991,79 @@
         <w:t xml:space="preserve"> </w:t>
       </w:r>
       <w:r>
-        <w:t xml:space="preserve">it supports .docx, .pdf, .txt, and .md file structures. Then it passes that raw plain text over to the PerplexityAnalyzer. This analyzer tokenizes the text into sentences, before calculating the sentence length standard deviation and Type Token Ratio. From there, the KNNClassifier pulls a 5D feature vector from the tokenized text and performs Euclidean distance classification </w:t>
+        <w:t xml:space="preserve">it supports .docx, .pdf, .txt, and .md file structures. Then it passes that raw plain text over to the PerplexityAnalyzer. This analyzer tokenizes the text into sentences, before calculating the sentence length standard deviation and Type Token Ratio. From there, the KNNClassifier pulls a 5D feature vector from the tokenized text and performs Euclidean distance classification against our hardcoded dataset. Meanwhile, the </w:t>
+      </w:r>
+      <w:proofErr w:type="spellStart"/>
+      <w:r>
+        <w:t>CosineSimilarityAnalyzer</w:t>
+      </w:r>
+      <w:proofErr w:type="spellEnd"/>
+      <w:r>
+        <w:t xml:space="preserve"> looks at the vector angle similarity between the actual document and some established human/AI prototype </w:t>
       </w:r>
       <w:r>
         <w:lastRenderedPageBreak/>
-        <w:t xml:space="preserve">against our hardcoded dataset. Meanwhile, the </w:t>
+        <w:t xml:space="preserve">profiles. Finally, the </w:t>
       </w:r>
       <w:proofErr w:type="spellStart"/>
       <w:r>
+        <w:t>ChartRenderer</w:t>
+      </w:r>
+      <w:proofErr w:type="spellEnd"/>
+      <w:r>
+        <w:t xml:space="preserve"> takes the results from all these analyzers and draws up interactive SVG charts</w:t>
+      </w:r>
+      <w:r>
+        <w:t xml:space="preserve"> </w:t>
+      </w:r>
+      <w:r>
+        <w:t>like the gauge, scatter plot, and radar web</w:t>
+      </w:r>
+      <w:r>
+        <w:t xml:space="preserve"> </w:t>
+      </w:r>
+      <w:r>
+        <w:t>right in the dashboard.</w:t>
+      </w:r>
+    </w:p>
+    <w:p>
+      <w:pPr>
+        <w:pStyle w:val="Heading3"/>
+      </w:pPr>
+      <w:bookmarkStart w:id="32" w:name="_Toc231875508"/>
+      <w:bookmarkStart w:id="33" w:name="_Toc237559731"/>
+      <w:r>
+        <w:t>3.1.4 Dynamic Modelling using State and Sequence Diagrams</w:t>
+      </w:r>
+      <w:bookmarkEnd w:id="32"/>
+      <w:bookmarkEnd w:id="33"/>
+    </w:p>
+    <w:p>
+      <w:r>
+        <w:t>T</w:t>
+      </w:r>
+      <w:r>
+        <w:t xml:space="preserve">he AI Text Detector System state machine initiates once the user supplies any text or document via the interactive dashboard GUI. Initially, there’s a basic validation state where the input document gets assessed whether it exceeds the minimum threshold value of 10 words, on failing it directly short circuits to the error state otherwise, proceed to tokenization state to excerpt all the sentences and words from it. Hereon, all the 7 engines (i.e. PerplexityAnalyzer, KNNClassifier, </w:t>
+      </w:r>
+      <w:proofErr w:type="spellStart"/>
+      <w:r>
         <w:t>CosineSimilarityAnalyzer</w:t>
       </w:r>
       <w:proofErr w:type="spellEnd"/>
       <w:r>
-        <w:t xml:space="preserve"> looks at the vector angle similarity between the actual document and some established human/AI prototype profiles. Finally, the </w:t>
+        <w:t xml:space="preserve">, </w:t>
       </w:r>
       <w:proofErr w:type="spellStart"/>
       <w:r>
-        <w:t>ChartRenderer</w:t>
+        <w:t>LogisticRegressionClassifier</w:t>
       </w:r>
       <w:proofErr w:type="spellEnd"/>
       <w:r>
-        <w:t xml:space="preserve"> takes the results from all these analyzers and draws up interactive SVG charts</w:t>
-      </w:r>
-      <w:r>
-        <w:t xml:space="preserve"> </w:t>
-      </w:r>
-      <w:r>
-        <w:t>like the gauge, scatter plot, and radar web</w:t>
-      </w:r>
-      <w:r>
-        <w:t xml:space="preserve"> </w:t>
-      </w:r>
-      <w:r>
-        <w:t>right in the dashboard.</w:t>
-      </w:r>
-    </w:p>
-    <w:p>
-      <w:pPr>
-        <w:pStyle w:val="Heading3"/>
-      </w:pPr>
-      <w:bookmarkStart w:id="33" w:name="_Toc231875508"/>
-      <w:bookmarkStart w:id="34" w:name="_Toc237559731"/>
-      <w:r>
-        <w:t>3.1.4 Dynamic Modelling using State and Sequence Diagrams</w:t>
-      </w:r>
-      <w:bookmarkEnd w:id="33"/>
-      <w:bookmarkEnd w:id="34"/>
-    </w:p>
-    <w:p>
-      <w:r>
-        <w:t>Basically, the AI Text Detector System’s state diagram kicks off the moment a user submits some text or a document through the visual dashboard interface. The first thing that happens is the system runs a quick validation check to see if the input is long enough</w:t>
-      </w:r>
-      <w:r>
-        <w:t xml:space="preserve"> </w:t>
-      </w:r>
-      <w:r>
-        <w:t xml:space="preserve">specifically, it needs to hit a minimum threshold of 10 words. If it doesn’t meet that mark, the system just hits a short circuit error state and stops right there. But if the text passes, it moves into the tokenization state, which is where it pulls out all the sentences and words. Next up, all seven analysis engines run at the exact same time. These are the PerplexityAnalyzer, KNNClassifier, </w:t>
+        <w:t xml:space="preserve">, </w:t>
       </w:r>
       <w:proofErr w:type="spellStart"/>
       <w:r>
-        <w:t>CosineSimilarityAnalyzer</w:t>
+        <w:t>TrigramAnalyzer</w:t>
       </w:r>
       <w:proofErr w:type="spellEnd"/>
       <w:r>
@@ -13005,43 +13071,22 @@
       </w:r>
       <w:proofErr w:type="spellStart"/>
       <w:r>
-        <w:t>LogisticRegressionClassifier</w:t>
+        <w:t>PosClassifier</w:t>
       </w:r>
       <w:proofErr w:type="spellEnd"/>
       <w:r>
-        <w:t xml:space="preserve">, </w:t>
+        <w:t xml:space="preserve"> and </w:t>
       </w:r>
       <w:proofErr w:type="spellStart"/>
       <w:r>
-        <w:t>TrigramAnalyzer</w:t>
+        <w:t>GrammarAnalyzer</w:t>
       </w:r>
       <w:proofErr w:type="spellEnd"/>
       <w:r>
-        <w:t xml:space="preserve">, </w:t>
-      </w:r>
-      <w:proofErr w:type="spellStart"/>
-      <w:r>
-        <w:t>PosClassifier</w:t>
-      </w:r>
-      <w:proofErr w:type="spellEnd"/>
-      <w:r>
-        <w:t xml:space="preserve">, and </w:t>
-      </w:r>
-      <w:proofErr w:type="spellStart"/>
-      <w:r>
-        <w:t>GrammarAnalyzer</w:t>
-      </w:r>
-      <w:proofErr w:type="spellEnd"/>
-      <w:r>
-        <w:t xml:space="preserve">. Each one spits back its own independent probability score. After that, the system gathers these scores in the ensemble scoring state to figure out the weighted average. The Grammar Perfection Score then comes in as a discount multiplier. Once we have the final calibrated probability, it gets handed off to the rendering state. This is where </w:t>
-      </w:r>
-      <w:proofErr w:type="spellStart"/>
-      <w:r>
-        <w:t>ChartRenderer</w:t>
-      </w:r>
-      <w:proofErr w:type="spellEnd"/>
-      <w:r>
-        <w:t xml:space="preserve"> actually draws the SVG visualizations like the gauge, scatter plot, and radar web. It also builds the sentence heatmap and fills in the statistics panels. Finally, the system just chills in the idle state until the user gives it something else to do.</w:t>
+        <w:t>) run in parallel with independent output probability after which the scores are combined in ensemble scoring to obtain the Weighted Average along with which Grammar Perfection Score works as a discount factor to calculate final calibrated probability that is further dispatched to the rendering stage to draw different SVG visualizations ( Gauge Chart, Scatter Plot &amp; Radial Web Chart), generate the sentence heatmap and finally populate the stats</w:t>
+      </w:r>
+      <w:r>
+        <w:t>.</w:t>
       </w:r>
     </w:p>
     <w:p/>
@@ -13080,6 +13125,28 @@
     <w:p>
       <w:pPr>
         <w:jc w:val="center"/>
+        <w:rPr>
+          <w:b/>
+        </w:rPr>
+      </w:pPr>
+    </w:p>
+    <w:p>
+      <w:pPr>
+        <w:jc w:val="center"/>
+        <w:rPr>
+          <w:b/>
+        </w:rPr>
+      </w:pPr>
+    </w:p>
+    <w:p>
+      <w:pPr>
+        <w:rPr>
+          <w:b/>
+        </w:rPr>
+      </w:pPr>
+    </w:p>
+    <w:p>
+      <w:pPr>
         <w:rPr>
           <w:b/>
         </w:rPr>
@@ -13094,10 +13161,10 @@
           <wp:anchor distT="0" distB="0" distL="114300" distR="114300" simplePos="0" relativeHeight="251665408" behindDoc="1" locked="0" layoutInCell="1" allowOverlap="1" wp14:anchorId="35D0FF1A" wp14:editId="2DD7503A">
             <wp:simplePos x="0" y="0"/>
             <wp:positionH relativeFrom="column">
-              <wp:posOffset>1872615</wp:posOffset>
+              <wp:posOffset>1910715</wp:posOffset>
             </wp:positionH>
             <wp:positionV relativeFrom="paragraph">
-              <wp:posOffset>-594995</wp:posOffset>
+              <wp:posOffset>-53340</wp:posOffset>
             </wp:positionV>
             <wp:extent cx="2484540" cy="4572898"/>
             <wp:effectExtent l="0" t="0" r="0" b="0"/>
@@ -13149,6 +13216,48 @@
     </w:p>
     <w:p>
       <w:pPr>
+        <w:rPr>
+          <w:b/>
+        </w:rPr>
+      </w:pPr>
+    </w:p>
+    <w:p>
+      <w:pPr>
+        <w:rPr>
+          <w:b/>
+        </w:rPr>
+      </w:pPr>
+    </w:p>
+    <w:p>
+      <w:pPr>
+        <w:rPr>
+          <w:b/>
+        </w:rPr>
+      </w:pPr>
+    </w:p>
+    <w:p>
+      <w:pPr>
+        <w:rPr>
+          <w:b/>
+        </w:rPr>
+      </w:pPr>
+    </w:p>
+    <w:p>
+      <w:pPr>
+        <w:rPr>
+          <w:b/>
+        </w:rPr>
+      </w:pPr>
+    </w:p>
+    <w:p>
+      <w:pPr>
+        <w:rPr>
+          <w:b/>
+        </w:rPr>
+      </w:pPr>
+    </w:p>
+    <w:p>
+      <w:pPr>
         <w:jc w:val="center"/>
         <w:rPr>
           <w:b/>
@@ -13157,41 +13266,7 @@
     </w:p>
     <w:p>
       <w:pPr>
-        <w:rPr>
-          <w:b/>
-        </w:rPr>
-      </w:pPr>
-    </w:p>
-    <w:p>
-      <w:pPr>
-        <w:rPr>
-          <w:b/>
-        </w:rPr>
-      </w:pPr>
-    </w:p>
-    <w:p>
-      <w:pPr>
-        <w:rPr>
-          <w:b/>
-        </w:rPr>
-      </w:pPr>
-    </w:p>
-    <w:p>
-      <w:pPr>
-        <w:rPr>
-          <w:b/>
-        </w:rPr>
-      </w:pPr>
-    </w:p>
-    <w:p>
-      <w:pPr>
-        <w:rPr>
-          <w:b/>
-        </w:rPr>
-      </w:pPr>
-    </w:p>
-    <w:p>
-      <w:pPr>
+        <w:jc w:val="center"/>
         <w:rPr>
           <w:b/>
         </w:rPr>
@@ -13222,46 +13297,40 @@
     </w:p>
     <w:p>
       <w:r>
-        <w:t>So, Figure 3.4 breaks down all these state transitions to show the entire operational lifecycle of the AI Text Detector. At the very beginning, you see a hollow, empty start circle that just means the system is ready to go. As soon as you submit text or drop a document into it, it shifts into the Input Received state, and that immediately triggers the validation step. If your input is too short</w:t>
-      </w:r>
-      <w:r>
-        <w:t xml:space="preserve"> </w:t>
-      </w:r>
-      <w:r>
-        <w:t>like fewer than 10 words</w:t>
-      </w:r>
-      <w:r>
-        <w:t xml:space="preserve"> </w:t>
-      </w:r>
-      <w:r>
-        <w:t xml:space="preserve">it bumps over to a validation failed state and pops up a warning message. But assuming it passes, it moves straight to tokenization to parse sentences and words locally. After the text is tokenized, all seven engines (Perplexity, KNN, Cosine Similarity, Logistic Regression, Character Trigram, POS Syntax, and Grammar) start running in parallel. They each calculate their own independent analysis score, which means we get a bunch of different perspectives on the text. The system takes all those numbers and combines them in the Ensemble Scoring state. Then it applies the Grammar Perfection Score as a discount multiplier. Using this final calibrated probability, </w:t>
+        <w:t>F</w:t>
+      </w:r>
+      <w:r>
+        <w:t>igure 3.4 details all those state transitions and demonstrates the complete life cycle of operations for the AI Text Detector system: we start off with hollow blank start circle indicating it is ready, then as we submit text/drag a doc in, it transit to ‘Input received’ state which automatically transition to ‘Validate’ state, should the length of submitted/dragged text be lower than 10 words it should immediately transit to ‘validation failed’ state and throw an error to the user, Otherwise, proceed to ‘</w:t>
       </w:r>
       <w:proofErr w:type="spellStart"/>
       <w:r>
-        <w:t>ChartRenderer</w:t>
+        <w:t>tokenisation</w:t>
       </w:r>
       <w:proofErr w:type="spellEnd"/>
       <w:r>
-        <w:t xml:space="preserve"> generates the SVG visualizations and the heatmap. From there, the system hops into a Result Display state for a </w:t>
-      </w:r>
-      <w:r>
+        <w:t>’ to identify all sentences and words within the text on the local end of the system, following all seven AI engines calculate their own individual analysis’ score which would finally lead up to state ‘Ensemble scoring’ to incorporate all analysis from each engines, applying ‘Grammar Perfection Score’ to act as a multiplier discount, from the above computation (result in float) draw SVG chart visualization and heatmap via ‘Chart renderer’ which then result in the ‘Result display’ state and return to ‘Idle’ as it is completed. Solid circle denotes the final state (end of life cycle)</w:t>
+      </w:r>
+      <w:r>
+        <w:t>.</w:t>
+      </w:r>
+    </w:p>
+    <w:p>
+      <w:pPr>
+        <w:jc w:val="center"/>
+        <w:rPr>
+          <w:b/>
+        </w:rPr>
+      </w:pPr>
+      <w:r>
+        <w:rPr>
+          <w:b/>
+        </w:rPr>
         <w:lastRenderedPageBreak/>
-        <w:t>bit before dropping back to Idle. The solid circle state down at the bottom just marks the end of the lifecycle.</w:t>
-      </w:r>
-    </w:p>
-    <w:p>
-      <w:pPr>
-        <w:jc w:val="center"/>
-      </w:pPr>
-      <w:r>
-        <w:rPr>
-          <w:noProof/>
-        </w:rPr>
         <w:drawing>
-          <wp:inline distT="0" distB="0" distL="0" distR="0" wp14:anchorId="1CAF58F1" wp14:editId="2574C12E">
-            <wp:extent cx="5715000" cy="5114925"/>
-            <wp:effectExtent l="0" t="0" r="0" b="9525"/>
-            <wp:docPr id="6" name="Picture 6"/>
+          <wp:inline distT="0" distB="0" distL="0" distR="0" wp14:anchorId="60008CDA" wp14:editId="7F186DBB">
+            <wp:extent cx="6215482" cy="5868035"/>
+            <wp:effectExtent l="0" t="0" r="0" b="0"/>
+            <wp:docPr id="13" name="Picture 13"/>
             <wp:cNvGraphicFramePr>
               <a:graphicFrameLocks xmlns:a="http://schemas.openxmlformats.org/drawingml/2006/main" noChangeAspect="1"/>
             </wp:cNvGraphicFramePr>
@@ -13281,7 +13350,7 @@
                   <pic:spPr>
                     <a:xfrm>
                       <a:off x="0" y="0"/>
-                      <a:ext cx="5715000" cy="5114925"/>
+                      <a:ext cx="6242461" cy="5893506"/>
                     </a:xfrm>
                     <a:prstGeom prst="rect">
                       <a:avLst/>
@@ -13310,90 +13379,66 @@
       </w:r>
     </w:p>
     <w:p>
-      <w:pPr>
-        <w:rPr>
-          <w:b/>
-        </w:rPr>
-      </w:pPr>
-      <w:r>
-        <w:t>Now looking at Figure 3.5, you can see how this whole flow fits together. The process actually kicks off in a few different ways</w:t>
-      </w:r>
-      <w:r>
-        <w:t xml:space="preserve"> </w:t>
-      </w:r>
-      <w:r>
-        <w:t xml:space="preserve">either a user submits text or a file manually, or it runs automatically in the background while they type, thanks to a keystroke triggered analyzer that’s debounced to 1 second. If they upload a file, the system reads it locally with the File API, which handles .docx, .pdf, .txt, and .md formats. Once we actually have the raw text, it checks the word count. If there are fewer than 10 words, it just stops and throws a minimum word </w:t>
+      <w:r>
+        <w:t xml:space="preserve">In Figure 3.5, The process can actually start in a few different ways; either the user manually either gives me either the file or the input text, or something kind of happening in the background that is triggered via my keystroke listener which is actually bounced to 1 second. If we take a File that the user uploads, that gets brought into the client through the File API in the browser; the browser knows how to read through dot X, dot PDF, dot TXT and dot M D files and we just bring that local raw text into the system, figure out how many words that we </w:t>
       </w:r>
       <w:r>
         <w:lastRenderedPageBreak/>
-        <w:t xml:space="preserve">count warning. Otherwise, it tokenizes the text into sentences and words. These tokens get handed out to the six core classification engines and the one grammar calibration module, which means they go to the PerplexityAnalyzer, KNNClassifier, </w:t>
+        <w:t xml:space="preserve">have here, if its less than ten words we just stop and warning up that there’s a minimum of word count, otherwise take those words break them into our sentences as our tokens and words then I pass it onto the various different six core </w:t>
       </w:r>
       <w:proofErr w:type="spellStart"/>
       <w:r>
-        <w:t>CosineSimilarityAnalyzer</w:t>
+        <w:t>classifyer</w:t>
       </w:r>
       <w:proofErr w:type="spellEnd"/>
       <w:r>
-        <w:t xml:space="preserve">, </w:t>
+        <w:t xml:space="preserve"> engines that we have, as well as one additional engine called </w:t>
       </w:r>
       <w:proofErr w:type="spellStart"/>
       <w:r>
-        <w:t>LogisticRegressionClassifier</w:t>
+        <w:t>GrammarCalibration</w:t>
       </w:r>
       <w:proofErr w:type="spellEnd"/>
       <w:r>
-        <w:t xml:space="preserve">, </w:t>
+        <w:t xml:space="preserve">. </w:t>
+      </w:r>
+      <w:proofErr w:type="gramStart"/>
+      <w:r>
+        <w:t>So</w:t>
+      </w:r>
+      <w:proofErr w:type="gramEnd"/>
+      <w:r>
+        <w:t xml:space="preserve"> they will take those same tokens and send them to six classifiers and one grammar calibration mechanism and they will all send back there prediction with a score . </w:t>
       </w:r>
       <w:proofErr w:type="spellStart"/>
       <w:r>
-        <w:t>TrigramAnalyzer</w:t>
+        <w:t>Myensemblecontroller</w:t>
       </w:r>
       <w:proofErr w:type="spellEnd"/>
       <w:r>
-        <w:t xml:space="preserve">, </w:t>
+        <w:t xml:space="preserve"> takes those six predictions and sends me back a weighted sum; the six classifier predictions are sent back and now the </w:t>
       </w:r>
       <w:proofErr w:type="spellStart"/>
       <w:r>
-        <w:t>PosClassifier</w:t>
+        <w:t>Grammerperfections</w:t>
       </w:r>
       <w:proofErr w:type="spellEnd"/>
       <w:r>
-        <w:t xml:space="preserve">, and </w:t>
-      </w:r>
-      <w:proofErr w:type="spellStart"/>
-      <w:r>
-        <w:t>GrammarAnalyzer</w:t>
-      </w:r>
-      <w:proofErr w:type="spellEnd"/>
-      <w:r>
-        <w:t xml:space="preserve">. Every single engine </w:t>
-      </w:r>
-      <w:proofErr w:type="gramStart"/>
-      <w:r>
-        <w:t>shoots</w:t>
-      </w:r>
-      <w:proofErr w:type="gramEnd"/>
-      <w:r>
-        <w:t xml:space="preserve"> back its own probability score. The ensemble controller then steps in to combine the six classifier scores using a weighted sum, before applying that Grammar Perfection Score as a discount. Put simply, the final calibrated probability goes through </w:t>
-      </w:r>
-      <w:proofErr w:type="spellStart"/>
-      <w:r>
-        <w:t>ChartRenderer</w:t>
-      </w:r>
-      <w:proofErr w:type="spellEnd"/>
-      <w:r>
-        <w:t xml:space="preserve"> to create the SVG gauge, scatter plot, and radar web. To wrap it all up, it builds and displays the sentence heatmap.</w:t>
+        <w:t xml:space="preserve"> Score will discount down some of those overall percentages. Bottom line is the scaled probability can be sent over to my Chart renderer and go out and print me out that Gauge, scatter diagram, and spider chart. Ultimately building out a heatmap for a particular sentence that may have come in</w:t>
+      </w:r>
+      <w:r>
+        <w:t>.</w:t>
       </w:r>
     </w:p>
     <w:p>
       <w:pPr>
         <w:pStyle w:val="Heading3"/>
       </w:pPr>
-      <w:bookmarkStart w:id="35" w:name="_Toc237559732"/>
+      <w:bookmarkStart w:id="34" w:name="_Toc237559732"/>
       <w:r>
         <w:t>3.1.5 Process Modelling Using Activity Diagrams</w:t>
       </w:r>
-      <w:bookmarkEnd w:id="35"/>
+      <w:bookmarkEnd w:id="34"/>
     </w:p>
     <w:p>
       <w:r>
@@ -13472,23 +13517,27 @@
     </w:p>
     <w:p>
       <w:r>
-        <w:t>In Figure 3.6, you get a closer look at this workflow. The whole thing begins with validating the text. If the count is under 10 words, the analysis just stops and gives a warning. Assuming it’s long enough, local tokenization happens next, and the session cache gets saved. Then the seven analysis engines</w:t>
-      </w:r>
-      <w:r>
-        <w:t xml:space="preserve"> </w:t>
-      </w:r>
-      <w:r>
-        <w:t>including Perplexity, KNN, Cosine Similarity, and Grammar Error</w:t>
-      </w:r>
-      <w:r>
-        <w:t xml:space="preserve"> </w:t>
-      </w:r>
-      <w:r>
-        <w:t xml:space="preserve">all run concurrently. The system takes their individual scores and aggregates them with a weighted </w:t>
+        <w:t xml:space="preserve">A closer view at how the whole thing works. A look on the figure 3.6 shows a bit how everything goes. To start with it, an analysis is made just by checking if text is valid with respect to number of words for which it should be analyzed. If words of the text </w:t>
+      </w:r>
+      <w:proofErr w:type="gramStart"/>
+      <w:r>
+        <w:t>is</w:t>
+      </w:r>
+      <w:proofErr w:type="gramEnd"/>
+      <w:r>
+        <w:t xml:space="preserve"> less </w:t>
+      </w:r>
+      <w:proofErr w:type="spellStart"/>
+      <w:r>
+        <w:t>then</w:t>
+      </w:r>
+      <w:proofErr w:type="spellEnd"/>
+      <w:r>
+        <w:t xml:space="preserve"> 10 words analysis comes to a halt and outputs a warning. If words count is greater than, analysis goes along. Tokenize locally will happen first, and the session gets save. At this point analysis </w:t>
       </w:r>
       <w:r>
         <w:lastRenderedPageBreak/>
-        <w:t xml:space="preserve">ensemble formula, and the Grammar Perfection Score is applied right after to calibrate the final probability. After that, the </w:t>
+        <w:t xml:space="preserve">goes concurrently for the 7 machines; Perplexity; KNN; Cosine Similarity; Grammar Errors, and so on. The values provided by the different 7 analyzers and combined by using a weighted-average and by applying Grammar Perfection Score for an automatic correction based on Grammar Errors Score. As last, </w:t>
       </w:r>
       <w:proofErr w:type="spellStart"/>
       <w:r>
@@ -13496,25 +13545,36 @@
       </w:r>
       <w:proofErr w:type="spellEnd"/>
       <w:r>
-        <w:t xml:space="preserve"> steps in to draw the SVG gauge, scatter plot, and radar web. The heatmap gets color mapped, the statistics are populated, and the dashboard finally shows the user the complete analysis results.</w:t>
+        <w:t xml:space="preserve"> comes into the play to create the graphic of the dashboard; SVG gauge, the scatter plot and the radar web, the map of heat colors, fill all fields with static texts, etc..</w:t>
+      </w:r>
+      <w:r>
+        <w:t>.</w:t>
       </w:r>
     </w:p>
     <w:p>
       <w:pPr>
         <w:pStyle w:val="Heading3"/>
       </w:pPr>
-      <w:bookmarkStart w:id="36" w:name="_Toc237559733"/>
+      <w:bookmarkStart w:id="35" w:name="_Toc237559733"/>
       <w:r>
         <w:t>3.1.6 Refinement of Class Diagram</w:t>
       </w:r>
-      <w:bookmarkEnd w:id="36"/>
-    </w:p>
-    <w:p>
-      <w:r>
-        <w:t>R</w:t>
-      </w:r>
-      <w:r>
-        <w:t>efining the initial class diagram so it could show the properties, methods, and communication lines between the different instances at runtime. This includes the controller, utility, machine learning ensemble, and database synchronization instances. Basically, this update connects the dots between the theoretical static structure and the actual runtime collaboration, so you can see exactly how live object instances talk to each other during a full text analysis cycle.</w:t>
+      <w:bookmarkEnd w:id="35"/>
+    </w:p>
+    <w:p>
+      <w:r>
+        <w:t xml:space="preserve">The modification of the </w:t>
+      </w:r>
+      <w:proofErr w:type="gramStart"/>
+      <w:r>
+        <w:t>first class</w:t>
+      </w:r>
+      <w:proofErr w:type="gramEnd"/>
+      <w:r>
+        <w:t xml:space="preserve"> diagram to display the properties, the methods and the communication paths between the individual instances during the run time of the process. Those instances are: the controller, the utility class instance and the machine learning ensemble and database synchronization instance. In essence this modification closes the gap between the "what is" static structure and the "how do they live" real world working of the object instances</w:t>
+      </w:r>
+      <w:r>
+        <w:t>.</w:t>
       </w:r>
     </w:p>
     <w:p>
@@ -13522,14 +13582,11 @@
         <w:jc w:val="center"/>
       </w:pPr>
       <w:r>
-        <w:rPr>
-          <w:noProof/>
-        </w:rPr>
         <w:drawing>
-          <wp:inline distT="0" distB="0" distL="0" distR="0" wp14:anchorId="6811B4BD" wp14:editId="721BEF63">
-            <wp:extent cx="5715000" cy="4201160"/>
-            <wp:effectExtent l="0" t="0" r="0" b="8890"/>
-            <wp:docPr id="3" name="Picture 3"/>
+          <wp:inline distT="0" distB="0" distL="0" distR="0" wp14:anchorId="61962BB2" wp14:editId="06959EFA">
+            <wp:extent cx="5908462" cy="3944203"/>
+            <wp:effectExtent l="0" t="0" r="0" b="0"/>
+            <wp:docPr id="5" name="Picture 5"/>
             <wp:cNvGraphicFramePr>
               <a:graphicFrameLocks xmlns:a="http://schemas.openxmlformats.org/drawingml/2006/main" noChangeAspect="1"/>
             </wp:cNvGraphicFramePr>
@@ -13549,7 +13606,7 @@
                   <pic:spPr>
                     <a:xfrm>
                       <a:off x="0" y="0"/>
-                      <a:ext cx="5727623" cy="4210439"/>
+                      <a:ext cx="5957177" cy="3976723"/>
                     </a:xfrm>
                     <a:prstGeom prst="rect">
                       <a:avLst/>
@@ -13570,31 +13627,30 @@
         <w:t>Figure 3.7: Refined Object and Collaboration Diagram for AI Text Detector</w:t>
       </w:r>
     </w:p>
-    <w:p/>
     <w:p>
       <w:pPr>
         <w:pStyle w:val="Heading2"/>
       </w:pPr>
-      <w:bookmarkStart w:id="37" w:name="_Toc237559734"/>
+      <w:bookmarkStart w:id="36" w:name="_Toc237559734"/>
       <w:r>
         <w:lastRenderedPageBreak/>
         <w:t>3.2 System Design</w:t>
       </w:r>
+      <w:bookmarkEnd w:id="36"/>
+    </w:p>
+    <w:p>
+      <w:pPr>
+        <w:pStyle w:val="Heading3"/>
+      </w:pPr>
+      <w:bookmarkStart w:id="37" w:name="_Toc237559735"/>
+      <w:r>
+        <w:t>3.2.1 Component Diagram</w:t>
+      </w:r>
       <w:bookmarkEnd w:id="37"/>
     </w:p>
     <w:p>
-      <w:pPr>
-        <w:pStyle w:val="Heading3"/>
-      </w:pPr>
-      <w:bookmarkStart w:id="38" w:name="_Toc237559735"/>
-      <w:r>
-        <w:t>3.2.1 Component Diagram</w:t>
-      </w:r>
-      <w:bookmarkEnd w:id="38"/>
-    </w:p>
-    <w:p>
-      <w:r>
-        <w:t xml:space="preserve">Looking at the component diagram, you can see the modular architecture of the AI Text Detector. The HTML5 dashboard acts as the main user interface, and it talks directly to the app.js controller. This controller is in charge of coordinating a few different things, like the FileParser class (which actually references the PDF.js and Mammoth.js libraries), as well as the PerplexityAnalyzer, the KNNClassifier, and the </w:t>
+      <w:r>
+        <w:t xml:space="preserve">In the component diagram, it shows us the modularity in which the AI Text Detector is built in. The HTML5 dashboard serves as the user interface and communicates directly with the app.js controller, which handles some of the basic elements. This controller makes use of the FileParser class (which directly uses PDF.js and Mammoth.js, on the hand), the PerplexityAnalyzer, the KNNClassifier and the </w:t>
       </w:r>
       <w:proofErr w:type="spellStart"/>
       <w:r>
@@ -13602,7 +13658,15 @@
       </w:r>
       <w:proofErr w:type="spellEnd"/>
       <w:r>
-        <w:t xml:space="preserve">. Every result from those engines gets channeled straight through the </w:t>
+        <w:t xml:space="preserve"> to determine what the score for each element are. All the output of these engines </w:t>
+      </w:r>
+      <w:proofErr w:type="gramStart"/>
+      <w:r>
+        <w:t>are</w:t>
+      </w:r>
+      <w:proofErr w:type="gramEnd"/>
+      <w:r>
+        <w:t xml:space="preserve"> fed to </w:t>
       </w:r>
       <w:proofErr w:type="spellStart"/>
       <w:r>
@@ -13610,7 +13674,7 @@
       </w:r>
       <w:proofErr w:type="spellEnd"/>
       <w:r>
-        <w:t xml:space="preserve"> component to generate the SVG visualizations. There’s also a lightweight Python backend running server.py that can optionally handle SQLite3 database persistence through a REST API. But if that’s not available, the </w:t>
+        <w:t xml:space="preserve"> to make some SVG outputs. Some python codes exist to allow persistence in SQLite3 with the use of REST API, in server.py. If it is not there, </w:t>
       </w:r>
       <w:proofErr w:type="spellStart"/>
       <w:r>
@@ -13618,7 +13682,10 @@
       </w:r>
       <w:proofErr w:type="spellEnd"/>
       <w:r>
-        <w:t xml:space="preserve"> API is right there to handle client-side fallback storage.</w:t>
+        <w:t xml:space="preserve"> API can be used as well to store the data in the client side</w:t>
+      </w:r>
+      <w:r>
+        <w:t>.</w:t>
       </w:r>
     </w:p>
     <w:p>
@@ -13679,44 +13746,64 @@
       <w:pPr>
         <w:pStyle w:val="Heading3"/>
       </w:pPr>
-      <w:bookmarkStart w:id="39" w:name="_Toc237559736"/>
+      <w:bookmarkStart w:id="38" w:name="_Toc237559736"/>
       <w:r>
         <w:lastRenderedPageBreak/>
         <w:t>3.2.2 Deployment Diagram</w:t>
       </w:r>
-      <w:bookmarkEnd w:id="39"/>
-    </w:p>
-    <w:p>
-      <w:r>
-        <w:t>Finally, the deployment diagram maps out the system’s execution model. The frontend part of the application</w:t>
-      </w:r>
-      <w:r>
-        <w:t xml:space="preserve"> </w:t>
-      </w:r>
-      <w:r>
-        <w:t>which includes the HTML5 dashboard, the JavaScript analysis engine, and the CSS3 styling</w:t>
-      </w:r>
-      <w:r>
-        <w:t xml:space="preserve"> </w:t>
-      </w:r>
-      <w:r>
-        <w:t xml:space="preserve">all runs client-side right inside the user’s browser sandbox. We also have an optional, lightweight Python HTTP server called server.py that runs on localhost:5000. It uses REST API endpoints to offer persistent SQLite3 database storage in </w:t>
+      <w:bookmarkEnd w:id="38"/>
+    </w:p>
+    <w:p>
+      <w:r>
+        <w:t xml:space="preserve">Lastly, the deployment diagram below shows how the application is intended to run. The front end of the </w:t>
       </w:r>
       <w:proofErr w:type="spellStart"/>
       <w:r>
+        <w:t>webapp</w:t>
+      </w:r>
+      <w:proofErr w:type="spellEnd"/>
+      <w:r>
+        <w:t xml:space="preserve"> with the HTML5dashboard, JS analyzer, CSS3 styles etc. All live on the user's web page, a closed and secure browser sandbox. On our side of things, there is an optional "very small" (about 50 lines of python, just for simplicity's sake) </w:t>
+      </w:r>
+      <w:proofErr w:type="spellStart"/>
+      <w:r>
+        <w:t>pythonHTTP</w:t>
+      </w:r>
+      <w:proofErr w:type="spellEnd"/>
+      <w:r>
+        <w:t xml:space="preserve"> server running on localhost:5000 on that computer itself that </w:t>
+      </w:r>
+      <w:proofErr w:type="spellStart"/>
+      <w:r>
+        <w:t>usesA</w:t>
+      </w:r>
+      <w:proofErr w:type="spellEnd"/>
+      <w:r>
+        <w:t xml:space="preserve"> persistent SQLite 3 database file (</w:t>
+      </w:r>
+      <w:proofErr w:type="spellStart"/>
+      <w:r>
         <w:t>sentinel.db</w:t>
       </w:r>
       <w:proofErr w:type="spellEnd"/>
       <w:r>
-        <w:t xml:space="preserve">, mostly for user accounts and their past analysis history. The cool thing is, if that Python server ever goes down or isn’t available, the app just automatically falls back to using the browser’s </w:t>
+        <w:t xml:space="preserve">) to keep track of some persistent data like our user's saved accounts and past history of our analyses, but this only stores what's strictly needed by users - and a neat piece is if the python server for whatever reason dies or is removed the app simply defaults </w:t>
       </w:r>
       <w:proofErr w:type="spellStart"/>
       <w:r>
+        <w:t>toUsing</w:t>
+      </w:r>
+      <w:proofErr w:type="spellEnd"/>
+      <w:r>
+        <w:t xml:space="preserve"> our good friend the </w:t>
+      </w:r>
+      <w:proofErr w:type="spellStart"/>
+      <w:r>
         <w:t>IndexedDB</w:t>
       </w:r>
       <w:proofErr w:type="spellEnd"/>
       <w:r>
-        <w:t xml:space="preserve"> named </w:t>
+        <w:t xml:space="preserve"> with name </w:t>
       </w:r>
       <w:proofErr w:type="spellStart"/>
       <w:r>
@@ -13724,7 +13811,10 @@
       </w:r>
       <w:proofErr w:type="spellEnd"/>
       <w:r>
-        <w:t>, which means the whole thing can still run perfectly fine offline.</w:t>
+        <w:t xml:space="preserve"> inside the browser, and still works flawlessly.</w:t>
+      </w:r>
+      <w:r>
+        <w:t>.</w:t>
       </w:r>
     </w:p>
     <w:p>
@@ -13800,32 +13890,40 @@
       <w:pPr>
         <w:pStyle w:val="Heading2"/>
       </w:pPr>
-      <w:bookmarkStart w:id="40" w:name="_Toc237559737"/>
+      <w:bookmarkStart w:id="39" w:name="_Toc237559737"/>
       <w:r>
         <w:lastRenderedPageBreak/>
         <w:t>3.3 Algorithm Details</w:t>
       </w:r>
+      <w:bookmarkEnd w:id="39"/>
+    </w:p>
+    <w:p>
+      <w:pPr>
+        <w:pStyle w:val="Heading3"/>
+        <w:rPr>
+          <w:bCs/>
+        </w:rPr>
+      </w:pPr>
+      <w:bookmarkStart w:id="40" w:name="_Toc237559738"/>
+      <w:r>
+        <w:t>3.3.1 Statistical NLP Algorithm (Perplexity &amp; Burstiness)</w:t>
+      </w:r>
       <w:bookmarkEnd w:id="40"/>
     </w:p>
     <w:p>
       <w:pPr>
-        <w:pStyle w:val="Heading3"/>
-        <w:rPr>
-          <w:bCs/>
-        </w:rPr>
-      </w:pPr>
-      <w:bookmarkStart w:id="41" w:name="_Toc237559738"/>
-      <w:r>
-        <w:t>3.3.1 Statistical NLP Algorithm (Perplexity &amp; Burstiness)</w:t>
-      </w:r>
-      <w:bookmarkEnd w:id="41"/>
-    </w:p>
-    <w:p>
-      <w:pPr>
         <w:spacing w:after="0"/>
       </w:pPr>
       <w:r>
-        <w:t>So basically, the Statistical NLP Algorithm looks at basic linguistic statistics of the text to identify machine generated patterns. Because Large Language Models generate text by predicting the next most likely token, they tend to spit out really uniform sentence structures and vocabulary repetition. This engine measures sentence length variance, Type Token Ratio, and bigram predictability to estimate how closely a document’s writing patterns resemble AI generated text.</w:t>
+        <w:t xml:space="preserve">In a nuts hell the Statistical NLP algorithm analyzes the </w:t>
+      </w:r>
+      <w:proofErr w:type="gramStart"/>
+      <w:r>
+        <w:t>low level</w:t>
+      </w:r>
+      <w:proofErr w:type="gramEnd"/>
+      <w:r>
+        <w:t xml:space="preserve"> linguistic statistics of a document and recognizes machine generated structures. Since Large Language Models generate text by predicting what the next token is statistically likely to be, they end up producing very predictable sentences that rely a lot on repeating the same kinds of phrases and words. This engine analyzes the variance in sentence length, TTR, and bigram predictability of a given document to determine the likelihood that it is machine generated.</w:t>
       </w:r>
     </w:p>
     <w:p>
@@ -13833,7 +13931,10 @@
         <w:spacing w:after="0"/>
       </w:pPr>
       <w:r>
-        <w:t>The analysis runs locally. First, the system tokenizes the text into sentences and words. Then it computes average sentence length and evaluates sentence length variance. It also calculates TTR, which is just the ratio of unique words to total words. The cool thing is that it penalizes predictable vocabulary using a database of common bigrams and transition words.</w:t>
+        <w:t>This process is run entirely on the machine of the user. It first tokenizes the text, splits it into sentences, and splits the sentences into words. The first statistical analysis that is done is the average sentence length and the sentence length variance. It is also calculating TTR, which is just a measure of unique words divided by the number of words in the document. The smart idea in the engine is the addition of a bigram and transition words database which can penalize for the predictability of word choices</w:t>
+      </w:r>
+      <w:r>
+        <w:t>.</w:t>
       </w:r>
     </w:p>
     <w:p>
@@ -14456,6 +14557,7 @@
               <w:rPr>
                 <w:sz w:val="18"/>
               </w:rPr>
+              <w:lastRenderedPageBreak/>
               <w:t xml:space="preserve">16:      </w:t>
             </w:r>
             <w:proofErr w:type="spellStart"/>
@@ -14587,7 +14689,6 @@
               <w:rPr>
                 <w:sz w:val="18"/>
               </w:rPr>
-              <w:lastRenderedPageBreak/>
               <w:t xml:space="preserve">19:      </w:t>
             </w:r>
             <w:r>
@@ -14636,7 +14737,7 @@
           <w:szCs w:val="24"/>
         </w:rPr>
       </w:pPr>
-      <w:bookmarkStart w:id="42" w:name="_Toc237559739"/>
+      <w:bookmarkStart w:id="41" w:name="_Toc237559739"/>
     </w:p>
     <w:p>
       <w:pPr>
@@ -14645,30 +14746,14 @@
       <w:r>
         <w:t>3.3.2 KNN Classifier</w:t>
       </w:r>
-      <w:bookmarkEnd w:id="42"/>
-    </w:p>
-    <w:p>
-      <w:pPr>
-        <w:spacing w:after="0"/>
-      </w:pPr>
-      <w:r>
-        <w:t xml:space="preserve">Now for the K Nearest Neighbors Classifier, it maps the document’s syntactic features right into a </w:t>
-      </w:r>
-      <w:proofErr w:type="gramStart"/>
-      <w:r>
-        <w:t>5 dimensional</w:t>
-      </w:r>
-      <w:proofErr w:type="gramEnd"/>
-      <w:r>
-        <w:t xml:space="preserve"> feature space. This basically means comparing the document vector against a </w:t>
-      </w:r>
-      <w:proofErr w:type="gramStart"/>
-      <w:r>
-        <w:t>pre curated</w:t>
-      </w:r>
-      <w:proofErr w:type="gramEnd"/>
-      <w:r>
-        <w:t xml:space="preserve"> training set of human and AI articles. The 5 extracted features are:</w:t>
+      <w:bookmarkEnd w:id="41"/>
+    </w:p>
+    <w:p>
+      <w:r>
+        <w:t>Next, with the K Nearest Neighbors Classifier, it translates the syntactic characteristics of the document into 5-dimensional feature space- it really just means the document is compared to a human/AI pre- compiled training set. The 5 features used are</w:t>
+      </w:r>
+      <w:r>
+        <w:t>:</w:t>
       </w:r>
     </w:p>
     <w:p>
@@ -14676,18 +14761,11 @@
         <w:pStyle w:val="ListParagraph"/>
         <w:numPr>
           <w:ilvl w:val="0"/>
-          <w:numId w:val="8"/>
+          <w:numId w:val="24"/>
         </w:numPr>
-        <w:spacing w:after="0"/>
-      </w:pPr>
-      <w:r>
-        <w:t>Lexical Diversity: Type</w:t>
-      </w:r>
-      <w:r>
-        <w:t xml:space="preserve"> </w:t>
-      </w:r>
-      <w:r>
-        <w:t>Token Ratio normalized against document length.</w:t>
+      </w:pPr>
+      <w:r>
+        <w:t>Lexical Diversity: The Type Token Ratio normalized with the length of the document.</w:t>
       </w:r>
     </w:p>
     <w:p>
@@ -14695,18 +14773,11 @@
         <w:pStyle w:val="ListParagraph"/>
         <w:numPr>
           <w:ilvl w:val="0"/>
-          <w:numId w:val="8"/>
+          <w:numId w:val="24"/>
         </w:numPr>
-        <w:spacing w:after="0"/>
-      </w:pPr>
-      <w:r>
-        <w:t>Sentence Length Uniformity: Sentence length standard deviation mapped to a 0</w:t>
-      </w:r>
-      <w:r>
-        <w:t xml:space="preserve"> </w:t>
-      </w:r>
-      <w:r>
-        <w:t>1 scale.</w:t>
+      </w:pPr>
+      <w:r>
+        <w:t>Sentence Length Uniformity: The standard deviation of sentence length mapped to a 0-1 scale.</w:t>
       </w:r>
     </w:p>
     <w:p>
@@ -14714,12 +14785,11 @@
         <w:pStyle w:val="ListParagraph"/>
         <w:numPr>
           <w:ilvl w:val="0"/>
-          <w:numId w:val="8"/>
+          <w:numId w:val="24"/>
         </w:numPr>
-        <w:spacing w:after="0"/>
-      </w:pPr>
-      <w:r>
-        <w:t>AI Word Density: Frequency of transitional keywords favored by language models.</w:t>
+      </w:pPr>
+      <w:r>
+        <w:t>AI Word Density: The quantity of transitional words typically chosen by language models.</w:t>
       </w:r>
     </w:p>
     <w:p>
@@ -14727,15 +14797,11 @@
         <w:pStyle w:val="ListParagraph"/>
         <w:numPr>
           <w:ilvl w:val="0"/>
-          <w:numId w:val="8"/>
+          <w:numId w:val="24"/>
         </w:numPr>
-        <w:spacing w:after="0"/>
-      </w:pPr>
-      <w:r>
-        <w:t>Readability Index Consistency: The Coleman</w:t>
-      </w:r>
-      <w:r>
-        <w:t xml:space="preserve"> </w:t>
+      </w:pPr>
+      <w:r>
+        <w:t xml:space="preserve">Readability Index Consistency: The Coleman </w:t>
       </w:r>
       <w:proofErr w:type="spellStart"/>
       <w:r>
@@ -14743,7 +14809,7 @@
       </w:r>
       <w:proofErr w:type="spellEnd"/>
       <w:r>
-        <w:t xml:space="preserve"> Readability Index normalized against grade 13.</w:t>
+        <w:t xml:space="preserve"> Readability Index normalized to grade 13.</w:t>
       </w:r>
     </w:p>
     <w:p>
@@ -14751,12 +14817,11 @@
         <w:pStyle w:val="ListParagraph"/>
         <w:numPr>
           <w:ilvl w:val="0"/>
-          <w:numId w:val="8"/>
+          <w:numId w:val="24"/>
         </w:numPr>
-        <w:spacing w:after="0"/>
-      </w:pPr>
-      <w:r>
-        <w:t>Punctuation Density: Density of punctuation marks per 100 words normalized against standard student writing.</w:t>
+      </w:pPr>
+      <w:r>
+        <w:t>Punctuation Density: The density of punctuation markers per 100 words normalized with respect to typical student writing.</w:t>
       </w:r>
     </w:p>
     <w:p>
@@ -14846,6 +14911,7 @@
                 </m:ctrlPr>
               </m:naryPr>
               <m:sub>
+                <w:proofErr w:type="spellStart"/>
                 <m:r>
                   <m:rPr>
                     <m:nor/>
@@ -14853,7 +14919,17 @@
                   <w:rPr>
                     <w:rFonts w:ascii="Cambria Math" w:hAnsi="Cambria Math"/>
                   </w:rPr>
-                  <m:t>i=1</m:t>
+                  <m:t>i</m:t>
+                </m:r>
+                <w:proofErr w:type="spellEnd"/>
+                <m:r>
+                  <m:rPr>
+                    <m:nor/>
+                  </m:rPr>
+                  <w:rPr>
+                    <w:rFonts w:ascii="Cambria Math" w:hAnsi="Cambria Math"/>
+                  </w:rPr>
+                  <m:t>=1</m:t>
                 </m:r>
               </m:sub>
               <m:sup>
@@ -15237,6 +15313,7 @@
               <w:rPr>
                 <w:sz w:val="18"/>
               </w:rPr>
+              <w:lastRenderedPageBreak/>
               <w:t xml:space="preserve"> 5:      f2 &lt;- clamp((</w:t>
             </w:r>
             <w:proofErr w:type="spellStart"/>
@@ -15383,7 +15460,6 @@
               <w:rPr>
                 <w:sz w:val="18"/>
               </w:rPr>
-              <w:lastRenderedPageBreak/>
               <w:t xml:space="preserve">12:          </w:t>
             </w:r>
             <w:proofErr w:type="spellStart"/>
@@ -15603,16 +15679,22 @@
       <w:pPr>
         <w:pStyle w:val="Heading3"/>
       </w:pPr>
-      <w:bookmarkStart w:id="43" w:name="_Toc237559740"/>
+      <w:bookmarkStart w:id="42" w:name="_Toc237559740"/>
     </w:p>
     <w:p>
       <w:pPr>
         <w:pStyle w:val="Heading3"/>
       </w:pPr>
       <w:r>
-        <w:t>3.3.3 Cosine Similarity (Vector Space Model)</w:t>
-      </w:r>
-      <w:bookmarkEnd w:id="43"/>
+        <w:t>3.3.3 Cosine Similarity (Vector</w:t>
+      </w:r>
+      <w:r>
+        <w:t xml:space="preserve"> </w:t>
+      </w:r>
+      <w:r>
+        <w:t xml:space="preserve"> Space Model)</w:t>
+      </w:r>
+      <w:bookmarkEnd w:id="42"/>
     </w:p>
     <w:p>
       <w:pPr>
@@ -16606,7 +16688,6 @@
                 <w:b/>
                 <w:sz w:val="21"/>
               </w:rPr>
-              <w:lastRenderedPageBreak/>
               <w:t>Algorithm 3: Stylometric Cosine Similarity Analysis</w:t>
             </w:r>
           </w:p>
@@ -17090,7 +17171,7 @@
           <w:szCs w:val="24"/>
         </w:rPr>
       </w:pPr>
-      <w:bookmarkStart w:id="44" w:name="_Toc237559741"/>
+      <w:bookmarkStart w:id="43" w:name="_Toc237559741"/>
     </w:p>
     <w:p>
       <w:pPr>
@@ -17099,7 +17180,7 @@
       <w:r>
         <w:t>3.3.4 Stylometric Logistic Regression Classifier</w:t>
       </w:r>
-      <w:bookmarkEnd w:id="44"/>
+      <w:bookmarkEnd w:id="43"/>
     </w:p>
     <w:p>
       <w:r>
@@ -17440,6 +17521,7 @@
                 <w:b/>
                 <w:sz w:val="21"/>
               </w:rPr>
+              <w:lastRenderedPageBreak/>
               <w:t>Algorithm 4: Binary Logistic Regression Classifier</w:t>
             </w:r>
           </w:p>
@@ -17566,7 +17648,6 @@
               <w:rPr>
                 <w:sz w:val="18"/>
               </w:rPr>
-              <w:lastRenderedPageBreak/>
               <w:t xml:space="preserve"> 5:      </w:t>
             </w:r>
             <w:r>
@@ -17713,11 +17794,11 @@
       <w:pPr>
         <w:pStyle w:val="Heading3"/>
       </w:pPr>
-      <w:bookmarkStart w:id="45" w:name="_Toc237559742"/>
+      <w:bookmarkStart w:id="44" w:name="_Toc237559742"/>
       <w:r>
         <w:t>3.3.5 Character Trigram Cosine Similarity</w:t>
       </w:r>
-      <w:bookmarkEnd w:id="45"/>
+      <w:bookmarkEnd w:id="44"/>
     </w:p>
     <w:p>
       <w:r>
@@ -18458,6 +18539,7 @@
               <w:rPr>
                 <w:sz w:val="18"/>
               </w:rPr>
+              <w:lastRenderedPageBreak/>
               <w:t xml:space="preserve">11:          </w:t>
             </w:r>
             <w:proofErr w:type="spellStart"/>
@@ -18749,12 +18831,12 @@
       <w:pPr>
         <w:pStyle w:val="Heading3"/>
       </w:pPr>
-      <w:bookmarkStart w:id="46" w:name="_Toc237559743"/>
+      <w:bookmarkStart w:id="45" w:name="_Toc237559743"/>
       <w:r>
         <w:lastRenderedPageBreak/>
         <w:t>3.3.6 POS Syntax Ratio Cosine Similarity</w:t>
       </w:r>
-      <w:bookmarkEnd w:id="46"/>
+      <w:bookmarkEnd w:id="45"/>
     </w:p>
     <w:p>
       <w:proofErr w:type="gramStart"/>
@@ -19526,22 +19608,19 @@
       <w:pPr>
         <w:pStyle w:val="Heading3"/>
       </w:pPr>
-      <w:bookmarkStart w:id="47" w:name="_Toc237559744"/>
-      <w:r>
+      <w:bookmarkStart w:id="46" w:name="_Toc237559744"/>
+      <w:r>
+        <w:lastRenderedPageBreak/>
         <w:t>3.3.7 Heuristic Grammar &amp; Typography Analyzer</w:t>
       </w:r>
-      <w:bookmarkEnd w:id="47"/>
+      <w:bookmarkEnd w:id="46"/>
     </w:p>
     <w:p>
       <w:pPr>
         <w:spacing w:after="0"/>
       </w:pPr>
       <w:r>
-        <w:t xml:space="preserve">The Heuristic Grammar &amp; Typography Analyzer evaluates the input text for common grammatical slips, capitalization errors, double negatives, punctuation spacing issues, and duplicate words. Since Large Language Models are trained on massive corpuses and usually </w:t>
-      </w:r>
-      <w:r>
-        <w:lastRenderedPageBreak/>
-        <w:t>output grammatically flawless text, these typographic errors and grammar mistakes become a strong inverse indicator of machine authorship.</w:t>
+        <w:t>The Heuristic Grammar &amp; Typography Analyzer evaluates the input text for common grammatical slips, capitalization errors, double negatives, punctuation spacing issues, and duplicate words. Since Large Language Models are trained on massive corpuses and usually output grammatically flawless text, these typographic errors and grammar mistakes become a strong inverse indicator of machine authorship.</w:t>
       </w:r>
     </w:p>
     <w:p>
@@ -20567,11 +20646,11 @@
       <w:pPr>
         <w:pStyle w:val="Heading3"/>
       </w:pPr>
-      <w:bookmarkStart w:id="48" w:name="_Toc237559745"/>
+      <w:bookmarkStart w:id="47" w:name="_Toc237559745"/>
       <w:r>
         <w:t>3.3.8 Ensemble Scoring &amp; Grammar Calibration</w:t>
       </w:r>
-      <w:bookmarkEnd w:id="48"/>
+      <w:bookmarkEnd w:id="47"/>
     </w:p>
     <w:p>
       <w:pPr>
@@ -20583,7 +20662,11 @@
         <w:spacing w:after="0"/>
       </w:pPr>
       <w:r>
-        <w:t>The final AI probability verdict is calculated by compiling the weighted outputs of the six core algorithms. These are 25% Logistic Regression, 25% Character Trigram Similarity, 20% KNN Classifier, 15% POS Syntax Ratios, 10% Cosine Similarity, and 5% Perplexity. After that, we calibrate the result using the Grammar Perfection Score as a discount multiplier.</w:t>
+        <w:t xml:space="preserve">The final AI probability verdict is calculated by compiling the weighted outputs of the six core algorithms. These are 25% Logistic Regression, 25% Character Trigram Similarity, 20% KNN Classifier, 15% POS Syntax Ratios, 10% Cosine Similarity, and 5% Perplexity. </w:t>
+      </w:r>
+      <w:r>
+        <w:lastRenderedPageBreak/>
+        <w:t>After that, we calibrate the result using the Grammar Perfection Score as a discount multiplier.</w:t>
       </w:r>
     </w:p>
     <w:p>
@@ -20704,7 +20787,6 @@
         </w:numPr>
       </w:pPr>
       <w:r>
-        <w:lastRenderedPageBreak/>
         <w:t>Score &gt; 65%: AI</w:t>
       </w:r>
       <w:r>
@@ -21306,60 +21388,60 @@
       <w:pPr>
         <w:pStyle w:val="Heading1"/>
       </w:pPr>
-      <w:bookmarkStart w:id="49" w:name="_Toc237559746"/>
+      <w:bookmarkStart w:id="48" w:name="_Toc237559746"/>
       <w:r>
         <w:lastRenderedPageBreak/>
         <w:t>CHAPTER 4</w:t>
       </w:r>
+      <w:bookmarkEnd w:id="48"/>
+      <w:r>
+        <w:t xml:space="preserve"> </w:t>
+      </w:r>
+    </w:p>
+    <w:p>
+      <w:pPr>
+        <w:pStyle w:val="Heading1"/>
+      </w:pPr>
+      <w:bookmarkStart w:id="49" w:name="_Toc237559747"/>
+      <w:r>
+        <w:t>IMPLEMENTATION AND TESTING</w:t>
+      </w:r>
       <w:bookmarkEnd w:id="49"/>
       <w:r>
-        <w:t xml:space="preserve"> </w:t>
-      </w:r>
-    </w:p>
-    <w:p>
-      <w:pPr>
-        <w:pStyle w:val="Heading1"/>
-      </w:pPr>
-      <w:bookmarkStart w:id="50" w:name="_Toc237559747"/>
-      <w:r>
-        <w:t>IMPLEMENTATION AND TESTING</w:t>
+        <w:t xml:space="preserve">  </w:t>
+      </w:r>
+    </w:p>
+    <w:p>
+      <w:pPr>
+        <w:pStyle w:val="Heading2"/>
+      </w:pPr>
+      <w:bookmarkStart w:id="50" w:name="_Toc237559748"/>
+      <w:r>
+        <w:t xml:space="preserve">4.1 </w:t>
+      </w:r>
+      <w:r>
+        <w:t>Implementation</w:t>
       </w:r>
       <w:bookmarkEnd w:id="50"/>
-      <w:r>
-        <w:t xml:space="preserve">  </w:t>
-      </w:r>
-    </w:p>
-    <w:p>
-      <w:pPr>
-        <w:pStyle w:val="Heading2"/>
-      </w:pPr>
-      <w:bookmarkStart w:id="51" w:name="_Toc237559748"/>
-      <w:r>
-        <w:t xml:space="preserve">4.1 </w:t>
-      </w:r>
-      <w:r>
-        <w:t>Implementation</w:t>
+    </w:p>
+    <w:p>
+      <w:pPr>
+        <w:pStyle w:val="Heading3"/>
+        <w:rPr>
+          <w:bCs/>
+        </w:rPr>
+      </w:pPr>
+      <w:bookmarkStart w:id="51" w:name="_Toc237559749"/>
+      <w:r>
+        <w:t xml:space="preserve">4.1.1 </w:t>
+      </w:r>
+      <w:r>
+        <w:rPr>
+          <w:bCs/>
+        </w:rPr>
+        <w:t>Tools Used</w:t>
       </w:r>
       <w:bookmarkEnd w:id="51"/>
-    </w:p>
-    <w:p>
-      <w:pPr>
-        <w:pStyle w:val="Heading3"/>
-        <w:rPr>
-          <w:bCs/>
-        </w:rPr>
-      </w:pPr>
-      <w:bookmarkStart w:id="52" w:name="_Toc237559749"/>
-      <w:r>
-        <w:t xml:space="preserve">4.1.1 </w:t>
-      </w:r>
-      <w:r>
-        <w:rPr>
-          <w:bCs/>
-        </w:rPr>
-        <w:t>Tools Used</w:t>
-      </w:r>
-      <w:bookmarkEnd w:id="52"/>
     </w:p>
     <w:p>
       <w:r>
@@ -21531,52 +21613,52 @@
       <w:pPr>
         <w:pStyle w:val="Heading2"/>
       </w:pPr>
-      <w:bookmarkStart w:id="53" w:name="_Toc237559750"/>
+      <w:bookmarkStart w:id="52" w:name="_Toc237559750"/>
       <w:r>
         <w:lastRenderedPageBreak/>
         <w:t>4.1.2 Module Implementation Details</w:t>
       </w:r>
+      <w:bookmarkEnd w:id="52"/>
+    </w:p>
+    <w:p>
+      <w:r>
+        <w:t xml:space="preserve">So, here are the main </w:t>
+      </w:r>
+      <w:proofErr w:type="gramStart"/>
+      <w:r>
+        <w:t>client side</w:t>
+      </w:r>
+      <w:proofErr w:type="gramEnd"/>
+      <w:r>
+        <w:t xml:space="preserve"> modules we built for the AI Text Detector. Basically, we used standard HTML5 markup for the frontend interface and styled it using custom CSS3 Variables. </w:t>
+      </w:r>
+      <w:r>
+        <w:t xml:space="preserve">The </w:t>
+      </w:r>
+      <w:r>
+        <w:t>JavaScript logic</w:t>
+      </w:r>
+      <w:r>
+        <w:t xml:space="preserve"> is </w:t>
+      </w:r>
+      <w:proofErr w:type="spellStart"/>
+      <w:r>
+        <w:t>seperated</w:t>
+      </w:r>
+      <w:proofErr w:type="spellEnd"/>
+      <w:r>
+        <w:t xml:space="preserve"> into independent modules. This just makes the whole codebase much easier to maintain and build on later.</w:t>
+      </w:r>
+    </w:p>
+    <w:p>
+      <w:pPr>
+        <w:pStyle w:val="Heading3"/>
+      </w:pPr>
+      <w:bookmarkStart w:id="53" w:name="_Toc237559751"/>
+      <w:r>
+        <w:t>4.1.2.1 FileParser Module</w:t>
+      </w:r>
       <w:bookmarkEnd w:id="53"/>
-    </w:p>
-    <w:p>
-      <w:r>
-        <w:t xml:space="preserve">So, here are the main </w:t>
-      </w:r>
-      <w:proofErr w:type="gramStart"/>
-      <w:r>
-        <w:t>client side</w:t>
-      </w:r>
-      <w:proofErr w:type="gramEnd"/>
-      <w:r>
-        <w:t xml:space="preserve"> modules we built for the AI Text Detector. Basically, we used standard HTML5 markup for the frontend interface and styled it using custom CSS3 Variables. </w:t>
-      </w:r>
-      <w:r>
-        <w:t xml:space="preserve">The </w:t>
-      </w:r>
-      <w:r>
-        <w:t>JavaScript logic</w:t>
-      </w:r>
-      <w:r>
-        <w:t xml:space="preserve"> is </w:t>
-      </w:r>
-      <w:proofErr w:type="spellStart"/>
-      <w:r>
-        <w:t>seperated</w:t>
-      </w:r>
-      <w:proofErr w:type="spellEnd"/>
-      <w:r>
-        <w:t xml:space="preserve"> into independent modules. This just makes the whole codebase much easier to maintain and build on later.</w:t>
-      </w:r>
-    </w:p>
-    <w:p>
-      <w:pPr>
-        <w:pStyle w:val="Heading3"/>
-      </w:pPr>
-      <w:bookmarkStart w:id="54" w:name="_Toc237559751"/>
-      <w:r>
-        <w:t>4.1.2.1 FileParser Module</w:t>
-      </w:r>
-      <w:bookmarkEnd w:id="54"/>
     </w:p>
     <w:p>
       <w:r>
@@ -22062,11 +22144,11 @@
       <w:pPr>
         <w:pStyle w:val="Heading3"/>
       </w:pPr>
-      <w:bookmarkStart w:id="55" w:name="_Toc237559752"/>
+      <w:bookmarkStart w:id="54" w:name="_Toc237559752"/>
       <w:r>
         <w:t>4.1.2.2 Perplexity &amp; Burstiness Module</w:t>
       </w:r>
-      <w:bookmarkEnd w:id="55"/>
+      <w:bookmarkEnd w:id="54"/>
     </w:p>
     <w:p>
       <w:r>
@@ -22477,11 +22559,11 @@
       <w:pPr>
         <w:pStyle w:val="Heading3"/>
       </w:pPr>
-      <w:bookmarkStart w:id="56" w:name="_Toc237559753"/>
+      <w:bookmarkStart w:id="55" w:name="_Toc237559753"/>
       <w:r>
         <w:t>4.1.2.3 KNN Heuristic Feature Module</w:t>
       </w:r>
-      <w:bookmarkEnd w:id="56"/>
+      <w:bookmarkEnd w:id="55"/>
     </w:p>
     <w:p>
       <w:pPr>
@@ -23021,11 +23103,11 @@
       <w:pPr>
         <w:pStyle w:val="Heading3"/>
       </w:pPr>
-      <w:bookmarkStart w:id="57" w:name="_Toc237559754"/>
+      <w:bookmarkStart w:id="56" w:name="_Toc237559754"/>
       <w:r>
         <w:t>4.1.2.4 KNN Voting Classifier Module</w:t>
       </w:r>
-      <w:bookmarkEnd w:id="57"/>
+      <w:bookmarkEnd w:id="56"/>
     </w:p>
     <w:p>
       <w:r>
@@ -23623,11 +23705,11 @@
       <w:pPr>
         <w:pStyle w:val="Heading3"/>
       </w:pPr>
-      <w:bookmarkStart w:id="58" w:name="_Toc237559755"/>
+      <w:bookmarkStart w:id="57" w:name="_Toc237559755"/>
       <w:r>
         <w:t>4.1.2.5 Cosine Similarity Feature Module</w:t>
       </w:r>
-      <w:bookmarkEnd w:id="58"/>
+      <w:bookmarkEnd w:id="57"/>
     </w:p>
     <w:p>
       <w:r>
@@ -24246,11 +24328,11 @@
       <w:pPr>
         <w:pStyle w:val="Heading3"/>
       </w:pPr>
-      <w:bookmarkStart w:id="59" w:name="_Toc237559756"/>
+      <w:bookmarkStart w:id="58" w:name="_Toc237559756"/>
       <w:r>
         <w:t>4.1.2.6 Cosine Similarity Angle Module</w:t>
       </w:r>
-      <w:bookmarkEnd w:id="59"/>
+      <w:bookmarkEnd w:id="58"/>
     </w:p>
     <w:p>
       <w:r>
@@ -24938,12 +25020,12 @@
       <w:pPr>
         <w:pStyle w:val="Heading3"/>
       </w:pPr>
-      <w:bookmarkStart w:id="60" w:name="_Toc237559757"/>
+      <w:bookmarkStart w:id="59" w:name="_Toc237559757"/>
       <w:r>
         <w:lastRenderedPageBreak/>
         <w:t>4.1.2.7 Logistic Regression Classifier Module</w:t>
       </w:r>
-      <w:bookmarkEnd w:id="60"/>
+      <w:bookmarkEnd w:id="59"/>
     </w:p>
     <w:p>
       <w:pPr>
@@ -25272,11 +25354,11 @@
       <w:pPr>
         <w:pStyle w:val="Heading3"/>
       </w:pPr>
-      <w:bookmarkStart w:id="61" w:name="_Toc237559758"/>
+      <w:bookmarkStart w:id="60" w:name="_Toc237559758"/>
       <w:r>
         <w:t>4.1.2.8 Character Trigrams Classifier Module</w:t>
       </w:r>
-      <w:bookmarkEnd w:id="61"/>
+      <w:bookmarkEnd w:id="60"/>
     </w:p>
     <w:p>
       <w:pPr>
@@ -25778,12 +25860,12 @@
       <w:pPr>
         <w:pStyle w:val="Heading3"/>
       </w:pPr>
-      <w:bookmarkStart w:id="62" w:name="_Toc237559759"/>
+      <w:bookmarkStart w:id="61" w:name="_Toc237559759"/>
       <w:r>
         <w:lastRenderedPageBreak/>
         <w:t>4.1.2.9 POS Syntax Ratios Classifier Module</w:t>
       </w:r>
-      <w:bookmarkEnd w:id="62"/>
+      <w:bookmarkEnd w:id="61"/>
     </w:p>
     <w:p>
       <w:pPr>
@@ -26359,7 +26441,7 @@
       <w:pPr>
         <w:pStyle w:val="Heading3"/>
       </w:pPr>
-      <w:bookmarkStart w:id="63" w:name="_Toc237559760"/>
+      <w:bookmarkStart w:id="62" w:name="_Toc237559760"/>
       <w:r>
         <w:t xml:space="preserve">4.1.2.10 </w:t>
       </w:r>
@@ -26371,7 +26453,7 @@
       <w:r>
         <w:t xml:space="preserve"> Gauge Module</w:t>
       </w:r>
-      <w:bookmarkEnd w:id="63"/>
+      <w:bookmarkEnd w:id="62"/>
     </w:p>
     <w:p>
       <w:r>
@@ -26866,7 +26948,7 @@
         <w:pStyle w:val="Heading3"/>
         <w:jc w:val="left"/>
       </w:pPr>
-      <w:bookmarkStart w:id="64" w:name="_Toc237559761"/>
+      <w:bookmarkStart w:id="63" w:name="_Toc237559761"/>
       <w:r>
         <w:lastRenderedPageBreak/>
         <w:t xml:space="preserve">4.1.2.11 </w:t>
@@ -26879,7 +26961,7 @@
       <w:r>
         <w:t xml:space="preserve"> Scatter Plot Module</w:t>
       </w:r>
-      <w:bookmarkEnd w:id="64"/>
+      <w:bookmarkEnd w:id="63"/>
     </w:p>
     <w:p>
       <w:r>
@@ -27555,7 +27637,7 @@
       <w:pPr>
         <w:pStyle w:val="Heading3"/>
       </w:pPr>
-      <w:bookmarkStart w:id="65" w:name="_Toc237559762"/>
+      <w:bookmarkStart w:id="64" w:name="_Toc237559762"/>
       <w:r>
         <w:t xml:space="preserve">4.1.2.12 </w:t>
       </w:r>
@@ -27567,7 +27649,7 @@
       <w:r>
         <w:t xml:space="preserve"> Radar Chart Module</w:t>
       </w:r>
-      <w:bookmarkEnd w:id="65"/>
+      <w:bookmarkEnd w:id="64"/>
     </w:p>
     <w:p>
       <w:r>
@@ -28122,12 +28204,12 @@
       <w:pPr>
         <w:pStyle w:val="Heading3"/>
       </w:pPr>
-      <w:bookmarkStart w:id="66" w:name="_Toc237559763"/>
+      <w:bookmarkStart w:id="65" w:name="_Toc237559763"/>
       <w:r>
         <w:lastRenderedPageBreak/>
         <w:t>4.1.2.13 app.js Analysis Controller Module</w:t>
       </w:r>
-      <w:bookmarkEnd w:id="66"/>
+      <w:bookmarkEnd w:id="65"/>
     </w:p>
     <w:p>
       <w:r>
@@ -28780,11 +28862,11 @@
       <w:pPr>
         <w:pStyle w:val="Heading3"/>
       </w:pPr>
-      <w:bookmarkStart w:id="67" w:name="_Toc237559764"/>
+      <w:bookmarkStart w:id="66" w:name="_Toc237559764"/>
       <w:r>
         <w:t>4.1.2.14 app.js UI Event Listener Module</w:t>
       </w:r>
-      <w:bookmarkEnd w:id="67"/>
+      <w:bookmarkEnd w:id="66"/>
     </w:p>
     <w:p>
       <w:r>
@@ -29229,11 +29311,11 @@
       <w:pPr>
         <w:pStyle w:val="Heading3"/>
       </w:pPr>
-      <w:bookmarkStart w:id="68" w:name="_Toc237559765"/>
+      <w:bookmarkStart w:id="67" w:name="_Toc237559765"/>
       <w:r>
         <w:t>4.1.2.15 style.css Custom Visual Styles</w:t>
       </w:r>
-      <w:bookmarkEnd w:id="68"/>
+      <w:bookmarkEnd w:id="67"/>
     </w:p>
     <w:p>
       <w:r>
@@ -29435,11 +29517,11 @@
       <w:pPr>
         <w:pStyle w:val="Heading3"/>
       </w:pPr>
-      <w:bookmarkStart w:id="69" w:name="_Toc237559766"/>
+      <w:bookmarkStart w:id="68" w:name="_Toc237559766"/>
       <w:r>
         <w:t>4.1.2.16 HTML5 Dashboard Layout Structure</w:t>
       </w:r>
-      <w:bookmarkEnd w:id="69"/>
+      <w:bookmarkEnd w:id="68"/>
     </w:p>
     <w:p>
       <w:r>
@@ -29710,11 +29792,11 @@
       <w:pPr>
         <w:pStyle w:val="Heading3"/>
       </w:pPr>
-      <w:bookmarkStart w:id="70" w:name="_Toc237559767"/>
+      <w:bookmarkStart w:id="69" w:name="_Toc237559767"/>
       <w:r>
         <w:t>4.1.2.17 Heuristic Grammar &amp; Typography Module</w:t>
       </w:r>
-      <w:bookmarkEnd w:id="70"/>
+      <w:bookmarkEnd w:id="69"/>
     </w:p>
     <w:p>
       <w:r>
@@ -30152,7 +30234,7 @@
       <w:pPr>
         <w:pStyle w:val="Heading3"/>
       </w:pPr>
-      <w:bookmarkStart w:id="71" w:name="_Toc237559768"/>
+      <w:bookmarkStart w:id="70" w:name="_Toc237559768"/>
       <w:r>
         <w:t xml:space="preserve">4.1.2.18 </w:t>
       </w:r>
@@ -30164,7 +30246,7 @@
       <w:r>
         <w:t xml:space="preserve"> Storage &amp; REST Sync Module</w:t>
       </w:r>
-      <w:bookmarkEnd w:id="71"/>
+      <w:bookmarkEnd w:id="70"/>
     </w:p>
     <w:p>
       <w:r>
@@ -31360,11 +31442,11 @@
       <w:pPr>
         <w:pStyle w:val="Heading3"/>
       </w:pPr>
-      <w:bookmarkStart w:id="72" w:name="_Toc237559769"/>
+      <w:bookmarkStart w:id="71" w:name="_Toc237559769"/>
       <w:r>
         <w:t>4.1.2.19 User Authentication &amp; Session Controller Module</w:t>
       </w:r>
-      <w:bookmarkEnd w:id="72"/>
+      <w:bookmarkEnd w:id="71"/>
     </w:p>
     <w:p>
       <w:r>
@@ -32629,11 +32711,11 @@
       <w:pPr>
         <w:pStyle w:val="Heading3"/>
       </w:pPr>
-      <w:bookmarkStart w:id="73" w:name="_Toc237559770"/>
+      <w:bookmarkStart w:id="72" w:name="_Toc237559770"/>
       <w:r>
         <w:t>4.1.2.20 server.py SQLite REST Backend Server Module</w:t>
       </w:r>
-      <w:bookmarkEnd w:id="73"/>
+      <w:bookmarkEnd w:id="72"/>
     </w:p>
     <w:p>
       <w:r>
@@ -33820,11 +33902,11 @@
       <w:pPr>
         <w:pStyle w:val="Heading3"/>
       </w:pPr>
-      <w:bookmarkStart w:id="74" w:name="_Toc237559771"/>
+      <w:bookmarkStart w:id="73" w:name="_Toc237559771"/>
       <w:r>
         <w:t>4.1.2.21 Guest Quota Manager &amp; History Security Module</w:t>
       </w:r>
-      <w:bookmarkEnd w:id="74"/>
+      <w:bookmarkEnd w:id="73"/>
     </w:p>
     <w:p>
       <w:r>
@@ -35045,11 +35127,11 @@
       <w:pPr>
         <w:pStyle w:val="Heading3"/>
       </w:pPr>
-      <w:bookmarkStart w:id="75" w:name="_Toc237559772"/>
+      <w:bookmarkStart w:id="74" w:name="_Toc237559772"/>
       <w:r>
         <w:t>4.1.2.22 Real-Time History Search &amp; UI Refinement Module</w:t>
       </w:r>
-      <w:bookmarkEnd w:id="75"/>
+      <w:bookmarkEnd w:id="74"/>
     </w:p>
     <w:p>
       <w:r>
@@ -36112,21 +36194,21 @@
       <w:pPr>
         <w:pStyle w:val="Heading2"/>
       </w:pPr>
-      <w:bookmarkStart w:id="76" w:name="_Toc237559773"/>
+      <w:bookmarkStart w:id="75" w:name="_Toc237559773"/>
       <w:r>
         <w:t>4.2 Testing</w:t>
       </w:r>
+      <w:bookmarkEnd w:id="75"/>
+    </w:p>
+    <w:p>
+      <w:pPr>
+        <w:pStyle w:val="Heading3"/>
+      </w:pPr>
+      <w:bookmarkStart w:id="76" w:name="_Toc237559774"/>
+      <w:r>
+        <w:t>4.2.1 Test Case for Unit Testing</w:t>
+      </w:r>
       <w:bookmarkEnd w:id="76"/>
-    </w:p>
-    <w:p>
-      <w:pPr>
-        <w:pStyle w:val="Heading3"/>
-      </w:pPr>
-      <w:bookmarkStart w:id="77" w:name="_Toc237559774"/>
-      <w:r>
-        <w:t>4.2.1 Test Case for Unit Testing</w:t>
-      </w:r>
-      <w:bookmarkEnd w:id="77"/>
     </w:p>
     <w:p>
       <w:pPr>
@@ -39126,11 +39208,11 @@
       <w:pPr>
         <w:pStyle w:val="Heading3"/>
       </w:pPr>
-      <w:bookmarkStart w:id="78" w:name="_Toc237559775"/>
+      <w:bookmarkStart w:id="77" w:name="_Toc237559775"/>
       <w:r>
         <w:t>4.2.2 Dataset Training &amp; Evasion Robustness Testing</w:t>
       </w:r>
-      <w:bookmarkEnd w:id="78"/>
+      <w:bookmarkEnd w:id="77"/>
     </w:p>
     <w:p>
       <w:pPr>
@@ -39340,14 +39422,16 @@
           <w:bCs/>
         </w:rPr>
       </w:pPr>
-      <w:bookmarkStart w:id="79" w:name="_Toc237559776"/>
+      <w:bookmarkStart w:id="78" w:name="_Toc237559776"/>
+      <w:bookmarkStart w:id="79" w:name="_GoBack"/>
+      <w:bookmarkEnd w:id="79"/>
       <w:r>
         <w:rPr>
           <w:bCs/>
         </w:rPr>
         <w:t>4.3 Result Analysis</w:t>
       </w:r>
-      <w:bookmarkEnd w:id="79"/>
+      <w:bookmarkEnd w:id="78"/>
     </w:p>
     <w:p>
       <w:pPr>
@@ -39682,8 +39766,16 @@
       <w:pPr>
         <w:spacing w:after="240"/>
         <w:jc w:val="center"/>
-      </w:pPr>
-      <w:r>
+        <w:rPr>
+          <w:b/>
+          <w:bCs/>
+        </w:rPr>
+      </w:pPr>
+      <w:r>
+        <w:rPr>
+          <w:b/>
+          <w:bCs/>
+        </w:rPr>
         <w:t>Figure 4.23: AI Probability Score Distribution</w:t>
       </w:r>
     </w:p>
@@ -39714,6 +39806,7 @@
         <w:t>To get the final result, the system computes a final ensemble score. It does this by combining the weighted voting and similarity scores from all the different base classifiers.</w:t>
       </w:r>
     </w:p>
+    <w:p/>
     <w:p>
       <w:pPr>
         <w:spacing w:before="240" w:after="120"/>
@@ -39723,6 +39816,7 @@
         <w:rPr>
           <w:b/>
         </w:rPr>
+        <w:lastRenderedPageBreak/>
         <w:t>Table 4.4: Classifier Performance Analysis</w:t>
       </w:r>
     </w:p>
@@ -39753,7 +39847,6 @@
               <w:rPr>
                 <w:b/>
               </w:rPr>
-              <w:lastRenderedPageBreak/>
               <w:t>Classifier Model</w:t>
             </w:r>
           </w:p>
@@ -41165,7 +41258,7 @@
     </w:p>
     <w:p>
       <w:r>
-        <w:t xml:space="preserve">The main goal of this whole project was to design, build, and test a privacy preserving, </w:t>
+        <w:t xml:space="preserve">The biggest drive behind the entire venture was to Design, Develop, and Demonstrate a Privacy-Preserving, </w:t>
       </w:r>
       <w:proofErr w:type="gramStart"/>
       <w:r>
@@ -41173,93 +41266,238 @@
       </w:r>
       <w:proofErr w:type="gramEnd"/>
       <w:r>
-        <w:t xml:space="preserve"> Web Application AI Text Detector. </w:t>
-      </w:r>
-      <w:r>
-        <w:t>To</w:t>
-      </w:r>
-      <w:r>
-        <w:t xml:space="preserve"> catch machine generated content without ever sending people’s sensitive text off to random </w:t>
+        <w:t xml:space="preserve"> Web Application AI Text Detector designed to detect machine generated text while keeping sensitive text from being sent to external, unspecified 3rd parties. As our development continued, we were able to satisfy our initial system design specifications for detecting machine generated text. This system was achieved by creating a lightweight, vanilla JavaScript, HTML5, and CSS enabled </w:t>
       </w:r>
       <w:proofErr w:type="gramStart"/>
       <w:r>
-        <w:t>third party</w:t>
+        <w:t>web based</w:t>
       </w:r>
       <w:proofErr w:type="gramEnd"/>
       <w:r>
-        <w:t xml:space="preserve"> servers. As development went on, we managed to hit all the functional requirements. We did this by hooking up a lightweight HTML5, Vanilla JavaScript, and CSS web interface directly to a multi algorithm stylometric detection engine.</w:t>
-      </w:r>
-    </w:p>
-    <w:p>
-      <w:r>
-        <w:t>Our AI text detector ties together six different analytical engines. It uses Statistical Perplexity &amp; Burstiness Analysis, K Nearest Neighbors (KNN) Heuristic Vector Matching, Vector Space Model (VSM) Cosine Similarity, Stylometric Logistic Regression, Character Trigram Profile Cosine Similarity, and Part of Speech (POS) Syntax Ratio Cosine Similarity. We also threw in some rule based Heuristic Grammar &amp; Typography Calibration just to round things out. By rolling all these algorithms into one Unified Ensemble Classifier, the system gets a really good look at lexical diversity, syntactic uniformity, burstiness variance, and those weird structural writing artifacts.</w:t>
-      </w:r>
-    </w:p>
-    <w:p>
-      <w:r>
-        <w:t xml:space="preserve">We tested the system on a benchmark dataset of 1,000 document samples, which was basically an even split of 500 human written essays and 500 AI generated outputs from models like GPT 4, Claude, and Gemini. The tests showed that our Unified Ensemble model pulls off an overall classification accuracy of 91.20%. It hit a Precision of 88.87%, a Recall of 94.20%, and an F1 Score of 91.46%. To break that down, we had 471 True Positives, 441 True Negatives, 59 False Positives, and 29 False Negatives. These results pretty much prove that mashing together </w:t>
+        <w:t xml:space="preserve"> User Interface that was directly linked to our advanced stylometric detection engine made from a multitude of algorithms. </w:t>
+      </w:r>
+    </w:p>
+    <w:p>
+      <w:r>
+        <w:t>T</w:t>
+      </w:r>
+      <w:r>
+        <w:t xml:space="preserve">ext detector uses the six disparate algorithmic measures in combination with a weighted decision mechanism, including: Statistical Perplexity &amp; Burstiness analysis, K nearest neighbors </w:t>
       </w:r>
       <w:proofErr w:type="spellStart"/>
       <w:r>
-        <w:t>multi dimensional</w:t>
+        <w:t>Heuristical</w:t>
       </w:r>
       <w:proofErr w:type="spellEnd"/>
       <w:r>
-        <w:t xml:space="preserve"> stylometric features beats out the older single metric classifiers every time.</w:t>
-      </w:r>
-    </w:p>
-    <w:p>
-      <w:r>
-        <w:t xml:space="preserve">Beyond just the raw classification performance, the AI text detector also features a pretty intuitive user interface. It has an Interactive Sentence Heatmap that highlights text for </w:t>
+        <w:t xml:space="preserve"> Matching Vector, Vector Space Model, and </w:t>
+      </w:r>
+      <w:proofErr w:type="spellStart"/>
+      <w:r>
+        <w:t>stylisticians</w:t>
+      </w:r>
+      <w:proofErr w:type="spellEnd"/>
+      <w:r>
+        <w:t xml:space="preserve"> have a tendency to model data with: stylized logistic regression, stylized trigrams of characters, styled grammar and typography, </w:t>
+      </w:r>
+      <w:proofErr w:type="spellStart"/>
+      <w:r>
+        <w:t>stylisticians</w:t>
+      </w:r>
+      <w:proofErr w:type="spellEnd"/>
+      <w:r>
+        <w:t xml:space="preserve"> using part-of-speech to calculate the syntactic features, with a resulting decision system known as a unified ensemble classifier. </w:t>
+      </w:r>
+    </w:p>
+    <w:p>
+      <w:r>
+        <w:t xml:space="preserve">This system provided it with a comprehensive perspective of lexical variation, structural consistency, varied patterns of burstiness, and the unique patterns characteristic of machine generated text. We performed extensive research and used this knowledge in order to determine what algorithm, what combination of algorithms, and what sort of implementation logic will most likely produce reliable machine text detection without compromising client privacy. Using a diverse and well represented data set comprising 1000 document samples-500 genuine documents and 500 documents generated by models including GPT 4, Claude, and Gemini-we found that the Unified Ensemble approach achieved an impressive accuracy of 91.20%. We observed </w:t>
+      </w:r>
+      <w:proofErr w:type="spellStart"/>
+      <w:r>
+        <w:t>aPrecision</w:t>
+      </w:r>
+      <w:proofErr w:type="spellEnd"/>
+      <w:r>
+        <w:t xml:space="preserve"> of 88.87%, a Recall of 94.20%, and aF1-Score of 91.46%. </w:t>
+      </w:r>
+    </w:p>
+    <w:p>
+      <w:r>
+        <w:t xml:space="preserve">Specifically, out of our 1000 total cases, we correctly identified 471 True Positives, 441 True Negatives, 59 False Positives, and 29 False Negatives. These results strongly indicate that </w:t>
+      </w:r>
+      <w:r>
+        <w:lastRenderedPageBreak/>
+        <w:t>using multifaceted statistical evidence to assess a text for signs of non-human origination will outperform older, single factor detection models each and every time. Beyond the remarkable accuracy numbers, our AI text detector also boasts a number of innovative features, including: an</w:t>
+      </w:r>
+      <w:r>
+        <w:t xml:space="preserve"> </w:t>
+      </w:r>
+      <w:r>
+        <w:t>Interactive Sentence</w:t>
+      </w:r>
+      <w:r>
+        <w:t xml:space="preserve"> </w:t>
+      </w:r>
+      <w:r>
+        <w:t>Heatmap, which allows user to quickly assess overall sentence machine text, with emerald for human, amber for mixed, and crimson for machine text; an</w:t>
+      </w:r>
+      <w:r>
+        <w:t xml:space="preserve"> </w:t>
+      </w:r>
+      <w:r>
+        <w:t>Interactive</w:t>
+      </w:r>
+      <w:r>
+        <w:t xml:space="preserve"> </w:t>
+      </w:r>
+      <w:r>
+        <w:t>Inspector</w:t>
+      </w:r>
+      <w:r>
+        <w:t xml:space="preserve"> </w:t>
+      </w:r>
+      <w:proofErr w:type="spellStart"/>
+      <w:r>
+        <w:t>Sidepanel</w:t>
+      </w:r>
+      <w:proofErr w:type="spellEnd"/>
+      <w:r>
+        <w:t xml:space="preserve">, which </w:t>
+      </w:r>
+      <w:proofErr w:type="spellStart"/>
+      <w:r>
+        <w:t>enablesusers</w:t>
+      </w:r>
+      <w:proofErr w:type="spellEnd"/>
+      <w:r>
+        <w:t xml:space="preserve"> to delve into each sentence on a deeper, sentence-by-sentence level; an</w:t>
+      </w:r>
+      <w:r>
+        <w:t xml:space="preserve"> </w:t>
+      </w:r>
+      <w:proofErr w:type="spellStart"/>
+      <w:r>
+        <w:t>InteractiveMathematical</w:t>
+      </w:r>
+      <w:proofErr w:type="spellEnd"/>
+      <w:r>
+        <w:t xml:space="preserve"> Resolution</w:t>
+      </w:r>
+      <w:r>
+        <w:t xml:space="preserve"> </w:t>
+      </w:r>
+      <w:r>
+        <w:t xml:space="preserve">Breakdown, and instant file upload processing for both plain text (.txt), Portable Document format (.pdf), as well as </w:t>
+      </w:r>
+      <w:proofErr w:type="spellStart"/>
+      <w:r>
+        <w:t>MicrosoftWord</w:t>
+      </w:r>
+      <w:proofErr w:type="spellEnd"/>
+      <w:r>
+        <w:t xml:space="preserve"> (.docx) documents. The key result from our project was to show, unequivocally, that performing real-time machine text detection wholly within </w:t>
+      </w:r>
+      <w:proofErr w:type="spellStart"/>
+      <w:r>
+        <w:t xml:space="preserve">a </w:t>
       </w:r>
       <w:proofErr w:type="gramStart"/>
       <w:r>
-        <w:t>you</w:t>
-      </w:r>
+        <w:t>users</w:t>
+      </w:r>
+      <w:proofErr w:type="spellEnd"/>
       <w:proofErr w:type="gramEnd"/>
       <w:r>
+        <w:t xml:space="preserve"> web browser, can produce real-time accuracy. </w:t>
+      </w:r>
+    </w:p>
+    <w:p>
+      <w:r>
+        <w:t>Overall, the</w:t>
+      </w:r>
+      <w:r>
         <w:t xml:space="preserve"> </w:t>
       </w:r>
       <w:r>
-        <w:t xml:space="preserve">emerald green for human writing, amber orange for mixed signatures, and crimson red for AI </w:t>
-      </w:r>
-      <w:r>
-        <w:lastRenderedPageBreak/>
-        <w:t xml:space="preserve">generated sentences. There’s also an Inspector </w:t>
+        <w:t>AI Text</w:t>
+      </w:r>
+      <w:r>
+        <w:t xml:space="preserve"> </w:t>
+      </w:r>
+      <w:r>
+        <w:t>Detector me</w:t>
+      </w:r>
+      <w:r>
+        <w:t>e</w:t>
+      </w:r>
+      <w:r>
+        <w:t>t</w:t>
+      </w:r>
+      <w:r>
+        <w:t xml:space="preserve">s </w:t>
+      </w:r>
+      <w:r>
+        <w:t xml:space="preserve">all original system design objectives. In the end, this system delivers to institutions, educators, and reviewers a reliable, intuitive, and, more importantly, completely private text authenticity and plagiarism checking system. Our new client-based detection system incorporates many cutting edge technologies for securing the privacy and for enhancing the users experience for every type of usage that we have planned for the system: </w:t>
       </w:r>
       <w:proofErr w:type="spellStart"/>
       <w:r>
-        <w:t>Sidepanel</w:t>
+        <w:t>UserAuthentication</w:t>
       </w:r>
       <w:proofErr w:type="spellEnd"/>
       <w:r>
-        <w:t xml:space="preserve"> if you want to look at things with sentence level granularity. Plus, we added an Interactive Mathematical Resolution Breakdown panel and instant file parsing support for Plain Text (.txt), PDF (.pdf), and Microsoft Word (.docx) formats.</w:t>
-      </w:r>
-    </w:p>
-    <w:p>
-      <w:proofErr w:type="gramStart"/>
-      <w:r>
-        <w:t>So</w:t>
-      </w:r>
-      <w:proofErr w:type="gramEnd"/>
-      <w:r>
-        <w:t xml:space="preserve"> to sum things up, the project proves that you can run real time AI text detection completely inside a web browser without losing performance. The AI text detector hit all of our initial system design goals. Put simply, it gives academic institutions, educators, and content reviewers a tool that is accurate, super easy to use, and entirely private when verifying text authenticity.</w:t>
-      </w:r>
-    </w:p>
-    <w:p>
-      <w:r>
-        <w:t>F</w:t>
-      </w:r>
-      <w:r>
-        <w:t xml:space="preserve">eatures like a User Authentication system and Dual Login capability, so people can sign in by username or email. We used a Dual-Engine Persistent Database Storage setup that pairs an SQLite3 backend with an </w:t>
+        <w:t xml:space="preserve"> and </w:t>
       </w:r>
       <w:proofErr w:type="spellStart"/>
       <w:r>
+        <w:t>DualLogin</w:t>
+      </w:r>
+      <w:proofErr w:type="spellEnd"/>
+      <w:r>
+        <w:t xml:space="preserve">(using both email address or username); </w:t>
+      </w:r>
+      <w:proofErr w:type="spellStart"/>
+      <w:r>
+        <w:t>aDual</w:t>
+      </w:r>
+      <w:proofErr w:type="spellEnd"/>
+      <w:r>
+        <w:t xml:space="preserve">-Engine persistent datastore comprised of an SQLite3 backend complimented by an </w:t>
+      </w:r>
+      <w:proofErr w:type="spellStart"/>
+      <w:r>
         <w:t>IndexedDB</w:t>
       </w:r>
       <w:proofErr w:type="spellEnd"/>
       <w:r>
-        <w:t xml:space="preserve"> fallback. Along with the Guest Daily Analysis Quota management and a refined Analysis History UI, all of this just helps ensure strong security, good data privacy, and a smooth user experience whether you’re working online or offline.</w:t>
+        <w:t xml:space="preserve"> client-side storage, </w:t>
+      </w:r>
+      <w:proofErr w:type="spellStart"/>
+      <w:r>
+        <w:t>aGuestDailyAnalysisQuota,and</w:t>
+      </w:r>
+      <w:proofErr w:type="spellEnd"/>
+      <w:r>
+        <w:t xml:space="preserve"> a highly </w:t>
+      </w:r>
+      <w:proofErr w:type="spellStart"/>
+      <w:r>
+        <w:t>interactiveand</w:t>
+      </w:r>
+      <w:proofErr w:type="spellEnd"/>
+      <w:r>
+        <w:t xml:space="preserve"> informative </w:t>
+      </w:r>
+      <w:proofErr w:type="spellStart"/>
+      <w:r>
+        <w:t>AnalysisHistoryUI</w:t>
+      </w:r>
+      <w:proofErr w:type="spellEnd"/>
+      <w:r>
+        <w:t>, which work together to give both good data protection and a great experience user no matter if they’re surfing the web online, or just browsing around offline</w:t>
+      </w:r>
+      <w:r>
+        <w:t>.</w:t>
       </w:r>
     </w:p>
     <w:p>
@@ -41331,6 +41569,7 @@
         <w:rPr>
           <w:bCs/>
         </w:rPr>
+        <w:lastRenderedPageBreak/>
         <w:t xml:space="preserve">Right </w:t>
       </w:r>
       <w:proofErr w:type="gramStart"/>
@@ -41371,11 +41610,7 @@
         <w:pStyle w:val="ListParagraph"/>
       </w:pPr>
       <w:r>
-        <w:t xml:space="preserve">Cloud Database Sync (Optional): It might make sense to offer an optional cloud-hosted database synchronization layer. This would let people pull up their analysis history on </w:t>
-      </w:r>
-      <w:r>
-        <w:lastRenderedPageBreak/>
-        <w:t>multiple devices. But we would definitely keep the default local-first architecture as the standard to protect privacy.</w:t>
+        <w:t>Cloud Database Sync (Optional): It might make sense to offer an optional cloud-hosted database synchronization layer. This would let people pull up their analysis history on multiple devices. But we would definitely keep the default local-first architecture as the standard to protect privacy.</w:t>
       </w:r>
     </w:p>
     <w:p>
@@ -41471,31 +41706,7 @@
         <w:pStyle w:val="ListParagraph"/>
       </w:pPr>
     </w:p>
-    <w:p>
-      <w:pPr>
-        <w:pStyle w:val="ListParagraph"/>
-      </w:pPr>
-    </w:p>
-    <w:p>
-      <w:pPr>
-        <w:pStyle w:val="ListParagraph"/>
-      </w:pPr>
-    </w:p>
-    <w:p>
-      <w:pPr>
-        <w:pStyle w:val="ListParagraph"/>
-      </w:pPr>
-    </w:p>
-    <w:p>
-      <w:pPr>
-        <w:pStyle w:val="ListParagraph"/>
-      </w:pPr>
-    </w:p>
-    <w:p>
-      <w:pPr>
-        <w:pStyle w:val="ListParagraph"/>
-      </w:pPr>
-    </w:p>
+    <w:p/>
     <w:p>
       <w:pPr>
         <w:pStyle w:val="Heading1"/>
@@ -41516,17 +41727,43 @@
     <w:p>
       <w:pPr>
         <w:spacing w:after="120"/>
-      </w:pPr>
-      <w:r>
         <w:rPr>
           <w:sz w:val="22"/>
         </w:rPr>
-        <w:t>[1] Gray, S. (2020). What is the Agile Methodology in Software Development. Medium. https://serenagray2451.medium.com/what</w:t>
-      </w:r>
+      </w:pPr>
       <w:r>
         <w:rPr>
           <w:sz w:val="22"/>
         </w:rPr>
+        <w:t xml:space="preserve">[1] Gray, S. (2020). What is the Agile Methodology in Software Development. Medium. </w:t>
+      </w:r>
+      <w:r>
+        <w:rPr>
+          <w:sz w:val="22"/>
+        </w:rPr>
+        <w:t xml:space="preserve">    </w:t>
+      </w:r>
+    </w:p>
+    <w:p>
+      <w:pPr>
+        <w:spacing w:after="120"/>
+      </w:pPr>
+      <w:r>
+        <w:rPr>
+          <w:sz w:val="22"/>
+        </w:rPr>
+        <w:t xml:space="preserve">    </w:t>
+      </w:r>
+      <w:r>
+        <w:rPr>
+          <w:sz w:val="22"/>
+        </w:rPr>
+        <w:t>https://serenagray2451.medium.com/what</w:t>
+      </w:r>
+      <w:r>
+        <w:rPr>
+          <w:sz w:val="22"/>
+        </w:rPr>
         <w:t xml:space="preserve"> </w:t>
       </w:r>
       <w:r>
@@ -42220,6 +42457,7 @@
         <w:rPr>
           <w:sz w:val="22"/>
         </w:rPr>
+        <w:lastRenderedPageBreak/>
         <w:t xml:space="preserve">     </w:t>
       </w:r>
       <w:r>
@@ -42240,7 +42478,6 @@
         <w:rPr>
           <w:sz w:val="22"/>
         </w:rPr>
-        <w:lastRenderedPageBreak/>
         <w:t>[10] Hugging Face. (2024). AI vs. Human Text Detection Dataset (silentone0725/ai</w:t>
       </w:r>
       <w:r>
@@ -42300,7 +42537,7 @@
         <w:rPr>
           <w:sz w:val="22"/>
         </w:rPr>
-        <w:t xml:space="preserve">      </w:t>
+        <w:t xml:space="preserve">     </w:t>
       </w:r>
       <w:r>
         <w:rPr>
@@ -42404,7 +42641,7 @@
         <w:rPr>
           <w:sz w:val="22"/>
         </w:rPr>
-        <w:t xml:space="preserve">      </w:t>
+        <w:t xml:space="preserve">     </w:t>
       </w:r>
       <w:r>
         <w:rPr>
@@ -44176,6 +44413,119 @@
     </w:lvl>
   </w:abstractNum>
   <w:abstractNum w:abstractNumId="10" w15:restartNumberingAfterBreak="0">
+    <w:nsid w:val="3B6F5C80"/>
+    <w:multiLevelType w:val="hybridMultilevel"/>
+    <w:tmpl w:val="CE120B4A"/>
+    <w:lvl w:ilvl="0" w:tplc="04090001">
+      <w:start w:val="1"/>
+      <w:numFmt w:val="bullet"/>
+      <w:lvlText w:val=""/>
+      <w:lvlJc w:val="left"/>
+      <w:pPr>
+        <w:ind w:left="720" w:hanging="360"/>
+      </w:pPr>
+      <w:rPr>
+        <w:rFonts w:ascii="Symbol" w:hAnsi="Symbol" w:hint="default"/>
+      </w:rPr>
+    </w:lvl>
+    <w:lvl w:ilvl="1" w:tplc="04090003" w:tentative="1">
+      <w:start w:val="1"/>
+      <w:numFmt w:val="bullet"/>
+      <w:lvlText w:val="o"/>
+      <w:lvlJc w:val="left"/>
+      <w:pPr>
+        <w:ind w:left="1440" w:hanging="360"/>
+      </w:pPr>
+      <w:rPr>
+        <w:rFonts w:ascii="Courier New" w:hAnsi="Courier New" w:cs="Courier New" w:hint="default"/>
+      </w:rPr>
+    </w:lvl>
+    <w:lvl w:ilvl="2" w:tplc="04090005" w:tentative="1">
+      <w:start w:val="1"/>
+      <w:numFmt w:val="bullet"/>
+      <w:lvlText w:val=""/>
+      <w:lvlJc w:val="left"/>
+      <w:pPr>
+        <w:ind w:left="2160" w:hanging="360"/>
+      </w:pPr>
+      <w:rPr>
+        <w:rFonts w:ascii="Wingdings" w:hAnsi="Wingdings" w:hint="default"/>
+      </w:rPr>
+    </w:lvl>
+    <w:lvl w:ilvl="3" w:tplc="04090001" w:tentative="1">
+      <w:start w:val="1"/>
+      <w:numFmt w:val="bullet"/>
+      <w:lvlText w:val=""/>
+      <w:lvlJc w:val="left"/>
+      <w:pPr>
+        <w:ind w:left="2880" w:hanging="360"/>
+      </w:pPr>
+      <w:rPr>
+        <w:rFonts w:ascii="Symbol" w:hAnsi="Symbol" w:hint="default"/>
+      </w:rPr>
+    </w:lvl>
+    <w:lvl w:ilvl="4" w:tplc="04090003" w:tentative="1">
+      <w:start w:val="1"/>
+      <w:numFmt w:val="bullet"/>
+      <w:lvlText w:val="o"/>
+      <w:lvlJc w:val="left"/>
+      <w:pPr>
+        <w:ind w:left="3600" w:hanging="360"/>
+      </w:pPr>
+      <w:rPr>
+        <w:rFonts w:ascii="Courier New" w:hAnsi="Courier New" w:cs="Courier New" w:hint="default"/>
+      </w:rPr>
+    </w:lvl>
+    <w:lvl w:ilvl="5" w:tplc="04090005" w:tentative="1">
+      <w:start w:val="1"/>
+      <w:numFmt w:val="bullet"/>
+      <w:lvlText w:val=""/>
+      <w:lvlJc w:val="left"/>
+      <w:pPr>
+        <w:ind w:left="4320" w:hanging="360"/>
+      </w:pPr>
+      <w:rPr>
+        <w:rFonts w:ascii="Wingdings" w:hAnsi="Wingdings" w:hint="default"/>
+      </w:rPr>
+    </w:lvl>
+    <w:lvl w:ilvl="6" w:tplc="04090001" w:tentative="1">
+      <w:start w:val="1"/>
+      <w:numFmt w:val="bullet"/>
+      <w:lvlText w:val=""/>
+      <w:lvlJc w:val="left"/>
+      <w:pPr>
+        <w:ind w:left="5040" w:hanging="360"/>
+      </w:pPr>
+      <w:rPr>
+        <w:rFonts w:ascii="Symbol" w:hAnsi="Symbol" w:hint="default"/>
+      </w:rPr>
+    </w:lvl>
+    <w:lvl w:ilvl="7" w:tplc="04090003" w:tentative="1">
+      <w:start w:val="1"/>
+      <w:numFmt w:val="bullet"/>
+      <w:lvlText w:val="o"/>
+      <w:lvlJc w:val="left"/>
+      <w:pPr>
+        <w:ind w:left="5760" w:hanging="360"/>
+      </w:pPr>
+      <w:rPr>
+        <w:rFonts w:ascii="Courier New" w:hAnsi="Courier New" w:cs="Courier New" w:hint="default"/>
+      </w:rPr>
+    </w:lvl>
+    <w:lvl w:ilvl="8" w:tplc="04090005" w:tentative="1">
+      <w:start w:val="1"/>
+      <w:numFmt w:val="bullet"/>
+      <w:lvlText w:val=""/>
+      <w:lvlJc w:val="left"/>
+      <w:pPr>
+        <w:ind w:left="6480" w:hanging="360"/>
+      </w:pPr>
+      <w:rPr>
+        <w:rFonts w:ascii="Wingdings" w:hAnsi="Wingdings" w:hint="default"/>
+      </w:rPr>
+    </w:lvl>
+  </w:abstractNum>
+  <w:abstractNum w:abstractNumId="11" w15:restartNumberingAfterBreak="0">
     <w:nsid w:val="3E771F97"/>
     <w:multiLevelType w:val="multilevel"/>
     <w:tmpl w:val="42865BEC"/>
@@ -44288,7 +44638,7 @@
       </w:rPr>
     </w:lvl>
   </w:abstractNum>
-  <w:abstractNum w:abstractNumId="11" w15:restartNumberingAfterBreak="0">
+  <w:abstractNum w:abstractNumId="12" w15:restartNumberingAfterBreak="0">
     <w:nsid w:val="40751BC5"/>
     <w:multiLevelType w:val="multilevel"/>
     <w:tmpl w:val="42865BEC"/>
@@ -44401,7 +44751,7 @@
       </w:rPr>
     </w:lvl>
   </w:abstractNum>
-  <w:abstractNum w:abstractNumId="12" w15:restartNumberingAfterBreak="0">
+  <w:abstractNum w:abstractNumId="13" w15:restartNumberingAfterBreak="0">
     <w:nsid w:val="4AD50F97"/>
     <w:multiLevelType w:val="hybridMultilevel"/>
     <w:tmpl w:val="92B23546"/>
@@ -44514,7 +44864,7 @@
       </w:rPr>
     </w:lvl>
   </w:abstractNum>
-  <w:abstractNum w:abstractNumId="13" w15:restartNumberingAfterBreak="0">
+  <w:abstractNum w:abstractNumId="14" w15:restartNumberingAfterBreak="0">
     <w:nsid w:val="4F692348"/>
     <w:multiLevelType w:val="hybridMultilevel"/>
     <w:tmpl w:val="9010293A"/>
@@ -44627,7 +44977,7 @@
       </w:rPr>
     </w:lvl>
   </w:abstractNum>
-  <w:abstractNum w:abstractNumId="14" w15:restartNumberingAfterBreak="0">
+  <w:abstractNum w:abstractNumId="15" w15:restartNumberingAfterBreak="0">
     <w:nsid w:val="59420C8D"/>
     <w:multiLevelType w:val="hybridMultilevel"/>
     <w:tmpl w:val="7C3C83A2"/>
@@ -44740,7 +45090,7 @@
       </w:rPr>
     </w:lvl>
   </w:abstractNum>
-  <w:abstractNum w:abstractNumId="15" w15:restartNumberingAfterBreak="0">
+  <w:abstractNum w:abstractNumId="16" w15:restartNumberingAfterBreak="0">
     <w:nsid w:val="5A343FD4"/>
     <w:multiLevelType w:val="hybridMultilevel"/>
     <w:tmpl w:val="BE80DA58"/>
@@ -44853,7 +45203,7 @@
       </w:rPr>
     </w:lvl>
   </w:abstractNum>
-  <w:abstractNum w:abstractNumId="16" w15:restartNumberingAfterBreak="0">
+  <w:abstractNum w:abstractNumId="17" w15:restartNumberingAfterBreak="0">
     <w:nsid w:val="5C97495E"/>
     <w:multiLevelType w:val="hybridMultilevel"/>
     <w:tmpl w:val="A8AA21D2"/>
@@ -44966,7 +45316,7 @@
       </w:rPr>
     </w:lvl>
   </w:abstractNum>
-  <w:abstractNum w:abstractNumId="17" w15:restartNumberingAfterBreak="0">
+  <w:abstractNum w:abstractNumId="18" w15:restartNumberingAfterBreak="0">
     <w:nsid w:val="5CBB2919"/>
     <w:multiLevelType w:val="hybridMultilevel"/>
     <w:tmpl w:val="95BE1316"/>
@@ -45079,7 +45429,7 @@
       </w:rPr>
     </w:lvl>
   </w:abstractNum>
-  <w:abstractNum w:abstractNumId="18" w15:restartNumberingAfterBreak="0">
+  <w:abstractNum w:abstractNumId="19" w15:restartNumberingAfterBreak="0">
     <w:nsid w:val="611E0A97"/>
     <w:multiLevelType w:val="multilevel"/>
     <w:tmpl w:val="03565476"/>
@@ -45192,7 +45542,7 @@
       </w:rPr>
     </w:lvl>
   </w:abstractNum>
-  <w:abstractNum w:abstractNumId="19" w15:restartNumberingAfterBreak="0">
+  <w:abstractNum w:abstractNumId="20" w15:restartNumberingAfterBreak="0">
     <w:nsid w:val="61C6388D"/>
     <w:multiLevelType w:val="hybridMultilevel"/>
     <w:tmpl w:val="BC1E48BE"/>
@@ -45305,7 +45655,7 @@
       </w:rPr>
     </w:lvl>
   </w:abstractNum>
-  <w:abstractNum w:abstractNumId="20" w15:restartNumberingAfterBreak="0">
+  <w:abstractNum w:abstractNumId="21" w15:restartNumberingAfterBreak="0">
     <w:nsid w:val="65ED7741"/>
     <w:multiLevelType w:val="hybridMultilevel"/>
     <w:tmpl w:val="B20C1A06"/>
@@ -45418,7 +45768,7 @@
       </w:rPr>
     </w:lvl>
   </w:abstractNum>
-  <w:abstractNum w:abstractNumId="21" w15:restartNumberingAfterBreak="0">
+  <w:abstractNum w:abstractNumId="22" w15:restartNumberingAfterBreak="0">
     <w:nsid w:val="6E79768D"/>
     <w:multiLevelType w:val="hybridMultilevel"/>
     <w:tmpl w:val="FC2253E2"/>
@@ -45531,7 +45881,7 @@
       </w:rPr>
     </w:lvl>
   </w:abstractNum>
-  <w:abstractNum w:abstractNumId="22" w15:restartNumberingAfterBreak="0">
+  <w:abstractNum w:abstractNumId="23" w15:restartNumberingAfterBreak="0">
     <w:nsid w:val="7EEE4A11"/>
     <w:multiLevelType w:val="multilevel"/>
     <w:tmpl w:val="54C2F56E"/>
@@ -45681,46 +46031,46 @@
     </w:lvl>
   </w:abstractNum>
   <w:num w:numId="1">
-    <w:abstractNumId w:val="18"/>
+    <w:abstractNumId w:val="19"/>
   </w:num>
   <w:num w:numId="2">
     <w:abstractNumId w:val="6"/>
   </w:num>
   <w:num w:numId="3">
-    <w:abstractNumId w:val="11"/>
+    <w:abstractNumId w:val="12"/>
   </w:num>
   <w:num w:numId="4">
-    <w:abstractNumId w:val="10"/>
+    <w:abstractNumId w:val="11"/>
   </w:num>
   <w:num w:numId="5">
     <w:abstractNumId w:val="9"/>
   </w:num>
   <w:num w:numId="6">
-    <w:abstractNumId w:val="17"/>
+    <w:abstractNumId w:val="18"/>
   </w:num>
   <w:num w:numId="7">
-    <w:abstractNumId w:val="15"/>
+    <w:abstractNumId w:val="16"/>
   </w:num>
   <w:num w:numId="8">
     <w:abstractNumId w:val="7"/>
   </w:num>
   <w:num w:numId="9">
+    <w:abstractNumId w:val="21"/>
+  </w:num>
+  <w:num w:numId="10">
+    <w:abstractNumId w:val="22"/>
+  </w:num>
+  <w:num w:numId="11">
     <w:abstractNumId w:val="20"/>
   </w:num>
-  <w:num w:numId="10">
-    <w:abstractNumId w:val="21"/>
-  </w:num>
-  <w:num w:numId="11">
-    <w:abstractNumId w:val="19"/>
-  </w:num>
   <w:num w:numId="12">
-    <w:abstractNumId w:val="22"/>
+    <w:abstractNumId w:val="23"/>
   </w:num>
   <w:num w:numId="13">
     <w:abstractNumId w:val="3"/>
   </w:num>
   <w:num w:numId="14">
-    <w:abstractNumId w:val="14"/>
+    <w:abstractNumId w:val="15"/>
   </w:num>
   <w:num w:numId="15">
     <w:abstractNumId w:val="5"/>
@@ -45729,10 +46079,10 @@
     <w:abstractNumId w:val="2"/>
   </w:num>
   <w:num w:numId="17">
-    <w:abstractNumId w:val="12"/>
+    <w:abstractNumId w:val="13"/>
   </w:num>
   <w:num w:numId="18">
-    <w:abstractNumId w:val="16"/>
+    <w:abstractNumId w:val="17"/>
   </w:num>
   <w:num w:numId="19">
     <w:abstractNumId w:val="8"/>
@@ -45744,10 +46094,13 @@
     <w:abstractNumId w:val="1"/>
   </w:num>
   <w:num w:numId="22">
-    <w:abstractNumId w:val="13"/>
+    <w:abstractNumId w:val="14"/>
   </w:num>
   <w:num w:numId="23">
     <w:abstractNumId w:val="4"/>
+  </w:num>
+  <w:num w:numId="24">
+    <w:abstractNumId w:val="10"/>
   </w:num>
 </w:numbering>
 </file>
@@ -46360,7 +46713,6 @@
   <w:style w:type="character" w:default="1" w:styleId="DefaultParagraphFont">
     <w:name w:val="Default Paragraph Font"/>
     <w:uiPriority w:val="1"/>
-    <w:semiHidden/>
     <w:unhideWhenUsed/>
   </w:style>
   <w:style w:type="table" w:default="1" w:styleId="TableNormal">
@@ -47514,7 +47866,7 @@
 </file>
 
 <file path=customXml/itemProps1.xml><?xml version="1.0" encoding="utf-8"?>
-<ds:datastoreItem xmlns:ds="http://schemas.openxmlformats.org/officeDocument/2006/customXml" ds:itemID="{7D8EC975-123D-4C36-8D19-F0B34312EE48}">
+<ds:datastoreItem xmlns:ds="http://schemas.openxmlformats.org/officeDocument/2006/customXml" ds:itemID="{40F0A94C-6B6B-4CD6-B863-3375E220D558}">
   <ds:schemaRefs>
     <ds:schemaRef ds:uri="http://schemas.openxmlformats.org/officeDocument/2006/bibliography"/>
   </ds:schemaRefs>

</xml_diff>

<commit_message>
Update project files and diagrams
</commit_message>
<xml_diff>
--- a/Ai text Detector Report_Updated.docx
+++ b/Ai text Detector Report_Updated.docx
@@ -1361,45 +1361,36 @@
         <w:ind w:left="-5" w:right="55"/>
       </w:pPr>
       <w:r>
-        <w:t xml:space="preserve">This project of creating an AI text Detector which will be used to check generated machine text using statistical NLP, </w:t>
-      </w:r>
-      <w:proofErr w:type="spellStart"/>
-      <w:r>
-        <w:t>KNearest</w:t>
-      </w:r>
-      <w:proofErr w:type="spellEnd"/>
-      <w:r>
-        <w:t xml:space="preserve"> Neighbors(KNN)and Cosine Similarity cannot be complete without a helping hand from the many. I’m indebted to Mr. Niraj Khadka Project Supervisor/Coordinator, without his invaluable suggestion and regular encouragement, </w:t>
-      </w:r>
-      <w:r>
-        <w:t xml:space="preserve">I </w:t>
-      </w:r>
-      <w:r>
-        <w:t xml:space="preserve">wouldn't have made progress during the course of building the project. With the extensive experience he possesses on the subject and constant motivation, </w:t>
-      </w:r>
-      <w:r>
-        <w:t>I</w:t>
-      </w:r>
-      <w:r>
-        <w:t xml:space="preserve"> became to learn deeply the concepts of Natural language Processing and Machine Learning. I would like to mention some friends, my mentors and the teachers/classmates for their help and inputs in the different stage of development especially during the testing phase to make it efficient to detect the machine generated text. </w:t>
+        <w:t>The project of developing AI TEXT DETECTOR to verify Machine Produced text by statistical Natural Language Processing(NLP) K Nearest Neighbors(KNN) and Cosine Similarity cannot be carried without support. Mr. Niraj Khadka Project Supervisor/Coordinator whose valuable suggestion and motivation had helped a lot during project development I will never fail to be thankful for those due to his rich expertise and ever inspiring words, I learned more in the course of time the real meaning behind Natural language Processing and Machine learning .</w:t>
+      </w:r>
+      <w:r>
+        <w:t xml:space="preserve"> </w:t>
+      </w:r>
+      <w:r>
+        <w:t xml:space="preserve">Special thanks </w:t>
       </w:r>
       <w:proofErr w:type="gramStart"/>
       <w:r>
-        <w:t>Lastly</w:t>
+        <w:t>goes</w:t>
       </w:r>
       <w:proofErr w:type="gramEnd"/>
       <w:r>
+        <w:t xml:space="preserve"> to friends and Mentors as well to their help and suggestions that I always receive whenever I seek, Teachers and class-mate’s help during the time of testing and debugging and many more.</w:t>
+      </w:r>
+      <w:r>
         <w:t xml:space="preserve"> </w:t>
       </w:r>
       <w:r>
-        <w:t>I</w:t>
-      </w:r>
-      <w:r>
-        <w:t xml:space="preserve"> would like to thank those individuals who have supported directly and indirectly to make this project a complete reality</w:t>
+        <w:t xml:space="preserve">At the final and for most, I want thank those who helped the development process be successful directly and </w:t>
+      </w:r>
+      <w:proofErr w:type="gramStart"/>
+      <w:r>
+        <w:t>indirectly.</w:t>
       </w:r>
       <w:r>
         <w:t>.</w:t>
       </w:r>
+      <w:proofErr w:type="gramEnd"/>
     </w:p>
     <w:p>
       <w:pPr>
@@ -1455,10 +1446,7 @@
         <w:spacing w:after="3"/>
       </w:pPr>
       <w:r>
-        <w:t>To</w:t>
-      </w:r>
-      <w:r>
-        <w:t xml:space="preserve"> test out adversarial evasion techniques like synonym swapping and spelling tweaks, this project sets up offline data augmentation workflows with the </w:t>
+        <w:t xml:space="preserve">In this repository we define offline data augmentation workflows using the </w:t>
       </w:r>
       <w:proofErr w:type="spellStart"/>
       <w:r>
@@ -1466,31 +1454,45 @@
       </w:r>
       <w:proofErr w:type="spellEnd"/>
       <w:r>
-        <w:t xml:space="preserve"> Python library. This basically lets us calibrate the grammar perfection discount factor when dealing with synthetic typo loads. For the front end, the user interface includes a responsive HTML5 dashboard put together with CSS custom properties. It’s got a semi-circular SVG probability gauge, an interactive sentence-level perplexity heatmap, and some animated SVG scatter plots and radar charts. Plus, there’s a real-time MathJax LaTeX resolution panel that shows every single weighted calculation. On the backend, a lightweight Python REST API server (server.py) running with SQLite3 handles the persistent database storage (</w:t>
+        <w:t xml:space="preserve"> Python library to play around with adversarial evasion strategies including synonym swap and spelling adjustments which basically allows to tweak the grammar perfection discount factor on synthetic typo loads. For the UI we have a responsive html5 dashboard developed using </w:t>
       </w:r>
       <w:proofErr w:type="spellStart"/>
       <w:r>
+        <w:t>css</w:t>
+      </w:r>
+      <w:proofErr w:type="spellEnd"/>
+      <w:r>
+        <w:t xml:space="preserve"> properties, semi-circular SVG probability gauge, sentence-level perplexity heatmap and animated </w:t>
+      </w:r>
+      <w:proofErr w:type="spellStart"/>
+      <w:r>
+        <w:t>svgs</w:t>
+      </w:r>
+      <w:proofErr w:type="spellEnd"/>
+      <w:r>
+        <w:t xml:space="preserve"> scatter plots and radar charts as well as a live MathJax latex resolving panel where every weighted computation is presented. All data persisted is in a local SQL database called </w:t>
+      </w:r>
+      <w:proofErr w:type="spellStart"/>
+      <w:r>
         <w:t>sentinel.db</w:t>
       </w:r>
       <w:proofErr w:type="spellEnd"/>
       <w:r>
-        <w:t xml:space="preserve">). This keeps track of user accounts and analysis history. But if you lose connection, a fallback </w:t>
+        <w:t xml:space="preserve">, managed via a tiny Python REST API server written using server.py, otherwise in an offline setup </w:t>
       </w:r>
       <w:proofErr w:type="spellStart"/>
       <w:r>
-        <w:t>IndexedDB</w:t>
+        <w:t>IndexxDB</w:t>
       </w:r>
       <w:proofErr w:type="spellEnd"/>
       <w:r>
-        <w:t xml:space="preserve"> (</w:t>
-      </w:r>
-      <w:proofErr w:type="spellStart"/>
-      <w:r>
-        <w:t>SentinelAIDB</w:t>
-      </w:r>
-      <w:proofErr w:type="spellEnd"/>
-      <w:r>
-        <w:t>) kicks in for full offline operation.</w:t>
+        <w:t xml:space="preserve"> can be use</w:t>
+      </w:r>
+      <w:r>
+        <w:t>d</w:t>
+      </w:r>
+      <w:r>
+        <w:t>.</w:t>
       </w:r>
     </w:p>
     <w:p>
@@ -1549,6 +1551,28 @@
           <w:bCs/>
         </w:rPr>
       </w:pPr>
+    </w:p>
+    <w:p>
+      <w:pPr>
+        <w:spacing w:before="0" w:after="160"/>
+        <w:jc w:val="left"/>
+        <w:rPr>
+          <w:b/>
+          <w:bCs/>
+        </w:rPr>
+      </w:pPr>
+    </w:p>
+    <w:p>
+      <w:pPr>
+        <w:spacing w:before="0" w:after="160"/>
+        <w:jc w:val="left"/>
+        <w:rPr>
+          <w:b/>
+          <w:bCs/>
+        </w:rPr>
+      </w:pPr>
+      <w:bookmarkStart w:id="8" w:name="_GoBack"/>
+      <w:bookmarkEnd w:id="8"/>
     </w:p>
     <w:p>
       <w:pPr>
@@ -7265,12 +7289,12 @@
         <w:pStyle w:val="Heading1"/>
         <w:spacing w:after="240"/>
       </w:pPr>
-      <w:bookmarkStart w:id="8" w:name="_Toc237559711"/>
+      <w:bookmarkStart w:id="9" w:name="_Toc237559711"/>
       <w:r>
         <w:lastRenderedPageBreak/>
         <w:t>LIST OF ABBREVIATIONS</w:t>
       </w:r>
-      <w:bookmarkEnd w:id="8"/>
+      <w:bookmarkEnd w:id="9"/>
     </w:p>
     <w:tbl>
       <w:tblPr>
@@ -7759,7 +7783,7 @@
           <w:rFonts w:cs="Times New Roman"/>
         </w:rPr>
       </w:pPr>
-      <w:bookmarkStart w:id="9" w:name="_Toc237559712"/>
+      <w:bookmarkStart w:id="10" w:name="_Toc237559712"/>
       <w:r>
         <w:rPr>
           <w:rFonts w:cs="Times New Roman"/>
@@ -7767,7 +7791,7 @@
         <w:lastRenderedPageBreak/>
         <w:t>LIST OF FIGURES</w:t>
       </w:r>
-      <w:bookmarkEnd w:id="9"/>
+      <w:bookmarkEnd w:id="10"/>
     </w:p>
     <w:tbl>
       <w:tblPr>
@@ -9580,12 +9604,12 @@
         <w:pStyle w:val="Heading1"/>
         <w:spacing w:after="240"/>
       </w:pPr>
-      <w:bookmarkStart w:id="10" w:name="_Toc237559713"/>
+      <w:bookmarkStart w:id="11" w:name="_Toc237559713"/>
       <w:r>
         <w:lastRenderedPageBreak/>
         <w:t>LIST OF TABLES</w:t>
       </w:r>
-      <w:bookmarkEnd w:id="10"/>
+      <w:bookmarkEnd w:id="11"/>
     </w:p>
     <w:tbl>
       <w:tblPr>
@@ -10129,12 +10153,12 @@
       <w:pPr>
         <w:pStyle w:val="Heading1"/>
       </w:pPr>
-      <w:bookmarkStart w:id="11" w:name="_Toc237559714"/>
+      <w:bookmarkStart w:id="12" w:name="_Toc237559714"/>
       <w:r>
         <w:lastRenderedPageBreak/>
         <w:t>CHAPTER 1</w:t>
       </w:r>
-      <w:bookmarkEnd w:id="11"/>
+      <w:bookmarkEnd w:id="12"/>
       <w:r>
         <w:t xml:space="preserve"> </w:t>
       </w:r>
@@ -10143,21 +10167,21 @@
       <w:pPr>
         <w:pStyle w:val="Heading1"/>
       </w:pPr>
-      <w:bookmarkStart w:id="12" w:name="_Toc237559715"/>
+      <w:bookmarkStart w:id="13" w:name="_Toc237559715"/>
       <w:r>
         <w:t>INTRODUCTION</w:t>
       </w:r>
-      <w:bookmarkEnd w:id="12"/>
+      <w:bookmarkEnd w:id="13"/>
     </w:p>
     <w:p>
       <w:pPr>
         <w:pStyle w:val="Heading2"/>
       </w:pPr>
-      <w:bookmarkStart w:id="13" w:name="_Toc237559716"/>
+      <w:bookmarkStart w:id="14" w:name="_Toc237559716"/>
       <w:r>
         <w:t>1.1 Introduction</w:t>
       </w:r>
-      <w:bookmarkEnd w:id="13"/>
+      <w:bookmarkEnd w:id="14"/>
       <w:r>
         <w:t xml:space="preserve"> </w:t>
       </w:r>
@@ -10258,11 +10282,11 @@
       <w:pPr>
         <w:pStyle w:val="Heading2"/>
       </w:pPr>
-      <w:bookmarkStart w:id="14" w:name="_Toc237559717"/>
+      <w:bookmarkStart w:id="15" w:name="_Toc237559717"/>
       <w:r>
         <w:t>1.2 Problem Statement</w:t>
       </w:r>
-      <w:bookmarkEnd w:id="14"/>
+      <w:bookmarkEnd w:id="15"/>
     </w:p>
     <w:p>
       <w:pPr>
@@ -10325,11 +10349,11 @@
       <w:pPr>
         <w:pStyle w:val="Heading2"/>
       </w:pPr>
-      <w:bookmarkStart w:id="15" w:name="_Toc237559718"/>
+      <w:bookmarkStart w:id="16" w:name="_Toc237559718"/>
       <w:r>
         <w:t>1.3 Objectives</w:t>
       </w:r>
-      <w:bookmarkEnd w:id="15"/>
+      <w:bookmarkEnd w:id="16"/>
     </w:p>
     <w:p>
       <w:pPr>
@@ -10514,7 +10538,7 @@
       <w:pPr>
         <w:pStyle w:val="Heading2"/>
       </w:pPr>
-      <w:bookmarkStart w:id="16" w:name="_Toc237559719"/>
+      <w:bookmarkStart w:id="17" w:name="_Toc237559719"/>
       <w:r>
         <w:t xml:space="preserve">1.4 </w:t>
       </w:r>
@@ -10524,7 +10548,7 @@
       <w:r>
         <w:t>Methodology</w:t>
       </w:r>
-      <w:bookmarkEnd w:id="16"/>
+      <w:bookmarkEnd w:id="17"/>
       <w:r>
         <w:t xml:space="preserve"> </w:t>
       </w:r>
@@ -10789,11 +10813,11 @@
       <w:pPr>
         <w:pStyle w:val="Heading2"/>
       </w:pPr>
-      <w:bookmarkStart w:id="17" w:name="_Toc237559720"/>
+      <w:bookmarkStart w:id="18" w:name="_Toc237559720"/>
       <w:r>
         <w:t>1.5 Report Organization</w:t>
       </w:r>
-      <w:bookmarkEnd w:id="17"/>
+      <w:bookmarkEnd w:id="18"/>
     </w:p>
     <w:p>
       <w:pPr>
@@ -10964,13 +10988,13 @@
         <w:pStyle w:val="Heading1"/>
         <w:spacing w:after="240"/>
       </w:pPr>
-      <w:bookmarkStart w:id="18" w:name="_Toc237559721"/>
+      <w:bookmarkStart w:id="19" w:name="_Toc237559721"/>
       <w:r>
         <w:lastRenderedPageBreak/>
         <w:t>CHAPTER 2</w:t>
       </w:r>
-      <w:bookmarkStart w:id="19" w:name="_Toc201399424"/>
-      <w:bookmarkEnd w:id="18"/>
+      <w:bookmarkStart w:id="20" w:name="_Toc201399424"/>
+      <w:bookmarkEnd w:id="19"/>
       <w:r>
         <w:t xml:space="preserve"> </w:t>
       </w:r>
@@ -10980,12 +11004,12 @@
         <w:pStyle w:val="Heading1"/>
         <w:spacing w:after="240"/>
       </w:pPr>
-      <w:bookmarkStart w:id="20" w:name="_Toc237559722"/>
+      <w:bookmarkStart w:id="21" w:name="_Toc237559722"/>
       <w:r>
         <w:t>BACKGROUND STUDY AND LITERATURE REVIEW</w:t>
       </w:r>
-      <w:bookmarkEnd w:id="19"/>
       <w:bookmarkEnd w:id="20"/>
+      <w:bookmarkEnd w:id="21"/>
       <w:r>
         <w:t xml:space="preserve"> </w:t>
       </w:r>
@@ -10994,11 +11018,11 @@
       <w:pPr>
         <w:pStyle w:val="Heading2"/>
       </w:pPr>
-      <w:bookmarkStart w:id="21" w:name="_Toc237559723"/>
+      <w:bookmarkStart w:id="22" w:name="_Toc237559723"/>
       <w:r>
         <w:t>2.1 Background Study</w:t>
       </w:r>
-      <w:bookmarkEnd w:id="21"/>
+      <w:bookmarkEnd w:id="22"/>
     </w:p>
     <w:p>
       <w:r>
@@ -11067,11 +11091,11 @@
       <w:pPr>
         <w:pStyle w:val="Heading2"/>
       </w:pPr>
-      <w:bookmarkStart w:id="22" w:name="_Toc237559724"/>
+      <w:bookmarkStart w:id="23" w:name="_Toc237559724"/>
       <w:r>
         <w:t>2.2 Literature Review</w:t>
       </w:r>
-      <w:bookmarkEnd w:id="22"/>
+      <w:bookmarkEnd w:id="23"/>
     </w:p>
     <w:p>
       <w:pPr>
@@ -11387,14 +11411,14 @@
         <w:pStyle w:val="Heading1"/>
         <w:ind w:left="224" w:right="278"/>
       </w:pPr>
-      <w:bookmarkStart w:id="23" w:name="_Toc201399427"/>
-      <w:bookmarkStart w:id="24" w:name="_Toc237559725"/>
+      <w:bookmarkStart w:id="24" w:name="_Toc201399427"/>
+      <w:bookmarkStart w:id="25" w:name="_Toc237559725"/>
       <w:r>
         <w:lastRenderedPageBreak/>
         <w:t>CHAPTER 3</w:t>
       </w:r>
-      <w:bookmarkEnd w:id="23"/>
       <w:bookmarkEnd w:id="24"/>
+      <w:bookmarkEnd w:id="25"/>
       <w:r>
         <w:t xml:space="preserve"> </w:t>
       </w:r>
@@ -11404,35 +11428,35 @@
         <w:pStyle w:val="Heading1"/>
         <w:ind w:left="224" w:right="278"/>
       </w:pPr>
-      <w:bookmarkStart w:id="25" w:name="_Toc237559726"/>
+      <w:bookmarkStart w:id="26" w:name="_Toc237559726"/>
       <w:r>
         <w:t>SYSTEM ANALYSIS AND DESIGN</w:t>
       </w:r>
-      <w:bookmarkEnd w:id="25"/>
+      <w:bookmarkEnd w:id="26"/>
     </w:p>
     <w:p>
       <w:pPr>
         <w:pStyle w:val="Heading2"/>
       </w:pPr>
-      <w:bookmarkStart w:id="26" w:name="_Toc231875504"/>
-      <w:bookmarkStart w:id="27" w:name="_Toc237559727"/>
+      <w:bookmarkStart w:id="27" w:name="_Toc231875504"/>
+      <w:bookmarkStart w:id="28" w:name="_Toc237559727"/>
       <w:r>
         <w:t>3.1 System Analysis</w:t>
       </w:r>
-      <w:bookmarkEnd w:id="26"/>
       <w:bookmarkEnd w:id="27"/>
+      <w:bookmarkEnd w:id="28"/>
     </w:p>
     <w:p>
       <w:pPr>
         <w:pStyle w:val="Heading3"/>
       </w:pPr>
-      <w:bookmarkStart w:id="28" w:name="_Toc231875505"/>
-      <w:bookmarkStart w:id="29" w:name="_Toc237559728"/>
+      <w:bookmarkStart w:id="29" w:name="_Toc231875505"/>
+      <w:bookmarkStart w:id="30" w:name="_Toc237559728"/>
       <w:r>
         <w:t>3.1.1 Requirement Analysis</w:t>
       </w:r>
-      <w:bookmarkEnd w:id="28"/>
       <w:bookmarkEnd w:id="29"/>
+      <w:bookmarkEnd w:id="30"/>
     </w:p>
     <w:p>
       <w:pPr>
@@ -12122,11 +12146,11 @@
       <w:pPr>
         <w:pStyle w:val="Heading3"/>
       </w:pPr>
-      <w:bookmarkStart w:id="30" w:name="_Toc237559729"/>
+      <w:bookmarkStart w:id="31" w:name="_Toc237559729"/>
       <w:r>
         <w:t>3.1.2 Feasibility Analysis</w:t>
       </w:r>
-      <w:bookmarkEnd w:id="30"/>
+      <w:bookmarkEnd w:id="31"/>
     </w:p>
     <w:p>
       <w:pPr>
@@ -12885,12 +12909,12 @@
       <w:pPr>
         <w:pStyle w:val="Heading3"/>
       </w:pPr>
-      <w:bookmarkStart w:id="31" w:name="_Toc237559730"/>
+      <w:bookmarkStart w:id="32" w:name="_Toc237559730"/>
       <w:r>
         <w:lastRenderedPageBreak/>
         <w:t>3.1.3 Object Modeling using Class Diagram</w:t>
       </w:r>
-      <w:bookmarkEnd w:id="31"/>
+      <w:bookmarkEnd w:id="32"/>
     </w:p>
     <w:p>
       <w:r>
@@ -13030,13 +13054,13 @@
       <w:pPr>
         <w:pStyle w:val="Heading3"/>
       </w:pPr>
-      <w:bookmarkStart w:id="32" w:name="_Toc231875508"/>
-      <w:bookmarkStart w:id="33" w:name="_Toc237559731"/>
+      <w:bookmarkStart w:id="33" w:name="_Toc231875508"/>
+      <w:bookmarkStart w:id="34" w:name="_Toc237559731"/>
       <w:r>
         <w:t>3.1.4 Dynamic Modelling using State and Sequence Diagrams</w:t>
       </w:r>
-      <w:bookmarkEnd w:id="32"/>
       <w:bookmarkEnd w:id="33"/>
+      <w:bookmarkEnd w:id="34"/>
     </w:p>
     <w:p>
       <w:r>
@@ -13324,6 +13348,7 @@
       <w:r>
         <w:rPr>
           <w:b/>
+          <w:noProof/>
         </w:rPr>
         <w:lastRenderedPageBreak/>
         <w:drawing>
@@ -13434,11 +13459,11 @@
       <w:pPr>
         <w:pStyle w:val="Heading3"/>
       </w:pPr>
-      <w:bookmarkStart w:id="34" w:name="_Toc237559732"/>
+      <w:bookmarkStart w:id="35" w:name="_Toc237559732"/>
       <w:r>
         <w:t>3.1.5 Process Modelling Using Activity Diagrams</w:t>
       </w:r>
-      <w:bookmarkEnd w:id="34"/>
+      <w:bookmarkEnd w:id="35"/>
     </w:p>
     <w:p>
       <w:r>
@@ -13555,11 +13580,11 @@
       <w:pPr>
         <w:pStyle w:val="Heading3"/>
       </w:pPr>
-      <w:bookmarkStart w:id="35" w:name="_Toc237559733"/>
+      <w:bookmarkStart w:id="36" w:name="_Toc237559733"/>
       <w:r>
         <w:t>3.1.6 Refinement of Class Diagram</w:t>
       </w:r>
-      <w:bookmarkEnd w:id="35"/>
+      <w:bookmarkEnd w:id="36"/>
     </w:p>
     <w:p>
       <w:r>
@@ -13582,6 +13607,9 @@
         <w:jc w:val="center"/>
       </w:pPr>
       <w:r>
+        <w:rPr>
+          <w:noProof/>
+        </w:rPr>
         <w:drawing>
           <wp:inline distT="0" distB="0" distL="0" distR="0" wp14:anchorId="61962BB2" wp14:editId="06959EFA">
             <wp:extent cx="5908462" cy="3944203"/>
@@ -13631,22 +13659,22 @@
       <w:pPr>
         <w:pStyle w:val="Heading2"/>
       </w:pPr>
-      <w:bookmarkStart w:id="36" w:name="_Toc237559734"/>
+      <w:bookmarkStart w:id="37" w:name="_Toc237559734"/>
       <w:r>
         <w:lastRenderedPageBreak/>
         <w:t>3.2 System Design</w:t>
       </w:r>
-      <w:bookmarkEnd w:id="36"/>
+      <w:bookmarkEnd w:id="37"/>
     </w:p>
     <w:p>
       <w:pPr>
         <w:pStyle w:val="Heading3"/>
       </w:pPr>
-      <w:bookmarkStart w:id="37" w:name="_Toc237559735"/>
+      <w:bookmarkStart w:id="38" w:name="_Toc237559735"/>
       <w:r>
         <w:t>3.2.1 Component Diagram</w:t>
       </w:r>
-      <w:bookmarkEnd w:id="37"/>
+      <w:bookmarkEnd w:id="38"/>
     </w:p>
     <w:p>
       <w:r>
@@ -13746,12 +13774,12 @@
       <w:pPr>
         <w:pStyle w:val="Heading3"/>
       </w:pPr>
-      <w:bookmarkStart w:id="38" w:name="_Toc237559736"/>
+      <w:bookmarkStart w:id="39" w:name="_Toc237559736"/>
       <w:r>
         <w:lastRenderedPageBreak/>
         <w:t>3.2.2 Deployment Diagram</w:t>
       </w:r>
-      <w:bookmarkEnd w:id="38"/>
+      <w:bookmarkEnd w:id="39"/>
     </w:p>
     <w:p>
       <w:r>
@@ -13890,12 +13918,12 @@
       <w:pPr>
         <w:pStyle w:val="Heading2"/>
       </w:pPr>
-      <w:bookmarkStart w:id="39" w:name="_Toc237559737"/>
+      <w:bookmarkStart w:id="40" w:name="_Toc237559737"/>
       <w:r>
         <w:lastRenderedPageBreak/>
         <w:t>3.3 Algorithm Details</w:t>
       </w:r>
-      <w:bookmarkEnd w:id="39"/>
+      <w:bookmarkEnd w:id="40"/>
     </w:p>
     <w:p>
       <w:pPr>
@@ -13904,11 +13932,11 @@
           <w:bCs/>
         </w:rPr>
       </w:pPr>
-      <w:bookmarkStart w:id="40" w:name="_Toc237559738"/>
+      <w:bookmarkStart w:id="41" w:name="_Toc237559738"/>
       <w:r>
         <w:t>3.3.1 Statistical NLP Algorithm (Perplexity &amp; Burstiness)</w:t>
       </w:r>
-      <w:bookmarkEnd w:id="40"/>
+      <w:bookmarkEnd w:id="41"/>
     </w:p>
     <w:p>
       <w:pPr>
@@ -14737,7 +14765,7 @@
           <w:szCs w:val="24"/>
         </w:rPr>
       </w:pPr>
-      <w:bookmarkStart w:id="41" w:name="_Toc237559739"/>
+      <w:bookmarkStart w:id="42" w:name="_Toc237559739"/>
     </w:p>
     <w:p>
       <w:pPr>
@@ -14746,7 +14774,7 @@
       <w:r>
         <w:t>3.3.2 KNN Classifier</w:t>
       </w:r>
-      <w:bookmarkEnd w:id="41"/>
+      <w:bookmarkEnd w:id="42"/>
     </w:p>
     <w:p>
       <w:r>
@@ -14911,7 +14939,6 @@
                 </m:ctrlPr>
               </m:naryPr>
               <m:sub>
-                <w:proofErr w:type="spellStart"/>
                 <m:r>
                   <m:rPr>
                     <m:nor/>
@@ -14919,17 +14946,7 @@
                   <w:rPr>
                     <w:rFonts w:ascii="Cambria Math" w:hAnsi="Cambria Math"/>
                   </w:rPr>
-                  <m:t>i</m:t>
-                </m:r>
-                <w:proofErr w:type="spellEnd"/>
-                <m:r>
-                  <m:rPr>
-                    <m:nor/>
-                  </m:rPr>
-                  <w:rPr>
-                    <w:rFonts w:ascii="Cambria Math" w:hAnsi="Cambria Math"/>
-                  </w:rPr>
-                  <m:t>=1</m:t>
+                  <m:t>i=1</m:t>
                 </m:r>
               </m:sub>
               <m:sup>
@@ -15679,7 +15696,7 @@
       <w:pPr>
         <w:pStyle w:val="Heading3"/>
       </w:pPr>
-      <w:bookmarkStart w:id="42" w:name="_Toc237559740"/>
+      <w:bookmarkStart w:id="43" w:name="_Toc237559740"/>
     </w:p>
     <w:p>
       <w:pPr>
@@ -15694,7 +15711,7 @@
       <w:r>
         <w:t xml:space="preserve"> Space Model)</w:t>
       </w:r>
-      <w:bookmarkEnd w:id="42"/>
+      <w:bookmarkEnd w:id="43"/>
     </w:p>
     <w:p>
       <w:pPr>
@@ -17171,7 +17188,7 @@
           <w:szCs w:val="24"/>
         </w:rPr>
       </w:pPr>
-      <w:bookmarkStart w:id="43" w:name="_Toc237559741"/>
+      <w:bookmarkStart w:id="44" w:name="_Toc237559741"/>
     </w:p>
     <w:p>
       <w:pPr>
@@ -17180,7 +17197,7 @@
       <w:r>
         <w:t>3.3.4 Stylometric Logistic Regression Classifier</w:t>
       </w:r>
-      <w:bookmarkEnd w:id="43"/>
+      <w:bookmarkEnd w:id="44"/>
     </w:p>
     <w:p>
       <w:r>
@@ -17794,11 +17811,11 @@
       <w:pPr>
         <w:pStyle w:val="Heading3"/>
       </w:pPr>
-      <w:bookmarkStart w:id="44" w:name="_Toc237559742"/>
+      <w:bookmarkStart w:id="45" w:name="_Toc237559742"/>
       <w:r>
         <w:t>3.3.5 Character Trigram Cosine Similarity</w:t>
       </w:r>
-      <w:bookmarkEnd w:id="44"/>
+      <w:bookmarkEnd w:id="45"/>
     </w:p>
     <w:p>
       <w:r>
@@ -18831,12 +18848,12 @@
       <w:pPr>
         <w:pStyle w:val="Heading3"/>
       </w:pPr>
-      <w:bookmarkStart w:id="45" w:name="_Toc237559743"/>
+      <w:bookmarkStart w:id="46" w:name="_Toc237559743"/>
       <w:r>
         <w:lastRenderedPageBreak/>
         <w:t>3.3.6 POS Syntax Ratio Cosine Similarity</w:t>
       </w:r>
-      <w:bookmarkEnd w:id="45"/>
+      <w:bookmarkEnd w:id="46"/>
     </w:p>
     <w:p>
       <w:proofErr w:type="gramStart"/>
@@ -19608,12 +19625,12 @@
       <w:pPr>
         <w:pStyle w:val="Heading3"/>
       </w:pPr>
-      <w:bookmarkStart w:id="46" w:name="_Toc237559744"/>
+      <w:bookmarkStart w:id="47" w:name="_Toc237559744"/>
       <w:r>
         <w:lastRenderedPageBreak/>
         <w:t>3.3.7 Heuristic Grammar &amp; Typography Analyzer</w:t>
       </w:r>
-      <w:bookmarkEnd w:id="46"/>
+      <w:bookmarkEnd w:id="47"/>
     </w:p>
     <w:p>
       <w:pPr>
@@ -20646,11 +20663,11 @@
       <w:pPr>
         <w:pStyle w:val="Heading3"/>
       </w:pPr>
-      <w:bookmarkStart w:id="47" w:name="_Toc237559745"/>
+      <w:bookmarkStart w:id="48" w:name="_Toc237559745"/>
       <w:r>
         <w:t>3.3.8 Ensemble Scoring &amp; Grammar Calibration</w:t>
       </w:r>
-      <w:bookmarkEnd w:id="47"/>
+      <w:bookmarkEnd w:id="48"/>
     </w:p>
     <w:p>
       <w:pPr>
@@ -21388,12 +21405,12 @@
       <w:pPr>
         <w:pStyle w:val="Heading1"/>
       </w:pPr>
-      <w:bookmarkStart w:id="48" w:name="_Toc237559746"/>
+      <w:bookmarkStart w:id="49" w:name="_Toc237559746"/>
       <w:r>
         <w:lastRenderedPageBreak/>
         <w:t>CHAPTER 4</w:t>
       </w:r>
-      <w:bookmarkEnd w:id="48"/>
+      <w:bookmarkEnd w:id="49"/>
       <w:r>
         <w:t xml:space="preserve"> </w:t>
       </w:r>
@@ -21402,11 +21419,11 @@
       <w:pPr>
         <w:pStyle w:val="Heading1"/>
       </w:pPr>
-      <w:bookmarkStart w:id="49" w:name="_Toc237559747"/>
+      <w:bookmarkStart w:id="50" w:name="_Toc237559747"/>
       <w:r>
         <w:t>IMPLEMENTATION AND TESTING</w:t>
       </w:r>
-      <w:bookmarkEnd w:id="49"/>
+      <w:bookmarkEnd w:id="50"/>
       <w:r>
         <w:t xml:space="preserve">  </w:t>
       </w:r>
@@ -21415,14 +21432,14 @@
       <w:pPr>
         <w:pStyle w:val="Heading2"/>
       </w:pPr>
-      <w:bookmarkStart w:id="50" w:name="_Toc237559748"/>
+      <w:bookmarkStart w:id="51" w:name="_Toc237559748"/>
       <w:r>
         <w:t xml:space="preserve">4.1 </w:t>
       </w:r>
       <w:r>
         <w:t>Implementation</w:t>
       </w:r>
-      <w:bookmarkEnd w:id="50"/>
+      <w:bookmarkEnd w:id="51"/>
     </w:p>
     <w:p>
       <w:pPr>
@@ -21431,7 +21448,7 @@
           <w:bCs/>
         </w:rPr>
       </w:pPr>
-      <w:bookmarkStart w:id="51" w:name="_Toc237559749"/>
+      <w:bookmarkStart w:id="52" w:name="_Toc237559749"/>
       <w:r>
         <w:t xml:space="preserve">4.1.1 </w:t>
       </w:r>
@@ -21441,7 +21458,7 @@
         </w:rPr>
         <w:t>Tools Used</w:t>
       </w:r>
-      <w:bookmarkEnd w:id="51"/>
+      <w:bookmarkEnd w:id="52"/>
     </w:p>
     <w:p>
       <w:r>
@@ -21613,12 +21630,12 @@
       <w:pPr>
         <w:pStyle w:val="Heading2"/>
       </w:pPr>
-      <w:bookmarkStart w:id="52" w:name="_Toc237559750"/>
+      <w:bookmarkStart w:id="53" w:name="_Toc237559750"/>
       <w:r>
         <w:lastRenderedPageBreak/>
         <w:t>4.1.2 Module Implementation Details</w:t>
       </w:r>
-      <w:bookmarkEnd w:id="52"/>
+      <w:bookmarkEnd w:id="53"/>
     </w:p>
     <w:p>
       <w:r>
@@ -21654,11 +21671,11 @@
       <w:pPr>
         <w:pStyle w:val="Heading3"/>
       </w:pPr>
-      <w:bookmarkStart w:id="53" w:name="_Toc237559751"/>
+      <w:bookmarkStart w:id="54" w:name="_Toc237559751"/>
       <w:r>
         <w:t>4.1.2.1 FileParser Module</w:t>
       </w:r>
-      <w:bookmarkEnd w:id="53"/>
+      <w:bookmarkEnd w:id="54"/>
     </w:p>
     <w:p>
       <w:r>
@@ -22144,11 +22161,11 @@
       <w:pPr>
         <w:pStyle w:val="Heading3"/>
       </w:pPr>
-      <w:bookmarkStart w:id="54" w:name="_Toc237559752"/>
+      <w:bookmarkStart w:id="55" w:name="_Toc237559752"/>
       <w:r>
         <w:t>4.1.2.2 Perplexity &amp; Burstiness Module</w:t>
       </w:r>
-      <w:bookmarkEnd w:id="54"/>
+      <w:bookmarkEnd w:id="55"/>
     </w:p>
     <w:p>
       <w:r>
@@ -22559,11 +22576,11 @@
       <w:pPr>
         <w:pStyle w:val="Heading3"/>
       </w:pPr>
-      <w:bookmarkStart w:id="55" w:name="_Toc237559753"/>
+      <w:bookmarkStart w:id="56" w:name="_Toc237559753"/>
       <w:r>
         <w:t>4.1.2.3 KNN Heuristic Feature Module</w:t>
       </w:r>
-      <w:bookmarkEnd w:id="55"/>
+      <w:bookmarkEnd w:id="56"/>
     </w:p>
     <w:p>
       <w:pPr>
@@ -23103,11 +23120,11 @@
       <w:pPr>
         <w:pStyle w:val="Heading3"/>
       </w:pPr>
-      <w:bookmarkStart w:id="56" w:name="_Toc237559754"/>
+      <w:bookmarkStart w:id="57" w:name="_Toc237559754"/>
       <w:r>
         <w:t>4.1.2.4 KNN Voting Classifier Module</w:t>
       </w:r>
-      <w:bookmarkEnd w:id="56"/>
+      <w:bookmarkEnd w:id="57"/>
     </w:p>
     <w:p>
       <w:r>
@@ -23705,11 +23722,11 @@
       <w:pPr>
         <w:pStyle w:val="Heading3"/>
       </w:pPr>
-      <w:bookmarkStart w:id="57" w:name="_Toc237559755"/>
+      <w:bookmarkStart w:id="58" w:name="_Toc237559755"/>
       <w:r>
         <w:t>4.1.2.5 Cosine Similarity Feature Module</w:t>
       </w:r>
-      <w:bookmarkEnd w:id="57"/>
+      <w:bookmarkEnd w:id="58"/>
     </w:p>
     <w:p>
       <w:r>
@@ -24328,11 +24345,11 @@
       <w:pPr>
         <w:pStyle w:val="Heading3"/>
       </w:pPr>
-      <w:bookmarkStart w:id="58" w:name="_Toc237559756"/>
+      <w:bookmarkStart w:id="59" w:name="_Toc237559756"/>
       <w:r>
         <w:t>4.1.2.6 Cosine Similarity Angle Module</w:t>
       </w:r>
-      <w:bookmarkEnd w:id="58"/>
+      <w:bookmarkEnd w:id="59"/>
     </w:p>
     <w:p>
       <w:r>
@@ -25020,12 +25037,12 @@
       <w:pPr>
         <w:pStyle w:val="Heading3"/>
       </w:pPr>
-      <w:bookmarkStart w:id="59" w:name="_Toc237559757"/>
+      <w:bookmarkStart w:id="60" w:name="_Toc237559757"/>
       <w:r>
         <w:lastRenderedPageBreak/>
         <w:t>4.1.2.7 Logistic Regression Classifier Module</w:t>
       </w:r>
-      <w:bookmarkEnd w:id="59"/>
+      <w:bookmarkEnd w:id="60"/>
     </w:p>
     <w:p>
       <w:pPr>
@@ -25354,11 +25371,11 @@
       <w:pPr>
         <w:pStyle w:val="Heading3"/>
       </w:pPr>
-      <w:bookmarkStart w:id="60" w:name="_Toc237559758"/>
+      <w:bookmarkStart w:id="61" w:name="_Toc237559758"/>
       <w:r>
         <w:t>4.1.2.8 Character Trigrams Classifier Module</w:t>
       </w:r>
-      <w:bookmarkEnd w:id="60"/>
+      <w:bookmarkEnd w:id="61"/>
     </w:p>
     <w:p>
       <w:pPr>
@@ -25860,12 +25877,12 @@
       <w:pPr>
         <w:pStyle w:val="Heading3"/>
       </w:pPr>
-      <w:bookmarkStart w:id="61" w:name="_Toc237559759"/>
+      <w:bookmarkStart w:id="62" w:name="_Toc237559759"/>
       <w:r>
         <w:lastRenderedPageBreak/>
         <w:t>4.1.2.9 POS Syntax Ratios Classifier Module</w:t>
       </w:r>
-      <w:bookmarkEnd w:id="61"/>
+      <w:bookmarkEnd w:id="62"/>
     </w:p>
     <w:p>
       <w:pPr>
@@ -26441,7 +26458,7 @@
       <w:pPr>
         <w:pStyle w:val="Heading3"/>
       </w:pPr>
-      <w:bookmarkStart w:id="62" w:name="_Toc237559760"/>
+      <w:bookmarkStart w:id="63" w:name="_Toc237559760"/>
       <w:r>
         <w:t xml:space="preserve">4.1.2.10 </w:t>
       </w:r>
@@ -26453,7 +26470,7 @@
       <w:r>
         <w:t xml:space="preserve"> Gauge Module</w:t>
       </w:r>
-      <w:bookmarkEnd w:id="62"/>
+      <w:bookmarkEnd w:id="63"/>
     </w:p>
     <w:p>
       <w:r>
@@ -26948,7 +26965,7 @@
         <w:pStyle w:val="Heading3"/>
         <w:jc w:val="left"/>
       </w:pPr>
-      <w:bookmarkStart w:id="63" w:name="_Toc237559761"/>
+      <w:bookmarkStart w:id="64" w:name="_Toc237559761"/>
       <w:r>
         <w:lastRenderedPageBreak/>
         <w:t xml:space="preserve">4.1.2.11 </w:t>
@@ -26961,7 +26978,7 @@
       <w:r>
         <w:t xml:space="preserve"> Scatter Plot Module</w:t>
       </w:r>
-      <w:bookmarkEnd w:id="63"/>
+      <w:bookmarkEnd w:id="64"/>
     </w:p>
     <w:p>
       <w:r>
@@ -27637,7 +27654,7 @@
       <w:pPr>
         <w:pStyle w:val="Heading3"/>
       </w:pPr>
-      <w:bookmarkStart w:id="64" w:name="_Toc237559762"/>
+      <w:bookmarkStart w:id="65" w:name="_Toc237559762"/>
       <w:r>
         <w:t xml:space="preserve">4.1.2.12 </w:t>
       </w:r>
@@ -27649,7 +27666,7 @@
       <w:r>
         <w:t xml:space="preserve"> Radar Chart Module</w:t>
       </w:r>
-      <w:bookmarkEnd w:id="64"/>
+      <w:bookmarkEnd w:id="65"/>
     </w:p>
     <w:p>
       <w:r>
@@ -28204,12 +28221,12 @@
       <w:pPr>
         <w:pStyle w:val="Heading3"/>
       </w:pPr>
-      <w:bookmarkStart w:id="65" w:name="_Toc237559763"/>
+      <w:bookmarkStart w:id="66" w:name="_Toc237559763"/>
       <w:r>
         <w:lastRenderedPageBreak/>
         <w:t>4.1.2.13 app.js Analysis Controller Module</w:t>
       </w:r>
-      <w:bookmarkEnd w:id="65"/>
+      <w:bookmarkEnd w:id="66"/>
     </w:p>
     <w:p>
       <w:r>
@@ -28862,11 +28879,11 @@
       <w:pPr>
         <w:pStyle w:val="Heading3"/>
       </w:pPr>
-      <w:bookmarkStart w:id="66" w:name="_Toc237559764"/>
+      <w:bookmarkStart w:id="67" w:name="_Toc237559764"/>
       <w:r>
         <w:t>4.1.2.14 app.js UI Event Listener Module</w:t>
       </w:r>
-      <w:bookmarkEnd w:id="66"/>
+      <w:bookmarkEnd w:id="67"/>
     </w:p>
     <w:p>
       <w:r>
@@ -29311,11 +29328,11 @@
       <w:pPr>
         <w:pStyle w:val="Heading3"/>
       </w:pPr>
-      <w:bookmarkStart w:id="67" w:name="_Toc237559765"/>
+      <w:bookmarkStart w:id="68" w:name="_Toc237559765"/>
       <w:r>
         <w:t>4.1.2.15 style.css Custom Visual Styles</w:t>
       </w:r>
-      <w:bookmarkEnd w:id="67"/>
+      <w:bookmarkEnd w:id="68"/>
     </w:p>
     <w:p>
       <w:r>
@@ -29517,11 +29534,11 @@
       <w:pPr>
         <w:pStyle w:val="Heading3"/>
       </w:pPr>
-      <w:bookmarkStart w:id="68" w:name="_Toc237559766"/>
+      <w:bookmarkStart w:id="69" w:name="_Toc237559766"/>
       <w:r>
         <w:t>4.1.2.16 HTML5 Dashboard Layout Structure</w:t>
       </w:r>
-      <w:bookmarkEnd w:id="68"/>
+      <w:bookmarkEnd w:id="69"/>
     </w:p>
     <w:p>
       <w:r>
@@ -29792,11 +29809,11 @@
       <w:pPr>
         <w:pStyle w:val="Heading3"/>
       </w:pPr>
-      <w:bookmarkStart w:id="69" w:name="_Toc237559767"/>
+      <w:bookmarkStart w:id="70" w:name="_Toc237559767"/>
       <w:r>
         <w:t>4.1.2.17 Heuristic Grammar &amp; Typography Module</w:t>
       </w:r>
-      <w:bookmarkEnd w:id="69"/>
+      <w:bookmarkEnd w:id="70"/>
     </w:p>
     <w:p>
       <w:r>
@@ -30234,7 +30251,7 @@
       <w:pPr>
         <w:pStyle w:val="Heading3"/>
       </w:pPr>
-      <w:bookmarkStart w:id="70" w:name="_Toc237559768"/>
+      <w:bookmarkStart w:id="71" w:name="_Toc237559768"/>
       <w:r>
         <w:t xml:space="preserve">4.1.2.18 </w:t>
       </w:r>
@@ -30246,7 +30263,7 @@
       <w:r>
         <w:t xml:space="preserve"> Storage &amp; REST Sync Module</w:t>
       </w:r>
-      <w:bookmarkEnd w:id="70"/>
+      <w:bookmarkEnd w:id="71"/>
     </w:p>
     <w:p>
       <w:r>
@@ -31442,11 +31459,11 @@
       <w:pPr>
         <w:pStyle w:val="Heading3"/>
       </w:pPr>
-      <w:bookmarkStart w:id="71" w:name="_Toc237559769"/>
+      <w:bookmarkStart w:id="72" w:name="_Toc237559769"/>
       <w:r>
         <w:t>4.1.2.19 User Authentication &amp; Session Controller Module</w:t>
       </w:r>
-      <w:bookmarkEnd w:id="71"/>
+      <w:bookmarkEnd w:id="72"/>
     </w:p>
     <w:p>
       <w:r>
@@ -32711,11 +32728,11 @@
       <w:pPr>
         <w:pStyle w:val="Heading3"/>
       </w:pPr>
-      <w:bookmarkStart w:id="72" w:name="_Toc237559770"/>
+      <w:bookmarkStart w:id="73" w:name="_Toc237559770"/>
       <w:r>
         <w:t>4.1.2.20 server.py SQLite REST Backend Server Module</w:t>
       </w:r>
-      <w:bookmarkEnd w:id="72"/>
+      <w:bookmarkEnd w:id="73"/>
     </w:p>
     <w:p>
       <w:r>
@@ -33902,11 +33919,11 @@
       <w:pPr>
         <w:pStyle w:val="Heading3"/>
       </w:pPr>
-      <w:bookmarkStart w:id="73" w:name="_Toc237559771"/>
+      <w:bookmarkStart w:id="74" w:name="_Toc237559771"/>
       <w:r>
         <w:t>4.1.2.21 Guest Quota Manager &amp; History Security Module</w:t>
       </w:r>
-      <w:bookmarkEnd w:id="73"/>
+      <w:bookmarkEnd w:id="74"/>
     </w:p>
     <w:p>
       <w:r>
@@ -35127,11 +35144,11 @@
       <w:pPr>
         <w:pStyle w:val="Heading3"/>
       </w:pPr>
-      <w:bookmarkStart w:id="74" w:name="_Toc237559772"/>
+      <w:bookmarkStart w:id="75" w:name="_Toc237559772"/>
       <w:r>
         <w:t>4.1.2.22 Real-Time History Search &amp; UI Refinement Module</w:t>
       </w:r>
-      <w:bookmarkEnd w:id="74"/>
+      <w:bookmarkEnd w:id="75"/>
     </w:p>
     <w:p>
       <w:r>
@@ -36194,21 +36211,21 @@
       <w:pPr>
         <w:pStyle w:val="Heading2"/>
       </w:pPr>
-      <w:bookmarkStart w:id="75" w:name="_Toc237559773"/>
+      <w:bookmarkStart w:id="76" w:name="_Toc237559773"/>
       <w:r>
         <w:t>4.2 Testing</w:t>
       </w:r>
-      <w:bookmarkEnd w:id="75"/>
+      <w:bookmarkEnd w:id="76"/>
     </w:p>
     <w:p>
       <w:pPr>
         <w:pStyle w:val="Heading3"/>
       </w:pPr>
-      <w:bookmarkStart w:id="76" w:name="_Toc237559774"/>
+      <w:bookmarkStart w:id="77" w:name="_Toc237559774"/>
       <w:r>
         <w:t>4.2.1 Test Case for Unit Testing</w:t>
       </w:r>
-      <w:bookmarkEnd w:id="76"/>
+      <w:bookmarkEnd w:id="77"/>
     </w:p>
     <w:p>
       <w:pPr>
@@ -39208,11 +39225,11 @@
       <w:pPr>
         <w:pStyle w:val="Heading3"/>
       </w:pPr>
-      <w:bookmarkStart w:id="77" w:name="_Toc237559775"/>
+      <w:bookmarkStart w:id="78" w:name="_Toc237559775"/>
       <w:r>
         <w:t>4.2.2 Dataset Training &amp; Evasion Robustness Testing</w:t>
       </w:r>
-      <w:bookmarkEnd w:id="77"/>
+      <w:bookmarkEnd w:id="78"/>
     </w:p>
     <w:p>
       <w:pPr>
@@ -39422,16 +39439,14 @@
           <w:bCs/>
         </w:rPr>
       </w:pPr>
-      <w:bookmarkStart w:id="78" w:name="_Toc237559776"/>
-      <w:bookmarkStart w:id="79" w:name="_GoBack"/>
+      <w:bookmarkStart w:id="79" w:name="_Toc237559776"/>
+      <w:r>
+        <w:rPr>
+          <w:bCs/>
+        </w:rPr>
+        <w:t>4.3 Result Analysis</w:t>
+      </w:r>
       <w:bookmarkEnd w:id="79"/>
-      <w:r>
-        <w:rPr>
-          <w:bCs/>
-        </w:rPr>
-        <w:t>4.3 Result Analysis</w:t>
-      </w:r>
-      <w:bookmarkEnd w:id="78"/>
     </w:p>
     <w:p>
       <w:pPr>
@@ -41279,10 +41294,7 @@
     </w:p>
     <w:p>
       <w:r>
-        <w:t>T</w:t>
-      </w:r>
-      <w:r>
-        <w:t xml:space="preserve">ext detector uses the six disparate algorithmic measures in combination with a weighted decision mechanism, including: Statistical Perplexity &amp; Burstiness analysis, K nearest neighbors </w:t>
+        <w:t xml:space="preserve">Text detector uses the six disparate algorithmic measures in combination with a weighted decision mechanism, including: Statistical Perplexity &amp; Burstiness analysis, K nearest neighbors </w:t>
       </w:r>
       <w:proofErr w:type="spellStart"/>
       <w:r>
@@ -41328,34 +41340,7 @@
       </w:r>
       <w:r>
         <w:lastRenderedPageBreak/>
-        <w:t>using multifaceted statistical evidence to assess a text for signs of non-human origination will outperform older, single factor detection models each and every time. Beyond the remarkable accuracy numbers, our AI text detector also boasts a number of innovative features, including: an</w:t>
-      </w:r>
-      <w:r>
-        <w:t xml:space="preserve"> </w:t>
-      </w:r>
-      <w:r>
-        <w:t>Interactive Sentence</w:t>
-      </w:r>
-      <w:r>
-        <w:t xml:space="preserve"> </w:t>
-      </w:r>
-      <w:r>
-        <w:t>Heatmap, which allows user to quickly assess overall sentence machine text, with emerald for human, amber for mixed, and crimson for machine text; an</w:t>
-      </w:r>
-      <w:r>
-        <w:t xml:space="preserve"> </w:t>
-      </w:r>
-      <w:r>
-        <w:t>Interactive</w:t>
-      </w:r>
-      <w:r>
-        <w:t xml:space="preserve"> </w:t>
-      </w:r>
-      <w:r>
-        <w:t>Inspector</w:t>
-      </w:r>
-      <w:r>
-        <w:t xml:space="preserve"> </w:t>
+        <w:t xml:space="preserve">using multifaceted statistical evidence to assess a text for signs of non-human origination will outperform older, single factor detection models each and every time. Beyond the remarkable accuracy numbers, our AI text detector also boasts a number of innovative features, including: an Interactive Sentence Heatmap, which allows user to quickly assess overall sentence machine text, with emerald for human, amber for mixed, and crimson for machine text; an Interactive Inspector </w:t>
       </w:r>
       <w:proofErr w:type="spellStart"/>
       <w:r>
@@ -41371,10 +41356,7 @@
       </w:r>
       <w:proofErr w:type="spellEnd"/>
       <w:r>
-        <w:t xml:space="preserve"> to delve into each sentence on a deeper, sentence-by-sentence level; an</w:t>
-      </w:r>
-      <w:r>
-        <w:t xml:space="preserve"> </w:t>
+        <w:t xml:space="preserve"> to delve into each sentence on a deeper, sentence-by-sentence level; an </w:t>
       </w:r>
       <w:proofErr w:type="spellStart"/>
       <w:r>
@@ -41382,13 +41364,7 @@
       </w:r>
       <w:proofErr w:type="spellEnd"/>
       <w:r>
-        <w:t xml:space="preserve"> Resolution</w:t>
-      </w:r>
-      <w:r>
-        <w:t xml:space="preserve"> </w:t>
-      </w:r>
-      <w:r>
-        <w:t xml:space="preserve">Breakdown, and instant file upload processing for both plain text (.txt), Portable Document format (.pdf), as well as </w:t>
+        <w:t xml:space="preserve"> Resolution Breakdown, and instant file upload processing for both plain text (.txt), Portable Document format (.pdf), as well as </w:t>
       </w:r>
       <w:proofErr w:type="spellStart"/>
       <w:r>
@@ -41414,31 +41390,7 @@
     </w:p>
     <w:p>
       <w:r>
-        <w:t>Overall, the</w:t>
-      </w:r>
-      <w:r>
-        <w:t xml:space="preserve"> </w:t>
-      </w:r>
-      <w:r>
-        <w:t>AI Text</w:t>
-      </w:r>
-      <w:r>
-        <w:t xml:space="preserve"> </w:t>
-      </w:r>
-      <w:r>
-        <w:t>Detector me</w:t>
-      </w:r>
-      <w:r>
-        <w:t>e</w:t>
-      </w:r>
-      <w:r>
-        <w:t>t</w:t>
-      </w:r>
-      <w:r>
-        <w:t xml:space="preserve">s </w:t>
-      </w:r>
-      <w:r>
-        <w:t xml:space="preserve">all original system design objectives. In the end, this system delivers to institutions, educators, and reviewers a reliable, intuitive, and, more importantly, completely private text authenticity and plagiarism checking system. Our new client-based detection system incorporates many cutting edge technologies for securing the privacy and for enhancing the users experience for every type of usage that we have planned for the system: </w:t>
+        <w:t xml:space="preserve">Overall, the AI Text Detector meets all original system design objectives. In the end, this system delivers to institutions, educators, and reviewers a reliable, intuitive, and, more importantly, completely private text authenticity and plagiarism checking system. Our new client-based detection system incorporates many cutting edge technologies for securing the privacy and for enhancing the users experience for every type of usage that we have planned for the system: </w:t>
       </w:r>
       <w:proofErr w:type="spellStart"/>
       <w:r>
@@ -43029,24 +42981,165 @@
         <w:jc w:val="center"/>
         <w:rPr>
           <w:b/>
+        </w:rPr>
+      </w:pPr>
+      <w:r>
+        <w:rPr>
+          <w:b/>
+        </w:rPr>
+        <w:t xml:space="preserve">Appendices </w:t>
+      </w:r>
+      <w:r>
+        <w:rPr>
+          <w:b/>
+        </w:rPr>
+        <w:t>5</w:t>
+      </w:r>
+    </w:p>
+    <w:p>
+      <w:pPr>
+        <w:jc w:val="center"/>
+        <w:rPr>
+          <w:b/>
           <w:bCs/>
         </w:rPr>
       </w:pPr>
       <w:r>
         <w:rPr>
           <w:b/>
-        </w:rPr>
-        <w:t xml:space="preserve">Appendices </w:t>
-      </w:r>
-      <w:r>
+          <w:bCs/>
+        </w:rPr>
+        <w:drawing>
+          <wp:inline distT="0" distB="0" distL="0" distR="0" wp14:anchorId="54C2BBBE" wp14:editId="575A5669">
+            <wp:extent cx="5715000" cy="2837180"/>
+            <wp:effectExtent l="0" t="0" r="0" b="1270"/>
+            <wp:docPr id="2" name="Picture 2"/>
+            <wp:cNvGraphicFramePr>
+              <a:graphicFrameLocks xmlns:a="http://schemas.openxmlformats.org/drawingml/2006/main" noChangeAspect="1"/>
+            </wp:cNvGraphicFramePr>
+            <a:graphic xmlns:a="http://schemas.openxmlformats.org/drawingml/2006/main">
+              <a:graphicData uri="http://schemas.openxmlformats.org/drawingml/2006/picture">
+                <pic:pic xmlns:pic="http://schemas.openxmlformats.org/drawingml/2006/picture">
+                  <pic:nvPicPr>
+                    <pic:cNvPr id="1" name=""/>
+                    <pic:cNvPicPr/>
+                  </pic:nvPicPr>
+                  <pic:blipFill>
+                    <a:blip r:embed="rId32"/>
+                    <a:stretch>
+                      <a:fillRect/>
+                    </a:stretch>
+                  </pic:blipFill>
+                  <pic:spPr>
+                    <a:xfrm>
+                      <a:off x="0" y="0"/>
+                      <a:ext cx="5715000" cy="2837180"/>
+                    </a:xfrm>
+                    <a:prstGeom prst="rect">
+                      <a:avLst/>
+                    </a:prstGeom>
+                  </pic:spPr>
+                </pic:pic>
+              </a:graphicData>
+            </a:graphic>
+          </wp:inline>
+        </w:drawing>
+      </w:r>
+    </w:p>
+    <w:p>
+      <w:pPr>
+        <w:jc w:val="center"/>
         <w:rPr>
           <w:b/>
-        </w:rPr>
-        <w:t>5</w:t>
+          <w:bCs/>
+        </w:rPr>
+      </w:pPr>
+      <w:r>
+        <w:rPr>
+          <w:b/>
+          <w:bCs/>
+        </w:rPr>
+        <w:lastRenderedPageBreak/>
+        <w:drawing>
+          <wp:inline distT="0" distB="0" distL="0" distR="0" wp14:anchorId="1CB0BEF3" wp14:editId="2619FE22">
+            <wp:extent cx="6056368" cy="3616325"/>
+            <wp:effectExtent l="0" t="0" r="1905" b="3175"/>
+            <wp:docPr id="6" name="Picture 6"/>
+            <wp:cNvGraphicFramePr>
+              <a:graphicFrameLocks xmlns:a="http://schemas.openxmlformats.org/drawingml/2006/main" noChangeAspect="1"/>
+            </wp:cNvGraphicFramePr>
+            <a:graphic xmlns:a="http://schemas.openxmlformats.org/drawingml/2006/main">
+              <a:graphicData uri="http://schemas.openxmlformats.org/drawingml/2006/picture">
+                <pic:pic xmlns:pic="http://schemas.openxmlformats.org/drawingml/2006/picture">
+                  <pic:nvPicPr>
+                    <pic:cNvPr id="1" name=""/>
+                    <pic:cNvPicPr/>
+                  </pic:nvPicPr>
+                  <pic:blipFill>
+                    <a:blip r:embed="rId33"/>
+                    <a:stretch>
+                      <a:fillRect/>
+                    </a:stretch>
+                  </pic:blipFill>
+                  <pic:spPr>
+                    <a:xfrm>
+                      <a:off x="0" y="0"/>
+                      <a:ext cx="6099285" cy="3641951"/>
+                    </a:xfrm>
+                    <a:prstGeom prst="rect">
+                      <a:avLst/>
+                    </a:prstGeom>
+                  </pic:spPr>
+                </pic:pic>
+              </a:graphicData>
+            </a:graphic>
+          </wp:inline>
+        </w:drawing>
+      </w:r>
+      <w:r>
+        <w:rPr>
+          <w:b/>
+          <w:bCs/>
+        </w:rPr>
+        <w:drawing>
+          <wp:inline distT="0" distB="0" distL="0" distR="0" wp14:anchorId="7B8EE5A8" wp14:editId="3103A4D6">
+            <wp:extent cx="5715000" cy="4272915"/>
+            <wp:effectExtent l="0" t="0" r="0" b="0"/>
+            <wp:docPr id="3" name="Picture 3"/>
+            <wp:cNvGraphicFramePr>
+              <a:graphicFrameLocks xmlns:a="http://schemas.openxmlformats.org/drawingml/2006/main" noChangeAspect="1"/>
+            </wp:cNvGraphicFramePr>
+            <a:graphic xmlns:a="http://schemas.openxmlformats.org/drawingml/2006/main">
+              <a:graphicData uri="http://schemas.openxmlformats.org/drawingml/2006/picture">
+                <pic:pic xmlns:pic="http://schemas.openxmlformats.org/drawingml/2006/picture">
+                  <pic:nvPicPr>
+                    <pic:cNvPr id="1" name=""/>
+                    <pic:cNvPicPr/>
+                  </pic:nvPicPr>
+                  <pic:blipFill>
+                    <a:blip r:embed="rId34"/>
+                    <a:stretch>
+                      <a:fillRect/>
+                    </a:stretch>
+                  </pic:blipFill>
+                  <pic:spPr>
+                    <a:xfrm>
+                      <a:off x="0" y="0"/>
+                      <a:ext cx="5715000" cy="4272915"/>
+                    </a:xfrm>
+                    <a:prstGeom prst="rect">
+                      <a:avLst/>
+                    </a:prstGeom>
+                  </pic:spPr>
+                </pic:pic>
+              </a:graphicData>
+            </a:graphic>
+          </wp:inline>
+        </w:drawing>
       </w:r>
     </w:p>
     <w:sectPr>
-      <w:footerReference w:type="default" r:id="rId32"/>
+      <w:footerReference w:type="default" r:id="rId35"/>
       <w:pgSz w:w="12240" w:h="15840"/>
       <w:pgMar w:top="1440" w:right="1440" w:bottom="1440" w:left="1800" w:header="720" w:footer="720" w:gutter="0"/>
       <w:pgNumType w:start="1"/>
@@ -46713,6 +46806,7 @@
   <w:style w:type="character" w:default="1" w:styleId="DefaultParagraphFont">
     <w:name w:val="Default Paragraph Font"/>
     <w:uiPriority w:val="1"/>
+    <w:semiHidden/>
     <w:unhideWhenUsed/>
   </w:style>
   <w:style w:type="table" w:default="1" w:styleId="TableNormal">
@@ -47866,7 +47960,7 @@
 </file>
 
 <file path=customXml/itemProps1.xml><?xml version="1.0" encoding="utf-8"?>
-<ds:datastoreItem xmlns:ds="http://schemas.openxmlformats.org/officeDocument/2006/customXml" ds:itemID="{40F0A94C-6B6B-4CD6-B863-3375E220D558}">
+<ds:datastoreItem xmlns:ds="http://schemas.openxmlformats.org/officeDocument/2006/customXml" ds:itemID="{C412A9E0-1E13-42F8-827B-0626315D2DDE}">
   <ds:schemaRefs>
     <ds:schemaRef ds:uri="http://schemas.openxmlformats.org/officeDocument/2006/bibliography"/>
   </ds:schemaRefs>

</xml_diff>

<commit_message>
Update Draw.io and SVG sequence, class, and refinement object diagrams
</commit_message>
<xml_diff>
--- a/Ai text Detector Report_Updated.docx
+++ b/Ai text Detector Report_Updated.docx
@@ -1361,13 +1361,7 @@
         <w:ind w:left="-5" w:right="55"/>
       </w:pPr>
       <w:r>
-        <w:t>The project of developing AI TEXT DETECTOR to verify Machine Produced text by statistical Natural Language Processing(NLP) K Nearest Neighbors(KNN) and Cosine Similarity cannot be carried without support. Mr. Niraj Khadka Project Supervisor/Coordinator whose valuable suggestion and motivation had helped a lot during project development I will never fail to be thankful for those due to his rich expertise and ever inspiring words, I learned more in the course of time the real meaning behind Natural language Processing and Machine learning .</w:t>
-      </w:r>
-      <w:r>
-        <w:t xml:space="preserve"> </w:t>
-      </w:r>
-      <w:r>
-        <w:t xml:space="preserve">Special thanks </w:t>
+        <w:t xml:space="preserve">The project of developing AI TEXT DETECTOR to verify Machine Produced text by statistical Natural Language Processing(NLP) K Nearest Neighbors(KNN) and Cosine Similarity cannot be carried without support. Mr. Niraj Khadka Project Supervisor/Coordinator whose valuable suggestion and motivation had helped a lot during project development I will never fail to be thankful for those due to his rich expertise and ever inspiring words, I learned more in the course of time the real meaning behind Natural language Processing and Machine learning . Special thanks </w:t>
       </w:r>
       <w:proofErr w:type="gramStart"/>
       <w:r>
@@ -1375,22 +1369,8 @@
       </w:r>
       <w:proofErr w:type="gramEnd"/>
       <w:r>
-        <w:t xml:space="preserve"> to friends and Mentors as well to their help and suggestions that I always receive whenever I seek, Teachers and class-mate’s help during the time of testing and debugging and many more.</w:t>
-      </w:r>
-      <w:r>
-        <w:t xml:space="preserve"> </w:t>
-      </w:r>
-      <w:r>
-        <w:t xml:space="preserve">At the final and for most, I want thank those who helped the development process be successful directly and </w:t>
-      </w:r>
-      <w:proofErr w:type="gramStart"/>
-      <w:r>
-        <w:t>indirectly.</w:t>
-      </w:r>
-      <w:r>
-        <w:t>.</w:t>
-      </w:r>
-      <w:proofErr w:type="gramEnd"/>
+        <w:t xml:space="preserve"> to friends and Mentors as well to their help and suggestions that I always receive whenever I seek, Teachers and class-mate’s help during the time of testing and debugging and many more. At the final and for most, I want thank those who helped the development process be successful directly and indirectly.</w:t>
+      </w:r>
     </w:p>
     <w:p>
       <w:pPr>
@@ -1444,52 +1424,62 @@
     <w:p>
       <w:pPr>
         <w:spacing w:after="3"/>
-      </w:pPr>
-      <w:r>
-        <w:t xml:space="preserve">In this repository we define offline data augmentation workflows using the </w:t>
+        <w:rPr>
+          <w:rFonts w:eastAsia="Aptos"/>
+        </w:rPr>
+      </w:pPr>
+      <w:r>
+        <w:rPr>
+          <w:rFonts w:eastAsia="Aptos"/>
+        </w:rPr>
+        <w:t xml:space="preserve">To evaluate adversarial evasion techniques (e.g. synonym swapping and spelling tweaks), the project implements robust offline data augmentation workflows using the </w:t>
       </w:r>
       <w:proofErr w:type="spellStart"/>
       <w:r>
+        <w:rPr>
+          <w:rFonts w:eastAsia="Aptos"/>
+          <w:bCs/>
+        </w:rPr>
         <w:t>nlpaug</w:t>
       </w:r>
       <w:proofErr w:type="spellEnd"/>
       <w:r>
-        <w:t xml:space="preserve"> Python library to play around with adversarial evasion strategies including synonym swap and spelling adjustments which basically allows to tweak the grammar perfection discount factor on synthetic typo loads. For the UI we have a responsive html5 dashboard developed using </w:t>
-      </w:r>
-      <w:proofErr w:type="spellStart"/>
-      <w:r>
-        <w:t>css</w:t>
-      </w:r>
-      <w:proofErr w:type="spellEnd"/>
-      <w:r>
-        <w:t xml:space="preserve"> properties, semi-circular SVG probability gauge, sentence-level perplexity heatmap and animated </w:t>
-      </w:r>
-      <w:proofErr w:type="spellStart"/>
-      <w:r>
-        <w:t>svgs</w:t>
-      </w:r>
-      <w:proofErr w:type="spellEnd"/>
-      <w:r>
-        <w:t xml:space="preserve"> scatter plots and radar charts as well as a live MathJax latex resolving panel where every weighted computation is presented. All data persisted is in a local SQL database called </w:t>
-      </w:r>
-      <w:proofErr w:type="spellStart"/>
-      <w:r>
-        <w:t>sentinel.db</w:t>
-      </w:r>
-      <w:proofErr w:type="spellEnd"/>
-      <w:r>
-        <w:t xml:space="preserve">, managed via a tiny Python REST API server written using server.py, otherwise in an offline setup </w:t>
-      </w:r>
-      <w:proofErr w:type="spellStart"/>
-      <w:r>
-        <w:t>IndexxDB</w:t>
-      </w:r>
-      <w:proofErr w:type="spellEnd"/>
-      <w:r>
-        <w:t xml:space="preserve"> can be use</w:t>
-      </w:r>
-      <w:r>
-        <w:t>d</w:t>
+        <w:rPr>
+          <w:rFonts w:eastAsia="Aptos"/>
+        </w:rPr>
+        <w:t xml:space="preserve"> Python library, which allows calibrating the grammar perfection discount factor under synthetic typo loads. The user interface features a prominent Classification Verdict banner at the top of the dashboard indicating if text is most probably written by AI, mixed, or human.</w:t>
+      </w:r>
+      <w:r>
+        <w:rPr>
+          <w:rFonts w:eastAsia="Aptos"/>
+        </w:rPr>
+        <w:t xml:space="preserve"> </w:t>
+      </w:r>
+      <w:r>
+        <w:rPr>
+          <w:rFonts w:eastAsia="Aptos"/>
+          <w:kern w:val="0"/>
+          <w14:ligatures w14:val="none"/>
+        </w:rPr>
+        <w:t xml:space="preserve">The individual metrics are combined via a weighted ensemble (25% Logistic Regression, 25% Character Trigram Similarity, 20% KNN Classifier, 15% POS Syntax Ratios, 10% Cosine Similarity, and 5% Perplexity) to calculate an overall AI probability. The application features an interactive single page dashboard built using HTML5 custom CSS variables and Vanilla JavaScript. It incorporates PDF.js and Mammoth.js for </w:t>
+      </w:r>
+      <w:proofErr w:type="gramStart"/>
+      <w:r>
+        <w:rPr>
+          <w:rFonts w:eastAsia="Aptos"/>
+          <w:kern w:val="0"/>
+          <w14:ligatures w14:val="none"/>
+        </w:rPr>
+        <w:t>client side</w:t>
+      </w:r>
+      <w:proofErr w:type="gramEnd"/>
+      <w:r>
+        <w:rPr>
+          <w:rFonts w:eastAsia="Aptos"/>
+          <w:kern w:val="0"/>
+          <w14:ligatures w14:val="none"/>
+        </w:rPr>
+        <w:t xml:space="preserve"> document parsing, SVG based clean minimalist visualization charts, an interactive sentence level perplexity heatmap, a prominent classification verdict banner, and a mathematical resolution panel powered by MathJax to trace raw formulas in real time</w:t>
       </w:r>
       <w:r>
         <w:t>.</w:t>
@@ -1541,38 +1531,6 @@
           <w:bCs/>
         </w:rPr>
       </w:pPr>
-    </w:p>
-    <w:p>
-      <w:pPr>
-        <w:spacing w:before="0" w:after="160"/>
-        <w:jc w:val="left"/>
-        <w:rPr>
-          <w:b/>
-          <w:bCs/>
-        </w:rPr>
-      </w:pPr>
-    </w:p>
-    <w:p>
-      <w:pPr>
-        <w:spacing w:before="0" w:after="160"/>
-        <w:jc w:val="left"/>
-        <w:rPr>
-          <w:b/>
-          <w:bCs/>
-        </w:rPr>
-      </w:pPr>
-    </w:p>
-    <w:p>
-      <w:pPr>
-        <w:spacing w:before="0" w:after="160"/>
-        <w:jc w:val="left"/>
-        <w:rPr>
-          <w:b/>
-          <w:bCs/>
-        </w:rPr>
-      </w:pPr>
-      <w:bookmarkStart w:id="8" w:name="_GoBack"/>
-      <w:bookmarkEnd w:id="8"/>
     </w:p>
     <w:p>
       <w:pPr>
@@ -7289,12 +7247,12 @@
         <w:pStyle w:val="Heading1"/>
         <w:spacing w:after="240"/>
       </w:pPr>
-      <w:bookmarkStart w:id="9" w:name="_Toc237559711"/>
+      <w:bookmarkStart w:id="8" w:name="_Toc237559711"/>
       <w:r>
         <w:lastRenderedPageBreak/>
         <w:t>LIST OF ABBREVIATIONS</w:t>
       </w:r>
-      <w:bookmarkEnd w:id="9"/>
+      <w:bookmarkEnd w:id="8"/>
     </w:p>
     <w:tbl>
       <w:tblPr>
@@ -7783,7 +7741,7 @@
           <w:rFonts w:cs="Times New Roman"/>
         </w:rPr>
       </w:pPr>
-      <w:bookmarkStart w:id="10" w:name="_Toc237559712"/>
+      <w:bookmarkStart w:id="9" w:name="_Toc237559712"/>
       <w:r>
         <w:rPr>
           <w:rFonts w:cs="Times New Roman"/>
@@ -7791,7 +7749,7 @@
         <w:lastRenderedPageBreak/>
         <w:t>LIST OF FIGURES</w:t>
       </w:r>
-      <w:bookmarkEnd w:id="10"/>
+      <w:bookmarkEnd w:id="9"/>
     </w:p>
     <w:tbl>
       <w:tblPr>
@@ -9604,12 +9562,12 @@
         <w:pStyle w:val="Heading1"/>
         <w:spacing w:after="240"/>
       </w:pPr>
-      <w:bookmarkStart w:id="11" w:name="_Toc237559713"/>
+      <w:bookmarkStart w:id="10" w:name="_Toc237559713"/>
       <w:r>
         <w:lastRenderedPageBreak/>
         <w:t>LIST OF TABLES</w:t>
       </w:r>
-      <w:bookmarkEnd w:id="11"/>
+      <w:bookmarkEnd w:id="10"/>
     </w:p>
     <w:tbl>
       <w:tblPr>
@@ -10153,35 +10111,35 @@
       <w:pPr>
         <w:pStyle w:val="Heading1"/>
       </w:pPr>
-      <w:bookmarkStart w:id="12" w:name="_Toc237559714"/>
+      <w:bookmarkStart w:id="11" w:name="_Toc237559714"/>
       <w:r>
         <w:lastRenderedPageBreak/>
         <w:t>CHAPTER 1</w:t>
       </w:r>
+      <w:bookmarkEnd w:id="11"/>
+      <w:r>
+        <w:t xml:space="preserve"> </w:t>
+      </w:r>
+    </w:p>
+    <w:p>
+      <w:pPr>
+        <w:pStyle w:val="Heading1"/>
+      </w:pPr>
+      <w:bookmarkStart w:id="12" w:name="_Toc237559715"/>
+      <w:r>
+        <w:t>INTRODUCTION</w:t>
+      </w:r>
       <w:bookmarkEnd w:id="12"/>
-      <w:r>
-        <w:t xml:space="preserve"> </w:t>
-      </w:r>
-    </w:p>
-    <w:p>
-      <w:pPr>
-        <w:pStyle w:val="Heading1"/>
-      </w:pPr>
-      <w:bookmarkStart w:id="13" w:name="_Toc237559715"/>
-      <w:r>
-        <w:t>INTRODUCTION</w:t>
+    </w:p>
+    <w:p>
+      <w:pPr>
+        <w:pStyle w:val="Heading2"/>
+      </w:pPr>
+      <w:bookmarkStart w:id="13" w:name="_Toc237559716"/>
+      <w:r>
+        <w:t>1.1 Introduction</w:t>
       </w:r>
       <w:bookmarkEnd w:id="13"/>
-    </w:p>
-    <w:p>
-      <w:pPr>
-        <w:pStyle w:val="Heading2"/>
-      </w:pPr>
-      <w:bookmarkStart w:id="14" w:name="_Toc237559716"/>
-      <w:r>
-        <w:t>1.1 Introduction</w:t>
-      </w:r>
-      <w:bookmarkEnd w:id="14"/>
       <w:r>
         <w:t xml:space="preserve"> </w:t>
       </w:r>
@@ -10282,11 +10240,11 @@
       <w:pPr>
         <w:pStyle w:val="Heading2"/>
       </w:pPr>
-      <w:bookmarkStart w:id="15" w:name="_Toc237559717"/>
+      <w:bookmarkStart w:id="14" w:name="_Toc237559717"/>
       <w:r>
         <w:t>1.2 Problem Statement</w:t>
       </w:r>
-      <w:bookmarkEnd w:id="15"/>
+      <w:bookmarkEnd w:id="14"/>
     </w:p>
     <w:p>
       <w:pPr>
@@ -10349,11 +10307,11 @@
       <w:pPr>
         <w:pStyle w:val="Heading2"/>
       </w:pPr>
-      <w:bookmarkStart w:id="16" w:name="_Toc237559718"/>
+      <w:bookmarkStart w:id="15" w:name="_Toc237559718"/>
       <w:r>
         <w:t>1.3 Objectives</w:t>
       </w:r>
-      <w:bookmarkEnd w:id="16"/>
+      <w:bookmarkEnd w:id="15"/>
     </w:p>
     <w:p>
       <w:pPr>
@@ -10538,7 +10496,7 @@
       <w:pPr>
         <w:pStyle w:val="Heading2"/>
       </w:pPr>
-      <w:bookmarkStart w:id="17" w:name="_Toc237559719"/>
+      <w:bookmarkStart w:id="16" w:name="_Toc237559719"/>
       <w:r>
         <w:t xml:space="preserve">1.4 </w:t>
       </w:r>
@@ -10548,7 +10506,7 @@
       <w:r>
         <w:t>Methodology</w:t>
       </w:r>
-      <w:bookmarkEnd w:id="17"/>
+      <w:bookmarkEnd w:id="16"/>
       <w:r>
         <w:t xml:space="preserve"> </w:t>
       </w:r>
@@ -10813,11 +10771,11 @@
       <w:pPr>
         <w:pStyle w:val="Heading2"/>
       </w:pPr>
-      <w:bookmarkStart w:id="18" w:name="_Toc237559720"/>
+      <w:bookmarkStart w:id="17" w:name="_Toc237559720"/>
       <w:r>
         <w:t>1.5 Report Organization</w:t>
       </w:r>
-      <w:bookmarkEnd w:id="18"/>
+      <w:bookmarkEnd w:id="17"/>
     </w:p>
     <w:p>
       <w:pPr>
@@ -10988,13 +10946,13 @@
         <w:pStyle w:val="Heading1"/>
         <w:spacing w:after="240"/>
       </w:pPr>
-      <w:bookmarkStart w:id="19" w:name="_Toc237559721"/>
+      <w:bookmarkStart w:id="18" w:name="_Toc237559721"/>
       <w:r>
         <w:lastRenderedPageBreak/>
         <w:t>CHAPTER 2</w:t>
       </w:r>
-      <w:bookmarkStart w:id="20" w:name="_Toc201399424"/>
-      <w:bookmarkEnd w:id="19"/>
+      <w:bookmarkStart w:id="19" w:name="_Toc201399424"/>
+      <w:bookmarkEnd w:id="18"/>
       <w:r>
         <w:t xml:space="preserve"> </w:t>
       </w:r>
@@ -11004,184 +10962,199 @@
         <w:pStyle w:val="Heading1"/>
         <w:spacing w:after="240"/>
       </w:pPr>
-      <w:bookmarkStart w:id="21" w:name="_Toc237559722"/>
+      <w:bookmarkStart w:id="20" w:name="_Toc237559722"/>
       <w:r>
         <w:t>BACKGROUND STUDY AND LITERATURE REVIEW</w:t>
       </w:r>
+      <w:bookmarkEnd w:id="19"/>
       <w:bookmarkEnd w:id="20"/>
+      <w:r>
+        <w:t xml:space="preserve"> </w:t>
+      </w:r>
+    </w:p>
+    <w:p>
+      <w:pPr>
+        <w:pStyle w:val="Heading2"/>
+      </w:pPr>
+      <w:bookmarkStart w:id="21" w:name="_Toc237559723"/>
+      <w:r>
+        <w:t>2.1 Background Study</w:t>
+      </w:r>
       <w:bookmarkEnd w:id="21"/>
-      <w:r>
+    </w:p>
+    <w:p>
+      <w:r>
+        <w:t xml:space="preserve">The </w:t>
+      </w:r>
+      <w:r>
+        <w:t>science</w:t>
+      </w:r>
+      <w:r>
+        <w:t xml:space="preserve"> of </w:t>
+      </w:r>
+      <w:r>
+        <w:t xml:space="preserve">writing </w:t>
+      </w:r>
+      <w:r>
+        <w:t>is based on the principle that everyone’s “</w:t>
+      </w:r>
+      <w:proofErr w:type="spellStart"/>
+      <w:r>
+        <w:t>writeprint</w:t>
+      </w:r>
+      <w:proofErr w:type="spellEnd"/>
+      <w:r>
+        <w:t xml:space="preserve">” is one of a kind, so a person’s average sentence length, the usage of punctuation, the “lexicon,” or words selected for a document, and the complexity of their sentence structure all reveal personal styles. The complication is that even if Large Language Models (LLMs) sound fluent and, human, LLMs do not really write like people-they work by choosing the most predictable token as output that would logically follow another token. Thus, this procedure produces content that exhibits lower entropy ( predictability), and consistent sentence length. </w:t>
+      </w:r>
+    </w:p>
+    <w:p>
+      <w:r>
+        <w:t xml:space="preserve">Unlike them, human-writers are pretty haphazard-their sentences will take the longest lengths and widest range of Vocabulary for that style, and it goes without stating people may or may not make grammar mistakes and spelling. </w:t>
+      </w:r>
+    </w:p>
+    <w:p>
+      <w:r>
+        <w:t xml:space="preserve">The solution: to classify automatically, we have to extract attribute based quantitative vectors, and utilize those quantitative vectors for statistical models, </w:t>
+      </w:r>
+      <w:proofErr w:type="gramStart"/>
+      <w:r>
+        <w:t>instance based</w:t>
+      </w:r>
+      <w:proofErr w:type="gramEnd"/>
+      <w:r>
+        <w:t xml:space="preserve"> classification, as well as other modeling approaches. Statistical Natural language processing provides the basis for this. Using statistical NL P, we may readily observe the predictable regularity characteristic of these AI–written content by the analysis of: Perplexity of word sequences, and the typical deviation in sentence size lengths, which goes by the rather colorful name burstiness. Instances based machine learning back our initial statistical analyses. </w:t>
+      </w:r>
+    </w:p>
+    <w:p>
+      <w:r>
+        <w:t xml:space="preserve">When we use </w:t>
+      </w:r>
+      <w:proofErr w:type="spellStart"/>
+      <w:r>
+        <w:t>KNearest</w:t>
+      </w:r>
+      <w:proofErr w:type="spellEnd"/>
+      <w:r>
+        <w:t xml:space="preserve"> neighbors Classification (KN N), the document’s syntactic qualities (as shown in previous segments of the work, such as the number of parts of speech or a breakdown of clause lengths) can easily be mapped into multi- dimensional space and distances can also be made into the system with previously built human and AI examples. </w:t>
+      </w:r>
+    </w:p>
+    <w:p>
+      <w:r>
+        <w:t xml:space="preserve">Then we apply the classification based on K 5 nearest training vectors’ majority vote or take that into account with cosine measure. Additionally, using a Vector Space model, we will also </w:t>
+      </w:r>
+      <w:r>
+        <w:lastRenderedPageBreak/>
+        <w:t xml:space="preserve">measure the semantic similarity. The system determines the category that the document is best fitted into by taking an estimate of cosine angle from document’s vector with both a human or an AI prototypical document. </w:t>
+      </w:r>
+    </w:p>
+    <w:p>
+      <w:r>
+        <w:t xml:space="preserve">Nonetheless, we have discovered, and incorporated it in our study, that spelling as well as grammatical mistakes tend to be extremely significant stylistic features in classification. Since we utilize curated, edited-down textual content corpora to develop our Large Language </w:t>
+      </w:r>
+      <w:proofErr w:type="spellStart"/>
+      <w:r>
+        <w:t>Models,LLMs</w:t>
+      </w:r>
+      <w:proofErr w:type="spellEnd"/>
+      <w:r>
+        <w:t xml:space="preserve"> tend to produce completely grammatically correct content - every single sentence is perfected and error-less - , when humans’ creative composing frequently includes subtle spelling slip, the “wrong “spacing and also casual “syntax “. The ‘Grammatical Correction’ feature counts the frequency of this indicator and that’s applied at the conclusion of all prediction methods with diminishing influence that’s exerted towards the AI probabilities, as an outcome, a written sample rich in typos or grammar is considerably more apt to be from the humans, rather than the LLM.</w:t>
+      </w:r>
+    </w:p>
+    <w:p>
+      <w:pPr>
+        <w:pStyle w:val="Heading2"/>
+      </w:pPr>
+      <w:bookmarkStart w:id="22" w:name="_Toc237559724"/>
+      <w:r>
+        <w:t>2.2 Literature Review</w:t>
+      </w:r>
+      <w:bookmarkEnd w:id="22"/>
+    </w:p>
+    <w:p>
+      <w:pPr>
+        <w:rPr>
+          <w:bCs/>
+        </w:rPr>
+      </w:pPr>
+      <w:proofErr w:type="spellStart"/>
+      <w:r>
+        <w:rPr>
+          <w:bCs/>
+        </w:rPr>
+        <w:t>Gehrmann</w:t>
+      </w:r>
+      <w:proofErr w:type="spellEnd"/>
+      <w:r>
+        <w:rPr>
+          <w:bCs/>
+        </w:rPr>
+        <w:t xml:space="preserve"> et al. brought about the first big leap in automated text detection when they developed the Giant Language Model Test Room (GLTR). They showed that generative language models end up producing text with extremely predictable token transitions. GLTR uses the BERT large and GPT 2 117M models to score each token in the input text. It bases this score on the predicted rank in the model’s vocabulary distribution. So basically, if tokens consistently fall within the top 10 predicted words, that points to machine generation. But tokens outside the top 1,000 usually suggest human authorship. In their study, they reported that human reviewers actually improved their detection accuracy from 54% to 72% by using this visual tool.</w:t>
+      </w:r>
+      <w:r>
+        <w:rPr>
+          <w:bCs/>
+        </w:rPr>
+        <w:t xml:space="preserve"> [1]</w:t>
+      </w:r>
+    </w:p>
+    <w:p>
+      <w:pPr>
+        <w:rPr>
+          <w:bCs/>
+        </w:rPr>
+      </w:pPr>
+      <w:r>
+        <w:rPr>
+          <w:bCs/>
+        </w:rPr>
+        <w:t>People needed zero shot text detection without constantly retraining classifiers, so Mitchell et al.</w:t>
+      </w:r>
+      <w:r>
+        <w:rPr>
+          <w:bCs/>
+        </w:rPr>
         <w:t xml:space="preserve"> </w:t>
       </w:r>
-    </w:p>
-    <w:p>
-      <w:pPr>
-        <w:pStyle w:val="Heading2"/>
-      </w:pPr>
-      <w:bookmarkStart w:id="22" w:name="_Toc237559723"/>
-      <w:r>
-        <w:t>2.1 Background Study</w:t>
-      </w:r>
-      <w:bookmarkEnd w:id="22"/>
-    </w:p>
-    <w:p>
-      <w:r>
-        <w:t>The field of stylometry (the art or science of writing) is based on the principle that everyone’s “</w:t>
+      <w:r>
+        <w:rPr>
+          <w:bCs/>
+        </w:rPr>
+        <w:t xml:space="preserve">developed </w:t>
       </w:r>
       <w:proofErr w:type="spellStart"/>
       <w:r>
-        <w:t>writeprint</w:t>
+        <w:rPr>
+          <w:bCs/>
+        </w:rPr>
+        <w:t>DetectGPT</w:t>
       </w:r>
       <w:proofErr w:type="spellEnd"/>
       <w:r>
-        <w:t xml:space="preserve">” is one of a kind, so a person’s average sentence length, the usage of punctuation, the “lexicon,” or words selected for a document, and the complexity of their sentence structure all reveal personal styles. The complication is that even if Large Language Models (LLMs) sound fluent and, human, LLMs do not really write like people-they work by choosing the most predictable token as output that would logically follow another token. Thus, this procedure produces content that exhibits lower entropy ( predictability), and consistent sentence length. </w:t>
-      </w:r>
-    </w:p>
-    <w:p>
-      <w:r>
-        <w:t xml:space="preserve">Unlike them, human-writers are pretty haphazard-their sentences will take the longest lengths and widest range of Vocabulary for that style, and it goes without stating people may or may not make grammar mistakes and spelling. </w:t>
-      </w:r>
-    </w:p>
-    <w:p>
-      <w:r>
-        <w:t xml:space="preserve">The solution: to classify automatically, we have to extract attribute based quantitative vectors, and utilize those quantitative vectors for statistical models, </w:t>
-      </w:r>
-      <w:proofErr w:type="gramStart"/>
-      <w:r>
-        <w:t>instance based</w:t>
-      </w:r>
-      <w:proofErr w:type="gramEnd"/>
-      <w:r>
-        <w:t xml:space="preserve"> classification, as well as other modeling approaches. Statistical Natural language processing provides the basis for this. Using statistical NL P, we may readily observe the predictable regularity characteristic of these AI–written content by the analysis of: Perplexity of word sequences, and the typical deviation in sentence size lengths, which goes by the rather colorful name burstiness. Instances based machine learning back our initial statistical analyses. </w:t>
-      </w:r>
-    </w:p>
-    <w:p>
-      <w:r>
-        <w:t xml:space="preserve">When we use </w:t>
+        <w:rPr>
+          <w:bCs/>
+        </w:rPr>
+        <w:t xml:space="preserve">. It’s a novel zero shot detection method based on probability curvature. The researchers found out that AI generated passages tend to lie in regions of negative curvature of the source model’s log probability function, while human text just doesn’t exhibit this property. </w:t>
       </w:r>
       <w:proofErr w:type="spellStart"/>
       <w:r>
-        <w:t>KNearest</w:t>
+        <w:rPr>
+          <w:bCs/>
+        </w:rPr>
+        <w:t>DetectGPT</w:t>
       </w:r>
       <w:proofErr w:type="spellEnd"/>
       <w:r>
-        <w:t xml:space="preserve"> neighbors Classification (KN N), the document’s syntactic qualities (as shown in previous segments of the work, such as the number of parts of speech or a breakdown of clause lengths) can easily be mapped into multi- dimensional space and distances can also be made into the system with previously built human and AI examples. </w:t>
-      </w:r>
-    </w:p>
-    <w:p>
-      <w:r>
+        <w:rPr>
+          <w:bCs/>
+        </w:rPr>
+        <w:t xml:space="preserve"> works by computing the log probability of the original </w:t>
+      </w:r>
+      <w:r>
+        <w:rPr>
+          <w:bCs/>
+        </w:rPr>
         <w:lastRenderedPageBreak/>
-        <w:t xml:space="preserve">Then we apply the classification based on K 5 nearest training vectors’ majority vote or take that into account with cosine measure. Additionally, using a Vector Space model, we will also measure the semantic similarity. The system determines the category that the document is best fitted into by taking an estimate of cosine angle from document’s vector with both a human or an AI prototypical document. </w:t>
-      </w:r>
-    </w:p>
-    <w:p>
-      <w:r>
-        <w:t xml:space="preserve">Nonetheless, we have discovered, and incorporated it in our study, that spelling as well as grammatical mistakes tend to be extremely significant stylistic features in classification. Since we utilize curated, edited-down textual content corpora to develop our Large Language </w:t>
-      </w:r>
-      <w:proofErr w:type="spellStart"/>
-      <w:r>
-        <w:t>Models,LLMs</w:t>
-      </w:r>
-      <w:proofErr w:type="spellEnd"/>
-      <w:r>
-        <w:t xml:space="preserve"> tend to produce completely grammatically correct content - every single sentence is perfected and error-less - , when humans’ creative composing frequently includes subtle spelling slip, the “wrong “spacing and also casual “syntax “. The ‘Grammatical Correction’ feature counts the frequency of this indicator and that’s applied at the conclusion of all prediction methods with diminishing influence that’s exerted towards the AI probabilities, as an outcome, a written sample rich in typos or grammar is considerably more apt to be from the humans, rather than the LLM.</w:t>
-      </w:r>
-    </w:p>
-    <w:p>
-      <w:pPr>
-        <w:pStyle w:val="Heading2"/>
-      </w:pPr>
-      <w:bookmarkStart w:id="23" w:name="_Toc237559724"/>
-      <w:r>
-        <w:t>2.2 Literature Review</w:t>
-      </w:r>
-      <w:bookmarkEnd w:id="23"/>
-    </w:p>
-    <w:p>
-      <w:pPr>
-        <w:rPr>
-          <w:bCs/>
-        </w:rPr>
-      </w:pPr>
-      <w:proofErr w:type="spellStart"/>
-      <w:r>
-        <w:rPr>
-          <w:bCs/>
-        </w:rPr>
-        <w:t>Gehrmann</w:t>
-      </w:r>
-      <w:proofErr w:type="spellEnd"/>
-      <w:r>
-        <w:rPr>
-          <w:bCs/>
-        </w:rPr>
-        <w:t xml:space="preserve"> et al. brought about the first big leap in automated text detection when they developed the Giant Language Model Test Room (GLTR). They showed that generative language models end up producing text with extremely predictable token transitions. GLTR uses the BERT large and GPT 2 117M models to score each token in the input text. It bases this score on the predicted rank in the model’s vocabulary distribution. So basically, if tokens consistently fall within the top 10 predicted words, that points to machine generation. But tokens outside the top 1,000 usually suggest human authorship. In their study, they reported that human reviewers actually improved their detection accuracy from 54% to 72% by using this visual tool.</w:t>
-      </w:r>
-      <w:r>
-        <w:rPr>
-          <w:bCs/>
-        </w:rPr>
-        <w:t xml:space="preserve"> [1]</w:t>
-      </w:r>
-    </w:p>
-    <w:p>
-      <w:pPr>
-        <w:rPr>
-          <w:bCs/>
-        </w:rPr>
-      </w:pPr>
-      <w:r>
-        <w:rPr>
-          <w:bCs/>
-        </w:rPr>
-        <w:t>People needed zero shot text detection without constantly retraining classifiers, so Mitchell et al.</w:t>
-      </w:r>
-      <w:r>
-        <w:rPr>
-          <w:bCs/>
-        </w:rPr>
-        <w:t xml:space="preserve"> </w:t>
-      </w:r>
-      <w:r>
-        <w:rPr>
-          <w:bCs/>
-        </w:rPr>
-        <w:t xml:space="preserve">developed </w:t>
-      </w:r>
-      <w:proofErr w:type="spellStart"/>
-      <w:r>
-        <w:rPr>
-          <w:bCs/>
-        </w:rPr>
-        <w:t>DetectGPT</w:t>
-      </w:r>
-      <w:proofErr w:type="spellEnd"/>
-      <w:r>
-        <w:rPr>
-          <w:bCs/>
-        </w:rPr>
-        <w:t xml:space="preserve">. It’s a novel zero shot detection method based on probability curvature. The researchers found out that AI generated passages tend to lie in regions of </w:t>
-      </w:r>
-      <w:r>
-        <w:rPr>
-          <w:bCs/>
-        </w:rPr>
-        <w:lastRenderedPageBreak/>
-        <w:t xml:space="preserve">negative curvature of the source model’s log probability function, while human text just doesn’t exhibit this property. </w:t>
-      </w:r>
-      <w:proofErr w:type="spellStart"/>
-      <w:r>
-        <w:rPr>
-          <w:bCs/>
-        </w:rPr>
-        <w:t>DetectGPT</w:t>
-      </w:r>
-      <w:proofErr w:type="spellEnd"/>
-      <w:r>
-        <w:rPr>
-          <w:bCs/>
-        </w:rPr>
-        <w:t xml:space="preserve"> works by computing the log probability of the original passage and comparing it against the average log probabilities of random perturbations generated by a mask filling model (such as T5). If that original passage has a way higher log probability than its perturbations, the system classifies it as machine generated. This method actually achieved an AUROC of 0.95 on GPT 2 outputs. The main weakness is that it requires access to the source model itself, which limits its applicability to open weight models.</w:t>
+        <w:t>passage and comparing it against the average log probabilities of random perturbations generated by a mask filling model (such as T5). If that original passage has a way higher log probability than its perturbations, the system classifies it as machine generated. This method actually achieved an AUROC of 0.95 on GPT 2 outputs. The main weakness is that it requires access to the source model itself, which limits its applicability to open weight models.</w:t>
       </w:r>
       <w:r>
         <w:rPr>
@@ -11411,14 +11384,14 @@
         <w:pStyle w:val="Heading1"/>
         <w:ind w:left="224" w:right="278"/>
       </w:pPr>
-      <w:bookmarkStart w:id="24" w:name="_Toc201399427"/>
-      <w:bookmarkStart w:id="25" w:name="_Toc237559725"/>
+      <w:bookmarkStart w:id="23" w:name="_Toc201399427"/>
+      <w:bookmarkStart w:id="24" w:name="_Toc237559725"/>
       <w:r>
         <w:lastRenderedPageBreak/>
         <w:t>CHAPTER 3</w:t>
       </w:r>
+      <w:bookmarkEnd w:id="23"/>
       <w:bookmarkEnd w:id="24"/>
-      <w:bookmarkEnd w:id="25"/>
       <w:r>
         <w:t xml:space="preserve"> </w:t>
       </w:r>
@@ -11428,35 +11401,35 @@
         <w:pStyle w:val="Heading1"/>
         <w:ind w:left="224" w:right="278"/>
       </w:pPr>
-      <w:bookmarkStart w:id="26" w:name="_Toc237559726"/>
+      <w:bookmarkStart w:id="25" w:name="_Toc237559726"/>
       <w:r>
         <w:t>SYSTEM ANALYSIS AND DESIGN</w:t>
       </w:r>
+      <w:bookmarkEnd w:id="25"/>
+    </w:p>
+    <w:p>
+      <w:pPr>
+        <w:pStyle w:val="Heading2"/>
+      </w:pPr>
+      <w:bookmarkStart w:id="26" w:name="_Toc231875504"/>
+      <w:bookmarkStart w:id="27" w:name="_Toc237559727"/>
+      <w:r>
+        <w:t>3.1 System Analysis</w:t>
+      </w:r>
       <w:bookmarkEnd w:id="26"/>
-    </w:p>
-    <w:p>
-      <w:pPr>
-        <w:pStyle w:val="Heading2"/>
-      </w:pPr>
-      <w:bookmarkStart w:id="27" w:name="_Toc231875504"/>
-      <w:bookmarkStart w:id="28" w:name="_Toc237559727"/>
-      <w:r>
-        <w:t>3.1 System Analysis</w:t>
-      </w:r>
       <w:bookmarkEnd w:id="27"/>
+    </w:p>
+    <w:p>
+      <w:pPr>
+        <w:pStyle w:val="Heading3"/>
+      </w:pPr>
+      <w:bookmarkStart w:id="28" w:name="_Toc231875505"/>
+      <w:bookmarkStart w:id="29" w:name="_Toc237559728"/>
+      <w:r>
+        <w:t>3.1.1 Requirement Analysis</w:t>
+      </w:r>
       <w:bookmarkEnd w:id="28"/>
-    </w:p>
-    <w:p>
-      <w:pPr>
-        <w:pStyle w:val="Heading3"/>
-      </w:pPr>
-      <w:bookmarkStart w:id="29" w:name="_Toc231875505"/>
-      <w:bookmarkStart w:id="30" w:name="_Toc237559728"/>
-      <w:r>
-        <w:t>3.1.1 Requirement Analysis</w:t>
-      </w:r>
       <w:bookmarkEnd w:id="29"/>
-      <w:bookmarkEnd w:id="30"/>
     </w:p>
     <w:p>
       <w:pPr>
@@ -12146,11 +12119,11 @@
       <w:pPr>
         <w:pStyle w:val="Heading3"/>
       </w:pPr>
-      <w:bookmarkStart w:id="31" w:name="_Toc237559729"/>
+      <w:bookmarkStart w:id="30" w:name="_Toc237559729"/>
       <w:r>
         <w:t>3.1.2 Feasibility Analysis</w:t>
       </w:r>
-      <w:bookmarkEnd w:id="31"/>
+      <w:bookmarkEnd w:id="30"/>
     </w:p>
     <w:p>
       <w:pPr>
@@ -12909,19 +12882,14 @@
       <w:pPr>
         <w:pStyle w:val="Heading3"/>
       </w:pPr>
-      <w:bookmarkStart w:id="32" w:name="_Toc237559730"/>
       <w:r>
         <w:lastRenderedPageBreak/>
         <w:t>3.1.3 Object Modeling using Class Diagram</w:t>
       </w:r>
-      <w:bookmarkEnd w:id="32"/>
-    </w:p>
-    <w:p>
-      <w:r>
-        <w:t>The system's class diagram effectively describes our client-side JavaScript engine's modular design. It splits the application logic into five distinct classes:  Parses, Sentence Perplexity, Vector Similarities, Instance Based Classification, Render SVG visualization</w:t>
-      </w:r>
-      <w:r>
-        <w:t>.</w:t>
+    </w:p>
+    <w:p>
+      <w:r>
+        <w:t>The system's class diagram describes the modular architecture of the client-side detection engine. The design splits the application logic into five distinct classes: Parses, Sentence Perplexity, Instance Based Classification, Vector Similarities, and Render SVG visualization. These classes encapsulate attribute structures, operational methods, explicit association names, and standard UML multiplicity indicators (1, 1..*) required for document ingestion, feature extraction, statistical NLP computation, k-NN classification, vector space similarity matching, and dynamic SVG dashboard rendering.</w:t>
       </w:r>
     </w:p>
     <w:p>
@@ -12934,12 +12902,11 @@
       <w:r>
         <w:rPr>
           <w:b/>
-          <w:noProof/>
         </w:rPr>
         <w:drawing>
-          <wp:inline distT="0" distB="0" distL="0" distR="0" wp14:anchorId="51BAB31B" wp14:editId="47BB7897">
-            <wp:extent cx="5715000" cy="4067810"/>
-            <wp:effectExtent l="0" t="0" r="0" b="8890"/>
+          <wp:inline distT="0" distB="0" distL="0" distR="0" wp14:anchorId="5780C555" wp14:editId="66136DED">
+            <wp:extent cx="5964555" cy="4890052"/>
+            <wp:effectExtent l="0" t="0" r="0" b="6350"/>
             <wp:docPr id="15" name="Picture 15"/>
             <wp:cNvGraphicFramePr>
               <a:graphicFrameLocks xmlns:a="http://schemas.openxmlformats.org/drawingml/2006/main" noChangeAspect="1"/>
@@ -12960,7 +12927,7 @@
                   <pic:spPr>
                     <a:xfrm>
                       <a:off x="0" y="0"/>
-                      <a:ext cx="5715000" cy="4067810"/>
+                      <a:ext cx="5998450" cy="4917841"/>
                     </a:xfrm>
                     <a:prstGeom prst="rect">
                       <a:avLst/>
@@ -12978,89 +12945,119 @@
         <w:jc w:val="center"/>
         <w:rPr>
           <w:b/>
+          <w:bCs/>
         </w:rPr>
       </w:pPr>
       <w:r>
         <w:rPr>
           <w:b/>
-        </w:rPr>
-        <w:t xml:space="preserve">Figure 3.3: </w:t>
-      </w:r>
-      <w:r>
+          <w:bCs/>
+        </w:rPr>
+        <w:t>Figure 3.3: Class Diagram for AI Text Detector</w:t>
+      </w:r>
+    </w:p>
+    <w:p>
+      <w:r>
+        <w:lastRenderedPageBreak/>
+        <w:t xml:space="preserve">Figure 3.3 explains the static architecture, encapsulated members, and UML multiplicity relationships across the five core system classes. The Parses class encapsulates document, status, wordCount, and format along with operational methods extractText(), readAsDocx(), and getWordCount(). The Sentence Perplexity class encapsulates perplexityLevel, burstinessValue, avgSentenceLength, and aiLikelihood with methods calculatePerplexity(), calculateBurstiness(), computeTTR(), getAiWordDensity(), getSentenceLengthVariance(), and getPerplexityVerdict(). The Instance Based Classification class encapsulates algorithm, neighborVotes, predictedClass, and confidenceScore with methods classify(), computeEuclideanDistance(), getNearestNeighbors(), getVerdictSummary(), and updateTrainingSet(). The Vector Similarities class encapsulates aiModelMatch, humanModelMatch, vectorCluster, and cosineDistance with methods computeCosineSimilarity(), extractNgramFrequency(), comparePrototypes(), getFeatureVector(), normalizeVector(), and getSimilarityIndex(). Finally, the Render SVG visualization class encapsulates chartType, verdictBanner, colorIndicator, and renderMode with methods renderGaugeChart(), renderScatterPlot(), renderRadarChart(), animateGaugePointer(), and updateVerdictDisplay(). Association multiplicities establish a 1:* relationship from Parses to Sentence Perplexity, Instance Based Classification, and Vector Similarities ("extracts &amp; feeds text"), *:1 </w:t>
+      </w:r>
+      <w:proofErr w:type="gramStart"/>
+      <w:r>
+        <w:t>relationships</w:t>
+      </w:r>
+      <w:proofErr w:type="gramEnd"/>
+      <w:r>
+        <w:t xml:space="preserve"> from Sentence Perplexity ("feeds metrics") and Vector Similarities ("compares") into Instance Based Classification, and a 1:1 relationship from Instance Based Classification to Render SVG visualization ("renders scores").</w:t>
+      </w:r>
+    </w:p>
+    <w:p>
+      <w:pPr>
+        <w:pStyle w:val="Heading3"/>
+      </w:pPr>
+      <w:r>
+        <w:t>3.1.4 Object Modeling using Object Diagram</w:t>
+      </w:r>
+    </w:p>
+    <w:p>
+      <w:r>
+        <w:t>The object diagram represents a concrete runtime snapshot of active object instances during an operational text scan session. It depicts instantiated objects of the five primary classes—docParser : Parses, sentencePerplexity : Sentence Perplexity, classifier : Instance Based Classification, vectorSimilarity : Vector Similarities, and visualizer : Render SVG visualization—populated with specific runtime slot values, instantiated operational methods, and active 1:1 runtime link multiplicities.</w:t>
+      </w:r>
+    </w:p>
+    <w:p>
+      <w:pPr>
+        <w:jc w:val="center"/>
+      </w:pPr>
+      <w:r>
+        <w:lastRenderedPageBreak/>
+        <w:drawing>
+          <wp:inline distT="0" distB="0" distL="0" distR="0" wp14:anchorId="0886214C" wp14:editId="7D118311">
+            <wp:extent cx="5850255" cy="5757078"/>
+            <wp:effectExtent l="0" t="0" r="0" b="0"/>
+            <wp:docPr id="16" name="Picture 16"/>
+            <wp:cNvGraphicFramePr>
+              <a:graphicFrameLocks xmlns:a="http://schemas.openxmlformats.org/drawingml/2006/main" noChangeAspect="1"/>
+            </wp:cNvGraphicFramePr>
+            <a:graphic xmlns:a="http://schemas.openxmlformats.org/drawingml/2006/main">
+              <a:graphicData uri="http://schemas.openxmlformats.org/drawingml/2006/picture">
+                <pic:pic xmlns:pic="http://schemas.openxmlformats.org/drawingml/2006/picture">
+                  <pic:nvPicPr>
+                    <pic:cNvPr id="1" name=""/>
+                    <pic:cNvPicPr/>
+                  </pic:nvPicPr>
+                  <pic:blipFill>
+                    <a:blip r:embed="rId16"/>
+                    <a:stretch>
+                      <a:fillRect/>
+                    </a:stretch>
+                  </pic:blipFill>
+                  <pic:spPr>
+                    <a:xfrm>
+                      <a:off x="0" y="0"/>
+                      <a:ext cx="5866915" cy="5773472"/>
+                    </a:xfrm>
+                    <a:prstGeom prst="rect">
+                      <a:avLst/>
+                    </a:prstGeom>
+                  </pic:spPr>
+                </pic:pic>
+              </a:graphicData>
+            </a:graphic>
+          </wp:inline>
+        </w:drawing>
+      </w:r>
+    </w:p>
+    <w:p>
+      <w:pPr>
+        <w:jc w:val="center"/>
         <w:rPr>
           <w:b/>
-        </w:rPr>
-        <w:t>Object</w:t>
-      </w:r>
+          <w:bCs/>
+        </w:rPr>
+      </w:pPr>
       <w:r>
         <w:rPr>
           <w:b/>
-        </w:rPr>
-        <w:t xml:space="preserve"> Diagram for AI Text Detector</w:t>
-      </w:r>
-    </w:p>
-    <w:p>
-      <w:r>
-        <w:t xml:space="preserve">If you look at Figure 3.3, it illustrates how the classes relate to each other inside the </w:t>
-      </w:r>
-      <w:proofErr w:type="gramStart"/>
-      <w:r>
-        <w:t>client side</w:t>
-      </w:r>
-      <w:proofErr w:type="gramEnd"/>
-      <w:r>
-        <w:t xml:space="preserve"> detection pipeline. First, the FileParser class takes care of extracting text from local documents</w:t>
-      </w:r>
-      <w:r>
-        <w:t xml:space="preserve"> </w:t>
-      </w:r>
-      <w:r>
-        <w:t xml:space="preserve">it supports .docx, .pdf, .txt, and .md file structures. Then it passes that raw plain text over to the PerplexityAnalyzer. This analyzer tokenizes the text into sentences, before calculating the sentence length standard deviation and Type Token Ratio. From there, the KNNClassifier pulls a 5D feature vector from the tokenized text and performs Euclidean distance classification against our hardcoded dataset. Meanwhile, the </w:t>
-      </w:r>
-      <w:proofErr w:type="spellStart"/>
-      <w:r>
-        <w:t>CosineSimilarityAnalyzer</w:t>
-      </w:r>
-      <w:proofErr w:type="spellEnd"/>
-      <w:r>
-        <w:t xml:space="preserve"> looks at the vector angle similarity between the actual document and some established human/AI prototype </w:t>
+          <w:bCs/>
+        </w:rPr>
+        <w:t>Figure 3.4: Object Diagram for AI Text Detector</w:t>
+      </w:r>
+    </w:p>
+    <w:p>
+      <w:r>
+        <w:t xml:space="preserve">Figure 3.4 illustrates the instantiated runtime state of the system during the analysis of the document "sample_essay.docx". The active objects include docParser : Parses (document = "sample_essay.docx", status = "Text Extracted Successfully", wordCount = 450 words, format = "Plain Text Buffer"), sentencePerplexity : Sentence Perplexity (perplexityLevel = "High (Uniform Pattern)", burstinessValue = "Low Sentence Variation", avgSentenceLength = 20.4 words, aiLikelihood = "88% AI-like rhythm"), classifier : Instance Based Classification </w:t>
       </w:r>
       <w:r>
         <w:lastRenderedPageBreak/>
-        <w:t xml:space="preserve">profiles. Finally, the </w:t>
-      </w:r>
-      <w:proofErr w:type="spellStart"/>
-      <w:r>
-        <w:t>ChartRenderer</w:t>
-      </w:r>
-      <w:proofErr w:type="spellEnd"/>
-      <w:r>
-        <w:t xml:space="preserve"> takes the results from all these analyzers and draws up interactive SVG charts</w:t>
-      </w:r>
-      <w:r>
-        <w:t xml:space="preserve"> </w:t>
-      </w:r>
-      <w:r>
-        <w:t>like the gauge, scatter plot, and radar web</w:t>
-      </w:r>
-      <w:r>
-        <w:t xml:space="preserve"> </w:t>
-      </w:r>
-      <w:r>
-        <w:t>right in the dashboard.</w:t>
+        <w:t>(algorithm = "K-Nearest Neighbors (K=5)", neighborVotes = "4 AI Matches, 1 Human", predictedClass = "AI Generated Text", confidenceScore = 91.5%), vectorSimilarity : Vector Similarities (aiModelMatch = "85% Similarity", humanModelMatch = "25% Similarity", vectorCluster = "AI Language Patterns", cosineDistance = 0.152), and visualizer : Render SVG visualization (chartType = "Radial Speedometer Gauge", verdictBanner = "AI-GENERATED (91.5%)", colorIndicator = "Red / Warning Accent", renderMode = "Vector Graphic Display"). During execution, active 1:1 runtime links connect docParser to sentencePerplexity, classifier, and vectorSimilarity to transfer the extracted 450-word buffer. In turn, sentencePerplexity and vectorSimilarity feed their complexity metrics and cosine similarity scores to classifier, which computes the 91.5% confidence score and passes it directly to visualizer to render the radial speedometer gauge and alert banner on the dashboard.</w:t>
       </w:r>
     </w:p>
     <w:p>
       <w:pPr>
         <w:pStyle w:val="Heading3"/>
       </w:pPr>
-      <w:bookmarkStart w:id="33" w:name="_Toc231875508"/>
-      <w:bookmarkStart w:id="34" w:name="_Toc237559731"/>
-      <w:r>
-        <w:t>3.1.4 Dynamic Modelling using State and Sequence Diagrams</w:t>
-      </w:r>
-      <w:bookmarkEnd w:id="33"/>
-      <w:bookmarkEnd w:id="34"/>
+      <w:r>
+        <w:t>3.1.5 Dynamic Modelling using State and Sequence Diagrams</w:t>
+      </w:r>
     </w:p>
     <w:p>
       <w:r>
@@ -13124,50 +13121,6 @@
       <w:r>
         <w:tab/>
       </w:r>
-    </w:p>
-    <w:p>
-      <w:pPr>
-        <w:jc w:val="center"/>
-      </w:pPr>
-    </w:p>
-    <w:p>
-      <w:pPr>
-        <w:jc w:val="center"/>
-        <w:rPr>
-          <w:b/>
-        </w:rPr>
-      </w:pPr>
-    </w:p>
-    <w:p>
-      <w:pPr>
-        <w:jc w:val="center"/>
-        <w:rPr>
-          <w:b/>
-        </w:rPr>
-      </w:pPr>
-    </w:p>
-    <w:p>
-      <w:pPr>
-        <w:jc w:val="center"/>
-        <w:rPr>
-          <w:b/>
-        </w:rPr>
-      </w:pPr>
-    </w:p>
-    <w:p>
-      <w:pPr>
-        <w:jc w:val="center"/>
-        <w:rPr>
-          <w:b/>
-        </w:rPr>
-      </w:pPr>
-    </w:p>
-    <w:p>
-      <w:pPr>
-        <w:rPr>
-          <w:b/>
-        </w:rPr>
-      </w:pPr>
     </w:p>
     <w:p>
       <w:pPr>
@@ -13185,10 +13138,10 @@
           <wp:anchor distT="0" distB="0" distL="114300" distR="114300" simplePos="0" relativeHeight="251665408" behindDoc="1" locked="0" layoutInCell="1" allowOverlap="1" wp14:anchorId="35D0FF1A" wp14:editId="2DD7503A">
             <wp:simplePos x="0" y="0"/>
             <wp:positionH relativeFrom="column">
-              <wp:posOffset>1910715</wp:posOffset>
+              <wp:posOffset>1803400</wp:posOffset>
             </wp:positionH>
             <wp:positionV relativeFrom="paragraph">
-              <wp:posOffset>-53340</wp:posOffset>
+              <wp:posOffset>-149498</wp:posOffset>
             </wp:positionV>
             <wp:extent cx="2484540" cy="4572898"/>
             <wp:effectExtent l="0" t="0" r="0" b="0"/>
@@ -13205,7 +13158,7 @@
                     <pic:cNvPicPr/>
                   </pic:nvPicPr>
                   <pic:blipFill>
-                    <a:blip r:embed="rId16">
+                    <a:blip r:embed="rId17">
                       <a:extLst>
                         <a:ext uri="{28A0092B-C50C-407E-A947-70E740481C1C}">
                           <a14:useLocalDpi xmlns:a14="http://schemas.microsoft.com/office/drawing/2010/main" val="0"/>
@@ -13315,27 +13268,14 @@
       <w:r>
         <w:rPr>
           <w:b/>
-        </w:rPr>
-        <w:t>Figure 3.4: State Diagram for AI Text Detector</w:t>
-      </w:r>
-    </w:p>
-    <w:p>
-      <w:r>
-        <w:t>F</w:t>
-      </w:r>
-      <w:r>
-        <w:t>igure 3.4 details all those state transitions and demonstrates the complete life cycle of operations for the AI Text Detector system: we start off with hollow blank start circle indicating it is ready, then as we submit text/drag a doc in, it transit to ‘Input received’ state which automatically transition to ‘Validate’ state, should the length of submitted/dragged text be lower than 10 words it should immediately transit to ‘validation failed’ state and throw an error to the user, Otherwise, proceed to ‘</w:t>
-      </w:r>
-      <w:proofErr w:type="spellStart"/>
-      <w:r>
-        <w:t>tokenisation</w:t>
-      </w:r>
-      <w:proofErr w:type="spellEnd"/>
-      <w:r>
-        <w:t>’ to identify all sentences and words within the text on the local end of the system, following all seven AI engines calculate their own individual analysis’ score which would finally lead up to state ‘Ensemble scoring’ to incorporate all analysis from each engines, applying ‘Grammar Perfection Score’ to act as a multiplier discount, from the above computation (result in float) draw SVG chart visualization and heatmap via ‘Chart renderer’ which then result in the ‘Result display’ state and return to ‘Idle’ as it is completed. Solid circle denotes the final state (end of life cycle)</w:t>
-      </w:r>
-      <w:r>
-        <w:t>.</w:t>
+          <w:bCs/>
+        </w:rPr>
+        <w:t>Figure 3.5: State Diagram for AI Text Detector</w:t>
+      </w:r>
+    </w:p>
+    <w:p>
+      <w:r>
+        <w:t>Figure 3.5 details all those state transitions and demonstrates the complete life cycle of operations for the AI Text Detector system: we start off with hollow blank start circle indicating it is ready, then as we submit text/drag a doc in, it transit to ‘Input received’ state which automatically transition to ‘Validate’ state, should the length of submitted/dragged text be lower than 10 words it should immediately transit to ‘validation failed’ state and throw an error to the user, Otherwise, proceed to ‘tokenisation’ to identify all sentences and words within the text on the local end of the system, following all seven AI engines calculate their own individual analysis’ score which would finally lead up to state ‘Ensemble scoring’ to incorporate all analysis from each engines, applying ‘Grammar Perfection Score’ to act as a multiplier discount, from the above computation (result in float) draw SVG chart visualization and heatmap via ‘Chart renderer’ which then result in the ‘Result display’ state and return to ‘Idle’ as it is completed. Solid circle denotes the final state (end of life cycle).</w:t>
       </w:r>
     </w:p>
     <w:p>
@@ -13348,151 +13288,13 @@
       <w:r>
         <w:rPr>
           <w:b/>
-          <w:noProof/>
         </w:rPr>
         <w:lastRenderedPageBreak/>
         <w:drawing>
-          <wp:inline distT="0" distB="0" distL="0" distR="0" wp14:anchorId="60008CDA" wp14:editId="7F186DBB">
-            <wp:extent cx="6215482" cy="5868035"/>
-            <wp:effectExtent l="0" t="0" r="0" b="0"/>
+          <wp:inline distT="0" distB="0" distL="0" distR="0" wp14:anchorId="7EDE282F" wp14:editId="452BDA31">
+            <wp:extent cx="5715000" cy="5235575"/>
+            <wp:effectExtent l="0" t="0" r="0" b="3175"/>
             <wp:docPr id="13" name="Picture 13"/>
-            <wp:cNvGraphicFramePr>
-              <a:graphicFrameLocks xmlns:a="http://schemas.openxmlformats.org/drawingml/2006/main" noChangeAspect="1"/>
-            </wp:cNvGraphicFramePr>
-            <a:graphic xmlns:a="http://schemas.openxmlformats.org/drawingml/2006/main">
-              <a:graphicData uri="http://schemas.openxmlformats.org/drawingml/2006/picture">
-                <pic:pic xmlns:pic="http://schemas.openxmlformats.org/drawingml/2006/picture">
-                  <pic:nvPicPr>
-                    <pic:cNvPr id="1" name=""/>
-                    <pic:cNvPicPr/>
-                  </pic:nvPicPr>
-                  <pic:blipFill>
-                    <a:blip r:embed="rId17"/>
-                    <a:stretch>
-                      <a:fillRect/>
-                    </a:stretch>
-                  </pic:blipFill>
-                  <pic:spPr>
-                    <a:xfrm>
-                      <a:off x="0" y="0"/>
-                      <a:ext cx="6242461" cy="5893506"/>
-                    </a:xfrm>
-                    <a:prstGeom prst="rect">
-                      <a:avLst/>
-                    </a:prstGeom>
-                  </pic:spPr>
-                </pic:pic>
-              </a:graphicData>
-            </a:graphic>
-          </wp:inline>
-        </w:drawing>
-      </w:r>
-    </w:p>
-    <w:p>
-      <w:pPr>
-        <w:jc w:val="center"/>
-        <w:rPr>
-          <w:b/>
-          <w:bCs/>
-        </w:rPr>
-      </w:pPr>
-      <w:r>
-        <w:rPr>
-          <w:b/>
-        </w:rPr>
-        <w:t>Figure 3.5: Sequence Diagram for AI Text Detector</w:t>
-      </w:r>
-    </w:p>
-    <w:p>
-      <w:r>
-        <w:t xml:space="preserve">In Figure 3.5, The process can actually start in a few different ways; either the user manually either gives me either the file or the input text, or something kind of happening in the background that is triggered via my keystroke listener which is actually bounced to 1 second. If we take a File that the user uploads, that gets brought into the client through the File API in the browser; the browser knows how to read through dot X, dot PDF, dot TXT and dot M D files and we just bring that local raw text into the system, figure out how many words that we </w:t>
-      </w:r>
-      <w:r>
-        <w:lastRenderedPageBreak/>
-        <w:t xml:space="preserve">have here, if its less than ten words we just stop and warning up that there’s a minimum of word count, otherwise take those words break them into our sentences as our tokens and words then I pass it onto the various different six core </w:t>
-      </w:r>
-      <w:proofErr w:type="spellStart"/>
-      <w:r>
-        <w:t>classifyer</w:t>
-      </w:r>
-      <w:proofErr w:type="spellEnd"/>
-      <w:r>
-        <w:t xml:space="preserve"> engines that we have, as well as one additional engine called </w:t>
-      </w:r>
-      <w:proofErr w:type="spellStart"/>
-      <w:r>
-        <w:t>GrammarCalibration</w:t>
-      </w:r>
-      <w:proofErr w:type="spellEnd"/>
-      <w:r>
-        <w:t xml:space="preserve">. </w:t>
-      </w:r>
-      <w:proofErr w:type="gramStart"/>
-      <w:r>
-        <w:t>So</w:t>
-      </w:r>
-      <w:proofErr w:type="gramEnd"/>
-      <w:r>
-        <w:t xml:space="preserve"> they will take those same tokens and send them to six classifiers and one grammar calibration mechanism and they will all send back there prediction with a score . </w:t>
-      </w:r>
-      <w:proofErr w:type="spellStart"/>
-      <w:r>
-        <w:t>Myensemblecontroller</w:t>
-      </w:r>
-      <w:proofErr w:type="spellEnd"/>
-      <w:r>
-        <w:t xml:space="preserve"> takes those six predictions and sends me back a weighted sum; the six classifier predictions are sent back and now the </w:t>
-      </w:r>
-      <w:proofErr w:type="spellStart"/>
-      <w:r>
-        <w:t>Grammerperfections</w:t>
-      </w:r>
-      <w:proofErr w:type="spellEnd"/>
-      <w:r>
-        <w:t xml:space="preserve"> Score will discount down some of those overall percentages. Bottom line is the scaled probability can be sent over to my Chart renderer and go out and print me out that Gauge, scatter diagram, and spider chart. Ultimately building out a heatmap for a particular sentence that may have come in</w:t>
-      </w:r>
-      <w:r>
-        <w:t>.</w:t>
-      </w:r>
-    </w:p>
-    <w:p>
-      <w:pPr>
-        <w:pStyle w:val="Heading3"/>
-      </w:pPr>
-      <w:bookmarkStart w:id="35" w:name="_Toc237559732"/>
-      <w:r>
-        <w:t>3.1.5 Process Modelling Using Activity Diagrams</w:t>
-      </w:r>
-      <w:bookmarkEnd w:id="35"/>
-    </w:p>
-    <w:p>
-      <w:r>
-        <w:t>T</w:t>
-      </w:r>
-      <w:r>
-        <w:t>his activity diagram lays out the entire operational workflow for the document analysis pipeline. It all starts up the moment a user pastes in some text or drops a file into the app. After checking to make sure the text meets the length requirements, the system splits it all up into sentences and words. Then it just runs the six classification modules, figures out the weighted ensemble score, and tacks on the grammar calibration discount. Finally, it spits out the final AI probability along with the SVG charts and the heatmap display.</w:t>
-      </w:r>
-    </w:p>
-    <w:p>
-      <w:pPr>
-        <w:jc w:val="center"/>
-      </w:pPr>
-      <w:r>
-        <w:rPr>
-          <w:noProof/>
-        </w:rPr>
-        <w:lastRenderedPageBreak/>
-        <w:t xml:space="preserve">                </w:t>
-      </w:r>
-      <w:r>
-        <w:rPr>
-          <w:noProof/>
-        </w:rPr>
-        <w:drawing>
-          <wp:inline distT="0" distB="0" distL="0" distR="0" wp14:anchorId="278CB038" wp14:editId="619B4E6A">
-            <wp:extent cx="5753035" cy="5907405"/>
-            <wp:effectExtent l="0" t="0" r="635" b="0"/>
-            <wp:docPr id="8" name="Picture 8"/>
             <wp:cNvGraphicFramePr>
               <a:graphicFrameLocks xmlns:a="http://schemas.openxmlformats.org/drawingml/2006/main" noChangeAspect="1"/>
             </wp:cNvGraphicFramePr>
@@ -13512,7 +13314,7 @@
                   <pic:spPr>
                     <a:xfrm>
                       <a:off x="0" y="0"/>
-                      <a:ext cx="5792573" cy="5948004"/>
+                      <a:ext cx="5715000" cy="5235575"/>
                     </a:xfrm>
                     <a:prstGeom prst="rect">
                       <a:avLst/>
@@ -13536,41 +13338,92 @@
       <w:r>
         <w:rPr>
           <w:b/>
-        </w:rPr>
-        <w:t>Figure 3.6: Activity Diagram for AI Text Detector</w:t>
-      </w:r>
-    </w:p>
-    <w:p>
-      <w:r>
-        <w:t xml:space="preserve">A closer view at how the whole thing works. A look on the figure 3.6 shows a bit how everything goes. To start with it, an analysis is made just by checking if text is valid with respect to number of words for which it should be analyzed. If words of the text </w:t>
-      </w:r>
-      <w:proofErr w:type="gramStart"/>
-      <w:r>
-        <w:t>is</w:t>
-      </w:r>
-      <w:proofErr w:type="gramEnd"/>
-      <w:r>
-        <w:t xml:space="preserve"> less </w:t>
+          <w:bCs/>
+        </w:rPr>
+        <w:t>Figure 3.6: Sequence Diagram for AI Text Detector</w:t>
+      </w:r>
+    </w:p>
+    <w:p>
+      <w:r>
+        <w:t>Figure 3.6 demonstrates the sequence diagram for the Sentinel AI Text Detector system, designed in a clean, monochrome Draw.io layout across four principal lifelines: Client (UI), Server (Controller), Scanner Engine, and Database (</w:t>
       </w:r>
       <w:proofErr w:type="spellStart"/>
       <w:r>
-        <w:t>then</w:t>
+        <w:t>sentinel.db</w:t>
       </w:r>
       <w:proofErr w:type="spellEnd"/>
       <w:r>
-        <w:t xml:space="preserve"> 10 words analysis comes to a halt and outputs a warning. If words count is greater than, analysis goes along. Tokenize locally will happen first, and the session gets save. At this point analysis </w:t>
+        <w:t xml:space="preserve">). The operational flow begins with an optional user authentication block (opt fragment), where credentials submitted via the login UI are verified by the server controller against SHA-256 password hashes stored in the database's users table to establish session states and enable persistent history tracking. Following authentication, the core text detection pipeline executes across nine sequential steps: first, the user submits a text passage or uploads a document via the dashboard GUI Scan next, </w:t>
       </w:r>
       <w:r>
         <w:lastRenderedPageBreak/>
-        <w:t xml:space="preserve">goes concurrently for the 7 machines; Perplexity; KNN; Cosine Similarity; Grammar Errors, and so on. The values provided by the different 7 analyzers and combined by using a weighted-average and by applying Grammar Perfection Score for an automatic correction based on Grammar Errors Score. As last, </w:t>
+        <w:t>the server controller validates input constraints such as the 10-word minimum threshold and user daily quota before initiating the detection pipeline</w:t>
+      </w:r>
+      <w:r>
+        <w:t>,</w:t>
+      </w:r>
+      <w:r>
+        <w:t xml:space="preserve"> the scanner engine then retrieves pre-compiled feature profiles, training centroids, and n-gram vocabularies from SQLite storage </w:t>
+      </w:r>
+      <w:r>
+        <w:t xml:space="preserve">, </w:t>
+      </w:r>
+      <w:r>
+        <w:t xml:space="preserve">inside the 'Scan all endpoints / AI evaluation engines' loop fragment box, feature extraction and classification are performed across statistical Perplexity, K-Nearest Neighbors, Logistic Regression, Character Trigrams, POS syntax ratios, Cosine Style Similarity, and Grammar Calibration </w:t>
+      </w:r>
+      <w:r>
+        <w:t>,</w:t>
+      </w:r>
+      <w:r>
+        <w:t xml:space="preserve">the classification ensemble computes the overall weighted AI probability score and returns the component metrics </w:t>
+      </w:r>
+      <w:r>
+        <w:t>,</w:t>
+      </w:r>
+      <w:r>
+        <w:t xml:space="preserve">scan metadata, verdict details, and raw </w:t>
       </w:r>
       <w:proofErr w:type="spellStart"/>
       <w:r>
-        <w:t>ChartRenderer</w:t>
+        <w:t>metrics_json</w:t>
       </w:r>
       <w:proofErr w:type="spellEnd"/>
       <w:r>
-        <w:t xml:space="preserve"> comes into the play to create the graphic of the dashboard; SVG gauge, the scatter plot and the radar web, the map of heat colors, fill all fields with static texts, etc..</w:t>
+        <w:t xml:space="preserve"> are persisted to the </w:t>
+      </w:r>
+      <w:proofErr w:type="spellStart"/>
+      <w:r>
+        <w:t>analysis_history</w:t>
+      </w:r>
+      <w:proofErr w:type="spellEnd"/>
+      <w:r>
+        <w:t xml:space="preserve"> table in </w:t>
+      </w:r>
+      <w:proofErr w:type="spellStart"/>
+      <w:r>
+        <w:t>sentinel.db</w:t>
+      </w:r>
+      <w:proofErr w:type="spellEnd"/>
+      <w:r>
+        <w:t xml:space="preserve"> </w:t>
+      </w:r>
+      <w:r>
+        <w:t>,</w:t>
+      </w:r>
+      <w:r>
+        <w:t xml:space="preserve">the controller requests formatted chart rendering payloads </w:t>
+      </w:r>
+      <w:r>
+        <w:t>,</w:t>
+      </w:r>
+      <w:r>
+        <w:t xml:space="preserve">scanner engine generates interactive visualization datasets for the radial speedometer gauge, KNN scatter plot, feature radar web, and sentence risk heatmap </w:t>
+      </w:r>
+      <w:r>
+        <w:t>,</w:t>
+      </w:r>
+      <w:r>
+        <w:t>and finally, the server delivers the complete interactive dashboard view and risk verdict statement to the client user interface</w:t>
       </w:r>
       <w:r>
         <w:t>.</w:t>
@@ -13580,26 +13433,16 @@
       <w:pPr>
         <w:pStyle w:val="Heading3"/>
       </w:pPr>
-      <w:bookmarkStart w:id="36" w:name="_Toc237559733"/>
-      <w:r>
-        <w:t>3.1.6 Refinement of Class Diagram</w:t>
-      </w:r>
-      <w:bookmarkEnd w:id="36"/>
-    </w:p>
-    <w:p>
-      <w:r>
-        <w:t xml:space="preserve">The modification of the </w:t>
-      </w:r>
-      <w:proofErr w:type="gramStart"/>
-      <w:r>
-        <w:t>first class</w:t>
-      </w:r>
-      <w:proofErr w:type="gramEnd"/>
-      <w:r>
-        <w:t xml:space="preserve"> diagram to display the properties, the methods and the communication paths between the individual instances during the run time of the process. Those instances are: the controller, the utility class instance and the machine learning ensemble and database synchronization instance. In essence this modification closes the gap between the "what is" static structure and the "how do they live" real world working of the object instances</w:t>
-      </w:r>
-      <w:r>
-        <w:t>.</w:t>
+      <w:r>
+        <w:t>3.1.6 Process Modelling Using Activity Diagrams</w:t>
+      </w:r>
+    </w:p>
+    <w:p>
+      <w:r>
+        <w:t>T</w:t>
+      </w:r>
+      <w:r>
+        <w:t>his activity diagram lays out the entire operational workflow for the document analysis pipeline. It all starts up the moment a user pastes in some text or drops a file into the app. After checking to make sure the text meets the length requirements, the system splits it all up into sentences and words. Then it just runs the six classification modules, figures out the weighted ensemble score, and tacks on the grammar calibration discount. Finally, it spits out the final AI probability along with the SVG charts and the heatmap display.</w:t>
       </w:r>
     </w:p>
     <w:p>
@@ -13610,11 +13453,18 @@
         <w:rPr>
           <w:noProof/>
         </w:rPr>
+        <w:lastRenderedPageBreak/>
+        <w:t xml:space="preserve">                </w:t>
+      </w:r>
+      <w:r>
+        <w:rPr>
+          <w:noProof/>
+        </w:rPr>
         <w:drawing>
-          <wp:inline distT="0" distB="0" distL="0" distR="0" wp14:anchorId="61962BB2" wp14:editId="06959EFA">
-            <wp:extent cx="5908462" cy="3944203"/>
-            <wp:effectExtent l="0" t="0" r="0" b="0"/>
-            <wp:docPr id="5" name="Picture 5"/>
+          <wp:inline distT="0" distB="0" distL="0" distR="0" wp14:anchorId="278CB038" wp14:editId="619B4E6A">
+            <wp:extent cx="5978096" cy="5906820"/>
+            <wp:effectExtent l="0" t="0" r="3810" b="0"/>
+            <wp:docPr id="8" name="Picture 8"/>
             <wp:cNvGraphicFramePr>
               <a:graphicFrameLocks xmlns:a="http://schemas.openxmlformats.org/drawingml/2006/main" noChangeAspect="1"/>
             </wp:cNvGraphicFramePr>
@@ -13634,7 +13484,7 @@
                   <pic:spPr>
                     <a:xfrm>
                       <a:off x="0" y="0"/>
-                      <a:ext cx="5957177" cy="3976723"/>
+                      <a:ext cx="6024709" cy="5952877"/>
                     </a:xfrm>
                     <a:prstGeom prst="rect">
                       <a:avLst/>
@@ -13646,86 +13496,74 @@
           </wp:inline>
         </w:drawing>
       </w:r>
+      <w:bookmarkStart w:id="31" w:name="_GoBack"/>
+      <w:bookmarkEnd w:id="31"/>
     </w:p>
     <w:p>
       <w:pPr>
         <w:jc w:val="center"/>
-      </w:pPr>
-      <w:r>
-        <w:t>Figure 3.7: Refined Object and Collaboration Diagram for AI Text Detector</w:t>
-      </w:r>
-    </w:p>
-    <w:p>
-      <w:pPr>
-        <w:pStyle w:val="Heading2"/>
-      </w:pPr>
-      <w:bookmarkStart w:id="37" w:name="_Toc237559734"/>
+        <w:rPr>
+          <w:b/>
+          <w:bCs/>
+        </w:rPr>
+      </w:pPr>
+      <w:r>
+        <w:rPr>
+          <w:b/>
+          <w:bCs/>
+        </w:rPr>
+        <w:t>Figure 3.7: Activity Diagram for AI Text Detector</w:t>
+      </w:r>
+    </w:p>
+    <w:p>
+      <w:r>
+        <w:t xml:space="preserve">A closer view at how the whole thing works. A look on the figure 3.7 shows a bit how everything goes. To start with it, an analysis is made just by checking if text is valid with respect to number of words for which it should be analyzed. If words of the text is less then 10 words analysis comes to a halt and outputs a warning. If words count is greater than, analysis goes along. Tokenize locally will happen first, and the session gets save. At this point analysis </w:t>
+      </w:r>
       <w:r>
         <w:lastRenderedPageBreak/>
-        <w:t>3.2 System Design</w:t>
-      </w:r>
-      <w:bookmarkEnd w:id="37"/>
+        <w:t>goes concurrently for the 7 machines; Perplexity; KNN; Cosine Similarity; Grammar Errors, and so on. The values provided by the different 7 analyzers and combined by using a weighted-average and by applying Grammar Perfection Score for an automatic correction based on Grammar Errors Score. As last, ChartRenderer comes into the play to create the graphic of the dashboard; SVG gauge, the scatter plot and the radar web, the map of heat colors, fill all fields with static texts, etc...</w:t>
+      </w:r>
     </w:p>
     <w:p>
       <w:pPr>
         <w:pStyle w:val="Heading3"/>
       </w:pPr>
-      <w:bookmarkStart w:id="38" w:name="_Toc237559735"/>
-      <w:r>
-        <w:t>3.2.1 Component Diagram</w:t>
-      </w:r>
-      <w:bookmarkEnd w:id="38"/>
-    </w:p>
-    <w:p>
-      <w:r>
-        <w:t xml:space="preserve">In the component diagram, it shows us the modularity in which the AI Text Detector is built in. The HTML5 dashboard serves as the user interface and communicates directly with the app.js controller, which handles some of the basic elements. This controller makes use of the FileParser class (which directly uses PDF.js and Mammoth.js, on the hand), the PerplexityAnalyzer, the KNNClassifier and the </w:t>
-      </w:r>
-      <w:proofErr w:type="spellStart"/>
-      <w:r>
-        <w:t>CosineSimilarityAnalyzer</w:t>
-      </w:r>
-      <w:proofErr w:type="spellEnd"/>
-      <w:r>
-        <w:t xml:space="preserve"> to determine what the score for each element are. All the output of these engines </w:t>
+      <w:r>
+        <w:t>3.1.7 Refinement of Class Diagram</w:t>
+      </w:r>
+    </w:p>
+    <w:p>
+      <w:r>
+        <w:t xml:space="preserve">The modification of the </w:t>
       </w:r>
       <w:proofErr w:type="gramStart"/>
       <w:r>
-        <w:t>are</w:t>
+        <w:t>first class</w:t>
       </w:r>
       <w:proofErr w:type="gramEnd"/>
       <w:r>
-        <w:t xml:space="preserve"> fed to </w:t>
-      </w:r>
-      <w:proofErr w:type="spellStart"/>
-      <w:r>
-        <w:t>ChartRenderer</w:t>
-      </w:r>
-      <w:proofErr w:type="spellEnd"/>
-      <w:r>
-        <w:t xml:space="preserve"> to make some SVG outputs. Some python codes exist to allow persistence in SQLite3 with the use of REST API, in server.py. If it is not there, </w:t>
-      </w:r>
-      <w:proofErr w:type="spellStart"/>
-      <w:r>
-        <w:t>IndexedDB</w:t>
-      </w:r>
-      <w:proofErr w:type="spellEnd"/>
-      <w:r>
-        <w:t xml:space="preserve"> API can be used as well to store the data in the client side</w:t>
+        <w:t xml:space="preserve"> diagram to display the properties, the methods and the communication paths between the individual instances during the run time of the process. Those instances are: the controller, the utility class instance and the machine learning ensemble and database synchronization instance. In essence this modification closes the gap between the "what is" static structure and the "how do they live" real world working of the object instances</w:t>
       </w:r>
       <w:r>
         <w:t>.</w:t>
       </w:r>
     </w:p>
     <w:p>
+      <w:pPr>
+        <w:jc w:val="center"/>
+      </w:pPr>
+      <w:r>
+        <w:t xml:space="preserve">          </w:t>
+      </w:r>
       <w:r>
         <w:rPr>
           <w:noProof/>
         </w:rPr>
         <w:drawing>
-          <wp:inline distT="0" distB="0" distL="0" distR="0" wp14:anchorId="2017B88A" wp14:editId="1D83A5CE">
-            <wp:extent cx="5715000" cy="3671570"/>
-            <wp:effectExtent l="0" t="0" r="0" b="5080"/>
-            <wp:docPr id="10" name="Picture 10"/>
+          <wp:inline distT="0" distB="0" distL="0" distR="0" wp14:anchorId="235D518E" wp14:editId="5DF8F63C">
+            <wp:extent cx="6033770" cy="3802654"/>
+            <wp:effectExtent l="0" t="0" r="5080" b="7620"/>
+            <wp:docPr id="7" name="Picture 7"/>
             <wp:cNvGraphicFramePr>
               <a:graphicFrameLocks xmlns:a="http://schemas.openxmlformats.org/drawingml/2006/main" noChangeAspect="1"/>
             </wp:cNvGraphicFramePr>
@@ -13745,7 +13583,7 @@
                   <pic:spPr>
                     <a:xfrm>
                       <a:off x="0" y="0"/>
-                      <a:ext cx="5715000" cy="3671570"/>
+                      <a:ext cx="6092442" cy="3839631"/>
                     </a:xfrm>
                     <a:prstGeom prst="rect">
                       <a:avLst/>
@@ -13757,6 +13595,9 @@
           </wp:inline>
         </w:drawing>
       </w:r>
+      <w:r>
+        <w:t xml:space="preserve"> </w:t>
+      </w:r>
     </w:p>
     <w:p>
       <w:pPr>
@@ -13767,105 +13608,157 @@
         </w:rPr>
       </w:pPr>
       <w:r>
-        <w:t>Figure 3.8: Component Diagram for AI Text Detector</w:t>
-      </w:r>
+        <w:rPr>
+          <w:b/>
+          <w:bCs/>
+        </w:rPr>
+        <w:t xml:space="preserve">Figure 3.8: Refined </w:t>
+      </w:r>
+      <w:r>
+        <w:rPr>
+          <w:b/>
+          <w:bCs/>
+        </w:rPr>
+        <w:t>Class</w:t>
+      </w:r>
+      <w:r>
+        <w:rPr>
+          <w:b/>
+          <w:bCs/>
+        </w:rPr>
+        <w:t xml:space="preserve"> Diagram for AI Text Detector</w:t>
+      </w:r>
+      <w:r>
+        <w:rPr>
+          <w:b/>
+          <w:bCs/>
+        </w:rPr>
+        <w:t xml:space="preserve"> </w:t>
+      </w:r>
+    </w:p>
+    <w:p>
+      <w:r>
+        <w:lastRenderedPageBreak/>
+        <w:t>Figure 3.4 demonstrates the object diagram for the AI Text Detector system, designed in a clean, monochrome Draw.io layout across five active runtime object instances: </w:t>
+      </w:r>
+      <w:proofErr w:type="spellStart"/>
+      <w:r>
+        <w:t>docParser</w:t>
+      </w:r>
+      <w:proofErr w:type="spellEnd"/>
+      <w:r>
+        <w:t xml:space="preserve"> : Parses, sentencePerplexity</w:t>
+      </w:r>
+      <w:r>
+        <w:t xml:space="preserve">, </w:t>
+      </w:r>
+      <w:r>
+        <w:t>Sentence Perplexity, classifier</w:t>
+      </w:r>
+      <w:r>
+        <w:t xml:space="preserve">, </w:t>
+      </w:r>
+      <w:r>
+        <w:t xml:space="preserve">Instance Based Classification, vectorSimilarity </w:t>
+      </w:r>
+      <w:r>
+        <w:t>,</w:t>
+      </w:r>
+      <w:r>
+        <w:t>Vector Similarities, and visualizer : Render SVG visualization. The operational runtime snapshot models the live data state during the analysis of the document "sample_essay.docx" : first, </w:t>
+      </w:r>
+      <w:proofErr w:type="spellStart"/>
+      <w:r>
+        <w:t>docParser</w:t>
+      </w:r>
+      <w:proofErr w:type="spellEnd"/>
+      <w:r>
+        <w:t> extracts the text buffer successfully and initializes word count and format metadata; next, sentencePerplexity processes the text to compute statistical complexity metrics including perplexity level, burstiness value, average sentence length, and AI likelihood concurrently, vectorSimilarity computes n-gram vector frequency overlaps against prototype language clusters, yielding an AI model match of 85% similarity, a human model match of 25% similarity, an AI language pattern cluster assignment, and a cosine distance of </w:t>
+      </w:r>
+      <w:r>
+        <w:t>0</w:t>
+      </w:r>
+      <w:r>
+        <w:t>.152; these extracted metrics and feature vectors feed directly into classifier, which executes instance-based classification using K-Nearest Neighbors (K=5) with 44 AI neighbor votes versus 11 human vote to yield a predicted class of 'AI Generated Text' with a confidence score of 91.5%</w:t>
+      </w:r>
+      <w:r>
+        <w:t xml:space="preserve"> </w:t>
+      </w:r>
+      <w:r>
+        <w:t>and finally, classifier passes the computed classification results to visualizer, which dynamically renders the SVG dashboard visual UI components including the radial speedometer gauge banner , red warning accent color indicator, scatter plot projection, and feature radar web chart.</w:t>
+      </w:r>
+    </w:p>
+    <w:p>
+      <w:pPr>
+        <w:pStyle w:val="Heading2"/>
+      </w:pPr>
+      <w:bookmarkStart w:id="32" w:name="_Toc237559734"/>
+      <w:r>
+        <w:t>3.2 System Design</w:t>
+      </w:r>
+      <w:bookmarkEnd w:id="32"/>
     </w:p>
     <w:p>
       <w:pPr>
         <w:pStyle w:val="Heading3"/>
       </w:pPr>
-      <w:bookmarkStart w:id="39" w:name="_Toc237559736"/>
-      <w:r>
+      <w:bookmarkStart w:id="33" w:name="_Toc237559735"/>
+      <w:r>
+        <w:t>3.2.1 Component Diagram</w:t>
+      </w:r>
+      <w:bookmarkEnd w:id="33"/>
+    </w:p>
+    <w:p>
+      <w:r>
+        <w:t xml:space="preserve">In the component diagram, it shows us the modularity in which the AI Text Detector is built in. The HTML5 dashboard serves as the user interface and communicates directly with the app.js controller, which handles some of the basic elements. This controller makes use of the FileParser class (which directly uses PDF.js and Mammoth.js, on the hand), the PerplexityAnalyzer, the KNNClassifier and the </w:t>
+      </w:r>
+      <w:proofErr w:type="spellStart"/>
+      <w:r>
+        <w:t>CosineSimilarityAnalyzer</w:t>
+      </w:r>
+      <w:proofErr w:type="spellEnd"/>
+      <w:r>
+        <w:t xml:space="preserve"> to determine what the score for each element are. All the output of these engines </w:t>
+      </w:r>
+      <w:proofErr w:type="gramStart"/>
+      <w:r>
+        <w:t>are</w:t>
+      </w:r>
+      <w:proofErr w:type="gramEnd"/>
+      <w:r>
+        <w:t xml:space="preserve"> fed to </w:t>
+      </w:r>
+      <w:proofErr w:type="spellStart"/>
+      <w:r>
+        <w:t>ChartRenderer</w:t>
+      </w:r>
+      <w:proofErr w:type="spellEnd"/>
+      <w:r>
+        <w:t xml:space="preserve"> to make some SVG outputs. Some python codes exist to allow persistence in SQLite3 with the use of REST API, in server.py. If it is not there, </w:t>
+      </w:r>
+      <w:proofErr w:type="spellStart"/>
+      <w:r>
+        <w:t>IndexedDB</w:t>
+      </w:r>
+      <w:proofErr w:type="spellEnd"/>
+      <w:r>
+        <w:t xml:space="preserve"> API can be used as well to store the data in the client side</w:t>
+      </w:r>
+      <w:r>
+        <w:t>.</w:t>
+      </w:r>
+    </w:p>
+    <w:p>
+      <w:r>
+        <w:rPr>
+          <w:noProof/>
+        </w:rPr>
         <w:lastRenderedPageBreak/>
-        <w:t>3.2.2 Deployment Diagram</w:t>
-      </w:r>
-      <w:bookmarkEnd w:id="39"/>
-    </w:p>
-    <w:p>
-      <w:r>
-        <w:t xml:space="preserve">Lastly, the deployment diagram below shows how the application is intended to run. The front end of the </w:t>
-      </w:r>
-      <w:proofErr w:type="spellStart"/>
-      <w:r>
-        <w:t>webapp</w:t>
-      </w:r>
-      <w:proofErr w:type="spellEnd"/>
-      <w:r>
-        <w:t xml:space="preserve"> with the HTML5dashboard, JS analyzer, CSS3 styles etc. All live on the user's web page, a closed and secure browser sandbox. On our side of things, there is an optional "very small" (about 50 lines of python, just for simplicity's sake) </w:t>
-      </w:r>
-      <w:proofErr w:type="spellStart"/>
-      <w:r>
-        <w:t>pythonHTTP</w:t>
-      </w:r>
-      <w:proofErr w:type="spellEnd"/>
-      <w:r>
-        <w:t xml:space="preserve"> server running on localhost:5000 on that computer itself that </w:t>
-      </w:r>
-      <w:proofErr w:type="spellStart"/>
-      <w:r>
-        <w:t>usesA</w:t>
-      </w:r>
-      <w:proofErr w:type="spellEnd"/>
-      <w:r>
-        <w:t xml:space="preserve"> persistent SQLite 3 database file (</w:t>
-      </w:r>
-      <w:proofErr w:type="spellStart"/>
-      <w:r>
-        <w:t>sentinel.db</w:t>
-      </w:r>
-      <w:proofErr w:type="spellEnd"/>
-      <w:r>
-        <w:t xml:space="preserve">) to keep track of some persistent data like our user's saved accounts and past history of our analyses, but this only stores what's strictly needed by users - and a neat piece is if the python server for whatever reason dies or is removed the app simply defaults </w:t>
-      </w:r>
-      <w:proofErr w:type="spellStart"/>
-      <w:r>
-        <w:t>toUsing</w:t>
-      </w:r>
-      <w:proofErr w:type="spellEnd"/>
-      <w:r>
-        <w:t xml:space="preserve"> our good friend the </w:t>
-      </w:r>
-      <w:proofErr w:type="spellStart"/>
-      <w:r>
-        <w:t>IndexedDB</w:t>
-      </w:r>
-      <w:proofErr w:type="spellEnd"/>
-      <w:r>
-        <w:t xml:space="preserve"> with name </w:t>
-      </w:r>
-      <w:proofErr w:type="spellStart"/>
-      <w:r>
-        <w:t>SentinelAIDB</w:t>
-      </w:r>
-      <w:proofErr w:type="spellEnd"/>
-      <w:r>
-        <w:t xml:space="preserve"> inside the browser, and still works flawlessly.</w:t>
-      </w:r>
-      <w:r>
-        <w:t>.</w:t>
-      </w:r>
-    </w:p>
-    <w:p>
-      <w:pPr>
-        <w:jc w:val="center"/>
-        <w:rPr>
-          <w:noProof/>
-        </w:rPr>
-      </w:pPr>
-    </w:p>
-    <w:p>
-      <w:pPr>
-        <w:jc w:val="center"/>
-      </w:pPr>
-      <w:r>
-        <w:rPr>
-          <w:noProof/>
-        </w:rPr>
         <w:drawing>
-          <wp:inline distT="0" distB="0" distL="0" distR="0" wp14:anchorId="4F0CF382" wp14:editId="41C0A1BD">
-            <wp:extent cx="5715000" cy="3542665"/>
-            <wp:effectExtent l="0" t="0" r="0" b="635"/>
-            <wp:docPr id="12" name="Picture 12"/>
+          <wp:inline distT="0" distB="0" distL="0" distR="0" wp14:anchorId="2017B88A" wp14:editId="1D83A5CE">
+            <wp:extent cx="5715000" cy="3871355"/>
+            <wp:effectExtent l="0" t="0" r="0" b="0"/>
+            <wp:docPr id="10" name="Picture 10"/>
             <wp:cNvGraphicFramePr>
               <a:graphicFrameLocks xmlns:a="http://schemas.openxmlformats.org/drawingml/2006/main" noChangeAspect="1"/>
             </wp:cNvGraphicFramePr>
@@ -13885,6 +13778,150 @@
                   <pic:spPr>
                     <a:xfrm>
                       <a:off x="0" y="0"/>
+                      <a:ext cx="5719791" cy="3874600"/>
+                    </a:xfrm>
+                    <a:prstGeom prst="rect">
+                      <a:avLst/>
+                    </a:prstGeom>
+                  </pic:spPr>
+                </pic:pic>
+              </a:graphicData>
+            </a:graphic>
+          </wp:inline>
+        </w:drawing>
+      </w:r>
+    </w:p>
+    <w:p>
+      <w:pPr>
+        <w:jc w:val="center"/>
+        <w:rPr>
+          <w:b/>
+          <w:bCs/>
+        </w:rPr>
+      </w:pPr>
+      <w:r>
+        <w:rPr>
+          <w:b/>
+          <w:bCs/>
+        </w:rPr>
+        <w:t>Figure 3.9: Component Diagram for AI Text Detector</w:t>
+      </w:r>
+    </w:p>
+    <w:p>
+      <w:pPr>
+        <w:pStyle w:val="Heading3"/>
+      </w:pPr>
+      <w:bookmarkStart w:id="34" w:name="_Toc237559736"/>
+      <w:r>
+        <w:t>3.2.2 Deployment Diagram</w:t>
+      </w:r>
+      <w:bookmarkEnd w:id="34"/>
+    </w:p>
+    <w:p>
+      <w:r>
+        <w:t xml:space="preserve">Lastly, the deployment diagram below shows how the application is intended to run. The front end of the </w:t>
+      </w:r>
+      <w:proofErr w:type="spellStart"/>
+      <w:r>
+        <w:t>webapp</w:t>
+      </w:r>
+      <w:proofErr w:type="spellEnd"/>
+      <w:r>
+        <w:t xml:space="preserve"> with the HTML5dashboard, JS analyzer, CSS3 styles etc. All live on the user's web page, a closed and secure browser sandbox. On our side of things, there is an optional "very small" (about 50 lines of python, just for simplicity's sake) </w:t>
+      </w:r>
+      <w:proofErr w:type="spellStart"/>
+      <w:r>
+        <w:t>pythonHTTP</w:t>
+      </w:r>
+      <w:proofErr w:type="spellEnd"/>
+      <w:r>
+        <w:t xml:space="preserve"> server running on localhost:5000 on that computer itself that </w:t>
+      </w:r>
+      <w:proofErr w:type="spellStart"/>
+      <w:r>
+        <w:t>usesA</w:t>
+      </w:r>
+      <w:proofErr w:type="spellEnd"/>
+      <w:r>
+        <w:t xml:space="preserve"> persistent SQLite 3 database file (</w:t>
+      </w:r>
+      <w:proofErr w:type="spellStart"/>
+      <w:r>
+        <w:t>sentinel.db</w:t>
+      </w:r>
+      <w:proofErr w:type="spellEnd"/>
+      <w:r>
+        <w:t xml:space="preserve">) to keep track of some persistent data like our user's saved accounts and past history of our analyses, but this only stores what's strictly needed by users - and a neat piece is if the python server for whatever reason dies or is removed the app simply defaults </w:t>
+      </w:r>
+      <w:proofErr w:type="spellStart"/>
+      <w:r>
+        <w:t>toUsing</w:t>
+      </w:r>
+      <w:proofErr w:type="spellEnd"/>
+      <w:r>
+        <w:t xml:space="preserve"> our good friend the </w:t>
+      </w:r>
+      <w:proofErr w:type="spellStart"/>
+      <w:r>
+        <w:t>IndexedDB</w:t>
+      </w:r>
+      <w:proofErr w:type="spellEnd"/>
+      <w:r>
+        <w:t xml:space="preserve"> with name </w:t>
+      </w:r>
+      <w:proofErr w:type="spellStart"/>
+      <w:r>
+        <w:t>SentinelAIDB</w:t>
+      </w:r>
+      <w:proofErr w:type="spellEnd"/>
+      <w:r>
+        <w:t xml:space="preserve"> inside the browser, and still works flawlessly.</w:t>
+      </w:r>
+      <w:r>
+        <w:t>.</w:t>
+      </w:r>
+    </w:p>
+    <w:p>
+      <w:pPr>
+        <w:jc w:val="center"/>
+        <w:rPr>
+          <w:noProof/>
+        </w:rPr>
+      </w:pPr>
+    </w:p>
+    <w:p>
+      <w:pPr>
+        <w:jc w:val="center"/>
+      </w:pPr>
+      <w:r>
+        <w:rPr>
+          <w:noProof/>
+        </w:rPr>
+        <w:lastRenderedPageBreak/>
+        <w:drawing>
+          <wp:inline distT="0" distB="0" distL="0" distR="0" wp14:anchorId="4F0CF382" wp14:editId="41C0A1BD">
+            <wp:extent cx="5715000" cy="3542665"/>
+            <wp:effectExtent l="0" t="0" r="0" b="635"/>
+            <wp:docPr id="12" name="Picture 12"/>
+            <wp:cNvGraphicFramePr>
+              <a:graphicFrameLocks xmlns:a="http://schemas.openxmlformats.org/drawingml/2006/main" noChangeAspect="1"/>
+            </wp:cNvGraphicFramePr>
+            <a:graphic xmlns:a="http://schemas.openxmlformats.org/drawingml/2006/main">
+              <a:graphicData uri="http://schemas.openxmlformats.org/drawingml/2006/picture">
+                <pic:pic xmlns:pic="http://schemas.openxmlformats.org/drawingml/2006/picture">
+                  <pic:nvPicPr>
+                    <pic:cNvPr id="1" name=""/>
+                    <pic:cNvPicPr/>
+                  </pic:nvPicPr>
+                  <pic:blipFill>
+                    <a:blip r:embed="rId22"/>
+                    <a:stretch>
+                      <a:fillRect/>
+                    </a:stretch>
+                  </pic:blipFill>
+                  <pic:spPr>
+                    <a:xfrm>
+                      <a:off x="0" y="0"/>
                       <a:ext cx="5715000" cy="3542665"/>
                     </a:xfrm>
                     <a:prstGeom prst="rect">
@@ -13911,62 +13948,62 @@
           <w:b/>
           <w:bCs/>
         </w:rPr>
-        <w:t>Figure 3.9: Deployment Diagram for AI Text Detector</w:t>
+        <w:t>Figure 3.10: Deployment Diagram for AI Text Detector</w:t>
       </w:r>
     </w:p>
     <w:p>
       <w:pPr>
         <w:pStyle w:val="Heading2"/>
       </w:pPr>
-      <w:bookmarkStart w:id="40" w:name="_Toc237559737"/>
+      <w:bookmarkStart w:id="35" w:name="_Toc237559737"/>
+      <w:r>
+        <w:t>3.3 Algorithm Details</w:t>
+      </w:r>
+      <w:bookmarkEnd w:id="35"/>
+    </w:p>
+    <w:p>
+      <w:pPr>
+        <w:pStyle w:val="Heading3"/>
+        <w:rPr>
+          <w:bCs/>
+        </w:rPr>
+      </w:pPr>
+      <w:bookmarkStart w:id="36" w:name="_Toc237559738"/>
+      <w:r>
+        <w:t>3.3.1 Statistical NLP Algorithm (Perplexity &amp; Burstiness)</w:t>
+      </w:r>
+      <w:bookmarkEnd w:id="36"/>
+    </w:p>
+    <w:p>
+      <w:pPr>
+        <w:spacing w:after="0"/>
+      </w:pPr>
+      <w:r>
+        <w:t xml:space="preserve">In a nuts hell the Statistical NLP algorithm analyzes the </w:t>
+      </w:r>
+      <w:proofErr w:type="gramStart"/>
+      <w:r>
+        <w:t>low level</w:t>
+      </w:r>
+      <w:proofErr w:type="gramEnd"/>
+      <w:r>
+        <w:t xml:space="preserve"> linguistic statistics of a document and recognizes machine generated structures. Since Large Language Models generate text by predicting what the next token is statistically likely to be, they end up producing very predictable sentences that rely a lot on repeating the same kinds of phrases and words. This engine analyzes the variance in sentence length, TTR, and bigram predictability of a given document to determine the likelihood that it is machine generated.</w:t>
+      </w:r>
+    </w:p>
+    <w:p>
+      <w:pPr>
+        <w:spacing w:after="0"/>
+      </w:pPr>
+      <w:r>
+        <w:t>This process is run entirely on the machine of the user. It first tokenizes the text, splits it into sentences, and splits the sentences into words. The first statistical analysis that is done is the average sentence length and the sentence length variance. It is also calculating TTR, which is just a measure of unique words divided by the number of words in the document. The smart idea in the engine is the addition of a bigram and transition words database which can penalize for the predictability of word choices</w:t>
+      </w:r>
+      <w:r>
+        <w:t>.</w:t>
+      </w:r>
+    </w:p>
+    <w:p>
       <w:r>
         <w:lastRenderedPageBreak/>
-        <w:t>3.3 Algorithm Details</w:t>
-      </w:r>
-      <w:bookmarkEnd w:id="40"/>
-    </w:p>
-    <w:p>
-      <w:pPr>
-        <w:pStyle w:val="Heading3"/>
-        <w:rPr>
-          <w:bCs/>
-        </w:rPr>
-      </w:pPr>
-      <w:bookmarkStart w:id="41" w:name="_Toc237559738"/>
-      <w:r>
-        <w:t>3.3.1 Statistical NLP Algorithm (Perplexity &amp; Burstiness)</w:t>
-      </w:r>
-      <w:bookmarkEnd w:id="41"/>
-    </w:p>
-    <w:p>
-      <w:pPr>
-        <w:spacing w:after="0"/>
-      </w:pPr>
-      <w:r>
-        <w:t xml:space="preserve">In a nuts hell the Statistical NLP algorithm analyzes the </w:t>
-      </w:r>
-      <w:proofErr w:type="gramStart"/>
-      <w:r>
-        <w:t>low level</w:t>
-      </w:r>
-      <w:proofErr w:type="gramEnd"/>
-      <w:r>
-        <w:t xml:space="preserve"> linguistic statistics of a document and recognizes machine generated structures. Since Large Language Models generate text by predicting what the next token is statistically likely to be, they end up producing very predictable sentences that rely a lot on repeating the same kinds of phrases and words. This engine analyzes the variance in sentence length, TTR, and bigram predictability of a given document to determine the likelihood that it is machine generated.</w:t>
-      </w:r>
-    </w:p>
-    <w:p>
-      <w:pPr>
-        <w:spacing w:after="0"/>
-      </w:pPr>
-      <w:r>
-        <w:t>This process is run entirely on the machine of the user. It first tokenizes the text, splits it into sentences, and splits the sentences into words. The first statistical analysis that is done is the average sentence length and the sentence length variance. It is also calculating TTR, which is just a measure of unique words divided by the number of words in the document. The smart idea in the engine is the addition of a bigram and transition words database which can penalize for the predictability of word choices</w:t>
-      </w:r>
-      <w:r>
-        <w:t>.</w:t>
-      </w:r>
-    </w:p>
-    <w:p>
-      <w:r>
         <w:t>To get the final Statistical NLP score, we compute a weighted sum of the burstiness factor, TTR factor, and predictability factor:</w:t>
       </w:r>
       <m:oMath>
@@ -14585,7 +14622,6 @@
               <w:rPr>
                 <w:sz w:val="18"/>
               </w:rPr>
-              <w:lastRenderedPageBreak/>
               <w:t xml:space="preserve">16:      </w:t>
             </w:r>
             <w:proofErr w:type="spellStart"/>
@@ -14765,7 +14801,7 @@
           <w:szCs w:val="24"/>
         </w:rPr>
       </w:pPr>
-      <w:bookmarkStart w:id="42" w:name="_Toc237559739"/>
+      <w:bookmarkStart w:id="37" w:name="_Toc237559739"/>
     </w:p>
     <w:p>
       <w:pPr>
@@ -14774,7 +14810,7 @@
       <w:r>
         <w:t>3.3.2 KNN Classifier</w:t>
       </w:r>
-      <w:bookmarkEnd w:id="42"/>
+      <w:bookmarkEnd w:id="37"/>
     </w:p>
     <w:p>
       <w:r>
@@ -14829,6 +14865,7 @@
         </w:numPr>
       </w:pPr>
       <w:r>
+        <w:lastRenderedPageBreak/>
         <w:t xml:space="preserve">Readability Index Consistency: The Coleman </w:t>
       </w:r>
       <w:proofErr w:type="spellStart"/>
@@ -15330,7 +15367,6 @@
               <w:rPr>
                 <w:sz w:val="18"/>
               </w:rPr>
-              <w:lastRenderedPageBreak/>
               <w:t xml:space="preserve"> 5:      f2 &lt;- clamp((</w:t>
             </w:r>
             <w:proofErr w:type="spellStart"/>
@@ -15696,7 +15732,7 @@
       <w:pPr>
         <w:pStyle w:val="Heading3"/>
       </w:pPr>
-      <w:bookmarkStart w:id="43" w:name="_Toc237559740"/>
+      <w:bookmarkStart w:id="38" w:name="_Toc237559740"/>
     </w:p>
     <w:p>
       <w:pPr>
@@ -15711,7 +15747,7 @@
       <w:r>
         <w:t xml:space="preserve"> Space Model)</w:t>
       </w:r>
-      <w:bookmarkEnd w:id="43"/>
+      <w:bookmarkEnd w:id="38"/>
     </w:p>
     <w:p>
       <w:pPr>
@@ -15726,7 +15762,11 @@
       </w:r>
       <w:proofErr w:type="gramEnd"/>
       <w:r>
-        <w:t xml:space="preserve"> vector that represents the frequency of stylistic markers like first person pronouns, complex conjunctions, intensifiers, passive voice, and Hapax Legomena. Then, this vector gets compared against </w:t>
+        <w:t xml:space="preserve"> vector that represents the frequency of stylistic markers like first person pronouns, complex conjunctions, intensifiers, passive voice, </w:t>
+      </w:r>
+      <w:r>
+        <w:lastRenderedPageBreak/>
+        <w:t xml:space="preserve">and Hapax Legomena. Then, this vector gets compared against </w:t>
       </w:r>
       <w:proofErr w:type="spellStart"/>
       <w:proofErr w:type="gramStart"/>
@@ -17069,6 +17109,7 @@
               <w:rPr>
                 <w:sz w:val="18"/>
               </w:rPr>
+              <w:lastRenderedPageBreak/>
               <w:t xml:space="preserve">12:      </w:t>
             </w:r>
             <w:r>
@@ -17188,7 +17229,7 @@
           <w:szCs w:val="24"/>
         </w:rPr>
       </w:pPr>
-      <w:bookmarkStart w:id="44" w:name="_Toc237559741"/>
+      <w:bookmarkStart w:id="39" w:name="_Toc237559741"/>
     </w:p>
     <w:p>
       <w:pPr>
@@ -17197,7 +17238,7 @@
       <w:r>
         <w:t>3.3.4 Stylometric Logistic Regression Classifier</w:t>
       </w:r>
-      <w:bookmarkEnd w:id="44"/>
+      <w:bookmarkEnd w:id="39"/>
     </w:p>
     <w:p>
       <w:r>
@@ -17538,7 +17579,6 @@
                 <w:b/>
                 <w:sz w:val="21"/>
               </w:rPr>
-              <w:lastRenderedPageBreak/>
               <w:t>Algorithm 4: Binary Logistic Regression Classifier</w:t>
             </w:r>
           </w:p>
@@ -17811,15 +17851,19 @@
       <w:pPr>
         <w:pStyle w:val="Heading3"/>
       </w:pPr>
-      <w:bookmarkStart w:id="45" w:name="_Toc237559742"/>
+      <w:bookmarkStart w:id="40" w:name="_Toc237559742"/>
       <w:r>
         <w:t>3.3.5 Character Trigram Cosine Similarity</w:t>
       </w:r>
-      <w:bookmarkEnd w:id="45"/>
-    </w:p>
-    <w:p>
-      <w:r>
-        <w:t xml:space="preserve">The Character Trigram Cosine Similarity engine analyzes the text at the character n gram level to detect machine generated structures. The thing is, Large language models output texts with really uniform character transitions. Human writing, on the other hand, exhibits specific spacing patterns and typographic mistakes like spacing after commas or common keyboard errors. The engine extracts all </w:t>
+      <w:bookmarkEnd w:id="40"/>
+    </w:p>
+    <w:p>
+      <w:r>
+        <w:t xml:space="preserve">The Character Trigram Cosine Similarity engine analyzes the text at the character n gram level to detect machine generated structures. The thing is, Large language models output texts with really uniform character transitions. Human writing, on the other hand, exhibits specific </w:t>
+      </w:r>
+      <w:r>
+        <w:lastRenderedPageBreak/>
+        <w:t xml:space="preserve">spacing patterns and typographic mistakes like spacing after commas or common keyboard errors. The engine extracts all </w:t>
       </w:r>
       <w:proofErr w:type="gramStart"/>
       <w:r>
@@ -18556,7 +18600,6 @@
               <w:rPr>
                 <w:sz w:val="18"/>
               </w:rPr>
-              <w:lastRenderedPageBreak/>
               <w:t xml:space="preserve">11:          </w:t>
             </w:r>
             <w:proofErr w:type="spellStart"/>
@@ -18848,12 +18891,11 @@
       <w:pPr>
         <w:pStyle w:val="Heading3"/>
       </w:pPr>
-      <w:bookmarkStart w:id="46" w:name="_Toc237559743"/>
-      <w:r>
-        <w:lastRenderedPageBreak/>
+      <w:bookmarkStart w:id="41" w:name="_Toc237559743"/>
+      <w:r>
         <w:t>3.3.6 POS Syntax Ratio Cosine Similarity</w:t>
       </w:r>
-      <w:bookmarkEnd w:id="46"/>
+      <w:bookmarkEnd w:id="41"/>
     </w:p>
     <w:p>
       <w:proofErr w:type="gramStart"/>
@@ -19081,6 +19123,7 @@
                 <w:b/>
                 <w:sz w:val="21"/>
               </w:rPr>
+              <w:lastRenderedPageBreak/>
               <w:t>Algorithm 6: Part-of-Speech Syntax Ratio Classification</w:t>
             </w:r>
           </w:p>
@@ -19625,12 +19668,11 @@
       <w:pPr>
         <w:pStyle w:val="Heading3"/>
       </w:pPr>
-      <w:bookmarkStart w:id="47" w:name="_Toc237559744"/>
-      <w:r>
-        <w:lastRenderedPageBreak/>
+      <w:bookmarkStart w:id="42" w:name="_Toc237559744"/>
+      <w:r>
         <w:t>3.3.7 Heuristic Grammar &amp; Typography Analyzer</w:t>
       </w:r>
-      <w:bookmarkEnd w:id="47"/>
+      <w:bookmarkEnd w:id="42"/>
     </w:p>
     <w:p>
       <w:pPr>
@@ -20066,6 +20108,7 @@
                 <w:b/>
                 <w:sz w:val="21"/>
               </w:rPr>
+              <w:lastRenderedPageBreak/>
               <w:t>Algorithm 7: Heuristic Grammar &amp; Typography Analysis</w:t>
             </w:r>
           </w:p>
@@ -20663,11 +20706,11 @@
       <w:pPr>
         <w:pStyle w:val="Heading3"/>
       </w:pPr>
-      <w:bookmarkStart w:id="48" w:name="_Toc237559745"/>
+      <w:bookmarkStart w:id="43" w:name="_Toc237559745"/>
       <w:r>
         <w:t>3.3.8 Ensemble Scoring &amp; Grammar Calibration</w:t>
       </w:r>
-      <w:bookmarkEnd w:id="48"/>
+      <w:bookmarkEnd w:id="43"/>
     </w:p>
     <w:p>
       <w:pPr>
@@ -20679,11 +20722,7 @@
         <w:spacing w:after="0"/>
       </w:pPr>
       <w:r>
-        <w:t xml:space="preserve">The final AI probability verdict is calculated by compiling the weighted outputs of the six core algorithms. These are 25% Logistic Regression, 25% Character Trigram Similarity, 20% KNN Classifier, 15% POS Syntax Ratios, 10% Cosine Similarity, and 5% Perplexity. </w:t>
-      </w:r>
-      <w:r>
-        <w:lastRenderedPageBreak/>
-        <w:t>After that, we calibrate the result using the Grammar Perfection Score as a discount multiplier.</w:t>
+        <w:t>The final AI probability verdict is calculated by compiling the weighted outputs of the six core algorithms. These are 25% Logistic Regression, 25% Character Trigram Similarity, 20% KNN Classifier, 15% POS Syntax Ratios, 10% Cosine Similarity, and 5% Perplexity. After that, we calibrate the result using the Grammar Perfection Score as a discount multiplier.</w:t>
       </w:r>
     </w:p>
     <w:p>
@@ -21055,6 +21094,7 @@
               <w:rPr>
                 <w:sz w:val="18"/>
               </w:rPr>
+              <w:lastRenderedPageBreak/>
               <w:t xml:space="preserve"> 3:      </w:t>
             </w:r>
             <w:proofErr w:type="spellStart"/>
@@ -21401,16 +21441,20 @@
     <w:p/>
     <w:p/>
     <w:p/>
+    <w:p/>
+    <w:p/>
+    <w:p/>
+    <w:p/>
     <w:p>
       <w:pPr>
         <w:pStyle w:val="Heading1"/>
       </w:pPr>
-      <w:bookmarkStart w:id="49" w:name="_Toc237559746"/>
+      <w:bookmarkStart w:id="44" w:name="_Toc237559746"/>
       <w:r>
         <w:lastRenderedPageBreak/>
         <w:t>CHAPTER 4</w:t>
       </w:r>
-      <w:bookmarkEnd w:id="49"/>
+      <w:bookmarkEnd w:id="44"/>
       <w:r>
         <w:t xml:space="preserve"> </w:t>
       </w:r>
@@ -21419,11 +21463,11 @@
       <w:pPr>
         <w:pStyle w:val="Heading1"/>
       </w:pPr>
-      <w:bookmarkStart w:id="50" w:name="_Toc237559747"/>
+      <w:bookmarkStart w:id="45" w:name="_Toc237559747"/>
       <w:r>
         <w:t>IMPLEMENTATION AND TESTING</w:t>
       </w:r>
-      <w:bookmarkEnd w:id="50"/>
+      <w:bookmarkEnd w:id="45"/>
       <w:r>
         <w:t xml:space="preserve">  </w:t>
       </w:r>
@@ -21432,14 +21476,14 @@
       <w:pPr>
         <w:pStyle w:val="Heading2"/>
       </w:pPr>
-      <w:bookmarkStart w:id="51" w:name="_Toc237559748"/>
+      <w:bookmarkStart w:id="46" w:name="_Toc237559748"/>
       <w:r>
         <w:t xml:space="preserve">4.1 </w:t>
       </w:r>
       <w:r>
         <w:t>Implementation</w:t>
       </w:r>
-      <w:bookmarkEnd w:id="51"/>
+      <w:bookmarkEnd w:id="46"/>
     </w:p>
     <w:p>
       <w:pPr>
@@ -21448,7 +21492,7 @@
           <w:bCs/>
         </w:rPr>
       </w:pPr>
-      <w:bookmarkStart w:id="52" w:name="_Toc237559749"/>
+      <w:bookmarkStart w:id="47" w:name="_Toc237559749"/>
       <w:r>
         <w:t xml:space="preserve">4.1.1 </w:t>
       </w:r>
@@ -21458,7 +21502,7 @@
         </w:rPr>
         <w:t>Tools Used</w:t>
       </w:r>
-      <w:bookmarkEnd w:id="52"/>
+      <w:bookmarkEnd w:id="47"/>
     </w:p>
     <w:p>
       <w:r>
@@ -21630,12 +21674,12 @@
       <w:pPr>
         <w:pStyle w:val="Heading2"/>
       </w:pPr>
-      <w:bookmarkStart w:id="53" w:name="_Toc237559750"/>
+      <w:bookmarkStart w:id="48" w:name="_Toc237559750"/>
       <w:r>
         <w:lastRenderedPageBreak/>
         <w:t>4.1.2 Module Implementation Details</w:t>
       </w:r>
-      <w:bookmarkEnd w:id="53"/>
+      <w:bookmarkEnd w:id="48"/>
     </w:p>
     <w:p>
       <w:r>
@@ -21671,11 +21715,11 @@
       <w:pPr>
         <w:pStyle w:val="Heading3"/>
       </w:pPr>
-      <w:bookmarkStart w:id="54" w:name="_Toc237559751"/>
+      <w:bookmarkStart w:id="49" w:name="_Toc237559751"/>
       <w:r>
         <w:t>4.1.2.1 FileParser Module</w:t>
       </w:r>
-      <w:bookmarkEnd w:id="54"/>
+      <w:bookmarkEnd w:id="49"/>
     </w:p>
     <w:p>
       <w:r>
@@ -22161,11 +22205,11 @@
       <w:pPr>
         <w:pStyle w:val="Heading3"/>
       </w:pPr>
-      <w:bookmarkStart w:id="55" w:name="_Toc237559752"/>
+      <w:bookmarkStart w:id="50" w:name="_Toc237559752"/>
       <w:r>
         <w:t>4.1.2.2 Perplexity &amp; Burstiness Module</w:t>
       </w:r>
-      <w:bookmarkEnd w:id="55"/>
+      <w:bookmarkEnd w:id="50"/>
     </w:p>
     <w:p>
       <w:r>
@@ -22576,11 +22620,11 @@
       <w:pPr>
         <w:pStyle w:val="Heading3"/>
       </w:pPr>
-      <w:bookmarkStart w:id="56" w:name="_Toc237559753"/>
+      <w:bookmarkStart w:id="51" w:name="_Toc237559753"/>
       <w:r>
         <w:t>4.1.2.3 KNN Heuristic Feature Module</w:t>
       </w:r>
-      <w:bookmarkEnd w:id="56"/>
+      <w:bookmarkEnd w:id="51"/>
     </w:p>
     <w:p>
       <w:pPr>
@@ -23120,11 +23164,11 @@
       <w:pPr>
         <w:pStyle w:val="Heading3"/>
       </w:pPr>
-      <w:bookmarkStart w:id="57" w:name="_Toc237559754"/>
+      <w:bookmarkStart w:id="52" w:name="_Toc237559754"/>
       <w:r>
         <w:t>4.1.2.4 KNN Voting Classifier Module</w:t>
       </w:r>
-      <w:bookmarkEnd w:id="57"/>
+      <w:bookmarkEnd w:id="52"/>
     </w:p>
     <w:p>
       <w:r>
@@ -23722,11 +23766,11 @@
       <w:pPr>
         <w:pStyle w:val="Heading3"/>
       </w:pPr>
-      <w:bookmarkStart w:id="58" w:name="_Toc237559755"/>
+      <w:bookmarkStart w:id="53" w:name="_Toc237559755"/>
       <w:r>
         <w:t>4.1.2.5 Cosine Similarity Feature Module</w:t>
       </w:r>
-      <w:bookmarkEnd w:id="58"/>
+      <w:bookmarkEnd w:id="53"/>
     </w:p>
     <w:p>
       <w:r>
@@ -24345,11 +24389,11 @@
       <w:pPr>
         <w:pStyle w:val="Heading3"/>
       </w:pPr>
-      <w:bookmarkStart w:id="59" w:name="_Toc237559756"/>
+      <w:bookmarkStart w:id="54" w:name="_Toc237559756"/>
       <w:r>
         <w:t>4.1.2.6 Cosine Similarity Angle Module</w:t>
       </w:r>
-      <w:bookmarkEnd w:id="59"/>
+      <w:bookmarkEnd w:id="54"/>
     </w:p>
     <w:p>
       <w:r>
@@ -25037,12 +25081,12 @@
       <w:pPr>
         <w:pStyle w:val="Heading3"/>
       </w:pPr>
-      <w:bookmarkStart w:id="60" w:name="_Toc237559757"/>
+      <w:bookmarkStart w:id="55" w:name="_Toc237559757"/>
       <w:r>
         <w:lastRenderedPageBreak/>
         <w:t>4.1.2.7 Logistic Regression Classifier Module</w:t>
       </w:r>
-      <w:bookmarkEnd w:id="60"/>
+      <w:bookmarkEnd w:id="55"/>
     </w:p>
     <w:p>
       <w:pPr>
@@ -25371,11 +25415,11 @@
       <w:pPr>
         <w:pStyle w:val="Heading3"/>
       </w:pPr>
-      <w:bookmarkStart w:id="61" w:name="_Toc237559758"/>
+      <w:bookmarkStart w:id="56" w:name="_Toc237559758"/>
       <w:r>
         <w:t>4.1.2.8 Character Trigrams Classifier Module</w:t>
       </w:r>
-      <w:bookmarkEnd w:id="61"/>
+      <w:bookmarkEnd w:id="56"/>
     </w:p>
     <w:p>
       <w:pPr>
@@ -25877,12 +25921,12 @@
       <w:pPr>
         <w:pStyle w:val="Heading3"/>
       </w:pPr>
-      <w:bookmarkStart w:id="62" w:name="_Toc237559759"/>
+      <w:bookmarkStart w:id="57" w:name="_Toc237559759"/>
       <w:r>
         <w:lastRenderedPageBreak/>
         <w:t>4.1.2.9 POS Syntax Ratios Classifier Module</w:t>
       </w:r>
-      <w:bookmarkEnd w:id="62"/>
+      <w:bookmarkEnd w:id="57"/>
     </w:p>
     <w:p>
       <w:pPr>
@@ -26458,7 +26502,7 @@
       <w:pPr>
         <w:pStyle w:val="Heading3"/>
       </w:pPr>
-      <w:bookmarkStart w:id="63" w:name="_Toc237559760"/>
+      <w:bookmarkStart w:id="58" w:name="_Toc237559760"/>
       <w:r>
         <w:t xml:space="preserve">4.1.2.10 </w:t>
       </w:r>
@@ -26470,7 +26514,7 @@
       <w:r>
         <w:t xml:space="preserve"> Gauge Module</w:t>
       </w:r>
-      <w:bookmarkEnd w:id="63"/>
+      <w:bookmarkEnd w:id="58"/>
     </w:p>
     <w:p>
       <w:r>
@@ -26965,7 +27009,7 @@
         <w:pStyle w:val="Heading3"/>
         <w:jc w:val="left"/>
       </w:pPr>
-      <w:bookmarkStart w:id="64" w:name="_Toc237559761"/>
+      <w:bookmarkStart w:id="59" w:name="_Toc237559761"/>
       <w:r>
         <w:lastRenderedPageBreak/>
         <w:t xml:space="preserve">4.1.2.11 </w:t>
@@ -26978,7 +27022,7 @@
       <w:r>
         <w:t xml:space="preserve"> Scatter Plot Module</w:t>
       </w:r>
-      <w:bookmarkEnd w:id="64"/>
+      <w:bookmarkEnd w:id="59"/>
     </w:p>
     <w:p>
       <w:r>
@@ -27654,7 +27698,7 @@
       <w:pPr>
         <w:pStyle w:val="Heading3"/>
       </w:pPr>
-      <w:bookmarkStart w:id="65" w:name="_Toc237559762"/>
+      <w:bookmarkStart w:id="60" w:name="_Toc237559762"/>
       <w:r>
         <w:t xml:space="preserve">4.1.2.12 </w:t>
       </w:r>
@@ -27666,7 +27710,7 @@
       <w:r>
         <w:t xml:space="preserve"> Radar Chart Module</w:t>
       </w:r>
-      <w:bookmarkEnd w:id="65"/>
+      <w:bookmarkEnd w:id="60"/>
     </w:p>
     <w:p>
       <w:r>
@@ -28221,12 +28265,12 @@
       <w:pPr>
         <w:pStyle w:val="Heading3"/>
       </w:pPr>
-      <w:bookmarkStart w:id="66" w:name="_Toc237559763"/>
+      <w:bookmarkStart w:id="61" w:name="_Toc237559763"/>
       <w:r>
         <w:lastRenderedPageBreak/>
         <w:t>4.1.2.13 app.js Analysis Controller Module</w:t>
       </w:r>
-      <w:bookmarkEnd w:id="66"/>
+      <w:bookmarkEnd w:id="61"/>
     </w:p>
     <w:p>
       <w:r>
@@ -28879,11 +28923,11 @@
       <w:pPr>
         <w:pStyle w:val="Heading3"/>
       </w:pPr>
-      <w:bookmarkStart w:id="67" w:name="_Toc237559764"/>
+      <w:bookmarkStart w:id="62" w:name="_Toc237559764"/>
       <w:r>
         <w:t>4.1.2.14 app.js UI Event Listener Module</w:t>
       </w:r>
-      <w:bookmarkEnd w:id="67"/>
+      <w:bookmarkEnd w:id="62"/>
     </w:p>
     <w:p>
       <w:r>
@@ -29328,11 +29372,11 @@
       <w:pPr>
         <w:pStyle w:val="Heading3"/>
       </w:pPr>
-      <w:bookmarkStart w:id="68" w:name="_Toc237559765"/>
+      <w:bookmarkStart w:id="63" w:name="_Toc237559765"/>
       <w:r>
         <w:t>4.1.2.15 style.css Custom Visual Styles</w:t>
       </w:r>
-      <w:bookmarkEnd w:id="68"/>
+      <w:bookmarkEnd w:id="63"/>
     </w:p>
     <w:p>
       <w:r>
@@ -29534,11 +29578,11 @@
       <w:pPr>
         <w:pStyle w:val="Heading3"/>
       </w:pPr>
-      <w:bookmarkStart w:id="69" w:name="_Toc237559766"/>
+      <w:bookmarkStart w:id="64" w:name="_Toc237559766"/>
       <w:r>
         <w:t>4.1.2.16 HTML5 Dashboard Layout Structure</w:t>
       </w:r>
-      <w:bookmarkEnd w:id="69"/>
+      <w:bookmarkEnd w:id="64"/>
     </w:p>
     <w:p>
       <w:r>
@@ -29809,11 +29853,11 @@
       <w:pPr>
         <w:pStyle w:val="Heading3"/>
       </w:pPr>
-      <w:bookmarkStart w:id="70" w:name="_Toc237559767"/>
+      <w:bookmarkStart w:id="65" w:name="_Toc237559767"/>
       <w:r>
         <w:t>4.1.2.17 Heuristic Grammar &amp; Typography Module</w:t>
       </w:r>
-      <w:bookmarkEnd w:id="70"/>
+      <w:bookmarkEnd w:id="65"/>
     </w:p>
     <w:p>
       <w:r>
@@ -30251,7 +30295,7 @@
       <w:pPr>
         <w:pStyle w:val="Heading3"/>
       </w:pPr>
-      <w:bookmarkStart w:id="71" w:name="_Toc237559768"/>
+      <w:bookmarkStart w:id="66" w:name="_Toc237559768"/>
       <w:r>
         <w:t xml:space="preserve">4.1.2.18 </w:t>
       </w:r>
@@ -30263,7 +30307,7 @@
       <w:r>
         <w:t xml:space="preserve"> Storage &amp; REST Sync Module</w:t>
       </w:r>
-      <w:bookmarkEnd w:id="71"/>
+      <w:bookmarkEnd w:id="66"/>
     </w:p>
     <w:p>
       <w:r>
@@ -31459,11 +31503,11 @@
       <w:pPr>
         <w:pStyle w:val="Heading3"/>
       </w:pPr>
-      <w:bookmarkStart w:id="72" w:name="_Toc237559769"/>
+      <w:bookmarkStart w:id="67" w:name="_Toc237559769"/>
       <w:r>
         <w:t>4.1.2.19 User Authentication &amp; Session Controller Module</w:t>
       </w:r>
-      <w:bookmarkEnd w:id="72"/>
+      <w:bookmarkEnd w:id="67"/>
     </w:p>
     <w:p>
       <w:r>
@@ -32728,11 +32772,11 @@
       <w:pPr>
         <w:pStyle w:val="Heading3"/>
       </w:pPr>
-      <w:bookmarkStart w:id="73" w:name="_Toc237559770"/>
+      <w:bookmarkStart w:id="68" w:name="_Toc237559770"/>
       <w:r>
         <w:t>4.1.2.20 server.py SQLite REST Backend Server Module</w:t>
       </w:r>
-      <w:bookmarkEnd w:id="73"/>
+      <w:bookmarkEnd w:id="68"/>
     </w:p>
     <w:p>
       <w:r>
@@ -33919,11 +33963,11 @@
       <w:pPr>
         <w:pStyle w:val="Heading3"/>
       </w:pPr>
-      <w:bookmarkStart w:id="74" w:name="_Toc237559771"/>
+      <w:bookmarkStart w:id="69" w:name="_Toc237559771"/>
       <w:r>
         <w:t>4.1.2.21 Guest Quota Manager &amp; History Security Module</w:t>
       </w:r>
-      <w:bookmarkEnd w:id="74"/>
+      <w:bookmarkEnd w:id="69"/>
     </w:p>
     <w:p>
       <w:r>
@@ -35144,11 +35188,11 @@
       <w:pPr>
         <w:pStyle w:val="Heading3"/>
       </w:pPr>
-      <w:bookmarkStart w:id="75" w:name="_Toc237559772"/>
+      <w:bookmarkStart w:id="70" w:name="_Toc237559772"/>
       <w:r>
         <w:t>4.1.2.22 Real-Time History Search &amp; UI Refinement Module</w:t>
       </w:r>
-      <w:bookmarkEnd w:id="75"/>
+      <w:bookmarkEnd w:id="70"/>
     </w:p>
     <w:p>
       <w:r>
@@ -36211,21 +36255,21 @@
       <w:pPr>
         <w:pStyle w:val="Heading2"/>
       </w:pPr>
-      <w:bookmarkStart w:id="76" w:name="_Toc237559773"/>
+      <w:bookmarkStart w:id="71" w:name="_Toc237559773"/>
       <w:r>
         <w:t>4.2 Testing</w:t>
       </w:r>
-      <w:bookmarkEnd w:id="76"/>
+      <w:bookmarkEnd w:id="71"/>
     </w:p>
     <w:p>
       <w:pPr>
         <w:pStyle w:val="Heading3"/>
       </w:pPr>
-      <w:bookmarkStart w:id="77" w:name="_Toc237559774"/>
+      <w:bookmarkStart w:id="72" w:name="_Toc237559774"/>
       <w:r>
         <w:t>4.2.1 Test Case for Unit Testing</w:t>
       </w:r>
-      <w:bookmarkEnd w:id="77"/>
+      <w:bookmarkEnd w:id="72"/>
     </w:p>
     <w:p>
       <w:pPr>
@@ -39225,11 +39269,11 @@
       <w:pPr>
         <w:pStyle w:val="Heading3"/>
       </w:pPr>
-      <w:bookmarkStart w:id="78" w:name="_Toc237559775"/>
+      <w:bookmarkStart w:id="73" w:name="_Toc237559775"/>
       <w:r>
         <w:t>4.2.2 Dataset Training &amp; Evasion Robustness Testing</w:t>
       </w:r>
-      <w:bookmarkEnd w:id="78"/>
+      <w:bookmarkEnd w:id="73"/>
     </w:p>
     <w:p>
       <w:pPr>
@@ -39439,14 +39483,14 @@
           <w:bCs/>
         </w:rPr>
       </w:pPr>
-      <w:bookmarkStart w:id="79" w:name="_Toc237559776"/>
+      <w:bookmarkStart w:id="74" w:name="_Toc237559776"/>
       <w:r>
         <w:rPr>
           <w:bCs/>
         </w:rPr>
         <w:t>4.3 Result Analysis</w:t>
       </w:r>
-      <w:bookmarkEnd w:id="79"/>
+      <w:bookmarkEnd w:id="74"/>
     </w:p>
     <w:p>
       <w:pPr>
@@ -39455,14 +39499,14 @@
           <w:bCs/>
         </w:rPr>
       </w:pPr>
-      <w:bookmarkStart w:id="80" w:name="_Toc237559777"/>
+      <w:bookmarkStart w:id="75" w:name="_Toc237559777"/>
       <w:r>
         <w:rPr>
           <w:bCs/>
         </w:rPr>
         <w:t>4.3.1 AI Probability Classification Analysis</w:t>
       </w:r>
-      <w:bookmarkEnd w:id="80"/>
+      <w:bookmarkEnd w:id="75"/>
     </w:p>
     <w:p>
       <w:r>
@@ -39756,7 +39800,7 @@
                     <pic:cNvPicPr/>
                   </pic:nvPicPr>
                   <pic:blipFill>
-                    <a:blip r:embed="rId22"/>
+                    <a:blip r:embed="rId23"/>
                     <a:stretch>
                       <a:fillRect/>
                     </a:stretch>
@@ -39807,14 +39851,14 @@
           <w:bCs/>
         </w:rPr>
       </w:pPr>
-      <w:bookmarkStart w:id="81" w:name="_Toc237559778"/>
+      <w:bookmarkStart w:id="76" w:name="_Toc237559778"/>
       <w:r>
         <w:rPr>
           <w:bCs/>
         </w:rPr>
         <w:t>4.3.2 Classifier Performance Analysis</w:t>
       </w:r>
-      <w:bookmarkEnd w:id="81"/>
+      <w:bookmarkEnd w:id="76"/>
     </w:p>
     <w:p>
       <w:r>
@@ -40079,7 +40123,7 @@
                     <pic:cNvPicPr/>
                   </pic:nvPicPr>
                   <pic:blipFill>
-                    <a:blip r:embed="rId23"/>
+                    <a:blip r:embed="rId24"/>
                     <a:stretch>
                       <a:fillRect/>
                     </a:stretch>
@@ -40125,14 +40169,14 @@
           <w:bCs/>
         </w:rPr>
       </w:pPr>
-      <w:bookmarkStart w:id="82" w:name="_Toc237559779"/>
+      <w:bookmarkStart w:id="77" w:name="_Toc237559779"/>
       <w:r>
         <w:rPr>
           <w:bCs/>
         </w:rPr>
         <w:t>4.3.3 AI Probability Distribution Analysis</w:t>
       </w:r>
-      <w:bookmarkEnd w:id="82"/>
+      <w:bookmarkEnd w:id="77"/>
     </w:p>
     <w:p>
       <w:pPr>
@@ -40495,7 +40539,7 @@
                     <pic:cNvPicPr/>
                   </pic:nvPicPr>
                   <pic:blipFill>
-                    <a:blip r:embed="rId24"/>
+                    <a:blip r:embed="rId25"/>
                     <a:stretch>
                       <a:fillRect/>
                     </a:stretch>
@@ -40546,14 +40590,14 @@
           <w:bCs/>
         </w:rPr>
       </w:pPr>
-      <w:bookmarkStart w:id="83" w:name="_Toc237559780"/>
+      <w:bookmarkStart w:id="78" w:name="_Toc237559780"/>
       <w:r>
         <w:rPr>
           <w:bCs/>
         </w:rPr>
         <w:t>4.3.4 Detector Accuracy Evaluation</w:t>
       </w:r>
-      <w:bookmarkEnd w:id="83"/>
+      <w:bookmarkEnd w:id="78"/>
     </w:p>
     <w:p>
       <w:r>
@@ -41154,7 +41198,7 @@
                     <pic:cNvPicPr/>
                   </pic:nvPicPr>
                   <pic:blipFill>
-                    <a:blip r:embed="rId25" cstate="print">
+                    <a:blip r:embed="rId26" cstate="print">
                       <a:extLst>
                         <a:ext uri="{28A0092B-C50C-407E-A947-70E740481C1C}">
                           <a14:useLocalDpi xmlns:a14="http://schemas.microsoft.com/office/drawing/2010/main" val="0"/>
@@ -41235,12 +41279,12 @@
       <w:pPr>
         <w:pStyle w:val="Heading1"/>
       </w:pPr>
-      <w:bookmarkStart w:id="84" w:name="_Toc237559781"/>
+      <w:bookmarkStart w:id="79" w:name="_Toc237559781"/>
       <w:r>
         <w:lastRenderedPageBreak/>
         <w:t>CHAPTER 5</w:t>
       </w:r>
-      <w:bookmarkEnd w:id="84"/>
+      <w:bookmarkEnd w:id="79"/>
       <w:r>
         <w:t xml:space="preserve"> </w:t>
       </w:r>
@@ -41252,24 +41296,24 @@
       <w:r>
         <w:t xml:space="preserve"> </w:t>
       </w:r>
-      <w:bookmarkStart w:id="85" w:name="_Toc237559782"/>
+      <w:bookmarkStart w:id="80" w:name="_Toc237559782"/>
       <w:r>
         <w:t>CONCLUSION AND FUTURE RECOMMENDATIONS</w:t>
       </w:r>
-      <w:bookmarkEnd w:id="85"/>
+      <w:bookmarkEnd w:id="80"/>
     </w:p>
     <w:p>
       <w:pPr>
         <w:pStyle w:val="Heading2"/>
       </w:pPr>
-      <w:bookmarkStart w:id="86" w:name="_Toc237559783"/>
+      <w:bookmarkStart w:id="81" w:name="_Toc237559783"/>
       <w:r>
         <w:rPr>
           <w:sz w:val="24"/>
         </w:rPr>
         <w:t>5.1 Conclusion</w:t>
       </w:r>
-      <w:bookmarkEnd w:id="86"/>
+      <w:bookmarkEnd w:id="81"/>
     </w:p>
     <w:p>
       <w:r>
@@ -41456,11 +41500,11 @@
       <w:pPr>
         <w:pStyle w:val="Heading2"/>
       </w:pPr>
-      <w:bookmarkStart w:id="87" w:name="_Toc237559784"/>
+      <w:bookmarkStart w:id="82" w:name="_Toc237559784"/>
       <w:r>
         <w:t>5.2 Future Recommendations</w:t>
       </w:r>
-      <w:bookmarkEnd w:id="87"/>
+      <w:bookmarkEnd w:id="82"/>
     </w:p>
     <w:p>
       <w:pPr>
@@ -41666,7 +41710,7 @@
           <w:sz w:val="36"/>
         </w:rPr>
       </w:pPr>
-      <w:bookmarkStart w:id="88" w:name="_Toc237559785"/>
+      <w:bookmarkStart w:id="83" w:name="_Toc237559785"/>
       <w:r>
         <w:rPr>
           <w:sz w:val="36"/>
@@ -41674,7 +41718,7 @@
         <w:lastRenderedPageBreak/>
         <w:t>REFERENCES</w:t>
       </w:r>
-      <w:bookmarkEnd w:id="88"/>
+      <w:bookmarkEnd w:id="83"/>
     </w:p>
     <w:p>
       <w:pPr>
@@ -41806,7 +41850,7 @@
         <w:rPr>
           <w:sz w:val="22"/>
         </w:rPr>
-        <w:t>c93023a7eb85</w:t>
+        <w:t xml:space="preserve">   </w:t>
       </w:r>
     </w:p>
     <w:p>
@@ -41848,7 +41892,31 @@
         <w:rPr>
           <w:sz w:val="22"/>
         </w:rPr>
-        <w:t>, H., &amp; Rush, A. M. (2019). GLTR: Statistical Visualization and Coherent Text Detection. ACL System Demonstrations.</w:t>
+        <w:t>, H., &amp; Rush, A. M. (2019). GLTR: Statistical Visualization and Coherent</w:t>
+      </w:r>
+      <w:r>
+        <w:rPr>
+          <w:sz w:val="22"/>
+        </w:rPr>
+        <w:t xml:space="preserve">    </w:t>
+      </w:r>
+      <w:r>
+        <w:rPr>
+          <w:sz w:val="22"/>
+        </w:rPr>
+        <w:t>Text</w:t>
+      </w:r>
+      <w:r>
+        <w:rPr>
+          <w:sz w:val="22"/>
+        </w:rPr>
+        <w:t xml:space="preserve"> </w:t>
+      </w:r>
+      <w:r>
+        <w:rPr>
+          <w:sz w:val="22"/>
+        </w:rPr>
+        <w:t>Detection. ACL System Demonstrations.</w:t>
       </w:r>
     </w:p>
     <w:p>
@@ -42308,12 +42376,24 @@
         <w:rPr>
           <w:sz w:val="22"/>
         </w:rPr>
-        <w:t>, T. L. (1975). A computer readability formula designed for machine translation. Journal of Applied Psychology, 60(2), 283</w:t>
+        <w:t xml:space="preserve">, T. L. (1975). A computer readability formula designed for machine </w:t>
       </w:r>
       <w:r>
         <w:rPr>
           <w:sz w:val="22"/>
         </w:rPr>
+        <w:t xml:space="preserve">      </w:t>
+      </w:r>
+      <w:r>
+        <w:rPr>
+          <w:sz w:val="22"/>
+        </w:rPr>
+        <w:t>translation. Journal of Applied Psychology, 60(2), 283</w:t>
+      </w:r>
+      <w:r>
+        <w:rPr>
+          <w:sz w:val="22"/>
+        </w:rPr>
         <w:t xml:space="preserve"> </w:t>
       </w:r>
       <w:r>
@@ -42409,14 +42489,147 @@
         <w:rPr>
           <w:sz w:val="22"/>
         </w:rPr>
+        <w:t xml:space="preserve">     </w:t>
+      </w:r>
+      <w:r>
+        <w:rPr>
+          <w:sz w:val="22"/>
+        </w:rPr>
+        <w:t>https://github.com/makcedward/nlpaug</w:t>
+      </w:r>
+    </w:p>
+    <w:p>
+      <w:pPr>
+        <w:spacing w:after="120"/>
+        <w:rPr>
+          <w:sz w:val="22"/>
+        </w:rPr>
+      </w:pPr>
+      <w:r>
+        <w:rPr>
+          <w:sz w:val="22"/>
+        </w:rPr>
         <w:lastRenderedPageBreak/>
+        <w:t>[10] Hugging Face. (2024). AI vs. Human Text Detection Dataset (silentone0725/ai</w:t>
+      </w:r>
+      <w:r>
+        <w:rPr>
+          <w:sz w:val="22"/>
+        </w:rPr>
+        <w:t xml:space="preserve"> </w:t>
+      </w:r>
+      <w:r>
+        <w:rPr>
+          <w:sz w:val="22"/>
+        </w:rPr>
+        <w:t>human</w:t>
+      </w:r>
+      <w:r>
+        <w:rPr>
+          <w:sz w:val="22"/>
+        </w:rPr>
+        <w:t xml:space="preserve"> </w:t>
+      </w:r>
+      <w:r>
+        <w:rPr>
+          <w:sz w:val="22"/>
+        </w:rPr>
+        <w:t>text</w:t>
+      </w:r>
+      <w:r>
+        <w:rPr>
+          <w:sz w:val="22"/>
+        </w:rPr>
+        <w:t xml:space="preserve"> </w:t>
+      </w:r>
+      <w:r>
+        <w:rPr>
+          <w:sz w:val="22"/>
+        </w:rPr>
+        <w:t xml:space="preserve">   </w:t>
+      </w:r>
+      <w:r>
+        <w:rPr>
+          <w:sz w:val="22"/>
+        </w:rPr>
+        <w:t>detection</w:t>
+      </w:r>
+      <w:r>
+        <w:rPr>
+          <w:sz w:val="22"/>
+        </w:rPr>
+        <w:t xml:space="preserve"> </w:t>
+      </w:r>
+      <w:r>
+        <w:rPr>
+          <w:sz w:val="22"/>
+        </w:rPr>
+        <w:t xml:space="preserve">v1). Hugging Face Datasets. </w:t>
+      </w:r>
+    </w:p>
+    <w:p>
+      <w:pPr>
+        <w:spacing w:after="120"/>
+      </w:pPr>
+      <w:r>
+        <w:rPr>
+          <w:sz w:val="22"/>
+        </w:rPr>
         <w:t xml:space="preserve">     </w:t>
       </w:r>
       <w:r>
         <w:rPr>
           <w:sz w:val="22"/>
         </w:rPr>
-        <w:t>https://github.com/makcedward/nlpaug</w:t>
+        <w:t>https://huggingface.co/datasets/silentone0725/ai</w:t>
+      </w:r>
+      <w:r>
+        <w:rPr>
+          <w:sz w:val="22"/>
+        </w:rPr>
+        <w:t xml:space="preserve"> </w:t>
+      </w:r>
+      <w:r>
+        <w:rPr>
+          <w:sz w:val="22"/>
+        </w:rPr>
+        <w:t>human</w:t>
+      </w:r>
+      <w:r>
+        <w:rPr>
+          <w:sz w:val="22"/>
+        </w:rPr>
+        <w:t xml:space="preserve"> </w:t>
+      </w:r>
+      <w:r>
+        <w:rPr>
+          <w:sz w:val="22"/>
+        </w:rPr>
+        <w:t>text</w:t>
+      </w:r>
+      <w:r>
+        <w:rPr>
+          <w:sz w:val="22"/>
+        </w:rPr>
+        <w:t xml:space="preserve"> </w:t>
+      </w:r>
+      <w:r>
+        <w:rPr>
+          <w:sz w:val="22"/>
+        </w:rPr>
+        <w:t>detection</w:t>
+      </w:r>
+      <w:r>
+        <w:rPr>
+          <w:sz w:val="22"/>
+        </w:rPr>
+        <w:t xml:space="preserve"> </w:t>
+      </w:r>
+      <w:r>
+        <w:rPr>
+          <w:sz w:val="22"/>
+        </w:rPr>
+        <w:t>v1</w:t>
       </w:r>
     </w:p>
     <w:p>
@@ -42430,158 +42643,31 @@
         <w:rPr>
           <w:sz w:val="22"/>
         </w:rPr>
-        <w:t>[10] Hugging Face. (2024). AI vs. Human Text Detection Dataset (silentone0725/ai</w:t>
-      </w:r>
+        <w:t xml:space="preserve">[11] </w:t>
+      </w:r>
+      <w:proofErr w:type="spellStart"/>
       <w:r>
         <w:rPr>
           <w:sz w:val="22"/>
         </w:rPr>
-        <w:t xml:space="preserve"> </w:t>
-      </w:r>
+        <w:t>Gerami</w:t>
+      </w:r>
+      <w:proofErr w:type="spellEnd"/>
       <w:r>
         <w:rPr>
           <w:sz w:val="22"/>
         </w:rPr>
-        <w:t>human</w:t>
-      </w:r>
-      <w:r>
+        <w:t>, S. (2023). AI vs Human Text Dataset. Kaggle.</w:t>
+      </w:r>
+    </w:p>
+    <w:p>
+      <w:pPr>
+        <w:spacing w:after="120"/>
         <w:rPr>
           <w:sz w:val="22"/>
         </w:rPr>
-        <w:t xml:space="preserve"> </w:t>
-      </w:r>
-      <w:r>
-        <w:rPr>
-          <w:sz w:val="22"/>
-        </w:rPr>
-        <w:t>text</w:t>
-      </w:r>
-      <w:r>
-        <w:rPr>
-          <w:sz w:val="22"/>
-        </w:rPr>
-        <w:t xml:space="preserve"> </w:t>
-      </w:r>
-      <w:r>
-        <w:rPr>
-          <w:sz w:val="22"/>
-        </w:rPr>
-        <w:t>detection</w:t>
-      </w:r>
-      <w:r>
-        <w:rPr>
-          <w:sz w:val="22"/>
-        </w:rPr>
-        <w:t xml:space="preserve"> </w:t>
-      </w:r>
-      <w:r>
-        <w:rPr>
-          <w:sz w:val="22"/>
-        </w:rPr>
-        <w:t xml:space="preserve">v1). Hugging Face Datasets. </w:t>
-      </w:r>
-    </w:p>
-    <w:p>
-      <w:pPr>
-        <w:spacing w:after="120"/>
-      </w:pPr>
-      <w:r>
-        <w:rPr>
-          <w:sz w:val="22"/>
-        </w:rPr>
-        <w:t xml:space="preserve">     </w:t>
-      </w:r>
-      <w:r>
-        <w:rPr>
-          <w:sz w:val="22"/>
-        </w:rPr>
-        <w:t>https://huggingface.co/datasets/silentone0725/ai</w:t>
-      </w:r>
-      <w:r>
-        <w:rPr>
-          <w:sz w:val="22"/>
-        </w:rPr>
-        <w:t xml:space="preserve"> </w:t>
-      </w:r>
-      <w:r>
-        <w:rPr>
-          <w:sz w:val="22"/>
-        </w:rPr>
-        <w:t>human</w:t>
-      </w:r>
-      <w:r>
-        <w:rPr>
-          <w:sz w:val="22"/>
-        </w:rPr>
-        <w:t xml:space="preserve"> </w:t>
-      </w:r>
-      <w:r>
-        <w:rPr>
-          <w:sz w:val="22"/>
-        </w:rPr>
-        <w:t>text</w:t>
-      </w:r>
-      <w:r>
-        <w:rPr>
-          <w:sz w:val="22"/>
-        </w:rPr>
-        <w:t xml:space="preserve"> </w:t>
-      </w:r>
-      <w:r>
-        <w:rPr>
-          <w:sz w:val="22"/>
-        </w:rPr>
-        <w:t>detection</w:t>
-      </w:r>
-      <w:r>
-        <w:rPr>
-          <w:sz w:val="22"/>
-        </w:rPr>
-        <w:t xml:space="preserve"> </w:t>
-      </w:r>
-      <w:r>
-        <w:rPr>
-          <w:sz w:val="22"/>
-        </w:rPr>
-        <w:t>v1</w:t>
-      </w:r>
-    </w:p>
-    <w:p>
-      <w:pPr>
-        <w:spacing w:after="120"/>
-        <w:rPr>
-          <w:sz w:val="22"/>
-        </w:rPr>
-      </w:pPr>
-      <w:r>
-        <w:rPr>
-          <w:sz w:val="22"/>
-        </w:rPr>
-        <w:t xml:space="preserve">[11] </w:t>
-      </w:r>
-      <w:proofErr w:type="spellStart"/>
-      <w:r>
-        <w:rPr>
-          <w:sz w:val="22"/>
-        </w:rPr>
-        <w:t>Gerami</w:t>
-      </w:r>
-      <w:proofErr w:type="spellEnd"/>
-      <w:r>
-        <w:rPr>
-          <w:sz w:val="22"/>
-        </w:rPr>
-        <w:t>, S. (2023). AI vs Human Text Dataset. Kaggle.</w:t>
-      </w:r>
-    </w:p>
-    <w:p>
-      <w:pPr>
-        <w:spacing w:after="120"/>
-        <w:rPr>
-          <w:sz w:val="22"/>
-        </w:rPr>
         <w:sectPr>
-          <w:footerReference w:type="default" r:id="rId26"/>
+          <w:footerReference w:type="default" r:id="rId27"/>
           <w:pgSz w:w="12240" w:h="15840"/>
           <w:pgMar w:top="1440" w:right="1440" w:bottom="1440" w:left="1800" w:header="720" w:footer="720" w:gutter="0"/>
           <w:pgNumType w:start="1"/>
@@ -42644,14 +42730,14 @@
       <w:pPr>
         <w:pStyle w:val="Heading1"/>
       </w:pPr>
-      <w:bookmarkStart w:id="89" w:name="_Toc232289034"/>
-      <w:bookmarkStart w:id="90" w:name="_Toc237559786"/>
+      <w:bookmarkStart w:id="84" w:name="_Toc232289034"/>
+      <w:bookmarkStart w:id="85" w:name="_Toc237559786"/>
       <w:r>
         <w:lastRenderedPageBreak/>
         <w:t>APPENDICES</w:t>
       </w:r>
-      <w:bookmarkEnd w:id="89"/>
-      <w:bookmarkEnd w:id="90"/>
+      <w:bookmarkEnd w:id="84"/>
+      <w:bookmarkEnd w:id="85"/>
     </w:p>
     <w:p>
       <w:r>
@@ -42674,7 +42760,7 @@
                     <pic:cNvPicPr/>
                   </pic:nvPicPr>
                   <pic:blipFill>
-                    <a:blip r:embed="rId27"/>
+                    <a:blip r:embed="rId28"/>
                     <a:stretch>
                       <a:fillRect/>
                     </a:stretch>
@@ -42738,7 +42824,7 @@
                     <pic:cNvPicPr/>
                   </pic:nvPicPr>
                   <pic:blipFill rotWithShape="1">
-                    <a:blip r:embed="rId28"/>
+                    <a:blip r:embed="rId29"/>
                     <a:srcRect b="3963"/>
                     <a:stretch/>
                   </pic:blipFill>
@@ -42801,67 +42887,6 @@
             <wp:extent cx="5715000" cy="3083560"/>
             <wp:effectExtent l="0" t="0" r="0" b="2540"/>
             <wp:docPr id="11" name="Picture 11"/>
-            <wp:cNvGraphicFramePr>
-              <a:graphicFrameLocks xmlns:a="http://schemas.openxmlformats.org/drawingml/2006/main" noChangeAspect="1"/>
-            </wp:cNvGraphicFramePr>
-            <a:graphic xmlns:a="http://schemas.openxmlformats.org/drawingml/2006/main">
-              <a:graphicData uri="http://schemas.openxmlformats.org/drawingml/2006/picture">
-                <pic:pic xmlns:pic="http://schemas.openxmlformats.org/drawingml/2006/picture">
-                  <pic:nvPicPr>
-                    <pic:cNvPr id="1" name=""/>
-                    <pic:cNvPicPr/>
-                  </pic:nvPicPr>
-                  <pic:blipFill>
-                    <a:blip r:embed="rId29"/>
-                    <a:stretch>
-                      <a:fillRect/>
-                    </a:stretch>
-                  </pic:blipFill>
-                  <pic:spPr>
-                    <a:xfrm>
-                      <a:off x="0" y="0"/>
-                      <a:ext cx="5715000" cy="3083560"/>
-                    </a:xfrm>
-                    <a:prstGeom prst="rect">
-                      <a:avLst/>
-                    </a:prstGeom>
-                  </pic:spPr>
-                </pic:pic>
-              </a:graphicData>
-            </a:graphic>
-          </wp:inline>
-        </w:drawing>
-      </w:r>
-    </w:p>
-    <w:p>
-      <w:pPr>
-        <w:jc w:val="center"/>
-        <w:rPr>
-          <w:b/>
-          <w:bCs/>
-        </w:rPr>
-      </w:pPr>
-      <w:r>
-        <w:rPr>
-          <w:b/>
-        </w:rPr>
-        <w:t xml:space="preserve">Appendices </w:t>
-      </w:r>
-      <w:r>
-        <w:rPr>
-          <w:b/>
-        </w:rPr>
-        <w:t>3</w:t>
-      </w:r>
-      <w:r>
-        <w:rPr>
-          <w:noProof/>
-        </w:rPr>
-        <w:drawing>
-          <wp:inline distT="0" distB="0" distL="0" distR="0" wp14:anchorId="2C08C4B3" wp14:editId="676EBF4C">
-            <wp:extent cx="5715000" cy="3083560"/>
-            <wp:effectExtent l="0" t="0" r="0" b="2540"/>
-            <wp:docPr id="30" name="Picture 30"/>
             <wp:cNvGraphicFramePr>
               <a:graphicFrameLocks xmlns:a="http://schemas.openxmlformats.org/drawingml/2006/main" noChangeAspect="1"/>
             </wp:cNvGraphicFramePr>
@@ -42912,29 +42937,17 @@
         <w:rPr>
           <w:b/>
         </w:rPr>
-        <w:t>4</w:t>
-      </w:r>
-    </w:p>
-    <w:p>
-      <w:pPr>
-        <w:jc w:val="center"/>
-        <w:rPr>
-          <w:b/>
-          <w:bCs/>
-        </w:rPr>
-      </w:pPr>
-      <w:r>
-        <w:rPr>
-          <w:b/>
-          <w:bCs/>
+        <w:t>3</w:t>
+      </w:r>
+      <w:r>
+        <w:rPr>
           <w:noProof/>
         </w:rPr>
-        <w:lastRenderedPageBreak/>
         <w:drawing>
-          <wp:inline distT="0" distB="0" distL="0" distR="0" wp14:anchorId="1EADB043" wp14:editId="084FB22A">
-            <wp:extent cx="5715000" cy="3092450"/>
-            <wp:effectExtent l="0" t="0" r="0" b="0"/>
-            <wp:docPr id="34" name="Picture 34"/>
+          <wp:inline distT="0" distB="0" distL="0" distR="0" wp14:anchorId="2C08C4B3" wp14:editId="676EBF4C">
+            <wp:extent cx="5715000" cy="3083560"/>
+            <wp:effectExtent l="0" t="0" r="0" b="2540"/>
+            <wp:docPr id="30" name="Picture 30"/>
             <wp:cNvGraphicFramePr>
               <a:graphicFrameLocks xmlns:a="http://schemas.openxmlformats.org/drawingml/2006/main" noChangeAspect="1"/>
             </wp:cNvGraphicFramePr>
@@ -42954,7 +42967,7 @@
                   <pic:spPr>
                     <a:xfrm>
                       <a:off x="0" y="0"/>
-                      <a:ext cx="5715000" cy="3092450"/>
+                      <a:ext cx="5715000" cy="3083560"/>
                     </a:xfrm>
                     <a:prstGeom prst="rect">
                       <a:avLst/>
@@ -42975,25 +42988,17 @@
           <w:bCs/>
         </w:rPr>
       </w:pPr>
-    </w:p>
-    <w:p>
-      <w:pPr>
-        <w:jc w:val="center"/>
+      <w:r>
         <w:rPr>
           <w:b/>
         </w:rPr>
-      </w:pPr>
+        <w:t xml:space="preserve">Appendices </w:t>
+      </w:r>
       <w:r>
         <w:rPr>
           <w:b/>
         </w:rPr>
-        <w:t xml:space="preserve">Appendices </w:t>
-      </w:r>
-      <w:r>
-        <w:rPr>
-          <w:b/>
-        </w:rPr>
-        <w:t>5</w:t>
+        <w:t>4</w:t>
       </w:r>
     </w:p>
     <w:p>
@@ -43008,12 +43013,14 @@
         <w:rPr>
           <w:b/>
           <w:bCs/>
-        </w:rPr>
+          <w:noProof/>
+        </w:rPr>
+        <w:lastRenderedPageBreak/>
         <w:drawing>
-          <wp:inline distT="0" distB="0" distL="0" distR="0" wp14:anchorId="54C2BBBE" wp14:editId="575A5669">
-            <wp:extent cx="5715000" cy="2837180"/>
-            <wp:effectExtent l="0" t="0" r="0" b="1270"/>
-            <wp:docPr id="2" name="Picture 2"/>
+          <wp:inline distT="0" distB="0" distL="0" distR="0" wp14:anchorId="1EADB043" wp14:editId="084FB22A">
+            <wp:extent cx="5715000" cy="3092450"/>
+            <wp:effectExtent l="0" t="0" r="0" b="0"/>
+            <wp:docPr id="34" name="Picture 34"/>
             <wp:cNvGraphicFramePr>
               <a:graphicFrameLocks xmlns:a="http://schemas.openxmlformats.org/drawingml/2006/main" noChangeAspect="1"/>
             </wp:cNvGraphicFramePr>
@@ -43033,7 +43040,7 @@
                   <pic:spPr>
                     <a:xfrm>
                       <a:off x="0" y="0"/>
-                      <a:ext cx="5715000" cy="2837180"/>
+                      <a:ext cx="5715000" cy="3092450"/>
                     </a:xfrm>
                     <a:prstGeom prst="rect">
                       <a:avLst/>
@@ -43054,92 +43061,47 @@
           <w:bCs/>
         </w:rPr>
       </w:pPr>
-      <w:r>
+    </w:p>
+    <w:p>
+      <w:pPr>
+        <w:jc w:val="center"/>
+        <w:rPr>
+          <w:b/>
+        </w:rPr>
+      </w:pPr>
+      <w:r>
+        <w:rPr>
+          <w:b/>
+        </w:rPr>
+        <w:t xml:space="preserve">Appendices </w:t>
+      </w:r>
+      <w:r>
+        <w:rPr>
+          <w:b/>
+        </w:rPr>
+        <w:t>5</w:t>
+      </w:r>
+    </w:p>
+    <w:p>
+      <w:pPr>
+        <w:jc w:val="center"/>
         <w:rPr>
           <w:b/>
           <w:bCs/>
         </w:rPr>
-        <w:lastRenderedPageBreak/>
-        <w:drawing>
-          <wp:inline distT="0" distB="0" distL="0" distR="0" wp14:anchorId="1CB0BEF3" wp14:editId="2619FE22">
-            <wp:extent cx="6056368" cy="3616325"/>
-            <wp:effectExtent l="0" t="0" r="1905" b="3175"/>
-            <wp:docPr id="6" name="Picture 6"/>
-            <wp:cNvGraphicFramePr>
-              <a:graphicFrameLocks xmlns:a="http://schemas.openxmlformats.org/drawingml/2006/main" noChangeAspect="1"/>
-            </wp:cNvGraphicFramePr>
-            <a:graphic xmlns:a="http://schemas.openxmlformats.org/drawingml/2006/main">
-              <a:graphicData uri="http://schemas.openxmlformats.org/drawingml/2006/picture">
-                <pic:pic xmlns:pic="http://schemas.openxmlformats.org/drawingml/2006/picture">
-                  <pic:nvPicPr>
-                    <pic:cNvPr id="1" name=""/>
-                    <pic:cNvPicPr/>
-                  </pic:nvPicPr>
-                  <pic:blipFill>
-                    <a:blip r:embed="rId33"/>
-                    <a:stretch>
-                      <a:fillRect/>
-                    </a:stretch>
-                  </pic:blipFill>
-                  <pic:spPr>
-                    <a:xfrm>
-                      <a:off x="0" y="0"/>
-                      <a:ext cx="6099285" cy="3641951"/>
-                    </a:xfrm>
-                    <a:prstGeom prst="rect">
-                      <a:avLst/>
-                    </a:prstGeom>
-                  </pic:spPr>
-                </pic:pic>
-              </a:graphicData>
-            </a:graphic>
-          </wp:inline>
-        </w:drawing>
-      </w:r>
-      <w:r>
+      </w:pPr>
+    </w:p>
+    <w:p>
+      <w:pPr>
+        <w:jc w:val="center"/>
         <w:rPr>
           <w:b/>
           <w:bCs/>
         </w:rPr>
-        <w:drawing>
-          <wp:inline distT="0" distB="0" distL="0" distR="0" wp14:anchorId="7B8EE5A8" wp14:editId="3103A4D6">
-            <wp:extent cx="5715000" cy="4272915"/>
-            <wp:effectExtent l="0" t="0" r="0" b="0"/>
-            <wp:docPr id="3" name="Picture 3"/>
-            <wp:cNvGraphicFramePr>
-              <a:graphicFrameLocks xmlns:a="http://schemas.openxmlformats.org/drawingml/2006/main" noChangeAspect="1"/>
-            </wp:cNvGraphicFramePr>
-            <a:graphic xmlns:a="http://schemas.openxmlformats.org/drawingml/2006/main">
-              <a:graphicData uri="http://schemas.openxmlformats.org/drawingml/2006/picture">
-                <pic:pic xmlns:pic="http://schemas.openxmlformats.org/drawingml/2006/picture">
-                  <pic:nvPicPr>
-                    <pic:cNvPr id="1" name=""/>
-                    <pic:cNvPicPr/>
-                  </pic:nvPicPr>
-                  <pic:blipFill>
-                    <a:blip r:embed="rId34"/>
-                    <a:stretch>
-                      <a:fillRect/>
-                    </a:stretch>
-                  </pic:blipFill>
-                  <pic:spPr>
-                    <a:xfrm>
-                      <a:off x="0" y="0"/>
-                      <a:ext cx="5715000" cy="4272915"/>
-                    </a:xfrm>
-                    <a:prstGeom prst="rect">
-                      <a:avLst/>
-                    </a:prstGeom>
-                  </pic:spPr>
-                </pic:pic>
-              </a:graphicData>
-            </a:graphic>
-          </wp:inline>
-        </w:drawing>
-      </w:r>
+      </w:pPr>
     </w:p>
     <w:sectPr>
-      <w:footerReference w:type="default" r:id="rId35"/>
+      <w:footerReference w:type="default" r:id="rId33"/>
       <w:pgSz w:w="12240" w:h="15840"/>
       <w:pgMar w:top="1440" w:right="1440" w:bottom="1440" w:left="1800" w:header="720" w:footer="720" w:gutter="0"/>
       <w:pgNumType w:start="1"/>
@@ -46806,7 +46768,6 @@
   <w:style w:type="character" w:default="1" w:styleId="DefaultParagraphFont">
     <w:name w:val="Default Paragraph Font"/>
     <w:uiPriority w:val="1"/>
-    <w:semiHidden/>
     <w:unhideWhenUsed/>
   </w:style>
   <w:style w:type="table" w:default="1" w:styleId="TableNormal">
@@ -47960,7 +47921,7 @@
 </file>
 
 <file path=customXml/itemProps1.xml><?xml version="1.0" encoding="utf-8"?>
-<ds:datastoreItem xmlns:ds="http://schemas.openxmlformats.org/officeDocument/2006/customXml" ds:itemID="{C412A9E0-1E13-42F8-827B-0626315D2DDE}">
+<ds:datastoreItem xmlns:ds="http://schemas.openxmlformats.org/officeDocument/2006/customXml" ds:itemID="{3CE310DD-B36F-4FE1-B367-BEA31AFD3324}">
   <ds:schemaRefs>
     <ds:schemaRef ds:uri="http://schemas.openxmlformats.org/officeDocument/2006/bibliography"/>
   </ds:schemaRefs>

</xml_diff>

<commit_message>
Update report and diagrams, clean up temporary scripts
</commit_message>
<xml_diff>
--- a/Ai text Detector Report_Updated.docx
+++ b/Ai text Detector Report_Updated.docx
@@ -6,6 +6,7 @@
       <w:pPr>
         <w:jc w:val="center"/>
       </w:pPr>
+      <w:bookmarkStart w:id="0" w:name="_Hlk237902297"/>
       <w:r>
         <w:rPr>
           <w:noProof/>
@@ -757,13 +758,13 @@
       <w:pPr>
         <w:pStyle w:val="Heading1"/>
       </w:pPr>
-      <w:bookmarkStart w:id="0" w:name="_Toc202261069"/>
-      <w:bookmarkStart w:id="1" w:name="_Toc237559707"/>
+      <w:bookmarkStart w:id="1" w:name="_Toc202261069"/>
+      <w:bookmarkStart w:id="2" w:name="_Toc237904398"/>
       <w:r>
         <w:t>SUPERVISORS RECOMMENDATION</w:t>
       </w:r>
-      <w:bookmarkEnd w:id="0"/>
       <w:bookmarkEnd w:id="1"/>
+      <w:bookmarkEnd w:id="2"/>
       <w:r>
         <w:t xml:space="preserve"> </w:t>
       </w:r>
@@ -1008,13 +1009,13 @@
         <w:spacing w:after="78"/>
         <w:ind w:left="224" w:right="223"/>
       </w:pPr>
-      <w:bookmarkStart w:id="2" w:name="_Toc202261070"/>
-      <w:bookmarkStart w:id="3" w:name="_Toc237559708"/>
+      <w:bookmarkStart w:id="3" w:name="_Toc202261070"/>
+      <w:bookmarkStart w:id="4" w:name="_Toc237904399"/>
       <w:r>
         <w:t>LETTER OF APPROVAL</w:t>
       </w:r>
-      <w:bookmarkEnd w:id="2"/>
       <w:bookmarkEnd w:id="3"/>
+      <w:bookmarkEnd w:id="4"/>
       <w:r>
         <w:t xml:space="preserve"> </w:t>
       </w:r>
@@ -1343,14 +1344,14 @@
       <w:r>
         <w:br w:type="page"/>
       </w:r>
-      <w:bookmarkStart w:id="4" w:name="_Toc202261071"/>
-      <w:bookmarkStart w:id="5" w:name="_Toc237559709"/>
+      <w:bookmarkStart w:id="5" w:name="_Toc202261071"/>
+      <w:bookmarkStart w:id="6" w:name="_Toc237904400"/>
       <w:r>
         <w:lastRenderedPageBreak/>
         <w:t>ACKNOWLEDGEMENT</w:t>
       </w:r>
-      <w:bookmarkEnd w:id="4"/>
       <w:bookmarkEnd w:id="5"/>
+      <w:bookmarkEnd w:id="6"/>
       <w:r>
         <w:t xml:space="preserve">  </w:t>
       </w:r>
@@ -1361,7 +1362,12 @@
         <w:ind w:left="-5" w:right="55"/>
       </w:pPr>
       <w:r>
-        <w:t xml:space="preserve">The project of developing AI TEXT DETECTOR to verify Machine Produced text by statistical Natural Language Processing(NLP) K Nearest Neighbors(KNN) and Cosine Similarity cannot be carried without support. Mr. Niraj Khadka Project Supervisor/Coordinator whose valuable suggestion and motivation had helped a lot during project development I will never fail to be thankful for those due to his rich expertise and ever inspiring words, I learned more in the course of time the real meaning behind Natural language Processing and Machine learning . Special thanks </w:t>
+        <w:t xml:space="preserve">The project of developing AI TEXT DETECTOR to verify Machine Produced text by statistical Natural Language Processing(NLP) K Nearest Neighbors(KNN) and Cosine Similarity cannot be carried without support. Mr. Niraj Khadka Project Supervisor/Coordinator whose valuable suggestion and motivation had helped a </w:t>
+      </w:r>
+      <w:bookmarkStart w:id="7" w:name="_GoBack"/>
+      <w:bookmarkEnd w:id="7"/>
+      <w:r>
+        <w:t xml:space="preserve">lot during project development I will never fail to be thankful for those due to his rich expertise and ever inspiring words, I learned more in the course of time the real meaning behind Natural language Processing and Machine learning . Special thanks </w:t>
       </w:r>
       <w:proofErr w:type="gramStart"/>
       <w:r>
@@ -1389,6 +1395,9 @@
     </w:p>
     <w:p>
       <w:pPr>
+        <w:tabs>
+          <w:tab w:val="left" w:pos="7830"/>
+        </w:tabs>
         <w:spacing w:after="0"/>
         <w:jc w:val="left"/>
       </w:pPr>
@@ -1409,14 +1418,14 @@
         <w:spacing w:after="78"/>
         <w:ind w:left="224" w:right="221"/>
       </w:pPr>
-      <w:bookmarkStart w:id="6" w:name="_Toc202261072"/>
-      <w:bookmarkStart w:id="7" w:name="_Toc237559710"/>
+      <w:bookmarkStart w:id="8" w:name="_Toc202261072"/>
+      <w:bookmarkStart w:id="9" w:name="_Toc237904401"/>
       <w:r>
         <w:lastRenderedPageBreak/>
         <w:t>ABSTRACT</w:t>
       </w:r>
-      <w:bookmarkEnd w:id="6"/>
-      <w:bookmarkEnd w:id="7"/>
+      <w:bookmarkEnd w:id="8"/>
+      <w:bookmarkEnd w:id="9"/>
       <w:r>
         <w:t xml:space="preserve"> </w:t>
       </w:r>
@@ -1660,7 +1669,7 @@
           <w:r>
             <w:fldChar w:fldCharType="separate"/>
           </w:r>
-          <w:hyperlink w:anchor="_Toc237559707" w:history="1">
+          <w:hyperlink w:anchor="_Toc237904398" w:history="1">
             <w:r>
               <w:rPr>
                 <w:rStyle w:val="Hyperlink"/>
@@ -1683,7 +1692,7 @@
               <w:rPr>
                 <w:webHidden/>
               </w:rPr>
-              <w:instrText xml:space="preserve"> PAGEREF _Toc237559707 \h </w:instrText>
+              <w:instrText xml:space="preserve"> PAGEREF _Toc237904398 \h </w:instrText>
             </w:r>
             <w:r>
               <w:rPr>
@@ -1725,7 +1734,7 @@
               <w14:ligatures w14:val="none"/>
             </w:rPr>
           </w:pPr>
-          <w:hyperlink w:anchor="_Toc237559708" w:history="1">
+          <w:hyperlink w:anchor="_Toc237904399" w:history="1">
             <w:r>
               <w:rPr>
                 <w:rStyle w:val="Hyperlink"/>
@@ -1748,7 +1757,7 @@
               <w:rPr>
                 <w:webHidden/>
               </w:rPr>
-              <w:instrText xml:space="preserve"> PAGEREF _Toc237559708 \h </w:instrText>
+              <w:instrText xml:space="preserve"> PAGEREF _Toc237904399 \h </w:instrText>
             </w:r>
             <w:r>
               <w:rPr>
@@ -1790,7 +1799,7 @@
               <w14:ligatures w14:val="none"/>
             </w:rPr>
           </w:pPr>
-          <w:hyperlink w:anchor="_Toc237559709" w:history="1">
+          <w:hyperlink w:anchor="_Toc237904400" w:history="1">
             <w:r>
               <w:rPr>
                 <w:rStyle w:val="Hyperlink"/>
@@ -1813,7 +1822,7 @@
               <w:rPr>
                 <w:webHidden/>
               </w:rPr>
-              <w:instrText xml:space="preserve"> PAGEREF _Toc237559709 \h </w:instrText>
+              <w:instrText xml:space="preserve"> PAGEREF _Toc237904400 \h </w:instrText>
             </w:r>
             <w:r>
               <w:rPr>
@@ -1855,7 +1864,7 @@
               <w14:ligatures w14:val="none"/>
             </w:rPr>
           </w:pPr>
-          <w:hyperlink w:anchor="_Toc237559710" w:history="1">
+          <w:hyperlink w:anchor="_Toc237904401" w:history="1">
             <w:r>
               <w:rPr>
                 <w:rStyle w:val="Hyperlink"/>
@@ -1878,7 +1887,7 @@
               <w:rPr>
                 <w:webHidden/>
               </w:rPr>
-              <w:instrText xml:space="preserve"> PAGEREF _Toc237559710 \h </w:instrText>
+              <w:instrText xml:space="preserve"> PAGEREF _Toc237904401 \h </w:instrText>
             </w:r>
             <w:r>
               <w:rPr>
@@ -1920,7 +1929,7 @@
               <w14:ligatures w14:val="none"/>
             </w:rPr>
           </w:pPr>
-          <w:hyperlink w:anchor="_Toc237559711" w:history="1">
+          <w:hyperlink w:anchor="_Toc237904402" w:history="1">
             <w:r>
               <w:rPr>
                 <w:rStyle w:val="Hyperlink"/>
@@ -1943,7 +1952,7 @@
               <w:rPr>
                 <w:webHidden/>
               </w:rPr>
-              <w:instrText xml:space="preserve"> PAGEREF _Toc237559711 \h </w:instrText>
+              <w:instrText xml:space="preserve"> PAGEREF _Toc237904402 \h </w:instrText>
             </w:r>
             <w:r>
               <w:rPr>
@@ -1985,7 +1994,7 @@
               <w14:ligatures w14:val="none"/>
             </w:rPr>
           </w:pPr>
-          <w:hyperlink w:anchor="_Toc237559712" w:history="1">
+          <w:hyperlink w:anchor="_Toc237904403" w:history="1">
             <w:r>
               <w:rPr>
                 <w:rStyle w:val="Hyperlink"/>
@@ -2008,7 +2017,7 @@
               <w:rPr>
                 <w:webHidden/>
               </w:rPr>
-              <w:instrText xml:space="preserve"> PAGEREF _Toc237559712 \h </w:instrText>
+              <w:instrText xml:space="preserve"> PAGEREF _Toc237904403 \h </w:instrText>
             </w:r>
             <w:r>
               <w:rPr>
@@ -2050,7 +2059,7 @@
               <w14:ligatures w14:val="none"/>
             </w:rPr>
           </w:pPr>
-          <w:hyperlink w:anchor="_Toc237559713" w:history="1">
+          <w:hyperlink w:anchor="_Toc237904404" w:history="1">
             <w:r>
               <w:rPr>
                 <w:rStyle w:val="Hyperlink"/>
@@ -2073,7 +2082,7 @@
               <w:rPr>
                 <w:webHidden/>
               </w:rPr>
-              <w:instrText xml:space="preserve"> PAGEREF _Toc237559713 \h </w:instrText>
+              <w:instrText xml:space="preserve"> PAGEREF _Toc237904404 \h </w:instrText>
             </w:r>
             <w:r>
               <w:rPr>
@@ -2115,15 +2124,59 @@
               <w14:ligatures w14:val="none"/>
             </w:rPr>
           </w:pPr>
-          <w:hyperlink w:anchor="_Toc237559714" w:history="1">
+          <w:hyperlink w:anchor="_Toc237904405" w:history="1">
             <w:r>
               <w:rPr>
                 <w:rStyle w:val="Hyperlink"/>
               </w:rPr>
               <w:t>CHAPTER 1</w:t>
             </w:r>
+            <w:r>
+              <w:rPr>
+                <w:webHidden/>
+              </w:rPr>
+              <w:tab/>
+            </w:r>
+            <w:r>
+              <w:rPr>
+                <w:webHidden/>
+              </w:rPr>
+              <w:fldChar w:fldCharType="begin"/>
+            </w:r>
+            <w:r>
+              <w:rPr>
+                <w:webHidden/>
+              </w:rPr>
+              <w:instrText xml:space="preserve"> PAGEREF _Toc237904405 \h </w:instrText>
+            </w:r>
+            <w:r>
+              <w:rPr>
+                <w:webHidden/>
+              </w:rPr>
+            </w:r>
+            <w:r>
+              <w:rPr>
+                <w:webHidden/>
+              </w:rPr>
+              <w:fldChar w:fldCharType="separate"/>
+            </w:r>
+            <w:r>
+              <w:rPr>
+                <w:webHidden/>
+              </w:rPr>
+              <w:t>1</w:t>
+            </w:r>
+            <w:r>
+              <w:rPr>
+                <w:webHidden/>
+              </w:rPr>
+              <w:fldChar w:fldCharType="end"/>
+            </w:r>
           </w:hyperlink>
-          <w:r>
+        </w:p>
+        <w:p>
+          <w:pPr>
+            <w:pStyle w:val="TOC1"/>
             <w:rPr>
               <w:rFonts w:asciiTheme="minorHAnsi" w:eastAsiaTheme="minorEastAsia" w:hAnsiTheme="minorHAnsi" w:cstheme="minorBidi"/>
               <w:b w:val="0"/>
@@ -2135,9 +2188,8 @@
               <w:lang w:bidi="ne-NP"/>
               <w14:ligatures w14:val="none"/>
             </w:rPr>
-            <w:t xml:space="preserve"> </w:t>
-          </w:r>
-          <w:hyperlink w:anchor="_Toc237559715" w:history="1">
+          </w:pPr>
+          <w:hyperlink w:anchor="_Toc237904406" w:history="1">
             <w:r>
               <w:rPr>
                 <w:rStyle w:val="Hyperlink"/>
@@ -2160,7 +2212,7 @@
               <w:rPr>
                 <w:webHidden/>
               </w:rPr>
-              <w:instrText xml:space="preserve"> PAGEREF _Toc237559715 \h </w:instrText>
+              <w:instrText xml:space="preserve"> PAGEREF _Toc237904406 \h </w:instrText>
             </w:r>
             <w:r>
               <w:rPr>
@@ -2204,7 +2256,7 @@
               <w14:ligatures w14:val="none"/>
             </w:rPr>
           </w:pPr>
-          <w:hyperlink w:anchor="_Toc237559716" w:history="1">
+          <w:hyperlink w:anchor="_Toc237904407" w:history="1">
             <w:r>
               <w:rPr>
                 <w:rStyle w:val="Hyperlink"/>
@@ -2231,7 +2283,7 @@
                 <w:noProof/>
                 <w:webHidden/>
               </w:rPr>
-              <w:instrText xml:space="preserve"> PAGEREF _Toc237559716 \h </w:instrText>
+              <w:instrText xml:space="preserve"> PAGEREF _Toc237904407 \h </w:instrText>
             </w:r>
             <w:r>
               <w:rPr>
@@ -2279,7 +2331,7 @@
               <w14:ligatures w14:val="none"/>
             </w:rPr>
           </w:pPr>
-          <w:hyperlink w:anchor="_Toc237559717" w:history="1">
+          <w:hyperlink w:anchor="_Toc237904408" w:history="1">
             <w:r>
               <w:rPr>
                 <w:rStyle w:val="Hyperlink"/>
@@ -2306,7 +2358,7 @@
                 <w:noProof/>
                 <w:webHidden/>
               </w:rPr>
-              <w:instrText xml:space="preserve"> PAGEREF _Toc237559717 \h </w:instrText>
+              <w:instrText xml:space="preserve"> PAGEREF _Toc237904408 \h </w:instrText>
             </w:r>
             <w:r>
               <w:rPr>
@@ -2354,7 +2406,7 @@
               <w14:ligatures w14:val="none"/>
             </w:rPr>
           </w:pPr>
-          <w:hyperlink w:anchor="_Toc237559718" w:history="1">
+          <w:hyperlink w:anchor="_Toc237904409" w:history="1">
             <w:r>
               <w:rPr>
                 <w:rStyle w:val="Hyperlink"/>
@@ -2381,7 +2433,7 @@
                 <w:noProof/>
                 <w:webHidden/>
               </w:rPr>
-              <w:instrText xml:space="preserve"> PAGEREF _Toc237559718 \h </w:instrText>
+              <w:instrText xml:space="preserve"> PAGEREF _Toc237904409 \h </w:instrText>
             </w:r>
             <w:r>
               <w:rPr>
@@ -2429,7 +2481,7 @@
               <w14:ligatures w14:val="none"/>
             </w:rPr>
           </w:pPr>
-          <w:hyperlink w:anchor="_Toc237559719" w:history="1">
+          <w:hyperlink w:anchor="_Toc237904410" w:history="1">
             <w:r>
               <w:rPr>
                 <w:rStyle w:val="Hyperlink"/>
@@ -2456,7 +2508,7 @@
                 <w:noProof/>
                 <w:webHidden/>
               </w:rPr>
-              <w:instrText xml:space="preserve"> PAGEREF _Toc237559719 \h </w:instrText>
+              <w:instrText xml:space="preserve"> PAGEREF _Toc237904410 \h </w:instrText>
             </w:r>
             <w:r>
               <w:rPr>
@@ -2504,7 +2556,7 @@
               <w14:ligatures w14:val="none"/>
             </w:rPr>
           </w:pPr>
-          <w:hyperlink w:anchor="_Toc237559720" w:history="1">
+          <w:hyperlink w:anchor="_Toc237904411" w:history="1">
             <w:r>
               <w:rPr>
                 <w:rStyle w:val="Hyperlink"/>
@@ -2531,7 +2583,7 @@
                 <w:noProof/>
                 <w:webHidden/>
               </w:rPr>
-              <w:instrText xml:space="preserve"> PAGEREF _Toc237559720 \h </w:instrText>
+              <w:instrText xml:space="preserve"> PAGEREF _Toc237904411 \h </w:instrText>
             </w:r>
             <w:r>
               <w:rPr>
@@ -2577,31 +2629,76 @@
               <w14:ligatures w14:val="none"/>
             </w:rPr>
           </w:pPr>
-          <w:hyperlink w:anchor="_Toc237559721" w:history="1">
+          <w:hyperlink w:anchor="_Toc237904412" w:history="1">
             <w:r>
               <w:rPr>
                 <w:rStyle w:val="Hyperlink"/>
               </w:rPr>
-              <w:t>CHAPTER</w:t>
-            </w:r>
+              <w:t>CHAPTER 2</w:t>
+            </w:r>
+            <w:r>
+              <w:rPr>
+                <w:webHidden/>
+              </w:rPr>
+              <w:tab/>
+            </w:r>
+            <w:r>
+              <w:rPr>
+                <w:webHidden/>
+              </w:rPr>
+              <w:fldChar w:fldCharType="begin"/>
+            </w:r>
+            <w:r>
+              <w:rPr>
+                <w:webHidden/>
+              </w:rPr>
+              <w:instrText xml:space="preserve"> PAGEREF _Toc237904412 \h </w:instrText>
+            </w:r>
+            <w:r>
+              <w:rPr>
+                <w:webHidden/>
+              </w:rPr>
+            </w:r>
+            <w:r>
+              <w:rPr>
+                <w:webHidden/>
+              </w:rPr>
+              <w:fldChar w:fldCharType="separate"/>
+            </w:r>
+            <w:r>
+              <w:rPr>
+                <w:webHidden/>
+              </w:rPr>
+              <w:t>6</w:t>
+            </w:r>
+            <w:r>
+              <w:rPr>
+                <w:webHidden/>
+              </w:rPr>
+              <w:fldChar w:fldCharType="end"/>
+            </w:r>
+          </w:hyperlink>
+        </w:p>
+        <w:p>
+          <w:pPr>
+            <w:pStyle w:val="TOC1"/>
+            <w:rPr>
+              <w:rFonts w:asciiTheme="minorHAnsi" w:eastAsiaTheme="minorEastAsia" w:hAnsiTheme="minorHAnsi" w:cstheme="minorBidi"/>
+              <w:b w:val="0"/>
+              <w:bCs w:val="0"/>
+              <w:color w:val="auto"/>
+              <w:kern w:val="0"/>
+              <w:sz w:val="22"/>
+              <w:szCs w:val="20"/>
+              <w:lang w:bidi="ne-NP"/>
+              <w14:ligatures w14:val="none"/>
+            </w:rPr>
+          </w:pPr>
+          <w:hyperlink w:anchor="_Toc237904413" w:history="1">
             <w:r>
               <w:rPr>
                 <w:rStyle w:val="Hyperlink"/>
               </w:rPr>
-              <w:t xml:space="preserve"> 2</w:t>
-            </w:r>
-            <w:r>
-              <w:rPr>
-                <w:rStyle w:val="Hyperlink"/>
-              </w:rPr>
-              <w:t xml:space="preserve"> </w:t>
-            </w:r>
-          </w:hyperlink>
-          <w:hyperlink w:anchor="_Toc237559722" w:history="1">
-            <w:r>
-              <w:rPr>
-                <w:rStyle w:val="Hyperlink"/>
-              </w:rPr>
               <w:t>BACKGROUND STUDY AND LITERATURE REVIEW</w:t>
             </w:r>
             <w:r>
@@ -2620,7 +2717,7 @@
               <w:rPr>
                 <w:webHidden/>
               </w:rPr>
-              <w:instrText xml:space="preserve"> PAGEREF _Toc237559722 \h </w:instrText>
+              <w:instrText xml:space="preserve"> PAGEREF _Toc237904413 \h </w:instrText>
             </w:r>
             <w:r>
               <w:rPr>
@@ -2664,7 +2761,7 @@
               <w14:ligatures w14:val="none"/>
             </w:rPr>
           </w:pPr>
-          <w:hyperlink w:anchor="_Toc237559723" w:history="1">
+          <w:hyperlink w:anchor="_Toc237904414" w:history="1">
             <w:r>
               <w:rPr>
                 <w:rStyle w:val="Hyperlink"/>
@@ -2691,7 +2788,7 @@
                 <w:noProof/>
                 <w:webHidden/>
               </w:rPr>
-              <w:instrText xml:space="preserve"> PAGEREF _Toc237559723 \h </w:instrText>
+              <w:instrText xml:space="preserve"> PAGEREF _Toc237904414 \h </w:instrText>
             </w:r>
             <w:r>
               <w:rPr>
@@ -2739,7 +2836,7 @@
               <w14:ligatures w14:val="none"/>
             </w:rPr>
           </w:pPr>
-          <w:hyperlink w:anchor="_Toc237559724" w:history="1">
+          <w:hyperlink w:anchor="_Toc237904415" w:history="1">
             <w:r>
               <w:rPr>
                 <w:rStyle w:val="Hyperlink"/>
@@ -2766,7 +2863,7 @@
                 <w:noProof/>
                 <w:webHidden/>
               </w:rPr>
-              <w:instrText xml:space="preserve"> PAGEREF _Toc237559724 \h </w:instrText>
+              <w:instrText xml:space="preserve"> PAGEREF _Toc237904415 \h </w:instrText>
             </w:r>
             <w:r>
               <w:rPr>
@@ -2812,15 +2909,59 @@
               <w14:ligatures w14:val="none"/>
             </w:rPr>
           </w:pPr>
-          <w:hyperlink w:anchor="_Toc237559725" w:history="1">
+          <w:hyperlink w:anchor="_Toc237904416" w:history="1">
             <w:r>
               <w:rPr>
                 <w:rStyle w:val="Hyperlink"/>
               </w:rPr>
               <w:t>CHAPTER 3</w:t>
             </w:r>
+            <w:r>
+              <w:rPr>
+                <w:webHidden/>
+              </w:rPr>
+              <w:tab/>
+            </w:r>
+            <w:r>
+              <w:rPr>
+                <w:webHidden/>
+              </w:rPr>
+              <w:fldChar w:fldCharType="begin"/>
+            </w:r>
+            <w:r>
+              <w:rPr>
+                <w:webHidden/>
+              </w:rPr>
+              <w:instrText xml:space="preserve"> PAGEREF _Toc237904416 \h </w:instrText>
+            </w:r>
+            <w:r>
+              <w:rPr>
+                <w:webHidden/>
+              </w:rPr>
+            </w:r>
+            <w:r>
+              <w:rPr>
+                <w:webHidden/>
+              </w:rPr>
+              <w:fldChar w:fldCharType="separate"/>
+            </w:r>
+            <w:r>
+              <w:rPr>
+                <w:webHidden/>
+              </w:rPr>
+              <w:t>10</w:t>
+            </w:r>
+            <w:r>
+              <w:rPr>
+                <w:webHidden/>
+              </w:rPr>
+              <w:fldChar w:fldCharType="end"/>
+            </w:r>
           </w:hyperlink>
-          <w:r>
+        </w:p>
+        <w:p>
+          <w:pPr>
+            <w:pStyle w:val="TOC1"/>
             <w:rPr>
               <w:rFonts w:asciiTheme="minorHAnsi" w:eastAsiaTheme="minorEastAsia" w:hAnsiTheme="minorHAnsi" w:cstheme="minorBidi"/>
               <w:b w:val="0"/>
@@ -2832,9 +2973,8 @@
               <w:lang w:bidi="ne-NP"/>
               <w14:ligatures w14:val="none"/>
             </w:rPr>
-            <w:t xml:space="preserve"> </w:t>
-          </w:r>
-          <w:hyperlink w:anchor="_Toc237559726" w:history="1">
+          </w:pPr>
+          <w:hyperlink w:anchor="_Toc237904417" w:history="1">
             <w:r>
               <w:rPr>
                 <w:rStyle w:val="Hyperlink"/>
@@ -2857,7 +2997,7 @@
               <w:rPr>
                 <w:webHidden/>
               </w:rPr>
-              <w:instrText xml:space="preserve"> PAGEREF _Toc237559726 \h </w:instrText>
+              <w:instrText xml:space="preserve"> PAGEREF _Toc237904417 \h </w:instrText>
             </w:r>
             <w:r>
               <w:rPr>
@@ -2901,7 +3041,7 @@
               <w14:ligatures w14:val="none"/>
             </w:rPr>
           </w:pPr>
-          <w:hyperlink w:anchor="_Toc237559727" w:history="1">
+          <w:hyperlink w:anchor="_Toc237904418" w:history="1">
             <w:r>
               <w:rPr>
                 <w:rStyle w:val="Hyperlink"/>
@@ -2928,7 +3068,7 @@
                 <w:noProof/>
                 <w:webHidden/>
               </w:rPr>
-              <w:instrText xml:space="preserve"> PAGEREF _Toc237559727 \h </w:instrText>
+              <w:instrText xml:space="preserve"> PAGEREF _Toc237904418 \h </w:instrText>
             </w:r>
             <w:r>
               <w:rPr>
@@ -2976,7 +3116,7 @@
               <w14:ligatures w14:val="none"/>
             </w:rPr>
           </w:pPr>
-          <w:hyperlink w:anchor="_Toc237559728" w:history="1">
+          <w:hyperlink w:anchor="_Toc237904419" w:history="1">
             <w:r>
               <w:rPr>
                 <w:rStyle w:val="Hyperlink"/>
@@ -3003,7 +3143,7 @@
                 <w:noProof/>
                 <w:webHidden/>
               </w:rPr>
-              <w:instrText xml:space="preserve"> PAGEREF _Toc237559728 \h </w:instrText>
+              <w:instrText xml:space="preserve"> PAGEREF _Toc237904419 \h </w:instrText>
             </w:r>
             <w:r>
               <w:rPr>
@@ -3051,7 +3191,7 @@
               <w14:ligatures w14:val="none"/>
             </w:rPr>
           </w:pPr>
-          <w:hyperlink w:anchor="_Toc237559729" w:history="1">
+          <w:hyperlink w:anchor="_Toc237904420" w:history="1">
             <w:r>
               <w:rPr>
                 <w:rStyle w:val="Hyperlink"/>
@@ -3078,7 +3218,7 @@
                 <w:noProof/>
                 <w:webHidden/>
               </w:rPr>
-              <w:instrText xml:space="preserve"> PAGEREF _Toc237559729 \h </w:instrText>
+              <w:instrText xml:space="preserve"> PAGEREF _Toc237904420 \h </w:instrText>
             </w:r>
             <w:r>
               <w:rPr>
@@ -3126,7 +3266,7 @@
               <w14:ligatures w14:val="none"/>
             </w:rPr>
           </w:pPr>
-          <w:hyperlink w:anchor="_Toc237559730" w:history="1">
+          <w:hyperlink w:anchor="_Toc237904421" w:history="1">
             <w:r>
               <w:rPr>
                 <w:rStyle w:val="Hyperlink"/>
@@ -3153,7 +3293,7 @@
                 <w:noProof/>
                 <w:webHidden/>
               </w:rPr>
-              <w:instrText xml:space="preserve"> PAGEREF _Toc237559730 \h </w:instrText>
+              <w:instrText xml:space="preserve"> PAGEREF _Toc237904421 \h </w:instrText>
             </w:r>
             <w:r>
               <w:rPr>
@@ -3201,13 +3341,13 @@
               <w14:ligatures w14:val="none"/>
             </w:rPr>
           </w:pPr>
-          <w:hyperlink w:anchor="_Toc237559731" w:history="1">
+          <w:hyperlink w:anchor="_Toc237904422" w:history="1">
             <w:r>
               <w:rPr>
                 <w:rStyle w:val="Hyperlink"/>
                 <w:noProof/>
               </w:rPr>
-              <w:t>3.1.4 Dynamic Modelling using State and Sequence Diagrams</w:t>
+              <w:t>3.1.4 Object Modeling using Object Diagram</w:t>
             </w:r>
             <w:r>
               <w:rPr>
@@ -3228,7 +3368,7 @@
                 <w:noProof/>
                 <w:webHidden/>
               </w:rPr>
-              <w:instrText xml:space="preserve"> PAGEREF _Toc237559731 \h </w:instrText>
+              <w:instrText xml:space="preserve"> PAGEREF _Toc237904422 \h </w:instrText>
             </w:r>
             <w:r>
               <w:rPr>
@@ -3276,13 +3416,13 @@
               <w14:ligatures w14:val="none"/>
             </w:rPr>
           </w:pPr>
-          <w:hyperlink w:anchor="_Toc237559732" w:history="1">
+          <w:hyperlink w:anchor="_Toc237904423" w:history="1">
             <w:r>
               <w:rPr>
                 <w:rStyle w:val="Hyperlink"/>
                 <w:noProof/>
               </w:rPr>
-              <w:t>3.1.5 Process Modelling Using Activity Diagrams</w:t>
+              <w:t>3.1.5 Dynamic Modelling using State and Sequence Diagrams</w:t>
             </w:r>
             <w:r>
               <w:rPr>
@@ -3303,7 +3443,7 @@
                 <w:noProof/>
                 <w:webHidden/>
               </w:rPr>
-              <w:instrText xml:space="preserve"> PAGEREF _Toc237559732 \h </w:instrText>
+              <w:instrText xml:space="preserve"> PAGEREF _Toc237904423 \h </w:instrText>
             </w:r>
             <w:r>
               <w:rPr>
@@ -3323,7 +3463,7 @@
                 <w:noProof/>
                 <w:webHidden/>
               </w:rPr>
-              <w:t>20</w:t>
+              <w:t>19</w:t>
             </w:r>
             <w:r>
               <w:rPr>
@@ -3351,13 +3491,13 @@
               <w14:ligatures w14:val="none"/>
             </w:rPr>
           </w:pPr>
-          <w:hyperlink w:anchor="_Toc237559733" w:history="1">
+          <w:hyperlink w:anchor="_Toc237904424" w:history="1">
             <w:r>
               <w:rPr>
                 <w:rStyle w:val="Hyperlink"/>
                 <w:noProof/>
               </w:rPr>
-              <w:t>3.1.6 Refinement of Class Diagram</w:t>
+              <w:t>3.1.6 Process Modelling Using Activity Diagrams</w:t>
             </w:r>
             <w:r>
               <w:rPr>
@@ -3378,7 +3518,7 @@
                 <w:noProof/>
                 <w:webHidden/>
               </w:rPr>
-              <w:instrText xml:space="preserve"> PAGEREF _Toc237559733 \h </w:instrText>
+              <w:instrText xml:space="preserve"> PAGEREF _Toc237904424 \h </w:instrText>
             </w:r>
             <w:r>
               <w:rPr>
@@ -3399,6 +3539,81 @@
                 <w:webHidden/>
               </w:rPr>
               <w:t>22</w:t>
+            </w:r>
+            <w:r>
+              <w:rPr>
+                <w:noProof/>
+                <w:webHidden/>
+              </w:rPr>
+              <w:fldChar w:fldCharType="end"/>
+            </w:r>
+          </w:hyperlink>
+        </w:p>
+        <w:p>
+          <w:pPr>
+            <w:pStyle w:val="TOC3"/>
+            <w:tabs>
+              <w:tab w:val="right" w:leader="dot" w:pos="8990"/>
+            </w:tabs>
+            <w:rPr>
+              <w:rFonts w:asciiTheme="minorHAnsi" w:eastAsiaTheme="minorEastAsia" w:hAnsiTheme="minorHAnsi" w:cstheme="minorBidi"/>
+              <w:noProof/>
+              <w:color w:val="auto"/>
+              <w:kern w:val="0"/>
+              <w:sz w:val="22"/>
+              <w:szCs w:val="20"/>
+              <w:lang w:bidi="ne-NP"/>
+              <w14:ligatures w14:val="none"/>
+            </w:rPr>
+          </w:pPr>
+          <w:hyperlink w:anchor="_Toc237904425" w:history="1">
+            <w:r>
+              <w:rPr>
+                <w:rStyle w:val="Hyperlink"/>
+                <w:noProof/>
+              </w:rPr>
+              <w:t>3.1.7 Refinement of Class Diagram</w:t>
+            </w:r>
+            <w:r>
+              <w:rPr>
+                <w:noProof/>
+                <w:webHidden/>
+              </w:rPr>
+              <w:tab/>
+            </w:r>
+            <w:r>
+              <w:rPr>
+                <w:noProof/>
+                <w:webHidden/>
+              </w:rPr>
+              <w:fldChar w:fldCharType="begin"/>
+            </w:r>
+            <w:r>
+              <w:rPr>
+                <w:noProof/>
+                <w:webHidden/>
+              </w:rPr>
+              <w:instrText xml:space="preserve"> PAGEREF _Toc237904425 \h </w:instrText>
+            </w:r>
+            <w:r>
+              <w:rPr>
+                <w:noProof/>
+                <w:webHidden/>
+              </w:rPr>
+            </w:r>
+            <w:r>
+              <w:rPr>
+                <w:noProof/>
+                <w:webHidden/>
+              </w:rPr>
+              <w:fldChar w:fldCharType="separate"/>
+            </w:r>
+            <w:r>
+              <w:rPr>
+                <w:noProof/>
+                <w:webHidden/>
+              </w:rPr>
+              <w:t>24</w:t>
             </w:r>
             <w:r>
               <w:rPr>
@@ -3426,7 +3641,7 @@
               <w14:ligatures w14:val="none"/>
             </w:rPr>
           </w:pPr>
-          <w:hyperlink w:anchor="_Toc237559734" w:history="1">
+          <w:hyperlink w:anchor="_Toc237904426" w:history="1">
             <w:r>
               <w:rPr>
                 <w:rStyle w:val="Hyperlink"/>
@@ -3453,7 +3668,7 @@
                 <w:noProof/>
                 <w:webHidden/>
               </w:rPr>
-              <w:instrText xml:space="preserve"> PAGEREF _Toc237559734 \h </w:instrText>
+              <w:instrText xml:space="preserve"> PAGEREF _Toc237904426 \h </w:instrText>
             </w:r>
             <w:r>
               <w:rPr>
@@ -3473,7 +3688,7 @@
                 <w:noProof/>
                 <w:webHidden/>
               </w:rPr>
-              <w:t>23</w:t>
+              <w:t>25</w:t>
             </w:r>
             <w:r>
               <w:rPr>
@@ -3501,7 +3716,7 @@
               <w14:ligatures w14:val="none"/>
             </w:rPr>
           </w:pPr>
-          <w:hyperlink w:anchor="_Toc237559735" w:history="1">
+          <w:hyperlink w:anchor="_Toc237904427" w:history="1">
             <w:r>
               <w:rPr>
                 <w:rStyle w:val="Hyperlink"/>
@@ -3528,7 +3743,7 @@
                 <w:noProof/>
                 <w:webHidden/>
               </w:rPr>
-              <w:instrText xml:space="preserve"> PAGEREF _Toc237559735 \h </w:instrText>
+              <w:instrText xml:space="preserve"> PAGEREF _Toc237904427 \h </w:instrText>
             </w:r>
             <w:r>
               <w:rPr>
@@ -3548,7 +3763,7 @@
                 <w:noProof/>
                 <w:webHidden/>
               </w:rPr>
-              <w:t>23</w:t>
+              <w:t>25</w:t>
             </w:r>
             <w:r>
               <w:rPr>
@@ -3576,7 +3791,7 @@
               <w14:ligatures w14:val="none"/>
             </w:rPr>
           </w:pPr>
-          <w:hyperlink w:anchor="_Toc237559736" w:history="1">
+          <w:hyperlink w:anchor="_Toc237904428" w:history="1">
             <w:r>
               <w:rPr>
                 <w:rStyle w:val="Hyperlink"/>
@@ -3603,7 +3818,7 @@
                 <w:noProof/>
                 <w:webHidden/>
               </w:rPr>
-              <w:instrText xml:space="preserve"> PAGEREF _Toc237559736 \h </w:instrText>
+              <w:instrText xml:space="preserve"> PAGEREF _Toc237904428 \h </w:instrText>
             </w:r>
             <w:r>
               <w:rPr>
@@ -3623,7 +3838,7 @@
                 <w:noProof/>
                 <w:webHidden/>
               </w:rPr>
-              <w:t>24</w:t>
+              <w:t>26</w:t>
             </w:r>
             <w:r>
               <w:rPr>
@@ -3651,7 +3866,7 @@
               <w14:ligatures w14:val="none"/>
             </w:rPr>
           </w:pPr>
-          <w:hyperlink w:anchor="_Toc237559737" w:history="1">
+          <w:hyperlink w:anchor="_Toc237904429" w:history="1">
             <w:r>
               <w:rPr>
                 <w:rStyle w:val="Hyperlink"/>
@@ -3678,7 +3893,7 @@
                 <w:noProof/>
                 <w:webHidden/>
               </w:rPr>
-              <w:instrText xml:space="preserve"> PAGEREF _Toc237559737 \h </w:instrText>
+              <w:instrText xml:space="preserve"> PAGEREF _Toc237904429 \h </w:instrText>
             </w:r>
             <w:r>
               <w:rPr>
@@ -3698,7 +3913,7 @@
                 <w:noProof/>
                 <w:webHidden/>
               </w:rPr>
-              <w:t>25</w:t>
+              <w:t>27</w:t>
             </w:r>
             <w:r>
               <w:rPr>
@@ -3726,7 +3941,7 @@
               <w14:ligatures w14:val="none"/>
             </w:rPr>
           </w:pPr>
-          <w:hyperlink w:anchor="_Toc237559738" w:history="1">
+          <w:hyperlink w:anchor="_Toc237904430" w:history="1">
             <w:r>
               <w:rPr>
                 <w:rStyle w:val="Hyperlink"/>
@@ -3753,7 +3968,7 @@
                 <w:noProof/>
                 <w:webHidden/>
               </w:rPr>
-              <w:instrText xml:space="preserve"> PAGEREF _Toc237559738 \h </w:instrText>
+              <w:instrText xml:space="preserve"> PAGEREF _Toc237904430 \h </w:instrText>
             </w:r>
             <w:r>
               <w:rPr>
@@ -3773,7 +3988,7 @@
                 <w:noProof/>
                 <w:webHidden/>
               </w:rPr>
-              <w:t>25</w:t>
+              <w:t>27</w:t>
             </w:r>
             <w:r>
               <w:rPr>
@@ -3801,7 +4016,7 @@
               <w14:ligatures w14:val="none"/>
             </w:rPr>
           </w:pPr>
-          <w:hyperlink w:anchor="_Toc237559739" w:history="1">
+          <w:hyperlink w:anchor="_Toc237904431" w:history="1">
             <w:r>
               <w:rPr>
                 <w:rStyle w:val="Hyperlink"/>
@@ -3828,7 +4043,7 @@
                 <w:noProof/>
                 <w:webHidden/>
               </w:rPr>
-              <w:instrText xml:space="preserve"> PAGEREF _Toc237559739 \h </w:instrText>
+              <w:instrText xml:space="preserve"> PAGEREF _Toc237904431 \h </w:instrText>
             </w:r>
             <w:r>
               <w:rPr>
@@ -3848,7 +4063,7 @@
                 <w:noProof/>
                 <w:webHidden/>
               </w:rPr>
-              <w:t>26</w:t>
+              <w:t>28</w:t>
             </w:r>
             <w:r>
               <w:rPr>
@@ -3876,13 +4091,13 @@
               <w14:ligatures w14:val="none"/>
             </w:rPr>
           </w:pPr>
-          <w:hyperlink w:anchor="_Toc237559740" w:history="1">
+          <w:hyperlink w:anchor="_Toc237904432" w:history="1">
             <w:r>
               <w:rPr>
                 <w:rStyle w:val="Hyperlink"/>
                 <w:noProof/>
               </w:rPr>
-              <w:t>3.3.3 Cosine Similarity (Vector Space Model)</w:t>
+              <w:t>3.3.3 Cosine Similarity (Vector  Space Model)</w:t>
             </w:r>
             <w:r>
               <w:rPr>
@@ -3903,7 +4118,7 @@
                 <w:noProof/>
                 <w:webHidden/>
               </w:rPr>
-              <w:instrText xml:space="preserve"> PAGEREF _Toc237559740 \h </w:instrText>
+              <w:instrText xml:space="preserve"> PAGEREF _Toc237904432 \h </w:instrText>
             </w:r>
             <w:r>
               <w:rPr>
@@ -3923,7 +4138,7 @@
                 <w:noProof/>
                 <w:webHidden/>
               </w:rPr>
-              <w:t>27</w:t>
+              <w:t>29</w:t>
             </w:r>
             <w:r>
               <w:rPr>
@@ -3951,7 +4166,7 @@
               <w14:ligatures w14:val="none"/>
             </w:rPr>
           </w:pPr>
-          <w:hyperlink w:anchor="_Toc237559741" w:history="1">
+          <w:hyperlink w:anchor="_Toc237904433" w:history="1">
             <w:r>
               <w:rPr>
                 <w:rStyle w:val="Hyperlink"/>
@@ -3978,7 +4193,7 @@
                 <w:noProof/>
                 <w:webHidden/>
               </w:rPr>
-              <w:instrText xml:space="preserve"> PAGEREF _Toc237559741 \h </w:instrText>
+              <w:instrText xml:space="preserve"> PAGEREF _Toc237904433 \h </w:instrText>
             </w:r>
             <w:r>
               <w:rPr>
@@ -3998,7 +4213,7 @@
                 <w:noProof/>
                 <w:webHidden/>
               </w:rPr>
-              <w:t>28</w:t>
+              <w:t>31</w:t>
             </w:r>
             <w:r>
               <w:rPr>
@@ -4026,7 +4241,7 @@
               <w14:ligatures w14:val="none"/>
             </w:rPr>
           </w:pPr>
-          <w:hyperlink w:anchor="_Toc237559742" w:history="1">
+          <w:hyperlink w:anchor="_Toc237904434" w:history="1">
             <w:r>
               <w:rPr>
                 <w:rStyle w:val="Hyperlink"/>
@@ -4053,7 +4268,7 @@
                 <w:noProof/>
                 <w:webHidden/>
               </w:rPr>
-              <w:instrText xml:space="preserve"> PAGEREF _Toc237559742 \h </w:instrText>
+              <w:instrText xml:space="preserve"> PAGEREF _Toc237904434 \h </w:instrText>
             </w:r>
             <w:r>
               <w:rPr>
@@ -4073,7 +4288,7 @@
                 <w:noProof/>
                 <w:webHidden/>
               </w:rPr>
-              <w:t>29</w:t>
+              <w:t>31</w:t>
             </w:r>
             <w:r>
               <w:rPr>
@@ -4101,7 +4316,7 @@
               <w14:ligatures w14:val="none"/>
             </w:rPr>
           </w:pPr>
-          <w:hyperlink w:anchor="_Toc237559743" w:history="1">
+          <w:hyperlink w:anchor="_Toc237904435" w:history="1">
             <w:r>
               <w:rPr>
                 <w:rStyle w:val="Hyperlink"/>
@@ -4128,7 +4343,7 @@
                 <w:noProof/>
                 <w:webHidden/>
               </w:rPr>
-              <w:instrText xml:space="preserve"> PAGEREF _Toc237559743 \h </w:instrText>
+              <w:instrText xml:space="preserve"> PAGEREF _Toc237904435 \h </w:instrText>
             </w:r>
             <w:r>
               <w:rPr>
@@ -4148,7 +4363,7 @@
                 <w:noProof/>
                 <w:webHidden/>
               </w:rPr>
-              <w:t>30</w:t>
+              <w:t>32</w:t>
             </w:r>
             <w:r>
               <w:rPr>
@@ -4176,7 +4391,7 @@
               <w14:ligatures w14:val="none"/>
             </w:rPr>
           </w:pPr>
-          <w:hyperlink w:anchor="_Toc237559744" w:history="1">
+          <w:hyperlink w:anchor="_Toc237904436" w:history="1">
             <w:r>
               <w:rPr>
                 <w:rStyle w:val="Hyperlink"/>
@@ -4203,7 +4418,7 @@
                 <w:noProof/>
                 <w:webHidden/>
               </w:rPr>
-              <w:instrText xml:space="preserve"> PAGEREF _Toc237559744 \h </w:instrText>
+              <w:instrText xml:space="preserve"> PAGEREF _Toc237904436 \h </w:instrText>
             </w:r>
             <w:r>
               <w:rPr>
@@ -4223,7 +4438,7 @@
                 <w:noProof/>
                 <w:webHidden/>
               </w:rPr>
-              <w:t>31</w:t>
+              <w:t>33</w:t>
             </w:r>
             <w:r>
               <w:rPr>
@@ -4251,7 +4466,7 @@
               <w14:ligatures w14:val="none"/>
             </w:rPr>
           </w:pPr>
-          <w:hyperlink w:anchor="_Toc237559745" w:history="1">
+          <w:hyperlink w:anchor="_Toc237904437" w:history="1">
             <w:r>
               <w:rPr>
                 <w:rStyle w:val="Hyperlink"/>
@@ -4278,7 +4493,7 @@
                 <w:noProof/>
                 <w:webHidden/>
               </w:rPr>
-              <w:instrText xml:space="preserve"> PAGEREF _Toc237559745 \h </w:instrText>
+              <w:instrText xml:space="preserve"> PAGEREF _Toc237904437 \h </w:instrText>
             </w:r>
             <w:r>
               <w:rPr>
@@ -4298,7 +4513,7 @@
                 <w:noProof/>
                 <w:webHidden/>
               </w:rPr>
-              <w:t>31</w:t>
+              <w:t>34</w:t>
             </w:r>
             <w:r>
               <w:rPr>
@@ -4324,15 +4539,59 @@
               <w14:ligatures w14:val="none"/>
             </w:rPr>
           </w:pPr>
-          <w:hyperlink w:anchor="_Toc237559746" w:history="1">
+          <w:hyperlink w:anchor="_Toc237904438" w:history="1">
             <w:r>
               <w:rPr>
                 <w:rStyle w:val="Hyperlink"/>
               </w:rPr>
               <w:t>CHAPTER 4</w:t>
             </w:r>
+            <w:r>
+              <w:rPr>
+                <w:webHidden/>
+              </w:rPr>
+              <w:tab/>
+            </w:r>
+            <w:r>
+              <w:rPr>
+                <w:webHidden/>
+              </w:rPr>
+              <w:fldChar w:fldCharType="begin"/>
+            </w:r>
+            <w:r>
+              <w:rPr>
+                <w:webHidden/>
+              </w:rPr>
+              <w:instrText xml:space="preserve"> PAGEREF _Toc237904438 \h </w:instrText>
+            </w:r>
+            <w:r>
+              <w:rPr>
+                <w:webHidden/>
+              </w:rPr>
+            </w:r>
+            <w:r>
+              <w:rPr>
+                <w:webHidden/>
+              </w:rPr>
+              <w:fldChar w:fldCharType="separate"/>
+            </w:r>
+            <w:r>
+              <w:rPr>
+                <w:webHidden/>
+              </w:rPr>
+              <w:t>36</w:t>
+            </w:r>
+            <w:r>
+              <w:rPr>
+                <w:webHidden/>
+              </w:rPr>
+              <w:fldChar w:fldCharType="end"/>
+            </w:r>
           </w:hyperlink>
-          <w:r>
+        </w:p>
+        <w:p>
+          <w:pPr>
+            <w:pStyle w:val="TOC1"/>
             <w:rPr>
               <w:rFonts w:asciiTheme="minorHAnsi" w:eastAsiaTheme="minorEastAsia" w:hAnsiTheme="minorHAnsi" w:cstheme="minorBidi"/>
               <w:b w:val="0"/>
@@ -4344,9 +4603,8 @@
               <w:lang w:bidi="ne-NP"/>
               <w14:ligatures w14:val="none"/>
             </w:rPr>
-            <w:t xml:space="preserve"> </w:t>
-          </w:r>
-          <w:hyperlink w:anchor="_Toc237559747" w:history="1">
+          </w:pPr>
+          <w:hyperlink w:anchor="_Toc237904439" w:history="1">
             <w:r>
               <w:rPr>
                 <w:rStyle w:val="Hyperlink"/>
@@ -4369,7 +4627,7 @@
               <w:rPr>
                 <w:webHidden/>
               </w:rPr>
-              <w:instrText xml:space="preserve"> PAGEREF _Toc237559747 \h </w:instrText>
+              <w:instrText xml:space="preserve"> PAGEREF _Toc237904439 \h </w:instrText>
             </w:r>
             <w:r>
               <w:rPr>
@@ -4386,7 +4644,7 @@
               <w:rPr>
                 <w:webHidden/>
               </w:rPr>
-              <w:t>33</w:t>
+              <w:t>36</w:t>
             </w:r>
             <w:r>
               <w:rPr>
@@ -4413,7 +4671,7 @@
               <w14:ligatures w14:val="none"/>
             </w:rPr>
           </w:pPr>
-          <w:hyperlink w:anchor="_Toc237559748" w:history="1">
+          <w:hyperlink w:anchor="_Toc237904440" w:history="1">
             <w:r>
               <w:rPr>
                 <w:rStyle w:val="Hyperlink"/>
@@ -4440,7 +4698,7 @@
                 <w:noProof/>
                 <w:webHidden/>
               </w:rPr>
-              <w:instrText xml:space="preserve"> PAGEREF _Toc237559748 \h </w:instrText>
+              <w:instrText xml:space="preserve"> PAGEREF _Toc237904440 \h </w:instrText>
             </w:r>
             <w:r>
               <w:rPr>
@@ -4460,7 +4718,7 @@
                 <w:noProof/>
                 <w:webHidden/>
               </w:rPr>
-              <w:t>33</w:t>
+              <w:t>36</w:t>
             </w:r>
             <w:r>
               <w:rPr>
@@ -4488,7 +4746,7 @@
               <w14:ligatures w14:val="none"/>
             </w:rPr>
           </w:pPr>
-          <w:hyperlink w:anchor="_Toc237559749" w:history="1">
+          <w:hyperlink w:anchor="_Toc237904441" w:history="1">
             <w:r>
               <w:rPr>
                 <w:rStyle w:val="Hyperlink"/>
@@ -4523,7 +4781,7 @@
                 <w:noProof/>
                 <w:webHidden/>
               </w:rPr>
-              <w:instrText xml:space="preserve"> PAGEREF _Toc237559749 \h </w:instrText>
+              <w:instrText xml:space="preserve"> PAGEREF _Toc237904441 \h </w:instrText>
             </w:r>
             <w:r>
               <w:rPr>
@@ -4543,7 +4801,7 @@
                 <w:noProof/>
                 <w:webHidden/>
               </w:rPr>
-              <w:t>33</w:t>
+              <w:t>36</w:t>
             </w:r>
             <w:r>
               <w:rPr>
@@ -4571,7 +4829,7 @@
               <w14:ligatures w14:val="none"/>
             </w:rPr>
           </w:pPr>
-          <w:hyperlink w:anchor="_Toc237559750" w:history="1">
+          <w:hyperlink w:anchor="_Toc237904442" w:history="1">
             <w:r>
               <w:rPr>
                 <w:rStyle w:val="Hyperlink"/>
@@ -4598,7 +4856,7 @@
                 <w:noProof/>
                 <w:webHidden/>
               </w:rPr>
-              <w:instrText xml:space="preserve"> PAGEREF _Toc237559750 \h </w:instrText>
+              <w:instrText xml:space="preserve"> PAGEREF _Toc237904442 \h </w:instrText>
             </w:r>
             <w:r>
               <w:rPr>
@@ -4618,7 +4876,7 @@
                 <w:noProof/>
                 <w:webHidden/>
               </w:rPr>
-              <w:t>34</w:t>
+              <w:t>37</w:t>
             </w:r>
             <w:r>
               <w:rPr>
@@ -4646,7 +4904,7 @@
               <w14:ligatures w14:val="none"/>
             </w:rPr>
           </w:pPr>
-          <w:hyperlink w:anchor="_Toc237559751" w:history="1">
+          <w:hyperlink w:anchor="_Toc237904443" w:history="1">
             <w:r>
               <w:rPr>
                 <w:rStyle w:val="Hyperlink"/>
@@ -4673,7 +4931,7 @@
                 <w:noProof/>
                 <w:webHidden/>
               </w:rPr>
-              <w:instrText xml:space="preserve"> PAGEREF _Toc237559751 \h </w:instrText>
+              <w:instrText xml:space="preserve"> PAGEREF _Toc237904443 \h </w:instrText>
             </w:r>
             <w:r>
               <w:rPr>
@@ -4693,7 +4951,7 @@
                 <w:noProof/>
                 <w:webHidden/>
               </w:rPr>
-              <w:t>34</w:t>
+              <w:t>37</w:t>
             </w:r>
             <w:r>
               <w:rPr>
@@ -4721,7 +4979,7 @@
               <w14:ligatures w14:val="none"/>
             </w:rPr>
           </w:pPr>
-          <w:hyperlink w:anchor="_Toc237559752" w:history="1">
+          <w:hyperlink w:anchor="_Toc237904444" w:history="1">
             <w:r>
               <w:rPr>
                 <w:rStyle w:val="Hyperlink"/>
@@ -4748,7 +5006,7 @@
                 <w:noProof/>
                 <w:webHidden/>
               </w:rPr>
-              <w:instrText xml:space="preserve"> PAGEREF _Toc237559752 \h </w:instrText>
+              <w:instrText xml:space="preserve"> PAGEREF _Toc237904444 \h </w:instrText>
             </w:r>
             <w:r>
               <w:rPr>
@@ -4768,7 +5026,7 @@
                 <w:noProof/>
                 <w:webHidden/>
               </w:rPr>
-              <w:t>34</w:t>
+              <w:t>37</w:t>
             </w:r>
             <w:r>
               <w:rPr>
@@ -4796,7 +5054,7 @@
               <w14:ligatures w14:val="none"/>
             </w:rPr>
           </w:pPr>
-          <w:hyperlink w:anchor="_Toc237559753" w:history="1">
+          <w:hyperlink w:anchor="_Toc237904445" w:history="1">
             <w:r>
               <w:rPr>
                 <w:rStyle w:val="Hyperlink"/>
@@ -4823,7 +5081,7 @@
                 <w:noProof/>
                 <w:webHidden/>
               </w:rPr>
-              <w:instrText xml:space="preserve"> PAGEREF _Toc237559753 \h </w:instrText>
+              <w:instrText xml:space="preserve"> PAGEREF _Toc237904445 \h </w:instrText>
             </w:r>
             <w:r>
               <w:rPr>
@@ -4843,7 +5101,7 @@
                 <w:noProof/>
                 <w:webHidden/>
               </w:rPr>
-              <w:t>35</w:t>
+              <w:t>38</w:t>
             </w:r>
             <w:r>
               <w:rPr>
@@ -4871,7 +5129,7 @@
               <w14:ligatures w14:val="none"/>
             </w:rPr>
           </w:pPr>
-          <w:hyperlink w:anchor="_Toc237559754" w:history="1">
+          <w:hyperlink w:anchor="_Toc237904446" w:history="1">
             <w:r>
               <w:rPr>
                 <w:rStyle w:val="Hyperlink"/>
@@ -4898,7 +5156,7 @@
                 <w:noProof/>
                 <w:webHidden/>
               </w:rPr>
-              <w:instrText xml:space="preserve"> PAGEREF _Toc237559754 \h </w:instrText>
+              <w:instrText xml:space="preserve"> PAGEREF _Toc237904446 \h </w:instrText>
             </w:r>
             <w:r>
               <w:rPr>
@@ -4918,7 +5176,7 @@
                 <w:noProof/>
                 <w:webHidden/>
               </w:rPr>
-              <w:t>35</w:t>
+              <w:t>38</w:t>
             </w:r>
             <w:r>
               <w:rPr>
@@ -4946,7 +5204,7 @@
               <w14:ligatures w14:val="none"/>
             </w:rPr>
           </w:pPr>
-          <w:hyperlink w:anchor="_Toc237559755" w:history="1">
+          <w:hyperlink w:anchor="_Toc237904447" w:history="1">
             <w:r>
               <w:rPr>
                 <w:rStyle w:val="Hyperlink"/>
@@ -4973,7 +5231,7 @@
                 <w:noProof/>
                 <w:webHidden/>
               </w:rPr>
-              <w:instrText xml:space="preserve"> PAGEREF _Toc237559755 \h </w:instrText>
+              <w:instrText xml:space="preserve"> PAGEREF _Toc237904447 \h </w:instrText>
             </w:r>
             <w:r>
               <w:rPr>
@@ -4993,7 +5251,7 @@
                 <w:noProof/>
                 <w:webHidden/>
               </w:rPr>
-              <w:t>36</w:t>
+              <w:t>39</w:t>
             </w:r>
             <w:r>
               <w:rPr>
@@ -5021,7 +5279,7 @@
               <w14:ligatures w14:val="none"/>
             </w:rPr>
           </w:pPr>
-          <w:hyperlink w:anchor="_Toc237559756" w:history="1">
+          <w:hyperlink w:anchor="_Toc237904448" w:history="1">
             <w:r>
               <w:rPr>
                 <w:rStyle w:val="Hyperlink"/>
@@ -5048,7 +5306,7 @@
                 <w:noProof/>
                 <w:webHidden/>
               </w:rPr>
-              <w:instrText xml:space="preserve"> PAGEREF _Toc237559756 \h </w:instrText>
+              <w:instrText xml:space="preserve"> PAGEREF _Toc237904448 \h </w:instrText>
             </w:r>
             <w:r>
               <w:rPr>
@@ -5068,7 +5326,7 @@
                 <w:noProof/>
                 <w:webHidden/>
               </w:rPr>
-              <w:t>36</w:t>
+              <w:t>39</w:t>
             </w:r>
             <w:r>
               <w:rPr>
@@ -5096,7 +5354,7 @@
               <w14:ligatures w14:val="none"/>
             </w:rPr>
           </w:pPr>
-          <w:hyperlink w:anchor="_Toc237559757" w:history="1">
+          <w:hyperlink w:anchor="_Toc237904449" w:history="1">
             <w:r>
               <w:rPr>
                 <w:rStyle w:val="Hyperlink"/>
@@ -5123,7 +5381,7 @@
                 <w:noProof/>
                 <w:webHidden/>
               </w:rPr>
-              <w:instrText xml:space="preserve"> PAGEREF _Toc237559757 \h </w:instrText>
+              <w:instrText xml:space="preserve"> PAGEREF _Toc237904449 \h </w:instrText>
             </w:r>
             <w:r>
               <w:rPr>
@@ -5143,7 +5401,7 @@
                 <w:noProof/>
                 <w:webHidden/>
               </w:rPr>
-              <w:t>37</w:t>
+              <w:t>40</w:t>
             </w:r>
             <w:r>
               <w:rPr>
@@ -5171,7 +5429,7 @@
               <w14:ligatures w14:val="none"/>
             </w:rPr>
           </w:pPr>
-          <w:hyperlink w:anchor="_Toc237559758" w:history="1">
+          <w:hyperlink w:anchor="_Toc237904450" w:history="1">
             <w:r>
               <w:rPr>
                 <w:rStyle w:val="Hyperlink"/>
@@ -5198,7 +5456,7 @@
                 <w:noProof/>
                 <w:webHidden/>
               </w:rPr>
-              <w:instrText xml:space="preserve"> PAGEREF _Toc237559758 \h </w:instrText>
+              <w:instrText xml:space="preserve"> PAGEREF _Toc237904450 \h </w:instrText>
             </w:r>
             <w:r>
               <w:rPr>
@@ -5218,7 +5476,7 @@
                 <w:noProof/>
                 <w:webHidden/>
               </w:rPr>
-              <w:t>37</w:t>
+              <w:t>40</w:t>
             </w:r>
             <w:r>
               <w:rPr>
@@ -5246,7 +5504,7 @@
               <w14:ligatures w14:val="none"/>
             </w:rPr>
           </w:pPr>
-          <w:hyperlink w:anchor="_Toc237559759" w:history="1">
+          <w:hyperlink w:anchor="_Toc237904451" w:history="1">
             <w:r>
               <w:rPr>
                 <w:rStyle w:val="Hyperlink"/>
@@ -5273,7 +5531,7 @@
                 <w:noProof/>
                 <w:webHidden/>
               </w:rPr>
-              <w:instrText xml:space="preserve"> PAGEREF _Toc237559759 \h </w:instrText>
+              <w:instrText xml:space="preserve"> PAGEREF _Toc237904451 \h </w:instrText>
             </w:r>
             <w:r>
               <w:rPr>
@@ -5293,7 +5551,7 @@
                 <w:noProof/>
                 <w:webHidden/>
               </w:rPr>
-              <w:t>38</w:t>
+              <w:t>41</w:t>
             </w:r>
             <w:r>
               <w:rPr>
@@ -5321,7 +5579,7 @@
               <w14:ligatures w14:val="none"/>
             </w:rPr>
           </w:pPr>
-          <w:hyperlink w:anchor="_Toc237559760" w:history="1">
+          <w:hyperlink w:anchor="_Toc237904452" w:history="1">
             <w:r>
               <w:rPr>
                 <w:rStyle w:val="Hyperlink"/>
@@ -5348,7 +5606,7 @@
                 <w:noProof/>
                 <w:webHidden/>
               </w:rPr>
-              <w:instrText xml:space="preserve"> PAGEREF _Toc237559760 \h </w:instrText>
+              <w:instrText xml:space="preserve"> PAGEREF _Toc237904452 \h </w:instrText>
             </w:r>
             <w:r>
               <w:rPr>
@@ -5368,7 +5626,7 @@
                 <w:noProof/>
                 <w:webHidden/>
               </w:rPr>
-              <w:t>38</w:t>
+              <w:t>41</w:t>
             </w:r>
             <w:r>
               <w:rPr>
@@ -5396,7 +5654,7 @@
               <w14:ligatures w14:val="none"/>
             </w:rPr>
           </w:pPr>
-          <w:hyperlink w:anchor="_Toc237559761" w:history="1">
+          <w:hyperlink w:anchor="_Toc237904453" w:history="1">
             <w:r>
               <w:rPr>
                 <w:rStyle w:val="Hyperlink"/>
@@ -5423,7 +5681,7 @@
                 <w:noProof/>
                 <w:webHidden/>
               </w:rPr>
-              <w:instrText xml:space="preserve"> PAGEREF _Toc237559761 \h </w:instrText>
+              <w:instrText xml:space="preserve"> PAGEREF _Toc237904453 \h </w:instrText>
             </w:r>
             <w:r>
               <w:rPr>
@@ -5443,7 +5701,7 @@
                 <w:noProof/>
                 <w:webHidden/>
               </w:rPr>
-              <w:t>39</w:t>
+              <w:t>42</w:t>
             </w:r>
             <w:r>
               <w:rPr>
@@ -5471,7 +5729,7 @@
               <w14:ligatures w14:val="none"/>
             </w:rPr>
           </w:pPr>
-          <w:hyperlink w:anchor="_Toc237559762" w:history="1">
+          <w:hyperlink w:anchor="_Toc237904454" w:history="1">
             <w:r>
               <w:rPr>
                 <w:rStyle w:val="Hyperlink"/>
@@ -5498,7 +5756,7 @@
                 <w:noProof/>
                 <w:webHidden/>
               </w:rPr>
-              <w:instrText xml:space="preserve"> PAGEREF _Toc237559762 \h </w:instrText>
+              <w:instrText xml:space="preserve"> PAGEREF _Toc237904454 \h </w:instrText>
             </w:r>
             <w:r>
               <w:rPr>
@@ -5518,7 +5776,7 @@
                 <w:noProof/>
                 <w:webHidden/>
               </w:rPr>
-              <w:t>39</w:t>
+              <w:t>42</w:t>
             </w:r>
             <w:r>
               <w:rPr>
@@ -5546,7 +5804,7 @@
               <w14:ligatures w14:val="none"/>
             </w:rPr>
           </w:pPr>
-          <w:hyperlink w:anchor="_Toc237559763" w:history="1">
+          <w:hyperlink w:anchor="_Toc237904455" w:history="1">
             <w:r>
               <w:rPr>
                 <w:rStyle w:val="Hyperlink"/>
@@ -5573,7 +5831,7 @@
                 <w:noProof/>
                 <w:webHidden/>
               </w:rPr>
-              <w:instrText xml:space="preserve"> PAGEREF _Toc237559763 \h </w:instrText>
+              <w:instrText xml:space="preserve"> PAGEREF _Toc237904455 \h </w:instrText>
             </w:r>
             <w:r>
               <w:rPr>
@@ -5593,7 +5851,7 @@
                 <w:noProof/>
                 <w:webHidden/>
               </w:rPr>
-              <w:t>40</w:t>
+              <w:t>43</w:t>
             </w:r>
             <w:r>
               <w:rPr>
@@ -5621,7 +5879,7 @@
               <w14:ligatures w14:val="none"/>
             </w:rPr>
           </w:pPr>
-          <w:hyperlink w:anchor="_Toc237559764" w:history="1">
+          <w:hyperlink w:anchor="_Toc237904456" w:history="1">
             <w:r>
               <w:rPr>
                 <w:rStyle w:val="Hyperlink"/>
@@ -5648,7 +5906,7 @@
                 <w:noProof/>
                 <w:webHidden/>
               </w:rPr>
-              <w:instrText xml:space="preserve"> PAGEREF _Toc237559764 \h </w:instrText>
+              <w:instrText xml:space="preserve"> PAGEREF _Toc237904456 \h </w:instrText>
             </w:r>
             <w:r>
               <w:rPr>
@@ -5668,7 +5926,7 @@
                 <w:noProof/>
                 <w:webHidden/>
               </w:rPr>
-              <w:t>40</w:t>
+              <w:t>43</w:t>
             </w:r>
             <w:r>
               <w:rPr>
@@ -5696,7 +5954,7 @@
               <w14:ligatures w14:val="none"/>
             </w:rPr>
           </w:pPr>
-          <w:hyperlink w:anchor="_Toc237559765" w:history="1">
+          <w:hyperlink w:anchor="_Toc237904457" w:history="1">
             <w:r>
               <w:rPr>
                 <w:rStyle w:val="Hyperlink"/>
@@ -5723,7 +5981,7 @@
                 <w:noProof/>
                 <w:webHidden/>
               </w:rPr>
-              <w:instrText xml:space="preserve"> PAGEREF _Toc237559765 \h </w:instrText>
+              <w:instrText xml:space="preserve"> PAGEREF _Toc237904457 \h </w:instrText>
             </w:r>
             <w:r>
               <w:rPr>
@@ -5743,7 +6001,7 @@
                 <w:noProof/>
                 <w:webHidden/>
               </w:rPr>
-              <w:t>40</w:t>
+              <w:t>43</w:t>
             </w:r>
             <w:r>
               <w:rPr>
@@ -5771,7 +6029,7 @@
               <w14:ligatures w14:val="none"/>
             </w:rPr>
           </w:pPr>
-          <w:hyperlink w:anchor="_Toc237559766" w:history="1">
+          <w:hyperlink w:anchor="_Toc237904458" w:history="1">
             <w:r>
               <w:rPr>
                 <w:rStyle w:val="Hyperlink"/>
@@ -5798,7 +6056,7 @@
                 <w:noProof/>
                 <w:webHidden/>
               </w:rPr>
-              <w:instrText xml:space="preserve"> PAGEREF _Toc237559766 \h </w:instrText>
+              <w:instrText xml:space="preserve"> PAGEREF _Toc237904458 \h </w:instrText>
             </w:r>
             <w:r>
               <w:rPr>
@@ -5818,7 +6076,7 @@
                 <w:noProof/>
                 <w:webHidden/>
               </w:rPr>
-              <w:t>41</w:t>
+              <w:t>44</w:t>
             </w:r>
             <w:r>
               <w:rPr>
@@ -5846,7 +6104,7 @@
               <w14:ligatures w14:val="none"/>
             </w:rPr>
           </w:pPr>
-          <w:hyperlink w:anchor="_Toc237559767" w:history="1">
+          <w:hyperlink w:anchor="_Toc237904459" w:history="1">
             <w:r>
               <w:rPr>
                 <w:rStyle w:val="Hyperlink"/>
@@ -5873,7 +6131,7 @@
                 <w:noProof/>
                 <w:webHidden/>
               </w:rPr>
-              <w:instrText xml:space="preserve"> PAGEREF _Toc237559767 \h </w:instrText>
+              <w:instrText xml:space="preserve"> PAGEREF _Toc237904459 \h </w:instrText>
             </w:r>
             <w:r>
               <w:rPr>
@@ -5893,7 +6151,7 @@
                 <w:noProof/>
                 <w:webHidden/>
               </w:rPr>
-              <w:t>41</w:t>
+              <w:t>44</w:t>
             </w:r>
             <w:r>
               <w:rPr>
@@ -5921,7 +6179,7 @@
               <w14:ligatures w14:val="none"/>
             </w:rPr>
           </w:pPr>
-          <w:hyperlink w:anchor="_Toc237559768" w:history="1">
+          <w:hyperlink w:anchor="_Toc237904460" w:history="1">
             <w:r>
               <w:rPr>
                 <w:rStyle w:val="Hyperlink"/>
@@ -5948,7 +6206,7 @@
                 <w:noProof/>
                 <w:webHidden/>
               </w:rPr>
-              <w:instrText xml:space="preserve"> PAGEREF _Toc237559768 \h </w:instrText>
+              <w:instrText xml:space="preserve"> PAGEREF _Toc237904460 \h </w:instrText>
             </w:r>
             <w:r>
               <w:rPr>
@@ -5968,7 +6226,7 @@
                 <w:noProof/>
                 <w:webHidden/>
               </w:rPr>
-              <w:t>42</w:t>
+              <w:t>45</w:t>
             </w:r>
             <w:r>
               <w:rPr>
@@ -5996,7 +6254,7 @@
               <w14:ligatures w14:val="none"/>
             </w:rPr>
           </w:pPr>
-          <w:hyperlink w:anchor="_Toc237559769" w:history="1">
+          <w:hyperlink w:anchor="_Toc237904461" w:history="1">
             <w:r>
               <w:rPr>
                 <w:rStyle w:val="Hyperlink"/>
@@ -6023,7 +6281,7 @@
                 <w:noProof/>
                 <w:webHidden/>
               </w:rPr>
-              <w:instrText xml:space="preserve"> PAGEREF _Toc237559769 \h </w:instrText>
+              <w:instrText xml:space="preserve"> PAGEREF _Toc237904461 \h </w:instrText>
             </w:r>
             <w:r>
               <w:rPr>
@@ -6043,7 +6301,7 @@
                 <w:noProof/>
                 <w:webHidden/>
               </w:rPr>
-              <w:t>43</w:t>
+              <w:t>46</w:t>
             </w:r>
             <w:r>
               <w:rPr>
@@ -6071,7 +6329,7 @@
               <w14:ligatures w14:val="none"/>
             </w:rPr>
           </w:pPr>
-          <w:hyperlink w:anchor="_Toc237559770" w:history="1">
+          <w:hyperlink w:anchor="_Toc237904462" w:history="1">
             <w:r>
               <w:rPr>
                 <w:rStyle w:val="Hyperlink"/>
@@ -6098,7 +6356,7 @@
                 <w:noProof/>
                 <w:webHidden/>
               </w:rPr>
-              <w:instrText xml:space="preserve"> PAGEREF _Toc237559770 \h </w:instrText>
+              <w:instrText xml:space="preserve"> PAGEREF _Toc237904462 \h </w:instrText>
             </w:r>
             <w:r>
               <w:rPr>
@@ -6118,7 +6376,7 @@
                 <w:noProof/>
                 <w:webHidden/>
               </w:rPr>
-              <w:t>44</w:t>
+              <w:t>47</w:t>
             </w:r>
             <w:r>
               <w:rPr>
@@ -6146,7 +6404,7 @@
               <w14:ligatures w14:val="none"/>
             </w:rPr>
           </w:pPr>
-          <w:hyperlink w:anchor="_Toc237559771" w:history="1">
+          <w:hyperlink w:anchor="_Toc237904463" w:history="1">
             <w:r>
               <w:rPr>
                 <w:rStyle w:val="Hyperlink"/>
@@ -6173,7 +6431,7 @@
                 <w:noProof/>
                 <w:webHidden/>
               </w:rPr>
-              <w:instrText xml:space="preserve"> PAGEREF _Toc237559771 \h </w:instrText>
+              <w:instrText xml:space="preserve"> PAGEREF _Toc237904463 \h </w:instrText>
             </w:r>
             <w:r>
               <w:rPr>
@@ -6193,7 +6451,7 @@
                 <w:noProof/>
                 <w:webHidden/>
               </w:rPr>
-              <w:t>45</w:t>
+              <w:t>48</w:t>
             </w:r>
             <w:r>
               <w:rPr>
@@ -6221,7 +6479,7 @@
               <w14:ligatures w14:val="none"/>
             </w:rPr>
           </w:pPr>
-          <w:hyperlink w:anchor="_Toc237559772" w:history="1">
+          <w:hyperlink w:anchor="_Toc237904464" w:history="1">
             <w:r>
               <w:rPr>
                 <w:rStyle w:val="Hyperlink"/>
@@ -6248,7 +6506,7 @@
                 <w:noProof/>
                 <w:webHidden/>
               </w:rPr>
-              <w:instrText xml:space="preserve"> PAGEREF _Toc237559772 \h </w:instrText>
+              <w:instrText xml:space="preserve"> PAGEREF _Toc237904464 \h </w:instrText>
             </w:r>
             <w:r>
               <w:rPr>
@@ -6268,7 +6526,7 @@
                 <w:noProof/>
                 <w:webHidden/>
               </w:rPr>
-              <w:t>46</w:t>
+              <w:t>49</w:t>
             </w:r>
             <w:r>
               <w:rPr>
@@ -6296,7 +6554,7 @@
               <w14:ligatures w14:val="none"/>
             </w:rPr>
           </w:pPr>
-          <w:hyperlink w:anchor="_Toc237559773" w:history="1">
+          <w:hyperlink w:anchor="_Toc237904465" w:history="1">
             <w:r>
               <w:rPr>
                 <w:rStyle w:val="Hyperlink"/>
@@ -6323,7 +6581,7 @@
                 <w:noProof/>
                 <w:webHidden/>
               </w:rPr>
-              <w:instrText xml:space="preserve"> PAGEREF _Toc237559773 \h </w:instrText>
+              <w:instrText xml:space="preserve"> PAGEREF _Toc237904465 \h </w:instrText>
             </w:r>
             <w:r>
               <w:rPr>
@@ -6343,7 +6601,7 @@
                 <w:noProof/>
                 <w:webHidden/>
               </w:rPr>
-              <w:t>47</w:t>
+              <w:t>50</w:t>
             </w:r>
             <w:r>
               <w:rPr>
@@ -6371,7 +6629,7 @@
               <w14:ligatures w14:val="none"/>
             </w:rPr>
           </w:pPr>
-          <w:hyperlink w:anchor="_Toc237559774" w:history="1">
+          <w:hyperlink w:anchor="_Toc237904466" w:history="1">
             <w:r>
               <w:rPr>
                 <w:rStyle w:val="Hyperlink"/>
@@ -6398,7 +6656,7 @@
                 <w:noProof/>
                 <w:webHidden/>
               </w:rPr>
-              <w:instrText xml:space="preserve"> PAGEREF _Toc237559774 \h </w:instrText>
+              <w:instrText xml:space="preserve"> PAGEREF _Toc237904466 \h </w:instrText>
             </w:r>
             <w:r>
               <w:rPr>
@@ -6418,7 +6676,7 @@
                 <w:noProof/>
                 <w:webHidden/>
               </w:rPr>
-              <w:t>47</w:t>
+              <w:t>50</w:t>
             </w:r>
             <w:r>
               <w:rPr>
@@ -6446,7 +6704,7 @@
               <w14:ligatures w14:val="none"/>
             </w:rPr>
           </w:pPr>
-          <w:hyperlink w:anchor="_Toc237559775" w:history="1">
+          <w:hyperlink w:anchor="_Toc237904467" w:history="1">
             <w:r>
               <w:rPr>
                 <w:rStyle w:val="Hyperlink"/>
@@ -6473,7 +6731,7 @@
                 <w:noProof/>
                 <w:webHidden/>
               </w:rPr>
-              <w:instrText xml:space="preserve"> PAGEREF _Toc237559775 \h </w:instrText>
+              <w:instrText xml:space="preserve"> PAGEREF _Toc237904467 \h </w:instrText>
             </w:r>
             <w:r>
               <w:rPr>
@@ -6493,7 +6751,7 @@
                 <w:noProof/>
                 <w:webHidden/>
               </w:rPr>
-              <w:t>51</w:t>
+              <w:t>54</w:t>
             </w:r>
             <w:r>
               <w:rPr>
@@ -6521,7 +6779,7 @@
               <w14:ligatures w14:val="none"/>
             </w:rPr>
           </w:pPr>
-          <w:hyperlink w:anchor="_Toc237559776" w:history="1">
+          <w:hyperlink w:anchor="_Toc237904468" w:history="1">
             <w:r>
               <w:rPr>
                 <w:rStyle w:val="Hyperlink"/>
@@ -6549,7 +6807,7 @@
                 <w:noProof/>
                 <w:webHidden/>
               </w:rPr>
-              <w:instrText xml:space="preserve"> PAGEREF _Toc237559776 \h </w:instrText>
+              <w:instrText xml:space="preserve"> PAGEREF _Toc237904468 \h </w:instrText>
             </w:r>
             <w:r>
               <w:rPr>
@@ -6569,7 +6827,7 @@
                 <w:noProof/>
                 <w:webHidden/>
               </w:rPr>
-              <w:t>53</w:t>
+              <w:t>56</w:t>
             </w:r>
             <w:r>
               <w:rPr>
@@ -6597,7 +6855,7 @@
               <w14:ligatures w14:val="none"/>
             </w:rPr>
           </w:pPr>
-          <w:hyperlink w:anchor="_Toc237559777" w:history="1">
+          <w:hyperlink w:anchor="_Toc237904469" w:history="1">
             <w:r>
               <w:rPr>
                 <w:rStyle w:val="Hyperlink"/>
@@ -6625,7 +6883,7 @@
                 <w:noProof/>
                 <w:webHidden/>
               </w:rPr>
-              <w:instrText xml:space="preserve"> PAGEREF _Toc237559777 \h </w:instrText>
+              <w:instrText xml:space="preserve"> PAGEREF _Toc237904469 \h </w:instrText>
             </w:r>
             <w:r>
               <w:rPr>
@@ -6645,7 +6903,7 @@
                 <w:noProof/>
                 <w:webHidden/>
               </w:rPr>
-              <w:t>53</w:t>
+              <w:t>56</w:t>
             </w:r>
             <w:r>
               <w:rPr>
@@ -6673,7 +6931,7 @@
               <w14:ligatures w14:val="none"/>
             </w:rPr>
           </w:pPr>
-          <w:hyperlink w:anchor="_Toc237559778" w:history="1">
+          <w:hyperlink w:anchor="_Toc237904470" w:history="1">
             <w:r>
               <w:rPr>
                 <w:rStyle w:val="Hyperlink"/>
@@ -6701,7 +6959,7 @@
                 <w:noProof/>
                 <w:webHidden/>
               </w:rPr>
-              <w:instrText xml:space="preserve"> PAGEREF _Toc237559778 \h </w:instrText>
+              <w:instrText xml:space="preserve"> PAGEREF _Toc237904470 \h </w:instrText>
             </w:r>
             <w:r>
               <w:rPr>
@@ -6721,7 +6979,7 @@
                 <w:noProof/>
                 <w:webHidden/>
               </w:rPr>
-              <w:t>54</w:t>
+              <w:t>57</w:t>
             </w:r>
             <w:r>
               <w:rPr>
@@ -6749,7 +7007,7 @@
               <w14:ligatures w14:val="none"/>
             </w:rPr>
           </w:pPr>
-          <w:hyperlink w:anchor="_Toc237559779" w:history="1">
+          <w:hyperlink w:anchor="_Toc237904471" w:history="1">
             <w:r>
               <w:rPr>
                 <w:rStyle w:val="Hyperlink"/>
@@ -6777,7 +7035,7 @@
                 <w:noProof/>
                 <w:webHidden/>
               </w:rPr>
-              <w:instrText xml:space="preserve"> PAGEREF _Toc237559779 \h </w:instrText>
+              <w:instrText xml:space="preserve"> PAGEREF _Toc237904471 \h </w:instrText>
             </w:r>
             <w:r>
               <w:rPr>
@@ -6797,7 +7055,7 @@
                 <w:noProof/>
                 <w:webHidden/>
               </w:rPr>
-              <w:t>56</w:t>
+              <w:t>59</w:t>
             </w:r>
             <w:r>
               <w:rPr>
@@ -6825,7 +7083,7 @@
               <w14:ligatures w14:val="none"/>
             </w:rPr>
           </w:pPr>
-          <w:hyperlink w:anchor="_Toc237559780" w:history="1">
+          <w:hyperlink w:anchor="_Toc237904472" w:history="1">
             <w:r>
               <w:rPr>
                 <w:rStyle w:val="Hyperlink"/>
@@ -6853,7 +7111,7 @@
                 <w:noProof/>
                 <w:webHidden/>
               </w:rPr>
-              <w:instrText xml:space="preserve"> PAGEREF _Toc237559780 \h </w:instrText>
+              <w:instrText xml:space="preserve"> PAGEREF _Toc237904472 \h </w:instrText>
             </w:r>
             <w:r>
               <w:rPr>
@@ -6873,7 +7131,7 @@
                 <w:noProof/>
                 <w:webHidden/>
               </w:rPr>
-              <w:t>57</w:t>
+              <w:t>60</w:t>
             </w:r>
             <w:r>
               <w:rPr>
@@ -6899,15 +7157,59 @@
               <w14:ligatures w14:val="none"/>
             </w:rPr>
           </w:pPr>
-          <w:hyperlink w:anchor="_Toc237559781" w:history="1">
+          <w:hyperlink w:anchor="_Toc237904473" w:history="1">
             <w:r>
               <w:rPr>
                 <w:rStyle w:val="Hyperlink"/>
               </w:rPr>
               <w:t>CHAPTER 5</w:t>
             </w:r>
+            <w:r>
+              <w:rPr>
+                <w:webHidden/>
+              </w:rPr>
+              <w:tab/>
+            </w:r>
+            <w:r>
+              <w:rPr>
+                <w:webHidden/>
+              </w:rPr>
+              <w:fldChar w:fldCharType="begin"/>
+            </w:r>
+            <w:r>
+              <w:rPr>
+                <w:webHidden/>
+              </w:rPr>
+              <w:instrText xml:space="preserve"> PAGEREF _Toc237904473 \h </w:instrText>
+            </w:r>
+            <w:r>
+              <w:rPr>
+                <w:webHidden/>
+              </w:rPr>
+            </w:r>
+            <w:r>
+              <w:rPr>
+                <w:webHidden/>
+              </w:rPr>
+              <w:fldChar w:fldCharType="separate"/>
+            </w:r>
+            <w:r>
+              <w:rPr>
+                <w:webHidden/>
+              </w:rPr>
+              <w:t>64</w:t>
+            </w:r>
+            <w:r>
+              <w:rPr>
+                <w:webHidden/>
+              </w:rPr>
+              <w:fldChar w:fldCharType="end"/>
+            </w:r>
           </w:hyperlink>
-          <w:r>
+        </w:p>
+        <w:p>
+          <w:pPr>
+            <w:pStyle w:val="TOC1"/>
             <w:rPr>
               <w:rFonts w:asciiTheme="minorHAnsi" w:eastAsiaTheme="minorEastAsia" w:hAnsiTheme="minorHAnsi" w:cstheme="minorBidi"/>
               <w:b w:val="0"/>
@@ -6919,9 +7221,8 @@
               <w:lang w:bidi="ne-NP"/>
               <w14:ligatures w14:val="none"/>
             </w:rPr>
-            <w:t xml:space="preserve"> </w:t>
-          </w:r>
-          <w:hyperlink w:anchor="_Toc237559782" w:history="1">
+          </w:pPr>
+          <w:hyperlink w:anchor="_Toc237904474" w:history="1">
             <w:r>
               <w:rPr>
                 <w:rStyle w:val="Hyperlink"/>
@@ -6944,7 +7245,7 @@
               <w:rPr>
                 <w:webHidden/>
               </w:rPr>
-              <w:instrText xml:space="preserve"> PAGEREF _Toc237559782 \h </w:instrText>
+              <w:instrText xml:space="preserve"> PAGEREF _Toc237904474 \h </w:instrText>
             </w:r>
             <w:r>
               <w:rPr>
@@ -6961,7 +7262,7 @@
               <w:rPr>
                 <w:webHidden/>
               </w:rPr>
-              <w:t>61</w:t>
+              <w:t>64</w:t>
             </w:r>
             <w:r>
               <w:rPr>
@@ -6988,7 +7289,7 @@
               <w14:ligatures w14:val="none"/>
             </w:rPr>
           </w:pPr>
-          <w:hyperlink w:anchor="_Toc237559783" w:history="1">
+          <w:hyperlink w:anchor="_Toc237904475" w:history="1">
             <w:r>
               <w:rPr>
                 <w:rStyle w:val="Hyperlink"/>
@@ -7015,7 +7316,7 @@
                 <w:noProof/>
                 <w:webHidden/>
               </w:rPr>
-              <w:instrText xml:space="preserve"> PAGEREF _Toc237559783 \h </w:instrText>
+              <w:instrText xml:space="preserve"> PAGEREF _Toc237904475 \h </w:instrText>
             </w:r>
             <w:r>
               <w:rPr>
@@ -7035,7 +7336,7 @@
                 <w:noProof/>
                 <w:webHidden/>
               </w:rPr>
-              <w:t>61</w:t>
+              <w:t>64</w:t>
             </w:r>
             <w:r>
               <w:rPr>
@@ -7063,7 +7364,7 @@
               <w14:ligatures w14:val="none"/>
             </w:rPr>
           </w:pPr>
-          <w:hyperlink w:anchor="_Toc237559784" w:history="1">
+          <w:hyperlink w:anchor="_Toc237904476" w:history="1">
             <w:r>
               <w:rPr>
                 <w:rStyle w:val="Hyperlink"/>
@@ -7090,7 +7391,7 @@
                 <w:noProof/>
                 <w:webHidden/>
               </w:rPr>
-              <w:instrText xml:space="preserve"> PAGEREF _Toc237559784 \h </w:instrText>
+              <w:instrText xml:space="preserve"> PAGEREF _Toc237904476 \h </w:instrText>
             </w:r>
             <w:r>
               <w:rPr>
@@ -7110,7 +7411,7 @@
                 <w:noProof/>
                 <w:webHidden/>
               </w:rPr>
-              <w:t>62</w:t>
+              <w:t>65</w:t>
             </w:r>
             <w:r>
               <w:rPr>
@@ -7136,7 +7437,7 @@
               <w14:ligatures w14:val="none"/>
             </w:rPr>
           </w:pPr>
-          <w:hyperlink w:anchor="_Toc237559785" w:history="1">
+          <w:hyperlink w:anchor="_Toc237904477" w:history="1">
             <w:r>
               <w:rPr>
                 <w:rStyle w:val="Hyperlink"/>
@@ -7159,7 +7460,7 @@
               <w:rPr>
                 <w:webHidden/>
               </w:rPr>
-              <w:instrText xml:space="preserve"> PAGEREF _Toc237559785 \h </w:instrText>
+              <w:instrText xml:space="preserve"> PAGEREF _Toc237904477 \h </w:instrText>
             </w:r>
             <w:r>
               <w:rPr>
@@ -7176,7 +7477,7 @@
               <w:rPr>
                 <w:webHidden/>
               </w:rPr>
-              <w:t>64</w:t>
+              <w:t>67</w:t>
             </w:r>
             <w:r>
               <w:rPr>
@@ -7201,7 +7502,7 @@
               <w14:ligatures w14:val="none"/>
             </w:rPr>
           </w:pPr>
-          <w:hyperlink w:anchor="_Toc237559786" w:history="1">
+          <w:hyperlink w:anchor="_Toc237904478" w:history="1">
             <w:r>
               <w:rPr>
                 <w:rStyle w:val="Hyperlink"/>
@@ -7239,20 +7540,17 @@
     <w:p/>
     <w:p/>
     <w:p/>
-    <w:p/>
-    <w:p/>
-    <w:p/>
     <w:p>
       <w:pPr>
         <w:pStyle w:val="Heading1"/>
         <w:spacing w:after="240"/>
       </w:pPr>
-      <w:bookmarkStart w:id="8" w:name="_Toc237559711"/>
+      <w:bookmarkStart w:id="10" w:name="_Toc237904402"/>
       <w:r>
         <w:lastRenderedPageBreak/>
         <w:t>LIST OF ABBREVIATIONS</w:t>
       </w:r>
-      <w:bookmarkEnd w:id="8"/>
+      <w:bookmarkEnd w:id="10"/>
     </w:p>
     <w:tbl>
       <w:tblPr>
@@ -7741,7 +8039,7 @@
           <w:rFonts w:cs="Times New Roman"/>
         </w:rPr>
       </w:pPr>
-      <w:bookmarkStart w:id="9" w:name="_Toc237559712"/>
+      <w:bookmarkStart w:id="11" w:name="_Toc237904403"/>
       <w:r>
         <w:rPr>
           <w:rFonts w:cs="Times New Roman"/>
@@ -7749,7 +8047,7 @@
         <w:lastRenderedPageBreak/>
         <w:t>LIST OF FIGURES</w:t>
       </w:r>
-      <w:bookmarkEnd w:id="9"/>
+      <w:bookmarkEnd w:id="11"/>
     </w:p>
     <w:tbl>
       <w:tblPr>
@@ -9562,12 +9860,12 @@
         <w:pStyle w:val="Heading1"/>
         <w:spacing w:after="240"/>
       </w:pPr>
-      <w:bookmarkStart w:id="10" w:name="_Toc237559713"/>
+      <w:bookmarkStart w:id="12" w:name="_Toc237904404"/>
       <w:r>
         <w:lastRenderedPageBreak/>
         <w:t>LIST OF TABLES</w:t>
       </w:r>
-      <w:bookmarkEnd w:id="10"/>
+      <w:bookmarkEnd w:id="12"/>
     </w:p>
     <w:tbl>
       <w:tblPr>
@@ -10111,12 +10409,12 @@
       <w:pPr>
         <w:pStyle w:val="Heading1"/>
       </w:pPr>
-      <w:bookmarkStart w:id="11" w:name="_Toc237559714"/>
+      <w:bookmarkStart w:id="13" w:name="_Toc237904405"/>
       <w:r>
         <w:lastRenderedPageBreak/>
         <w:t>CHAPTER 1</w:t>
       </w:r>
-      <w:bookmarkEnd w:id="11"/>
+      <w:bookmarkEnd w:id="13"/>
       <w:r>
         <w:t xml:space="preserve"> </w:t>
       </w:r>
@@ -10125,21 +10423,21 @@
       <w:pPr>
         <w:pStyle w:val="Heading1"/>
       </w:pPr>
-      <w:bookmarkStart w:id="12" w:name="_Toc237559715"/>
+      <w:bookmarkStart w:id="14" w:name="_Toc237904406"/>
       <w:r>
         <w:t>INTRODUCTION</w:t>
       </w:r>
-      <w:bookmarkEnd w:id="12"/>
+      <w:bookmarkEnd w:id="14"/>
     </w:p>
     <w:p>
       <w:pPr>
         <w:pStyle w:val="Heading2"/>
       </w:pPr>
-      <w:bookmarkStart w:id="13" w:name="_Toc237559716"/>
+      <w:bookmarkStart w:id="15" w:name="_Toc237904407"/>
       <w:r>
         <w:t>1.1 Introduction</w:t>
       </w:r>
-      <w:bookmarkEnd w:id="13"/>
+      <w:bookmarkEnd w:id="15"/>
       <w:r>
         <w:t xml:space="preserve"> </w:t>
       </w:r>
@@ -10240,11 +10538,11 @@
       <w:pPr>
         <w:pStyle w:val="Heading2"/>
       </w:pPr>
-      <w:bookmarkStart w:id="14" w:name="_Toc237559717"/>
+      <w:bookmarkStart w:id="16" w:name="_Toc237904408"/>
       <w:r>
         <w:t>1.2 Problem Statement</w:t>
       </w:r>
-      <w:bookmarkEnd w:id="14"/>
+      <w:bookmarkEnd w:id="16"/>
     </w:p>
     <w:p>
       <w:pPr>
@@ -10307,11 +10605,11 @@
       <w:pPr>
         <w:pStyle w:val="Heading2"/>
       </w:pPr>
-      <w:bookmarkStart w:id="15" w:name="_Toc237559718"/>
+      <w:bookmarkStart w:id="17" w:name="_Toc237904409"/>
       <w:r>
         <w:t>1.3 Objectives</w:t>
       </w:r>
-      <w:bookmarkEnd w:id="15"/>
+      <w:bookmarkEnd w:id="17"/>
     </w:p>
     <w:p>
       <w:pPr>
@@ -10496,7 +10794,7 @@
       <w:pPr>
         <w:pStyle w:val="Heading2"/>
       </w:pPr>
-      <w:bookmarkStart w:id="16" w:name="_Toc237559719"/>
+      <w:bookmarkStart w:id="18" w:name="_Toc237904410"/>
       <w:r>
         <w:t xml:space="preserve">1.4 </w:t>
       </w:r>
@@ -10506,7 +10804,7 @@
       <w:r>
         <w:t>Methodology</w:t>
       </w:r>
-      <w:bookmarkEnd w:id="16"/>
+      <w:bookmarkEnd w:id="18"/>
       <w:r>
         <w:t xml:space="preserve"> </w:t>
       </w:r>
@@ -10592,13 +10890,8 @@
       <w:r>
         <w:t xml:space="preserve"> and </w:t>
       </w:r>
-      <w:proofErr w:type="spellStart"/>
-      <w:r>
-        <w:t>CosineSimilarityAnalyzer</w:t>
-      </w:r>
-      <w:proofErr w:type="spellEnd"/>
-      <w:r>
-        <w:t xml:space="preserve"> engines.</w:t>
+      <w:r>
+        <w:t>CosineSimilarityAnalyzer engines.</w:t>
       </w:r>
     </w:p>
     <w:p>
@@ -10771,11 +11064,11 @@
       <w:pPr>
         <w:pStyle w:val="Heading2"/>
       </w:pPr>
-      <w:bookmarkStart w:id="17" w:name="_Toc237559720"/>
+      <w:bookmarkStart w:id="19" w:name="_Toc237904411"/>
       <w:r>
         <w:t>1.5 Report Organization</w:t>
       </w:r>
-      <w:bookmarkEnd w:id="17"/>
+      <w:bookmarkEnd w:id="19"/>
     </w:p>
     <w:p>
       <w:pPr>
@@ -10806,15 +11099,7 @@
         <w:spacing w:before="0" w:after="160"/>
       </w:pPr>
       <w:r>
-        <w:t xml:space="preserve">In Chapter 2, we review the main research studies on stylometry and AI text detection. We look at existing methods like GLTR, </w:t>
-      </w:r>
-      <w:proofErr w:type="spellStart"/>
-      <w:r>
-        <w:t>DetectGPT</w:t>
-      </w:r>
-      <w:proofErr w:type="spellEnd"/>
-      <w:r>
-        <w:t>, and lexical feature classifiers, and then explain how our project builds on and extends those earlier findings.</w:t>
+        <w:t>In Chapter 2, we review the main research studies on stylometry and AI text detection. We look at existing methods like GLTR, DetectGPT, and lexical feature classifiers, and then explain how our project builds on and extends those earlier findings.</w:t>
       </w:r>
     </w:p>
     <w:p>
@@ -10946,13 +11231,13 @@
         <w:pStyle w:val="Heading1"/>
         <w:spacing w:after="240"/>
       </w:pPr>
-      <w:bookmarkStart w:id="18" w:name="_Toc237559721"/>
+      <w:bookmarkStart w:id="20" w:name="_Toc237904412"/>
       <w:r>
         <w:lastRenderedPageBreak/>
         <w:t>CHAPTER 2</w:t>
       </w:r>
-      <w:bookmarkStart w:id="19" w:name="_Toc201399424"/>
-      <w:bookmarkEnd w:id="18"/>
+      <w:bookmarkStart w:id="21" w:name="_Toc201399424"/>
+      <w:bookmarkEnd w:id="20"/>
       <w:r>
         <w:t xml:space="preserve"> </w:t>
       </w:r>
@@ -10962,12 +11247,12 @@
         <w:pStyle w:val="Heading1"/>
         <w:spacing w:after="240"/>
       </w:pPr>
-      <w:bookmarkStart w:id="20" w:name="_Toc237559722"/>
+      <w:bookmarkStart w:id="22" w:name="_Toc237904413"/>
       <w:r>
         <w:t>BACKGROUND STUDY AND LITERATURE REVIEW</w:t>
       </w:r>
-      <w:bookmarkEnd w:id="19"/>
-      <w:bookmarkEnd w:id="20"/>
+      <w:bookmarkEnd w:id="21"/>
+      <w:bookmarkEnd w:id="22"/>
       <w:r>
         <w:t xml:space="preserve"> </w:t>
       </w:r>
@@ -10976,11 +11261,11 @@
       <w:pPr>
         <w:pStyle w:val="Heading2"/>
       </w:pPr>
-      <w:bookmarkStart w:id="21" w:name="_Toc237559723"/>
+      <w:bookmarkStart w:id="23" w:name="_Toc237904414"/>
       <w:r>
         <w:t>2.1 Background Study</w:t>
       </w:r>
-      <w:bookmarkEnd w:id="21"/>
+      <w:bookmarkEnd w:id="23"/>
     </w:p>
     <w:p>
       <w:r>
@@ -11064,11 +11349,11 @@
       <w:pPr>
         <w:pStyle w:val="Heading2"/>
       </w:pPr>
-      <w:bookmarkStart w:id="22" w:name="_Toc237559724"/>
+      <w:bookmarkStart w:id="24" w:name="_Toc237904415"/>
       <w:r>
         <w:t>2.2 Literature Review</w:t>
       </w:r>
-      <w:bookmarkEnd w:id="22"/>
+      <w:bookmarkEnd w:id="24"/>
     </w:p>
     <w:p>
       <w:pPr>
@@ -11119,36 +11404,9 @@
         <w:rPr>
           <w:bCs/>
         </w:rPr>
-        <w:t xml:space="preserve">developed </w:t>
-      </w:r>
-      <w:proofErr w:type="spellStart"/>
-      <w:r>
-        <w:rPr>
-          <w:bCs/>
-        </w:rPr>
-        <w:t>DetectGPT</w:t>
-      </w:r>
-      <w:proofErr w:type="spellEnd"/>
-      <w:r>
-        <w:rPr>
-          <w:bCs/>
-        </w:rPr>
-        <w:t xml:space="preserve">. It’s a novel zero shot detection method based on probability curvature. The researchers found out that AI generated passages tend to lie in regions of negative curvature of the source model’s log probability function, while human text just doesn’t exhibit this property. </w:t>
-      </w:r>
-      <w:proofErr w:type="spellStart"/>
-      <w:r>
-        <w:rPr>
-          <w:bCs/>
-        </w:rPr>
-        <w:t>DetectGPT</w:t>
-      </w:r>
-      <w:proofErr w:type="spellEnd"/>
-      <w:r>
-        <w:rPr>
-          <w:bCs/>
-        </w:rPr>
-        <w:t xml:space="preserve"> works by computing the log probability of the original </w:t>
-      </w:r>
+        <w:t xml:space="preserve">developed DetectGPT. It’s a novel zero shot detection method based on probability curvature. The researchers found out that AI generated passages tend to lie in regions of negative curvature of the source model’s log probability function, while human text just doesn’t exhibit this property. DetectGPT works by computing the log probability of the original </w:t>
+      </w:r>
+      <w:bookmarkEnd w:id="0"/>
       <w:r>
         <w:rPr>
           <w:bCs/>
@@ -11384,14 +11642,14 @@
         <w:pStyle w:val="Heading1"/>
         <w:ind w:left="224" w:right="278"/>
       </w:pPr>
-      <w:bookmarkStart w:id="23" w:name="_Toc201399427"/>
-      <w:bookmarkStart w:id="24" w:name="_Toc237559725"/>
+      <w:bookmarkStart w:id="25" w:name="_Toc201399427"/>
+      <w:bookmarkStart w:id="26" w:name="_Toc237904416"/>
       <w:r>
         <w:lastRenderedPageBreak/>
         <w:t>CHAPTER 3</w:t>
       </w:r>
-      <w:bookmarkEnd w:id="23"/>
-      <w:bookmarkEnd w:id="24"/>
+      <w:bookmarkEnd w:id="25"/>
+      <w:bookmarkEnd w:id="26"/>
       <w:r>
         <w:t xml:space="preserve"> </w:t>
       </w:r>
@@ -11401,35 +11659,35 @@
         <w:pStyle w:val="Heading1"/>
         <w:ind w:left="224" w:right="278"/>
       </w:pPr>
-      <w:bookmarkStart w:id="25" w:name="_Toc237559726"/>
+      <w:bookmarkStart w:id="27" w:name="_Toc237904417"/>
       <w:r>
         <w:t>SYSTEM ANALYSIS AND DESIGN</w:t>
       </w:r>
-      <w:bookmarkEnd w:id="25"/>
+      <w:bookmarkEnd w:id="27"/>
     </w:p>
     <w:p>
       <w:pPr>
         <w:pStyle w:val="Heading2"/>
       </w:pPr>
-      <w:bookmarkStart w:id="26" w:name="_Toc231875504"/>
-      <w:bookmarkStart w:id="27" w:name="_Toc237559727"/>
+      <w:bookmarkStart w:id="28" w:name="_Toc231875504"/>
+      <w:bookmarkStart w:id="29" w:name="_Toc237904418"/>
       <w:r>
         <w:t>3.1 System Analysis</w:t>
-      </w:r>
-      <w:bookmarkEnd w:id="26"/>
-      <w:bookmarkEnd w:id="27"/>
-    </w:p>
-    <w:p>
-      <w:pPr>
-        <w:pStyle w:val="Heading3"/>
-      </w:pPr>
-      <w:bookmarkStart w:id="28" w:name="_Toc231875505"/>
-      <w:bookmarkStart w:id="29" w:name="_Toc237559728"/>
-      <w:r>
-        <w:t>3.1.1 Requirement Analysis</w:t>
       </w:r>
       <w:bookmarkEnd w:id="28"/>
       <w:bookmarkEnd w:id="29"/>
+    </w:p>
+    <w:p>
+      <w:pPr>
+        <w:pStyle w:val="Heading3"/>
+      </w:pPr>
+      <w:bookmarkStart w:id="30" w:name="_Toc231875505"/>
+      <w:bookmarkStart w:id="31" w:name="_Toc237904419"/>
+      <w:r>
+        <w:t>3.1.1 Requirement Analysis</w:t>
+      </w:r>
+      <w:bookmarkEnd w:id="30"/>
+      <w:bookmarkEnd w:id="31"/>
     </w:p>
     <w:p>
       <w:pPr>
@@ -12119,11 +12377,11 @@
       <w:pPr>
         <w:pStyle w:val="Heading3"/>
       </w:pPr>
-      <w:bookmarkStart w:id="30" w:name="_Toc237559729"/>
+      <w:bookmarkStart w:id="32" w:name="_Toc237904420"/>
       <w:r>
         <w:t>3.1.2 Feasibility Analysis</w:t>
       </w:r>
-      <w:bookmarkEnd w:id="30"/>
+      <w:bookmarkEnd w:id="32"/>
     </w:p>
     <w:p>
       <w:pPr>
@@ -12882,14 +13140,24 @@
       <w:pPr>
         <w:pStyle w:val="Heading3"/>
       </w:pPr>
+      <w:bookmarkStart w:id="33" w:name="_Toc237904421"/>
       <w:r>
         <w:lastRenderedPageBreak/>
         <w:t>3.1.3 Object Modeling using Class Diagram</w:t>
       </w:r>
-    </w:p>
-    <w:p>
-      <w:r>
-        <w:t>The system's class diagram describes the modular architecture of the client-side detection engine. The design splits the application logic into five distinct classes: Parses, Sentence Perplexity, Instance Based Classification, Vector Similarities, and Render SVG visualization. These classes encapsulate attribute structures, operational methods, explicit association names, and standard UML multiplicity indicators (1, 1..*) required for document ingestion, feature extraction, statistical NLP computation, k-NN classification, vector space similarity matching, and dynamic SVG dashboard rendering.</w:t>
+      <w:bookmarkEnd w:id="33"/>
+    </w:p>
+    <w:p>
+      <w:r>
+        <w:t xml:space="preserve">The system's class diagram describes the modular architecture of the client-side detection engine. The design splits the application logic into five distinct classes: Parses, Sentence Perplexity, Instance Based Classification, Vector Similarities, and Render SVG visualization. These classes encapsulate attribute structures, operational methods, explicit association names, and standard UML multiplicity indicators (1, </w:t>
+      </w:r>
+      <w:proofErr w:type="gramStart"/>
+      <w:r>
+        <w:t>1..</w:t>
+      </w:r>
+      <w:proofErr w:type="gramEnd"/>
+      <w:r>
+        <w:t>*) required for document ingestion, feature extraction, statistical NLP computation, k-NN classification, vector space similarity matching, and dynamic SVG dashboard rendering.</w:t>
       </w:r>
     </w:p>
     <w:p>
@@ -12902,6 +13170,7 @@
       <w:r>
         <w:rPr>
           <w:b/>
+          <w:noProof/>
         </w:rPr>
         <w:drawing>
           <wp:inline distT="0" distB="0" distL="0" distR="0" wp14:anchorId="5780C555" wp14:editId="66136DED">
@@ -12959,7 +13228,327 @@
     <w:p>
       <w:r>
         <w:lastRenderedPageBreak/>
-        <w:t xml:space="preserve">Figure 3.3 explains the static architecture, encapsulated members, and UML multiplicity relationships across the five core system classes. The Parses class encapsulates document, status, wordCount, and format along with operational methods extractText(), readAsDocx(), and getWordCount(). The Sentence Perplexity class encapsulates perplexityLevel, burstinessValue, avgSentenceLength, and aiLikelihood with methods calculatePerplexity(), calculateBurstiness(), computeTTR(), getAiWordDensity(), getSentenceLengthVariance(), and getPerplexityVerdict(). The Instance Based Classification class encapsulates algorithm, neighborVotes, predictedClass, and confidenceScore with methods classify(), computeEuclideanDistance(), getNearestNeighbors(), getVerdictSummary(), and updateTrainingSet(). The Vector Similarities class encapsulates aiModelMatch, humanModelMatch, vectorCluster, and cosineDistance with methods computeCosineSimilarity(), extractNgramFrequency(), comparePrototypes(), getFeatureVector(), normalizeVector(), and getSimilarityIndex(). Finally, the Render SVG visualization class encapsulates chartType, verdictBanner, colorIndicator, and renderMode with methods renderGaugeChart(), renderScatterPlot(), renderRadarChart(), animateGaugePointer(), and updateVerdictDisplay(). Association multiplicities establish a 1:* relationship from Parses to Sentence Perplexity, Instance Based Classification, and Vector Similarities ("extracts &amp; feeds text"), *:1 </w:t>
+        <w:t xml:space="preserve">Figure 3.3 explains the static architecture, encapsulated members, and UML multiplicity relationships across the five core system classes. The Parses class encapsulates document, status, </w:t>
+      </w:r>
+      <w:proofErr w:type="spellStart"/>
+      <w:r>
+        <w:t>wordCount</w:t>
+      </w:r>
+      <w:proofErr w:type="spellEnd"/>
+      <w:r>
+        <w:t xml:space="preserve">, and format along with operational methods </w:t>
+      </w:r>
+      <w:proofErr w:type="spellStart"/>
+      <w:r>
+        <w:t>extractText</w:t>
+      </w:r>
+      <w:proofErr w:type="spellEnd"/>
+      <w:r>
+        <w:t xml:space="preserve">(), </w:t>
+      </w:r>
+      <w:proofErr w:type="spellStart"/>
+      <w:r>
+        <w:t>readAsDocx</w:t>
+      </w:r>
+      <w:proofErr w:type="spellEnd"/>
+      <w:r>
+        <w:t xml:space="preserve">(), and </w:t>
+      </w:r>
+      <w:proofErr w:type="spellStart"/>
+      <w:r>
+        <w:t>getWordCount</w:t>
+      </w:r>
+      <w:proofErr w:type="spellEnd"/>
+      <w:r>
+        <w:t xml:space="preserve">(). The Sentence Perplexity class encapsulates </w:t>
+      </w:r>
+      <w:proofErr w:type="spellStart"/>
+      <w:r>
+        <w:t>perplexityLevel</w:t>
+      </w:r>
+      <w:proofErr w:type="spellEnd"/>
+      <w:r>
+        <w:t xml:space="preserve">, </w:t>
+      </w:r>
+      <w:proofErr w:type="spellStart"/>
+      <w:r>
+        <w:t>burstinessValue</w:t>
+      </w:r>
+      <w:proofErr w:type="spellEnd"/>
+      <w:r>
+        <w:t xml:space="preserve">, </w:t>
+      </w:r>
+      <w:proofErr w:type="spellStart"/>
+      <w:r>
+        <w:t>avgSentenceLength</w:t>
+      </w:r>
+      <w:proofErr w:type="spellEnd"/>
+      <w:r>
+        <w:t xml:space="preserve">, and </w:t>
+      </w:r>
+      <w:proofErr w:type="spellStart"/>
+      <w:r>
+        <w:t>aiLikelihood</w:t>
+      </w:r>
+      <w:proofErr w:type="spellEnd"/>
+      <w:r>
+        <w:t xml:space="preserve"> with methods </w:t>
+      </w:r>
+      <w:proofErr w:type="spellStart"/>
+      <w:r>
+        <w:t>calculatePerplexity</w:t>
+      </w:r>
+      <w:proofErr w:type="spellEnd"/>
+      <w:r>
+        <w:t xml:space="preserve">(), </w:t>
+      </w:r>
+      <w:proofErr w:type="spellStart"/>
+      <w:r>
+        <w:t>calculateBurstiness</w:t>
+      </w:r>
+      <w:proofErr w:type="spellEnd"/>
+      <w:r>
+        <w:t xml:space="preserve">(), </w:t>
+      </w:r>
+      <w:proofErr w:type="spellStart"/>
+      <w:r>
+        <w:t>computeTTR</w:t>
+      </w:r>
+      <w:proofErr w:type="spellEnd"/>
+      <w:r>
+        <w:t xml:space="preserve">(), </w:t>
+      </w:r>
+      <w:proofErr w:type="spellStart"/>
+      <w:r>
+        <w:t>getAiWordDensity</w:t>
+      </w:r>
+      <w:proofErr w:type="spellEnd"/>
+      <w:r>
+        <w:t xml:space="preserve">(), </w:t>
+      </w:r>
+      <w:proofErr w:type="spellStart"/>
+      <w:r>
+        <w:t>getSentenceLengthVariance</w:t>
+      </w:r>
+      <w:proofErr w:type="spellEnd"/>
+      <w:r>
+        <w:t xml:space="preserve">(), and </w:t>
+      </w:r>
+      <w:proofErr w:type="spellStart"/>
+      <w:r>
+        <w:t>getPerplexityVerdict</w:t>
+      </w:r>
+      <w:proofErr w:type="spellEnd"/>
+      <w:r>
+        <w:t xml:space="preserve">(). The Instance Based Classification class encapsulates algorithm, </w:t>
+      </w:r>
+      <w:proofErr w:type="spellStart"/>
+      <w:r>
+        <w:t>neighborVotes</w:t>
+      </w:r>
+      <w:proofErr w:type="spellEnd"/>
+      <w:r>
+        <w:t xml:space="preserve">, </w:t>
+      </w:r>
+      <w:proofErr w:type="spellStart"/>
+      <w:r>
+        <w:t>predictedClass</w:t>
+      </w:r>
+      <w:proofErr w:type="spellEnd"/>
+      <w:r>
+        <w:t xml:space="preserve">, and </w:t>
+      </w:r>
+      <w:proofErr w:type="spellStart"/>
+      <w:r>
+        <w:t>confidenceScore</w:t>
+      </w:r>
+      <w:proofErr w:type="spellEnd"/>
+      <w:r>
+        <w:t xml:space="preserve"> with methods classify(), </w:t>
+      </w:r>
+      <w:proofErr w:type="spellStart"/>
+      <w:r>
+        <w:t>computeEuclideanDistance</w:t>
+      </w:r>
+      <w:proofErr w:type="spellEnd"/>
+      <w:r>
+        <w:t xml:space="preserve">(), </w:t>
+      </w:r>
+      <w:proofErr w:type="spellStart"/>
+      <w:r>
+        <w:t>getNearestNeighbors</w:t>
+      </w:r>
+      <w:proofErr w:type="spellEnd"/>
+      <w:r>
+        <w:t xml:space="preserve">(), </w:t>
+      </w:r>
+      <w:proofErr w:type="spellStart"/>
+      <w:r>
+        <w:t>getVerdictSummary</w:t>
+      </w:r>
+      <w:proofErr w:type="spellEnd"/>
+      <w:r>
+        <w:t xml:space="preserve">(), and </w:t>
+      </w:r>
+      <w:proofErr w:type="spellStart"/>
+      <w:r>
+        <w:t>updateTrainingSet</w:t>
+      </w:r>
+      <w:proofErr w:type="spellEnd"/>
+      <w:r>
+        <w:t xml:space="preserve">(). The Vector Similarities class encapsulates </w:t>
+      </w:r>
+      <w:proofErr w:type="spellStart"/>
+      <w:r>
+        <w:t>aiModelMatch</w:t>
+      </w:r>
+      <w:proofErr w:type="spellEnd"/>
+      <w:r>
+        <w:t xml:space="preserve">, </w:t>
+      </w:r>
+      <w:proofErr w:type="spellStart"/>
+      <w:r>
+        <w:t>humanModelMatch</w:t>
+      </w:r>
+      <w:proofErr w:type="spellEnd"/>
+      <w:r>
+        <w:t xml:space="preserve">, </w:t>
+      </w:r>
+      <w:proofErr w:type="spellStart"/>
+      <w:r>
+        <w:t>vectorCluster</w:t>
+      </w:r>
+      <w:proofErr w:type="spellEnd"/>
+      <w:r>
+        <w:t xml:space="preserve">, and </w:t>
+      </w:r>
+      <w:proofErr w:type="spellStart"/>
+      <w:r>
+        <w:t>cosineDistance</w:t>
+      </w:r>
+      <w:proofErr w:type="spellEnd"/>
+      <w:r>
+        <w:t xml:space="preserve"> with methods </w:t>
+      </w:r>
+      <w:proofErr w:type="spellStart"/>
+      <w:r>
+        <w:t>computeCosineSimilarity</w:t>
+      </w:r>
+      <w:proofErr w:type="spellEnd"/>
+      <w:r>
+        <w:t xml:space="preserve">(), </w:t>
+      </w:r>
+      <w:proofErr w:type="spellStart"/>
+      <w:r>
+        <w:t>extractNgramFrequency</w:t>
+      </w:r>
+      <w:proofErr w:type="spellEnd"/>
+      <w:r>
+        <w:t xml:space="preserve">(), </w:t>
+      </w:r>
+      <w:proofErr w:type="spellStart"/>
+      <w:r>
+        <w:t>comparePrototypes</w:t>
+      </w:r>
+      <w:proofErr w:type="spellEnd"/>
+      <w:r>
+        <w:t xml:space="preserve">(), </w:t>
+      </w:r>
+      <w:proofErr w:type="spellStart"/>
+      <w:r>
+        <w:t>getFeatureVector</w:t>
+      </w:r>
+      <w:proofErr w:type="spellEnd"/>
+      <w:r>
+        <w:t xml:space="preserve">(), </w:t>
+      </w:r>
+      <w:proofErr w:type="spellStart"/>
+      <w:r>
+        <w:t>normalizeVector</w:t>
+      </w:r>
+      <w:proofErr w:type="spellEnd"/>
+      <w:r>
+        <w:t xml:space="preserve">(), and </w:t>
+      </w:r>
+      <w:proofErr w:type="spellStart"/>
+      <w:r>
+        <w:t>getSimilarityIndex</w:t>
+      </w:r>
+      <w:proofErr w:type="spellEnd"/>
+      <w:r>
+        <w:t xml:space="preserve">(). Finally, the Render SVG visualization class encapsulates </w:t>
+      </w:r>
+      <w:proofErr w:type="spellStart"/>
+      <w:r>
+        <w:t>chartType</w:t>
+      </w:r>
+      <w:proofErr w:type="spellEnd"/>
+      <w:r>
+        <w:t xml:space="preserve">, </w:t>
+      </w:r>
+      <w:proofErr w:type="spellStart"/>
+      <w:r>
+        <w:t>verdictBanner</w:t>
+      </w:r>
+      <w:proofErr w:type="spellEnd"/>
+      <w:r>
+        <w:t xml:space="preserve">, </w:t>
+      </w:r>
+      <w:proofErr w:type="spellStart"/>
+      <w:r>
+        <w:t>colorIndicator</w:t>
+      </w:r>
+      <w:proofErr w:type="spellEnd"/>
+      <w:r>
+        <w:t xml:space="preserve">, and </w:t>
+      </w:r>
+      <w:proofErr w:type="spellStart"/>
+      <w:r>
+        <w:t>renderMode</w:t>
+      </w:r>
+      <w:proofErr w:type="spellEnd"/>
+      <w:r>
+        <w:t xml:space="preserve"> with methods </w:t>
+      </w:r>
+      <w:proofErr w:type="spellStart"/>
+      <w:r>
+        <w:t>renderGaugeChart</w:t>
+      </w:r>
+      <w:proofErr w:type="spellEnd"/>
+      <w:r>
+        <w:t xml:space="preserve">(), </w:t>
+      </w:r>
+      <w:proofErr w:type="spellStart"/>
+      <w:r>
+        <w:t>renderScatterPlot</w:t>
+      </w:r>
+      <w:proofErr w:type="spellEnd"/>
+      <w:r>
+        <w:t xml:space="preserve">(), </w:t>
+      </w:r>
+      <w:proofErr w:type="spellStart"/>
+      <w:r>
+        <w:t>renderRadarChart</w:t>
+      </w:r>
+      <w:proofErr w:type="spellEnd"/>
+      <w:r>
+        <w:t xml:space="preserve">(), </w:t>
+      </w:r>
+      <w:proofErr w:type="spellStart"/>
+      <w:r>
+        <w:t>animateGaugePointer</w:t>
+      </w:r>
+      <w:proofErr w:type="spellEnd"/>
+      <w:r>
+        <w:t xml:space="preserve">(), and </w:t>
+      </w:r>
+      <w:proofErr w:type="spellStart"/>
+      <w:r>
+        <w:t>updateVerdictDisplay</w:t>
+      </w:r>
+      <w:proofErr w:type="spellEnd"/>
+      <w:r>
+        <w:t xml:space="preserve">(). Association multiplicities establish a 1:* relationship from Parses to Sentence Perplexity, Instance Based Classification, and Vector Similarities ("extracts &amp; feeds text"), *:1 </w:t>
       </w:r>
       <w:proofErr w:type="gramStart"/>
       <w:r>
@@ -12974,13 +13563,31 @@
       <w:pPr>
         <w:pStyle w:val="Heading3"/>
       </w:pPr>
+      <w:bookmarkStart w:id="34" w:name="_Toc237904422"/>
       <w:r>
         <w:t>3.1.4 Object Modeling using Object Diagram</w:t>
       </w:r>
-    </w:p>
-    <w:p>
-      <w:r>
-        <w:t>The object diagram represents a concrete runtime snapshot of active object instances during an operational text scan session. It depicts instantiated objects of the five primary classes—docParser : Parses, sentencePerplexity : Sentence Perplexity, classifier : Instance Based Classification, vectorSimilarity : Vector Similarities, and visualizer : Render SVG visualization—populated with specific runtime slot values, instantiated operational methods, and active 1:1 runtime link multiplicities.</w:t>
+      <w:bookmarkEnd w:id="34"/>
+    </w:p>
+    <w:p>
+      <w:r>
+        <w:t>The object diagram represents a concrete runtime snapshot of active object instances during an operational text scan session. It depicts instantiated objects of the five primary classes—</w:t>
+      </w:r>
+      <w:proofErr w:type="spellStart"/>
+      <w:r>
+        <w:t>docParser</w:t>
+      </w:r>
+      <w:proofErr w:type="spellEnd"/>
+      <w:r>
+        <w:t xml:space="preserve"> : Parses, sentencePerplexity : Sentence Perplexity, classifier : Instance Based Classification, vectorSimilarity : Vector Similarities, and visualizer : Render SVG visualization—populated with specific runtime slot values, instantiated operational methods, and active 1:1 runtime link </w:t>
+      </w:r>
+      <w:proofErr w:type="gramStart"/>
+      <w:r>
+        <w:t>multiplicities</w:t>
+      </w:r>
+      <w:proofErr w:type="gramEnd"/>
+      <w:r>
+        <w:t>.</w:t>
       </w:r>
     </w:p>
     <w:p>
@@ -12988,6 +13595,9 @@
         <w:jc w:val="center"/>
       </w:pPr>
       <w:r>
+        <w:rPr>
+          <w:noProof/>
+        </w:rPr>
         <w:lastRenderedPageBreak/>
         <w:drawing>
           <wp:inline distT="0" distB="0" distL="0" distR="0" wp14:anchorId="0886214C" wp14:editId="7D118311">
@@ -13044,35 +13654,173 @@
     </w:p>
     <w:p>
       <w:r>
-        <w:t xml:space="preserve">Figure 3.4 illustrates the instantiated runtime state of the system during the analysis of the document "sample_essay.docx". The active objects include docParser : Parses (document = "sample_essay.docx", status = "Text Extracted Successfully", wordCount = 450 words, format = "Plain Text Buffer"), sentencePerplexity : Sentence Perplexity (perplexityLevel = "High (Uniform Pattern)", burstinessValue = "Low Sentence Variation", avgSentenceLength = 20.4 words, aiLikelihood = "88% AI-like rhythm"), classifier : Instance Based Classification </w:t>
+        <w:t xml:space="preserve">Figure 3.4 illustrates the instantiated runtime state of the system during the analysis of the document "sample_essay.docx". The active objects include </w:t>
+      </w:r>
+      <w:proofErr w:type="spellStart"/>
+      <w:r>
+        <w:t>docParser</w:t>
+      </w:r>
+      <w:proofErr w:type="spellEnd"/>
+      <w:r>
+        <w:t xml:space="preserve"> : Parses (document = "sample_essay.docx", status = "Text Extracted Successfully", </w:t>
+      </w:r>
+      <w:proofErr w:type="spellStart"/>
+      <w:r>
+        <w:t>wordCount</w:t>
+      </w:r>
+      <w:proofErr w:type="spellEnd"/>
+      <w:r>
+        <w:t xml:space="preserve"> = 450 words, format = "Plain Text Buffer"), sentencePerplexity : Sentence Perplexity (</w:t>
+      </w:r>
+      <w:proofErr w:type="spellStart"/>
+      <w:r>
+        <w:t>perplexityLevel</w:t>
+      </w:r>
+      <w:proofErr w:type="spellEnd"/>
+      <w:r>
+        <w:t xml:space="preserve"> = "High (Uniform Pattern)", </w:t>
+      </w:r>
+      <w:proofErr w:type="spellStart"/>
+      <w:r>
+        <w:t>burstinessValue</w:t>
+      </w:r>
+      <w:proofErr w:type="spellEnd"/>
+      <w:r>
+        <w:t xml:space="preserve"> = "Low Sentence Variation", </w:t>
+      </w:r>
+      <w:proofErr w:type="spellStart"/>
+      <w:r>
+        <w:t>avgSentenceLength</w:t>
+      </w:r>
+      <w:proofErr w:type="spellEnd"/>
+      <w:r>
+        <w:t xml:space="preserve"> = 20.4 words, </w:t>
+      </w:r>
+      <w:proofErr w:type="spellStart"/>
+      <w:r>
+        <w:t>aiLikelihood</w:t>
+      </w:r>
+      <w:proofErr w:type="spellEnd"/>
+      <w:r>
+        <w:t xml:space="preserve"> = "88% AI-like rhythm"), classifier : Instance Based Classification </w:t>
       </w:r>
       <w:r>
         <w:lastRenderedPageBreak/>
-        <w:t>(algorithm = "K-Nearest Neighbors (K=5)", neighborVotes = "4 AI Matches, 1 Human", predictedClass = "AI Generated Text", confidenceScore = 91.5%), vectorSimilarity : Vector Similarities (aiModelMatch = "85% Similarity", humanModelMatch = "25% Similarity", vectorCluster = "AI Language Patterns", cosineDistance = 0.152), and visualizer : Render SVG visualization (chartType = "Radial Speedometer Gauge", verdictBanner = "AI-GENERATED (91.5%)", colorIndicator = "Red / Warning Accent", renderMode = "Vector Graphic Display"). During execution, active 1:1 runtime links connect docParser to sentencePerplexity, classifier, and vectorSimilarity to transfer the extracted 450-word buffer. In turn, sentencePerplexity and vectorSimilarity feed their complexity metrics and cosine similarity scores to classifier, which computes the 91.5% confidence score and passes it directly to visualizer to render the radial speedometer gauge and alert banner on the dashboard.</w:t>
+        <w:t xml:space="preserve">(algorithm = "K-Nearest Neighbors (K=5)", </w:t>
+      </w:r>
+      <w:proofErr w:type="spellStart"/>
+      <w:r>
+        <w:t>neighborVotes</w:t>
+      </w:r>
+      <w:proofErr w:type="spellEnd"/>
+      <w:r>
+        <w:t xml:space="preserve"> = "4 AI Matches, 1 Human", </w:t>
+      </w:r>
+      <w:proofErr w:type="spellStart"/>
+      <w:r>
+        <w:t>predictedClass</w:t>
+      </w:r>
+      <w:proofErr w:type="spellEnd"/>
+      <w:r>
+        <w:t xml:space="preserve"> = "AI Generated Text", </w:t>
+      </w:r>
+      <w:proofErr w:type="spellStart"/>
+      <w:r>
+        <w:t>confidenceScore</w:t>
+      </w:r>
+      <w:proofErr w:type="spellEnd"/>
+      <w:r>
+        <w:t xml:space="preserve"> = 91.5%), vectorSimilarity : Vector Similarities (</w:t>
+      </w:r>
+      <w:proofErr w:type="spellStart"/>
+      <w:r>
+        <w:t>aiModelMatch</w:t>
+      </w:r>
+      <w:proofErr w:type="spellEnd"/>
+      <w:r>
+        <w:t xml:space="preserve"> = "85% Similarity", </w:t>
+      </w:r>
+      <w:proofErr w:type="spellStart"/>
+      <w:r>
+        <w:t>humanModelMatch</w:t>
+      </w:r>
+      <w:proofErr w:type="spellEnd"/>
+      <w:r>
+        <w:t xml:space="preserve"> = "25% Similarity", </w:t>
+      </w:r>
+      <w:proofErr w:type="spellStart"/>
+      <w:r>
+        <w:t>vectorCluster</w:t>
+      </w:r>
+      <w:proofErr w:type="spellEnd"/>
+      <w:r>
+        <w:t xml:space="preserve"> = "AI Language Patterns", </w:t>
+      </w:r>
+      <w:proofErr w:type="spellStart"/>
+      <w:r>
+        <w:t>cosineDistance</w:t>
+      </w:r>
+      <w:proofErr w:type="spellEnd"/>
+      <w:r>
+        <w:t xml:space="preserve"> = 0.152), and visualizer : Render SVG visualization (</w:t>
+      </w:r>
+      <w:proofErr w:type="spellStart"/>
+      <w:r>
+        <w:t>chartType</w:t>
+      </w:r>
+      <w:proofErr w:type="spellEnd"/>
+      <w:r>
+        <w:t xml:space="preserve"> = "Radial Speedometer Gauge", </w:t>
+      </w:r>
+      <w:proofErr w:type="spellStart"/>
+      <w:r>
+        <w:t>verdictBanner</w:t>
+      </w:r>
+      <w:proofErr w:type="spellEnd"/>
+      <w:r>
+        <w:t xml:space="preserve"> = "AI-GENERATED (91.5%)", </w:t>
+      </w:r>
+      <w:proofErr w:type="spellStart"/>
+      <w:r>
+        <w:t>colorIndicator</w:t>
+      </w:r>
+      <w:proofErr w:type="spellEnd"/>
+      <w:r>
+        <w:t xml:space="preserve"> = "Red / Warning Accent", </w:t>
+      </w:r>
+      <w:proofErr w:type="spellStart"/>
+      <w:r>
+        <w:t>renderMode</w:t>
+      </w:r>
+      <w:proofErr w:type="spellEnd"/>
+      <w:r>
+        <w:t xml:space="preserve"> = "Vector Graphic Display"). During execution, active 1:1 runtime links connect </w:t>
+      </w:r>
+      <w:proofErr w:type="spellStart"/>
+      <w:r>
+        <w:t>docParser</w:t>
+      </w:r>
+      <w:proofErr w:type="spellEnd"/>
+      <w:r>
+        <w:t xml:space="preserve"> to sentencePerplexity, classifier, and vectorSimilarity to transfer the extracted 450-word buffer. In turn, sentencePerplexity and vectorSimilarity feed their complexity metrics and cosine similarity scores to classifier, which computes the 91.5% confidence score and passes it directly to visualizer to render the radial speedometer gauge and alert banner on the dashboard.</w:t>
       </w:r>
     </w:p>
     <w:p>
       <w:pPr>
         <w:pStyle w:val="Heading3"/>
       </w:pPr>
+      <w:bookmarkStart w:id="35" w:name="_Toc237904423"/>
       <w:r>
         <w:t>3.1.5 Dynamic Modelling using State and Sequence Diagrams</w:t>
       </w:r>
+      <w:bookmarkEnd w:id="35"/>
     </w:p>
     <w:p>
       <w:r>
         <w:t>T</w:t>
       </w:r>
       <w:r>
-        <w:t xml:space="preserve">he AI Text Detector System state machine initiates once the user supplies any text or document via the interactive dashboard GUI. Initially, there’s a basic validation state where the input document gets assessed whether it exceeds the minimum threshold value of 10 words, on failing it directly short circuits to the error state otherwise, proceed to tokenization state to excerpt all the sentences and words from it. Hereon, all the 7 engines (i.e. PerplexityAnalyzer, KNNClassifier, </w:t>
-      </w:r>
-      <w:proofErr w:type="spellStart"/>
-      <w:r>
-        <w:t>CosineSimilarityAnalyzer</w:t>
-      </w:r>
-      <w:proofErr w:type="spellEnd"/>
-      <w:r>
-        <w:t xml:space="preserve">, </w:t>
+        <w:t xml:space="preserve">he AI Text Detector System state machine initiates once the user supplies any text or document via the interactive dashboard GUI. Initially, there’s a basic validation state where the input document gets assessed whether it exceeds the minimum threshold value of 10 words, on failing it directly short circuits to the error state otherwise, proceed to tokenization state to excerpt all the sentences and words from it. Hereon, all the 7 engines (i.e. PerplexityAnalyzer, KNNClassifier, CosineSimilarityAnalyzer, </w:t>
       </w:r>
       <w:proofErr w:type="spellStart"/>
       <w:r>
@@ -13275,7 +14023,15 @@
     </w:p>
     <w:p>
       <w:r>
-        <w:t>Figure 3.5 details all those state transitions and demonstrates the complete life cycle of operations for the AI Text Detector system: we start off with hollow blank start circle indicating it is ready, then as we submit text/drag a doc in, it transit to ‘Input received’ state which automatically transition to ‘Validate’ state, should the length of submitted/dragged text be lower than 10 words it should immediately transit to ‘validation failed’ state and throw an error to the user, Otherwise, proceed to ‘tokenisation’ to identify all sentences and words within the text on the local end of the system, following all seven AI engines calculate their own individual analysis’ score which would finally lead up to state ‘Ensemble scoring’ to incorporate all analysis from each engines, applying ‘Grammar Perfection Score’ to act as a multiplier discount, from the above computation (result in float) draw SVG chart visualization and heatmap via ‘Chart renderer’ which then result in the ‘Result display’ state and return to ‘Idle’ as it is completed. Solid circle denotes the final state (end of life cycle).</w:t>
+        <w:t>Figure 3.5 details all those state transitions and demonstrates the complete life cycle of operations for the AI Text Detector system: we start off with hollow blank start circle indicating it is ready, then as we submit text/drag a doc in, it transit to ‘Input received’ state which automatically transition to ‘Validate’ state, should the length of submitted/dragged text be lower than 10 words it should immediately transit to ‘validation failed’ state and throw an error to the user, Otherwise, proceed to ‘</w:t>
+      </w:r>
+      <w:proofErr w:type="spellStart"/>
+      <w:r>
+        <w:t>tokenisation</w:t>
+      </w:r>
+      <w:proofErr w:type="spellEnd"/>
+      <w:r>
+        <w:t>’ to identify all sentences and words within the text on the local end of the system, following all seven AI engines calculate their own individual analysis’ score which would finally lead up to state ‘Ensemble scoring’ to incorporate all analysis from each engines, applying ‘Grammar Perfection Score’ to act as a multiplier discount, from the above computation (result in float) draw SVG chart visualization and heatmap via ‘Chart renderer’ which then result in the ‘Result display’ state and return to ‘Idle’ as it is completed. Solid circle denotes the final state (end of life cycle).</w:t>
       </w:r>
     </w:p>
     <w:p>
@@ -13288,6 +14044,7 @@
       <w:r>
         <w:rPr>
           <w:b/>
+          <w:noProof/>
         </w:rPr>
         <w:lastRenderedPageBreak/>
         <w:drawing>
@@ -13357,31 +14114,7 @@
       </w:r>
       <w:r>
         <w:lastRenderedPageBreak/>
-        <w:t>the server controller validates input constraints such as the 10-word minimum threshold and user daily quota before initiating the detection pipeline</w:t>
-      </w:r>
-      <w:r>
-        <w:t>,</w:t>
-      </w:r>
-      <w:r>
-        <w:t xml:space="preserve"> the scanner engine then retrieves pre-compiled feature profiles, training centroids, and n-gram vocabularies from SQLite storage </w:t>
-      </w:r>
-      <w:r>
-        <w:t xml:space="preserve">, </w:t>
-      </w:r>
-      <w:r>
-        <w:t xml:space="preserve">inside the 'Scan all endpoints / AI evaluation engines' loop fragment box, feature extraction and classification are performed across statistical Perplexity, K-Nearest Neighbors, Logistic Regression, Character Trigrams, POS syntax ratios, Cosine Style Similarity, and Grammar Calibration </w:t>
-      </w:r>
-      <w:r>
-        <w:t>,</w:t>
-      </w:r>
-      <w:r>
-        <w:t xml:space="preserve">the classification ensemble computes the overall weighted AI probability score and returns the component metrics </w:t>
-      </w:r>
-      <w:r>
-        <w:t>,</w:t>
-      </w:r>
-      <w:r>
-        <w:t xml:space="preserve">scan metadata, verdict details, and raw </w:t>
+        <w:t xml:space="preserve">the server controller validates input constraints such as the 10-word minimum threshold and user daily quota before initiating the detection pipeline, the scanner engine then retrieves pre-compiled feature profiles, training centroids, and n-gram vocabularies from SQLite storage , inside the 'Scan all endpoints / AI evaluation engines' loop fragment box, feature extraction and classification are performed across statistical Perplexity, K-Nearest Neighbors, Logistic Regression, Character Trigrams, POS syntax ratios, Cosine Style Similarity, and Grammar Calibration ,the classification ensemble computes the overall weighted AI probability score and returns the component metrics ,scan metadata, verdict details, and raw </w:t>
       </w:r>
       <w:proofErr w:type="spellStart"/>
       <w:r>
@@ -13405,37 +14138,18 @@
       </w:r>
       <w:proofErr w:type="spellEnd"/>
       <w:r>
-        <w:t xml:space="preserve"> </w:t>
-      </w:r>
-      <w:r>
-        <w:t>,</w:t>
-      </w:r>
-      <w:r>
-        <w:t xml:space="preserve">the controller requests formatted chart rendering payloads </w:t>
-      </w:r>
-      <w:r>
-        <w:t>,</w:t>
-      </w:r>
-      <w:r>
-        <w:t xml:space="preserve">scanner engine generates interactive visualization datasets for the radial speedometer gauge, KNN scatter plot, feature radar web, and sentence risk heatmap </w:t>
-      </w:r>
-      <w:r>
-        <w:t>,</w:t>
-      </w:r>
-      <w:r>
-        <w:t>and finally, the server delivers the complete interactive dashboard view and risk verdict statement to the client user interface</w:t>
-      </w:r>
-      <w:r>
-        <w:t>.</w:t>
+        <w:t xml:space="preserve"> ,the controller requests formatted chart rendering payloads ,scanner engine generates interactive visualization datasets for the radial speedometer gauge, KNN scatter plot, feature radar web, and sentence risk heatmap ,and finally, the server delivers the complete interactive dashboard view and risk verdict statement to the client user interface.</w:t>
       </w:r>
     </w:p>
     <w:p>
       <w:pPr>
         <w:pStyle w:val="Heading3"/>
       </w:pPr>
+      <w:bookmarkStart w:id="36" w:name="_Toc237904424"/>
       <w:r>
         <w:t>3.1.6 Process Modelling Using Activity Diagrams</w:t>
       </w:r>
+      <w:bookmarkEnd w:id="36"/>
     </w:p>
     <w:p>
       <w:r>
@@ -13496,8 +14210,6 @@
           </wp:inline>
         </w:drawing>
       </w:r>
-      <w:bookmarkStart w:id="31" w:name="_GoBack"/>
-      <w:bookmarkEnd w:id="31"/>
     </w:p>
     <w:p>
       <w:pPr>
@@ -13517,52 +14229,64 @@
     </w:p>
     <w:p>
       <w:r>
-        <w:t xml:space="preserve">A closer view at how the whole thing works. A look on the figure 3.7 shows a bit how everything goes. To start with it, an analysis is made just by checking if text is valid with respect to number of words for which it should be analyzed. If words of the text is less then 10 words analysis comes to a halt and outputs a warning. If words count is greater than, analysis goes along. Tokenize locally will happen first, and the session gets save. At this point analysis </w:t>
+        <w:t xml:space="preserve">A closer view at how the whole thing works. A look on the figure 3.7 shows a bit how everything goes. To start with it, an analysis is made just by checking if text is valid with respect to number of words for which it should be analyzed. If words of the text </w:t>
+      </w:r>
+      <w:proofErr w:type="gramStart"/>
+      <w:r>
+        <w:t>is</w:t>
+      </w:r>
+      <w:proofErr w:type="gramEnd"/>
+      <w:r>
+        <w:t xml:space="preserve"> less </w:t>
+      </w:r>
+      <w:proofErr w:type="spellStart"/>
+      <w:r>
+        <w:t>then</w:t>
+      </w:r>
+      <w:proofErr w:type="spellEnd"/>
+      <w:r>
+        <w:t xml:space="preserve"> 10 words analysis comes to a halt and outputs a warning. If words count is greater than, analysis goes along. Tokenize locally will happen first, and the session gets save. At this point analysis </w:t>
       </w:r>
       <w:r>
         <w:lastRenderedPageBreak/>
-        <w:t>goes concurrently for the 7 machines; Perplexity; KNN; Cosine Similarity; Grammar Errors, and so on. The values provided by the different 7 analyzers and combined by using a weighted-average and by applying Grammar Perfection Score for an automatic correction based on Grammar Errors Score. As last, ChartRenderer comes into the play to create the graphic of the dashboard; SVG gauge, the scatter plot and the radar web, the map of heat colors, fill all fields with static texts, etc...</w:t>
+        <w:t xml:space="preserve">goes concurrently for the 7 machines; Perplexity; KNN; Cosine Similarity; Grammar Errors, and so on. The values provided by the different 7 analyzers and combined by using a weighted-average and by applying Grammar Perfection Score for an automatic correction based on Grammar Errors Score. As last, </w:t>
+      </w:r>
+      <w:proofErr w:type="spellStart"/>
+      <w:r>
+        <w:t>ChartRenderer</w:t>
+      </w:r>
+      <w:proofErr w:type="spellEnd"/>
+      <w:r>
+        <w:t xml:space="preserve"> comes into the play to create the graphic of the dashboard; SVG gauge, the scatter plot and the radar web, the map of heat colors, fill all fields with static texts, etc...</w:t>
       </w:r>
     </w:p>
     <w:p>
       <w:pPr>
         <w:pStyle w:val="Heading3"/>
       </w:pPr>
+      <w:bookmarkStart w:id="37" w:name="_Toc237904425"/>
       <w:r>
         <w:t>3.1.7 Refinement of Class Diagram</w:t>
       </w:r>
-    </w:p>
-    <w:p>
-      <w:r>
-        <w:t xml:space="preserve">The modification of the </w:t>
-      </w:r>
-      <w:proofErr w:type="gramStart"/>
-      <w:r>
-        <w:t>first class</w:t>
-      </w:r>
-      <w:proofErr w:type="gramEnd"/>
-      <w:r>
-        <w:t xml:space="preserve"> diagram to display the properties, the methods and the communication paths between the individual instances during the run time of the process. Those instances are: the controller, the utility class instance and the machine learning ensemble and database synchronization instance. In essence this modification closes the gap between the "what is" static structure and the "how do they live" real world working of the object instances</w:t>
-      </w:r>
-      <w:r>
-        <w:t>.</w:t>
-      </w:r>
-    </w:p>
-    <w:p>
-      <w:pPr>
-        <w:jc w:val="center"/>
-      </w:pPr>
-      <w:r>
-        <w:t xml:space="preserve">          </w:t>
-      </w:r>
+      <w:bookmarkEnd w:id="37"/>
+    </w:p>
+    <w:p>
       <w:r>
         <w:rPr>
           <w:noProof/>
         </w:rPr>
         <w:drawing>
-          <wp:inline distT="0" distB="0" distL="0" distR="0" wp14:anchorId="235D518E" wp14:editId="5DF8F63C">
-            <wp:extent cx="6033770" cy="3802654"/>
-            <wp:effectExtent l="0" t="0" r="5080" b="7620"/>
+          <wp:anchor distT="0" distB="0" distL="114300" distR="114300" simplePos="0" relativeHeight="251667456" behindDoc="1" locked="0" layoutInCell="1" allowOverlap="1" wp14:anchorId="235D518E">
+            <wp:simplePos x="0" y="0"/>
+            <wp:positionH relativeFrom="column">
+              <wp:posOffset>-60350</wp:posOffset>
+            </wp:positionH>
+            <wp:positionV relativeFrom="paragraph">
+              <wp:posOffset>1471320</wp:posOffset>
+            </wp:positionV>
+            <wp:extent cx="6239865" cy="4388485"/>
+            <wp:effectExtent l="0" t="0" r="8890" b="0"/>
+            <wp:wrapNone/>
             <wp:docPr id="7" name="Picture 7"/>
             <wp:cNvGraphicFramePr>
               <a:graphicFrameLocks xmlns:a="http://schemas.openxmlformats.org/drawingml/2006/main" noChangeAspect="1"/>
@@ -13575,7 +14299,13 @@
                     <pic:cNvPicPr/>
                   </pic:nvPicPr>
                   <pic:blipFill>
-                    <a:blip r:embed="rId20"/>
+                    <a:blip r:embed="rId20">
+                      <a:extLst>
+                        <a:ext uri="{28A0092B-C50C-407E-A947-70E740481C1C}">
+                          <a14:useLocalDpi xmlns:a14="http://schemas.microsoft.com/office/drawing/2010/main" val="0"/>
+                        </a:ext>
+                      </a:extLst>
+                    </a:blip>
                     <a:stretch>
                       <a:fillRect/>
                     </a:stretch>
@@ -13583,7 +14313,7 @@
                   <pic:spPr>
                     <a:xfrm>
                       <a:off x="0" y="0"/>
-                      <a:ext cx="6092442" cy="3839631"/>
+                      <a:ext cx="6250432" cy="4395916"/>
                     </a:xfrm>
                     <a:prstGeom prst="rect">
                       <a:avLst/>
@@ -13592,12 +14322,82 @@
                 </pic:pic>
               </a:graphicData>
             </a:graphic>
-          </wp:inline>
+            <wp14:sizeRelH relativeFrom="page">
+              <wp14:pctWidth>0</wp14:pctWidth>
+            </wp14:sizeRelH>
+            <wp14:sizeRelV relativeFrom="page">
+              <wp14:pctHeight>0</wp14:pctHeight>
+            </wp14:sizeRelV>
+          </wp:anchor>
         </w:drawing>
       </w:r>
       <w:r>
-        <w:t xml:space="preserve"> </w:t>
-      </w:r>
+        <w:t xml:space="preserve">The modification of the </w:t>
+      </w:r>
+      <w:proofErr w:type="gramStart"/>
+      <w:r>
+        <w:t>first class</w:t>
+      </w:r>
+      <w:proofErr w:type="gramEnd"/>
+      <w:r>
+        <w:t xml:space="preserve"> diagram to display the properties, the methods and the communication paths between the individual instances during the run time of the process. Those instances are: the controller, the utility class instance and the machine learning ensemble and database synchronization instance. In essence this modification closes the gap between the "what is" static structure and the "how do they live" real world working of the object instances</w:t>
+      </w:r>
+      <w:r>
+        <w:t>.</w:t>
+      </w:r>
+    </w:p>
+    <w:p>
+      <w:pPr>
+        <w:jc w:val="center"/>
+      </w:pPr>
+      <w:r>
+        <w:t xml:space="preserve">           </w:t>
+      </w:r>
+    </w:p>
+    <w:p>
+      <w:pPr>
+        <w:jc w:val="center"/>
+      </w:pPr>
+    </w:p>
+    <w:p>
+      <w:pPr>
+        <w:jc w:val="center"/>
+      </w:pPr>
+    </w:p>
+    <w:p>
+      <w:pPr>
+        <w:jc w:val="center"/>
+      </w:pPr>
+    </w:p>
+    <w:p>
+      <w:pPr>
+        <w:jc w:val="center"/>
+      </w:pPr>
+    </w:p>
+    <w:p>
+      <w:pPr>
+        <w:jc w:val="center"/>
+      </w:pPr>
+    </w:p>
+    <w:p>
+      <w:pPr>
+        <w:jc w:val="center"/>
+      </w:pPr>
+    </w:p>
+    <w:p>
+      <w:pPr>
+        <w:jc w:val="center"/>
+      </w:pPr>
+    </w:p>
+    <w:p>
+      <w:pPr>
+        <w:jc w:val="center"/>
+      </w:pPr>
+    </w:p>
+    <w:p>
+      <w:pPr>
+        <w:jc w:val="center"/>
+      </w:pPr>
     </w:p>
     <w:p>
       <w:pPr>
@@ -13692,33 +14492,25 @@
       <w:pPr>
         <w:pStyle w:val="Heading2"/>
       </w:pPr>
-      <w:bookmarkStart w:id="32" w:name="_Toc237559734"/>
+      <w:bookmarkStart w:id="38" w:name="_Toc237904426"/>
       <w:r>
         <w:t>3.2 System Design</w:t>
       </w:r>
-      <w:bookmarkEnd w:id="32"/>
+      <w:bookmarkEnd w:id="38"/>
     </w:p>
     <w:p>
       <w:pPr>
         <w:pStyle w:val="Heading3"/>
       </w:pPr>
-      <w:bookmarkStart w:id="33" w:name="_Toc237559735"/>
+      <w:bookmarkStart w:id="39" w:name="_Toc237904427"/>
       <w:r>
         <w:t>3.2.1 Component Diagram</w:t>
       </w:r>
-      <w:bookmarkEnd w:id="33"/>
-    </w:p>
-    <w:p>
-      <w:r>
-        <w:t xml:space="preserve">In the component diagram, it shows us the modularity in which the AI Text Detector is built in. The HTML5 dashboard serves as the user interface and communicates directly with the app.js controller, which handles some of the basic elements. This controller makes use of the FileParser class (which directly uses PDF.js and Mammoth.js, on the hand), the PerplexityAnalyzer, the KNNClassifier and the </w:t>
-      </w:r>
-      <w:proofErr w:type="spellStart"/>
-      <w:r>
-        <w:t>CosineSimilarityAnalyzer</w:t>
-      </w:r>
-      <w:proofErr w:type="spellEnd"/>
-      <w:r>
-        <w:t xml:space="preserve"> to determine what the score for each element are. All the output of these engines </w:t>
+      <w:bookmarkEnd w:id="39"/>
+    </w:p>
+    <w:p>
+      <w:r>
+        <w:t xml:space="preserve">In the component diagram, it shows us the modularity in which the AI Text Detector is built in. The HTML5 dashboard serves as the user interface and communicates directly with the app.js controller, which handles some of the basic elements. This controller makes use of the FileParser class (which directly uses PDF.js and Mammoth.js, on the hand), the PerplexityAnalyzer, the KNNClassifier and the CosineSimilarityAnalyzer to determine what the score for each element are. All the output of these engines </w:t>
       </w:r>
       <w:proofErr w:type="gramStart"/>
       <w:r>
@@ -13811,11 +14603,11 @@
       <w:pPr>
         <w:pStyle w:val="Heading3"/>
       </w:pPr>
-      <w:bookmarkStart w:id="34" w:name="_Toc237559736"/>
+      <w:bookmarkStart w:id="40" w:name="_Toc237904428"/>
       <w:r>
         <w:t>3.2.2 Deployment Diagram</w:t>
       </w:r>
-      <w:bookmarkEnd w:id="34"/>
+      <w:bookmarkEnd w:id="40"/>
     </w:p>
     <w:p>
       <w:r>
@@ -13955,11 +14747,11 @@
       <w:pPr>
         <w:pStyle w:val="Heading2"/>
       </w:pPr>
-      <w:bookmarkStart w:id="35" w:name="_Toc237559737"/>
+      <w:bookmarkStart w:id="41" w:name="_Toc237904429"/>
       <w:r>
         <w:t>3.3 Algorithm Details</w:t>
       </w:r>
-      <w:bookmarkEnd w:id="35"/>
+      <w:bookmarkEnd w:id="41"/>
     </w:p>
     <w:p>
       <w:pPr>
@@ -13968,11 +14760,11 @@
           <w:bCs/>
         </w:rPr>
       </w:pPr>
-      <w:bookmarkStart w:id="36" w:name="_Toc237559738"/>
+      <w:bookmarkStart w:id="42" w:name="_Toc237904430"/>
       <w:r>
         <w:t>3.3.1 Statistical NLP Algorithm (Perplexity &amp; Burstiness)</w:t>
       </w:r>
-      <w:bookmarkEnd w:id="36"/>
+      <w:bookmarkEnd w:id="42"/>
     </w:p>
     <w:p>
       <w:pPr>
@@ -14801,16 +15593,16 @@
           <w:szCs w:val="24"/>
         </w:rPr>
       </w:pPr>
-      <w:bookmarkStart w:id="37" w:name="_Toc237559739"/>
     </w:p>
     <w:p>
       <w:pPr>
         <w:pStyle w:val="Heading3"/>
       </w:pPr>
+      <w:bookmarkStart w:id="43" w:name="_Toc237904431"/>
       <w:r>
         <w:t>3.3.2 KNN Classifier</w:t>
       </w:r>
-      <w:bookmarkEnd w:id="37"/>
+      <w:bookmarkEnd w:id="43"/>
     </w:p>
     <w:p>
       <w:r>
@@ -14976,6 +15768,7 @@
                 </m:ctrlPr>
               </m:naryPr>
               <m:sub>
+                <w:proofErr w:type="spellStart"/>
                 <m:r>
                   <m:rPr>
                     <m:nor/>
@@ -14983,7 +15776,17 @@
                   <w:rPr>
                     <w:rFonts w:ascii="Cambria Math" w:hAnsi="Cambria Math"/>
                   </w:rPr>
-                  <m:t>i=1</m:t>
+                  <m:t>i</m:t>
+                </m:r>
+                <w:proofErr w:type="spellEnd"/>
+                <m:r>
+                  <m:rPr>
+                    <m:nor/>
+                  </m:rPr>
+                  <w:rPr>
+                    <w:rFonts w:ascii="Cambria Math" w:hAnsi="Cambria Math"/>
+                  </w:rPr>
+                  <m:t>=1</m:t>
                 </m:r>
               </m:sub>
               <m:sup>
@@ -15732,12 +16535,12 @@
       <w:pPr>
         <w:pStyle w:val="Heading3"/>
       </w:pPr>
-      <w:bookmarkStart w:id="38" w:name="_Toc237559740"/>
     </w:p>
     <w:p>
       <w:pPr>
         <w:pStyle w:val="Heading3"/>
       </w:pPr>
+      <w:bookmarkStart w:id="44" w:name="_Toc237904432"/>
       <w:r>
         <w:t>3.3.3 Cosine Similarity (Vector</w:t>
       </w:r>
@@ -15747,7 +16550,7 @@
       <w:r>
         <w:t xml:space="preserve"> Space Model)</w:t>
       </w:r>
-      <w:bookmarkEnd w:id="38"/>
+      <w:bookmarkEnd w:id="44"/>
     </w:p>
     <w:p>
       <w:pPr>
@@ -17229,16 +18032,16 @@
           <w:szCs w:val="24"/>
         </w:rPr>
       </w:pPr>
-      <w:bookmarkStart w:id="39" w:name="_Toc237559741"/>
     </w:p>
     <w:p>
       <w:pPr>
         <w:pStyle w:val="Heading3"/>
       </w:pPr>
+      <w:bookmarkStart w:id="45" w:name="_Toc237904433"/>
       <w:r>
         <w:t>3.3.4 Stylometric Logistic Regression Classifier</w:t>
       </w:r>
-      <w:bookmarkEnd w:id="39"/>
+      <w:bookmarkEnd w:id="45"/>
     </w:p>
     <w:p>
       <w:r>
@@ -17851,11 +18654,11 @@
       <w:pPr>
         <w:pStyle w:val="Heading3"/>
       </w:pPr>
-      <w:bookmarkStart w:id="40" w:name="_Toc237559742"/>
+      <w:bookmarkStart w:id="46" w:name="_Toc237904434"/>
       <w:r>
         <w:t>3.3.5 Character Trigram Cosine Similarity</w:t>
       </w:r>
-      <w:bookmarkEnd w:id="40"/>
+      <w:bookmarkEnd w:id="46"/>
     </w:p>
     <w:p>
       <w:r>
@@ -18891,11 +19694,11 @@
       <w:pPr>
         <w:pStyle w:val="Heading3"/>
       </w:pPr>
-      <w:bookmarkStart w:id="41" w:name="_Toc237559743"/>
+      <w:bookmarkStart w:id="47" w:name="_Toc237904435"/>
       <w:r>
         <w:t>3.3.6 POS Syntax Ratio Cosine Similarity</w:t>
       </w:r>
-      <w:bookmarkEnd w:id="41"/>
+      <w:bookmarkEnd w:id="47"/>
     </w:p>
     <w:p>
       <w:proofErr w:type="gramStart"/>
@@ -19668,11 +20471,11 @@
       <w:pPr>
         <w:pStyle w:val="Heading3"/>
       </w:pPr>
-      <w:bookmarkStart w:id="42" w:name="_Toc237559744"/>
+      <w:bookmarkStart w:id="48" w:name="_Toc237904436"/>
       <w:r>
         <w:t>3.3.7 Heuristic Grammar &amp; Typography Analyzer</w:t>
       </w:r>
-      <w:bookmarkEnd w:id="42"/>
+      <w:bookmarkEnd w:id="48"/>
     </w:p>
     <w:p>
       <w:pPr>
@@ -20706,11 +21509,11 @@
       <w:pPr>
         <w:pStyle w:val="Heading3"/>
       </w:pPr>
-      <w:bookmarkStart w:id="43" w:name="_Toc237559745"/>
+      <w:bookmarkStart w:id="49" w:name="_Toc237904437"/>
       <w:r>
         <w:t>3.3.8 Ensemble Scoring &amp; Grammar Calibration</w:t>
       </w:r>
-      <w:bookmarkEnd w:id="43"/>
+      <w:bookmarkEnd w:id="49"/>
     </w:p>
     <w:p>
       <w:pPr>
@@ -21449,12 +22252,12 @@
       <w:pPr>
         <w:pStyle w:val="Heading1"/>
       </w:pPr>
-      <w:bookmarkStart w:id="44" w:name="_Toc237559746"/>
+      <w:bookmarkStart w:id="50" w:name="_Toc237904438"/>
       <w:r>
         <w:lastRenderedPageBreak/>
         <w:t>CHAPTER 4</w:t>
       </w:r>
-      <w:bookmarkEnd w:id="44"/>
+      <w:bookmarkEnd w:id="50"/>
       <w:r>
         <w:t xml:space="preserve"> </w:t>
       </w:r>
@@ -21463,11 +22266,11 @@
       <w:pPr>
         <w:pStyle w:val="Heading1"/>
       </w:pPr>
-      <w:bookmarkStart w:id="45" w:name="_Toc237559747"/>
+      <w:bookmarkStart w:id="51" w:name="_Toc237904439"/>
       <w:r>
         <w:t>IMPLEMENTATION AND TESTING</w:t>
       </w:r>
-      <w:bookmarkEnd w:id="45"/>
+      <w:bookmarkEnd w:id="51"/>
       <w:r>
         <w:t xml:space="preserve">  </w:t>
       </w:r>
@@ -21476,14 +22279,14 @@
       <w:pPr>
         <w:pStyle w:val="Heading2"/>
       </w:pPr>
-      <w:bookmarkStart w:id="46" w:name="_Toc237559748"/>
+      <w:bookmarkStart w:id="52" w:name="_Toc237904440"/>
       <w:r>
         <w:t xml:space="preserve">4.1 </w:t>
       </w:r>
       <w:r>
         <w:t>Implementation</w:t>
       </w:r>
-      <w:bookmarkEnd w:id="46"/>
+      <w:bookmarkEnd w:id="52"/>
     </w:p>
     <w:p>
       <w:pPr>
@@ -21492,7 +22295,7 @@
           <w:bCs/>
         </w:rPr>
       </w:pPr>
-      <w:bookmarkStart w:id="47" w:name="_Toc237559749"/>
+      <w:bookmarkStart w:id="53" w:name="_Toc237904441"/>
       <w:r>
         <w:t xml:space="preserve">4.1.1 </w:t>
       </w:r>
@@ -21502,7 +22305,7 @@
         </w:rPr>
         <w:t>Tools Used</w:t>
       </w:r>
-      <w:bookmarkEnd w:id="47"/>
+      <w:bookmarkEnd w:id="53"/>
     </w:p>
     <w:p>
       <w:r>
@@ -21674,12 +22477,12 @@
       <w:pPr>
         <w:pStyle w:val="Heading2"/>
       </w:pPr>
-      <w:bookmarkStart w:id="48" w:name="_Toc237559750"/>
+      <w:bookmarkStart w:id="54" w:name="_Toc237904442"/>
       <w:r>
         <w:lastRenderedPageBreak/>
         <w:t>4.1.2 Module Implementation Details</w:t>
       </w:r>
-      <w:bookmarkEnd w:id="48"/>
+      <w:bookmarkEnd w:id="54"/>
     </w:p>
     <w:p>
       <w:r>
@@ -21715,11 +22518,11 @@
       <w:pPr>
         <w:pStyle w:val="Heading3"/>
       </w:pPr>
-      <w:bookmarkStart w:id="49" w:name="_Toc237559751"/>
+      <w:bookmarkStart w:id="55" w:name="_Toc237904443"/>
       <w:r>
         <w:t>4.1.2.1 FileParser Module</w:t>
       </w:r>
-      <w:bookmarkEnd w:id="49"/>
+      <w:bookmarkEnd w:id="55"/>
     </w:p>
     <w:p>
       <w:r>
@@ -22205,11 +23008,11 @@
       <w:pPr>
         <w:pStyle w:val="Heading3"/>
       </w:pPr>
-      <w:bookmarkStart w:id="50" w:name="_Toc237559752"/>
+      <w:bookmarkStart w:id="56" w:name="_Toc237904444"/>
       <w:r>
         <w:t>4.1.2.2 Perplexity &amp; Burstiness Module</w:t>
       </w:r>
-      <w:bookmarkEnd w:id="50"/>
+      <w:bookmarkEnd w:id="56"/>
     </w:p>
     <w:p>
       <w:r>
@@ -22620,11 +23423,11 @@
       <w:pPr>
         <w:pStyle w:val="Heading3"/>
       </w:pPr>
-      <w:bookmarkStart w:id="51" w:name="_Toc237559753"/>
+      <w:bookmarkStart w:id="57" w:name="_Toc237904445"/>
       <w:r>
         <w:t>4.1.2.3 KNN Heuristic Feature Module</w:t>
       </w:r>
-      <w:bookmarkEnd w:id="51"/>
+      <w:bookmarkEnd w:id="57"/>
     </w:p>
     <w:p>
       <w:pPr>
@@ -23164,11 +23967,11 @@
       <w:pPr>
         <w:pStyle w:val="Heading3"/>
       </w:pPr>
-      <w:bookmarkStart w:id="52" w:name="_Toc237559754"/>
+      <w:bookmarkStart w:id="58" w:name="_Toc237904446"/>
       <w:r>
         <w:t>4.1.2.4 KNN Voting Classifier Module</w:t>
       </w:r>
-      <w:bookmarkEnd w:id="52"/>
+      <w:bookmarkEnd w:id="58"/>
     </w:p>
     <w:p>
       <w:r>
@@ -23758,7 +24561,6 @@
           <w:b/>
           <w:sz w:val="22"/>
         </w:rPr>
-        <w:lastRenderedPageBreak/>
         <w:t>Figure 4.4: Code Snippet of KNN Classifier Module</w:t>
       </w:r>
     </w:p>
@@ -23766,23 +24568,15 @@
       <w:pPr>
         <w:pStyle w:val="Heading3"/>
       </w:pPr>
-      <w:bookmarkStart w:id="53" w:name="_Toc237559755"/>
+      <w:bookmarkStart w:id="59" w:name="_Toc237904447"/>
       <w:r>
         <w:t>4.1.2.5 Cosine Similarity Feature Module</w:t>
       </w:r>
-      <w:bookmarkEnd w:id="53"/>
-    </w:p>
-    <w:p>
-      <w:r>
-        <w:t xml:space="preserve">The </w:t>
-      </w:r>
-      <w:proofErr w:type="spellStart"/>
-      <w:r>
-        <w:t>CosineSimilarityAnalyzer</w:t>
-      </w:r>
-      <w:proofErr w:type="spellEnd"/>
-      <w:r>
-        <w:t xml:space="preserve"> works by pulling out a 5D syntactic profile. Basically, this profile looks at first person pronouns, complex conjunctions, intensifiers, passive voice, and Hapax Legomena. Then it just maps all of these into normalized vector coordinates.</w:t>
+      <w:bookmarkEnd w:id="59"/>
+    </w:p>
+    <w:p>
+      <w:r>
+        <w:t>The CosineSimilarityAnalyzer works by pulling out a 5D syntactic profile. Basically, this profile looks at first person pronouns, complex conjunctions, intensifiers, passive voice, and Hapax Legomena. Then it just maps all of these into normalized vector coordinates.</w:t>
       </w:r>
     </w:p>
     <w:tbl>
@@ -24389,23 +25183,15 @@
       <w:pPr>
         <w:pStyle w:val="Heading3"/>
       </w:pPr>
-      <w:bookmarkStart w:id="54" w:name="_Toc237559756"/>
+      <w:bookmarkStart w:id="60" w:name="_Toc237904448"/>
       <w:r>
         <w:t>4.1.2.6 Cosine Similarity Angle Module</w:t>
       </w:r>
-      <w:bookmarkEnd w:id="54"/>
-    </w:p>
-    <w:p>
-      <w:r>
-        <w:t xml:space="preserve">To find the similarity margin, the </w:t>
-      </w:r>
-      <w:proofErr w:type="spellStart"/>
-      <w:r>
-        <w:t>CosineSimilarityAnalyzer</w:t>
-      </w:r>
-      <w:proofErr w:type="spellEnd"/>
-      <w:r>
-        <w:t xml:space="preserve"> calculates the angles between the document syntax vector and the human/AI prototype vectors. It relies on the vector dot product to do this math and return the final margin.</w:t>
+      <w:bookmarkEnd w:id="60"/>
+    </w:p>
+    <w:p>
+      <w:r>
+        <w:t>To find the similarity margin, the CosineSimilarityAnalyzer calculates the angles between the document syntax vector and the human/AI prototype vectors. It relies on the vector dot product to do this math and return the final margin.</w:t>
       </w:r>
     </w:p>
     <w:tbl>
@@ -25081,12 +25867,12 @@
       <w:pPr>
         <w:pStyle w:val="Heading3"/>
       </w:pPr>
-      <w:bookmarkStart w:id="55" w:name="_Toc237559757"/>
+      <w:bookmarkStart w:id="61" w:name="_Toc237904449"/>
       <w:r>
         <w:lastRenderedPageBreak/>
         <w:t>4.1.2.7 Logistic Regression Classifier Module</w:t>
       </w:r>
-      <w:bookmarkEnd w:id="55"/>
+      <w:bookmarkEnd w:id="61"/>
     </w:p>
     <w:p>
       <w:pPr>
@@ -25415,11 +26201,11 @@
       <w:pPr>
         <w:pStyle w:val="Heading3"/>
       </w:pPr>
-      <w:bookmarkStart w:id="56" w:name="_Toc237559758"/>
+      <w:bookmarkStart w:id="62" w:name="_Toc237904450"/>
       <w:r>
         <w:t>4.1.2.8 Character Trigrams Classifier Module</w:t>
       </w:r>
-      <w:bookmarkEnd w:id="56"/>
+      <w:bookmarkEnd w:id="62"/>
     </w:p>
     <w:p>
       <w:pPr>
@@ -25921,12 +26707,12 @@
       <w:pPr>
         <w:pStyle w:val="Heading3"/>
       </w:pPr>
-      <w:bookmarkStart w:id="57" w:name="_Toc237559759"/>
+      <w:bookmarkStart w:id="63" w:name="_Toc237904451"/>
       <w:r>
         <w:lastRenderedPageBreak/>
         <w:t>4.1.2.9 POS Syntax Ratios Classifier Module</w:t>
       </w:r>
-      <w:bookmarkEnd w:id="57"/>
+      <w:bookmarkEnd w:id="63"/>
     </w:p>
     <w:p>
       <w:pPr>
@@ -26502,7 +27288,7 @@
       <w:pPr>
         <w:pStyle w:val="Heading3"/>
       </w:pPr>
-      <w:bookmarkStart w:id="58" w:name="_Toc237559760"/>
+      <w:bookmarkStart w:id="64" w:name="_Toc237904452"/>
       <w:r>
         <w:t xml:space="preserve">4.1.2.10 </w:t>
       </w:r>
@@ -26514,7 +27300,7 @@
       <w:r>
         <w:t xml:space="preserve"> Gauge Module</w:t>
       </w:r>
-      <w:bookmarkEnd w:id="58"/>
+      <w:bookmarkEnd w:id="64"/>
     </w:p>
     <w:p>
       <w:r>
@@ -27009,7 +27795,7 @@
         <w:pStyle w:val="Heading3"/>
         <w:jc w:val="left"/>
       </w:pPr>
-      <w:bookmarkStart w:id="59" w:name="_Toc237559761"/>
+      <w:bookmarkStart w:id="65" w:name="_Toc237904453"/>
       <w:r>
         <w:lastRenderedPageBreak/>
         <w:t xml:space="preserve">4.1.2.11 </w:t>
@@ -27022,7 +27808,7 @@
       <w:r>
         <w:t xml:space="preserve"> Scatter Plot Module</w:t>
       </w:r>
-      <w:bookmarkEnd w:id="59"/>
+      <w:bookmarkEnd w:id="65"/>
     </w:p>
     <w:p>
       <w:r>
@@ -27698,7 +28484,7 @@
       <w:pPr>
         <w:pStyle w:val="Heading3"/>
       </w:pPr>
-      <w:bookmarkStart w:id="60" w:name="_Toc237559762"/>
+      <w:bookmarkStart w:id="66" w:name="_Toc237904454"/>
       <w:r>
         <w:t xml:space="preserve">4.1.2.12 </w:t>
       </w:r>
@@ -27710,7 +28496,7 @@
       <w:r>
         <w:t xml:space="preserve"> Radar Chart Module</w:t>
       </w:r>
-      <w:bookmarkEnd w:id="60"/>
+      <w:bookmarkEnd w:id="66"/>
     </w:p>
     <w:p>
       <w:r>
@@ -28265,12 +29051,12 @@
       <w:pPr>
         <w:pStyle w:val="Heading3"/>
       </w:pPr>
-      <w:bookmarkStart w:id="61" w:name="_Toc237559763"/>
+      <w:bookmarkStart w:id="67" w:name="_Toc237904455"/>
       <w:r>
         <w:lastRenderedPageBreak/>
         <w:t>4.1.2.13 app.js Analysis Controller Module</w:t>
       </w:r>
-      <w:bookmarkEnd w:id="61"/>
+      <w:bookmarkEnd w:id="67"/>
     </w:p>
     <w:p>
       <w:r>
@@ -28923,11 +29709,11 @@
       <w:pPr>
         <w:pStyle w:val="Heading3"/>
       </w:pPr>
-      <w:bookmarkStart w:id="62" w:name="_Toc237559764"/>
+      <w:bookmarkStart w:id="68" w:name="_Toc237904456"/>
       <w:r>
         <w:t>4.1.2.14 app.js UI Event Listener Module</w:t>
       </w:r>
-      <w:bookmarkEnd w:id="62"/>
+      <w:bookmarkEnd w:id="68"/>
     </w:p>
     <w:p>
       <w:r>
@@ -29372,11 +30158,11 @@
       <w:pPr>
         <w:pStyle w:val="Heading3"/>
       </w:pPr>
-      <w:bookmarkStart w:id="63" w:name="_Toc237559765"/>
+      <w:bookmarkStart w:id="69" w:name="_Toc237904457"/>
       <w:r>
         <w:t>4.1.2.15 style.css Custom Visual Styles</w:t>
       </w:r>
-      <w:bookmarkEnd w:id="63"/>
+      <w:bookmarkEnd w:id="69"/>
     </w:p>
     <w:p>
       <w:r>
@@ -29578,11 +30364,11 @@
       <w:pPr>
         <w:pStyle w:val="Heading3"/>
       </w:pPr>
-      <w:bookmarkStart w:id="64" w:name="_Toc237559766"/>
+      <w:bookmarkStart w:id="70" w:name="_Toc237904458"/>
       <w:r>
         <w:t>4.1.2.16 HTML5 Dashboard Layout Structure</w:t>
       </w:r>
-      <w:bookmarkEnd w:id="64"/>
+      <w:bookmarkEnd w:id="70"/>
     </w:p>
     <w:p>
       <w:r>
@@ -29853,11 +30639,11 @@
       <w:pPr>
         <w:pStyle w:val="Heading3"/>
       </w:pPr>
-      <w:bookmarkStart w:id="65" w:name="_Toc237559767"/>
+      <w:bookmarkStart w:id="71" w:name="_Toc237904459"/>
       <w:r>
         <w:t>4.1.2.17 Heuristic Grammar &amp; Typography Module</w:t>
       </w:r>
-      <w:bookmarkEnd w:id="65"/>
+      <w:bookmarkEnd w:id="71"/>
     </w:p>
     <w:p>
       <w:r>
@@ -30295,7 +31081,7 @@
       <w:pPr>
         <w:pStyle w:val="Heading3"/>
       </w:pPr>
-      <w:bookmarkStart w:id="66" w:name="_Toc237559768"/>
+      <w:bookmarkStart w:id="72" w:name="_Toc237904460"/>
       <w:r>
         <w:t xml:space="preserve">4.1.2.18 </w:t>
       </w:r>
@@ -30307,7 +31093,7 @@
       <w:r>
         <w:t xml:space="preserve"> Storage &amp; REST Sync Module</w:t>
       </w:r>
-      <w:bookmarkEnd w:id="66"/>
+      <w:bookmarkEnd w:id="72"/>
     </w:p>
     <w:p>
       <w:r>
@@ -31475,7 +32261,6 @@
           <w:sz w:val="22"/>
           <w:szCs w:val="22"/>
         </w:rPr>
-        <w:lastRenderedPageBreak/>
         <w:t xml:space="preserve">Figure 4.18: Code Snippet of </w:t>
       </w:r>
       <w:proofErr w:type="spellStart"/>
@@ -31503,11 +32288,11 @@
       <w:pPr>
         <w:pStyle w:val="Heading3"/>
       </w:pPr>
-      <w:bookmarkStart w:id="67" w:name="_Toc237559769"/>
+      <w:bookmarkStart w:id="73" w:name="_Toc237904461"/>
       <w:r>
         <w:t>4.1.2.19 User Authentication &amp; Session Controller Module</w:t>
       </w:r>
-      <w:bookmarkEnd w:id="67"/>
+      <w:bookmarkEnd w:id="73"/>
     </w:p>
     <w:p>
       <w:r>
@@ -32764,7 +33549,6 @@
           <w:sz w:val="22"/>
           <w:szCs w:val="22"/>
         </w:rPr>
-        <w:lastRenderedPageBreak/>
         <w:t>Figure 4.19: Code Snippet of User Authentication &amp; Session Controller Module</w:t>
       </w:r>
     </w:p>
@@ -32772,11 +33556,11 @@
       <w:pPr>
         <w:pStyle w:val="Heading3"/>
       </w:pPr>
-      <w:bookmarkStart w:id="68" w:name="_Toc237559770"/>
+      <w:bookmarkStart w:id="74" w:name="_Toc237904462"/>
       <w:r>
         <w:t>4.1.2.20 server.py SQLite REST Backend Server Module</w:t>
       </w:r>
-      <w:bookmarkEnd w:id="68"/>
+      <w:bookmarkEnd w:id="74"/>
     </w:p>
     <w:p>
       <w:r>
@@ -33955,7 +34739,6 @@
           <w:sz w:val="22"/>
           <w:szCs w:val="22"/>
         </w:rPr>
-        <w:lastRenderedPageBreak/>
         <w:t>Figure 4.20: Code Snippet of server.py SQLite REST Backend Server Module</w:t>
       </w:r>
     </w:p>
@@ -33963,11 +34746,11 @@
       <w:pPr>
         <w:pStyle w:val="Heading3"/>
       </w:pPr>
-      <w:bookmarkStart w:id="69" w:name="_Toc237559771"/>
+      <w:bookmarkStart w:id="75" w:name="_Toc237904463"/>
       <w:r>
         <w:t>4.1.2.21 Guest Quota Manager &amp; History Security Module</w:t>
       </w:r>
-      <w:bookmarkEnd w:id="69"/>
+      <w:bookmarkEnd w:id="75"/>
     </w:p>
     <w:p>
       <w:r>
@@ -35180,7 +35963,6 @@
           <w:sz w:val="22"/>
           <w:szCs w:val="22"/>
         </w:rPr>
-        <w:lastRenderedPageBreak/>
         <w:t>Figure 4.21: Code Snippet of Guest Quota Manager &amp; History Security Module</w:t>
       </w:r>
     </w:p>
@@ -35188,11 +35970,11 @@
       <w:pPr>
         <w:pStyle w:val="Heading3"/>
       </w:pPr>
-      <w:bookmarkStart w:id="70" w:name="_Toc237559772"/>
+      <w:bookmarkStart w:id="76" w:name="_Toc237904464"/>
       <w:r>
         <w:t>4.1.2.22 Real-Time History Search &amp; UI Refinement Module</w:t>
       </w:r>
-      <w:bookmarkEnd w:id="70"/>
+      <w:bookmarkEnd w:id="76"/>
     </w:p>
     <w:p>
       <w:r>
@@ -36255,21 +37037,21 @@
       <w:pPr>
         <w:pStyle w:val="Heading2"/>
       </w:pPr>
-      <w:bookmarkStart w:id="71" w:name="_Toc237559773"/>
+      <w:bookmarkStart w:id="77" w:name="_Toc237904465"/>
       <w:r>
         <w:t>4.2 Testing</w:t>
       </w:r>
-      <w:bookmarkEnd w:id="71"/>
+      <w:bookmarkEnd w:id="77"/>
     </w:p>
     <w:p>
       <w:pPr>
         <w:pStyle w:val="Heading3"/>
       </w:pPr>
-      <w:bookmarkStart w:id="72" w:name="_Toc237559774"/>
+      <w:bookmarkStart w:id="78" w:name="_Toc237904466"/>
       <w:r>
         <w:t>4.2.1 Test Case for Unit Testing</w:t>
       </w:r>
-      <w:bookmarkEnd w:id="72"/>
+      <w:bookmarkEnd w:id="78"/>
     </w:p>
     <w:p>
       <w:pPr>
@@ -39269,11 +40051,11 @@
       <w:pPr>
         <w:pStyle w:val="Heading3"/>
       </w:pPr>
-      <w:bookmarkStart w:id="73" w:name="_Toc237559775"/>
+      <w:bookmarkStart w:id="79" w:name="_Toc237904467"/>
       <w:r>
         <w:t>4.2.2 Dataset Training &amp; Evasion Robustness Testing</w:t>
       </w:r>
-      <w:bookmarkEnd w:id="73"/>
+      <w:bookmarkEnd w:id="79"/>
     </w:p>
     <w:p>
       <w:pPr>
@@ -39483,14 +40265,14 @@
           <w:bCs/>
         </w:rPr>
       </w:pPr>
-      <w:bookmarkStart w:id="74" w:name="_Toc237559776"/>
+      <w:bookmarkStart w:id="80" w:name="_Toc237904468"/>
       <w:r>
         <w:rPr>
           <w:bCs/>
         </w:rPr>
         <w:t>4.3 Result Analysis</w:t>
       </w:r>
-      <w:bookmarkEnd w:id="74"/>
+      <w:bookmarkEnd w:id="80"/>
     </w:p>
     <w:p>
       <w:pPr>
@@ -39499,14 +40281,14 @@
           <w:bCs/>
         </w:rPr>
       </w:pPr>
-      <w:bookmarkStart w:id="75" w:name="_Toc237559777"/>
+      <w:bookmarkStart w:id="81" w:name="_Toc237904469"/>
       <w:r>
         <w:rPr>
           <w:bCs/>
         </w:rPr>
         <w:t>4.3.1 AI Probability Classification Analysis</w:t>
       </w:r>
-      <w:bookmarkEnd w:id="75"/>
+      <w:bookmarkEnd w:id="81"/>
     </w:p>
     <w:p>
       <w:r>
@@ -39851,14 +40633,14 @@
           <w:bCs/>
         </w:rPr>
       </w:pPr>
-      <w:bookmarkStart w:id="76" w:name="_Toc237559778"/>
+      <w:bookmarkStart w:id="82" w:name="_Toc237904470"/>
       <w:r>
         <w:rPr>
           <w:bCs/>
         </w:rPr>
         <w:t>4.3.2 Classifier Performance Analysis</w:t>
       </w:r>
-      <w:bookmarkEnd w:id="76"/>
+      <w:bookmarkEnd w:id="82"/>
     </w:p>
     <w:p>
       <w:r>
@@ -40169,14 +40951,14 @@
           <w:bCs/>
         </w:rPr>
       </w:pPr>
-      <w:bookmarkStart w:id="77" w:name="_Toc237559779"/>
+      <w:bookmarkStart w:id="83" w:name="_Toc237904471"/>
       <w:r>
         <w:rPr>
           <w:bCs/>
         </w:rPr>
         <w:t>4.3.3 AI Probability Distribution Analysis</w:t>
       </w:r>
-      <w:bookmarkEnd w:id="77"/>
+      <w:bookmarkEnd w:id="83"/>
     </w:p>
     <w:p>
       <w:pPr>
@@ -40590,14 +41372,14 @@
           <w:bCs/>
         </w:rPr>
       </w:pPr>
-      <w:bookmarkStart w:id="78" w:name="_Toc237559780"/>
+      <w:bookmarkStart w:id="84" w:name="_Toc237904472"/>
       <w:r>
         <w:rPr>
           <w:bCs/>
         </w:rPr>
         <w:t>4.3.4 Detector Accuracy Evaluation</w:t>
       </w:r>
-      <w:bookmarkEnd w:id="78"/>
+      <w:bookmarkEnd w:id="84"/>
     </w:p>
     <w:p>
       <w:r>
@@ -41279,12 +42061,12 @@
       <w:pPr>
         <w:pStyle w:val="Heading1"/>
       </w:pPr>
-      <w:bookmarkStart w:id="79" w:name="_Toc237559781"/>
+      <w:bookmarkStart w:id="85" w:name="_Toc237904473"/>
       <w:r>
         <w:lastRenderedPageBreak/>
         <w:t>CHAPTER 5</w:t>
       </w:r>
-      <w:bookmarkEnd w:id="79"/>
+      <w:bookmarkEnd w:id="85"/>
       <w:r>
         <w:t xml:space="preserve"> </w:t>
       </w:r>
@@ -41296,24 +42078,24 @@
       <w:r>
         <w:t xml:space="preserve"> </w:t>
       </w:r>
-      <w:bookmarkStart w:id="80" w:name="_Toc237559782"/>
+      <w:bookmarkStart w:id="86" w:name="_Toc237904474"/>
       <w:r>
         <w:t>CONCLUSION AND FUTURE RECOMMENDATIONS</w:t>
       </w:r>
-      <w:bookmarkEnd w:id="80"/>
+      <w:bookmarkEnd w:id="86"/>
     </w:p>
     <w:p>
       <w:pPr>
         <w:pStyle w:val="Heading2"/>
       </w:pPr>
-      <w:bookmarkStart w:id="81" w:name="_Toc237559783"/>
+      <w:bookmarkStart w:id="87" w:name="_Toc237904475"/>
       <w:r>
         <w:rPr>
           <w:sz w:val="24"/>
         </w:rPr>
         <w:t>5.1 Conclusion</w:t>
       </w:r>
-      <w:bookmarkEnd w:id="81"/>
+      <w:bookmarkEnd w:id="87"/>
     </w:p>
     <w:p>
       <w:r>
@@ -41500,11 +42282,11 @@
       <w:pPr>
         <w:pStyle w:val="Heading2"/>
       </w:pPr>
-      <w:bookmarkStart w:id="82" w:name="_Toc237559784"/>
+      <w:bookmarkStart w:id="88" w:name="_Toc237904476"/>
       <w:r>
         <w:t>5.2 Future Recommendations</w:t>
       </w:r>
-      <w:bookmarkEnd w:id="82"/>
+      <w:bookmarkEnd w:id="88"/>
     </w:p>
     <w:p>
       <w:pPr>
@@ -41710,7 +42492,7 @@
           <w:sz w:val="36"/>
         </w:rPr>
       </w:pPr>
-      <w:bookmarkStart w:id="83" w:name="_Toc237559785"/>
+      <w:bookmarkStart w:id="89" w:name="_Toc237904477"/>
       <w:r>
         <w:rPr>
           <w:sz w:val="36"/>
@@ -41718,7 +42500,7 @@
         <w:lastRenderedPageBreak/>
         <w:t>REFERENCES</w:t>
       </w:r>
-      <w:bookmarkEnd w:id="83"/>
+      <w:bookmarkEnd w:id="89"/>
     </w:p>
     <w:p>
       <w:pPr>
@@ -41947,21 +42729,7 @@
         <w:rPr>
           <w:sz w:val="22"/>
         </w:rPr>
-        <w:t xml:space="preserve">[3] Mitchell, E., Yoon, C., Liang, P., Manning, C. D., &amp; Finn, C. (2023). </w:t>
-      </w:r>
-      <w:proofErr w:type="spellStart"/>
-      <w:r>
-        <w:rPr>
-          <w:sz w:val="22"/>
-        </w:rPr>
-        <w:t>DetectGPT</w:t>
-      </w:r>
-      <w:proofErr w:type="spellEnd"/>
-      <w:r>
-        <w:rPr>
-          <w:sz w:val="22"/>
-        </w:rPr>
-        <w:t>: Zero</w:t>
+        <w:t>[3] Mitchell, E., Yoon, C., Liang, P., Manning, C. D., &amp; Finn, C. (2023). DetectGPT: Zero</w:t>
       </w:r>
       <w:r>
         <w:rPr>
@@ -42730,14 +43498,14 @@
       <w:pPr>
         <w:pStyle w:val="Heading1"/>
       </w:pPr>
-      <w:bookmarkStart w:id="84" w:name="_Toc232289034"/>
-      <w:bookmarkStart w:id="85" w:name="_Toc237559786"/>
+      <w:bookmarkStart w:id="90" w:name="_Toc232289034"/>
+      <w:bookmarkStart w:id="91" w:name="_Toc237904478"/>
       <w:r>
         <w:lastRenderedPageBreak/>
         <w:t>APPENDICES</w:t>
       </w:r>
-      <w:bookmarkEnd w:id="84"/>
-      <w:bookmarkEnd w:id="85"/>
+      <w:bookmarkEnd w:id="90"/>
+      <w:bookmarkEnd w:id="91"/>
     </w:p>
     <w:p>
       <w:r>
@@ -46768,6 +47536,7 @@
   <w:style w:type="character" w:default="1" w:styleId="DefaultParagraphFont">
     <w:name w:val="Default Paragraph Font"/>
     <w:uiPriority w:val="1"/>
+    <w:semiHidden/>
     <w:unhideWhenUsed/>
   </w:style>
   <w:style w:type="table" w:default="1" w:styleId="TableNormal">
@@ -47921,7 +48690,7 @@
 </file>
 
 <file path=customXml/itemProps1.xml><?xml version="1.0" encoding="utf-8"?>
-<ds:datastoreItem xmlns:ds="http://schemas.openxmlformats.org/officeDocument/2006/customXml" ds:itemID="{3CE310DD-B36F-4FE1-B367-BEA31AFD3324}">
+<ds:datastoreItem xmlns:ds="http://schemas.openxmlformats.org/officeDocument/2006/customXml" ds:itemID="{2EB27BCE-8A2B-4AAD-8BE0-6FEDC9B9D5F3}">
   <ds:schemaRefs>
     <ds:schemaRef ds:uri="http://schemas.openxmlformats.org/officeDocument/2006/bibliography"/>
   </ds:schemaRefs>

</xml_diff>